<commit_message>
Deploying to gh-pages from @ Morrison-Lab/sds@5d9d7be3549c333f906fb050935b72bad591fe51 🚀
</commit_message>
<xml_diff>
--- a/model-validation-handout.docx
+++ b/model-validation-handout.docx
@@ -15,7 +15,7 @@
         <w:pStyle w:val="Date"/>
       </w:pPr>
       <w:r>
-        <w:t xml:space="preserve">Last modified: 2026-10-05 23:57:11 (PDT)</w:t>
+        <w:t xml:space="preserve">Last modified: 2026-10-06 01:02:59 (PDT)</w:t>
       </w:r>
     </w:p>
     <w:bookmarkStart w:id="33" w:name="sec-prediction-rules"/>
@@ -43030,7 +43030,7 @@
         <w:rPr>
           <w:rStyle w:val="CommentTok"/>
         </w:rPr>
-        <w:t xml:space="preserve">#&gt;    7.10543e-15    2.00000e+00</w:t>
+        <w:t xml:space="preserve">#&gt;    8.88178e-15    2.00000e+00</w:t>
       </w:r>
     </w:p>
     <w:p>
@@ -43038,7 +43038,7 @@
         <w:pStyle w:val="FirstParagraph"/>
       </w:pPr>
       <w:r>
-        <w:t xml:space="preserve">The two columns differ by at most 7.1e-15,</w:t>
+        <w:t xml:space="preserve">The two columns differ by at most 8.9e-15,</w:t>
       </w:r>
       <w:r>
         <w:t xml:space="preserve"> </w:t>

</xml_diff>

<commit_message>
Deploying to gh-pages from @ Morrison-Lab/sds@7ef5f2e8eb76c3b813355a511123cdc2afab1bea 🚀
</commit_message>
<xml_diff>
--- a/model-validation-handout.docx
+++ b/model-validation-handout.docx
@@ -15,7 +15,7 @@
         <w:pStyle w:val="Date"/>
       </w:pPr>
       <w:r>
-        <w:t xml:space="preserve">Last modified: 2026-10-06 01:19:38 (PDT)</w:t>
+        <w:t xml:space="preserve">Last modified: 2026-10-06 01:35:15 (PDT)</w:t>
       </w:r>
     </w:p>
     <w:bookmarkStart w:id="33" w:name="sec-prediction-rules"/>
@@ -43030,7 +43030,7 @@
         <w:rPr>
           <w:rStyle w:val="CommentTok"/>
         </w:rPr>
-        <w:t xml:space="preserve">#&gt;    8.88178e-15    2.00000e+00</w:t>
+        <w:t xml:space="preserve">#&gt;    7.10543e-15    2.00000e+00</w:t>
       </w:r>
     </w:p>
     <w:p>
@@ -43038,7 +43038,7 @@
         <w:pStyle w:val="FirstParagraph"/>
       </w:pPr>
       <w:r>
-        <w:t xml:space="preserve">The two columns differ by at most 8.9e-15,</w:t>
+        <w:t xml:space="preserve">The two columns differ by at most 7.1e-15,</w:t>
       </w:r>
       <w:r>
         <w:t xml:space="preserve"> </w:t>

</xml_diff>

<commit_message>
Deploying to gh-pages from @ Morrison-Lab/sds@532ba941da95d367851843a188d7fb98c2452842 🚀
</commit_message>
<xml_diff>
--- a/model-validation-handout.docx
+++ b/model-validation-handout.docx
@@ -15,7 +15,7 @@
         <w:pStyle w:val="Date"/>
       </w:pPr>
       <w:r>
-        <w:t xml:space="preserve">Last modified: 2026-10-06 01:50:41 (PDT)</w:t>
+        <w:t xml:space="preserve">Last modified: 2026-10-07 17:50:26 (PDT)</w:t>
       </w:r>
     </w:p>
     <w:bookmarkStart w:id="33" w:name="sec-prediction-rules"/>
@@ -43030,7 +43030,7 @@
         <w:rPr>
           <w:rStyle w:val="CommentTok"/>
         </w:rPr>
-        <w:t xml:space="preserve">#&gt;    8.88178e-15    2.00000e+00</w:t>
+        <w:t xml:space="preserve">#&gt;    7.10543e-15    2.00000e+00</w:t>
       </w:r>
     </w:p>
     <w:p>
@@ -43038,7 +43038,7 @@
         <w:pStyle w:val="FirstParagraph"/>
       </w:pPr>
       <w:r>
-        <w:t xml:space="preserve">The two columns differ by at most 8.9e-15,</w:t>
+        <w:t xml:space="preserve">The two columns differ by at most 7.1e-15,</w:t>
       </w:r>
       <w:r>
         <w:t xml:space="preserve"> </w:t>

</xml_diff>

<commit_message>
Deploying to gh-pages from @ Morrison-Lab/sds@ffc5e1f547b893b443b8c053720840976775167f 🚀
</commit_message>
<xml_diff>
--- a/model-validation-handout.docx
+++ b/model-validation-handout.docx
@@ -15,7 +15,7 @@
         <w:pStyle w:val="Date"/>
       </w:pPr>
       <w:r>
-        <w:t xml:space="preserve">Last modified: 2026-10-07 23:40:32 (PDT)</w:t>
+        <w:t xml:space="preserve">Last modified: 2026-10-08 02:08:11 (PDT)</w:t>
       </w:r>
     </w:p>
     <w:bookmarkStart w:id="33" w:name="sec-prediction-rules"/>
@@ -43066,7 +43066,7 @@
         <w:rPr>
           <w:rStyle w:val="CommentTok"/>
         </w:rPr>
-        <w:t xml:space="preserve">#&gt;    8.88178e-15    2.00000e+00</w:t>
+        <w:t xml:space="preserve">#&gt;    7.10543e-15    2.00000e+00</w:t>
       </w:r>
     </w:p>
     <w:p>
@@ -43074,7 +43074,7 @@
         <w:pStyle w:val="FirstParagraph"/>
       </w:pPr>
       <w:r>
-        <w:t xml:space="preserve">The two columns differ by at most 8.9e-15,</w:t>
+        <w:t xml:space="preserve">The two columns differ by at most 7.1e-15,</w:t>
       </w:r>
       <w:r>
         <w:t xml:space="preserve"> </w:t>

</xml_diff>

<commit_message>
Deploying to gh-pages from @ Morrison-Lab/sds@94e3cbcb12cb91d00ac08992d5319730cd35f14d 🚀
</commit_message>
<xml_diff>
--- a/model-validation-handout.docx
+++ b/model-validation-handout.docx
@@ -15,7 +15,7 @@
         <w:pStyle w:val="Date"/>
       </w:pPr>
       <w:r>
-        <w:t xml:space="preserve">Last modified: 2026-10-08 02:08:30 (PDT)</w:t>
+        <w:t xml:space="preserve">Last modified: 2026-10-08 02:07:46 (PDT)</w:t>
       </w:r>
     </w:p>
     <w:bookmarkStart w:id="33" w:name="sec-prediction-rules"/>
@@ -43066,7 +43066,7 @@
         <w:rPr>
           <w:rStyle w:val="CommentTok"/>
         </w:rPr>
-        <w:t xml:space="preserve">#&gt;    7.10543e-15    2.00000e+00</w:t>
+        <w:t xml:space="preserve">#&gt;    8.88178e-15    2.00000e+00</w:t>
       </w:r>
     </w:p>
     <w:p>
@@ -43074,7 +43074,7 @@
         <w:pStyle w:val="FirstParagraph"/>
       </w:pPr>
       <w:r>
-        <w:t xml:space="preserve">The two columns differ by at most 7.1e-15,</w:t>
+        <w:t xml:space="preserve">The two columns differ by at most 8.9e-15,</w:t>
       </w:r>
       <w:r>
         <w:t xml:space="preserve"> </w:t>

</xml_diff>

<commit_message>
Deploying to gh-pages from @ Morrison-Lab/sds@f286f1d1a049e446fddeb0f28e5ea2ead4e8cc16 🚀
</commit_message>
<xml_diff>
--- a/model-validation-handout.docx
+++ b/model-validation-handout.docx
@@ -15,7 +15,7 @@
         <w:pStyle w:val="Date"/>
       </w:pPr>
       <w:r>
-        <w:t xml:space="preserve">Last modified: 2026-10-08 02:08:18 (PDT)</w:t>
+        <w:t xml:space="preserve">Last modified: 2026-10-08 11:58:11 (PDT)</w:t>
       </w:r>
     </w:p>
     <w:bookmarkStart w:id="33" w:name="sec-prediction-rules"/>
@@ -43066,7 +43066,7 @@
         <w:rPr>
           <w:rStyle w:val="CommentTok"/>
         </w:rPr>
-        <w:t xml:space="preserve">#&gt;    8.88178e-15    2.00000e+00</w:t>
+        <w:t xml:space="preserve">#&gt;    7.10543e-15    2.00000e+00</w:t>
       </w:r>
     </w:p>
     <w:p>
@@ -43074,7 +43074,7 @@
         <w:pStyle w:val="FirstParagraph"/>
       </w:pPr>
       <w:r>
-        <w:t xml:space="preserve">The two columns differ by at most 8.9e-15,</w:t>
+        <w:t xml:space="preserve">The two columns differ by at most 7.1e-15,</w:t>
       </w:r>
       <w:r>
         <w:t xml:space="preserve"> </w:t>

</xml_diff>

<commit_message>
Deploying to gh-pages from @ Morrison-Lab/sds@fef8fee5b92303c2c50363b556c9ca91cc70cf15 🚀
</commit_message>
<xml_diff>
--- a/model-validation-handout.docx
+++ b/model-validation-handout.docx
@@ -15,7 +15,7 @@
         <w:pStyle w:val="Date"/>
       </w:pPr>
       <w:r>
-        <w:t xml:space="preserve">Last modified: 2026-10-08 15:39:20 (PDT)</w:t>
+        <w:t xml:space="preserve">Last modified: 2026-10-08 23:14:25 (UTC)</w:t>
       </w:r>
     </w:p>
     <w:bookmarkStart w:id="33" w:name="sec-prediction-rules"/>
@@ -43066,7 +43066,7 @@
         <w:rPr>
           <w:rStyle w:val="CommentTok"/>
         </w:rPr>
-        <w:t xml:space="preserve">#&gt;    7.10543e-15    2.00000e+00</w:t>
+        <w:t xml:space="preserve">#&gt;    8.88178e-15    2.00000e+00</w:t>
       </w:r>
     </w:p>
     <w:p>
@@ -43074,7 +43074,7 @@
         <w:pStyle w:val="FirstParagraph"/>
       </w:pPr>
       <w:r>
-        <w:t xml:space="preserve">The two columns differ by at most 7.1e-15,</w:t>
+        <w:t xml:space="preserve">The two columns differ by at most 8.9e-15,</w:t>
       </w:r>
       <w:r>
         <w:t xml:space="preserve"> </w:t>

</xml_diff>

<commit_message>
Deploying to gh-pages from @ Morrison-Lab/sds@5f66edec97d4cc0558cf1fad606d811c2f89ab83 🚀
</commit_message>
<xml_diff>
--- a/model-validation-handout.docx
+++ b/model-validation-handout.docx
@@ -15,7 +15,7 @@
         <w:pStyle w:val="Date"/>
       </w:pPr>
       <w:r>
-        <w:t xml:space="preserve">Last modified: 2026-10-09 10:25:47 (PDT)</w:t>
+        <w:t xml:space="preserve">Last modified: 2026-10-09 10:39:54 (PDT)</w:t>
       </w:r>
     </w:p>
     <w:bookmarkStart w:id="33" w:name="sec-prediction-rules"/>
@@ -24485,6 +24485,147 @@
         <w:rPr>
           <w:rStyle w:val="NormalTok"/>
         </w:rPr>
+        <w:t xml:space="preserve">partition_data </w:t>
+      </w:r>
+      <w:r>
+        <w:rPr>
+          <w:rStyle w:val="OtherTok"/>
+        </w:rPr>
+        <w:t xml:space="preserve">&lt;-</w:t>
+      </w:r>
+      <w:r>
+        <w:rPr>
+          <w:rStyle w:val="NormalTok"/>
+        </w:rPr>
+        <w:t xml:space="preserve"> dplyr</w:t>
+      </w:r>
+      <w:r>
+        <w:rPr>
+          <w:rStyle w:val="SpecialCharTok"/>
+        </w:rPr>
+        <w:t xml:space="preserve">::</w:t>
+      </w:r>
+      <w:r>
+        <w:rPr>
+          <w:rStyle w:val="FunctionTok"/>
+        </w:rPr>
+        <w:t xml:space="preserve">bind_rows</w:t>
+      </w:r>
+      <w:r>
+        <w:rPr>
+          <w:rStyle w:val="NormalTok"/>
+        </w:rPr>
+        <w:t xml:space="preserve">(</w:t>
+      </w:r>
+      <w:r>
+        <w:br/>
+      </w:r>
+      <w:r>
+        <w:rPr>
+          <w:rStyle w:val="NormalTok"/>
+        </w:rPr>
+        <w:t xml:space="preserve">  </w:t>
+      </w:r>
+      <w:r>
+        <w:rPr>
+          <w:rStyle w:val="AttributeTok"/>
+        </w:rPr>
+        <w:t xml:space="preserve">training =</w:t>
+      </w:r>
+      <w:r>
+        <w:rPr>
+          <w:rStyle w:val="NormalTok"/>
+        </w:rPr>
+        <w:t xml:space="preserve"> train_dat,</w:t>
+      </w:r>
+      <w:r>
+        <w:br/>
+      </w:r>
+      <w:r>
+        <w:rPr>
+          <w:rStyle w:val="NormalTok"/>
+        </w:rPr>
+        <w:t xml:space="preserve">  </w:t>
+      </w:r>
+      <w:r>
+        <w:rPr>
+          <w:rStyle w:val="AttributeTok"/>
+        </w:rPr>
+        <w:t xml:space="preserve">validation =</w:t>
+      </w:r>
+      <w:r>
+        <w:rPr>
+          <w:rStyle w:val="NormalTok"/>
+        </w:rPr>
+        <w:t xml:space="preserve"> valid_dat,</w:t>
+      </w:r>
+      <w:r>
+        <w:br/>
+      </w:r>
+      <w:r>
+        <w:rPr>
+          <w:rStyle w:val="NormalTok"/>
+        </w:rPr>
+        <w:t xml:space="preserve">  </w:t>
+      </w:r>
+      <w:r>
+        <w:rPr>
+          <w:rStyle w:val="AttributeTok"/>
+        </w:rPr>
+        <w:t xml:space="preserve">test =</w:t>
+      </w:r>
+      <w:r>
+        <w:rPr>
+          <w:rStyle w:val="NormalTok"/>
+        </w:rPr>
+        <w:t xml:space="preserve"> test_dat,</w:t>
+      </w:r>
+      <w:r>
+        <w:br/>
+      </w:r>
+      <w:r>
+        <w:rPr>
+          <w:rStyle w:val="NormalTok"/>
+        </w:rPr>
+        <w:t xml:space="preserve">  </w:t>
+      </w:r>
+      <w:r>
+        <w:rPr>
+          <w:rStyle w:val="AttributeTok"/>
+        </w:rPr>
+        <w:t xml:space="preserve">.id =</w:t>
+      </w:r>
+      <w:r>
+        <w:rPr>
+          <w:rStyle w:val="NormalTok"/>
+        </w:rPr>
+        <w:t xml:space="preserve"> </w:t>
+      </w:r>
+      <w:r>
+        <w:rPr>
+          <w:rStyle w:val="StringTok"/>
+        </w:rPr>
+        <w:t xml:space="preserve">"series"</w:t>
+      </w:r>
+      <w:r>
+        <w:br/>
+      </w:r>
+      <w:r>
+        <w:rPr>
+          <w:rStyle w:val="NormalTok"/>
+        </w:rPr>
+        <w:t xml:space="preserve">)</w:t>
+      </w:r>
+      <w:r>
+        <w:br/>
+      </w:r>
+      <w:r>
+        <w:br/>
+      </w:r>
+      <w:r>
+        <w:rPr>
+          <w:rStyle w:val="NormalTok"/>
+        </w:rPr>
         <w:t xml:space="preserve">plot_partitions_with_fit </w:t>
       </w:r>
       <w:r>
@@ -24518,13 +24659,325 @@
         <w:rPr>
           <w:rStyle w:val="NormalTok"/>
         </w:rPr>
+        <w:t xml:space="preserve">  series_levels </w:t>
+      </w:r>
+      <w:r>
+        <w:rPr>
+          <w:rStyle w:val="OtherTok"/>
+        </w:rPr>
+        <w:t xml:space="preserve">&lt;-</w:t>
+      </w:r>
+      <w:r>
+        <w:rPr>
+          <w:rStyle w:val="NormalTok"/>
+        </w:rPr>
+        <w:t xml:space="preserve"> </w:t>
+      </w:r>
+      <w:r>
+        <w:rPr>
+          <w:rStyle w:val="FunctionTok"/>
+        </w:rPr>
+        <w:t xml:space="preserve">c</w:t>
+      </w:r>
+      <w:r>
+        <w:rPr>
+          <w:rStyle w:val="NormalTok"/>
+        </w:rPr>
+        <w:t xml:space="preserve">(</w:t>
+      </w:r>
+      <w:r>
+        <w:rPr>
+          <w:rStyle w:val="FunctionTok"/>
+        </w:rPr>
+        <w:t xml:space="preserve">names</w:t>
+      </w:r>
+      <w:r>
+        <w:rPr>
+          <w:rStyle w:val="NormalTok"/>
+        </w:rPr>
+        <w:t xml:space="preserve">(partition_colors), fit_label)</w:t>
+      </w:r>
+      <w:r>
+        <w:br/>
+      </w:r>
+      <w:r>
+        <w:rPr>
+          <w:rStyle w:val="NormalTok"/>
+        </w:rPr>
+        <w:t xml:space="preserve">  partition_data</w:t>
+      </w:r>
+      <w:r>
+        <w:rPr>
+          <w:rStyle w:val="SpecialCharTok"/>
+        </w:rPr>
+        <w:t xml:space="preserve">$</w:t>
+      </w:r>
+      <w:r>
+        <w:rPr>
+          <w:rStyle w:val="NormalTok"/>
+        </w:rPr>
+        <w:t xml:space="preserve">series </w:t>
+      </w:r>
+      <w:r>
+        <w:rPr>
+          <w:rStyle w:val="OtherTok"/>
+        </w:rPr>
+        <w:t xml:space="preserve">&lt;-</w:t>
+      </w:r>
+      <w:r>
+        <w:rPr>
+          <w:rStyle w:val="NormalTok"/>
+        </w:rPr>
+        <w:t xml:space="preserve"> </w:t>
+      </w:r>
+      <w:r>
+        <w:rPr>
+          <w:rStyle w:val="FunctionTok"/>
+        </w:rPr>
+        <w:t xml:space="preserve">factor</w:t>
+      </w:r>
+      <w:r>
+        <w:rPr>
+          <w:rStyle w:val="NormalTok"/>
+        </w:rPr>
+        <w:t xml:space="preserve">(partition_data</w:t>
+      </w:r>
+      <w:r>
+        <w:rPr>
+          <w:rStyle w:val="SpecialCharTok"/>
+        </w:rPr>
+        <w:t xml:space="preserve">$</w:t>
+      </w:r>
+      <w:r>
+        <w:rPr>
+          <w:rStyle w:val="NormalTok"/>
+        </w:rPr>
+        <w:t xml:space="preserve">series, </w:t>
+      </w:r>
+      <w:r>
+        <w:rPr>
+          <w:rStyle w:val="AttributeTok"/>
+        </w:rPr>
+        <w:t xml:space="preserve">levels =</w:t>
+      </w:r>
+      <w:r>
+        <w:rPr>
+          <w:rStyle w:val="NormalTok"/>
+        </w:rPr>
+        <w:t xml:space="preserve"> series_levels)</w:t>
+      </w:r>
+      <w:r>
+        <w:br/>
+      </w:r>
+      <w:r>
+        <w:rPr>
+          <w:rStyle w:val="NormalTok"/>
+        </w:rPr>
+        <w:t xml:space="preserve">  fitted_curve </w:t>
+      </w:r>
+      <w:r>
+        <w:rPr>
+          <w:rStyle w:val="OtherTok"/>
+        </w:rPr>
+        <w:t xml:space="preserve">&lt;-</w:t>
+      </w:r>
+      <w:r>
+        <w:rPr>
+          <w:rStyle w:val="NormalTok"/>
+        </w:rPr>
+        <w:t xml:space="preserve"> </w:t>
+      </w:r>
+      <w:r>
+        <w:rPr>
+          <w:rStyle w:val="FunctionTok"/>
+        </w:rPr>
+        <w:t xml:space="preserve">data.frame</w:t>
+      </w:r>
+      <w:r>
+        <w:rPr>
+          <w:rStyle w:val="NormalTok"/>
+        </w:rPr>
+        <w:t xml:space="preserve">(</w:t>
+      </w:r>
+      <w:r>
+        <w:br/>
+      </w:r>
+      <w:r>
+        <w:rPr>
+          <w:rStyle w:val="NormalTok"/>
+        </w:rPr>
+        <w:t xml:space="preserve">    </w:t>
+      </w:r>
+      <w:r>
+        <w:rPr>
+          <w:rStyle w:val="AttributeTok"/>
+        </w:rPr>
+        <w:t xml:space="preserve">wt =</w:t>
+      </w:r>
+      <w:r>
+        <w:rPr>
+          <w:rStyle w:val="NormalTok"/>
+        </w:rPr>
+        <w:t xml:space="preserve"> wt_grid,</w:t>
+      </w:r>
+      <w:r>
+        <w:br/>
+      </w:r>
+      <w:r>
+        <w:rPr>
+          <w:rStyle w:val="NormalTok"/>
+        </w:rPr>
+        <w:t xml:space="preserve">    </w:t>
+      </w:r>
+      <w:r>
+        <w:rPr>
+          <w:rStyle w:val="AttributeTok"/>
+        </w:rPr>
+        <w:t xml:space="preserve">mpg =</w:t>
+      </w:r>
+      <w:r>
+        <w:rPr>
+          <w:rStyle w:val="NormalTok"/>
+        </w:rPr>
+        <w:t xml:space="preserve"> </w:t>
+      </w:r>
+      <w:r>
+        <w:rPr>
+          <w:rStyle w:val="FunctionTok"/>
+        </w:rPr>
+        <w:t xml:space="preserve">predict</w:t>
+      </w:r>
+      <w:r>
+        <w:rPr>
+          <w:rStyle w:val="NormalTok"/>
+        </w:rPr>
+        <w:t xml:space="preserve">(model, </w:t>
+      </w:r>
+      <w:r>
+        <w:rPr>
+          <w:rStyle w:val="AttributeTok"/>
+        </w:rPr>
+        <w:t xml:space="preserve">newdata =</w:t>
+      </w:r>
+      <w:r>
+        <w:rPr>
+          <w:rStyle w:val="NormalTok"/>
+        </w:rPr>
+        <w:t xml:space="preserve"> </w:t>
+      </w:r>
+      <w:r>
+        <w:rPr>
+          <w:rStyle w:val="FunctionTok"/>
+        </w:rPr>
+        <w:t xml:space="preserve">data.frame</w:t>
+      </w:r>
+      <w:r>
+        <w:rPr>
+          <w:rStyle w:val="NormalTok"/>
+        </w:rPr>
+        <w:t xml:space="preserve">(</w:t>
+      </w:r>
+      <w:r>
+        <w:rPr>
+          <w:rStyle w:val="AttributeTok"/>
+        </w:rPr>
+        <w:t xml:space="preserve">wt =</w:t>
+      </w:r>
+      <w:r>
+        <w:rPr>
+          <w:rStyle w:val="NormalTok"/>
+        </w:rPr>
+        <w:t xml:space="preserve"> wt_grid)),</w:t>
+      </w:r>
+      <w:r>
+        <w:br/>
+      </w:r>
+      <w:r>
+        <w:rPr>
+          <w:rStyle w:val="NormalTok"/>
+        </w:rPr>
+        <w:t xml:space="preserve">    </w:t>
+      </w:r>
+      <w:r>
+        <w:rPr>
+          <w:rStyle w:val="AttributeTok"/>
+        </w:rPr>
+        <w:t xml:space="preserve">series =</w:t>
+      </w:r>
+      <w:r>
+        <w:rPr>
+          <w:rStyle w:val="NormalTok"/>
+        </w:rPr>
+        <w:t xml:space="preserve"> </w:t>
+      </w:r>
+      <w:r>
+        <w:rPr>
+          <w:rStyle w:val="FunctionTok"/>
+        </w:rPr>
+        <w:t xml:space="preserve">factor</w:t>
+      </w:r>
+      <w:r>
+        <w:rPr>
+          <w:rStyle w:val="NormalTok"/>
+        </w:rPr>
+        <w:t xml:space="preserve">(fit_label, </w:t>
+      </w:r>
+      <w:r>
+        <w:rPr>
+          <w:rStyle w:val="AttributeTok"/>
+        </w:rPr>
+        <w:t xml:space="preserve">levels =</w:t>
+      </w:r>
+      <w:r>
+        <w:rPr>
+          <w:rStyle w:val="NormalTok"/>
+        </w:rPr>
+        <w:t xml:space="preserve"> series_levels)</w:t>
+      </w:r>
+      <w:r>
+        <w:br/>
+      </w:r>
+      <w:r>
+        <w:rPr>
+          <w:rStyle w:val="NormalTok"/>
+        </w:rPr>
+        <w:t xml:space="preserve">  )</w:t>
+      </w:r>
+      <w:r>
+        <w:br/>
+      </w:r>
+      <w:r>
+        <w:rPr>
+          <w:rStyle w:val="NormalTok"/>
+        </w:rPr>
         <w:t xml:space="preserve">  </w:t>
       </w:r>
       <w:r>
         <w:rPr>
+          <w:rStyle w:val="CommentTok"/>
+        </w:rPr>
+        <w:t xml:space="preserve"># nolint start: object_usage_linter.</w:t>
+      </w:r>
+      <w:r>
+        <w:br/>
+      </w:r>
+      <w:r>
+        <w:rPr>
+          <w:rStyle w:val="NormalTok"/>
+        </w:rPr>
+        <w:t xml:space="preserve">  ggplot2</w:t>
+      </w:r>
+      <w:r>
+        <w:rPr>
+          <w:rStyle w:val="SpecialCharTok"/>
+        </w:rPr>
+        <w:t xml:space="preserve">::</w:t>
+      </w:r>
+      <w:r>
+        <w:rPr>
           <w:rStyle w:val="FunctionTok"/>
         </w:rPr>
-        <w:t xml:space="preserve">plot</w:t>
+        <w:t xml:space="preserve">ggplot</w:t>
       </w:r>
       <w:r>
         <w:rPr>
@@ -24539,19 +24992,34 @@
         <w:rPr>
           <w:rStyle w:val="NormalTok"/>
         </w:rPr>
-        <w:t xml:space="preserve">    train_dat</w:t>
+        <w:t xml:space="preserve">    partition_data,</w:t>
+      </w:r>
+      <w:r>
+        <w:br/>
+      </w:r>
+      <w:r>
+        <w:rPr>
+          <w:rStyle w:val="NormalTok"/>
+        </w:rPr>
+        <w:t xml:space="preserve">    ggplot2</w:t>
       </w:r>
       <w:r>
         <w:rPr>
           <w:rStyle w:val="SpecialCharTok"/>
         </w:rPr>
-        <w:t xml:space="preserve">$</w:t>
-      </w:r>
-      <w:r>
-        <w:rPr>
-          <w:rStyle w:val="NormalTok"/>
-        </w:rPr>
-        <w:t xml:space="preserve">wt,</w:t>
+        <w:t xml:space="preserve">::</w:t>
+      </w:r>
+      <w:r>
+        <w:rPr>
+          <w:rStyle w:val="FunctionTok"/>
+        </w:rPr>
+        <w:t xml:space="preserve">aes</w:t>
+      </w:r>
+      <w:r>
+        <w:rPr>
+          <w:rStyle w:val="NormalTok"/>
+        </w:rPr>
+        <w:t xml:space="preserve">(</w:t>
       </w:r>
       <w:r>
         <w:br/>
@@ -24560,19 +25028,106 @@
         <w:rPr>
           <w:rStyle w:val="NormalTok"/>
         </w:rPr>
-        <w:t xml:space="preserve">    train_dat</w:t>
+        <w:t xml:space="preserve">      </w:t>
+      </w:r>
+      <w:r>
+        <w:rPr>
+          <w:rStyle w:val="AttributeTok"/>
+        </w:rPr>
+        <w:t xml:space="preserve">x =</w:t>
+      </w:r>
+      <w:r>
+        <w:rPr>
+          <w:rStyle w:val="NormalTok"/>
+        </w:rPr>
+        <w:t xml:space="preserve"> wt,</w:t>
+      </w:r>
+      <w:r>
+        <w:br/>
+      </w:r>
+      <w:r>
+        <w:rPr>
+          <w:rStyle w:val="NormalTok"/>
+        </w:rPr>
+        <w:t xml:space="preserve">      </w:t>
+      </w:r>
+      <w:r>
+        <w:rPr>
+          <w:rStyle w:val="AttributeTok"/>
+        </w:rPr>
+        <w:t xml:space="preserve">y =</w:t>
+      </w:r>
+      <w:r>
+        <w:rPr>
+          <w:rStyle w:val="NormalTok"/>
+        </w:rPr>
+        <w:t xml:space="preserve"> mpg,</w:t>
+      </w:r>
+      <w:r>
+        <w:br/>
+      </w:r>
+      <w:r>
+        <w:rPr>
+          <w:rStyle w:val="NormalTok"/>
+        </w:rPr>
+        <w:t xml:space="preserve">      </w:t>
+      </w:r>
+      <w:r>
+        <w:rPr>
+          <w:rStyle w:val="AttributeTok"/>
+        </w:rPr>
+        <w:t xml:space="preserve">color =</w:t>
+      </w:r>
+      <w:r>
+        <w:rPr>
+          <w:rStyle w:val="NormalTok"/>
+        </w:rPr>
+        <w:t xml:space="preserve"> series,</w:t>
+      </w:r>
+      <w:r>
+        <w:br/>
+      </w:r>
+      <w:r>
+        <w:rPr>
+          <w:rStyle w:val="NormalTok"/>
+        </w:rPr>
+        <w:t xml:space="preserve">      </w:t>
+      </w:r>
+      <w:r>
+        <w:rPr>
+          <w:rStyle w:val="AttributeTok"/>
+        </w:rPr>
+        <w:t xml:space="preserve">shape =</w:t>
+      </w:r>
+      <w:r>
+        <w:rPr>
+          <w:rStyle w:val="NormalTok"/>
+        </w:rPr>
+        <w:t xml:space="preserve"> series</w:t>
+      </w:r>
+      <w:r>
+        <w:br/>
+      </w:r>
+      <w:r>
+        <w:rPr>
+          <w:rStyle w:val="NormalTok"/>
+        </w:rPr>
+        <w:t xml:space="preserve">    )</w:t>
+      </w:r>
+      <w:r>
+        <w:br/>
+      </w:r>
+      <w:r>
+        <w:rPr>
+          <w:rStyle w:val="NormalTok"/>
+        </w:rPr>
+        <w:t xml:space="preserve">  ) </w:t>
       </w:r>
       <w:r>
         <w:rPr>
           <w:rStyle w:val="SpecialCharTok"/>
         </w:rPr>
-        <w:t xml:space="preserve">$</w:t>
-      </w:r>
-      <w:r>
-        <w:rPr>
-          <w:rStyle w:val="NormalTok"/>
-        </w:rPr>
-        <w:t xml:space="preserve">mpg,</w:t>
+        <w:t xml:space="preserve">+</w:t>
       </w:r>
       <w:r>
         <w:br/>
@@ -24581,25 +25136,823 @@
         <w:rPr>
           <w:rStyle w:val="NormalTok"/>
         </w:rPr>
-        <w:t xml:space="preserve">    </w:t>
+        <w:t xml:space="preserve">    ggplot2</w:t>
+      </w:r>
+      <w:r>
+        <w:rPr>
+          <w:rStyle w:val="SpecialCharTok"/>
+        </w:rPr>
+        <w:t xml:space="preserve">::</w:t>
+      </w:r>
+      <w:r>
+        <w:rPr>
+          <w:rStyle w:val="FunctionTok"/>
+        </w:rPr>
+        <w:t xml:space="preserve">geom_point</w:t>
+      </w:r>
+      <w:r>
+        <w:rPr>
+          <w:rStyle w:val="NormalTok"/>
+        </w:rPr>
+        <w:t xml:space="preserve">() </w:t>
+      </w:r>
+      <w:r>
+        <w:rPr>
+          <w:rStyle w:val="SpecialCharTok"/>
+        </w:rPr>
+        <w:t xml:space="preserve">+</w:t>
+      </w:r>
+      <w:r>
+        <w:br/>
+      </w:r>
+      <w:r>
+        <w:rPr>
+          <w:rStyle w:val="NormalTok"/>
+        </w:rPr>
+        <w:t xml:space="preserve">    ggplot2</w:t>
+      </w:r>
+      <w:r>
+        <w:rPr>
+          <w:rStyle w:val="SpecialCharTok"/>
+        </w:rPr>
+        <w:t xml:space="preserve">::</w:t>
+      </w:r>
+      <w:r>
+        <w:rPr>
+          <w:rStyle w:val="FunctionTok"/>
+        </w:rPr>
+        <w:t xml:space="preserve">geom_line</w:t>
+      </w:r>
+      <w:r>
+        <w:rPr>
+          <w:rStyle w:val="NormalTok"/>
+        </w:rPr>
+        <w:t xml:space="preserve">(</w:t>
+      </w:r>
+      <w:r>
+        <w:br/>
+      </w:r>
+      <w:r>
+        <w:rPr>
+          <w:rStyle w:val="NormalTok"/>
+        </w:rPr>
+        <w:t xml:space="preserve">      ggplot2</w:t>
+      </w:r>
+      <w:r>
+        <w:rPr>
+          <w:rStyle w:val="SpecialCharTok"/>
+        </w:rPr>
+        <w:t xml:space="preserve">::</w:t>
+      </w:r>
+      <w:r>
+        <w:rPr>
+          <w:rStyle w:val="FunctionTok"/>
+        </w:rPr>
+        <w:t xml:space="preserve">aes</w:t>
+      </w:r>
+      <w:r>
+        <w:rPr>
+          <w:rStyle w:val="NormalTok"/>
+        </w:rPr>
+        <w:t xml:space="preserve">(</w:t>
       </w:r>
       <w:r>
         <w:rPr>
           <w:rStyle w:val="AttributeTok"/>
         </w:rPr>
-        <w:t xml:space="preserve">xlab =</w:t>
-      </w:r>
-      <w:r>
-        <w:rPr>
-          <w:rStyle w:val="NormalTok"/>
-        </w:rPr>
-        <w:t xml:space="preserve"> </w:t>
+        <w:t xml:space="preserve">linetype =</w:t>
+      </w:r>
+      <w:r>
+        <w:rPr>
+          <w:rStyle w:val="NormalTok"/>
+        </w:rPr>
+        <w:t xml:space="preserve"> series),</w:t>
+      </w:r>
+      <w:r>
+        <w:br/>
+      </w:r>
+      <w:r>
+        <w:rPr>
+          <w:rStyle w:val="NormalTok"/>
+        </w:rPr>
+        <w:t xml:space="preserve">      </w:t>
+      </w:r>
+      <w:r>
+        <w:rPr>
+          <w:rStyle w:val="AttributeTok"/>
+        </w:rPr>
+        <w:t xml:space="preserve">data =</w:t>
+      </w:r>
+      <w:r>
+        <w:rPr>
+          <w:rStyle w:val="NormalTok"/>
+        </w:rPr>
+        <w:t xml:space="preserve"> fitted_curve,</w:t>
+      </w:r>
+      <w:r>
+        <w:br/>
+      </w:r>
+      <w:r>
+        <w:rPr>
+          <w:rStyle w:val="NormalTok"/>
+        </w:rPr>
+        <w:t xml:space="preserve">      </w:t>
+      </w:r>
+      <w:r>
+        <w:rPr>
+          <w:rStyle w:val="AttributeTok"/>
+        </w:rPr>
+        <w:t xml:space="preserve">linewidth =</w:t>
+      </w:r>
+      <w:r>
+        <w:rPr>
+          <w:rStyle w:val="NormalTok"/>
+        </w:rPr>
+        <w:t xml:space="preserve"> </w:t>
+      </w:r>
+      <w:r>
+        <w:rPr>
+          <w:rStyle w:val="DecValTok"/>
+        </w:rPr>
+        <w:t xml:space="preserve">1</w:t>
+      </w:r>
+      <w:r>
+        <w:br/>
+      </w:r>
+      <w:r>
+        <w:rPr>
+          <w:rStyle w:val="NormalTok"/>
+        </w:rPr>
+        <w:t xml:space="preserve">    ) </w:t>
+      </w:r>
+      <w:r>
+        <w:rPr>
+          <w:rStyle w:val="SpecialCharTok"/>
+        </w:rPr>
+        <w:t xml:space="preserve">+</w:t>
+      </w:r>
+      <w:r>
+        <w:br/>
+      </w:r>
+      <w:r>
+        <w:rPr>
+          <w:rStyle w:val="NormalTok"/>
+        </w:rPr>
+        <w:t xml:space="preserve">    ggplot2</w:t>
+      </w:r>
+      <w:r>
+        <w:rPr>
+          <w:rStyle w:val="SpecialCharTok"/>
+        </w:rPr>
+        <w:t xml:space="preserve">::</w:t>
+      </w:r>
+      <w:r>
+        <w:rPr>
+          <w:rStyle w:val="FunctionTok"/>
+        </w:rPr>
+        <w:t xml:space="preserve">scale_color_manual</w:t>
+      </w:r>
+      <w:r>
+        <w:rPr>
+          <w:rStyle w:val="NormalTok"/>
+        </w:rPr>
+        <w:t xml:space="preserve">(</w:t>
+      </w:r>
+      <w:r>
+        <w:br/>
+      </w:r>
+      <w:r>
+        <w:rPr>
+          <w:rStyle w:val="NormalTok"/>
+        </w:rPr>
+        <w:t xml:space="preserve">      </w:t>
+      </w:r>
+      <w:r>
+        <w:rPr>
+          <w:rStyle w:val="AttributeTok"/>
+        </w:rPr>
+        <w:t xml:space="preserve">limits =</w:t>
+      </w:r>
+      <w:r>
+        <w:rPr>
+          <w:rStyle w:val="NormalTok"/>
+        </w:rPr>
+        <w:t xml:space="preserve"> series_levels,</w:t>
+      </w:r>
+      <w:r>
+        <w:br/>
+      </w:r>
+      <w:r>
+        <w:rPr>
+          <w:rStyle w:val="NormalTok"/>
+        </w:rPr>
+        <w:t xml:space="preserve">      </w:t>
+      </w:r>
+      <w:r>
+        <w:rPr>
+          <w:rStyle w:val="AttributeTok"/>
+        </w:rPr>
+        <w:t xml:space="preserve">values =</w:t>
+      </w:r>
+      <w:r>
+        <w:rPr>
+          <w:rStyle w:val="NormalTok"/>
+        </w:rPr>
+        <w:t xml:space="preserve"> </w:t>
+      </w:r>
+      <w:r>
+        <w:rPr>
+          <w:rStyle w:val="FunctionTok"/>
+        </w:rPr>
+        <w:t xml:space="preserve">c</w:t>
+      </w:r>
+      <w:r>
+        <w:rPr>
+          <w:rStyle w:val="NormalTok"/>
+        </w:rPr>
+        <w:t xml:space="preserve">(partition_colors, stats</w:t>
+      </w:r>
+      <w:r>
+        <w:rPr>
+          <w:rStyle w:val="SpecialCharTok"/>
+        </w:rPr>
+        <w:t xml:space="preserve">::</w:t>
+      </w:r>
+      <w:r>
+        <w:rPr>
+          <w:rStyle w:val="FunctionTok"/>
+        </w:rPr>
+        <w:t xml:space="preserve">setNames</w:t>
+      </w:r>
+      <w:r>
+        <w:rPr>
+          <w:rStyle w:val="NormalTok"/>
+        </w:rPr>
+        <w:t xml:space="preserve">(</w:t>
       </w:r>
       <w:r>
         <w:rPr>
           <w:rStyle w:val="StringTok"/>
         </w:rPr>
-        <w:t xml:space="preserve">"wt"</w:t>
+        <w:t xml:space="preserve">"blue"</w:t>
+      </w:r>
+      <w:r>
+        <w:rPr>
+          <w:rStyle w:val="NormalTok"/>
+        </w:rPr>
+        <w:t xml:space="preserve">, fit_label))</w:t>
+      </w:r>
+      <w:r>
+        <w:br/>
+      </w:r>
+      <w:r>
+        <w:rPr>
+          <w:rStyle w:val="NormalTok"/>
+        </w:rPr>
+        <w:t xml:space="preserve">    ) </w:t>
+      </w:r>
+      <w:r>
+        <w:rPr>
+          <w:rStyle w:val="SpecialCharTok"/>
+        </w:rPr>
+        <w:t xml:space="preserve">+</w:t>
+      </w:r>
+      <w:r>
+        <w:br/>
+      </w:r>
+      <w:r>
+        <w:rPr>
+          <w:rStyle w:val="NormalTok"/>
+        </w:rPr>
+        <w:t xml:space="preserve">    ggplot2</w:t>
+      </w:r>
+      <w:r>
+        <w:rPr>
+          <w:rStyle w:val="SpecialCharTok"/>
+        </w:rPr>
+        <w:t xml:space="preserve">::</w:t>
+      </w:r>
+      <w:r>
+        <w:rPr>
+          <w:rStyle w:val="FunctionTok"/>
+        </w:rPr>
+        <w:t xml:space="preserve">scale_shape_manual</w:t>
+      </w:r>
+      <w:r>
+        <w:rPr>
+          <w:rStyle w:val="NormalTok"/>
+        </w:rPr>
+        <w:t xml:space="preserve">(</w:t>
+      </w:r>
+      <w:r>
+        <w:br/>
+      </w:r>
+      <w:r>
+        <w:rPr>
+          <w:rStyle w:val="NormalTok"/>
+        </w:rPr>
+        <w:t xml:space="preserve">      </w:t>
+      </w:r>
+      <w:r>
+        <w:rPr>
+          <w:rStyle w:val="AttributeTok"/>
+        </w:rPr>
+        <w:t xml:space="preserve">limits =</w:t>
+      </w:r>
+      <w:r>
+        <w:rPr>
+          <w:rStyle w:val="NormalTok"/>
+        </w:rPr>
+        <w:t xml:space="preserve"> series_levels,</w:t>
+      </w:r>
+      <w:r>
+        <w:br/>
+      </w:r>
+      <w:r>
+        <w:rPr>
+          <w:rStyle w:val="NormalTok"/>
+        </w:rPr>
+        <w:t xml:space="preserve">      </w:t>
+      </w:r>
+      <w:r>
+        <w:rPr>
+          <w:rStyle w:val="AttributeTok"/>
+        </w:rPr>
+        <w:t xml:space="preserve">values =</w:t>
+      </w:r>
+      <w:r>
+        <w:rPr>
+          <w:rStyle w:val="NormalTok"/>
+        </w:rPr>
+        <w:t xml:space="preserve"> </w:t>
+      </w:r>
+      <w:r>
+        <w:rPr>
+          <w:rStyle w:val="FunctionTok"/>
+        </w:rPr>
+        <w:t xml:space="preserve">c</w:t>
+      </w:r>
+      <w:r>
+        <w:rPr>
+          <w:rStyle w:val="NormalTok"/>
+        </w:rPr>
+        <w:t xml:space="preserve">(partition_shapes, stats</w:t>
+      </w:r>
+      <w:r>
+        <w:rPr>
+          <w:rStyle w:val="SpecialCharTok"/>
+        </w:rPr>
+        <w:t xml:space="preserve">::</w:t>
+      </w:r>
+      <w:r>
+        <w:rPr>
+          <w:rStyle w:val="FunctionTok"/>
+        </w:rPr>
+        <w:t xml:space="preserve">setNames</w:t>
+      </w:r>
+      <w:r>
+        <w:rPr>
+          <w:rStyle w:val="NormalTok"/>
+        </w:rPr>
+        <w:t xml:space="preserve">(</w:t>
+      </w:r>
+      <w:r>
+        <w:rPr>
+          <w:rStyle w:val="ConstantTok"/>
+        </w:rPr>
+        <w:t xml:space="preserve">NA</w:t>
+      </w:r>
+      <w:r>
+        <w:rPr>
+          <w:rStyle w:val="NormalTok"/>
+        </w:rPr>
+        <w:t xml:space="preserve">, fit_label))</w:t>
+      </w:r>
+      <w:r>
+        <w:br/>
+      </w:r>
+      <w:r>
+        <w:rPr>
+          <w:rStyle w:val="NormalTok"/>
+        </w:rPr>
+        <w:t xml:space="preserve">    ) </w:t>
+      </w:r>
+      <w:r>
+        <w:rPr>
+          <w:rStyle w:val="SpecialCharTok"/>
+        </w:rPr>
+        <w:t xml:space="preserve">+</w:t>
+      </w:r>
+      <w:r>
+        <w:br/>
+      </w:r>
+      <w:r>
+        <w:rPr>
+          <w:rStyle w:val="NormalTok"/>
+        </w:rPr>
+        <w:t xml:space="preserve">    ggplot2</w:t>
+      </w:r>
+      <w:r>
+        <w:rPr>
+          <w:rStyle w:val="SpecialCharTok"/>
+        </w:rPr>
+        <w:t xml:space="preserve">::</w:t>
+      </w:r>
+      <w:r>
+        <w:rPr>
+          <w:rStyle w:val="FunctionTok"/>
+        </w:rPr>
+        <w:t xml:space="preserve">scale_linetype_manual</w:t>
+      </w:r>
+      <w:r>
+        <w:rPr>
+          <w:rStyle w:val="NormalTok"/>
+        </w:rPr>
+        <w:t xml:space="preserve">(</w:t>
+      </w:r>
+      <w:r>
+        <w:br/>
+      </w:r>
+      <w:r>
+        <w:rPr>
+          <w:rStyle w:val="NormalTok"/>
+        </w:rPr>
+        <w:t xml:space="preserve">      </w:t>
+      </w:r>
+      <w:r>
+        <w:rPr>
+          <w:rStyle w:val="AttributeTok"/>
+        </w:rPr>
+        <w:t xml:space="preserve">limits =</w:t>
+      </w:r>
+      <w:r>
+        <w:rPr>
+          <w:rStyle w:val="NormalTok"/>
+        </w:rPr>
+        <w:t xml:space="preserve"> series_levels,</w:t>
+      </w:r>
+      <w:r>
+        <w:br/>
+      </w:r>
+      <w:r>
+        <w:rPr>
+          <w:rStyle w:val="NormalTok"/>
+        </w:rPr>
+        <w:t xml:space="preserve">      </w:t>
+      </w:r>
+      <w:r>
+        <w:rPr>
+          <w:rStyle w:val="AttributeTok"/>
+        </w:rPr>
+        <w:t xml:space="preserve">values =</w:t>
+      </w:r>
+      <w:r>
+        <w:rPr>
+          <w:rStyle w:val="NormalTok"/>
+        </w:rPr>
+        <w:t xml:space="preserve"> stats</w:t>
+      </w:r>
+      <w:r>
+        <w:rPr>
+          <w:rStyle w:val="SpecialCharTok"/>
+        </w:rPr>
+        <w:t xml:space="preserve">::</w:t>
+      </w:r>
+      <w:r>
+        <w:rPr>
+          <w:rStyle w:val="FunctionTok"/>
+        </w:rPr>
+        <w:t xml:space="preserve">setNames</w:t>
+      </w:r>
+      <w:r>
+        <w:rPr>
+          <w:rStyle w:val="NormalTok"/>
+        </w:rPr>
+        <w:t xml:space="preserve">(</w:t>
+      </w:r>
+      <w:r>
+        <w:rPr>
+          <w:rStyle w:val="FunctionTok"/>
+        </w:rPr>
+        <w:t xml:space="preserve">c</w:t>
+      </w:r>
+      <w:r>
+        <w:rPr>
+          <w:rStyle w:val="NormalTok"/>
+        </w:rPr>
+        <w:t xml:space="preserve">(</w:t>
+      </w:r>
+      <w:r>
+        <w:rPr>
+          <w:rStyle w:val="DecValTok"/>
+        </w:rPr>
+        <w:t xml:space="preserve">0</w:t>
+      </w:r>
+      <w:r>
+        <w:rPr>
+          <w:rStyle w:val="NormalTok"/>
+        </w:rPr>
+        <w:t xml:space="preserve">, </w:t>
+      </w:r>
+      <w:r>
+        <w:rPr>
+          <w:rStyle w:val="DecValTok"/>
+        </w:rPr>
+        <w:t xml:space="preserve">0</w:t>
+      </w:r>
+      <w:r>
+        <w:rPr>
+          <w:rStyle w:val="NormalTok"/>
+        </w:rPr>
+        <w:t xml:space="preserve">, </w:t>
+      </w:r>
+      <w:r>
+        <w:rPr>
+          <w:rStyle w:val="DecValTok"/>
+        </w:rPr>
+        <w:t xml:space="preserve">0</w:t>
+      </w:r>
+      <w:r>
+        <w:rPr>
+          <w:rStyle w:val="NormalTok"/>
+        </w:rPr>
+        <w:t xml:space="preserve">, </w:t>
+      </w:r>
+      <w:r>
+        <w:rPr>
+          <w:rStyle w:val="DecValTok"/>
+        </w:rPr>
+        <w:t xml:space="preserve">1</w:t>
+      </w:r>
+      <w:r>
+        <w:rPr>
+          <w:rStyle w:val="NormalTok"/>
+        </w:rPr>
+        <w:t xml:space="preserve">), series_levels)</w:t>
+      </w:r>
+      <w:r>
+        <w:br/>
+      </w:r>
+      <w:r>
+        <w:rPr>
+          <w:rStyle w:val="NormalTok"/>
+        </w:rPr>
+        <w:t xml:space="preserve">    ) </w:t>
+      </w:r>
+      <w:r>
+        <w:rPr>
+          <w:rStyle w:val="SpecialCharTok"/>
+        </w:rPr>
+        <w:t xml:space="preserve">+</w:t>
+      </w:r>
+      <w:r>
+        <w:br/>
+      </w:r>
+      <w:r>
+        <w:rPr>
+          <w:rStyle w:val="NormalTok"/>
+        </w:rPr>
+        <w:t xml:space="preserve">    ggplot2</w:t>
+      </w:r>
+      <w:r>
+        <w:rPr>
+          <w:rStyle w:val="SpecialCharTok"/>
+        </w:rPr>
+        <w:t xml:space="preserve">::</w:t>
+      </w:r>
+      <w:r>
+        <w:rPr>
+          <w:rStyle w:val="FunctionTok"/>
+        </w:rPr>
+        <w:t xml:space="preserve">coord_cartesian</w:t>
+      </w:r>
+      <w:r>
+        <w:rPr>
+          <w:rStyle w:val="NormalTok"/>
+        </w:rPr>
+        <w:t xml:space="preserve">(</w:t>
+      </w:r>
+      <w:r>
+        <w:rPr>
+          <w:rStyle w:val="AttributeTok"/>
+        </w:rPr>
+        <w:t xml:space="preserve">xlim =</w:t>
+      </w:r>
+      <w:r>
+        <w:rPr>
+          <w:rStyle w:val="NormalTok"/>
+        </w:rPr>
+        <w:t xml:space="preserve"> wt_range, </w:t>
+      </w:r>
+      <w:r>
+        <w:rPr>
+          <w:rStyle w:val="AttributeTok"/>
+        </w:rPr>
+        <w:t xml:space="preserve">ylim =</w:t>
+      </w:r>
+      <w:r>
+        <w:rPr>
+          <w:rStyle w:val="NormalTok"/>
+        </w:rPr>
+        <w:t xml:space="preserve"> mpg_range) </w:t>
+      </w:r>
+      <w:r>
+        <w:rPr>
+          <w:rStyle w:val="SpecialCharTok"/>
+        </w:rPr>
+        <w:t xml:space="preserve">+</w:t>
+      </w:r>
+      <w:r>
+        <w:br/>
+      </w:r>
+      <w:r>
+        <w:rPr>
+          <w:rStyle w:val="NormalTok"/>
+        </w:rPr>
+        <w:t xml:space="preserve">    ggplot2</w:t>
+      </w:r>
+      <w:r>
+        <w:rPr>
+          <w:rStyle w:val="SpecialCharTok"/>
+        </w:rPr>
+        <w:t xml:space="preserve">::</w:t>
+      </w:r>
+      <w:r>
+        <w:rPr>
+          <w:rStyle w:val="FunctionTok"/>
+        </w:rPr>
+        <w:t xml:space="preserve">labs</w:t>
+      </w:r>
+      <w:r>
+        <w:rPr>
+          <w:rStyle w:val="NormalTok"/>
+        </w:rPr>
+        <w:t xml:space="preserve">(</w:t>
+      </w:r>
+      <w:r>
+        <w:rPr>
+          <w:rStyle w:val="AttributeTok"/>
+        </w:rPr>
+        <w:t xml:space="preserve">color =</w:t>
+      </w:r>
+      <w:r>
+        <w:rPr>
+          <w:rStyle w:val="NormalTok"/>
+        </w:rPr>
+        <w:t xml:space="preserve"> </w:t>
+      </w:r>
+      <w:r>
+        <w:rPr>
+          <w:rStyle w:val="ConstantTok"/>
+        </w:rPr>
+        <w:t xml:space="preserve">NULL</w:t>
+      </w:r>
+      <w:r>
+        <w:rPr>
+          <w:rStyle w:val="NormalTok"/>
+        </w:rPr>
+        <w:t xml:space="preserve">, </w:t>
+      </w:r>
+      <w:r>
+        <w:rPr>
+          <w:rStyle w:val="AttributeTok"/>
+        </w:rPr>
+        <w:t xml:space="preserve">shape =</w:t>
+      </w:r>
+      <w:r>
+        <w:rPr>
+          <w:rStyle w:val="NormalTok"/>
+        </w:rPr>
+        <w:t xml:space="preserve"> </w:t>
+      </w:r>
+      <w:r>
+        <w:rPr>
+          <w:rStyle w:val="ConstantTok"/>
+        </w:rPr>
+        <w:t xml:space="preserve">NULL</w:t>
+      </w:r>
+      <w:r>
+        <w:rPr>
+          <w:rStyle w:val="NormalTok"/>
+        </w:rPr>
+        <w:t xml:space="preserve">, </w:t>
+      </w:r>
+      <w:r>
+        <w:rPr>
+          <w:rStyle w:val="AttributeTok"/>
+        </w:rPr>
+        <w:t xml:space="preserve">linetype =</w:t>
+      </w:r>
+      <w:r>
+        <w:rPr>
+          <w:rStyle w:val="NormalTok"/>
+        </w:rPr>
+        <w:t xml:space="preserve"> </w:t>
+      </w:r>
+      <w:r>
+        <w:rPr>
+          <w:rStyle w:val="ConstantTok"/>
+        </w:rPr>
+        <w:t xml:space="preserve">NULL</w:t>
+      </w:r>
+      <w:r>
+        <w:rPr>
+          <w:rStyle w:val="NormalTok"/>
+        </w:rPr>
+        <w:t xml:space="preserve">) </w:t>
+      </w:r>
+      <w:r>
+        <w:rPr>
+          <w:rStyle w:val="SpecialCharTok"/>
+        </w:rPr>
+        <w:t xml:space="preserve">+</w:t>
+      </w:r>
+      <w:r>
+        <w:br/>
+      </w:r>
+      <w:r>
+        <w:rPr>
+          <w:rStyle w:val="NormalTok"/>
+        </w:rPr>
+        <w:t xml:space="preserve">    ggplot2</w:t>
+      </w:r>
+      <w:r>
+        <w:rPr>
+          <w:rStyle w:val="SpecialCharTok"/>
+        </w:rPr>
+        <w:t xml:space="preserve">::</w:t>
+      </w:r>
+      <w:r>
+        <w:rPr>
+          <w:rStyle w:val="FunctionTok"/>
+        </w:rPr>
+        <w:t xml:space="preserve">theme_minimal</w:t>
+      </w:r>
+      <w:r>
+        <w:rPr>
+          <w:rStyle w:val="NormalTok"/>
+        </w:rPr>
+        <w:t xml:space="preserve">() </w:t>
+      </w:r>
+      <w:r>
+        <w:rPr>
+          <w:rStyle w:val="SpecialCharTok"/>
+        </w:rPr>
+        <w:t xml:space="preserve">+</w:t>
+      </w:r>
+      <w:r>
+        <w:br/>
+      </w:r>
+      <w:r>
+        <w:rPr>
+          <w:rStyle w:val="NormalTok"/>
+        </w:rPr>
+        <w:t xml:space="preserve">    ggplot2</w:t>
+      </w:r>
+      <w:r>
+        <w:rPr>
+          <w:rStyle w:val="SpecialCharTok"/>
+        </w:rPr>
+        <w:t xml:space="preserve">::</w:t>
+      </w:r>
+      <w:r>
+        <w:rPr>
+          <w:rStyle w:val="FunctionTok"/>
+        </w:rPr>
+        <w:t xml:space="preserve">theme</w:t>
+      </w:r>
+      <w:r>
+        <w:rPr>
+          <w:rStyle w:val="NormalTok"/>
+        </w:rPr>
+        <w:t xml:space="preserve">(</w:t>
+      </w:r>
+      <w:r>
+        <w:br/>
+      </w:r>
+      <w:r>
+        <w:rPr>
+          <w:rStyle w:val="NormalTok"/>
+        </w:rPr>
+        <w:t xml:space="preserve">      </w:t>
+      </w:r>
+      <w:r>
+        <w:rPr>
+          <w:rStyle w:val="AttributeTok"/>
+        </w:rPr>
+        <w:t xml:space="preserve">legend.position =</w:t>
+      </w:r>
+      <w:r>
+        <w:rPr>
+          <w:rStyle w:val="NormalTok"/>
+        </w:rPr>
+        <w:t xml:space="preserve"> </w:t>
+      </w:r>
+      <w:r>
+        <w:rPr>
+          <w:rStyle w:val="StringTok"/>
+        </w:rPr>
+        <w:t xml:space="preserve">"inside"</w:t>
       </w:r>
       <w:r>
         <w:rPr>
@@ -24614,31 +25967,55 @@
         <w:rPr>
           <w:rStyle w:val="NormalTok"/>
         </w:rPr>
-        <w:t xml:space="preserve">    </w:t>
+        <w:t xml:space="preserve">      </w:t>
       </w:r>
       <w:r>
         <w:rPr>
           <w:rStyle w:val="AttributeTok"/>
         </w:rPr>
-        <w:t xml:space="preserve">ylab =</w:t>
-      </w:r>
-      <w:r>
-        <w:rPr>
-          <w:rStyle w:val="NormalTok"/>
-        </w:rPr>
-        <w:t xml:space="preserve"> </w:t>
-      </w:r>
-      <w:r>
-        <w:rPr>
-          <w:rStyle w:val="StringTok"/>
-        </w:rPr>
-        <w:t xml:space="preserve">"mpg"</w:t>
-      </w:r>
-      <w:r>
-        <w:rPr>
-          <w:rStyle w:val="NormalTok"/>
-        </w:rPr>
-        <w:t xml:space="preserve">,</w:t>
+        <w:t xml:space="preserve">legend.position.inside =</w:t>
+      </w:r>
+      <w:r>
+        <w:rPr>
+          <w:rStyle w:val="NormalTok"/>
+        </w:rPr>
+        <w:t xml:space="preserve"> </w:t>
+      </w:r>
+      <w:r>
+        <w:rPr>
+          <w:rStyle w:val="FunctionTok"/>
+        </w:rPr>
+        <w:t xml:space="preserve">c</w:t>
+      </w:r>
+      <w:r>
+        <w:rPr>
+          <w:rStyle w:val="NormalTok"/>
+        </w:rPr>
+        <w:t xml:space="preserve">(</w:t>
+      </w:r>
+      <w:r>
+        <w:rPr>
+          <w:rStyle w:val="FloatTok"/>
+        </w:rPr>
+        <w:t xml:space="preserve">0.85</w:t>
+      </w:r>
+      <w:r>
+        <w:rPr>
+          <w:rStyle w:val="NormalTok"/>
+        </w:rPr>
+        <w:t xml:space="preserve">, </w:t>
+      </w:r>
+      <w:r>
+        <w:rPr>
+          <w:rStyle w:val="FloatTok"/>
+        </w:rPr>
+        <w:t xml:space="preserve">0.8</w:t>
+      </w:r>
+      <w:r>
+        <w:rPr>
+          <w:rStyle w:val="NormalTok"/>
+        </w:rPr>
+        <w:t xml:space="preserve">)</w:t>
       </w:r>
       <w:r>
         <w:br/>
@@ -24647,31 +26024,7 @@
         <w:rPr>
           <w:rStyle w:val="NormalTok"/>
         </w:rPr>
-        <w:t xml:space="preserve">    </w:t>
-      </w:r>
-      <w:r>
-        <w:rPr>
-          <w:rStyle w:val="AttributeTok"/>
-        </w:rPr>
-        <w:t xml:space="preserve">pch =</w:t>
-      </w:r>
-      <w:r>
-        <w:rPr>
-          <w:rStyle w:val="NormalTok"/>
-        </w:rPr>
-        <w:t xml:space="preserve"> partition_shapes[[</w:t>
-      </w:r>
-      <w:r>
-        <w:rPr>
-          <w:rStyle w:val="StringTok"/>
-        </w:rPr>
-        <w:t xml:space="preserve">"training"</w:t>
-      </w:r>
-      <w:r>
-        <w:rPr>
-          <w:rStyle w:val="NormalTok"/>
-        </w:rPr>
-        <w:t xml:space="preserve">]],</w:t>
+        <w:t xml:space="preserve">    )</w:t>
       </w:r>
       <w:r>
         <w:br/>
@@ -24680,919 +26033,13 @@
         <w:rPr>
           <w:rStyle w:val="NormalTok"/>
         </w:rPr>
-        <w:t xml:space="preserve">    </w:t>
-      </w:r>
-      <w:r>
-        <w:rPr>
-          <w:rStyle w:val="AttributeTok"/>
-        </w:rPr>
-        <w:t xml:space="preserve">xlim =</w:t>
-      </w:r>
-      <w:r>
-        <w:rPr>
-          <w:rStyle w:val="NormalTok"/>
-        </w:rPr>
-        <w:t xml:space="preserve"> wt_range,</w:t>
-      </w:r>
-      <w:r>
-        <w:br/>
-      </w:r>
-      <w:r>
-        <w:rPr>
-          <w:rStyle w:val="NormalTok"/>
-        </w:rPr>
-        <w:t xml:space="preserve">    </w:t>
-      </w:r>
-      <w:r>
-        <w:rPr>
-          <w:rStyle w:val="AttributeTok"/>
-        </w:rPr>
-        <w:t xml:space="preserve">ylim =</w:t>
-      </w:r>
-      <w:r>
-        <w:rPr>
-          <w:rStyle w:val="NormalTok"/>
-        </w:rPr>
-        <w:t xml:space="preserve"> mpg_range,</w:t>
-      </w:r>
-      <w:r>
-        <w:br/>
-      </w:r>
-      <w:r>
-        <w:rPr>
-          <w:rStyle w:val="NormalTok"/>
-        </w:rPr>
-        <w:t xml:space="preserve">    </w:t>
-      </w:r>
-      <w:r>
-        <w:rPr>
-          <w:rStyle w:val="AttributeTok"/>
-        </w:rPr>
-        <w:t xml:space="preserve">col =</w:t>
-      </w:r>
-      <w:r>
-        <w:rPr>
-          <w:rStyle w:val="NormalTok"/>
-        </w:rPr>
-        <w:t xml:space="preserve"> partition_colors[[</w:t>
-      </w:r>
-      <w:r>
-        <w:rPr>
-          <w:rStyle w:val="StringTok"/>
-        </w:rPr>
-        <w:t xml:space="preserve">"training"</w:t>
-      </w:r>
-      <w:r>
-        <w:rPr>
-          <w:rStyle w:val="NormalTok"/>
-        </w:rPr>
-        <w:t xml:space="preserve">]]</w:t>
-      </w:r>
-      <w:r>
-        <w:br/>
-      </w:r>
-      <w:r>
-        <w:rPr>
-          <w:rStyle w:val="NormalTok"/>
-        </w:rPr>
-        <w:t xml:space="preserve">  )</w:t>
-      </w:r>
-      <w:r>
-        <w:br/>
-      </w:r>
-      <w:r>
-        <w:rPr>
-          <w:rStyle w:val="NormalTok"/>
-        </w:rPr>
         <w:t xml:space="preserve">  </w:t>
       </w:r>
       <w:r>
         <w:rPr>
-          <w:rStyle w:val="FunctionTok"/>
-        </w:rPr>
-        <w:t xml:space="preserve">points</w:t>
-      </w:r>
-      <w:r>
-        <w:rPr>
-          <w:rStyle w:val="NormalTok"/>
-        </w:rPr>
-        <w:t xml:space="preserve">(</w:t>
-      </w:r>
-      <w:r>
-        <w:br/>
-      </w:r>
-      <w:r>
-        <w:rPr>
-          <w:rStyle w:val="NormalTok"/>
-        </w:rPr>
-        <w:t xml:space="preserve">    valid_dat</w:t>
-      </w:r>
-      <w:r>
-        <w:rPr>
-          <w:rStyle w:val="SpecialCharTok"/>
-        </w:rPr>
-        <w:t xml:space="preserve">$</w:t>
-      </w:r>
-      <w:r>
-        <w:rPr>
-          <w:rStyle w:val="NormalTok"/>
-        </w:rPr>
-        <w:t xml:space="preserve">wt,</w:t>
-      </w:r>
-      <w:r>
-        <w:br/>
-      </w:r>
-      <w:r>
-        <w:rPr>
-          <w:rStyle w:val="NormalTok"/>
-        </w:rPr>
-        <w:t xml:space="preserve">    valid_dat</w:t>
-      </w:r>
-      <w:r>
-        <w:rPr>
-          <w:rStyle w:val="SpecialCharTok"/>
-        </w:rPr>
-        <w:t xml:space="preserve">$</w:t>
-      </w:r>
-      <w:r>
-        <w:rPr>
-          <w:rStyle w:val="NormalTok"/>
-        </w:rPr>
-        <w:t xml:space="preserve">mpg,</w:t>
-      </w:r>
-      <w:r>
-        <w:br/>
-      </w:r>
-      <w:r>
-        <w:rPr>
-          <w:rStyle w:val="NormalTok"/>
-        </w:rPr>
-        <w:t xml:space="preserve">    </w:t>
-      </w:r>
-      <w:r>
-        <w:rPr>
-          <w:rStyle w:val="AttributeTok"/>
-        </w:rPr>
-        <w:t xml:space="preserve">pch =</w:t>
-      </w:r>
-      <w:r>
-        <w:rPr>
-          <w:rStyle w:val="NormalTok"/>
-        </w:rPr>
-        <w:t xml:space="preserve"> partition_shapes[[</w:t>
-      </w:r>
-      <w:r>
-        <w:rPr>
-          <w:rStyle w:val="StringTok"/>
-        </w:rPr>
-        <w:t xml:space="preserve">"validation"</w:t>
-      </w:r>
-      <w:r>
-        <w:rPr>
-          <w:rStyle w:val="NormalTok"/>
-        </w:rPr>
-        <w:t xml:space="preserve">]],</w:t>
-      </w:r>
-      <w:r>
-        <w:br/>
-      </w:r>
-      <w:r>
-        <w:rPr>
-          <w:rStyle w:val="NormalTok"/>
-        </w:rPr>
-        <w:t xml:space="preserve">    </w:t>
-      </w:r>
-      <w:r>
-        <w:rPr>
-          <w:rStyle w:val="AttributeTok"/>
-        </w:rPr>
-        <w:t xml:space="preserve">col =</w:t>
-      </w:r>
-      <w:r>
-        <w:rPr>
-          <w:rStyle w:val="NormalTok"/>
-        </w:rPr>
-        <w:t xml:space="preserve"> partition_colors[[</w:t>
-      </w:r>
-      <w:r>
-        <w:rPr>
-          <w:rStyle w:val="StringTok"/>
-        </w:rPr>
-        <w:t xml:space="preserve">"validation"</w:t>
-      </w:r>
-      <w:r>
-        <w:rPr>
-          <w:rStyle w:val="NormalTok"/>
-        </w:rPr>
-        <w:t xml:space="preserve">]]</w:t>
-      </w:r>
-      <w:r>
-        <w:br/>
-      </w:r>
-      <w:r>
-        <w:rPr>
-          <w:rStyle w:val="NormalTok"/>
-        </w:rPr>
-        <w:t xml:space="preserve">  )</w:t>
-      </w:r>
-      <w:r>
-        <w:br/>
-      </w:r>
-      <w:r>
-        <w:rPr>
-          <w:rStyle w:val="NormalTok"/>
-        </w:rPr>
-        <w:t xml:space="preserve">  </w:t>
-      </w:r>
-      <w:r>
-        <w:rPr>
-          <w:rStyle w:val="FunctionTok"/>
-        </w:rPr>
-        <w:t xml:space="preserve">points</w:t>
-      </w:r>
-      <w:r>
-        <w:rPr>
-          <w:rStyle w:val="NormalTok"/>
-        </w:rPr>
-        <w:t xml:space="preserve">(</w:t>
-      </w:r>
-      <w:r>
-        <w:br/>
-      </w:r>
-      <w:r>
-        <w:rPr>
-          <w:rStyle w:val="NormalTok"/>
-        </w:rPr>
-        <w:t xml:space="preserve">    test_dat</w:t>
-      </w:r>
-      <w:r>
-        <w:rPr>
-          <w:rStyle w:val="SpecialCharTok"/>
-        </w:rPr>
-        <w:t xml:space="preserve">$</w:t>
-      </w:r>
-      <w:r>
-        <w:rPr>
-          <w:rStyle w:val="NormalTok"/>
-        </w:rPr>
-        <w:t xml:space="preserve">wt,</w:t>
-      </w:r>
-      <w:r>
-        <w:br/>
-      </w:r>
-      <w:r>
-        <w:rPr>
-          <w:rStyle w:val="NormalTok"/>
-        </w:rPr>
-        <w:t xml:space="preserve">    test_dat</w:t>
-      </w:r>
-      <w:r>
-        <w:rPr>
-          <w:rStyle w:val="SpecialCharTok"/>
-        </w:rPr>
-        <w:t xml:space="preserve">$</w:t>
-      </w:r>
-      <w:r>
-        <w:rPr>
-          <w:rStyle w:val="NormalTok"/>
-        </w:rPr>
-        <w:t xml:space="preserve">mpg,</w:t>
-      </w:r>
-      <w:r>
-        <w:br/>
-      </w:r>
-      <w:r>
-        <w:rPr>
-          <w:rStyle w:val="NormalTok"/>
-        </w:rPr>
-        <w:t xml:space="preserve">    </w:t>
-      </w:r>
-      <w:r>
-        <w:rPr>
-          <w:rStyle w:val="AttributeTok"/>
-        </w:rPr>
-        <w:t xml:space="preserve">pch =</w:t>
-      </w:r>
-      <w:r>
-        <w:rPr>
-          <w:rStyle w:val="NormalTok"/>
-        </w:rPr>
-        <w:t xml:space="preserve"> partition_shapes[[</w:t>
-      </w:r>
-      <w:r>
-        <w:rPr>
-          <w:rStyle w:val="StringTok"/>
-        </w:rPr>
-        <w:t xml:space="preserve">"test"</w:t>
-      </w:r>
-      <w:r>
-        <w:rPr>
-          <w:rStyle w:val="NormalTok"/>
-        </w:rPr>
-        <w:t xml:space="preserve">]],</w:t>
-      </w:r>
-      <w:r>
-        <w:br/>
-      </w:r>
-      <w:r>
-        <w:rPr>
-          <w:rStyle w:val="NormalTok"/>
-        </w:rPr>
-        <w:t xml:space="preserve">    </w:t>
-      </w:r>
-      <w:r>
-        <w:rPr>
-          <w:rStyle w:val="AttributeTok"/>
-        </w:rPr>
-        <w:t xml:space="preserve">col =</w:t>
-      </w:r>
-      <w:r>
-        <w:rPr>
-          <w:rStyle w:val="NormalTok"/>
-        </w:rPr>
-        <w:t xml:space="preserve"> partition_colors[[</w:t>
-      </w:r>
-      <w:r>
-        <w:rPr>
-          <w:rStyle w:val="StringTok"/>
-        </w:rPr>
-        <w:t xml:space="preserve">"test"</w:t>
-      </w:r>
-      <w:r>
-        <w:rPr>
-          <w:rStyle w:val="NormalTok"/>
-        </w:rPr>
-        <w:t xml:space="preserve">]]</w:t>
-      </w:r>
-      <w:r>
-        <w:br/>
-      </w:r>
-      <w:r>
-        <w:rPr>
-          <w:rStyle w:val="NormalTok"/>
-        </w:rPr>
-        <w:t xml:space="preserve">  )</w:t>
-      </w:r>
-      <w:r>
-        <w:br/>
-      </w:r>
-      <w:r>
-        <w:rPr>
-          <w:rStyle w:val="NormalTok"/>
-        </w:rPr>
-        <w:t xml:space="preserve">  fitted_curve </w:t>
-      </w:r>
-      <w:r>
-        <w:rPr>
-          <w:rStyle w:val="OtherTok"/>
-        </w:rPr>
-        <w:t xml:space="preserve">&lt;-</w:t>
-      </w:r>
-      <w:r>
-        <w:rPr>
-          <w:rStyle w:val="NormalTok"/>
-        </w:rPr>
-        <w:t xml:space="preserve"> </w:t>
-      </w:r>
-      <w:r>
-        <w:rPr>
-          <w:rStyle w:val="FunctionTok"/>
-        </w:rPr>
-        <w:t xml:space="preserve">predict</w:t>
-      </w:r>
-      <w:r>
-        <w:rPr>
-          <w:rStyle w:val="NormalTok"/>
-        </w:rPr>
-        <w:t xml:space="preserve">(model, </w:t>
-      </w:r>
-      <w:r>
-        <w:rPr>
-          <w:rStyle w:val="AttributeTok"/>
-        </w:rPr>
-        <w:t xml:space="preserve">newdata =</w:t>
-      </w:r>
-      <w:r>
-        <w:rPr>
-          <w:rStyle w:val="NormalTok"/>
-        </w:rPr>
-        <w:t xml:space="preserve"> </w:t>
-      </w:r>
-      <w:r>
-        <w:rPr>
-          <w:rStyle w:val="FunctionTok"/>
-        </w:rPr>
-        <w:t xml:space="preserve">data.frame</w:t>
-      </w:r>
-      <w:r>
-        <w:rPr>
-          <w:rStyle w:val="NormalTok"/>
-        </w:rPr>
-        <w:t xml:space="preserve">(</w:t>
-      </w:r>
-      <w:r>
-        <w:rPr>
-          <w:rStyle w:val="AttributeTok"/>
-        </w:rPr>
-        <w:t xml:space="preserve">wt =</w:t>
-      </w:r>
-      <w:r>
-        <w:rPr>
-          <w:rStyle w:val="NormalTok"/>
-        </w:rPr>
-        <w:t xml:space="preserve"> wt_grid))</w:t>
-      </w:r>
-      <w:r>
-        <w:br/>
-      </w:r>
-      <w:r>
-        <w:rPr>
-          <w:rStyle w:val="NormalTok"/>
-        </w:rPr>
-        <w:t xml:space="preserve">  </w:t>
-      </w:r>
-      <w:r>
-        <w:rPr>
-          <w:rStyle w:val="FunctionTok"/>
-        </w:rPr>
-        <w:t xml:space="preserve">lines</w:t>
-      </w:r>
-      <w:r>
-        <w:rPr>
-          <w:rStyle w:val="NormalTok"/>
-        </w:rPr>
-        <w:t xml:space="preserve">(wt_grid, fitted_curve, </w:t>
-      </w:r>
-      <w:r>
-        <w:rPr>
-          <w:rStyle w:val="AttributeTok"/>
-        </w:rPr>
-        <w:t xml:space="preserve">col =</w:t>
-      </w:r>
-      <w:r>
-        <w:rPr>
-          <w:rStyle w:val="NormalTok"/>
-        </w:rPr>
-        <w:t xml:space="preserve"> </w:t>
-      </w:r>
-      <w:r>
-        <w:rPr>
-          <w:rStyle w:val="StringTok"/>
-        </w:rPr>
-        <w:t xml:space="preserve">"blue"</w:t>
-      </w:r>
-      <w:r>
-        <w:rPr>
-          <w:rStyle w:val="NormalTok"/>
-        </w:rPr>
-        <w:t xml:space="preserve">, </w:t>
-      </w:r>
-      <w:r>
-        <w:rPr>
-          <w:rStyle w:val="AttributeTok"/>
-        </w:rPr>
-        <w:t xml:space="preserve">lwd =</w:t>
-      </w:r>
-      <w:r>
-        <w:rPr>
-          <w:rStyle w:val="NormalTok"/>
-        </w:rPr>
-        <w:t xml:space="preserve"> </w:t>
-      </w:r>
-      <w:r>
-        <w:rPr>
-          <w:rStyle w:val="DecValTok"/>
-        </w:rPr>
-        <w:t xml:space="preserve">2</w:t>
-      </w:r>
-      <w:r>
-        <w:rPr>
-          <w:rStyle w:val="NormalTok"/>
-        </w:rPr>
-        <w:t xml:space="preserve">)</w:t>
-      </w:r>
-      <w:r>
-        <w:br/>
-      </w:r>
-      <w:r>
-        <w:rPr>
-          <w:rStyle w:val="NormalTok"/>
-        </w:rPr>
-        <w:t xml:space="preserve">  </w:t>
-      </w:r>
-      <w:r>
-        <w:rPr>
-          <w:rStyle w:val="FunctionTok"/>
-        </w:rPr>
-        <w:t xml:space="preserve">legend</w:t>
-      </w:r>
-      <w:r>
-        <w:rPr>
-          <w:rStyle w:val="NormalTok"/>
-        </w:rPr>
-        <w:t xml:space="preserve">(</w:t>
-      </w:r>
-      <w:r>
-        <w:br/>
-      </w:r>
-      <w:r>
-        <w:rPr>
-          <w:rStyle w:val="NormalTok"/>
-        </w:rPr>
-        <w:t xml:space="preserve">    </w:t>
-      </w:r>
-      <w:r>
-        <w:rPr>
-          <w:rStyle w:val="StringTok"/>
-        </w:rPr>
-        <w:t xml:space="preserve">"topright"</w:t>
-      </w:r>
-      <w:r>
-        <w:rPr>
-          <w:rStyle w:val="NormalTok"/>
-        </w:rPr>
-        <w:t xml:space="preserve">,</w:t>
-      </w:r>
-      <w:r>
-        <w:br/>
-      </w:r>
-      <w:r>
-        <w:rPr>
-          <w:rStyle w:val="NormalTok"/>
-        </w:rPr>
-        <w:t xml:space="preserve">    </w:t>
-      </w:r>
-      <w:r>
-        <w:rPr>
-          <w:rStyle w:val="AttributeTok"/>
-        </w:rPr>
-        <w:t xml:space="preserve">legend =</w:t>
-      </w:r>
-      <w:r>
-        <w:rPr>
-          <w:rStyle w:val="NormalTok"/>
-        </w:rPr>
-        <w:t xml:space="preserve"> </w:t>
-      </w:r>
-      <w:r>
-        <w:rPr>
-          <w:rStyle w:val="FunctionTok"/>
-        </w:rPr>
-        <w:t xml:space="preserve">c</w:t>
-      </w:r>
-      <w:r>
-        <w:rPr>
-          <w:rStyle w:val="NormalTok"/>
-        </w:rPr>
-        <w:t xml:space="preserve">(</w:t>
-      </w:r>
-      <w:r>
-        <w:rPr>
-          <w:rStyle w:val="StringTok"/>
-        </w:rPr>
-        <w:t xml:space="preserve">"training"</w:t>
-      </w:r>
-      <w:r>
-        <w:rPr>
-          <w:rStyle w:val="NormalTok"/>
-        </w:rPr>
-        <w:t xml:space="preserve">, </w:t>
-      </w:r>
-      <w:r>
-        <w:rPr>
-          <w:rStyle w:val="StringTok"/>
-        </w:rPr>
-        <w:t xml:space="preserve">"validation"</w:t>
-      </w:r>
-      <w:r>
-        <w:rPr>
-          <w:rStyle w:val="NormalTok"/>
-        </w:rPr>
-        <w:t xml:space="preserve">, </w:t>
-      </w:r>
-      <w:r>
-        <w:rPr>
-          <w:rStyle w:val="StringTok"/>
-        </w:rPr>
-        <w:t xml:space="preserve">"test"</w:t>
-      </w:r>
-      <w:r>
-        <w:rPr>
-          <w:rStyle w:val="NormalTok"/>
-        </w:rPr>
-        <w:t xml:space="preserve">, fit_label),</w:t>
-      </w:r>
-      <w:r>
-        <w:br/>
-      </w:r>
-      <w:r>
-        <w:rPr>
-          <w:rStyle w:val="NormalTok"/>
-        </w:rPr>
-        <w:t xml:space="preserve">    </w:t>
-      </w:r>
-      <w:r>
-        <w:rPr>
-          <w:rStyle w:val="AttributeTok"/>
-        </w:rPr>
-        <w:t xml:space="preserve">col =</w:t>
-      </w:r>
-      <w:r>
-        <w:rPr>
-          <w:rStyle w:val="NormalTok"/>
-        </w:rPr>
-        <w:t xml:space="preserve"> </w:t>
-      </w:r>
-      <w:r>
-        <w:rPr>
-          <w:rStyle w:val="FunctionTok"/>
-        </w:rPr>
-        <w:t xml:space="preserve">c</w:t>
-      </w:r>
-      <w:r>
-        <w:rPr>
-          <w:rStyle w:val="NormalTok"/>
-        </w:rPr>
-        <w:t xml:space="preserve">(</w:t>
-      </w:r>
-      <w:r>
-        <w:rPr>
-          <w:rStyle w:val="FunctionTok"/>
-        </w:rPr>
-        <w:t xml:space="preserve">unname</w:t>
-      </w:r>
-      <w:r>
-        <w:rPr>
-          <w:rStyle w:val="NormalTok"/>
-        </w:rPr>
-        <w:t xml:space="preserve">(partition_colors), </w:t>
-      </w:r>
-      <w:r>
-        <w:rPr>
-          <w:rStyle w:val="StringTok"/>
-        </w:rPr>
-        <w:t xml:space="preserve">"blue"</w:t>
-      </w:r>
-      <w:r>
-        <w:rPr>
-          <w:rStyle w:val="NormalTok"/>
-        </w:rPr>
-        <w:t xml:space="preserve">),</w:t>
-      </w:r>
-      <w:r>
-        <w:br/>
-      </w:r>
-      <w:r>
-        <w:rPr>
-          <w:rStyle w:val="NormalTok"/>
-        </w:rPr>
-        <w:t xml:space="preserve">    </w:t>
-      </w:r>
-      <w:r>
-        <w:rPr>
-          <w:rStyle w:val="AttributeTok"/>
-        </w:rPr>
-        <w:t xml:space="preserve">pch =</w:t>
-      </w:r>
-      <w:r>
-        <w:rPr>
-          <w:rStyle w:val="NormalTok"/>
-        </w:rPr>
-        <w:t xml:space="preserve"> </w:t>
-      </w:r>
-      <w:r>
-        <w:rPr>
-          <w:rStyle w:val="FunctionTok"/>
-        </w:rPr>
-        <w:t xml:space="preserve">c</w:t>
-      </w:r>
-      <w:r>
-        <w:rPr>
-          <w:rStyle w:val="NormalTok"/>
-        </w:rPr>
-        <w:t xml:space="preserve">(</w:t>
-      </w:r>
-      <w:r>
-        <w:rPr>
-          <w:rStyle w:val="FunctionTok"/>
-        </w:rPr>
-        <w:t xml:space="preserve">unname</w:t>
-      </w:r>
-      <w:r>
-        <w:rPr>
-          <w:rStyle w:val="NormalTok"/>
-        </w:rPr>
-        <w:t xml:space="preserve">(partition_shapes), </w:t>
-      </w:r>
-      <w:r>
-        <w:rPr>
-          <w:rStyle w:val="ConstantTok"/>
-        </w:rPr>
-        <w:t xml:space="preserve">NA</w:t>
-      </w:r>
-      <w:r>
-        <w:rPr>
-          <w:rStyle w:val="NormalTok"/>
-        </w:rPr>
-        <w:t xml:space="preserve">),</w:t>
-      </w:r>
-      <w:r>
-        <w:br/>
-      </w:r>
-      <w:r>
-        <w:rPr>
-          <w:rStyle w:val="NormalTok"/>
-        </w:rPr>
-        <w:t xml:space="preserve">    </w:t>
-      </w:r>
-      <w:r>
-        <w:rPr>
-          <w:rStyle w:val="AttributeTok"/>
-        </w:rPr>
-        <w:t xml:space="preserve">lty =</w:t>
-      </w:r>
-      <w:r>
-        <w:rPr>
-          <w:rStyle w:val="NormalTok"/>
-        </w:rPr>
-        <w:t xml:space="preserve"> </w:t>
-      </w:r>
-      <w:r>
-        <w:rPr>
-          <w:rStyle w:val="FunctionTok"/>
-        </w:rPr>
-        <w:t xml:space="preserve">c</w:t>
-      </w:r>
-      <w:r>
-        <w:rPr>
-          <w:rStyle w:val="NormalTok"/>
-        </w:rPr>
-        <w:t xml:space="preserve">(</w:t>
-      </w:r>
-      <w:r>
-        <w:rPr>
-          <w:rStyle w:val="ConstantTok"/>
-        </w:rPr>
-        <w:t xml:space="preserve">NA</w:t>
-      </w:r>
-      <w:r>
-        <w:rPr>
-          <w:rStyle w:val="NormalTok"/>
-        </w:rPr>
-        <w:t xml:space="preserve">, </w:t>
-      </w:r>
-      <w:r>
-        <w:rPr>
-          <w:rStyle w:val="ConstantTok"/>
-        </w:rPr>
-        <w:t xml:space="preserve">NA</w:t>
-      </w:r>
-      <w:r>
-        <w:rPr>
-          <w:rStyle w:val="NormalTok"/>
-        </w:rPr>
-        <w:t xml:space="preserve">, </w:t>
-      </w:r>
-      <w:r>
-        <w:rPr>
-          <w:rStyle w:val="ConstantTok"/>
-        </w:rPr>
-        <w:t xml:space="preserve">NA</w:t>
-      </w:r>
-      <w:r>
-        <w:rPr>
-          <w:rStyle w:val="NormalTok"/>
-        </w:rPr>
-        <w:t xml:space="preserve">, </w:t>
-      </w:r>
-      <w:r>
-        <w:rPr>
-          <w:rStyle w:val="DecValTok"/>
-        </w:rPr>
-        <w:t xml:space="preserve">1</w:t>
-      </w:r>
-      <w:r>
-        <w:rPr>
-          <w:rStyle w:val="NormalTok"/>
-        </w:rPr>
-        <w:t xml:space="preserve">),</w:t>
-      </w:r>
-      <w:r>
-        <w:br/>
-      </w:r>
-      <w:r>
-        <w:rPr>
-          <w:rStyle w:val="NormalTok"/>
-        </w:rPr>
-        <w:t xml:space="preserve">    </w:t>
-      </w:r>
-      <w:r>
-        <w:rPr>
-          <w:rStyle w:val="AttributeTok"/>
-        </w:rPr>
-        <w:t xml:space="preserve">lwd =</w:t>
-      </w:r>
-      <w:r>
-        <w:rPr>
-          <w:rStyle w:val="NormalTok"/>
-        </w:rPr>
-        <w:t xml:space="preserve"> </w:t>
-      </w:r>
-      <w:r>
-        <w:rPr>
-          <w:rStyle w:val="FunctionTok"/>
-        </w:rPr>
-        <w:t xml:space="preserve">c</w:t>
-      </w:r>
-      <w:r>
-        <w:rPr>
-          <w:rStyle w:val="NormalTok"/>
-        </w:rPr>
-        <w:t xml:space="preserve">(</w:t>
-      </w:r>
-      <w:r>
-        <w:rPr>
-          <w:rStyle w:val="ConstantTok"/>
-        </w:rPr>
-        <w:t xml:space="preserve">NA</w:t>
-      </w:r>
-      <w:r>
-        <w:rPr>
-          <w:rStyle w:val="NormalTok"/>
-        </w:rPr>
-        <w:t xml:space="preserve">, </w:t>
-      </w:r>
-      <w:r>
-        <w:rPr>
-          <w:rStyle w:val="ConstantTok"/>
-        </w:rPr>
-        <w:t xml:space="preserve">NA</w:t>
-      </w:r>
-      <w:r>
-        <w:rPr>
-          <w:rStyle w:val="NormalTok"/>
-        </w:rPr>
-        <w:t xml:space="preserve">, </w:t>
-      </w:r>
-      <w:r>
-        <w:rPr>
-          <w:rStyle w:val="ConstantTok"/>
-        </w:rPr>
-        <w:t xml:space="preserve">NA</w:t>
-      </w:r>
-      <w:r>
-        <w:rPr>
-          <w:rStyle w:val="NormalTok"/>
-        </w:rPr>
-        <w:t xml:space="preserve">, </w:t>
-      </w:r>
-      <w:r>
-        <w:rPr>
-          <w:rStyle w:val="DecValTok"/>
-        </w:rPr>
-        <w:t xml:space="preserve">2</w:t>
-      </w:r>
-      <w:r>
-        <w:rPr>
-          <w:rStyle w:val="NormalTok"/>
-        </w:rPr>
-        <w:t xml:space="preserve">),</w:t>
-      </w:r>
-      <w:r>
-        <w:br/>
-      </w:r>
-      <w:r>
-        <w:rPr>
-          <w:rStyle w:val="NormalTok"/>
-        </w:rPr>
-        <w:t xml:space="preserve">    </w:t>
-      </w:r>
-      <w:r>
-        <w:rPr>
-          <w:rStyle w:val="AttributeTok"/>
-        </w:rPr>
-        <w:t xml:space="preserve">bty =</w:t>
-      </w:r>
-      <w:r>
-        <w:rPr>
-          <w:rStyle w:val="NormalTok"/>
-        </w:rPr>
-        <w:t xml:space="preserve"> </w:t>
-      </w:r>
-      <w:r>
-        <w:rPr>
-          <w:rStyle w:val="StringTok"/>
-        </w:rPr>
-        <w:t xml:space="preserve">"n"</w:t>
-      </w:r>
-      <w:r>
-        <w:br/>
-      </w:r>
-      <w:r>
-        <w:rPr>
-          <w:rStyle w:val="NormalTok"/>
-        </w:rPr>
-        <w:t xml:space="preserve">  )</w:t>
+          <w:rStyle w:val="CommentTok"/>
+        </w:rPr>
+        <w:t xml:space="preserve"># nolint end</w:t>
       </w:r>
       <w:r>
         <w:br/>
@@ -43145,7 +43592,7 @@
         <w:rPr>
           <w:rStyle w:val="CommentTok"/>
         </w:rPr>
-        <w:t xml:space="preserve">#&gt;    8.88178e-15    2.00000e+00</w:t>
+        <w:t xml:space="preserve">#&gt;    7.10543e-15    2.00000e+00</w:t>
       </w:r>
     </w:p>
     <w:p>
@@ -43153,7 +43600,7 @@
         <w:pStyle w:val="FirstParagraph"/>
       </w:pPr>
       <w:r>
-        <w:t xml:space="preserve">The two columns differ by at most 8.9e-15,</w:t>
+        <w:t xml:space="preserve">The two columns differ by at most 7.1e-15,</w:t>
       </w:r>
       <w:r>
         <w:t xml:space="preserve"> </w:t>

</xml_diff>

<commit_message>
Deploying to gh-pages from @ Morrison-Lab/sds@392d7896f420db045bf2d451985798bf2d00b692 🚀
</commit_message>
<xml_diff>
--- a/model-validation-handout.docx
+++ b/model-validation-handout.docx
@@ -15,7 +15,7 @@
         <w:pStyle w:val="Date"/>
       </w:pPr>
       <w:r>
-        <w:t xml:space="preserve">Last modified: 2026-10-13 16:43:17 (PDT)</w:t>
+        <w:t xml:space="preserve">Last modified: 2026-10-13 18:24:21 (PDT)</w:t>
       </w:r>
     </w:p>
     <w:bookmarkStart w:id="38" w:name="sec-prediction-rules"/>
@@ -18756,7 +18756,7 @@
     </w:p>
     <w:bookmarkEnd w:id="89"/>
     <w:bookmarkEnd w:id="90"/>
-    <w:bookmarkStart w:id="130" w:name="sec-data-splits"/>
+    <w:bookmarkStart w:id="133" w:name="sec-data-splits"/>
     <w:p>
       <w:pPr>
         <w:pStyle w:val="Heading2"/>
@@ -21333,7 +21333,7 @@
       <w:bookmarkEnd w:id="105"/>
     </w:p>
     <w:bookmarkEnd w:id="106"/>
-    <w:bookmarkStart w:id="107" w:name="rem-data-splits"/>
+    <w:bookmarkStart w:id="110" w:name="rem-data-splits"/>
     <w:p>
       <w:pPr>
         <w:pStyle w:val="FirstParagraph"/>
@@ -21492,8 +21492,82 @@
         <w:t xml:space="preserve">is what makes its score free of that optimism.</w:t>
       </w:r>
     </w:p>
-    <w:bookmarkEnd w:id="107"/>
-    <w:bookmarkStart w:id="129" w:name="exm-train-validation-test-split"/>
+    <w:p>
+      <w:pPr>
+        <w:pStyle w:val="BodyText"/>
+      </w:pPr>
+      <w:r>
+        <w:t xml:space="preserve">For further reading, the machine learning notes define the same three sets in their own notation:</w:t>
+      </w:r>
+      <w:r>
+        <w:t xml:space="preserve"> </w:t>
+      </w:r>
+      <w:r>
+        <w:t xml:space="preserve">the</w:t>
+      </w:r>
+      <w:r>
+        <w:t xml:space="preserve"> </w:t>
+      </w:r>
+      <w:hyperlink r:id="rId107">
+        <w:r>
+          <w:rPr>
+            <w:rStyle w:val="Hyperlink"/>
+          </w:rPr>
+          <w:t xml:space="preserve">training set</w:t>
+        </w:r>
+      </w:hyperlink>
+      <w:r>
+        <w:t xml:space="preserve">,</w:t>
+      </w:r>
+      <w:r>
+        <w:t xml:space="preserve"> </w:t>
+      </w:r>
+      <w:r>
+        <w:t xml:space="preserve">the</w:t>
+      </w:r>
+      <w:r>
+        <w:t xml:space="preserve"> </w:t>
+      </w:r>
+      <w:hyperlink r:id="rId108">
+        <w:r>
+          <w:rPr>
+            <w:rStyle w:val="Hyperlink"/>
+          </w:rPr>
+          <w:t xml:space="preserve">validation set</w:t>
+        </w:r>
+      </w:hyperlink>
+      <w:r>
+        <w:t xml:space="preserve">,</w:t>
+      </w:r>
+      <w:r>
+        <w:t xml:space="preserve"> </w:t>
+      </w:r>
+      <w:r>
+        <w:t xml:space="preserve">and the</w:t>
+      </w:r>
+      <w:r>
+        <w:t xml:space="preserve"> </w:t>
+      </w:r>
+      <w:hyperlink r:id="rId109">
+        <w:r>
+          <w:rPr>
+            <w:rStyle w:val="Hyperlink"/>
+          </w:rPr>
+          <w:t xml:space="preserve">test set</w:t>
+        </w:r>
+      </w:hyperlink>
+      <w:r>
+        <w:t xml:space="preserve">.</w:t>
+      </w:r>
+      <w:r>
+        <w:t xml:space="preserve"> </w:t>
+      </w:r>
+      <w:r>
+        <w:t xml:space="preserve">They use a different symbol for the training set and a parenthesized observation index, but the same three-way split.</w:t>
+      </w:r>
+    </w:p>
+    <w:bookmarkEnd w:id="110"/>
+    <w:bookmarkStart w:id="132" w:name="exm-train-validation-test-split"/>
     <w:p>
       <w:pPr>
         <w:pStyle w:val="BodyText"/>
@@ -21727,7 +21801,7 @@
       <w:tr>
         <w:tc>
           <w:tcPr/>
-          <w:bookmarkStart w:id="108" w:name="tbl-train-validation-test-split-sizes"/>
+          <w:bookmarkStart w:id="111" w:name="tbl-train-validation-test-split-sizes"/>
           <w:p>
             <w:pPr>
               <w:jc w:val="center"/>
@@ -22359,7 +22433,7 @@
               <w:t xml:space="preserve">#&gt; 3 test           7</w:t>
             </w:r>
           </w:p>
-          <w:bookmarkEnd w:id="108"/>
+          <w:bookmarkEnd w:id="111"/>
         </w:tc>
       </w:tr>
     </w:tbl>
@@ -26217,7 +26291,7 @@
       <w:tr>
         <w:tc>
           <w:tcPr/>
-          <w:bookmarkStart w:id="112" w:name="fig-linear-model-superimposed"/>
+          <w:bookmarkStart w:id="115" w:name="fig-linear-model-superimposed"/>
           <w:p>
             <w:pPr>
               <w:pStyle w:val="SourceCode"/>
@@ -26257,18 +26331,18 @@
                 <wp:inline>
                   <wp:extent cx="4620126" cy="3696101"/>
                   <wp:effectExtent b="0" l="0" r="0" t="0"/>
-                  <wp:docPr descr="" title="" id="110" name="Picture"/>
+                  <wp:docPr descr="" title="" id="113" name="Picture"/>
                   <a:graphic>
                     <a:graphicData uri="http://schemas.openxmlformats.org/drawingml/2006/picture">
                       <pic:pic>
                         <pic:nvPicPr>
-                          <pic:cNvPr descr="model-validation_files/figure-docx/unnamed-chunk-3-1.png" id="111" name="Picture"/>
+                          <pic:cNvPr descr="model-validation_files/figure-docx/unnamed-chunk-3-1.png" id="114" name="Picture"/>
                           <pic:cNvPicPr>
                             <a:picLocks noChangeArrowheads="1" noChangeAspect="1"/>
                           </pic:cNvPicPr>
                         </pic:nvPicPr>
                         <pic:blipFill>
-                          <a:blip r:embed="rId109"/>
+                          <a:blip r:embed="rId112"/>
                           <a:stretch>
                             <a:fillRect/>
                           </a:stretch>
@@ -26308,7 +26382,7 @@
               <w:t xml:space="preserve">Figure 2: Linear model fit superimposed on data partitions</w:t>
             </w:r>
           </w:p>
-          <w:bookmarkEnd w:id="112"/>
+          <w:bookmarkEnd w:id="115"/>
         </w:tc>
       </w:tr>
     </w:tbl>
@@ -26333,7 +26407,7 @@
       <w:tr>
         <w:tc>
           <w:tcPr/>
-          <w:bookmarkStart w:id="116" w:name="fig-quadratic-model-superimposed"/>
+          <w:bookmarkStart w:id="119" w:name="fig-quadratic-model-superimposed"/>
           <w:p>
             <w:pPr>
               <w:pStyle w:val="SourceCode"/>
@@ -26373,18 +26447,18 @@
                 <wp:inline>
                   <wp:extent cx="4620126" cy="3696101"/>
                   <wp:effectExtent b="0" l="0" r="0" t="0"/>
-                  <wp:docPr descr="" title="" id="114" name="Picture"/>
+                  <wp:docPr descr="" title="" id="117" name="Picture"/>
                   <a:graphic>
                     <a:graphicData uri="http://schemas.openxmlformats.org/drawingml/2006/picture">
                       <pic:pic>
                         <pic:nvPicPr>
-                          <pic:cNvPr descr="model-validation_files/figure-docx/unnamed-chunk-4-1.png" id="115" name="Picture"/>
+                          <pic:cNvPr descr="model-validation_files/figure-docx/unnamed-chunk-4-1.png" id="118" name="Picture"/>
                           <pic:cNvPicPr>
                             <a:picLocks noChangeArrowheads="1" noChangeAspect="1"/>
                           </pic:cNvPicPr>
                         </pic:nvPicPr>
                         <pic:blipFill>
-                          <a:blip r:embed="rId113"/>
+                          <a:blip r:embed="rId116"/>
                           <a:stretch>
                             <a:fillRect/>
                           </a:stretch>
@@ -26424,7 +26498,7 @@
               <w:t xml:space="preserve">Figure 3: Quadratic model fit superimposed on data partitions</w:t>
             </w:r>
           </w:p>
-          <w:bookmarkEnd w:id="116"/>
+          <w:bookmarkEnd w:id="119"/>
         </w:tc>
       </w:tr>
     </w:tbl>
@@ -26449,7 +26523,7 @@
       <w:tr>
         <w:tc>
           <w:tcPr/>
-          <w:bookmarkStart w:id="120" w:name="fig-cubic-model-superimposed"/>
+          <w:bookmarkStart w:id="123" w:name="fig-cubic-model-superimposed"/>
           <w:p>
             <w:pPr>
               <w:pStyle w:val="SourceCode"/>
@@ -26489,18 +26563,18 @@
                 <wp:inline>
                   <wp:extent cx="4620126" cy="3696101"/>
                   <wp:effectExtent b="0" l="0" r="0" t="0"/>
-                  <wp:docPr descr="" title="" id="118" name="Picture"/>
+                  <wp:docPr descr="" title="" id="121" name="Picture"/>
                   <a:graphic>
                     <a:graphicData uri="http://schemas.openxmlformats.org/drawingml/2006/picture">
                       <pic:pic>
                         <pic:nvPicPr>
-                          <pic:cNvPr descr="model-validation_files/figure-docx/unnamed-chunk-5-1.png" id="119" name="Picture"/>
+                          <pic:cNvPr descr="model-validation_files/figure-docx/unnamed-chunk-5-1.png" id="122" name="Picture"/>
                           <pic:cNvPicPr>
                             <a:picLocks noChangeArrowheads="1" noChangeAspect="1"/>
                           </pic:cNvPicPr>
                         </pic:nvPicPr>
                         <pic:blipFill>
-                          <a:blip r:embed="rId117"/>
+                          <a:blip r:embed="rId120"/>
                           <a:stretch>
                             <a:fillRect/>
                           </a:stretch>
@@ -26540,7 +26614,7 @@
               <w:t xml:space="preserve">Figure 4: Cubic model fit superimposed on data partitions</w:t>
             </w:r>
           </w:p>
-          <w:bookmarkEnd w:id="120"/>
+          <w:bookmarkEnd w:id="123"/>
         </w:tc>
       </w:tr>
     </w:tbl>
@@ -26565,7 +26639,7 @@
       <w:tr>
         <w:tc>
           <w:tcPr/>
-          <w:bookmarkStart w:id="124" w:name="fig-quartic-model-superimposed"/>
+          <w:bookmarkStart w:id="127" w:name="fig-quartic-model-superimposed"/>
           <w:p>
             <w:pPr>
               <w:pStyle w:val="SourceCode"/>
@@ -26605,18 +26679,18 @@
                 <wp:inline>
                   <wp:extent cx="4620126" cy="3696101"/>
                   <wp:effectExtent b="0" l="0" r="0" t="0"/>
-                  <wp:docPr descr="" title="" id="122" name="Picture"/>
+                  <wp:docPr descr="" title="" id="125" name="Picture"/>
                   <a:graphic>
                     <a:graphicData uri="http://schemas.openxmlformats.org/drawingml/2006/picture">
                       <pic:pic>
                         <pic:nvPicPr>
-                          <pic:cNvPr descr="model-validation_files/figure-docx/unnamed-chunk-6-1.png" id="123" name="Picture"/>
+                          <pic:cNvPr descr="model-validation_files/figure-docx/unnamed-chunk-6-1.png" id="126" name="Picture"/>
                           <pic:cNvPicPr>
                             <a:picLocks noChangeArrowheads="1" noChangeAspect="1"/>
                           </pic:cNvPicPr>
                         </pic:nvPicPr>
                         <pic:blipFill>
-                          <a:blip r:embed="rId121"/>
+                          <a:blip r:embed="rId124"/>
                           <a:stretch>
                             <a:fillRect/>
                           </a:stretch>
@@ -26656,7 +26730,7 @@
               <w:t xml:space="preserve">Figure 5: Quartic model fit superimposed on data partitions</w:t>
             </w:r>
           </w:p>
-          <w:bookmarkEnd w:id="124"/>
+          <w:bookmarkEnd w:id="127"/>
         </w:tc>
       </w:tr>
     </w:tbl>
@@ -26681,7 +26755,7 @@
       <w:tr>
         <w:tc>
           <w:tcPr/>
-          <w:bookmarkStart w:id="125" w:name="tbl-train-validation-results"/>
+          <w:bookmarkStart w:id="128" w:name="tbl-train-validation-results"/>
           <w:p>
             <w:pPr>
               <w:jc w:val="center"/>
@@ -26770,7 +26844,7 @@
               <w:t xml:space="preserve">#&gt; 4 quartic            1.90            3.97</w:t>
             </w:r>
           </w:p>
-          <w:bookmarkEnd w:id="125"/>
+          <w:bookmarkEnd w:id="128"/>
         </w:tc>
       </w:tr>
     </w:tbl>
@@ -26839,7 +26913,7 @@
       <w:tr>
         <w:tc>
           <w:tcPr/>
-          <w:bookmarkStart w:id="126" w:name="tbl-train-validation-test-rmse"/>
+          <w:bookmarkStart w:id="129" w:name="tbl-train-validation-test-rmse"/>
           <w:p>
             <w:pPr>
               <w:jc w:val="center"/>
@@ -26916,7 +26990,7 @@
               <w:t xml:space="preserve">#&gt; 2 test       linear  2.44</w:t>
             </w:r>
           </w:p>
-          <w:bookmarkEnd w:id="126"/>
+          <w:bookmarkEnd w:id="129"/>
         </w:tc>
       </w:tr>
     </w:tbl>
@@ -26969,12 +27043,12 @@
                 <wp:inline>
                   <wp:extent cx="152400" cy="152400"/>
                   <wp:effectExtent b="0" l="0" r="0" t="0"/>
-                  <wp:docPr descr="" title="" id="127" name="Picture"/>
+                  <wp:docPr descr="" title="" id="130" name="Picture"/>
                   <a:graphic>
                     <a:graphicData uri="http://schemas.openxmlformats.org/drawingml/2006/picture">
                       <pic:pic>
                         <pic:nvPicPr>
-                          <pic:cNvPr descr="/opt/quarto/share/formats/docx/note.png" id="128" name="Picture"/>
+                          <pic:cNvPr descr="/opt/quarto/share/formats/docx/note.png" id="131" name="Picture"/>
                           <pic:cNvPicPr>
                             <a:picLocks noChangeArrowheads="1" noChangeAspect="1"/>
                           </pic:cNvPicPr>
@@ -27053,9 +27127,9 @@
         </w:tc>
       </w:tr>
     </w:tbl>
-    <w:bookmarkEnd w:id="129"/>
-    <w:bookmarkEnd w:id="130"/>
-    <w:bookmarkStart w:id="171" w:name="sec-kfold"/>
+    <w:bookmarkEnd w:id="132"/>
+    <w:bookmarkEnd w:id="133"/>
+    <w:bookmarkStart w:id="174" w:name="sec-kfold"/>
     <w:p>
       <w:pPr>
         <w:pStyle w:val="Heading2"/>
@@ -27075,7 +27149,7 @@
         <w:t xml:space="preserve">-fold cross-validation</w:t>
       </w:r>
     </w:p>
-    <w:bookmarkStart w:id="131" w:name="exr-kfold"/>
+    <w:bookmarkStart w:id="134" w:name="exr-kfold"/>
     <w:p>
       <w:pPr>
         <w:pStyle w:val="FirstParagraph"/>
@@ -27226,8 +27300,8 @@
         <w:t xml:space="preserve">How many times is a given car used for fitting, and how many times for prediction?</w:t>
       </w:r>
     </w:p>
-    <w:bookmarkEnd w:id="131"/>
-    <w:bookmarkStart w:id="132" w:name="sol-kfold"/>
+    <w:bookmarkEnd w:id="134"/>
+    <w:bookmarkStart w:id="135" w:name="sol-kfold"/>
     <w:p>
       <w:pPr>
         <w:pStyle w:val="FirstParagraph"/>
@@ -27401,8 +27475,8 @@
         <w:t xml:space="preserve">fits.</w:t>
       </w:r>
     </w:p>
-    <w:bookmarkEnd w:id="132"/>
-    <w:bookmarkStart w:id="136" w:name="def-folds"/>
+    <w:bookmarkEnd w:id="135"/>
+    <w:bookmarkStart w:id="139" w:name="def-folds"/>
     <w:p>
       <w:pPr>
         <w:pStyle w:val="FirstParagraph"/>
@@ -27578,7 +27652,7 @@
       <w:pPr>
         <w:pStyle w:val="BodyText"/>
       </w:pPr>
-      <w:bookmarkStart w:id="133" w:name="eq-folds"/>
+      <w:bookmarkStart w:id="136" w:name="eq-folds"/>
       <m:oMathPara>
         <m:oMathParaPr>
           <m:jc m:val="center"/>
@@ -27669,7 +27743,7 @@
           </m:r>
         </m:oMath>
       </m:oMathPara>
-      <w:bookmarkEnd w:id="133"/>
+      <w:bookmarkEnd w:id="136"/>
     </w:p>
     <w:tbl>
       <w:tblPr>
@@ -27712,12 +27786,12 @@
                 <wp:inline>
                   <wp:extent cx="152400" cy="152400"/>
                   <wp:effectExtent b="0" l="0" r="0" t="0"/>
-                  <wp:docPr descr="" title="" id="134" name="Picture"/>
+                  <wp:docPr descr="" title="" id="137" name="Picture"/>
                   <a:graphic>
                     <a:graphicData uri="http://schemas.openxmlformats.org/drawingml/2006/picture">
                       <pic:pic>
                         <pic:nvPicPr>
-                          <pic:cNvPr descr="/opt/quarto/share/formats/docx/note.png" id="135" name="Picture"/>
+                          <pic:cNvPr descr="/opt/quarto/share/formats/docx/note.png" id="138" name="Picture"/>
                           <pic:cNvPicPr>
                             <a:picLocks noChangeArrowheads="1" noChangeAspect="1"/>
                           </pic:cNvPicPr>
@@ -27822,8 +27896,8 @@
         </w:tc>
       </w:tr>
     </w:tbl>
-    <w:bookmarkEnd w:id="136"/>
-    <w:bookmarkStart w:id="138" w:name="def-fold-size"/>
+    <w:bookmarkEnd w:id="139"/>
+    <w:bookmarkStart w:id="141" w:name="def-fold-size"/>
     <w:p>
       <w:pPr>
         <w:pStyle w:val="BodyText"/>
@@ -27917,7 +27991,7 @@
       <w:pPr>
         <w:pStyle w:val="BodyText"/>
       </w:pPr>
-      <w:bookmarkStart w:id="137" w:name="eq-fold-size"/>
+      <w:bookmarkStart w:id="140" w:name="eq-fold-size"/>
       <m:oMathPara>
         <m:oMathParaPr>
           <m:jc m:val="center"/>
@@ -28012,10 +28086,10 @@
           </m:r>
         </m:oMath>
       </m:oMathPara>
-      <w:bookmarkEnd w:id="137"/>
+      <w:bookmarkEnd w:id="140"/>
     </w:p>
-    <w:bookmarkEnd w:id="138"/>
-    <w:bookmarkStart w:id="142" w:name="def-fold-assignment"/>
+    <w:bookmarkEnd w:id="141"/>
+    <w:bookmarkStart w:id="145" w:name="def-fold-assignment"/>
     <w:p>
       <w:pPr>
         <w:pStyle w:val="FirstParagraph"/>
@@ -28166,7 +28240,7 @@
       <w:pPr>
         <w:pStyle w:val="BodyText"/>
       </w:pPr>
-      <w:bookmarkStart w:id="139" w:name="eq-fold-assignment"/>
+      <w:bookmarkStart w:id="142" w:name="eq-fold-assignment"/>
       <m:oMathPara>
         <m:oMathParaPr>
           <m:jc m:val="center"/>
@@ -28238,7 +28312,7 @@
           </m:r>
         </m:oMath>
       </m:oMathPara>
-      <w:bookmarkEnd w:id="139"/>
+      <w:bookmarkEnd w:id="142"/>
     </w:p>
     <w:tbl>
       <w:tblPr>
@@ -28281,12 +28355,12 @@
                 <wp:inline>
                   <wp:extent cx="152400" cy="152400"/>
                   <wp:effectExtent b="0" l="0" r="0" t="0"/>
-                  <wp:docPr descr="" title="" id="140" name="Picture"/>
+                  <wp:docPr descr="" title="" id="143" name="Picture"/>
                   <a:graphic>
                     <a:graphicData uri="http://schemas.openxmlformats.org/drawingml/2006/picture">
                       <pic:pic>
                         <pic:nvPicPr>
-                          <pic:cNvPr descr="/opt/quarto/share/formats/docx/note.png" id="141" name="Picture"/>
+                          <pic:cNvPr descr="/opt/quarto/share/formats/docx/note.png" id="144" name="Picture"/>
                           <pic:cNvPicPr>
                             <a:picLocks noChangeArrowheads="1" noChangeAspect="1"/>
                           </pic:cNvPicPr>
@@ -28394,8 +28468,8 @@
         </w:tc>
       </w:tr>
     </w:tbl>
-    <w:bookmarkEnd w:id="142"/>
-    <w:bookmarkStart w:id="146" w:name="def-fold-out-rule"/>
+    <w:bookmarkEnd w:id="145"/>
+    <w:bookmarkStart w:id="149" w:name="def-fold-out-rule"/>
     <w:p>
       <w:pPr>
         <w:pStyle w:val="BodyText"/>
@@ -28587,7 +28661,7 @@
       <w:pPr>
         <w:pStyle w:val="BodyText"/>
       </w:pPr>
-      <w:bookmarkStart w:id="143" w:name="eq-fold-out-rule"/>
+      <w:bookmarkStart w:id="146" w:name="eq-fold-out-rule"/>
       <m:oMathPara>
         <m:oMathParaPr>
           <m:jc m:val="center"/>
@@ -28820,7 +28894,7 @@
           </m:r>
         </m:oMath>
       </m:oMathPara>
-      <w:bookmarkEnd w:id="143"/>
+      <w:bookmarkEnd w:id="146"/>
     </w:p>
     <w:tbl>
       <w:tblPr>
@@ -28863,12 +28937,12 @@
                 <wp:inline>
                   <wp:extent cx="152400" cy="152400"/>
                   <wp:effectExtent b="0" l="0" r="0" t="0"/>
-                  <wp:docPr descr="" title="" id="144" name="Picture"/>
+                  <wp:docPr descr="" title="" id="147" name="Picture"/>
                   <a:graphic>
                     <a:graphicData uri="http://schemas.openxmlformats.org/drawingml/2006/picture">
                       <pic:pic>
                         <pic:nvPicPr>
-                          <pic:cNvPr descr="/opt/quarto/share/formats/docx/note.png" id="145" name="Picture"/>
+                          <pic:cNvPr descr="/opt/quarto/share/formats/docx/note.png" id="148" name="Picture"/>
                           <pic:cNvPicPr>
                             <a:picLocks noChangeArrowheads="1" noChangeAspect="1"/>
                           </pic:cNvPicPr>
@@ -28991,8 +29065,8 @@
         </w:tc>
       </w:tr>
     </w:tbl>
-    <w:bookmarkEnd w:id="146"/>
-    <w:bookmarkStart w:id="147" w:name="def-kfold"/>
+    <w:bookmarkEnd w:id="149"/>
+    <w:bookmarkStart w:id="150" w:name="def-kfold"/>
     <w:p>
       <w:pPr>
         <w:pStyle w:val="BodyText"/>
@@ -29339,8 +29413,8 @@
         <w:t xml:space="preserve">Compute a summary prediction-error measure across all folds.</w:t>
       </w:r>
     </w:p>
-    <w:bookmarkEnd w:id="147"/>
-    <w:bookmarkStart w:id="148" w:name="rem-kfold-vs-validation-set"/>
+    <w:bookmarkEnd w:id="150"/>
+    <w:bookmarkStart w:id="151" w:name="rem-kfold-vs-validation-set"/>
     <w:p>
       <w:pPr>
         <w:pStyle w:val="FirstParagraph"/>
@@ -29442,8 +29516,8 @@
         <w:t xml:space="preserve">give 4 fits on 24 cars each.</w:t>
       </w:r>
     </w:p>
-    <w:bookmarkEnd w:id="148"/>
-    <w:bookmarkStart w:id="152" w:name="def-cv-estimate"/>
+    <w:bookmarkEnd w:id="151"/>
+    <w:bookmarkStart w:id="155" w:name="def-cv-estimate"/>
     <w:p>
       <w:pPr>
         <w:pStyle w:val="BodyText"/>
@@ -29655,7 +29729,7 @@
       <w:pPr>
         <w:pStyle w:val="BodyText"/>
       </w:pPr>
-      <w:bookmarkStart w:id="149" w:name="eq-cv-estimate"/>
+      <w:bookmarkStart w:id="152" w:name="eq-cv-estimate"/>
       <m:oMathPara>
         <m:oMathParaPr>
           <m:jc m:val="center"/>
@@ -29914,7 +29988,7 @@
           </m:r>
         </m:oMath>
       </m:oMathPara>
-      <w:bookmarkEnd w:id="149"/>
+      <w:bookmarkEnd w:id="152"/>
     </w:p>
     <w:tbl>
       <w:tblPr>
@@ -29957,12 +30031,12 @@
                 <wp:inline>
                   <wp:extent cx="152400" cy="152400"/>
                   <wp:effectExtent b="0" l="0" r="0" t="0"/>
-                  <wp:docPr descr="" title="" id="150" name="Picture"/>
+                  <wp:docPr descr="" title="" id="153" name="Picture"/>
                   <a:graphic>
                     <a:graphicData uri="http://schemas.openxmlformats.org/drawingml/2006/picture">
                       <pic:pic>
                         <pic:nvPicPr>
-                          <pic:cNvPr descr="/opt/quarto/share/formats/docx/note.png" id="151" name="Picture"/>
+                          <pic:cNvPr descr="/opt/quarto/share/formats/docx/note.png" id="154" name="Picture"/>
                           <pic:cNvPicPr>
                             <a:picLocks noChangeArrowheads="1" noChangeAspect="1"/>
                           </pic:cNvPicPr>
@@ -30061,8 +30135,8 @@
         </w:tc>
       </w:tr>
     </w:tbl>
-    <w:bookmarkEnd w:id="152"/>
-    <w:bookmarkStart w:id="153" w:name="exr-cv-estimate-by-fold"/>
+    <w:bookmarkEnd w:id="155"/>
+    <w:bookmarkStart w:id="156" w:name="exr-cv-estimate-by-fold"/>
     <w:p>
       <w:pPr>
         <w:pStyle w:val="BodyText"/>
@@ -30263,8 +30337,8 @@
         <w:t xml:space="preserve">.</w:t>
       </w:r>
     </w:p>
-    <w:bookmarkEnd w:id="153"/>
-    <w:bookmarkStart w:id="154" w:name="sol-cv-estimate-by-fold"/>
+    <w:bookmarkEnd w:id="156"/>
+    <w:bookmarkStart w:id="157" w:name="sol-cv-estimate-by-fold"/>
     <w:p>
       <w:pPr>
         <w:pStyle w:val="BodyText"/>
@@ -31405,8 +31479,8 @@
         <w:t xml:space="preserve">so each inner sum uses a single fitted rule.</w:t>
       </w:r>
     </w:p>
-    <w:bookmarkEnd w:id="154"/>
-    <w:bookmarkStart w:id="156" w:name="thm-cv-estimate-by-fold"/>
+    <w:bookmarkEnd w:id="157"/>
+    <w:bookmarkStart w:id="159" w:name="thm-cv-estimate-by-fold"/>
     <w:p>
       <w:pPr>
         <w:pStyle w:val="BodyText"/>
@@ -31495,7 +31569,7 @@
       <w:pPr>
         <w:pStyle w:val="BodyText"/>
       </w:pPr>
-      <w:bookmarkStart w:id="155" w:name="eq-cv-estimate-by-fold"/>
+      <w:bookmarkStart w:id="158" w:name="eq-cv-estimate-by-fold"/>
       <m:oMathPara>
         <m:oMathParaPr>
           <m:jc m:val="center"/>
@@ -31768,9 +31842,9 @@
           </m:r>
         </m:oMath>
       </m:oMathPara>
-      <w:bookmarkEnd w:id="155"/>
+      <w:bookmarkEnd w:id="158"/>
     </w:p>
-    <w:bookmarkEnd w:id="156"/>
+    <w:bookmarkEnd w:id="159"/>
     <w:p>
       <w:pPr>
         <w:pStyle w:val="FirstParagraph"/>
@@ -31803,7 +31877,7 @@
         <w:t xml:space="preserve">.</w:t>
       </w:r>
     </w:p>
-    <w:bookmarkStart w:id="160" w:name="def-fold-mse"/>
+    <w:bookmarkStart w:id="163" w:name="def-fold-mse"/>
     <w:p>
       <w:pPr>
         <w:pStyle w:val="BodyText"/>
@@ -31971,7 +32045,7 @@
       <w:pPr>
         <w:pStyle w:val="BodyText"/>
       </w:pPr>
-      <w:bookmarkStart w:id="157" w:name="eq-fold-mse"/>
+      <w:bookmarkStart w:id="160" w:name="eq-fold-mse"/>
       <m:oMathPara>
         <m:oMathParaPr>
           <m:jc m:val="center"/>
@@ -32211,7 +32285,7 @@
           </m:r>
         </m:oMath>
       </m:oMathPara>
-      <w:bookmarkEnd w:id="157"/>
+      <w:bookmarkEnd w:id="160"/>
     </w:p>
     <w:tbl>
       <w:tblPr>
@@ -32254,12 +32328,12 @@
                 <wp:inline>
                   <wp:extent cx="152400" cy="152400"/>
                   <wp:effectExtent b="0" l="0" r="0" t="0"/>
-                  <wp:docPr descr="" title="" id="158" name="Picture"/>
+                  <wp:docPr descr="" title="" id="161" name="Picture"/>
                   <a:graphic>
                     <a:graphicData uri="http://schemas.openxmlformats.org/drawingml/2006/picture">
                       <pic:pic>
                         <pic:nvPicPr>
-                          <pic:cNvPr descr="/opt/quarto/share/formats/docx/note.png" id="159" name="Picture"/>
+                          <pic:cNvPr descr="/opt/quarto/share/formats/docx/note.png" id="162" name="Picture"/>
                           <pic:cNvPicPr>
                             <a:picLocks noChangeArrowheads="1" noChangeAspect="1"/>
                           </pic:cNvPicPr>
@@ -32390,8 +32464,8 @@
         </w:tc>
       </w:tr>
     </w:tbl>
-    <w:bookmarkEnd w:id="160"/>
-    <w:bookmarkStart w:id="161" w:name="rem-cv-estimate"/>
+    <w:bookmarkEnd w:id="163"/>
+    <w:bookmarkStart w:id="164" w:name="rem-cv-estimate"/>
     <w:p>
       <w:pPr>
         <w:pStyle w:val="BodyText"/>
@@ -33057,8 +33131,8 @@
         <w:t xml:space="preserve">use.</w:t>
       </w:r>
     </w:p>
-    <w:bookmarkEnd w:id="161"/>
-    <w:bookmarkStart w:id="162" w:name="rem-choosing-k"/>
+    <w:bookmarkEnd w:id="164"/>
+    <w:bookmarkStart w:id="165" w:name="rem-choosing-k"/>
     <w:p>
       <w:pPr>
         <w:pStyle w:val="BodyText"/>
@@ -33465,8 +33539,8 @@
         <w:t xml:space="preserve">is the usual compromise.</w:t>
       </w:r>
     </w:p>
-    <w:bookmarkEnd w:id="162"/>
-    <w:bookmarkStart w:id="167" w:name="exm-kfold-simulated"/>
+    <w:bookmarkEnd w:id="165"/>
+    <w:bookmarkStart w:id="170" w:name="exm-kfold-simulated"/>
     <w:p>
       <w:pPr>
         <w:pStyle w:val="BodyText"/>
@@ -34660,7 +34734,7 @@
       <w:tr>
         <w:tc>
           <w:tcPr/>
-          <w:bookmarkStart w:id="166" w:name="fig-cv-simulated"/>
+          <w:bookmarkStart w:id="169" w:name="fig-cv-simulated"/>
           <w:p>
             <w:pPr>
               <w:pStyle w:val="SourceCode"/>
@@ -35624,18 +35698,18 @@
                 <wp:inline>
                   <wp:extent cx="4620126" cy="3696101"/>
                   <wp:effectExtent b="0" l="0" r="0" t="0"/>
-                  <wp:docPr descr="" title="" id="164" name="Picture"/>
+                  <wp:docPr descr="" title="" id="167" name="Picture"/>
                   <a:graphic>
                     <a:graphicData uri="http://schemas.openxmlformats.org/drawingml/2006/picture">
                       <pic:pic>
                         <pic:nvPicPr>
-                          <pic:cNvPr descr="model-validation_files/figure-docx/cv-simulated-plot-1.png" id="165" name="Picture"/>
+                          <pic:cNvPr descr="model-validation_files/figure-docx/cv-simulated-plot-1.png" id="168" name="Picture"/>
                           <pic:cNvPicPr>
                             <a:picLocks noChangeArrowheads="1" noChangeAspect="1"/>
                           </pic:cNvPicPr>
                         </pic:nvPicPr>
                         <pic:blipFill>
-                          <a:blip r:embed="rId163"/>
+                          <a:blip r:embed="rId166"/>
                           <a:stretch>
                             <a:fillRect/>
                           </a:stretch>
@@ -35704,7 +35778,7 @@
               <w:t xml:space="preserve">could be computed from real data.</w:t>
             </w:r>
           </w:p>
-          <w:bookmarkEnd w:id="166"/>
+          <w:bookmarkEnd w:id="169"/>
         </w:tc>
       </w:tr>
     </w:tbl>
@@ -37592,8 +37666,8 @@
         <w:t xml:space="preserve">new ones.</w:t>
       </w:r>
     </w:p>
-    <w:bookmarkEnd w:id="167"/>
-    <w:bookmarkStart w:id="170" w:name="exm-kfold-mtcars"/>
+    <w:bookmarkEnd w:id="170"/>
+    <w:bookmarkStart w:id="173" w:name="exm-kfold-mtcars"/>
     <w:p>
       <w:pPr>
         <w:pStyle w:val="BodyText"/>
@@ -37796,7 +37870,7 @@
       <w:tr>
         <w:tc>
           <w:tcPr/>
-          <w:bookmarkStart w:id="168" w:name="tbl-cv-mtcars-repeats"/>
+          <w:bookmarkStart w:id="171" w:name="tbl-cv-mtcars-repeats"/>
           <w:p>
             <w:pPr>
               <w:jc w:val="center"/>
@@ -38452,7 +38526,7 @@
               <w:t xml:space="preserve">#&gt; 5         5     3.38     2.74     2.78     2.81</w:t>
             </w:r>
           </w:p>
-          <w:bookmarkEnd w:id="168"/>
+          <w:bookmarkEnd w:id="171"/>
         </w:tc>
       </w:tr>
     </w:tbl>
@@ -38477,7 +38551,7 @@
       <w:tr>
         <w:tc>
           <w:tcPr/>
-          <w:bookmarkStart w:id="169" w:name="tbl-cv-mtcars"/>
+          <w:bookmarkStart w:id="172" w:name="tbl-cv-mtcars"/>
           <w:p>
             <w:pPr>
               <w:jc w:val="center"/>
@@ -38833,7 +38907,7 @@
               <w:t xml:space="preserve">#&gt; 5         5 2       2.74</w:t>
             </w:r>
           </w:p>
-          <w:bookmarkEnd w:id="169"/>
+          <w:bookmarkEnd w:id="172"/>
         </w:tc>
       </w:tr>
     </w:tbl>
@@ -39523,9 +39597,9 @@
         <w:t xml:space="preserve">may not survive a different split.</w:t>
       </w:r>
     </w:p>
-    <w:bookmarkEnd w:id="170"/>
-    <w:bookmarkEnd w:id="171"/>
-    <w:bookmarkStart w:id="196" w:name="sec-loocv"/>
+    <w:bookmarkEnd w:id="173"/>
+    <w:bookmarkEnd w:id="174"/>
+    <w:bookmarkStart w:id="199" w:name="sec-loocv"/>
     <w:p>
       <w:pPr>
         <w:pStyle w:val="Heading2"/>
@@ -39534,7 +39608,7 @@
         <w:t xml:space="preserve">6 Leave-one-out cross-validation</w:t>
       </w:r>
     </w:p>
-    <w:bookmarkStart w:id="172" w:name="exr-loocv"/>
+    <w:bookmarkStart w:id="175" w:name="exr-loocv"/>
     <w:p>
       <w:pPr>
         <w:pStyle w:val="FirstParagraph"/>
@@ -39744,8 +39818,8 @@
         <w:t xml:space="preserve">) differ?</w:t>
       </w:r>
     </w:p>
-    <w:bookmarkEnd w:id="172"/>
-    <w:bookmarkStart w:id="173" w:name="sol-loocv"/>
+    <w:bookmarkEnd w:id="175"/>
+    <w:bookmarkStart w:id="176" w:name="sol-loocv"/>
     <w:p>
       <w:pPr>
         <w:pStyle w:val="FirstParagraph"/>
@@ -39942,8 +40016,8 @@
         <w:t xml:space="preserve">the estimate is not random.</w:t>
       </w:r>
     </w:p>
-    <w:bookmarkEnd w:id="173"/>
-    <w:bookmarkStart w:id="177" w:name="def-loocv"/>
+    <w:bookmarkEnd w:id="176"/>
+    <w:bookmarkStart w:id="180" w:name="def-loocv"/>
     <w:p>
       <w:pPr>
         <w:pStyle w:val="FirstParagraph"/>
@@ -40247,7 +40321,7 @@
       <w:pPr>
         <w:pStyle w:val="BodyText"/>
       </w:pPr>
-      <w:bookmarkStart w:id="174" w:name="eq-loocv"/>
+      <w:bookmarkStart w:id="177" w:name="eq-loocv"/>
       <m:oMathPara>
         <m:oMathParaPr>
           <m:jc m:val="center"/>
@@ -40493,7 +40567,7 @@
           </m:r>
         </m:oMath>
       </m:oMathPara>
-      <w:bookmarkEnd w:id="174"/>
+      <w:bookmarkEnd w:id="177"/>
     </w:p>
     <w:tbl>
       <w:tblPr>
@@ -40536,12 +40610,12 @@
                 <wp:inline>
                   <wp:extent cx="152400" cy="152400"/>
                   <wp:effectExtent b="0" l="0" r="0" t="0"/>
-                  <wp:docPr descr="" title="" id="175" name="Picture"/>
+                  <wp:docPr descr="" title="" id="178" name="Picture"/>
                   <a:graphic>
                     <a:graphicData uri="http://schemas.openxmlformats.org/drawingml/2006/picture">
                       <pic:pic>
                         <pic:nvPicPr>
-                          <pic:cNvPr descr="/opt/quarto/share/formats/docx/note.png" id="176" name="Picture"/>
+                          <pic:cNvPr descr="/opt/quarto/share/formats/docx/note.png" id="179" name="Picture"/>
                           <pic:cNvPicPr>
                             <a:picLocks noChangeArrowheads="1" noChangeAspect="1"/>
                           </pic:cNvPicPr>
@@ -40614,8 +40688,8 @@
         </w:tc>
       </w:tr>
     </w:tbl>
-    <w:bookmarkEnd w:id="177"/>
-    <w:bookmarkStart w:id="179" w:name="def-term-vector"/>
+    <w:bookmarkEnd w:id="180"/>
+    <w:bookmarkStart w:id="182" w:name="def-term-vector"/>
     <w:p>
       <w:pPr>
         <w:pStyle w:val="BodyText"/>
@@ -40852,7 +40926,7 @@
       <w:pPr>
         <w:pStyle w:val="BodyText"/>
       </w:pPr>
-      <w:bookmarkStart w:id="178" w:name="eq-term-vector"/>
+      <w:bookmarkStart w:id="181" w:name="eq-term-vector"/>
       <m:oMathPara>
         <m:oMathParaPr>
           <m:jc m:val="center"/>
@@ -41040,10 +41114,10 @@
           </m:r>
         </m:oMath>
       </m:oMathPara>
-      <w:bookmarkEnd w:id="178"/>
+      <w:bookmarkEnd w:id="181"/>
     </w:p>
-    <w:bookmarkEnd w:id="179"/>
-    <w:bookmarkStart w:id="181" w:name="rem-term-vector"/>
+    <w:bookmarkEnd w:id="182"/>
+    <w:bookmarkStart w:id="184" w:name="rem-term-vector"/>
     <w:p>
       <w:pPr>
         <w:pStyle w:val="FirstParagraph"/>
@@ -41136,7 +41210,7 @@
       <w:r>
         <w:t xml:space="preserve"> </w:t>
       </w:r>
-      <w:hyperlink r:id="rId180">
+      <w:hyperlink r:id="rId183">
         <w:r>
           <w:rPr>
             <w:rStyle w:val="Hyperlink"/>
@@ -41172,8 +41246,8 @@
         <w:t xml:space="preserve">.</w:t>
       </w:r>
     </w:p>
-    <w:bookmarkEnd w:id="181"/>
-    <w:bookmarkStart w:id="183" w:name="def-cross-product-matrix"/>
+    <w:bookmarkEnd w:id="184"/>
+    <w:bookmarkStart w:id="186" w:name="def-cross-product-matrix"/>
     <w:p>
       <w:pPr>
         <w:pStyle w:val="BodyText"/>
@@ -41295,7 +41369,7 @@
       <w:pPr>
         <w:pStyle w:val="BodyText"/>
       </w:pPr>
-      <w:bookmarkStart w:id="182" w:name="eq-cross-product-matrix"/>
+      <w:bookmarkStart w:id="185" w:name="eq-cross-product-matrix"/>
       <m:oMathPara>
         <m:oMathParaPr>
           <m:jc m:val="center"/>
@@ -41428,10 +41502,10 @@
           </m:r>
         </m:oMath>
       </m:oMathPara>
-      <w:bookmarkEnd w:id="182"/>
+      <w:bookmarkEnd w:id="185"/>
     </w:p>
-    <w:bookmarkEnd w:id="183"/>
-    <w:bookmarkStart w:id="189" w:name="def-leverage"/>
+    <w:bookmarkEnd w:id="186"/>
+    <w:bookmarkStart w:id="192" w:name="def-leverage"/>
     <w:p>
       <w:pPr>
         <w:pStyle w:val="FirstParagraph"/>
@@ -41452,7 +41526,7 @@
       <w:r>
         <w:t xml:space="preserve"> </w:t>
       </w:r>
-      <w:hyperlink r:id="rId184">
+      <w:hyperlink r:id="rId187">
         <w:r>
           <w:rPr>
             <w:rStyle w:val="Hyperlink"/>
@@ -41596,7 +41670,7 @@
       <w:pPr>
         <w:pStyle w:val="BodyText"/>
       </w:pPr>
-      <w:bookmarkStart w:id="185" w:name="eq-leverage"/>
+      <w:bookmarkStart w:id="188" w:name="eq-leverage"/>
       <m:oMathPara>
         <m:oMathParaPr>
           <m:jc m:val="center"/>
@@ -41727,7 +41801,7 @@
           </m:r>
         </m:oMath>
       </m:oMathPara>
-      <w:bookmarkEnd w:id="185"/>
+      <w:bookmarkEnd w:id="188"/>
     </w:p>
     <w:tbl>
       <w:tblPr>
@@ -41770,12 +41844,12 @@
                 <wp:inline>
                   <wp:extent cx="152400" cy="152400"/>
                   <wp:effectExtent b="0" l="0" r="0" t="0"/>
-                  <wp:docPr descr="" title="" id="186" name="Picture"/>
+                  <wp:docPr descr="" title="" id="189" name="Picture"/>
                   <a:graphic>
                     <a:graphicData uri="http://schemas.openxmlformats.org/drawingml/2006/picture">
                       <pic:pic>
                         <pic:nvPicPr>
-                          <pic:cNvPr descr="/opt/quarto/share/formats/docx/note.png" id="187" name="Picture"/>
+                          <pic:cNvPr descr="/opt/quarto/share/formats/docx/note.png" id="190" name="Picture"/>
                           <pic:cNvPicPr>
                             <a:picLocks noChangeArrowheads="1" noChangeAspect="1"/>
                           </pic:cNvPicPr>
@@ -41869,7 +41943,7 @@
             <w:r>
               <w:t xml:space="preserve"> </w:t>
             </w:r>
-            <w:hyperlink r:id="rId188">
+            <w:hyperlink r:id="rId191">
               <w:r>
                 <w:rPr>
                   <w:rStyle w:val="Hyperlink"/>
@@ -41885,8 +41959,8 @@
         </w:tc>
       </w:tr>
     </w:tbl>
-    <w:bookmarkEnd w:id="189"/>
-    <w:bookmarkStart w:id="193" w:name="thm-loocv-shortcut"/>
+    <w:bookmarkEnd w:id="192"/>
+    <w:bookmarkStart w:id="196" w:name="thm-loocv-shortcut"/>
     <w:p>
       <w:pPr>
         <w:pStyle w:val="BodyText"/>
@@ -41907,7 +41981,7 @@
       <w:r>
         <w:t xml:space="preserve"> </w:t>
       </w:r>
-      <w:hyperlink r:id="rId184">
+      <w:hyperlink r:id="rId187">
         <w:r>
           <w:rPr>
             <w:rStyle w:val="Hyperlink"/>
@@ -42133,7 +42207,7 @@
       <w:pPr>
         <w:pStyle w:val="BodyText"/>
       </w:pPr>
-      <w:bookmarkStart w:id="190" w:name="eq-loocv-shortcut"/>
+      <w:bookmarkStart w:id="193" w:name="eq-loocv-shortcut"/>
       <m:oMathPara>
         <m:oMathParaPr>
           <m:jc m:val="center"/>
@@ -42323,7 +42397,7 @@
           </m:r>
         </m:oMath>
       </m:oMathPara>
-      <w:bookmarkEnd w:id="190"/>
+      <w:bookmarkEnd w:id="193"/>
     </w:p>
     <w:tbl>
       <w:tblPr>
@@ -42366,12 +42440,12 @@
                 <wp:inline>
                   <wp:extent cx="152400" cy="152400"/>
                   <wp:effectExtent b="0" l="0" r="0" t="0"/>
-                  <wp:docPr descr="" title="" id="191" name="Picture"/>
+                  <wp:docPr descr="" title="" id="194" name="Picture"/>
                   <a:graphic>
                     <a:graphicData uri="http://schemas.openxmlformats.org/drawingml/2006/picture">
                       <pic:pic>
                         <pic:nvPicPr>
-                          <pic:cNvPr descr="/opt/quarto/share/formats/docx/note.png" id="192" name="Picture"/>
+                          <pic:cNvPr descr="/opt/quarto/share/formats/docx/note.png" id="195" name="Picture"/>
                           <pic:cNvPicPr>
                             <a:picLocks noChangeArrowheads="1" noChangeAspect="1"/>
                           </pic:cNvPicPr>
@@ -42465,7 +42539,7 @@
         </w:tc>
       </w:tr>
     </w:tbl>
-    <w:bookmarkEnd w:id="193"/>
+    <w:bookmarkEnd w:id="196"/>
     <w:p>
       <w:pPr>
         <w:pStyle w:val="BodyText"/>
@@ -42594,7 +42668,7 @@
         <w:t xml:space="preserve">which this page does not develop.</w:t>
       </w:r>
     </w:p>
-    <w:bookmarkStart w:id="194" w:name="exm-loocv-shortcut"/>
+    <w:bookmarkStart w:id="197" w:name="exm-loocv-shortcut"/>
     <w:p>
       <w:pPr>
         <w:pStyle w:val="BodyText"/>
@@ -43682,7 +43756,7 @@
         <w:rPr>
           <w:rStyle w:val="CommentTok"/>
         </w:rPr>
-        <w:t xml:space="preserve">#&gt;    7.10543e-15    2.00000e+00</w:t>
+        <w:t xml:space="preserve">#&gt;    8.88178e-15    2.00000e+00</w:t>
       </w:r>
     </w:p>
     <w:p>
@@ -43690,7 +43764,7 @@
         <w:pStyle w:val="FirstParagraph"/>
       </w:pPr>
       <w:r>
-        <w:t xml:space="preserve">The two columns differ by at most 7.1e-15,</w:t>
+        <w:t xml:space="preserve">The two columns differ by at most 8.9e-15,</w:t>
       </w:r>
       <w:r>
         <w:t xml:space="preserve"> </w:t>
@@ -43734,8 +43808,8 @@
         <w:t xml:space="preserve">rerunning it always gives the same choice.</w:t>
       </w:r>
     </w:p>
-    <w:bookmarkEnd w:id="194"/>
-    <w:bookmarkStart w:id="195" w:name="rem-loocv"/>
+    <w:bookmarkEnd w:id="197"/>
+    <w:bookmarkStart w:id="198" w:name="rem-loocv"/>
     <w:p>
       <w:pPr>
         <w:pStyle w:val="BodyText"/>
@@ -44207,9 +44281,9 @@
         <w:t xml:space="preserve">fits.</w:t>
       </w:r>
     </w:p>
-    <w:bookmarkEnd w:id="195"/>
-    <w:bookmarkEnd w:id="196"/>
-    <w:bookmarkStart w:id="229" w:name="sec-cv-model-choice"/>
+    <w:bookmarkEnd w:id="198"/>
+    <w:bookmarkEnd w:id="199"/>
+    <w:bookmarkStart w:id="232" w:name="sec-cv-model-choice"/>
     <w:p>
       <w:pPr>
         <w:pStyle w:val="Heading2"/>
@@ -44218,7 +44292,7 @@
         <w:t xml:space="preserve">7 Choosing a model by cross-validation</w:t>
       </w:r>
     </w:p>
-    <w:bookmarkStart w:id="198" w:name="def-cv-estimate-indexed"/>
+    <w:bookmarkStart w:id="201" w:name="def-cv-estimate-indexed"/>
     <w:p>
       <w:pPr>
         <w:pStyle w:val="FirstParagraph"/>
@@ -44544,7 +44618,7 @@
       <w:pPr>
         <w:pStyle w:val="BodyText"/>
       </w:pPr>
-      <w:bookmarkStart w:id="197" w:name="eq-cv-estimate-indexed"/>
+      <w:bookmarkStart w:id="200" w:name="eq-cv-estimate-indexed"/>
       <m:oMathPara>
         <m:oMathParaPr>
           <m:jc m:val="center"/>
@@ -44937,10 +45011,10 @@
           </m:r>
         </m:oMath>
       </m:oMathPara>
-      <w:bookmarkEnd w:id="197"/>
+      <w:bookmarkEnd w:id="200"/>
     </w:p>
-    <w:bookmarkEnd w:id="198"/>
-    <w:bookmarkStart w:id="200" w:name="def-cv-choice"/>
+    <w:bookmarkEnd w:id="201"/>
+    <w:bookmarkStart w:id="203" w:name="def-cv-choice"/>
     <w:p>
       <w:pPr>
         <w:pStyle w:val="FirstParagraph"/>
@@ -45230,7 +45304,7 @@
       <w:pPr>
         <w:pStyle w:val="BodyText"/>
       </w:pPr>
-      <w:bookmarkStart w:id="199" w:name="eq-cv-choice"/>
+      <w:bookmarkStart w:id="202" w:name="eq-cv-choice"/>
       <m:oMathPara>
         <m:oMathParaPr>
           <m:jc m:val="center"/>
@@ -45475,10 +45549,10 @@
           </m:r>
         </m:oMath>
       </m:oMathPara>
-      <w:bookmarkEnd w:id="199"/>
+      <w:bookmarkEnd w:id="202"/>
     </w:p>
-    <w:bookmarkEnd w:id="200"/>
-    <w:bookmarkStart w:id="204" w:name="def-nested-cv"/>
+    <w:bookmarkEnd w:id="203"/>
+    <w:bookmarkStart w:id="207" w:name="def-nested-cv"/>
     <w:p>
       <w:pPr>
         <w:pStyle w:val="FirstParagraph"/>
@@ -45592,7 +45666,7 @@
       <w:pPr>
         <w:pStyle w:val="BodyText"/>
       </w:pPr>
-      <w:bookmarkStart w:id="201" w:name="eq-nested-cv"/>
+      <w:bookmarkStart w:id="204" w:name="eq-nested-cv"/>
       <m:oMathPara>
         <m:oMathParaPr>
           <m:jc m:val="center"/>
@@ -45706,7 +45780,7 @@
           </m:r>
         </m:oMath>
       </m:oMathPara>
-      <w:bookmarkEnd w:id="201"/>
+      <w:bookmarkEnd w:id="204"/>
     </w:p>
     <w:tbl>
       <w:tblPr>
@@ -45749,12 +45823,12 @@
                 <wp:inline>
                   <wp:extent cx="152400" cy="152400"/>
                   <wp:effectExtent b="0" l="0" r="0" t="0"/>
-                  <wp:docPr descr="" title="" id="202" name="Picture"/>
+                  <wp:docPr descr="" title="" id="205" name="Picture"/>
                   <a:graphic>
                     <a:graphicData uri="http://schemas.openxmlformats.org/drawingml/2006/picture">
                       <pic:pic>
                         <pic:nvPicPr>
-                          <pic:cNvPr descr="/opt/quarto/share/formats/docx/note.png" id="203" name="Picture"/>
+                          <pic:cNvPr descr="/opt/quarto/share/formats/docx/note.png" id="206" name="Picture"/>
                           <pic:cNvPicPr>
                             <a:picLocks noChangeArrowheads="1" noChangeAspect="1"/>
                           </pic:cNvPicPr>
@@ -45836,8 +45910,8 @@
         </w:tc>
       </w:tr>
     </w:tbl>
-    <w:bookmarkEnd w:id="204"/>
-    <w:bookmarkStart w:id="205" w:name="rem-nested-cv"/>
+    <w:bookmarkEnd w:id="207"/>
+    <w:bookmarkStart w:id="208" w:name="rem-nested-cv"/>
     <w:p>
       <w:pPr>
         <w:pStyle w:val="BodyText"/>
@@ -45993,8 +46067,8 @@
         <w:t xml:space="preserve">That inner cross-validation is the nested one.</w:t>
       </w:r>
     </w:p>
-    <w:bookmarkEnd w:id="205"/>
-    <w:bookmarkStart w:id="208" w:name="rem-cv-winner-optimistic"/>
+    <w:bookmarkEnd w:id="208"/>
+    <w:bookmarkStart w:id="211" w:name="rem-cv-winner-optimistic"/>
     <w:p>
       <w:pPr>
         <w:pStyle w:val="BodyText"/>
@@ -46187,12 +46261,12 @@
                 <wp:inline>
                   <wp:extent cx="152400" cy="152400"/>
                   <wp:effectExtent b="0" l="0" r="0" t="0"/>
-                  <wp:docPr descr="" title="" id="206" name="Picture"/>
+                  <wp:docPr descr="" title="" id="209" name="Picture"/>
                   <a:graphic>
                     <a:graphicData uri="http://schemas.openxmlformats.org/drawingml/2006/picture">
                       <pic:pic>
                         <pic:nvPicPr>
-                          <pic:cNvPr descr="/opt/quarto/share/formats/docx/note.png" id="207" name="Picture"/>
+                          <pic:cNvPr descr="/opt/quarto/share/formats/docx/note.png" id="210" name="Picture"/>
                           <pic:cNvPicPr>
                             <a:picLocks noChangeArrowheads="1" noChangeAspect="1"/>
                           </pic:cNvPicPr>
@@ -46262,8 +46336,8 @@
         </w:tc>
       </w:tr>
     </w:tbl>
-    <w:bookmarkEnd w:id="208"/>
-    <w:bookmarkStart w:id="213" w:name="def-cv-se"/>
+    <w:bookmarkEnd w:id="211"/>
+    <w:bookmarkStart w:id="216" w:name="def-cv-se"/>
     <w:p>
       <w:pPr>
         <w:pStyle w:val="BodyText"/>
@@ -46367,7 +46441,7 @@
       <w:r>
         <w:t xml:space="preserve"> </w:t>
       </w:r>
-      <w:hyperlink r:id="rId209">
+      <w:hyperlink r:id="rId212">
         <w:r>
           <w:rPr>
             <w:rStyle w:val="Hyperlink"/>
@@ -46433,7 +46507,7 @@
       <w:pPr>
         <w:pStyle w:val="BodyText"/>
       </w:pPr>
-      <w:bookmarkStart w:id="210" w:name="eq-cv-se"/>
+      <w:bookmarkStart w:id="213" w:name="eq-cv-se"/>
       <m:oMathPara>
         <m:oMathParaPr>
           <m:jc m:val="center"/>
@@ -46608,7 +46682,7 @@
           </m:r>
         </m:oMath>
       </m:oMathPara>
-      <w:bookmarkEnd w:id="210"/>
+      <w:bookmarkEnd w:id="213"/>
     </w:p>
     <w:tbl>
       <w:tblPr>
@@ -46651,12 +46725,12 @@
                 <wp:inline>
                   <wp:extent cx="152400" cy="152400"/>
                   <wp:effectExtent b="0" l="0" r="0" t="0"/>
-                  <wp:docPr descr="" title="" id="211" name="Picture"/>
+                  <wp:docPr descr="" title="" id="214" name="Picture"/>
                   <a:graphic>
                     <a:graphicData uri="http://schemas.openxmlformats.org/drawingml/2006/picture">
                       <pic:pic>
                         <pic:nvPicPr>
-                          <pic:cNvPr descr="/opt/quarto/share/formats/docx/note.png" id="212" name="Picture"/>
+                          <pic:cNvPr descr="/opt/quarto/share/formats/docx/note.png" id="215" name="Picture"/>
                           <pic:cNvPicPr>
                             <a:picLocks noChangeArrowheads="1" noChangeAspect="1"/>
                           </pic:cNvPicPr>
@@ -46729,8 +46803,8 @@
         </w:tc>
       </w:tr>
     </w:tbl>
-    <w:bookmarkEnd w:id="213"/>
-    <w:bookmarkStart w:id="215" w:name="rem-cv-se"/>
+    <w:bookmarkEnd w:id="216"/>
+    <w:bookmarkStart w:id="218" w:name="rem-cv-se"/>
     <w:p>
       <w:pPr>
         <w:pStyle w:val="BodyText"/>
@@ -46953,7 +47027,7 @@
       <w:r>
         <w:t xml:space="preserve"> </w:t>
       </w:r>
-      <w:hyperlink r:id="rId214">
+      <w:hyperlink r:id="rId217">
         <w:r>
           <w:rPr>
             <w:rStyle w:val="Hyperlink"/>
@@ -47017,8 +47091,8 @@
         <w:t xml:space="preserve">.</w:t>
       </w:r>
     </w:p>
-    <w:bookmarkEnd w:id="215"/>
-    <w:bookmarkStart w:id="217" w:name="def-fold-mse-indexed"/>
+    <w:bookmarkEnd w:id="218"/>
+    <w:bookmarkStart w:id="220" w:name="def-fold-mse-indexed"/>
     <w:p>
       <w:pPr>
         <w:pStyle w:val="BodyText"/>
@@ -47183,7 +47257,7 @@
       <w:pPr>
         <w:pStyle w:val="BodyText"/>
       </w:pPr>
-      <w:bookmarkStart w:id="216" w:name="eq-fold-mse-indexed"/>
+      <w:bookmarkStart w:id="219" w:name="eq-fold-mse-indexed"/>
       <m:oMathPara>
         <m:oMathParaPr>
           <m:jc m:val="center"/>
@@ -47557,10 +47631,10 @@
           </m:r>
         </m:oMath>
       </m:oMathPara>
-      <w:bookmarkEnd w:id="216"/>
+      <w:bookmarkEnd w:id="219"/>
     </w:p>
-    <w:bookmarkEnd w:id="217"/>
-    <w:bookmarkStart w:id="219" w:name="def-cv-se-indexed"/>
+    <w:bookmarkEnd w:id="220"/>
+    <w:bookmarkStart w:id="222" w:name="def-cv-se-indexed"/>
     <w:p>
       <w:pPr>
         <w:pStyle w:val="FirstParagraph"/>
@@ -47740,7 +47814,7 @@
       <w:pPr>
         <w:pStyle w:val="BodyText"/>
       </w:pPr>
-      <w:bookmarkStart w:id="218" w:name="eq-cv-se-indexed"/>
+      <w:bookmarkStart w:id="221" w:name="eq-cv-se-indexed"/>
       <m:oMathPara>
         <m:oMathParaPr>
           <m:jc m:val="center"/>
@@ -47999,10 +48073,10 @@
           </m:r>
         </m:oMath>
       </m:oMathPara>
-      <w:bookmarkEnd w:id="218"/>
+      <w:bookmarkEnd w:id="221"/>
     </w:p>
-    <w:bookmarkEnd w:id="219"/>
-    <w:bookmarkStart w:id="223" w:name="def-one-se-rule"/>
+    <w:bookmarkEnd w:id="222"/>
+    <w:bookmarkStart w:id="226" w:name="def-one-se-rule"/>
     <w:p>
       <w:pPr>
         <w:pStyle w:val="FirstParagraph"/>
@@ -48247,7 +48321,7 @@
       <w:pPr>
         <w:pStyle w:val="BodyText"/>
       </w:pPr>
-      <w:bookmarkStart w:id="220" w:name="eq-one-se-rule"/>
+      <w:bookmarkStart w:id="223" w:name="eq-one-se-rule"/>
       <m:oMathPara>
         <m:oMathParaPr>
           <m:jc m:val="center"/>
@@ -48542,7 +48616,7 @@
           </m:r>
         </m:oMath>
       </m:oMathPara>
-      <w:bookmarkEnd w:id="220"/>
+      <w:bookmarkEnd w:id="223"/>
     </w:p>
     <w:tbl>
       <w:tblPr>
@@ -48585,12 +48659,12 @@
                 <wp:inline>
                   <wp:extent cx="152400" cy="152400"/>
                   <wp:effectExtent b="0" l="0" r="0" t="0"/>
-                  <wp:docPr descr="" title="" id="221" name="Picture"/>
+                  <wp:docPr descr="" title="" id="224" name="Picture"/>
                   <a:graphic>
                     <a:graphicData uri="http://schemas.openxmlformats.org/drawingml/2006/picture">
                       <pic:pic>
                         <pic:nvPicPr>
-                          <pic:cNvPr descr="/opt/quarto/share/formats/docx/note.png" id="222" name="Picture"/>
+                          <pic:cNvPr descr="/opt/quarto/share/formats/docx/note.png" id="225" name="Picture"/>
                           <pic:cNvPicPr>
                             <a:picLocks noChangeArrowheads="1" noChangeAspect="1"/>
                           </pic:cNvPicPr>
@@ -48672,8 +48746,8 @@
         </w:tc>
       </w:tr>
     </w:tbl>
-    <w:bookmarkEnd w:id="223"/>
-    <w:bookmarkStart w:id="228" w:name="exm-one-se-rule"/>
+    <w:bookmarkEnd w:id="226"/>
+    <w:bookmarkStart w:id="231" w:name="exm-one-se-rule"/>
     <w:p>
       <w:pPr>
         <w:pStyle w:val="BodyText"/>
@@ -49745,7 +49819,7 @@
       <w:tr>
         <w:tc>
           <w:tcPr/>
-          <w:bookmarkStart w:id="227" w:name="fig-one-se-rule"/>
+          <w:bookmarkStart w:id="230" w:name="fig-one-se-rule"/>
           <w:p>
             <w:pPr>
               <w:pStyle w:val="SourceCode"/>
@@ -50358,18 +50432,18 @@
                 <wp:inline>
                   <wp:extent cx="4620126" cy="3696101"/>
                   <wp:effectExtent b="0" l="0" r="0" t="0"/>
-                  <wp:docPr descr="" title="" id="225" name="Picture"/>
+                  <wp:docPr descr="" title="" id="228" name="Picture"/>
                   <a:graphic>
                     <a:graphicData uri="http://schemas.openxmlformats.org/drawingml/2006/picture">
                       <pic:pic>
                         <pic:nvPicPr>
-                          <pic:cNvPr descr="model-validation_files/figure-docx/one-se-rule-plot-1.png" id="226" name="Picture"/>
+                          <pic:cNvPr descr="model-validation_files/figure-docx/one-se-rule-plot-1.png" id="229" name="Picture"/>
                           <pic:cNvPicPr>
                             <a:picLocks noChangeArrowheads="1" noChangeAspect="1"/>
                           </pic:cNvPicPr>
                         </pic:nvPicPr>
                         <pic:blipFill>
-                          <a:blip r:embed="rId224"/>
+                          <a:blip r:embed="rId227"/>
                           <a:stretch>
                             <a:fillRect/>
                           </a:stretch>
@@ -50449,7 +50523,7 @@
               <w:t xml:space="preserve">The dashed line is one fold-based standard error above the smallest estimate.</w:t>
             </w:r>
           </w:p>
-          <w:bookmarkEnd w:id="227"/>
+          <w:bookmarkEnd w:id="230"/>
         </w:tc>
       </w:tr>
     </w:tbl>
@@ -50535,9 +50609,9 @@
         <w:t xml:space="preserve">and 0.099 for degree 3.</w:t>
       </w:r>
     </w:p>
-    <w:bookmarkEnd w:id="228"/>
-    <w:bookmarkEnd w:id="229"/>
-    <w:bookmarkStart w:id="236" w:name="sec-cv-whole-procedure"/>
+    <w:bookmarkEnd w:id="231"/>
+    <w:bookmarkEnd w:id="232"/>
+    <w:bookmarkStart w:id="239" w:name="sec-cv-whole-procedure"/>
     <w:p>
       <w:pPr>
         <w:pStyle w:val="Heading2"/>
@@ -50546,7 +50620,7 @@
         <w:t xml:space="preserve">8 Cross-validating the whole procedure</w:t>
       </w:r>
     </w:p>
-    <w:bookmarkStart w:id="232" w:name="exr-cv-screening"/>
+    <w:bookmarkStart w:id="235" w:name="exr-cv-screening"/>
     <w:p>
       <w:pPr>
         <w:pStyle w:val="FirstParagraph"/>
@@ -50846,12 +50920,12 @@
                 <wp:inline>
                   <wp:extent cx="152400" cy="152400"/>
                   <wp:effectExtent b="0" l="0" r="0" t="0"/>
-                  <wp:docPr descr="" title="" id="230" name="Picture"/>
+                  <wp:docPr descr="" title="" id="233" name="Picture"/>
                   <a:graphic>
                     <a:graphicData uri="http://schemas.openxmlformats.org/drawingml/2006/picture">
                       <pic:pic>
                         <pic:nvPicPr>
-                          <pic:cNvPr descr="/opt/quarto/share/formats/docx/note.png" id="231" name="Picture"/>
+                          <pic:cNvPr descr="/opt/quarto/share/formats/docx/note.png" id="234" name="Picture"/>
                           <pic:cNvPicPr>
                             <a:picLocks noChangeArrowheads="1" noChangeAspect="1"/>
                           </pic:cNvPicPr>
@@ -50939,8 +51013,8 @@
         </w:tc>
       </w:tr>
     </w:tbl>
-    <w:bookmarkEnd w:id="232"/>
-    <w:bookmarkStart w:id="233" w:name="sol-cv-screening"/>
+    <w:bookmarkEnd w:id="235"/>
+    <w:bookmarkStart w:id="236" w:name="sol-cv-screening"/>
     <w:p>
       <w:pPr>
         <w:pStyle w:val="BodyText"/>
@@ -52868,8 +52942,8 @@
         <w:t xml:space="preserve">needs fails.</w:t>
       </w:r>
     </w:p>
-    <w:bookmarkEnd w:id="233"/>
-    <w:bookmarkStart w:id="235" w:name="rem-cv-every-step"/>
+    <w:bookmarkEnd w:id="236"/>
+    <w:bookmarkStart w:id="238" w:name="rem-cv-every-step"/>
     <w:p>
       <w:pPr>
         <w:pStyle w:val="BodyText"/>
@@ -53025,7 +53099,7 @@
       <w:r>
         <w:t xml:space="preserve"> </w:t>
       </w:r>
-      <w:hyperlink r:id="rId234">
+      <w:hyperlink r:id="rId237">
         <w:r>
           <w:rPr>
             <w:rStyle w:val="Hyperlink"/>
@@ -53049,9 +53123,9 @@
         <w:t xml:space="preserve">when they are computed without the outcome.</w:t>
       </w:r>
     </w:p>
-    <w:bookmarkEnd w:id="235"/>
-    <w:bookmarkEnd w:id="236"/>
-    <w:bookmarkStart w:id="242" w:name="references"/>
+    <w:bookmarkEnd w:id="238"/>
+    <w:bookmarkEnd w:id="239"/>
+    <w:bookmarkStart w:id="245" w:name="references"/>
     <w:p>
       <w:pPr>
         <w:pStyle w:val="Heading2"/>
@@ -53060,8 +53134,8 @@
         <w:t xml:space="preserve">References</w:t>
       </w:r>
     </w:p>
-    <w:bookmarkStart w:id="241" w:name="refs"/>
-    <w:bookmarkStart w:id="238" w:name="ref-hastie2009elements"/>
+    <w:bookmarkStart w:id="244" w:name="refs"/>
+    <w:bookmarkStart w:id="241" w:name="ref-hastie2009elements"/>
     <w:p>
       <w:pPr>
         <w:pStyle w:val="Bibliography"/>
@@ -53085,7 +53159,7 @@
       <w:r>
         <w:t xml:space="preserve"> </w:t>
       </w:r>
-      <w:hyperlink r:id="rId237">
+      <w:hyperlink r:id="rId240">
         <w:r>
           <w:rPr>
             <w:rStyle w:val="Hyperlink"/>
@@ -53097,8 +53171,8 @@
         <w:t xml:space="preserve">.</w:t>
       </w:r>
     </w:p>
-    <w:bookmarkEnd w:id="238"/>
-    <w:bookmarkStart w:id="240" w:name="ref-james2021islr2e"/>
+    <w:bookmarkEnd w:id="241"/>
+    <w:bookmarkStart w:id="243" w:name="ref-james2021islr2e"/>
     <w:p>
       <w:pPr>
         <w:pStyle w:val="Bibliography"/>
@@ -53136,7 +53210,7 @@
       <w:r>
         <w:t xml:space="preserve"> </w:t>
       </w:r>
-      <w:hyperlink r:id="rId239">
+      <w:hyperlink r:id="rId242">
         <w:r>
           <w:rPr>
             <w:rStyle w:val="Hyperlink"/>
@@ -53148,9 +53222,9 @@
         <w:t xml:space="preserve">.</w:t>
       </w:r>
     </w:p>
-    <w:bookmarkEnd w:id="240"/>
-    <w:bookmarkEnd w:id="241"/>
-    <w:bookmarkEnd w:id="242"/>
+    <w:bookmarkEnd w:id="243"/>
+    <w:bookmarkEnd w:id="244"/>
+    <w:bookmarkEnd w:id="245"/>
     <w:sectPr>
       <w:footnotePr>
         <w:numRestart w:val="eachSect"/>

</xml_diff>

<commit_message>
Deploying to gh-pages from @ Morrison-Lab/sds@b785e0b374158f549432ba8fcbefac3f4e0746e4 🚀
</commit_message>
<xml_diff>
--- a/model-validation-handout.docx
+++ b/model-validation-handout.docx
@@ -15,7 +15,7 @@
         <w:pStyle w:val="Date"/>
       </w:pPr>
       <w:r>
-        <w:t xml:space="preserve">Last modified: 2026-10-13 22:49:53 (PDT)</w:t>
+        <w:t xml:space="preserve">Last modified: 2026-10-14 00:15:52 (PDT)</w:t>
       </w:r>
     </w:p>
     <w:bookmarkStart w:id="38" w:name="sec-prediction-rules"/>
@@ -18803,7 +18803,7 @@
       </w:r>
       <m:oMath>
         <m:r>
-          <m:t>N</m:t>
+          <m:t>n</m:t>
         </m:r>
         <m:r>
           <m:rPr>
@@ -18841,7 +18841,7 @@
           <m:t>0.6</m:t>
         </m:r>
         <m:r>
-          <m:t>N</m:t>
+          <m:t>n</m:t>
         </m:r>
         <m:r>
           <m:rPr>
@@ -18870,7 +18870,7 @@
           <m:t>0.2</m:t>
         </m:r>
         <m:r>
-          <m:t>N</m:t>
+          <m:t>n</m:t>
         </m:r>
         <m:r>
           <m:rPr>
@@ -19195,7 +19195,7 @@
           <m:t>,</m:t>
         </m:r>
         <m:r>
-          <m:t>N</m:t>
+          <m:t>n</m:t>
         </m:r>
       </m:oMath>
       <w:r>
@@ -19447,7 +19447,7 @@
                     <m:t>,</m:t>
                   </m:r>
                   <m:r>
-                    <m:t>N</m:t>
+                    <m:t>n</m:t>
                   </m:r>
                 </m:e>
               </m:d>
@@ -19943,7 +19943,7 @@
       </w:r>
       <m:oMath>
         <m:r>
-          <m:t>N</m:t>
+          <m:t>n</m:t>
         </m:r>
         <m:r>
           <m:rPr>
@@ -43756,7 +43756,7 @@
         <w:rPr>
           <w:rStyle w:val="CommentTok"/>
         </w:rPr>
-        <w:t xml:space="preserve">#&gt;    8.88178e-15    2.00000e+00</w:t>
+        <w:t xml:space="preserve">#&gt;    7.10543e-15    2.00000e+00</w:t>
       </w:r>
     </w:p>
     <w:p>
@@ -43764,7 +43764,7 @@
         <w:pStyle w:val="FirstParagraph"/>
       </w:pPr>
       <w:r>
-        <w:t xml:space="preserve">The two columns differ by at most 8.9e-15,</w:t>
+        <w:t xml:space="preserve">The two columns differ by at most 7.1e-15,</w:t>
       </w:r>
       <w:r>
         <w:t xml:space="preserve"> </w:t>

</xml_diff>

<commit_message>
Deploying to gh-pages from @ Morrison-Lab/sds@0d6fb9243f35337e7147cc2885b1709f0895ee14 🚀
</commit_message>
<xml_diff>
--- a/model-validation-handout.docx
+++ b/model-validation-handout.docx
@@ -15,7 +15,7 @@
         <w:pStyle w:val="Date"/>
       </w:pPr>
       <w:r>
-        <w:t xml:space="preserve">Last modified: 2026-10-14 00:15:52 (PDT)</w:t>
+        <w:t xml:space="preserve">Last modified: 2026-10-14 00:24:30 (PDT)</w:t>
       </w:r>
     </w:p>
     <w:bookmarkStart w:id="38" w:name="sec-prediction-rules"/>
@@ -17047,7 +17047,7 @@
         <w:rPr>
           <w:rStyle w:val="NormalTok"/>
         </w:rPr>
-        <w:t xml:space="preserve">(fit, prediction_mse, </w:t>
+        <w:t xml:space="preserve">(fit, rmse, </w:t>
       </w:r>
       <w:r>
         <w:rPr>
@@ -17098,7 +17098,7 @@
         <w:rPr>
           <w:rStyle w:val="NormalTok"/>
         </w:rPr>
-        <w:t xml:space="preserve">(fit, prediction_mse, </w:t>
+        <w:t xml:space="preserve">(fit, rmse, </w:t>
       </w:r>
       <w:r>
         <w:rPr>
@@ -17212,7 +17212,7 @@
         <w:rPr>
           <w:rStyle w:val="CommentTok"/>
         </w:rPr>
-        <w:t xml:space="preserve">#&gt;  1      1   0.321          0.299 </w:t>
+        <w:t xml:space="preserve">#&gt;  1      1    0.567          0.547</w:t>
       </w:r>
       <w:r>
         <w:br/>
@@ -17221,7 +17221,7 @@
         <w:rPr>
           <w:rStyle w:val="CommentTok"/>
         </w:rPr>
-        <w:t xml:space="preserve">#&gt;  2      2   0.313          0.310 </w:t>
+        <w:t xml:space="preserve">#&gt;  2      2    0.560          0.557</w:t>
       </w:r>
       <w:r>
         <w:br/>
@@ -17230,7 +17230,7 @@
         <w:rPr>
           <w:rStyle w:val="CommentTok"/>
         </w:rPr>
-        <w:t xml:space="preserve">#&gt;  3      3   0.0535         0.0994</w:t>
+        <w:t xml:space="preserve">#&gt;  3      3    0.231          0.315</w:t>
       </w:r>
       <w:r>
         <w:br/>
@@ -17239,7 +17239,7 @@
         <w:rPr>
           <w:rStyle w:val="CommentTok"/>
         </w:rPr>
-        <w:t xml:space="preserve">#&gt;  4      4   0.0535         0.0994</w:t>
+        <w:t xml:space="preserve">#&gt;  4      4    0.231          0.315</w:t>
       </w:r>
       <w:r>
         <w:br/>
@@ -17248,7 +17248,7 @@
         <w:rPr>
           <w:rStyle w:val="CommentTok"/>
         </w:rPr>
-        <w:t xml:space="preserve">#&gt;  5      5   0.0465         0.0939</w:t>
+        <w:t xml:space="preserve">#&gt;  5      5    0.216          0.306</w:t>
       </w:r>
       <w:r>
         <w:br/>
@@ -17257,7 +17257,7 @@
         <w:rPr>
           <w:rStyle w:val="CommentTok"/>
         </w:rPr>
-        <w:t xml:space="preserve">#&gt;  6      6   0.0381         0.105 </w:t>
+        <w:t xml:space="preserve">#&gt;  6      6    0.195          0.324</w:t>
       </w:r>
       <w:r>
         <w:br/>
@@ -17266,7 +17266,7 @@
         <w:rPr>
           <w:rStyle w:val="CommentTok"/>
         </w:rPr>
-        <w:t xml:space="preserve">#&gt;  7      7   0.0377         0.106 </w:t>
+        <w:t xml:space="preserve">#&gt;  7      7    0.194          0.326</w:t>
       </w:r>
       <w:r>
         <w:br/>
@@ -17275,7 +17275,7 @@
         <w:rPr>
           <w:rStyle w:val="CommentTok"/>
         </w:rPr>
-        <w:t xml:space="preserve">#&gt;  8      8   0.0340         0.112 </w:t>
+        <w:t xml:space="preserve">#&gt;  8      8    0.184          0.335</w:t>
       </w:r>
       <w:r>
         <w:br/>
@@ -17284,7 +17284,7 @@
         <w:rPr>
           <w:rStyle w:val="CommentTok"/>
         </w:rPr>
-        <w:t xml:space="preserve">#&gt;  9      9   0.0333         0.112 </w:t>
+        <w:t xml:space="preserve">#&gt;  9      9    0.183          0.335</w:t>
       </w:r>
       <w:r>
         <w:br/>
@@ -17293,7 +17293,7 @@
         <w:rPr>
           <w:rStyle w:val="CommentTok"/>
         </w:rPr>
-        <w:t xml:space="preserve">#&gt; 10     10   0.0326         0.116</w:t>
+        <w:t xml:space="preserve">#&gt; 10     10    0.180          0.341</w:t>
       </w:r>
     </w:p>
     <w:tbl>
@@ -17433,7 +17433,7 @@
               <w:rPr>
                 <w:rStyle w:val="StringTok"/>
               </w:rPr>
-              <w:t xml:space="preserve">"mse"</w:t>
+              <w:t xml:space="preserve">"rmse"</w:t>
             </w:r>
             <w:r>
               <w:br/>
@@ -17493,7 +17493,7 @@
               <w:rPr>
                 <w:rStyle w:val="NormalTok"/>
               </w:rPr>
-              <w:t xml:space="preserve">(degree, mse, </w:t>
+              <w:t xml:space="preserve">(degree, rmse, </w:t>
             </w:r>
             <w:r>
               <w:rPr>
@@ -17562,13 +17562,109 @@
               <w:rPr>
                 <w:rStyle w:val="NormalTok"/>
               </w:rPr>
-              <w:t xml:space="preserve"> sim_sigma</w:t>
+              <w:t xml:space="preserve"> sim_sigma, </w:t>
+            </w:r>
+            <w:r>
+              <w:rPr>
+                <w:rStyle w:val="AttributeTok"/>
+              </w:rPr>
+              <w:t xml:space="preserve">linetype =</w:t>
+            </w:r>
+            <w:r>
+              <w:rPr>
+                <w:rStyle w:val="NormalTok"/>
+              </w:rPr>
+              <w:t xml:space="preserve"> </w:t>
+            </w:r>
+            <w:r>
+              <w:rPr>
+                <w:rStyle w:val="StringTok"/>
+              </w:rPr>
+              <w:t xml:space="preserve">"dashed"</w:t>
+            </w:r>
+            <w:r>
+              <w:rPr>
+                <w:rStyle w:val="NormalTok"/>
+              </w:rPr>
+              <w:t xml:space="preserve">) </w:t>
             </w:r>
             <w:r>
               <w:rPr>
                 <w:rStyle w:val="SpecialCharTok"/>
               </w:rPr>
-              <w:t xml:space="preserve">^</w:t>
+              <w:t xml:space="preserve">+</w:t>
+            </w:r>
+            <w:r>
+              <w:br/>
+            </w:r>
+            <w:r>
+              <w:rPr>
+                <w:rStyle w:val="NormalTok"/>
+              </w:rPr>
+              <w:t xml:space="preserve">  ggplot2</w:t>
+            </w:r>
+            <w:r>
+              <w:rPr>
+                <w:rStyle w:val="SpecialCharTok"/>
+              </w:rPr>
+              <w:t xml:space="preserve">::</w:t>
+            </w:r>
+            <w:r>
+              <w:rPr>
+                <w:rStyle w:val="FunctionTok"/>
+              </w:rPr>
+              <w:t xml:space="preserve">geom_line</w:t>
+            </w:r>
+            <w:r>
+              <w:rPr>
+                <w:rStyle w:val="NormalTok"/>
+              </w:rPr>
+              <w:t xml:space="preserve">() </w:t>
+            </w:r>
+            <w:r>
+              <w:rPr>
+                <w:rStyle w:val="SpecialCharTok"/>
+              </w:rPr>
+              <w:t xml:space="preserve">+</w:t>
+            </w:r>
+            <w:r>
+              <w:br/>
+            </w:r>
+            <w:r>
+              <w:rPr>
+                <w:rStyle w:val="NormalTok"/>
+              </w:rPr>
+              <w:t xml:space="preserve">  ggplot2</w:t>
+            </w:r>
+            <w:r>
+              <w:rPr>
+                <w:rStyle w:val="SpecialCharTok"/>
+              </w:rPr>
+              <w:t xml:space="preserve">::</w:t>
+            </w:r>
+            <w:r>
+              <w:rPr>
+                <w:rStyle w:val="FunctionTok"/>
+              </w:rPr>
+              <w:t xml:space="preserve">geom_point</w:t>
+            </w:r>
+            <w:r>
+              <w:rPr>
+                <w:rStyle w:val="NormalTok"/>
+              </w:rPr>
+              <w:t xml:space="preserve">(</w:t>
+            </w:r>
+            <w:r>
+              <w:rPr>
+                <w:rStyle w:val="AttributeTok"/>
+              </w:rPr>
+              <w:t xml:space="preserve">size =</w:t>
+            </w:r>
+            <w:r>
+              <w:rPr>
+                <w:rStyle w:val="NormalTok"/>
+              </w:rPr>
+              <w:t xml:space="preserve"> </w:t>
             </w:r>
             <w:r>
               <w:rPr>
@@ -17580,37 +17676,151 @@
               <w:rPr>
                 <w:rStyle w:val="NormalTok"/>
               </w:rPr>
-              <w:t xml:space="preserve">, </w:t>
+              <w:t xml:space="preserve">) </w:t>
+            </w:r>
+            <w:r>
+              <w:rPr>
+                <w:rStyle w:val="SpecialCharTok"/>
+              </w:rPr>
+              <w:t xml:space="preserve">+</w:t>
+            </w:r>
+            <w:r>
+              <w:br/>
+            </w:r>
+            <w:r>
+              <w:rPr>
+                <w:rStyle w:val="NormalTok"/>
+              </w:rPr>
+              <w:t xml:space="preserve">  ggplot2</w:t>
+            </w:r>
+            <w:r>
+              <w:rPr>
+                <w:rStyle w:val="SpecialCharTok"/>
+              </w:rPr>
+              <w:t xml:space="preserve">::</w:t>
+            </w:r>
+            <w:r>
+              <w:rPr>
+                <w:rStyle w:val="FunctionTok"/>
+              </w:rPr>
+              <w:t xml:space="preserve">scale_x_continuous</w:t>
+            </w:r>
+            <w:r>
+              <w:rPr>
+                <w:rStyle w:val="NormalTok"/>
+              </w:rPr>
+              <w:t xml:space="preserve">(</w:t>
             </w:r>
             <w:r>
               <w:rPr>
                 <w:rStyle w:val="AttributeTok"/>
               </w:rPr>
-              <w:t xml:space="preserve">linetype =</w:t>
+              <w:t xml:space="preserve">breaks =</w:t>
             </w:r>
             <w:r>
               <w:rPr>
                 <w:rStyle w:val="NormalTok"/>
               </w:rPr>
+              <w:t xml:space="preserve"> sim_degrees) </w:t>
+            </w:r>
+            <w:r>
+              <w:rPr>
+                <w:rStyle w:val="SpecialCharTok"/>
+              </w:rPr>
+              <w:t xml:space="preserve">+</w:t>
+            </w:r>
+            <w:r>
+              <w:br/>
+            </w:r>
+            <w:r>
+              <w:rPr>
+                <w:rStyle w:val="NormalTok"/>
+              </w:rPr>
+              <w:t xml:space="preserve">  ggplot2</w:t>
+            </w:r>
+            <w:r>
+              <w:rPr>
+                <w:rStyle w:val="SpecialCharTok"/>
+              </w:rPr>
+              <w:t xml:space="preserve">::</w:t>
+            </w:r>
+            <w:r>
+              <w:rPr>
+                <w:rStyle w:val="FunctionTok"/>
+              </w:rPr>
+              <w:t xml:space="preserve">scale_y_log10</w:t>
+            </w:r>
+            <w:r>
+              <w:rPr>
+                <w:rStyle w:val="NormalTok"/>
+              </w:rPr>
+              <w:t xml:space="preserve">() </w:t>
+            </w:r>
+            <w:r>
+              <w:rPr>
+                <w:rStyle w:val="SpecialCharTok"/>
+              </w:rPr>
+              <w:t xml:space="preserve">+</w:t>
+            </w:r>
+            <w:r>
+              <w:br/>
+            </w:r>
+            <w:r>
+              <w:rPr>
+                <w:rStyle w:val="NormalTok"/>
+              </w:rPr>
+              <w:t xml:space="preserve">  ggplot2</w:t>
+            </w:r>
+            <w:r>
+              <w:rPr>
+                <w:rStyle w:val="SpecialCharTok"/>
+              </w:rPr>
+              <w:t xml:space="preserve">::</w:t>
+            </w:r>
+            <w:r>
+              <w:rPr>
+                <w:rStyle w:val="FunctionTok"/>
+              </w:rPr>
+              <w:t xml:space="preserve">labs</w:t>
+            </w:r>
+            <w:r>
+              <w:rPr>
+                <w:rStyle w:val="NormalTok"/>
+              </w:rPr>
+              <w:t xml:space="preserve">(</w:t>
+            </w:r>
+            <w:r>
+              <w:br/>
+            </w:r>
+            <w:r>
+              <w:rPr>
+                <w:rStyle w:val="NormalTok"/>
+              </w:rPr>
+              <w:t xml:space="preserve">    </w:t>
+            </w:r>
+            <w:r>
+              <w:rPr>
+                <w:rStyle w:val="AttributeTok"/>
+              </w:rPr>
+              <w:t xml:space="preserve">x =</w:t>
+            </w:r>
+            <w:r>
+              <w:rPr>
+                <w:rStyle w:val="NormalTok"/>
+              </w:rPr>
               <w:t xml:space="preserve"> </w:t>
             </w:r>
             <w:r>
               <w:rPr>
                 <w:rStyle w:val="StringTok"/>
               </w:rPr>
-              <w:t xml:space="preserve">"dashed"</w:t>
+              <w:t xml:space="preserve">"polynomial degree"</w:t>
             </w:r>
             <w:r>
               <w:rPr>
                 <w:rStyle w:val="NormalTok"/>
               </w:rPr>
-              <w:t xml:space="preserve">) </w:t>
-            </w:r>
-            <w:r>
-              <w:rPr>
-                <w:rStyle w:val="SpecialCharTok"/>
-              </w:rPr>
-              <w:t xml:space="preserve">+</w:t>
+              <w:t xml:space="preserve">,</w:t>
             </w:r>
             <w:r>
               <w:br/>
@@ -17619,253 +17829,25 @@
               <w:rPr>
                 <w:rStyle w:val="NormalTok"/>
               </w:rPr>
-              <w:t xml:space="preserve">  ggplot2</w:t>
-            </w:r>
-            <w:r>
-              <w:rPr>
-                <w:rStyle w:val="SpecialCharTok"/>
-              </w:rPr>
-              <w:t xml:space="preserve">::</w:t>
-            </w:r>
-            <w:r>
-              <w:rPr>
-                <w:rStyle w:val="FunctionTok"/>
-              </w:rPr>
-              <w:t xml:space="preserve">geom_line</w:t>
+              <w:t xml:space="preserve">    </w:t>
+            </w:r>
+            <w:r>
+              <w:rPr>
+                <w:rStyle w:val="AttributeTok"/>
+              </w:rPr>
+              <w:t xml:space="preserve">y =</w:t>
             </w:r>
             <w:r>
               <w:rPr>
                 <w:rStyle w:val="NormalTok"/>
               </w:rPr>
-              <w:t xml:space="preserve">() </w:t>
-            </w:r>
-            <w:r>
-              <w:rPr>
-                <w:rStyle w:val="SpecialCharTok"/>
-              </w:rPr>
-              <w:t xml:space="preserve">+</w:t>
-            </w:r>
-            <w:r>
-              <w:br/>
-            </w:r>
-            <w:r>
-              <w:rPr>
-                <w:rStyle w:val="NormalTok"/>
-              </w:rPr>
-              <w:t xml:space="preserve">  ggplot2</w:t>
-            </w:r>
-            <w:r>
-              <w:rPr>
-                <w:rStyle w:val="SpecialCharTok"/>
-              </w:rPr>
-              <w:t xml:space="preserve">::</w:t>
-            </w:r>
-            <w:r>
-              <w:rPr>
-                <w:rStyle w:val="FunctionTok"/>
-              </w:rPr>
-              <w:t xml:space="preserve">geom_point</w:t>
-            </w:r>
-            <w:r>
-              <w:rPr>
-                <w:rStyle w:val="NormalTok"/>
-              </w:rPr>
-              <w:t xml:space="preserve">(</w:t>
-            </w:r>
-            <w:r>
-              <w:rPr>
-                <w:rStyle w:val="AttributeTok"/>
-              </w:rPr>
-              <w:t xml:space="preserve">size =</w:t>
-            </w:r>
-            <w:r>
-              <w:rPr>
-                <w:rStyle w:val="NormalTok"/>
-              </w:rPr>
               <w:t xml:space="preserve"> </w:t>
             </w:r>
             <w:r>
               <w:rPr>
-                <w:rStyle w:val="DecValTok"/>
-              </w:rPr>
-              <w:t xml:space="preserve">2</w:t>
-            </w:r>
-            <w:r>
-              <w:rPr>
-                <w:rStyle w:val="NormalTok"/>
-              </w:rPr>
-              <w:t xml:space="preserve">) </w:t>
-            </w:r>
-            <w:r>
-              <w:rPr>
-                <w:rStyle w:val="SpecialCharTok"/>
-              </w:rPr>
-              <w:t xml:space="preserve">+</w:t>
-            </w:r>
-            <w:r>
-              <w:br/>
-            </w:r>
-            <w:r>
-              <w:rPr>
-                <w:rStyle w:val="NormalTok"/>
-              </w:rPr>
-              <w:t xml:space="preserve">  ggplot2</w:t>
-            </w:r>
-            <w:r>
-              <w:rPr>
-                <w:rStyle w:val="SpecialCharTok"/>
-              </w:rPr>
-              <w:t xml:space="preserve">::</w:t>
-            </w:r>
-            <w:r>
-              <w:rPr>
-                <w:rStyle w:val="FunctionTok"/>
-              </w:rPr>
-              <w:t xml:space="preserve">scale_x_continuous</w:t>
-            </w:r>
-            <w:r>
-              <w:rPr>
-                <w:rStyle w:val="NormalTok"/>
-              </w:rPr>
-              <w:t xml:space="preserve">(</w:t>
-            </w:r>
-            <w:r>
-              <w:rPr>
-                <w:rStyle w:val="AttributeTok"/>
-              </w:rPr>
-              <w:t xml:space="preserve">breaks =</w:t>
-            </w:r>
-            <w:r>
-              <w:rPr>
-                <w:rStyle w:val="NormalTok"/>
-              </w:rPr>
-              <w:t xml:space="preserve"> sim_degrees) </w:t>
-            </w:r>
-            <w:r>
-              <w:rPr>
-                <w:rStyle w:val="SpecialCharTok"/>
-              </w:rPr>
-              <w:t xml:space="preserve">+</w:t>
-            </w:r>
-            <w:r>
-              <w:br/>
-            </w:r>
-            <w:r>
-              <w:rPr>
-                <w:rStyle w:val="NormalTok"/>
-              </w:rPr>
-              <w:t xml:space="preserve">  ggplot2</w:t>
-            </w:r>
-            <w:r>
-              <w:rPr>
-                <w:rStyle w:val="SpecialCharTok"/>
-              </w:rPr>
-              <w:t xml:space="preserve">::</w:t>
-            </w:r>
-            <w:r>
-              <w:rPr>
-                <w:rStyle w:val="FunctionTok"/>
-              </w:rPr>
-              <w:t xml:space="preserve">scale_y_log10</w:t>
-            </w:r>
-            <w:r>
-              <w:rPr>
-                <w:rStyle w:val="NormalTok"/>
-              </w:rPr>
-              <w:t xml:space="preserve">() </w:t>
-            </w:r>
-            <w:r>
-              <w:rPr>
-                <w:rStyle w:val="SpecialCharTok"/>
-              </w:rPr>
-              <w:t xml:space="preserve">+</w:t>
-            </w:r>
-            <w:r>
-              <w:br/>
-            </w:r>
-            <w:r>
-              <w:rPr>
-                <w:rStyle w:val="NormalTok"/>
-              </w:rPr>
-              <w:t xml:space="preserve">  ggplot2</w:t>
-            </w:r>
-            <w:r>
-              <w:rPr>
-                <w:rStyle w:val="SpecialCharTok"/>
-              </w:rPr>
-              <w:t xml:space="preserve">::</w:t>
-            </w:r>
-            <w:r>
-              <w:rPr>
-                <w:rStyle w:val="FunctionTok"/>
-              </w:rPr>
-              <w:t xml:space="preserve">labs</w:t>
-            </w:r>
-            <w:r>
-              <w:rPr>
-                <w:rStyle w:val="NormalTok"/>
-              </w:rPr>
-              <w:t xml:space="preserve">(</w:t>
-            </w:r>
-            <w:r>
-              <w:br/>
-            </w:r>
-            <w:r>
-              <w:rPr>
-                <w:rStyle w:val="NormalTok"/>
-              </w:rPr>
-              <w:t xml:space="preserve">    </w:t>
-            </w:r>
-            <w:r>
-              <w:rPr>
-                <w:rStyle w:val="AttributeTok"/>
-              </w:rPr>
-              <w:t xml:space="preserve">x =</w:t>
-            </w:r>
-            <w:r>
-              <w:rPr>
-                <w:rStyle w:val="NormalTok"/>
-              </w:rPr>
-              <w:t xml:space="preserve"> </w:t>
-            </w:r>
-            <w:r>
-              <w:rPr>
                 <w:rStyle w:val="StringTok"/>
               </w:rPr>
-              <w:t xml:space="preserve">"polynomial degree"</w:t>
-            </w:r>
-            <w:r>
-              <w:rPr>
-                <w:rStyle w:val="NormalTok"/>
-              </w:rPr>
-              <w:t xml:space="preserve">,</w:t>
-            </w:r>
-            <w:r>
-              <w:br/>
-            </w:r>
-            <w:r>
-              <w:rPr>
-                <w:rStyle w:val="NormalTok"/>
-              </w:rPr>
-              <w:t xml:space="preserve">    </w:t>
-            </w:r>
-            <w:r>
-              <w:rPr>
-                <w:rStyle w:val="AttributeTok"/>
-              </w:rPr>
-              <w:t xml:space="preserve">y =</w:t>
-            </w:r>
-            <w:r>
-              <w:rPr>
-                <w:rStyle w:val="NormalTok"/>
-              </w:rPr>
-              <w:t xml:space="preserve"> </w:t>
-            </w:r>
-            <w:r>
-              <w:rPr>
-                <w:rStyle w:val="StringTok"/>
-              </w:rPr>
-              <w:t xml:space="preserve">"mean squared error (log scale)"</w:t>
+              <w:t xml:space="preserve">"root mean squared error (log scale)"</w:t>
             </w:r>
             <w:r>
               <w:rPr>
@@ -18090,13 +18072,13 @@
               <w:pStyle w:val="ImageCaption"/>
             </w:pPr>
             <w:r>
-              <w:t xml:space="preserve">Figure 1: Training mean squared error and estimated generalization error</w:t>
+              <w:t xml:space="preserve">Figure 1: Training RMSE and estimated generalization error</w:t>
             </w:r>
             <w:r>
               <w:t xml:space="preserve"> </w:t>
             </w:r>
             <w:r>
-              <w:t xml:space="preserve">(mean squared error on</w:t>
+              <w:t xml:space="preserve">(RMSE on</w:t>
             </w:r>
             <w:r>
               <w:t xml:space="preserve"> </w:t>
@@ -18151,24 +18133,15 @@
               <w:t xml:space="preserve"> </w:t>
             </w:r>
             <w:r>
-              <w:t xml:space="preserve">The dashed line is the noise variance</w:t>
+              <w:t xml:space="preserve">The dashed line is the noise standard deviation</w:t>
             </w:r>
             <w:r>
               <w:t xml:space="preserve"> </w:t>
             </w:r>
             <m:oMath>
-              <m:sSup>
-                <m:e>
-                  <m:r>
-                    <m:t>σ</m:t>
-                  </m:r>
-                </m:e>
-                <m:sup>
-                  <m:r>
-                    <m:t>2</m:t>
-                  </m:r>
-                </m:sup>
-              </m:sSup>
+              <m:r>
+                <m:t>σ</m:t>
+              </m:r>
             </m:oMath>
             <w:r>
               <w:t xml:space="preserve">,</w:t>
@@ -18177,7 +18150,7 @@
               <w:t xml:space="preserve"> </w:t>
             </w:r>
             <w:r>
-              <w:t xml:space="preserve">the</w:t>
+              <w:t xml:space="preserve">the square root of the</w:t>
             </w:r>
             <w:r>
               <w:t xml:space="preserve"> </w:t>
@@ -18404,100 +18377,64 @@
         <w:rPr>
           <w:rStyle w:val="NormalTok"/>
         </w:rPr>
-        <w:t xml:space="preserve"> sim_sigma</w:t>
+        <w:t xml:space="preserve"> sim_sigma),</w:t>
+      </w:r>
+      <w:r>
+        <w:br/>
+      </w:r>
+      <w:r>
+        <w:rPr>
+          <w:rStyle w:val="NormalTok"/>
+        </w:rPr>
+        <w:t xml:space="preserve">  </w:t>
+      </w:r>
+      <w:r>
+        <w:rPr>
+          <w:rStyle w:val="AttributeTok"/>
+        </w:rPr>
+        <w:t xml:space="preserve">generalization =</w:t>
+      </w:r>
+      <w:r>
+        <w:rPr>
+          <w:rStyle w:val="NormalTok"/>
+        </w:rPr>
+        <w:t xml:space="preserve"> </w:t>
+      </w:r>
+      <w:r>
+        <w:rPr>
+          <w:rStyle w:val="FunctionTok"/>
+        </w:rPr>
+        <w:t xml:space="preserve">sum</w:t>
+      </w:r>
+      <w:r>
+        <w:rPr>
+          <w:rStyle w:val="NormalTok"/>
+        </w:rPr>
+        <w:t xml:space="preserve">(sim_errors</w:t>
       </w:r>
       <w:r>
         <w:rPr>
           <w:rStyle w:val="SpecialCharTok"/>
         </w:rPr>
-        <w:t xml:space="preserve">^</w:t>
-      </w:r>
-      <w:r>
-        <w:rPr>
-          <w:rStyle w:val="DecValTok"/>
-        </w:rPr>
-        <w:t xml:space="preserve">2</w:t>
-      </w:r>
-      <w:r>
-        <w:rPr>
-          <w:rStyle w:val="NormalTok"/>
-        </w:rPr>
-        <w:t xml:space="preserve">),</w:t>
-      </w:r>
-      <w:r>
-        <w:br/>
-      </w:r>
-      <w:r>
-        <w:rPr>
-          <w:rStyle w:val="NormalTok"/>
-        </w:rPr>
-        <w:t xml:space="preserve">  </w:t>
-      </w:r>
-      <w:r>
-        <w:rPr>
-          <w:rStyle w:val="AttributeTok"/>
-        </w:rPr>
-        <w:t xml:space="preserve">generalization =</w:t>
-      </w:r>
-      <w:r>
-        <w:rPr>
-          <w:rStyle w:val="NormalTok"/>
-        </w:rPr>
-        <w:t xml:space="preserve"> </w:t>
-      </w:r>
-      <w:r>
-        <w:rPr>
-          <w:rStyle w:val="FunctionTok"/>
-        </w:rPr>
-        <w:t xml:space="preserve">sum</w:t>
-      </w:r>
-      <w:r>
-        <w:rPr>
-          <w:rStyle w:val="NormalTok"/>
-        </w:rPr>
-        <w:t xml:space="preserve">(sim_errors</w:t>
+        <w:t xml:space="preserve">$</w:t>
+      </w:r>
+      <w:r>
+        <w:rPr>
+          <w:rStyle w:val="NormalTok"/>
+        </w:rPr>
+        <w:t xml:space="preserve">generalization </w:t>
       </w:r>
       <w:r>
         <w:rPr>
           <w:rStyle w:val="SpecialCharTok"/>
         </w:rPr>
-        <w:t xml:space="preserve">$</w:t>
-      </w:r>
-      <w:r>
-        <w:rPr>
-          <w:rStyle w:val="NormalTok"/>
-        </w:rPr>
-        <w:t xml:space="preserve">generalization </w:t>
-      </w:r>
-      <w:r>
-        <w:rPr>
-          <w:rStyle w:val="SpecialCharTok"/>
-        </w:rPr>
         <w:t xml:space="preserve">&lt;</w:t>
       </w:r>
       <w:r>
         <w:rPr>
           <w:rStyle w:val="NormalTok"/>
         </w:rPr>
-        <w:t xml:space="preserve"> sim_sigma</w:t>
-      </w:r>
-      <w:r>
-        <w:rPr>
-          <w:rStyle w:val="SpecialCharTok"/>
-        </w:rPr>
-        <w:t xml:space="preserve">^</w:t>
-      </w:r>
-      <w:r>
-        <w:rPr>
-          <w:rStyle w:val="DecValTok"/>
-        </w:rPr>
-        <w:t xml:space="preserve">2</w:t>
-      </w:r>
-      <w:r>
-        <w:rPr>
-          <w:rStyle w:val="NormalTok"/>
-        </w:rPr>
-        <w:t xml:space="preserve">)</w:t>
+        <w:t xml:space="preserve"> sim_sigma)</w:t>
       </w:r>
       <w:r>
         <w:br/>
@@ -18661,24 +18598,15 @@
         <w:t xml:space="preserve"> </w:t>
       </w:r>
       <w:r>
-        <w:t xml:space="preserve">No prediction rule can have generalization error below</w:t>
+        <w:t xml:space="preserve">No prediction rule can have generalization RMSE below</w:t>
       </w:r>
       <w:r>
         <w:t xml:space="preserve"> </w:t>
       </w:r>
       <m:oMath>
-        <m:sSup>
-          <m:e>
-            <m:r>
-              <m:t>σ</m:t>
-            </m:r>
-          </m:e>
-          <m:sup>
-            <m:r>
-              <m:t>2</m:t>
-            </m:r>
-          </m:sup>
-        </m:sSup>
+        <m:r>
+          <m:t>σ</m:t>
+        </m:r>
         <m:r>
           <m:rPr>
             <m:sty m:val="p"/>
@@ -18686,7 +18614,7 @@
           <m:t>=</m:t>
         </m:r>
         <m:r>
-          <m:t>0.09</m:t>
+          <m:t>0.3</m:t>
         </m:r>
       </m:oMath>
       <w:r>
@@ -18696,24 +18624,15 @@
         <w:t xml:space="preserve"> </w:t>
       </w:r>
       <w:r>
-        <w:t xml:space="preserve">Yet the training error falls below</w:t>
+        <w:t xml:space="preserve">Yet the training RMSE falls below</w:t>
       </w:r>
       <w:r>
         <w:t xml:space="preserve"> </w:t>
       </w:r>
       <m:oMath>
-        <m:sSup>
-          <m:e>
-            <m:r>
-              <m:t>σ</m:t>
-            </m:r>
-          </m:e>
-          <m:sup>
-            <m:r>
-              <m:t>2</m:t>
-            </m:r>
-          </m:sup>
-        </m:sSup>
+        <m:r>
+          <m:t>σ</m:t>
+        </m:r>
       </m:oMath>
       <w:r>
         <w:t xml:space="preserve"> </w:t>
@@ -34424,6 +34343,32 @@
       <w:r>
         <w:t xml:space="preserve">so the degrees are compared on the same splits.</w:t>
       </w:r>
+      <w:r>
+        <w:t xml:space="preserve"> </w:t>
+      </w:r>
+      <w:r>
+        <w:t xml:space="preserve">The table and figure report the square root of each cross-validation estimate,</w:t>
+      </w:r>
+      <w:r>
+        <w:t xml:space="preserve"> </w:t>
+      </w:r>
+      <w:r>
+        <w:t xml:space="preserve">so that it is in the same unit as the training and generalization RMSE of</w:t>
+      </w:r>
+      <w:r>
+        <w:t xml:space="preserve"> </w:t>
+      </w:r>
+      <w:hyperlink w:anchor="exm-train-test-error-simulated">
+        <w:r>
+          <w:rPr>
+            <w:rStyle w:val="Hyperlink"/>
+          </w:rPr>
+          <w:t xml:space="preserve">Example 2</w:t>
+        </w:r>
+      </w:hyperlink>
+      <w:r>
+        <w:t xml:space="preserve">.</w:t>
+      </w:r>
     </w:p>
     <w:p>
       <w:pPr>
@@ -34541,6 +34486,18 @@
         <w:rPr>
           <w:rStyle w:val="FunctionTok"/>
         </w:rPr>
+        <w:t xml:space="preserve">sqrt</w:t>
+      </w:r>
+      <w:r>
+        <w:rPr>
+          <w:rStyle w:val="NormalTok"/>
+        </w:rPr>
+        <w:t xml:space="preserve">(</w:t>
+      </w:r>
+      <w:r>
+        <w:rPr>
+          <w:rStyle w:val="FunctionTok"/>
+        </w:rPr>
         <w:t xml:space="preserve">cv_mse</w:t>
       </w:r>
       <w:r>
@@ -34571,7 +34528,7 @@
         <w:rPr>
           <w:rStyle w:val="NormalTok"/>
         </w:rPr>
-        <w:t xml:space="preserve">(x, d), sim_train, sim_folds)</w:t>
+        <w:t xml:space="preserve">(x, d), sim_train, sim_folds))</w:t>
       </w:r>
       <w:r>
         <w:br/>
@@ -34619,7 +34576,7 @@
         <w:rPr>
           <w:rStyle w:val="CommentTok"/>
         </w:rPr>
-        <w:t xml:space="preserve">#&gt;    degree training generalization   cv_5</w:t>
+        <w:t xml:space="preserve">#&gt;    degree training generalization  cv_5</w:t>
       </w:r>
       <w:r>
         <w:br/>
@@ -34628,7 +34585,7 @@
         <w:rPr>
           <w:rStyle w:val="CommentTok"/>
         </w:rPr>
-        <w:t xml:space="preserve">#&gt;     &lt;int&gt;    &lt;dbl&gt;          &lt;dbl&gt;  &lt;dbl&gt;</w:t>
+        <w:t xml:space="preserve">#&gt;     &lt;int&gt;    &lt;dbl&gt;          &lt;dbl&gt; &lt;dbl&gt;</w:t>
       </w:r>
       <w:r>
         <w:br/>
@@ -34637,7 +34594,7 @@
         <w:rPr>
           <w:rStyle w:val="CommentTok"/>
         </w:rPr>
-        <w:t xml:space="preserve">#&gt;  1      1   0.321          0.299  0.356 </w:t>
+        <w:t xml:space="preserve">#&gt;  1      1    0.567          0.547 0.597</w:t>
       </w:r>
       <w:r>
         <w:br/>
@@ -34646,7 +34603,7 @@
         <w:rPr>
           <w:rStyle w:val="CommentTok"/>
         </w:rPr>
-        <w:t xml:space="preserve">#&gt;  2      2   0.313          0.310  0.372 </w:t>
+        <w:t xml:space="preserve">#&gt;  2      2    0.560          0.557 0.610</w:t>
       </w:r>
       <w:r>
         <w:br/>
@@ -34655,7 +34612,7 @@
         <w:rPr>
           <w:rStyle w:val="CommentTok"/>
         </w:rPr>
-        <w:t xml:space="preserve">#&gt;  3      3   0.0535         0.0994 0.0821</w:t>
+        <w:t xml:space="preserve">#&gt;  3      3    0.231          0.315 0.287</w:t>
       </w:r>
       <w:r>
         <w:br/>
@@ -34664,7 +34621,7 @@
         <w:rPr>
           <w:rStyle w:val="CommentTok"/>
         </w:rPr>
-        <w:t xml:space="preserve">#&gt;  4      4   0.0535         0.0994 0.0982</w:t>
+        <w:t xml:space="preserve">#&gt;  4      4    0.231          0.315 0.313</w:t>
       </w:r>
       <w:r>
         <w:br/>
@@ -34673,7 +34630,7 @@
         <w:rPr>
           <w:rStyle w:val="CommentTok"/>
         </w:rPr>
-        <w:t xml:space="preserve">#&gt;  5      5   0.0465         0.0939 0.104 </w:t>
+        <w:t xml:space="preserve">#&gt;  5      5    0.216          0.306 0.323</w:t>
       </w:r>
       <w:r>
         <w:br/>
@@ -34682,7 +34639,7 @@
         <w:rPr>
           <w:rStyle w:val="CommentTok"/>
         </w:rPr>
-        <w:t xml:space="preserve">#&gt;  6      6   0.0381         0.105  0.0941</w:t>
+        <w:t xml:space="preserve">#&gt;  6      6    0.195          0.324 0.307</w:t>
       </w:r>
       <w:r>
         <w:br/>
@@ -34691,7 +34648,7 @@
         <w:rPr>
           <w:rStyle w:val="CommentTok"/>
         </w:rPr>
-        <w:t xml:space="preserve">#&gt;  7      7   0.0377         0.106  0.156 </w:t>
+        <w:t xml:space="preserve">#&gt;  7      7    0.194          0.326 0.395</w:t>
       </w:r>
       <w:r>
         <w:br/>
@@ -34700,7 +34657,7 @@
         <w:rPr>
           <w:rStyle w:val="CommentTok"/>
         </w:rPr>
-        <w:t xml:space="preserve">#&gt;  8      8   0.0340         0.112  0.100 </w:t>
+        <w:t xml:space="preserve">#&gt;  8      8    0.184          0.335 0.316</w:t>
       </w:r>
       <w:r>
         <w:br/>
@@ -34709,7 +34666,7 @@
         <w:rPr>
           <w:rStyle w:val="CommentTok"/>
         </w:rPr>
-        <w:t xml:space="preserve">#&gt;  9      9   0.0333         0.112  0.287 </w:t>
+        <w:t xml:space="preserve">#&gt;  9      9    0.183          0.335 0.536</w:t>
       </w:r>
       <w:r>
         <w:br/>
@@ -34718,7 +34675,7 @@
         <w:rPr>
           <w:rStyle w:val="CommentTok"/>
         </w:rPr>
-        <w:t xml:space="preserve">#&gt; 10     10   0.0326         0.116  1.92</w:t>
+        <w:t xml:space="preserve">#&gt; 10     10    0.180          0.341 1.39</w:t>
       </w:r>
     </w:p>
     <w:tbl>
@@ -34858,7 +34815,7 @@
               <w:rPr>
                 <w:rStyle w:val="StringTok"/>
               </w:rPr>
-              <w:t xml:space="preserve">"mse"</w:t>
+              <w:t xml:space="preserve">"rmse"</w:t>
             </w:r>
             <w:r>
               <w:br/>
@@ -35149,7 +35106,7 @@
               <w:rPr>
                 <w:rStyle w:val="NormalTok"/>
               </w:rPr>
-              <w:t xml:space="preserve">(degree, mse, </w:t>
+              <w:t xml:space="preserve">(degree, rmse, </w:t>
             </w:r>
             <w:r>
               <w:rPr>
@@ -35218,13 +35175,109 @@
               <w:rPr>
                 <w:rStyle w:val="NormalTok"/>
               </w:rPr>
-              <w:t xml:space="preserve"> sim_sigma</w:t>
+              <w:t xml:space="preserve"> sim_sigma, </w:t>
+            </w:r>
+            <w:r>
+              <w:rPr>
+                <w:rStyle w:val="AttributeTok"/>
+              </w:rPr>
+              <w:t xml:space="preserve">linetype =</w:t>
+            </w:r>
+            <w:r>
+              <w:rPr>
+                <w:rStyle w:val="NormalTok"/>
+              </w:rPr>
+              <w:t xml:space="preserve"> </w:t>
+            </w:r>
+            <w:r>
+              <w:rPr>
+                <w:rStyle w:val="StringTok"/>
+              </w:rPr>
+              <w:t xml:space="preserve">"dashed"</w:t>
+            </w:r>
+            <w:r>
+              <w:rPr>
+                <w:rStyle w:val="NormalTok"/>
+              </w:rPr>
+              <w:t xml:space="preserve">) </w:t>
             </w:r>
             <w:r>
               <w:rPr>
                 <w:rStyle w:val="SpecialCharTok"/>
               </w:rPr>
-              <w:t xml:space="preserve">^</w:t>
+              <w:t xml:space="preserve">+</w:t>
+            </w:r>
+            <w:r>
+              <w:br/>
+            </w:r>
+            <w:r>
+              <w:rPr>
+                <w:rStyle w:val="NormalTok"/>
+              </w:rPr>
+              <w:t xml:space="preserve">  ggplot2</w:t>
+            </w:r>
+            <w:r>
+              <w:rPr>
+                <w:rStyle w:val="SpecialCharTok"/>
+              </w:rPr>
+              <w:t xml:space="preserve">::</w:t>
+            </w:r>
+            <w:r>
+              <w:rPr>
+                <w:rStyle w:val="FunctionTok"/>
+              </w:rPr>
+              <w:t xml:space="preserve">geom_line</w:t>
+            </w:r>
+            <w:r>
+              <w:rPr>
+                <w:rStyle w:val="NormalTok"/>
+              </w:rPr>
+              <w:t xml:space="preserve">() </w:t>
+            </w:r>
+            <w:r>
+              <w:rPr>
+                <w:rStyle w:val="SpecialCharTok"/>
+              </w:rPr>
+              <w:t xml:space="preserve">+</w:t>
+            </w:r>
+            <w:r>
+              <w:br/>
+            </w:r>
+            <w:r>
+              <w:rPr>
+                <w:rStyle w:val="NormalTok"/>
+              </w:rPr>
+              <w:t xml:space="preserve">  ggplot2</w:t>
+            </w:r>
+            <w:r>
+              <w:rPr>
+                <w:rStyle w:val="SpecialCharTok"/>
+              </w:rPr>
+              <w:t xml:space="preserve">::</w:t>
+            </w:r>
+            <w:r>
+              <w:rPr>
+                <w:rStyle w:val="FunctionTok"/>
+              </w:rPr>
+              <w:t xml:space="preserve">geom_point</w:t>
+            </w:r>
+            <w:r>
+              <w:rPr>
+                <w:rStyle w:val="NormalTok"/>
+              </w:rPr>
+              <w:t xml:space="preserve">(</w:t>
+            </w:r>
+            <w:r>
+              <w:rPr>
+                <w:rStyle w:val="AttributeTok"/>
+              </w:rPr>
+              <w:t xml:space="preserve">size =</w:t>
+            </w:r>
+            <w:r>
+              <w:rPr>
+                <w:rStyle w:val="NormalTok"/>
+              </w:rPr>
+              <w:t xml:space="preserve"> </w:t>
             </w:r>
             <w:r>
               <w:rPr>
@@ -35236,37 +35289,151 @@
               <w:rPr>
                 <w:rStyle w:val="NormalTok"/>
               </w:rPr>
-              <w:t xml:space="preserve">, </w:t>
+              <w:t xml:space="preserve">) </w:t>
+            </w:r>
+            <w:r>
+              <w:rPr>
+                <w:rStyle w:val="SpecialCharTok"/>
+              </w:rPr>
+              <w:t xml:space="preserve">+</w:t>
+            </w:r>
+            <w:r>
+              <w:br/>
+            </w:r>
+            <w:r>
+              <w:rPr>
+                <w:rStyle w:val="NormalTok"/>
+              </w:rPr>
+              <w:t xml:space="preserve">  ggplot2</w:t>
+            </w:r>
+            <w:r>
+              <w:rPr>
+                <w:rStyle w:val="SpecialCharTok"/>
+              </w:rPr>
+              <w:t xml:space="preserve">::</w:t>
+            </w:r>
+            <w:r>
+              <w:rPr>
+                <w:rStyle w:val="FunctionTok"/>
+              </w:rPr>
+              <w:t xml:space="preserve">scale_x_continuous</w:t>
+            </w:r>
+            <w:r>
+              <w:rPr>
+                <w:rStyle w:val="NormalTok"/>
+              </w:rPr>
+              <w:t xml:space="preserve">(</w:t>
             </w:r>
             <w:r>
               <w:rPr>
                 <w:rStyle w:val="AttributeTok"/>
               </w:rPr>
-              <w:t xml:space="preserve">linetype =</w:t>
+              <w:t xml:space="preserve">breaks =</w:t>
             </w:r>
             <w:r>
               <w:rPr>
                 <w:rStyle w:val="NormalTok"/>
               </w:rPr>
+              <w:t xml:space="preserve"> sim_degrees) </w:t>
+            </w:r>
+            <w:r>
+              <w:rPr>
+                <w:rStyle w:val="SpecialCharTok"/>
+              </w:rPr>
+              <w:t xml:space="preserve">+</w:t>
+            </w:r>
+            <w:r>
+              <w:br/>
+            </w:r>
+            <w:r>
+              <w:rPr>
+                <w:rStyle w:val="NormalTok"/>
+              </w:rPr>
+              <w:t xml:space="preserve">  ggplot2</w:t>
+            </w:r>
+            <w:r>
+              <w:rPr>
+                <w:rStyle w:val="SpecialCharTok"/>
+              </w:rPr>
+              <w:t xml:space="preserve">::</w:t>
+            </w:r>
+            <w:r>
+              <w:rPr>
+                <w:rStyle w:val="FunctionTok"/>
+              </w:rPr>
+              <w:t xml:space="preserve">scale_y_log10</w:t>
+            </w:r>
+            <w:r>
+              <w:rPr>
+                <w:rStyle w:val="NormalTok"/>
+              </w:rPr>
+              <w:t xml:space="preserve">() </w:t>
+            </w:r>
+            <w:r>
+              <w:rPr>
+                <w:rStyle w:val="SpecialCharTok"/>
+              </w:rPr>
+              <w:t xml:space="preserve">+</w:t>
+            </w:r>
+            <w:r>
+              <w:br/>
+            </w:r>
+            <w:r>
+              <w:rPr>
+                <w:rStyle w:val="NormalTok"/>
+              </w:rPr>
+              <w:t xml:space="preserve">  ggplot2</w:t>
+            </w:r>
+            <w:r>
+              <w:rPr>
+                <w:rStyle w:val="SpecialCharTok"/>
+              </w:rPr>
+              <w:t xml:space="preserve">::</w:t>
+            </w:r>
+            <w:r>
+              <w:rPr>
+                <w:rStyle w:val="FunctionTok"/>
+              </w:rPr>
+              <w:t xml:space="preserve">labs</w:t>
+            </w:r>
+            <w:r>
+              <w:rPr>
+                <w:rStyle w:val="NormalTok"/>
+              </w:rPr>
+              <w:t xml:space="preserve">(</w:t>
+            </w:r>
+            <w:r>
+              <w:br/>
+            </w:r>
+            <w:r>
+              <w:rPr>
+                <w:rStyle w:val="NormalTok"/>
+              </w:rPr>
+              <w:t xml:space="preserve">    </w:t>
+            </w:r>
+            <w:r>
+              <w:rPr>
+                <w:rStyle w:val="AttributeTok"/>
+              </w:rPr>
+              <w:t xml:space="preserve">x =</w:t>
+            </w:r>
+            <w:r>
+              <w:rPr>
+                <w:rStyle w:val="NormalTok"/>
+              </w:rPr>
               <w:t xml:space="preserve"> </w:t>
             </w:r>
             <w:r>
               <w:rPr>
                 <w:rStyle w:val="StringTok"/>
               </w:rPr>
-              <w:t xml:space="preserve">"dashed"</w:t>
+              <w:t xml:space="preserve">"polynomial degree"</w:t>
             </w:r>
             <w:r>
               <w:rPr>
                 <w:rStyle w:val="NormalTok"/>
               </w:rPr>
-              <w:t xml:space="preserve">) </w:t>
-            </w:r>
-            <w:r>
-              <w:rPr>
-                <w:rStyle w:val="SpecialCharTok"/>
-              </w:rPr>
-              <w:t xml:space="preserve">+</w:t>
+              <w:t xml:space="preserve">,</w:t>
             </w:r>
             <w:r>
               <w:br/>
@@ -35275,253 +35442,25 @@
               <w:rPr>
                 <w:rStyle w:val="NormalTok"/>
               </w:rPr>
-              <w:t xml:space="preserve">  ggplot2</w:t>
-            </w:r>
-            <w:r>
-              <w:rPr>
-                <w:rStyle w:val="SpecialCharTok"/>
-              </w:rPr>
-              <w:t xml:space="preserve">::</w:t>
-            </w:r>
-            <w:r>
-              <w:rPr>
-                <w:rStyle w:val="FunctionTok"/>
-              </w:rPr>
-              <w:t xml:space="preserve">geom_line</w:t>
+              <w:t xml:space="preserve">    </w:t>
+            </w:r>
+            <w:r>
+              <w:rPr>
+                <w:rStyle w:val="AttributeTok"/>
+              </w:rPr>
+              <w:t xml:space="preserve">y =</w:t>
             </w:r>
             <w:r>
               <w:rPr>
                 <w:rStyle w:val="NormalTok"/>
               </w:rPr>
-              <w:t xml:space="preserve">() </w:t>
-            </w:r>
-            <w:r>
-              <w:rPr>
-                <w:rStyle w:val="SpecialCharTok"/>
-              </w:rPr>
-              <w:t xml:space="preserve">+</w:t>
-            </w:r>
-            <w:r>
-              <w:br/>
-            </w:r>
-            <w:r>
-              <w:rPr>
-                <w:rStyle w:val="NormalTok"/>
-              </w:rPr>
-              <w:t xml:space="preserve">  ggplot2</w:t>
-            </w:r>
-            <w:r>
-              <w:rPr>
-                <w:rStyle w:val="SpecialCharTok"/>
-              </w:rPr>
-              <w:t xml:space="preserve">::</w:t>
-            </w:r>
-            <w:r>
-              <w:rPr>
-                <w:rStyle w:val="FunctionTok"/>
-              </w:rPr>
-              <w:t xml:space="preserve">geom_point</w:t>
-            </w:r>
-            <w:r>
-              <w:rPr>
-                <w:rStyle w:val="NormalTok"/>
-              </w:rPr>
-              <w:t xml:space="preserve">(</w:t>
-            </w:r>
-            <w:r>
-              <w:rPr>
-                <w:rStyle w:val="AttributeTok"/>
-              </w:rPr>
-              <w:t xml:space="preserve">size =</w:t>
-            </w:r>
-            <w:r>
-              <w:rPr>
-                <w:rStyle w:val="NormalTok"/>
-              </w:rPr>
               <w:t xml:space="preserve"> </w:t>
             </w:r>
             <w:r>
               <w:rPr>
-                <w:rStyle w:val="DecValTok"/>
-              </w:rPr>
-              <w:t xml:space="preserve">2</w:t>
-            </w:r>
-            <w:r>
-              <w:rPr>
-                <w:rStyle w:val="NormalTok"/>
-              </w:rPr>
-              <w:t xml:space="preserve">) </w:t>
-            </w:r>
-            <w:r>
-              <w:rPr>
-                <w:rStyle w:val="SpecialCharTok"/>
-              </w:rPr>
-              <w:t xml:space="preserve">+</w:t>
-            </w:r>
-            <w:r>
-              <w:br/>
-            </w:r>
-            <w:r>
-              <w:rPr>
-                <w:rStyle w:val="NormalTok"/>
-              </w:rPr>
-              <w:t xml:space="preserve">  ggplot2</w:t>
-            </w:r>
-            <w:r>
-              <w:rPr>
-                <w:rStyle w:val="SpecialCharTok"/>
-              </w:rPr>
-              <w:t xml:space="preserve">::</w:t>
-            </w:r>
-            <w:r>
-              <w:rPr>
-                <w:rStyle w:val="FunctionTok"/>
-              </w:rPr>
-              <w:t xml:space="preserve">scale_x_continuous</w:t>
-            </w:r>
-            <w:r>
-              <w:rPr>
-                <w:rStyle w:val="NormalTok"/>
-              </w:rPr>
-              <w:t xml:space="preserve">(</w:t>
-            </w:r>
-            <w:r>
-              <w:rPr>
-                <w:rStyle w:val="AttributeTok"/>
-              </w:rPr>
-              <w:t xml:space="preserve">breaks =</w:t>
-            </w:r>
-            <w:r>
-              <w:rPr>
-                <w:rStyle w:val="NormalTok"/>
-              </w:rPr>
-              <w:t xml:space="preserve"> sim_degrees) </w:t>
-            </w:r>
-            <w:r>
-              <w:rPr>
-                <w:rStyle w:val="SpecialCharTok"/>
-              </w:rPr>
-              <w:t xml:space="preserve">+</w:t>
-            </w:r>
-            <w:r>
-              <w:br/>
-            </w:r>
-            <w:r>
-              <w:rPr>
-                <w:rStyle w:val="NormalTok"/>
-              </w:rPr>
-              <w:t xml:space="preserve">  ggplot2</w:t>
-            </w:r>
-            <w:r>
-              <w:rPr>
-                <w:rStyle w:val="SpecialCharTok"/>
-              </w:rPr>
-              <w:t xml:space="preserve">::</w:t>
-            </w:r>
-            <w:r>
-              <w:rPr>
-                <w:rStyle w:val="FunctionTok"/>
-              </w:rPr>
-              <w:t xml:space="preserve">scale_y_log10</w:t>
-            </w:r>
-            <w:r>
-              <w:rPr>
-                <w:rStyle w:val="NormalTok"/>
-              </w:rPr>
-              <w:t xml:space="preserve">() </w:t>
-            </w:r>
-            <w:r>
-              <w:rPr>
-                <w:rStyle w:val="SpecialCharTok"/>
-              </w:rPr>
-              <w:t xml:space="preserve">+</w:t>
-            </w:r>
-            <w:r>
-              <w:br/>
-            </w:r>
-            <w:r>
-              <w:rPr>
-                <w:rStyle w:val="NormalTok"/>
-              </w:rPr>
-              <w:t xml:space="preserve">  ggplot2</w:t>
-            </w:r>
-            <w:r>
-              <w:rPr>
-                <w:rStyle w:val="SpecialCharTok"/>
-              </w:rPr>
-              <w:t xml:space="preserve">::</w:t>
-            </w:r>
-            <w:r>
-              <w:rPr>
-                <w:rStyle w:val="FunctionTok"/>
-              </w:rPr>
-              <w:t xml:space="preserve">labs</w:t>
-            </w:r>
-            <w:r>
-              <w:rPr>
-                <w:rStyle w:val="NormalTok"/>
-              </w:rPr>
-              <w:t xml:space="preserve">(</w:t>
-            </w:r>
-            <w:r>
-              <w:br/>
-            </w:r>
-            <w:r>
-              <w:rPr>
-                <w:rStyle w:val="NormalTok"/>
-              </w:rPr>
-              <w:t xml:space="preserve">    </w:t>
-            </w:r>
-            <w:r>
-              <w:rPr>
-                <w:rStyle w:val="AttributeTok"/>
-              </w:rPr>
-              <w:t xml:space="preserve">x =</w:t>
-            </w:r>
-            <w:r>
-              <w:rPr>
-                <w:rStyle w:val="NormalTok"/>
-              </w:rPr>
-              <w:t xml:space="preserve"> </w:t>
-            </w:r>
-            <w:r>
-              <w:rPr>
                 <w:rStyle w:val="StringTok"/>
               </w:rPr>
-              <w:t xml:space="preserve">"polynomial degree"</w:t>
-            </w:r>
-            <w:r>
-              <w:rPr>
-                <w:rStyle w:val="NormalTok"/>
-              </w:rPr>
-              <w:t xml:space="preserve">,</w:t>
-            </w:r>
-            <w:r>
-              <w:br/>
-            </w:r>
-            <w:r>
-              <w:rPr>
-                <w:rStyle w:val="NormalTok"/>
-              </w:rPr>
-              <w:t xml:space="preserve">    </w:t>
-            </w:r>
-            <w:r>
-              <w:rPr>
-                <w:rStyle w:val="AttributeTok"/>
-              </w:rPr>
-              <w:t xml:space="preserve">y =</w:t>
-            </w:r>
-            <w:r>
-              <w:rPr>
-                <w:rStyle w:val="NormalTok"/>
-              </w:rPr>
-              <w:t xml:space="preserve"> </w:t>
-            </w:r>
-            <w:r>
-              <w:rPr>
-                <w:rStyle w:val="StringTok"/>
-              </w:rPr>
-              <w:t xml:space="preserve">"mean squared error (log scale)"</w:t>
+              <w:t xml:space="preserve">"root mean squared error (log scale)"</w:t>
             </w:r>
             <w:r>
               <w:rPr>
@@ -36153,7 +36092,7 @@
         <w:rPr>
           <w:rStyle w:val="CommentTok"/>
         </w:rPr>
-        <w:t xml:space="preserve">#&gt;                               3.0000                               5.0000 </w:t>
+        <w:t xml:space="preserve">#&gt;                              3.00000                              5.00000 </w:t>
       </w:r>
       <w:r>
         <w:br/>
@@ -36171,7 +36110,7 @@
         <w:rPr>
           <w:rStyle w:val="CommentTok"/>
         </w:rPr>
-        <w:t xml:space="preserve">#&gt;                              24.0000                              16.5906</w:t>
+        <w:t xml:space="preserve">#&gt;                             24.00000                              4.07316</w:t>
       </w:r>
     </w:p>
     <w:p>
@@ -36292,7 +36231,7 @@
         <w:t xml:space="preserve"> </w:t>
       </w:r>
       <w:r>
-        <w:t xml:space="preserve">16.6 times the estimated generalization error.</w:t>
+        <w:t xml:space="preserve">4.1 times the estimated generalization RMSE.</w:t>
       </w:r>
     </w:p>
     <w:p>
@@ -37463,7 +37402,7 @@
         <w:t xml:space="preserve"> </w:t>
       </w:r>
       <w:r>
-        <w:t xml:space="preserve">have median generalization error</w:t>
+        <w:t xml:space="preserve">have median generalization MSE</w:t>
       </w:r>
       <w:r>
         <w:t xml:space="preserve"> </w:t>
@@ -50580,7 +50519,7 @@
         <w:t xml:space="preserve"> </w:t>
       </w:r>
       <w:r>
-        <w:t xml:space="preserve">the estimated generalization errors of</w:t>
+        <w:t xml:space="preserve">the estimated generalization RMSE of</w:t>
       </w:r>
       <w:r>
         <w:t xml:space="preserve"> </w:t>
@@ -50594,19 +50533,22 @@
         </w:r>
       </w:hyperlink>
       <w:r>
-        <w:t xml:space="preserve">:</w:t>
-      </w:r>
-      <w:r>
-        <w:t xml:space="preserve"> </w:t>
-      </w:r>
-      <w:r>
-        <w:t xml:space="preserve">0.112 for degree 8</w:t>
-      </w:r>
-      <w:r>
-        <w:t xml:space="preserve"> </w:t>
-      </w:r>
-      <w:r>
-        <w:t xml:space="preserve">and 0.099 for degree 3.</w:t>
+        <w:t xml:space="preserve"> </w:t>
+      </w:r>
+      <w:r>
+        <w:t xml:space="preserve">for each:</w:t>
+      </w:r>
+      <w:r>
+        <w:t xml:space="preserve"> </w:t>
+      </w:r>
+      <w:r>
+        <w:t xml:space="preserve">0.335 for degree 8</w:t>
+      </w:r>
+      <w:r>
+        <w:t xml:space="preserve"> </w:t>
+      </w:r>
+      <w:r>
+        <w:t xml:space="preserve">and 0.315 for degree 3.</w:t>
       </w:r>
     </w:p>
     <w:bookmarkEnd w:id="231"/>

</xml_diff>

<commit_message>
Deploying to gh-pages from @ Morrison-Lab/sds@d0801e94c54b1922d09a0cf053df18a390e41ca3 🚀
</commit_message>
<xml_diff>
--- a/model-validation-handout.docx
+++ b/model-validation-handout.docx
@@ -15,7 +15,7 @@
         <w:pStyle w:val="Date"/>
       </w:pPr>
       <w:r>
-        <w:t xml:space="preserve">Last modified: 2026-10-14 00:24:30 (PDT)</w:t>
+        <w:t xml:space="preserve">Last modified: 2026-10-14 01:48:17 (PDT)</w:t>
       </w:r>
     </w:p>
     <w:bookmarkStart w:id="38" w:name="sec-prediction-rules"/>
@@ -39538,7 +39538,7 @@
     </w:p>
     <w:bookmarkEnd w:id="173"/>
     <w:bookmarkEnd w:id="174"/>
-    <w:bookmarkStart w:id="199" w:name="sec-loocv"/>
+    <w:bookmarkStart w:id="205" w:name="sec-loocv"/>
     <w:p>
       <w:pPr>
         <w:pStyle w:val="Heading2"/>
@@ -41186,7 +41186,7 @@
       </w:r>
     </w:p>
     <w:bookmarkEnd w:id="184"/>
-    <w:bookmarkStart w:id="186" w:name="def-cross-product-matrix"/>
+    <w:bookmarkStart w:id="189" w:name="def-cross-product-matrix"/>
     <w:p>
       <w:pPr>
         <w:pStyle w:val="BodyText"/>
@@ -41443,13 +41443,602 @@
       </m:oMathPara>
       <w:bookmarkEnd w:id="185"/>
     </w:p>
-    <w:bookmarkEnd w:id="186"/>
-    <w:bookmarkStart w:id="192" w:name="def-leverage"/>
+    <w:tbl>
+      <w:tblPr>
+        <w:tblStyle w:val="Table"/>
+        <w:tblLook w:firstRow="0" w:lastRow="0" w:firstColumn="0" w:lastColumn="0" w:noHBand="0" w:noVBand="0" w:val="0000"/>
+        <w:tblBorders>
+          <w:top w:val="single" w:sz="4" w:space="0" w:color="0758E5"/>
+          <w:left w:val="single" w:sz="24" w:space="0" w:color="0758E5"/>
+          <w:bottom w:val="single" w:sz="4" w:space="0" w:color="0758E5"/>
+          <w:right w:val="single" w:sz="4" w:space="0" w:color="0758E5"/>
+        </w:tblBorders>
+        <w:tblCellMar>
+          <w:left w:w="144" w:type="dxa"/>
+          <w:right w:w="144" w:type="dxa"/>
+        </w:tblCellMar>
+        <w:tblLook w:firstRow="0" w:lastRow="0" w:firstColumn="0" w:lastColumn="0" w:noHBand="0" w:noVBand="0" w:val="0000"/>
+      </w:tblPr>
+      <w:tr>
+        <w:trPr>
+          <w:cantSplit/>
+        </w:trPr>
+        <w:tc>
+          <w:tcPr>
+            <w:shd w:color="auto" w:fill="dae6fb" w:val="clear"/>
+            <w:tcMar>
+              <w:top w:w="92" w:type="dxa"/>
+              <w:bottom w:w="92" w:type="dxa"/>
+            </w:tcMar>
+          </w:tcPr>
+          <w:p>
+            <w:pPr>
+              <w:pStyle w:val="FirstParagraph"/>
+            </w:pPr>
+            <w:pPr>
+              <w:spacing w:before="0" w:after="0"/>
+              <w:textAlignment w:val="center"/>
+            </w:pPr>
+            <w:r>
+              <w:drawing>
+                <wp:inline>
+                  <wp:extent cx="152400" cy="152400"/>
+                  <wp:effectExtent b="0" l="0" r="0" t="0"/>
+                  <wp:docPr descr="" title="" id="186" name="Picture"/>
+                  <a:graphic>
+                    <a:graphicData uri="http://schemas.openxmlformats.org/drawingml/2006/picture">
+                      <pic:pic>
+                        <pic:nvPicPr>
+                          <pic:cNvPr descr="/opt/quarto/share/formats/docx/note.png" id="187" name="Picture"/>
+                          <pic:cNvPicPr>
+                            <a:picLocks noChangeArrowheads="1" noChangeAspect="1"/>
+                          </pic:cNvPicPr>
+                        </pic:nvPicPr>
+                        <pic:blipFill>
+                          <a:blip r:embed="rId11"/>
+                          <a:stretch>
+                            <a:fillRect/>
+                          </a:stretch>
+                        </pic:blipFill>
+                        <pic:spPr bwMode="auto">
+                          <a:xfrm>
+                            <a:off x="0" y="0"/>
+                            <a:ext cx="152400" cy="152400"/>
+                          </a:xfrm>
+                          <a:prstGeom prst="rect">
+                            <a:avLst/>
+                          </a:prstGeom>
+                          <a:noFill/>
+                          <a:ln w="9525">
+                            <a:noFill/>
+                            <a:headEnd/>
+                            <a:tailEnd/>
+                          </a:ln>
+                        </pic:spPr>
+                      </pic:pic>
+                    </a:graphicData>
+                  </a:graphic>
+                </wp:inline>
+              </w:drawing>
+            </w:r>
+            <w:r>
+              <w:t xml:space="preserve"> </w:t>
+            </w:r>
+            <w:r>
+              <w:t xml:space="preserve"> </w:t>
+            </w:r>
+            <w:r>
+              <w:t xml:space="preserve">Source</w:t>
+            </w:r>
+          </w:p>
+        </w:tc>
+      </w:tr>
+      <w:tr>
+        <w:trPr>
+          <w:cantSplit/>
+        </w:trPr>
+        <w:tc>
+          <w:tcPr>
+            <w:tcMar>
+              <w:top w:w="108" w:type="dxa"/>
+              <w:bottom w:w="108" w:type="dxa"/>
+            </w:tcMar>
+          </w:tcPr>
+          <w:p>
+            <w:pPr>
+              <w:pStyle w:val="BodyText"/>
+            </w:pPr>
+            <w:pPr>
+              <w:spacing w:before="16" w:after="16"/>
+            </w:pPr>
+            <w:r>
+              <w:t xml:space="preserve">Sanchez</w:t>
+            </w:r>
+            <w:r>
+              <w:t xml:space="preserve"> </w:t>
+            </w:r>
+            <w:r>
+              <w:t xml:space="preserve">(2020, chap. </w:t>
+            </w:r>
+            <w:r>
+              <w:t xml:space="preserve">“Matrix Cross-Products”</w:t>
+            </w:r>
+            <w:r>
+              <w:t xml:space="preserve">)</w:t>
+            </w:r>
+            <w:r>
+              <w:t xml:space="preserve"> </w:t>
+            </w:r>
+            <w:r>
+              <w:t xml:space="preserve">(see</w:t>
+            </w:r>
+            <w:r>
+              <w:t xml:space="preserve"> </w:t>
+            </w:r>
+            <w:hyperlink r:id="rId188">
+              <w:r>
+                <w:rPr>
+                  <w:rStyle w:val="Hyperlink"/>
+                </w:rPr>
+                <w:t xml:space="preserve">the chapter online</w:t>
+              </w:r>
+            </w:hyperlink>
+            <w:r>
+              <w:t xml:space="preserve">) names this matrix a sum-of-squares and cross-products matrix.</w:t>
+            </w:r>
+          </w:p>
+          <w:p/>
+        </w:tc>
+      </w:tr>
+    </w:tbl>
+    <w:bookmarkEnd w:id="189"/>
+    <w:bookmarkStart w:id="192" w:name="rem-cross-product-matrix"/>
+    <w:p>
+      <w:pPr>
+        <w:pStyle w:val="BodyText"/>
+      </w:pPr>
+      <w:r>
+        <w:rPr>
+          <w:i/>
+          <w:iCs/>
+        </w:rPr>
+        <w:t xml:space="preserve">Remark 11</w:t>
+      </w:r>
+      <w:r>
+        <w:t xml:space="preserve"> (Cross-product matrix as a matrix product). </w:t>
+      </w:r>
+      <w:r>
+        <w:t xml:space="preserve">Let</w:t>
+      </w:r>
+      <w:r>
+        <w:t xml:space="preserve"> </w:t>
+      </w:r>
+      <m:oMath>
+        <m:r>
+          <m:rPr>
+            <m:sty m:val="p"/>
+          </m:rPr>
+          <m:t>Φ</m:t>
+        </m:r>
+      </m:oMath>
+      <w:r>
+        <w:t xml:space="preserve"> </w:t>
+      </w:r>
+      <w:r>
+        <w:t xml:space="preserve">be the matrix whose rows are the transposed</w:t>
+      </w:r>
+      <w:r>
+        <w:t xml:space="preserve"> </w:t>
+      </w:r>
+      <w:hyperlink w:anchor="def-term-vector">
+        <w:r>
+          <w:rPr>
+            <w:rStyle w:val="Hyperlink"/>
+          </w:rPr>
+          <w:t xml:space="preserve">term vectors</w:t>
+        </w:r>
+      </w:hyperlink>
+      <w:r>
+        <w:t xml:space="preserve"> </w:t>
+      </w:r>
+      <m:oMath>
+        <m:sSup>
+          <m:e>
+            <m:sSub>
+              <m:e>
+                <m:acc>
+                  <m:accPr>
+                    <m:chr m:val="̃"/>
+                  </m:accPr>
+                  <m:e>
+                    <m:r>
+                      <m:t>t</m:t>
+                    </m:r>
+                  </m:e>
+                </m:acc>
+              </m:e>
+              <m:sub>
+                <m:r>
+                  <m:t>i</m:t>
+                </m:r>
+              </m:sub>
+            </m:sSub>
+          </m:e>
+          <m:sup>
+            <m:r>
+              <m:rPr>
+                <m:sty m:val="p"/>
+              </m:rPr>
+              <m:t>⊤</m:t>
+            </m:r>
+          </m:sup>
+        </m:sSup>
+      </m:oMath>
+      <w:r>
+        <w:t xml:space="preserve">,</w:t>
+      </w:r>
+      <w:r>
+        <w:t xml:space="preserve"> </w:t>
+      </w:r>
+      <m:oMath>
+        <m:r>
+          <m:t>i</m:t>
+        </m:r>
+        <m:r>
+          <m:rPr>
+            <m:sty m:val="p"/>
+          </m:rPr>
+          <m:t>∈</m:t>
+        </m:r>
+        <m:r>
+          <m:t>I</m:t>
+        </m:r>
+      </m:oMath>
+      <w:r>
+        <w:t xml:space="preserve">.</w:t>
+      </w:r>
+      <w:r>
+        <w:t xml:space="preserve"> </w:t>
+      </w:r>
+      <w:r>
+        <w:t xml:space="preserve">The cross-product matrix then equals the matrix product</w:t>
+      </w:r>
+    </w:p>
+    <w:p>
+      <w:pPr>
+        <w:pStyle w:val="BodyText"/>
+      </w:pPr>
+      <m:oMathPara>
+        <m:oMathParaPr>
+          <m:jc m:val="center"/>
+        </m:oMathParaPr>
+        <m:oMath>
+          <m:r>
+            <m:t>A</m:t>
+          </m:r>
+          <m:r>
+            <m:rPr>
+              <m:sty m:val="p"/>
+            </m:rPr>
+            <m:t>=</m:t>
+          </m:r>
+          <m:sSup>
+            <m:e>
+              <m:r>
+                <m:rPr>
+                  <m:sty m:val="p"/>
+                </m:rPr>
+                <m:t>Φ</m:t>
+              </m:r>
+            </m:e>
+            <m:sup>
+              <m:r>
+                <m:rPr>
+                  <m:sty m:val="p"/>
+                </m:rPr>
+                <m:t>⊤</m:t>
+              </m:r>
+            </m:sup>
+          </m:sSup>
+          <m:r>
+            <m:rPr>
+              <m:sty m:val="p"/>
+            </m:rPr>
+            <m:t>Φ</m:t>
+          </m:r>
+          <m:r>
+            <m:rPr>
+              <m:sty m:val="p"/>
+            </m:rPr>
+            <m:t>.</m:t>
+          </m:r>
+        </m:oMath>
+      </m:oMathPara>
+    </w:p>
     <w:p>
       <w:pPr>
         <w:pStyle w:val="FirstParagraph"/>
       </w:pPr>
       <w:r>
+        <w:t xml:space="preserve">Its diagonal entries are sums of squares of one term over the training set.</w:t>
+      </w:r>
+      <w:r>
+        <w:t xml:space="preserve"> </w:t>
+      </w:r>
+      <w:r>
+        <w:t xml:space="preserve">Its off-diagonal entries are sums of cross-products of two different terms.</w:t>
+      </w:r>
+      <w:r>
+        <w:t xml:space="preserve"> </w:t>
+      </w:r>
+      <w:r>
+        <w:t xml:space="preserve">Statisticians therefore call</w:t>
+      </w:r>
+      <w:r>
+        <w:t xml:space="preserve"> </w:t>
+      </w:r>
+      <m:oMath>
+        <m:r>
+          <m:t>A</m:t>
+        </m:r>
+      </m:oMath>
+      <w:r>
+        <w:t xml:space="preserve"> </w:t>
+      </w:r>
+      <w:r>
+        <w:t xml:space="preserve">the sum-of-squares and cross-products (SSCP) matrix of the terms.</w:t>
+      </w:r>
+      <w:r>
+        <w:t xml:space="preserve"> </w:t>
+      </w:r>
+      <w:r>
+        <w:t xml:space="preserve">When every column of</w:t>
+      </w:r>
+      <w:r>
+        <w:t xml:space="preserve"> </w:t>
+      </w:r>
+      <m:oMath>
+        <m:r>
+          <m:rPr>
+            <m:sty m:val="p"/>
+          </m:rPr>
+          <m:t>Φ</m:t>
+        </m:r>
+      </m:oMath>
+      <w:r>
+        <w:t xml:space="preserve"> </w:t>
+      </w:r>
+      <w:r>
+        <w:t xml:space="preserve">has mean zero,</w:t>
+      </w:r>
+      <w:r>
+        <w:t xml:space="preserve"> </w:t>
+      </w:r>
+      <m:oMath>
+        <m:r>
+          <m:t>A</m:t>
+        </m:r>
+        <m:r>
+          <m:rPr>
+            <m:sty m:val="p"/>
+          </m:rPr>
+          <m:t>/</m:t>
+        </m:r>
+        <m:r>
+          <m:rPr>
+            <m:sty m:val="p"/>
+          </m:rPr>
+          <m:t>(</m:t>
+        </m:r>
+        <m:r>
+          <m:t>​</m:t>
+        </m:r>
+        <m:d>
+          <m:dPr>
+            <m:begChr m:val="|"/>
+            <m:sepChr m:val=""/>
+            <m:endChr m:val="|"/>
+            <m:grow/>
+          </m:dPr>
+          <m:e>
+            <m:r>
+              <m:t>I</m:t>
+            </m:r>
+          </m:e>
+        </m:d>
+        <m:r>
+          <m:t>​</m:t>
+        </m:r>
+        <m:r>
+          <m:rPr>
+            <m:sty m:val="p"/>
+          </m:rPr>
+          <m:t>−</m:t>
+        </m:r>
+        <m:r>
+          <m:t>1</m:t>
+        </m:r>
+        <m:r>
+          <m:rPr>
+            <m:sty m:val="p"/>
+          </m:rPr>
+          <m:t>)</m:t>
+        </m:r>
+      </m:oMath>
+      <w:r>
+        <w:t xml:space="preserve"> </w:t>
+      </w:r>
+      <w:r>
+        <w:t xml:space="preserve">is the sample covariance matrix of the terms.</w:t>
+      </w:r>
+    </w:p>
+    <w:tbl>
+      <w:tblPr>
+        <w:tblStyle w:val="Table"/>
+        <w:tblLook w:firstRow="0" w:lastRow="0" w:firstColumn="0" w:lastColumn="0" w:noHBand="0" w:noVBand="0" w:val="0000"/>
+        <w:tblBorders>
+          <w:top w:val="single" w:sz="4" w:space="0" w:color="0758E5"/>
+          <w:left w:val="single" w:sz="24" w:space="0" w:color="0758E5"/>
+          <w:bottom w:val="single" w:sz="4" w:space="0" w:color="0758E5"/>
+          <w:right w:val="single" w:sz="4" w:space="0" w:color="0758E5"/>
+        </w:tblBorders>
+        <w:tblCellMar>
+          <w:left w:w="144" w:type="dxa"/>
+          <w:right w:w="144" w:type="dxa"/>
+        </w:tblCellMar>
+        <w:tblLook w:firstRow="0" w:lastRow="0" w:firstColumn="0" w:lastColumn="0" w:noHBand="0" w:noVBand="0" w:val="0000"/>
+      </w:tblPr>
+      <w:tr>
+        <w:trPr>
+          <w:cantSplit/>
+        </w:trPr>
+        <w:tc>
+          <w:tcPr>
+            <w:shd w:color="auto" w:fill="dae6fb" w:val="clear"/>
+            <w:tcMar>
+              <w:top w:w="92" w:type="dxa"/>
+              <w:bottom w:w="92" w:type="dxa"/>
+            </w:tcMar>
+          </w:tcPr>
+          <w:p>
+            <w:pPr>
+              <w:pStyle w:val="BodyText"/>
+            </w:pPr>
+            <w:pPr>
+              <w:spacing w:before="0" w:after="0"/>
+              <w:textAlignment w:val="center"/>
+            </w:pPr>
+            <w:r>
+              <w:drawing>
+                <wp:inline>
+                  <wp:extent cx="152400" cy="152400"/>
+                  <wp:effectExtent b="0" l="0" r="0" t="0"/>
+                  <wp:docPr descr="" title="" id="190" name="Picture"/>
+                  <a:graphic>
+                    <a:graphicData uri="http://schemas.openxmlformats.org/drawingml/2006/picture">
+                      <pic:pic>
+                        <pic:nvPicPr>
+                          <pic:cNvPr descr="/opt/quarto/share/formats/docx/note.png" id="191" name="Picture"/>
+                          <pic:cNvPicPr>
+                            <a:picLocks noChangeArrowheads="1" noChangeAspect="1"/>
+                          </pic:cNvPicPr>
+                        </pic:nvPicPr>
+                        <pic:blipFill>
+                          <a:blip r:embed="rId11"/>
+                          <a:stretch>
+                            <a:fillRect/>
+                          </a:stretch>
+                        </pic:blipFill>
+                        <pic:spPr bwMode="auto">
+                          <a:xfrm>
+                            <a:off x="0" y="0"/>
+                            <a:ext cx="152400" cy="152400"/>
+                          </a:xfrm>
+                          <a:prstGeom prst="rect">
+                            <a:avLst/>
+                          </a:prstGeom>
+                          <a:noFill/>
+                          <a:ln w="9525">
+                            <a:noFill/>
+                            <a:headEnd/>
+                            <a:tailEnd/>
+                          </a:ln>
+                        </pic:spPr>
+                      </pic:pic>
+                    </a:graphicData>
+                  </a:graphic>
+                </wp:inline>
+              </w:drawing>
+            </w:r>
+            <w:r>
+              <w:t xml:space="preserve"> </w:t>
+            </w:r>
+            <w:r>
+              <w:t xml:space="preserve"> </w:t>
+            </w:r>
+            <w:r>
+              <w:t xml:space="preserve">Source</w:t>
+            </w:r>
+          </w:p>
+        </w:tc>
+      </w:tr>
+      <w:tr>
+        <w:trPr>
+          <w:cantSplit/>
+        </w:trPr>
+        <w:tc>
+          <w:tcPr>
+            <w:tcMar>
+              <w:top w:w="108" w:type="dxa"/>
+              <w:bottom w:w="108" w:type="dxa"/>
+            </w:tcMar>
+          </w:tcPr>
+          <w:p>
+            <w:pPr>
+              <w:pStyle w:val="BodyText"/>
+            </w:pPr>
+            <w:pPr>
+              <w:spacing w:before="16" w:after="16"/>
+            </w:pPr>
+            <w:r>
+              <w:t xml:space="preserve">I restated the SSCP reading and the covariance special case from Sanchez</w:t>
+            </w:r>
+            <w:r>
+              <w:t xml:space="preserve"> </w:t>
+            </w:r>
+            <w:r>
+              <w:t xml:space="preserve">(2020, chap. </w:t>
+            </w:r>
+            <w:r>
+              <w:t xml:space="preserve">“Matrix Cross-Products”</w:t>
+            </w:r>
+            <w:r>
+              <w:t xml:space="preserve">)</w:t>
+            </w:r>
+            <w:r>
+              <w:t xml:space="preserve"> </w:t>
+            </w:r>
+            <w:r>
+              <w:t xml:space="preserve">(see</w:t>
+            </w:r>
+            <w:r>
+              <w:t xml:space="preserve"> </w:t>
+            </w:r>
+            <w:hyperlink r:id="rId188">
+              <w:r>
+                <w:rPr>
+                  <w:rStyle w:val="Hyperlink"/>
+                </w:rPr>
+                <w:t xml:space="preserve">the chapter online</w:t>
+              </w:r>
+            </w:hyperlink>
+            <w:r>
+              <w:t xml:space="preserve">) in this page’s notation.</w:t>
+            </w:r>
+            <w:r>
+              <w:t xml:space="preserve"> </w:t>
+            </w:r>
+            <w:r>
+              <w:t xml:space="preserve">The book carries a non-commercial, share-alike license,</w:t>
+            </w:r>
+            <w:r>
+              <w:t xml:space="preserve"> </w:t>
+            </w:r>
+            <w:r>
+              <w:t xml:space="preserve">so I paraphrased it and copied none of its text.</w:t>
+            </w:r>
+          </w:p>
+          <w:p/>
+        </w:tc>
+      </w:tr>
+    </w:tbl>
+    <w:bookmarkEnd w:id="192"/>
+    <w:bookmarkStart w:id="198" w:name="def-leverage"/>
+    <w:p>
+      <w:pPr>
+        <w:pStyle w:val="BodyText"/>
+      </w:pPr>
+      <w:r>
         <w:rPr>
           <w:b/>
           <w:bCs/>
@@ -41465,7 +42054,7 @@
       <w:r>
         <w:t xml:space="preserve"> </w:t>
       </w:r>
-      <w:hyperlink r:id="rId187">
+      <w:hyperlink r:id="rId193">
         <w:r>
           <w:rPr>
             <w:rStyle w:val="Hyperlink"/>
@@ -41609,7 +42198,7 @@
       <w:pPr>
         <w:pStyle w:val="BodyText"/>
       </w:pPr>
-      <w:bookmarkStart w:id="188" w:name="eq-leverage"/>
+      <w:bookmarkStart w:id="194" w:name="eq-leverage"/>
       <m:oMathPara>
         <m:oMathParaPr>
           <m:jc m:val="center"/>
@@ -41740,7 +42329,7 @@
           </m:r>
         </m:oMath>
       </m:oMathPara>
-      <w:bookmarkEnd w:id="188"/>
+      <w:bookmarkEnd w:id="194"/>
     </w:p>
     <w:tbl>
       <w:tblPr>
@@ -41783,12 +42372,12 @@
                 <wp:inline>
                   <wp:extent cx="152400" cy="152400"/>
                   <wp:effectExtent b="0" l="0" r="0" t="0"/>
-                  <wp:docPr descr="" title="" id="189" name="Picture"/>
+                  <wp:docPr descr="" title="" id="195" name="Picture"/>
                   <a:graphic>
                     <a:graphicData uri="http://schemas.openxmlformats.org/drawingml/2006/picture">
                       <pic:pic>
                         <pic:nvPicPr>
-                          <pic:cNvPr descr="/opt/quarto/share/formats/docx/note.png" id="190" name="Picture"/>
+                          <pic:cNvPr descr="/opt/quarto/share/formats/docx/note.png" id="196" name="Picture"/>
                           <pic:cNvPicPr>
                             <a:picLocks noChangeArrowheads="1" noChangeAspect="1"/>
                           </pic:cNvPicPr>
@@ -41882,7 +42471,7 @@
             <w:r>
               <w:t xml:space="preserve"> </w:t>
             </w:r>
-            <w:hyperlink r:id="rId191">
+            <w:hyperlink r:id="rId197">
               <w:r>
                 <w:rPr>
                   <w:rStyle w:val="Hyperlink"/>
@@ -41898,8 +42487,8 @@
         </w:tc>
       </w:tr>
     </w:tbl>
-    <w:bookmarkEnd w:id="192"/>
-    <w:bookmarkStart w:id="196" w:name="thm-loocv-shortcut"/>
+    <w:bookmarkEnd w:id="198"/>
+    <w:bookmarkStart w:id="202" w:name="thm-loocv-shortcut"/>
     <w:p>
       <w:pPr>
         <w:pStyle w:val="BodyText"/>
@@ -41920,7 +42509,7 @@
       <w:r>
         <w:t xml:space="preserve"> </w:t>
       </w:r>
-      <w:hyperlink r:id="rId187">
+      <w:hyperlink r:id="rId193">
         <w:r>
           <w:rPr>
             <w:rStyle w:val="Hyperlink"/>
@@ -42146,7 +42735,7 @@
       <w:pPr>
         <w:pStyle w:val="BodyText"/>
       </w:pPr>
-      <w:bookmarkStart w:id="193" w:name="eq-loocv-shortcut"/>
+      <w:bookmarkStart w:id="199" w:name="eq-loocv-shortcut"/>
       <m:oMathPara>
         <m:oMathParaPr>
           <m:jc m:val="center"/>
@@ -42336,7 +42925,7 @@
           </m:r>
         </m:oMath>
       </m:oMathPara>
-      <w:bookmarkEnd w:id="193"/>
+      <w:bookmarkEnd w:id="199"/>
     </w:p>
     <w:tbl>
       <w:tblPr>
@@ -42379,12 +42968,12 @@
                 <wp:inline>
                   <wp:extent cx="152400" cy="152400"/>
                   <wp:effectExtent b="0" l="0" r="0" t="0"/>
-                  <wp:docPr descr="" title="" id="194" name="Picture"/>
+                  <wp:docPr descr="" title="" id="200" name="Picture"/>
                   <a:graphic>
                     <a:graphicData uri="http://schemas.openxmlformats.org/drawingml/2006/picture">
                       <pic:pic>
                         <pic:nvPicPr>
-                          <pic:cNvPr descr="/opt/quarto/share/formats/docx/note.png" id="195" name="Picture"/>
+                          <pic:cNvPr descr="/opt/quarto/share/formats/docx/note.png" id="201" name="Picture"/>
                           <pic:cNvPicPr>
                             <a:picLocks noChangeArrowheads="1" noChangeAspect="1"/>
                           </pic:cNvPicPr>
@@ -42478,7 +43067,7 @@
         </w:tc>
       </w:tr>
     </w:tbl>
-    <w:bookmarkEnd w:id="196"/>
+    <w:bookmarkEnd w:id="202"/>
     <w:p>
       <w:pPr>
         <w:pStyle w:val="BodyText"/>
@@ -42607,7 +43196,7 @@
         <w:t xml:space="preserve">which this page does not develop.</w:t>
       </w:r>
     </w:p>
-    <w:bookmarkStart w:id="197" w:name="exm-loocv-shortcut"/>
+    <w:bookmarkStart w:id="203" w:name="exm-loocv-shortcut"/>
     <w:p>
       <w:pPr>
         <w:pStyle w:val="BodyText"/>
@@ -43747,8 +44336,8 @@
         <w:t xml:space="preserve">rerunning it always gives the same choice.</w:t>
       </w:r>
     </w:p>
-    <w:bookmarkEnd w:id="197"/>
-    <w:bookmarkStart w:id="198" w:name="rem-loocv"/>
+    <w:bookmarkEnd w:id="203"/>
+    <w:bookmarkStart w:id="204" w:name="rem-loocv"/>
     <w:p>
       <w:pPr>
         <w:pStyle w:val="BodyText"/>
@@ -43758,7 +44347,7 @@
           <w:i/>
           <w:iCs/>
         </w:rPr>
-        <w:t xml:space="preserve">Remark 11</w:t>
+        <w:t xml:space="preserve">Remark 12</w:t>
       </w:r>
       <w:r>
         <w:t xml:space="preserve"> (When to use leave-one-out cross-validation). </w:t>
@@ -44220,9 +44809,9 @@
         <w:t xml:space="preserve">fits.</w:t>
       </w:r>
     </w:p>
-    <w:bookmarkEnd w:id="198"/>
-    <w:bookmarkEnd w:id="199"/>
-    <w:bookmarkStart w:id="232" w:name="sec-cv-model-choice"/>
+    <w:bookmarkEnd w:id="204"/>
+    <w:bookmarkEnd w:id="205"/>
+    <w:bookmarkStart w:id="238" w:name="sec-cv-model-choice"/>
     <w:p>
       <w:pPr>
         <w:pStyle w:val="Heading2"/>
@@ -44231,7 +44820,7 @@
         <w:t xml:space="preserve">7 Choosing a model by cross-validation</w:t>
       </w:r>
     </w:p>
-    <w:bookmarkStart w:id="201" w:name="def-cv-estimate-indexed"/>
+    <w:bookmarkStart w:id="207" w:name="def-cv-estimate-indexed"/>
     <w:p>
       <w:pPr>
         <w:pStyle w:val="FirstParagraph"/>
@@ -44557,7 +45146,7 @@
       <w:pPr>
         <w:pStyle w:val="BodyText"/>
       </w:pPr>
-      <w:bookmarkStart w:id="200" w:name="eq-cv-estimate-indexed"/>
+      <w:bookmarkStart w:id="206" w:name="eq-cv-estimate-indexed"/>
       <m:oMathPara>
         <m:oMathParaPr>
           <m:jc m:val="center"/>
@@ -44950,10 +45539,10 @@
           </m:r>
         </m:oMath>
       </m:oMathPara>
-      <w:bookmarkEnd w:id="200"/>
+      <w:bookmarkEnd w:id="206"/>
     </w:p>
-    <w:bookmarkEnd w:id="201"/>
-    <w:bookmarkStart w:id="203" w:name="def-cv-choice"/>
+    <w:bookmarkEnd w:id="207"/>
+    <w:bookmarkStart w:id="209" w:name="def-cv-choice"/>
     <w:p>
       <w:pPr>
         <w:pStyle w:val="FirstParagraph"/>
@@ -45243,7 +45832,7 @@
       <w:pPr>
         <w:pStyle w:val="BodyText"/>
       </w:pPr>
-      <w:bookmarkStart w:id="202" w:name="eq-cv-choice"/>
+      <w:bookmarkStart w:id="208" w:name="eq-cv-choice"/>
       <m:oMathPara>
         <m:oMathParaPr>
           <m:jc m:val="center"/>
@@ -45488,10 +46077,10 @@
           </m:r>
         </m:oMath>
       </m:oMathPara>
-      <w:bookmarkEnd w:id="202"/>
+      <w:bookmarkEnd w:id="208"/>
     </w:p>
-    <w:bookmarkEnd w:id="203"/>
-    <w:bookmarkStart w:id="207" w:name="def-nested-cv"/>
+    <w:bookmarkEnd w:id="209"/>
+    <w:bookmarkStart w:id="213" w:name="def-nested-cv"/>
     <w:p>
       <w:pPr>
         <w:pStyle w:val="FirstParagraph"/>
@@ -45605,7 +46194,7 @@
       <w:pPr>
         <w:pStyle w:val="BodyText"/>
       </w:pPr>
-      <w:bookmarkStart w:id="204" w:name="eq-nested-cv"/>
+      <w:bookmarkStart w:id="210" w:name="eq-nested-cv"/>
       <m:oMathPara>
         <m:oMathParaPr>
           <m:jc m:val="center"/>
@@ -45719,7 +46308,7 @@
           </m:r>
         </m:oMath>
       </m:oMathPara>
-      <w:bookmarkEnd w:id="204"/>
+      <w:bookmarkEnd w:id="210"/>
     </w:p>
     <w:tbl>
       <w:tblPr>
@@ -45762,12 +46351,12 @@
                 <wp:inline>
                   <wp:extent cx="152400" cy="152400"/>
                   <wp:effectExtent b="0" l="0" r="0" t="0"/>
-                  <wp:docPr descr="" title="" id="205" name="Picture"/>
+                  <wp:docPr descr="" title="" id="211" name="Picture"/>
                   <a:graphic>
                     <a:graphicData uri="http://schemas.openxmlformats.org/drawingml/2006/picture">
                       <pic:pic>
                         <pic:nvPicPr>
-                          <pic:cNvPr descr="/opt/quarto/share/formats/docx/note.png" id="206" name="Picture"/>
+                          <pic:cNvPr descr="/opt/quarto/share/formats/docx/note.png" id="212" name="Picture"/>
                           <pic:cNvPicPr>
                             <a:picLocks noChangeArrowheads="1" noChangeAspect="1"/>
                           </pic:cNvPicPr>
@@ -45849,8 +46438,8 @@
         </w:tc>
       </w:tr>
     </w:tbl>
-    <w:bookmarkEnd w:id="207"/>
-    <w:bookmarkStart w:id="208" w:name="rem-nested-cv"/>
+    <w:bookmarkEnd w:id="213"/>
+    <w:bookmarkStart w:id="214" w:name="rem-nested-cv"/>
     <w:p>
       <w:pPr>
         <w:pStyle w:val="BodyText"/>
@@ -45860,7 +46449,7 @@
           <w:i/>
           <w:iCs/>
         </w:rPr>
-        <w:t xml:space="preserve">Remark 12</w:t>
+        <w:t xml:space="preserve">Remark 13</w:t>
       </w:r>
       <w:r>
         <w:t xml:space="preserve"> (What is nested). </w:t>
@@ -46006,8 +46595,8 @@
         <w:t xml:space="preserve">That inner cross-validation is the nested one.</w:t>
       </w:r>
     </w:p>
-    <w:bookmarkEnd w:id="208"/>
-    <w:bookmarkStart w:id="211" w:name="rem-cv-winner-optimistic"/>
+    <w:bookmarkEnd w:id="214"/>
+    <w:bookmarkStart w:id="217" w:name="rem-cv-winner-optimistic"/>
     <w:p>
       <w:pPr>
         <w:pStyle w:val="BodyText"/>
@@ -46017,7 +46606,7 @@
           <w:i/>
           <w:iCs/>
         </w:rPr>
-        <w:t xml:space="preserve">Remark 13</w:t>
+        <w:t xml:space="preserve">Remark 14</w:t>
       </w:r>
       <w:r>
         <w:t xml:space="preserve"> (Cross-validation replaces the validation set, not the test set). </w:t>
@@ -46200,12 +46789,12 @@
                 <wp:inline>
                   <wp:extent cx="152400" cy="152400"/>
                   <wp:effectExtent b="0" l="0" r="0" t="0"/>
-                  <wp:docPr descr="" title="" id="209" name="Picture"/>
+                  <wp:docPr descr="" title="" id="215" name="Picture"/>
                   <a:graphic>
                     <a:graphicData uri="http://schemas.openxmlformats.org/drawingml/2006/picture">
                       <pic:pic>
                         <pic:nvPicPr>
-                          <pic:cNvPr descr="/opt/quarto/share/formats/docx/note.png" id="210" name="Picture"/>
+                          <pic:cNvPr descr="/opt/quarto/share/formats/docx/note.png" id="216" name="Picture"/>
                           <pic:cNvPicPr>
                             <a:picLocks noChangeArrowheads="1" noChangeAspect="1"/>
                           </pic:cNvPicPr>
@@ -46275,8 +46864,8 @@
         </w:tc>
       </w:tr>
     </w:tbl>
-    <w:bookmarkEnd w:id="211"/>
-    <w:bookmarkStart w:id="216" w:name="def-cv-se"/>
+    <w:bookmarkEnd w:id="217"/>
+    <w:bookmarkStart w:id="222" w:name="def-cv-se"/>
     <w:p>
       <w:pPr>
         <w:pStyle w:val="BodyText"/>
@@ -46380,7 +46969,7 @@
       <w:r>
         <w:t xml:space="preserve"> </w:t>
       </w:r>
-      <w:hyperlink r:id="rId212">
+      <w:hyperlink r:id="rId218">
         <w:r>
           <w:rPr>
             <w:rStyle w:val="Hyperlink"/>
@@ -46446,7 +47035,7 @@
       <w:pPr>
         <w:pStyle w:val="BodyText"/>
       </w:pPr>
-      <w:bookmarkStart w:id="213" w:name="eq-cv-se"/>
+      <w:bookmarkStart w:id="219" w:name="eq-cv-se"/>
       <m:oMathPara>
         <m:oMathParaPr>
           <m:jc m:val="center"/>
@@ -46621,7 +47210,7 @@
           </m:r>
         </m:oMath>
       </m:oMathPara>
-      <w:bookmarkEnd w:id="213"/>
+      <w:bookmarkEnd w:id="219"/>
     </w:p>
     <w:tbl>
       <w:tblPr>
@@ -46664,12 +47253,12 @@
                 <wp:inline>
                   <wp:extent cx="152400" cy="152400"/>
                   <wp:effectExtent b="0" l="0" r="0" t="0"/>
-                  <wp:docPr descr="" title="" id="214" name="Picture"/>
+                  <wp:docPr descr="" title="" id="220" name="Picture"/>
                   <a:graphic>
                     <a:graphicData uri="http://schemas.openxmlformats.org/drawingml/2006/picture">
                       <pic:pic>
                         <pic:nvPicPr>
-                          <pic:cNvPr descr="/opt/quarto/share/formats/docx/note.png" id="215" name="Picture"/>
+                          <pic:cNvPr descr="/opt/quarto/share/formats/docx/note.png" id="221" name="Picture"/>
                           <pic:cNvPicPr>
                             <a:picLocks noChangeArrowheads="1" noChangeAspect="1"/>
                           </pic:cNvPicPr>
@@ -46742,8 +47331,8 @@
         </w:tc>
       </w:tr>
     </w:tbl>
-    <w:bookmarkEnd w:id="216"/>
-    <w:bookmarkStart w:id="218" w:name="rem-cv-se"/>
+    <w:bookmarkEnd w:id="222"/>
+    <w:bookmarkStart w:id="224" w:name="rem-cv-se"/>
     <w:p>
       <w:pPr>
         <w:pStyle w:val="BodyText"/>
@@ -46753,7 +47342,7 @@
           <w:i/>
           <w:iCs/>
         </w:rPr>
-        <w:t xml:space="preserve">Remark 14</w:t>
+        <w:t xml:space="preserve">Remark 15</w:t>
       </w:r>
       <w:r>
         <w:t xml:space="preserve"> (The fold-based standard error is only a rough guide). </w:t>
@@ -46966,7 +47555,7 @@
       <w:r>
         <w:t xml:space="preserve"> </w:t>
       </w:r>
-      <w:hyperlink r:id="rId217">
+      <w:hyperlink r:id="rId223">
         <w:r>
           <w:rPr>
             <w:rStyle w:val="Hyperlink"/>
@@ -47030,8 +47619,8 @@
         <w:t xml:space="preserve">.</w:t>
       </w:r>
     </w:p>
-    <w:bookmarkEnd w:id="218"/>
-    <w:bookmarkStart w:id="220" w:name="def-fold-mse-indexed"/>
+    <w:bookmarkEnd w:id="224"/>
+    <w:bookmarkStart w:id="226" w:name="def-fold-mse-indexed"/>
     <w:p>
       <w:pPr>
         <w:pStyle w:val="BodyText"/>
@@ -47196,7 +47785,7 @@
       <w:pPr>
         <w:pStyle w:val="BodyText"/>
       </w:pPr>
-      <w:bookmarkStart w:id="219" w:name="eq-fold-mse-indexed"/>
+      <w:bookmarkStart w:id="225" w:name="eq-fold-mse-indexed"/>
       <m:oMathPara>
         <m:oMathParaPr>
           <m:jc m:val="center"/>
@@ -47570,10 +48159,10 @@
           </m:r>
         </m:oMath>
       </m:oMathPara>
-      <w:bookmarkEnd w:id="219"/>
+      <w:bookmarkEnd w:id="225"/>
     </w:p>
-    <w:bookmarkEnd w:id="220"/>
-    <w:bookmarkStart w:id="222" w:name="def-cv-se-indexed"/>
+    <w:bookmarkEnd w:id="226"/>
+    <w:bookmarkStart w:id="228" w:name="def-cv-se-indexed"/>
     <w:p>
       <w:pPr>
         <w:pStyle w:val="FirstParagraph"/>
@@ -47753,7 +48342,7 @@
       <w:pPr>
         <w:pStyle w:val="BodyText"/>
       </w:pPr>
-      <w:bookmarkStart w:id="221" w:name="eq-cv-se-indexed"/>
+      <w:bookmarkStart w:id="227" w:name="eq-cv-se-indexed"/>
       <m:oMathPara>
         <m:oMathParaPr>
           <m:jc m:val="center"/>
@@ -48012,10 +48601,10 @@
           </m:r>
         </m:oMath>
       </m:oMathPara>
-      <w:bookmarkEnd w:id="221"/>
+      <w:bookmarkEnd w:id="227"/>
     </w:p>
-    <w:bookmarkEnd w:id="222"/>
-    <w:bookmarkStart w:id="226" w:name="def-one-se-rule"/>
+    <w:bookmarkEnd w:id="228"/>
+    <w:bookmarkStart w:id="232" w:name="def-one-se-rule"/>
     <w:p>
       <w:pPr>
         <w:pStyle w:val="FirstParagraph"/>
@@ -48260,7 +48849,7 @@
       <w:pPr>
         <w:pStyle w:val="BodyText"/>
       </w:pPr>
-      <w:bookmarkStart w:id="223" w:name="eq-one-se-rule"/>
+      <w:bookmarkStart w:id="229" w:name="eq-one-se-rule"/>
       <m:oMathPara>
         <m:oMathParaPr>
           <m:jc m:val="center"/>
@@ -48555,7 +49144,7 @@
           </m:r>
         </m:oMath>
       </m:oMathPara>
-      <w:bookmarkEnd w:id="223"/>
+      <w:bookmarkEnd w:id="229"/>
     </w:p>
     <w:tbl>
       <w:tblPr>
@@ -48598,12 +49187,12 @@
                 <wp:inline>
                   <wp:extent cx="152400" cy="152400"/>
                   <wp:effectExtent b="0" l="0" r="0" t="0"/>
-                  <wp:docPr descr="" title="" id="224" name="Picture"/>
+                  <wp:docPr descr="" title="" id="230" name="Picture"/>
                   <a:graphic>
                     <a:graphicData uri="http://schemas.openxmlformats.org/drawingml/2006/picture">
                       <pic:pic>
                         <pic:nvPicPr>
-                          <pic:cNvPr descr="/opt/quarto/share/formats/docx/note.png" id="225" name="Picture"/>
+                          <pic:cNvPr descr="/opt/quarto/share/formats/docx/note.png" id="231" name="Picture"/>
                           <pic:cNvPicPr>
                             <a:picLocks noChangeArrowheads="1" noChangeAspect="1"/>
                           </pic:cNvPicPr>
@@ -48685,8 +49274,8 @@
         </w:tc>
       </w:tr>
     </w:tbl>
-    <w:bookmarkEnd w:id="226"/>
-    <w:bookmarkStart w:id="231" w:name="exm-one-se-rule"/>
+    <w:bookmarkEnd w:id="232"/>
+    <w:bookmarkStart w:id="237" w:name="exm-one-se-rule"/>
     <w:p>
       <w:pPr>
         <w:pStyle w:val="BodyText"/>
@@ -49758,7 +50347,7 @@
       <w:tr>
         <w:tc>
           <w:tcPr/>
-          <w:bookmarkStart w:id="230" w:name="fig-one-se-rule"/>
+          <w:bookmarkStart w:id="236" w:name="fig-one-se-rule"/>
           <w:p>
             <w:pPr>
               <w:pStyle w:val="SourceCode"/>
@@ -50371,18 +50960,18 @@
                 <wp:inline>
                   <wp:extent cx="4620126" cy="3696101"/>
                   <wp:effectExtent b="0" l="0" r="0" t="0"/>
-                  <wp:docPr descr="" title="" id="228" name="Picture"/>
+                  <wp:docPr descr="" title="" id="234" name="Picture"/>
                   <a:graphic>
                     <a:graphicData uri="http://schemas.openxmlformats.org/drawingml/2006/picture">
                       <pic:pic>
                         <pic:nvPicPr>
-                          <pic:cNvPr descr="model-validation_files/figure-docx/one-se-rule-plot-1.png" id="229" name="Picture"/>
+                          <pic:cNvPr descr="model-validation_files/figure-docx/one-se-rule-plot-1.png" id="235" name="Picture"/>
                           <pic:cNvPicPr>
                             <a:picLocks noChangeArrowheads="1" noChangeAspect="1"/>
                           </pic:cNvPicPr>
                         </pic:nvPicPr>
                         <pic:blipFill>
-                          <a:blip r:embed="rId227"/>
+                          <a:blip r:embed="rId233"/>
                           <a:stretch>
                             <a:fillRect/>
                           </a:stretch>
@@ -50462,7 +51051,7 @@
               <w:t xml:space="preserve">The dashed line is one fold-based standard error above the smallest estimate.</w:t>
             </w:r>
           </w:p>
-          <w:bookmarkEnd w:id="230"/>
+          <w:bookmarkEnd w:id="236"/>
         </w:tc>
       </w:tr>
     </w:tbl>
@@ -50551,9 +51140,9 @@
         <w:t xml:space="preserve">and 0.315 for degree 3.</w:t>
       </w:r>
     </w:p>
-    <w:bookmarkEnd w:id="231"/>
-    <w:bookmarkEnd w:id="232"/>
-    <w:bookmarkStart w:id="239" w:name="sec-cv-whole-procedure"/>
+    <w:bookmarkEnd w:id="237"/>
+    <w:bookmarkEnd w:id="238"/>
+    <w:bookmarkStart w:id="245" w:name="sec-cv-whole-procedure"/>
     <w:p>
       <w:pPr>
         <w:pStyle w:val="Heading2"/>
@@ -50562,7 +51151,7 @@
         <w:t xml:space="preserve">8 Cross-validating the whole procedure</w:t>
       </w:r>
     </w:p>
-    <w:bookmarkStart w:id="235" w:name="exr-cv-screening"/>
+    <w:bookmarkStart w:id="241" w:name="exr-cv-screening"/>
     <w:p>
       <w:pPr>
         <w:pStyle w:val="FirstParagraph"/>
@@ -50862,12 +51451,12 @@
                 <wp:inline>
                   <wp:extent cx="152400" cy="152400"/>
                   <wp:effectExtent b="0" l="0" r="0" t="0"/>
-                  <wp:docPr descr="" title="" id="233" name="Picture"/>
+                  <wp:docPr descr="" title="" id="239" name="Picture"/>
                   <a:graphic>
                     <a:graphicData uri="http://schemas.openxmlformats.org/drawingml/2006/picture">
                       <pic:pic>
                         <pic:nvPicPr>
-                          <pic:cNvPr descr="/opt/quarto/share/formats/docx/note.png" id="234" name="Picture"/>
+                          <pic:cNvPr descr="/opt/quarto/share/formats/docx/note.png" id="240" name="Picture"/>
                           <pic:cNvPicPr>
                             <a:picLocks noChangeArrowheads="1" noChangeAspect="1"/>
                           </pic:cNvPicPr>
@@ -50955,8 +51544,8 @@
         </w:tc>
       </w:tr>
     </w:tbl>
-    <w:bookmarkEnd w:id="235"/>
-    <w:bookmarkStart w:id="236" w:name="sol-cv-screening"/>
+    <w:bookmarkEnd w:id="241"/>
+    <w:bookmarkStart w:id="242" w:name="sol-cv-screening"/>
     <w:p>
       <w:pPr>
         <w:pStyle w:val="BodyText"/>
@@ -52884,8 +53473,8 @@
         <w:t xml:space="preserve">needs fails.</w:t>
       </w:r>
     </w:p>
-    <w:bookmarkEnd w:id="236"/>
-    <w:bookmarkStart w:id="238" w:name="rem-cv-every-step"/>
+    <w:bookmarkEnd w:id="242"/>
+    <w:bookmarkStart w:id="244" w:name="rem-cv-every-step"/>
     <w:p>
       <w:pPr>
         <w:pStyle w:val="BodyText"/>
@@ -52895,7 +53484,7 @@
           <w:i/>
           <w:iCs/>
         </w:rPr>
-        <w:t xml:space="preserve">Remark 15</w:t>
+        <w:t xml:space="preserve">Remark 16</w:t>
       </w:r>
       <w:r>
         <w:t xml:space="preserve"> (Cross-validate the whole procedure). </w:t>
@@ -53041,7 +53630,7 @@
       <w:r>
         <w:t xml:space="preserve"> </w:t>
       </w:r>
-      <w:hyperlink r:id="rId237">
+      <w:hyperlink r:id="rId243">
         <w:r>
           <w:rPr>
             <w:rStyle w:val="Hyperlink"/>
@@ -53065,19 +53654,49 @@
         <w:t xml:space="preserve">when they are computed without the outcome.</w:t>
       </w:r>
     </w:p>
-    <w:bookmarkEnd w:id="238"/>
-    <w:bookmarkEnd w:id="239"/>
-    <w:bookmarkStart w:id="245" w:name="references"/>
+    <w:bookmarkEnd w:id="244"/>
+    <w:bookmarkEnd w:id="245"/>
+    <w:bookmarkStart w:id="246" w:name="further-reading"/>
     <w:p>
       <w:pPr>
         <w:pStyle w:val="Heading2"/>
       </w:pPr>
       <w:r>
+        <w:t xml:space="preserve">9 Further reading</w:t>
+      </w:r>
+    </w:p>
+    <w:p>
+      <w:pPr>
+        <w:pStyle w:val="FirstParagraph"/>
+      </w:pPr>
+      <w:r>
+        <w:t xml:space="preserve">Sanchez (2020)</w:t>
+      </w:r>
+      <w:r>
+        <w:t xml:space="preserve"> </w:t>
+      </w:r>
+      <w:r>
+        <w:t xml:space="preserve">reviews the matrix algebra behind statistical learning,</w:t>
+      </w:r>
+      <w:r>
+        <w:t xml:space="preserve"> </w:t>
+      </w:r>
+      <w:r>
+        <w:t xml:space="preserve">including the covariance and correlation matrices that cross-products produce.</w:t>
+      </w:r>
+    </w:p>
+    <w:bookmarkEnd w:id="246"/>
+    <w:bookmarkStart w:id="254" w:name="references"/>
+    <w:p>
+      <w:pPr>
+        <w:pStyle w:val="Heading2"/>
+      </w:pPr>
+      <w:r>
         <w:t xml:space="preserve">References</w:t>
       </w:r>
     </w:p>
-    <w:bookmarkStart w:id="244" w:name="refs"/>
-    <w:bookmarkStart w:id="241" w:name="ref-hastie2009elements"/>
+    <w:bookmarkStart w:id="253" w:name="refs"/>
+    <w:bookmarkStart w:id="248" w:name="ref-hastie2009elements"/>
     <w:p>
       <w:pPr>
         <w:pStyle w:val="Bibliography"/>
@@ -53101,7 +53720,7 @@
       <w:r>
         <w:t xml:space="preserve"> </w:t>
       </w:r>
-      <w:hyperlink r:id="rId240">
+      <w:hyperlink r:id="rId247">
         <w:r>
           <w:rPr>
             <w:rStyle w:val="Hyperlink"/>
@@ -53113,8 +53732,8 @@
         <w:t xml:space="preserve">.</w:t>
       </w:r>
     </w:p>
-    <w:bookmarkEnd w:id="241"/>
-    <w:bookmarkStart w:id="243" w:name="ref-james2021islr2e"/>
+    <w:bookmarkEnd w:id="248"/>
+    <w:bookmarkStart w:id="250" w:name="ref-james2021islr2e"/>
     <w:p>
       <w:pPr>
         <w:pStyle w:val="Bibliography"/>
@@ -53152,7 +53771,7 @@
       <w:r>
         <w:t xml:space="preserve"> </w:t>
       </w:r>
-      <w:hyperlink r:id="rId242">
+      <w:hyperlink r:id="rId249">
         <w:r>
           <w:rPr>
             <w:rStyle w:val="Hyperlink"/>
@@ -53164,9 +53783,60 @@
         <w:t xml:space="preserve">.</w:t>
       </w:r>
     </w:p>
-    <w:bookmarkEnd w:id="243"/>
-    <w:bookmarkEnd w:id="244"/>
-    <w:bookmarkEnd w:id="245"/>
+    <w:bookmarkEnd w:id="250"/>
+    <w:bookmarkStart w:id="252" w:name="ref-sanchez2020matrix4sl"/>
+    <w:p>
+      <w:pPr>
+        <w:pStyle w:val="Bibliography"/>
+      </w:pPr>
+      <w:r>
+        <w:t xml:space="preserve">Sanchez, Gaston. 2020.</w:t>
+      </w:r>
+      <w:r>
+        <w:t xml:space="preserve"> </w:t>
+      </w:r>
+      <w:r>
+        <w:rPr>
+          <w:i/>
+          <w:iCs/>
+        </w:rPr>
+        <w:t xml:space="preserve">A Matrix Algebra Companion for Statistical Learning (</w:t>
+      </w:r>
+      <w:r>
+        <w:rPr>
+          <w:i/>
+          <w:iCs/>
+        </w:rPr>
+        <w:t xml:space="preserve">matrix4sl</w:t>
+      </w:r>
+      <w:r>
+        <w:rPr>
+          <w:i/>
+          <w:iCs/>
+        </w:rPr>
+        <w:t xml:space="preserve">)</w:t>
+      </w:r>
+      <w:r>
+        <w:t xml:space="preserve">. Online book, work in progress. Licensed CC BY-NC-SA 4.0.</w:t>
+      </w:r>
+      <w:r>
+        <w:t xml:space="preserve"> </w:t>
+      </w:r>
+      <w:hyperlink r:id="rId251">
+        <w:r>
+          <w:rPr>
+            <w:rStyle w:val="Hyperlink"/>
+          </w:rPr>
+          <w:t xml:space="preserve">https://www.gastonsanchez.com/matrix4sl/</w:t>
+        </w:r>
+      </w:hyperlink>
+      <w:r>
+        <w:t xml:space="preserve">.</w:t>
+      </w:r>
+    </w:p>
+    <w:bookmarkEnd w:id="252"/>
+    <w:bookmarkEnd w:id="253"/>
+    <w:bookmarkEnd w:id="254"/>
     <w:sectPr>
       <w:footnotePr>
         <w:numRestart w:val="eachSect"/>

</xml_diff>

<commit_message>
Deploying to gh-pages from @ Morrison-Lab/sds@2ba909e6955d15c63a1bb3e44c9fa096216ebccf 🚀
</commit_message>
<xml_diff>
--- a/model-validation-handout.docx
+++ b/model-validation-handout.docx
@@ -15,7 +15,7 @@
         <w:pStyle w:val="Date"/>
       </w:pPr>
       <w:r>
-        <w:t xml:space="preserve">Last modified: 2026-10-15 05:33:00 (PDT)</w:t>
+        <w:t xml:space="preserve">Last modified: 2026-10-15 05:47:35 (PDT)</w:t>
       </w:r>
     </w:p>
     <w:bookmarkStart w:id="17" w:name="sec-data-sets"/>
@@ -28857,30 +28857,67 @@
         <w:t xml:space="preserve"> </w:t>
       </w:r>
       <w:r>
-        <w:t xml:space="preserve">So the step of</w:t>
-      </w:r>
-      <w:r>
-        <w:t xml:space="preserve"> </w:t>
-      </w:r>
-      <w:hyperlink w:anchor="sol-held-out-unbiased">
+        <w:t xml:space="preserve">So the argument of</w:t>
+      </w:r>
+      <w:r>
+        <w:t xml:space="preserve"> </w:t>
+      </w:r>
+      <w:hyperlink w:anchor="thm-held-out-unbiased">
         <w:r>
           <w:rPr>
             <w:rStyle w:val="Hyperlink"/>
           </w:rPr>
-          <w:t xml:space="preserve">Solution 7</w:t>
+          <w:t xml:space="preserve">Theorem 3</w:t>
         </w:r>
       </w:hyperlink>
       <w:r>
-        <w:t xml:space="preserve"> </w:t>
-      </w:r>
-      <w:r>
-        <w:t xml:space="preserve">labeled</w:t>
-      </w:r>
-      <w:r>
-        <w:t xml:space="preserve"> </w:t>
-      </w:r>
-      <w:r>
-        <w:t xml:space="preserve">“each term, as above”</w:t>
+        <w:t xml:space="preserve">,</w:t>
+      </w:r>
+      <w:r>
+        <w:t xml:space="preserve"> </w:t>
+      </w:r>
+      <w:r>
+        <w:t xml:space="preserve">that each squared prediction error has conditional expectation</w:t>
+      </w:r>
+      <w:r>
+        <w:t xml:space="preserve"> </w:t>
+      </w:r>
+      <m:oMath>
+        <m:sSub>
+          <m:e>
+            <m:r>
+              <m:rPr>
+                <m:sty m:val="p"/>
+              </m:rPr>
+              <m:t>Err</m:t>
+            </m:r>
+          </m:e>
+          <m:sub>
+            <m:sSub>
+              <m:e>
+                <m:r>
+                  <m:rPr>
+                    <m:scr m:val="script"/>
+                    <m:sty m:val="p"/>
+                  </m:rPr>
+                  <m:t>D</m:t>
+                </m:r>
+              </m:e>
+              <m:sub>
+                <m:r>
+                  <m:rPr>
+                    <m:nor/>
+                    <m:sty m:val="p"/>
+                  </m:rPr>
+                  <m:t>train</m:t>
+                </m:r>
+              </m:sub>
+            </m:sSub>
+          </m:sub>
+        </m:sSub>
+      </m:oMath>
+      <w:r>
+        <w:t xml:space="preserve">,</w:t>
       </w:r>
       <w:r>
         <w:t xml:space="preserve"> </w:t>
@@ -52706,7 +52743,7 @@
     </w:p>
     <w:bookmarkEnd w:id="197"/>
     <w:bookmarkEnd w:id="198"/>
-    <w:bookmarkStart w:id="229" w:name="sec-loocv"/>
+    <w:bookmarkStart w:id="230" w:name="sec-loocv"/>
     <w:p>
       <w:pPr>
         <w:pStyle w:val="Heading2"/>
@@ -53796,10 +53833,1849 @@
       </w:tr>
     </w:tbl>
     <w:bookmarkEnd w:id="204"/>
-    <w:bookmarkStart w:id="206" w:name="def-term-vector"/>
+    <w:bookmarkStart w:id="205" w:name="lem-loocv-not-random"/>
     <w:p>
       <w:pPr>
         <w:pStyle w:val="BodyText"/>
+      </w:pPr>
+      <w:r>
+        <w:rPr>
+          <w:b/>
+          <w:bCs/>
+        </w:rPr>
+        <w:t xml:space="preserve">Lemma 1 (Leave-one-out cross-validation does not depend on the fold assignment)</w:t>
+      </w:r>
+      <w:r>
+        <w:t xml:space="preserve"> </w:t>
+      </w:r>
+      <w:r>
+        <w:t xml:space="preserve">Let</w:t>
+      </w:r>
+      <w:r>
+        <w:t xml:space="preserve"> </w:t>
+      </w:r>
+      <m:oMath>
+        <m:sSub>
+          <m:e>
+            <m:r>
+              <m:rPr>
+                <m:scr m:val="script"/>
+                <m:sty m:val="p"/>
+              </m:rPr>
+              <m:t>D</m:t>
+            </m:r>
+          </m:e>
+          <m:sub>
+            <m:r>
+              <m:rPr>
+                <m:nor/>
+                <m:sty m:val="p"/>
+              </m:rPr>
+              <m:t>train</m:t>
+            </m:r>
+          </m:sub>
+        </m:sSub>
+        <m:r>
+          <m:rPr>
+            <m:sty m:val="p"/>
+          </m:rPr>
+          <m:t>=</m:t>
+        </m:r>
+        <m:r>
+          <m:t>​</m:t>
+        </m:r>
+        <m:d>
+          <m:dPr>
+            <m:begChr m:val="("/>
+            <m:sepChr m:val=""/>
+            <m:endChr m:val=")"/>
+            <m:grow/>
+          </m:dPr>
+          <m:e>
+            <m:r>
+              <m:rPr>
+                <m:sty m:val="p"/>
+              </m:rPr>
+              <m:t>(</m:t>
+            </m:r>
+            <m:sSub>
+              <m:e>
+                <m:r>
+                  <m:t>x</m:t>
+                </m:r>
+              </m:e>
+              <m:sub>
+                <m:r>
+                  <m:t>i</m:t>
+                </m:r>
+              </m:sub>
+            </m:sSub>
+            <m:r>
+              <m:rPr>
+                <m:sty m:val="p"/>
+              </m:rPr>
+              <m:t>,</m:t>
+            </m:r>
+            <m:sSub>
+              <m:e>
+                <m:r>
+                  <m:t>y</m:t>
+                </m:r>
+              </m:e>
+              <m:sub>
+                <m:r>
+                  <m:t>i</m:t>
+                </m:r>
+              </m:sub>
+            </m:sSub>
+            <m:r>
+              <m:rPr>
+                <m:sty m:val="p"/>
+              </m:rPr>
+              <m:t>)</m:t>
+            </m:r>
+          </m:e>
+        </m:d>
+        <m:sSub>
+          <m:e>
+            <m:r>
+              <m:t>​</m:t>
+            </m:r>
+          </m:e>
+          <m:sub>
+            <m:r>
+              <m:t>i</m:t>
+            </m:r>
+            <m:r>
+              <m:rPr>
+                <m:sty m:val="p"/>
+              </m:rPr>
+              <m:t>∈</m:t>
+            </m:r>
+            <m:r>
+              <m:t>I</m:t>
+            </m:r>
+          </m:sub>
+        </m:sSub>
+      </m:oMath>
+      <w:r>
+        <w:t xml:space="preserve"> </w:t>
+      </w:r>
+      <w:r>
+        <w:t xml:space="preserve">be a</w:t>
+      </w:r>
+      <w:r>
+        <w:t xml:space="preserve"> </w:t>
+      </w:r>
+      <w:hyperlink w:anchor="def-training-set">
+        <w:r>
+          <w:rPr>
+            <w:rStyle w:val="Hyperlink"/>
+          </w:rPr>
+          <w:t xml:space="preserve">training set</w:t>
+        </w:r>
+      </w:hyperlink>
+      <w:r>
+        <w:t xml:space="preserve"> </w:t>
+      </w:r>
+      <w:r>
+        <w:t xml:space="preserve">of</w:t>
+      </w:r>
+      <w:r>
+        <w:t xml:space="preserve"> </w:t>
+      </w:r>
+      <m:oMath>
+        <m:r>
+          <m:t>n</m:t>
+        </m:r>
+        <m:r>
+          <m:rPr>
+            <m:sty m:val="p"/>
+          </m:rPr>
+          <m:t>=</m:t>
+        </m:r>
+        <m:r>
+          <m:t>​</m:t>
+        </m:r>
+        <m:d>
+          <m:dPr>
+            <m:begChr m:val="|"/>
+            <m:sepChr m:val=""/>
+            <m:endChr m:val="|"/>
+            <m:grow/>
+          </m:dPr>
+          <m:e>
+            <m:r>
+              <m:t>I</m:t>
+            </m:r>
+          </m:e>
+        </m:d>
+        <m:r>
+          <m:t>​</m:t>
+        </m:r>
+      </m:oMath>
+      <w:r>
+        <w:t xml:space="preserve"> </w:t>
+      </w:r>
+      <w:r>
+        <w:t xml:space="preserve">observations, indexed by</w:t>
+      </w:r>
+      <w:r>
+        <w:t xml:space="preserve"> </w:t>
+      </w:r>
+      <m:oMath>
+        <m:r>
+          <m:t>I</m:t>
+        </m:r>
+      </m:oMath>
+      <w:r>
+        <w:t xml:space="preserve">.</w:t>
+      </w:r>
+      <w:r>
+        <w:t xml:space="preserve"> </w:t>
+      </w:r>
+      <w:r>
+        <w:t xml:space="preserve">Then the</w:t>
+      </w:r>
+      <w:r>
+        <w:t xml:space="preserve"> </w:t>
+      </w:r>
+      <w:hyperlink w:anchor="def-cv-estimate">
+        <w:r>
+          <w:rPr>
+            <w:rStyle w:val="Hyperlink"/>
+          </w:rPr>
+          <w:t xml:space="preserve">cross-validation estimate</w:t>
+        </w:r>
+      </w:hyperlink>
+      <w:r>
+        <w:t xml:space="preserve"> </w:t>
+      </w:r>
+      <m:oMath>
+        <m:sSub>
+          <m:e>
+            <m:acc>
+              <m:accPr>
+                <m:chr m:val="̂"/>
+              </m:accPr>
+              <m:e>
+                <m:r>
+                  <m:rPr>
+                    <m:sty m:val="p"/>
+                  </m:rPr>
+                  <m:t>Err</m:t>
+                </m:r>
+              </m:e>
+            </m:acc>
+          </m:e>
+          <m:sub>
+            <m:r>
+              <m:rPr>
+                <m:nor/>
+                <m:sty m:val="p"/>
+              </m:rPr>
+              <m:t>CV</m:t>
+            </m:r>
+            <m:r>
+              <m:rPr>
+                <m:sty m:val="p"/>
+              </m:rPr>
+              <m:t>(</m:t>
+            </m:r>
+            <m:r>
+              <m:t>n</m:t>
+            </m:r>
+            <m:r>
+              <m:rPr>
+                <m:sty m:val="p"/>
+              </m:rPr>
+              <m:t>)</m:t>
+            </m:r>
+          </m:sub>
+        </m:sSub>
+      </m:oMath>
+      <w:r>
+        <w:t xml:space="preserve"> </w:t>
+      </w:r>
+      <w:r>
+        <w:t xml:space="preserve">of</w:t>
+      </w:r>
+      <w:r>
+        <w:t xml:space="preserve"> </w:t>
+      </w:r>
+      <w:hyperlink w:anchor="def-loocv">
+        <w:r>
+          <w:rPr>
+            <w:rStyle w:val="Hyperlink"/>
+          </w:rPr>
+          <w:t xml:space="preserve">leave-one-out cross-validation</w:t>
+        </w:r>
+      </w:hyperlink>
+      <w:r>
+        <w:t xml:space="preserve"> </w:t>
+      </w:r>
+      <w:r>
+        <w:t xml:space="preserve">(</w:t>
+      </w:r>
+      <m:oMath>
+        <m:r>
+          <m:t>k</m:t>
+        </m:r>
+        <m:r>
+          <m:rPr>
+            <m:sty m:val="p"/>
+          </m:rPr>
+          <m:t>=</m:t>
+        </m:r>
+        <m:r>
+          <m:t>n</m:t>
+        </m:r>
+      </m:oMath>
+      <w:r>
+        <w:t xml:space="preserve">)</w:t>
+      </w:r>
+      <w:r>
+        <w:t xml:space="preserve"> </w:t>
+      </w:r>
+      <w:r>
+        <w:t xml:space="preserve">is the same for every</w:t>
+      </w:r>
+      <w:r>
+        <w:t xml:space="preserve"> </w:t>
+      </w:r>
+      <w:hyperlink w:anchor="def-fold-assignment">
+        <w:r>
+          <w:rPr>
+            <w:rStyle w:val="Hyperlink"/>
+          </w:rPr>
+          <w:t xml:space="preserve">fold assignment</w:t>
+        </w:r>
+      </w:hyperlink>
+      <w:r>
+        <w:t xml:space="preserve"> </w:t>
+      </w:r>
+      <m:oMath>
+        <m:r>
+          <m:t>κ</m:t>
+        </m:r>
+        <m:r>
+          <m:rPr>
+            <m:sty m:val="p"/>
+          </m:rPr>
+          <m:t>(</m:t>
+        </m:r>
+        <m:r>
+          <m:t>i</m:t>
+        </m:r>
+        <m:r>
+          <m:rPr>
+            <m:sty m:val="p"/>
+          </m:rPr>
+          <m:t>)</m:t>
+        </m:r>
+      </m:oMath>
+      <w:r>
+        <w:t xml:space="preserve">.</w:t>
+      </w:r>
+    </w:p>
+    <w:bookmarkEnd w:id="205"/>
+    <w:p>
+      <w:pPr>
+        <w:pStyle w:val="BodyText"/>
+      </w:pPr>
+      <w:r>
+        <w:rPr>
+          <w:i/>
+          <w:iCs/>
+        </w:rPr>
+        <w:t xml:space="preserve">Proof</w:t>
+      </w:r>
+      <w:r>
+        <w:t xml:space="preserve">. </w:t>
+      </w:r>
+      <w:r>
+        <w:t xml:space="preserve">This is the solution to</w:t>
+      </w:r>
+      <w:r>
+        <w:t xml:space="preserve"> </w:t>
+      </w:r>
+      <w:hyperlink w:anchor="exr-loocv">
+        <w:r>
+          <w:rPr>
+            <w:rStyle w:val="Hyperlink"/>
+          </w:rPr>
+          <w:t xml:space="preserve">Exercise 11</w:t>
+        </w:r>
+      </w:hyperlink>
+      <w:r>
+        <w:t xml:space="preserve">, part 3, worked in</w:t>
+      </w:r>
+      <w:r>
+        <w:t xml:space="preserve"> </w:t>
+      </w:r>
+      <w:hyperlink w:anchor="sol-loocv">
+        <w:r>
+          <w:rPr>
+            <w:rStyle w:val="Hyperlink"/>
+          </w:rPr>
+          <w:t xml:space="preserve">Solution 11</w:t>
+        </w:r>
+      </w:hyperlink>
+      <w:r>
+        <w:t xml:space="preserve">.</w:t>
+      </w:r>
+      <w:r>
+        <w:t xml:space="preserve"> </w:t>
+      </w:r>
+      <w:r>
+        <w:t xml:space="preserve">It uses</w:t>
+      </w:r>
+      <w:r>
+        <w:t xml:space="preserve"> </w:t>
+      </w:r>
+      <w:hyperlink w:anchor="eq-cv-estimate">
+        <w:r>
+          <w:rPr>
+            <w:rStyle w:val="Hyperlink"/>
+          </w:rPr>
+          <w:t xml:space="preserve">Equation 31</w:t>
+        </w:r>
+      </w:hyperlink>
+      <w:r>
+        <w:t xml:space="preserve"> </w:t>
+      </w:r>
+      <w:r>
+        <w:t xml:space="preserve">and</w:t>
+      </w:r>
+      <w:r>
+        <w:t xml:space="preserve"> </w:t>
+      </w:r>
+      <w:hyperlink w:anchor="eq-fold-out-rule">
+        <w:r>
+          <w:rPr>
+            <w:rStyle w:val="Hyperlink"/>
+          </w:rPr>
+          <w:t xml:space="preserve">Equation 30</w:t>
+        </w:r>
+      </w:hyperlink>
+      <w:r>
+        <w:t xml:space="preserve">.</w:t>
+      </w:r>
+    </w:p>
+    <w:p>
+      <w:pPr>
+        <w:pStyle w:val="BodyText"/>
+      </w:pPr>
+      <w:r>
+        <w:t xml:space="preserve">Each step below changes one thing.</w:t>
+      </w:r>
+    </w:p>
+    <w:p>
+      <w:pPr>
+        <w:numPr>
+          <w:ilvl w:val="0"/>
+          <w:numId w:val="1015"/>
+        </w:numPr>
+      </w:pPr>
+      <w:r>
+        <w:t xml:space="preserve">With</w:t>
+      </w:r>
+      <w:r>
+        <w:t xml:space="preserve"> </w:t>
+      </w:r>
+      <m:oMath>
+        <m:r>
+          <m:t>k</m:t>
+        </m:r>
+        <m:r>
+          <m:rPr>
+            <m:sty m:val="p"/>
+          </m:rPr>
+          <m:t>=</m:t>
+        </m:r>
+        <m:r>
+          <m:t>n</m:t>
+        </m:r>
+      </m:oMath>
+      <w:r>
+        <w:t xml:space="preserve">, the</w:t>
+      </w:r>
+      <w:r>
+        <w:t xml:space="preserve"> </w:t>
+      </w:r>
+      <m:oMath>
+        <m:r>
+          <m:t>n</m:t>
+        </m:r>
+      </m:oMath>
+      <w:r>
+        <w:t xml:space="preserve"> </w:t>
+      </w:r>
+      <w:r>
+        <w:t xml:space="preserve">nonempty, disjoint</w:t>
+      </w:r>
+      <w:r>
+        <w:t xml:space="preserve"> </w:t>
+      </w:r>
+      <w:hyperlink w:anchor="def-folds">
+        <w:r>
+          <w:rPr>
+            <w:rStyle w:val="Hyperlink"/>
+          </w:rPr>
+          <w:t xml:space="preserve">folds</w:t>
+        </w:r>
+      </w:hyperlink>
+      <w:r>
+        <w:t xml:space="preserve"> </w:t>
+      </w:r>
+      <w:r>
+        <w:t xml:space="preserve">of</w:t>
+      </w:r>
+      <w:r>
+        <w:t xml:space="preserve"> </w:t>
+      </w:r>
+      <w:hyperlink w:anchor="eq-folds">
+        <w:r>
+          <w:rPr>
+            <w:rStyle w:val="Hyperlink"/>
+          </w:rPr>
+          <w:t xml:space="preserve">Equation 27</w:t>
+        </w:r>
+      </w:hyperlink>
+      <w:r>
+        <w:t xml:space="preserve"> </w:t>
+      </w:r>
+      <w:r>
+        <w:t xml:space="preserve">partition the</w:t>
+      </w:r>
+      <w:r>
+        <w:t xml:space="preserve"> </w:t>
+      </w:r>
+      <m:oMath>
+        <m:r>
+          <m:t>n</m:t>
+        </m:r>
+      </m:oMath>
+      <w:r>
+        <w:t xml:space="preserve"> </w:t>
+      </w:r>
+      <w:r>
+        <w:t xml:space="preserve">indices of</w:t>
+      </w:r>
+      <w:r>
+        <w:t xml:space="preserve"> </w:t>
+      </w:r>
+      <m:oMath>
+        <m:r>
+          <m:t>I</m:t>
+        </m:r>
+      </m:oMath>
+      <w:r>
+        <w:t xml:space="preserve">,</w:t>
+      </w:r>
+      <w:r>
+        <w:t xml:space="preserve"> </w:t>
+      </w:r>
+      <w:r>
+        <w:t xml:space="preserve">so each fold holds exactly one index.</w:t>
+      </w:r>
+      <w:r>
+        <w:t xml:space="preserve"> </w:t>
+      </w:r>
+      <w:r>
+        <w:t xml:space="preserve">(A partition of</w:t>
+      </w:r>
+      <w:r>
+        <w:t xml:space="preserve"> </w:t>
+      </w:r>
+      <m:oMath>
+        <m:r>
+          <m:t>n</m:t>
+        </m:r>
+      </m:oMath>
+      <w:r>
+        <w:t xml:space="preserve"> </w:t>
+      </w:r>
+      <w:r>
+        <w:t xml:space="preserve">indices into</w:t>
+      </w:r>
+      <w:r>
+        <w:t xml:space="preserve"> </w:t>
+      </w:r>
+      <m:oMath>
+        <m:r>
+          <m:t>n</m:t>
+        </m:r>
+      </m:oMath>
+      <w:r>
+        <w:t xml:space="preserve"> </w:t>
+      </w:r>
+      <w:r>
+        <w:t xml:space="preserve">nonempty, disjoint subsets has one index per subset.)</w:t>
+      </w:r>
+    </w:p>
+    <w:p>
+      <w:pPr>
+        <w:numPr>
+          <w:ilvl w:val="0"/>
+          <w:numId w:val="1015"/>
+        </w:numPr>
+      </w:pPr>
+      <w:r>
+        <w:t xml:space="preserve">For observation</w:t>
+      </w:r>
+      <w:r>
+        <w:t xml:space="preserve"> </w:t>
+      </w:r>
+      <m:oMath>
+        <m:r>
+          <m:t>i</m:t>
+        </m:r>
+      </m:oMath>
+      <w:r>
+        <w:t xml:space="preserve">,</w:t>
+      </w:r>
+      <w:r>
+        <w:t xml:space="preserve"> </w:t>
+      </w:r>
+      <w:hyperlink w:anchor="eq-fold-assignment">
+        <w:r>
+          <w:rPr>
+            <w:rStyle w:val="Hyperlink"/>
+          </w:rPr>
+          <w:t xml:space="preserve">Equation 29</w:t>
+        </w:r>
+      </w:hyperlink>
+      <w:r>
+        <w:t xml:space="preserve"> </w:t>
+      </w:r>
+      <w:r>
+        <w:t xml:space="preserve">gives</w:t>
+      </w:r>
+      <w:r>
+        <w:t xml:space="preserve"> </w:t>
+      </w:r>
+      <m:oMath>
+        <m:r>
+          <m:t>i</m:t>
+        </m:r>
+        <m:r>
+          <m:rPr>
+            <m:sty m:val="p"/>
+          </m:rPr>
+          <m:t>∈</m:t>
+        </m:r>
+        <m:sSub>
+          <m:e>
+            <m:r>
+              <m:rPr>
+                <m:scr m:val="script"/>
+                <m:sty m:val="p"/>
+              </m:rPr>
+              <m:t>F</m:t>
+            </m:r>
+          </m:e>
+          <m:sub>
+            <m:r>
+              <m:t>κ</m:t>
+            </m:r>
+            <m:r>
+              <m:rPr>
+                <m:sty m:val="p"/>
+              </m:rPr>
+              <m:t>(</m:t>
+            </m:r>
+            <m:r>
+              <m:t>i</m:t>
+            </m:r>
+            <m:r>
+              <m:rPr>
+                <m:sty m:val="p"/>
+              </m:rPr>
+              <m:t>)</m:t>
+            </m:r>
+          </m:sub>
+        </m:sSub>
+      </m:oMath>
+      <w:r>
+        <w:t xml:space="preserve">,</w:t>
+      </w:r>
+      <w:r>
+        <w:t xml:space="preserve"> </w:t>
+      </w:r>
+      <w:r>
+        <w:t xml:space="preserve">so</w:t>
+      </w:r>
+      <w:r>
+        <w:t xml:space="preserve"> </w:t>
+      </w:r>
+      <m:oMath>
+        <m:sSub>
+          <m:e>
+            <m:r>
+              <m:rPr>
+                <m:scr m:val="script"/>
+                <m:sty m:val="p"/>
+              </m:rPr>
+              <m:t>F</m:t>
+            </m:r>
+          </m:e>
+          <m:sub>
+            <m:r>
+              <m:t>κ</m:t>
+            </m:r>
+            <m:r>
+              <m:rPr>
+                <m:sty m:val="p"/>
+              </m:rPr>
+              <m:t>(</m:t>
+            </m:r>
+            <m:r>
+              <m:t>i</m:t>
+            </m:r>
+            <m:r>
+              <m:rPr>
+                <m:sty m:val="p"/>
+              </m:rPr>
+              <m:t>)</m:t>
+            </m:r>
+          </m:sub>
+        </m:sSub>
+        <m:r>
+          <m:rPr>
+            <m:sty m:val="p"/>
+          </m:rPr>
+          <m:t>=</m:t>
+        </m:r>
+        <m:r>
+          <m:t>​</m:t>
+        </m:r>
+        <m:d>
+          <m:dPr>
+            <m:begChr m:val="{"/>
+            <m:sepChr m:val=""/>
+            <m:endChr m:val="}"/>
+            <m:grow/>
+          </m:dPr>
+          <m:e>
+            <m:r>
+              <m:t>i</m:t>
+            </m:r>
+          </m:e>
+        </m:d>
+        <m:r>
+          <m:t>​</m:t>
+        </m:r>
+      </m:oMath>
+      <w:r>
+        <w:t xml:space="preserve">.</w:t>
+      </w:r>
+      <w:r>
+        <w:t xml:space="preserve"> </w:t>
+      </w:r>
+      <w:r>
+        <w:t xml:space="preserve">(Fold</w:t>
+      </w:r>
+      <w:r>
+        <w:t xml:space="preserve"> </w:t>
+      </w:r>
+      <m:oMath>
+        <m:r>
+          <m:t>κ</m:t>
+        </m:r>
+        <m:r>
+          <m:rPr>
+            <m:sty m:val="p"/>
+          </m:rPr>
+          <m:t>(</m:t>
+        </m:r>
+        <m:r>
+          <m:t>i</m:t>
+        </m:r>
+        <m:r>
+          <m:rPr>
+            <m:sty m:val="p"/>
+          </m:rPr>
+          <m:t>)</m:t>
+        </m:r>
+      </m:oMath>
+      <w:r>
+        <w:t xml:space="preserve"> </w:t>
+      </w:r>
+      <w:r>
+        <w:t xml:space="preserve">holds one index, and that index is</w:t>
+      </w:r>
+      <w:r>
+        <w:t xml:space="preserve"> </w:t>
+      </w:r>
+      <m:oMath>
+        <m:r>
+          <m:t>i</m:t>
+        </m:r>
+      </m:oMath>
+      <w:r>
+        <w:t xml:space="preserve">.)</w:t>
+      </w:r>
+    </w:p>
+    <w:p>
+      <w:pPr>
+        <w:numPr>
+          <w:ilvl w:val="0"/>
+          <w:numId w:val="1015"/>
+        </w:numPr>
+      </w:pPr>
+      <w:r>
+        <w:t xml:space="preserve">Let</w:t>
+      </w:r>
+      <w:r>
+        <w:t xml:space="preserve"> </w:t>
+      </w:r>
+      <m:oMath>
+        <m:r>
+          <m:t>g</m:t>
+        </m:r>
+      </m:oMath>
+      <w:r>
+        <w:t xml:space="preserve"> </w:t>
+      </w:r>
+      <w:r>
+        <w:t xml:space="preserve">be the</w:t>
+      </w:r>
+      <w:r>
+        <w:t xml:space="preserve"> </w:t>
+      </w:r>
+      <w:hyperlink w:anchor="def-fitting-procedure">
+        <w:r>
+          <w:rPr>
+            <w:rStyle w:val="Hyperlink"/>
+          </w:rPr>
+          <w:t xml:space="preserve">fitting procedure</w:t>
+        </w:r>
+      </w:hyperlink>
+      <w:r>
+        <w:t xml:space="preserve">,</w:t>
+      </w:r>
+      <w:r>
+        <w:t xml:space="preserve"> </w:t>
+      </w:r>
+      <w:r>
+        <w:t xml:space="preserve">the rule that maps a training set to a fitted prediction rule.</w:t>
+      </w:r>
+      <w:r>
+        <w:t xml:space="preserve"> </w:t>
+      </w:r>
+      <w:r>
+        <w:t xml:space="preserve">The</w:t>
+      </w:r>
+      <w:r>
+        <w:t xml:space="preserve"> </w:t>
+      </w:r>
+      <w:hyperlink w:anchor="def-fold-out-rule">
+        <w:r>
+          <w:rPr>
+            <w:rStyle w:val="Hyperlink"/>
+          </w:rPr>
+          <w:t xml:space="preserve">fold-out rule</w:t>
+        </w:r>
+      </w:hyperlink>
+      <w:r>
+        <w:t xml:space="preserve"> </w:t>
+      </w:r>
+      <w:r>
+        <w:t xml:space="preserve">of observation</w:t>
+      </w:r>
+      <w:r>
+        <w:t xml:space="preserve"> </w:t>
+      </w:r>
+      <m:oMath>
+        <m:r>
+          <m:t>i</m:t>
+        </m:r>
+      </m:oMath>
+      <w:r>
+        <w:t xml:space="preserve"> </w:t>
+      </w:r>
+      <w:r>
+        <w:t xml:space="preserve">is then</w:t>
+      </w:r>
+      <w:r>
+        <w:t xml:space="preserve"> </w:t>
+      </w:r>
+      <m:oMath>
+        <m:sSup>
+          <m:e>
+            <m:acc>
+              <m:accPr>
+                <m:chr m:val="̂"/>
+              </m:accPr>
+              <m:e>
+                <m:r>
+                  <m:t>y</m:t>
+                </m:r>
+              </m:e>
+            </m:acc>
+          </m:e>
+          <m:sup>
+            <m:r>
+              <m:rPr>
+                <m:sty m:val="p"/>
+              </m:rPr>
+              <m:t>(</m:t>
+            </m:r>
+            <m:r>
+              <m:rPr>
+                <m:sty m:val="p"/>
+              </m:rPr>
+              <m:t>−</m:t>
+            </m:r>
+            <m:r>
+              <m:t>κ</m:t>
+            </m:r>
+            <m:r>
+              <m:rPr>
+                <m:sty m:val="p"/>
+              </m:rPr>
+              <m:t>(</m:t>
+            </m:r>
+            <m:r>
+              <m:t>i</m:t>
+            </m:r>
+            <m:r>
+              <m:rPr>
+                <m:sty m:val="p"/>
+              </m:rPr>
+              <m:t>)</m:t>
+            </m:r>
+            <m:r>
+              <m:rPr>
+                <m:sty m:val="p"/>
+              </m:rPr>
+              <m:t>)</m:t>
+            </m:r>
+          </m:sup>
+        </m:sSup>
+        <m:r>
+          <m:t>​</m:t>
+        </m:r>
+        <m:d>
+          <m:dPr>
+            <m:begChr m:val="("/>
+            <m:sepChr m:val=""/>
+            <m:endChr m:val=")"/>
+            <m:grow/>
+          </m:dPr>
+          <m:e>
+            <m:r>
+              <m:t>x</m:t>
+            </m:r>
+          </m:e>
+        </m:d>
+        <m:r>
+          <m:t>​</m:t>
+        </m:r>
+        <m:r>
+          <m:rPr>
+            <m:sty m:val="p"/>
+          </m:rPr>
+          <m:t>=</m:t>
+        </m:r>
+        <m:r>
+          <m:t>g</m:t>
+        </m:r>
+        <m:r>
+          <m:t>​</m:t>
+        </m:r>
+        <m:d>
+          <m:dPr>
+            <m:begChr m:val="("/>
+            <m:sepChr m:val=""/>
+            <m:endChr m:val=")"/>
+            <m:grow/>
+          </m:dPr>
+          <m:e>
+            <m:r>
+              <m:t>x</m:t>
+            </m:r>
+            <m:r>
+              <m:rPr>
+                <m:sty m:val="p"/>
+              </m:rPr>
+              <m:t>;</m:t>
+            </m:r>
+            <m:r>
+              <m:t>​</m:t>
+            </m:r>
+            <m:d>
+              <m:dPr>
+                <m:begChr m:val="("/>
+                <m:sepChr m:val=""/>
+                <m:endChr m:val=")"/>
+                <m:grow/>
+              </m:dPr>
+              <m:e>
+                <m:r>
+                  <m:rPr>
+                    <m:sty m:val="p"/>
+                  </m:rPr>
+                  <m:t>(</m:t>
+                </m:r>
+                <m:sSub>
+                  <m:e>
+                    <m:r>
+                      <m:t>x</m:t>
+                    </m:r>
+                  </m:e>
+                  <m:sub>
+                    <m:sSup>
+                      <m:e>
+                        <m:r>
+                          <m:t>i</m:t>
+                        </m:r>
+                      </m:e>
+                      <m:sup>
+                        <m:r>
+                          <m:rPr>
+                            <m:sty m:val="p"/>
+                          </m:rPr>
+                          <m:t>′</m:t>
+                        </m:r>
+                      </m:sup>
+                    </m:sSup>
+                  </m:sub>
+                </m:sSub>
+                <m:r>
+                  <m:rPr>
+                    <m:sty m:val="p"/>
+                  </m:rPr>
+                  <m:t>,</m:t>
+                </m:r>
+                <m:sSub>
+                  <m:e>
+                    <m:r>
+                      <m:t>y</m:t>
+                    </m:r>
+                  </m:e>
+                  <m:sub>
+                    <m:sSup>
+                      <m:e>
+                        <m:r>
+                          <m:t>i</m:t>
+                        </m:r>
+                      </m:e>
+                      <m:sup>
+                        <m:r>
+                          <m:rPr>
+                            <m:sty m:val="p"/>
+                          </m:rPr>
+                          <m:t>′</m:t>
+                        </m:r>
+                      </m:sup>
+                    </m:sSup>
+                  </m:sub>
+                </m:sSub>
+                <m:r>
+                  <m:rPr>
+                    <m:sty m:val="p"/>
+                  </m:rPr>
+                  <m:t>)</m:t>
+                </m:r>
+              </m:e>
+            </m:d>
+            <m:sSub>
+              <m:e>
+                <m:r>
+                  <m:t>​</m:t>
+                </m:r>
+              </m:e>
+              <m:sub>
+                <m:sSup>
+                  <m:e>
+                    <m:r>
+                      <m:t>i</m:t>
+                    </m:r>
+                  </m:e>
+                  <m:sup>
+                    <m:r>
+                      <m:rPr>
+                        <m:sty m:val="p"/>
+                      </m:rPr>
+                      <m:t>′</m:t>
+                    </m:r>
+                  </m:sup>
+                </m:sSup>
+                <m:r>
+                  <m:rPr>
+                    <m:sty m:val="p"/>
+                  </m:rPr>
+                  <m:t>∈</m:t>
+                </m:r>
+                <m:r>
+                  <m:t>I</m:t>
+                </m:r>
+                <m:r>
+                  <m:rPr>
+                    <m:sty m:val="p"/>
+                  </m:rPr>
+                  <m:t>\</m:t>
+                </m:r>
+                <m:r>
+                  <m:t>​</m:t>
+                </m:r>
+                <m:d>
+                  <m:dPr>
+                    <m:begChr m:val="{"/>
+                    <m:sepChr m:val=""/>
+                    <m:endChr m:val="}"/>
+                    <m:grow/>
+                  </m:dPr>
+                  <m:e>
+                    <m:r>
+                      <m:t>i</m:t>
+                    </m:r>
+                  </m:e>
+                </m:d>
+                <m:r>
+                  <m:t>​</m:t>
+                </m:r>
+              </m:sub>
+            </m:sSub>
+          </m:e>
+        </m:d>
+        <m:r>
+          <m:t>​</m:t>
+        </m:r>
+      </m:oMath>
+      <w:r>
+        <w:t xml:space="preserve">.</w:t>
+      </w:r>
+      <w:r>
+        <w:t xml:space="preserve"> </w:t>
+      </w:r>
+      <w:r>
+        <w:t xml:space="preserve">(</w:t>
+      </w:r>
+      <w:hyperlink w:anchor="eq-fold-out-rule">
+        <w:r>
+          <w:rPr>
+            <w:rStyle w:val="Hyperlink"/>
+          </w:rPr>
+          <w:t xml:space="preserve">Equation 30</w:t>
+        </w:r>
+      </w:hyperlink>
+      <w:r>
+        <w:t xml:space="preserve"> </w:t>
+      </w:r>
+      <w:r>
+        <w:t xml:space="preserve">with</w:t>
+      </w:r>
+      <w:r>
+        <w:t xml:space="preserve"> </w:t>
+      </w:r>
+      <m:oMath>
+        <m:sSub>
+          <m:e>
+            <m:r>
+              <m:rPr>
+                <m:scr m:val="script"/>
+                <m:sty m:val="p"/>
+              </m:rPr>
+              <m:t>F</m:t>
+            </m:r>
+          </m:e>
+          <m:sub>
+            <m:r>
+              <m:t>κ</m:t>
+            </m:r>
+            <m:r>
+              <m:rPr>
+                <m:sty m:val="p"/>
+              </m:rPr>
+              <m:t>(</m:t>
+            </m:r>
+            <m:r>
+              <m:t>i</m:t>
+            </m:r>
+            <m:r>
+              <m:rPr>
+                <m:sty m:val="p"/>
+              </m:rPr>
+              <m:t>)</m:t>
+            </m:r>
+          </m:sub>
+        </m:sSub>
+        <m:r>
+          <m:rPr>
+            <m:sty m:val="p"/>
+          </m:rPr>
+          <m:t>=</m:t>
+        </m:r>
+        <m:r>
+          <m:t>​</m:t>
+        </m:r>
+        <m:d>
+          <m:dPr>
+            <m:begChr m:val="{"/>
+            <m:sepChr m:val=""/>
+            <m:endChr m:val="}"/>
+            <m:grow/>
+          </m:dPr>
+          <m:e>
+            <m:r>
+              <m:t>i</m:t>
+            </m:r>
+          </m:e>
+        </m:d>
+        <m:r>
+          <m:t>​</m:t>
+        </m:r>
+      </m:oMath>
+      <w:r>
+        <w:t xml:space="preserve">.)</w:t>
+      </w:r>
+    </w:p>
+    <w:p>
+      <w:pPr>
+        <w:numPr>
+          <w:ilvl w:val="0"/>
+          <w:numId w:val="1015"/>
+        </w:numPr>
+      </w:pPr>
+      <w:r>
+        <w:t xml:space="preserve">This rule is fitted to every observation except observation</w:t>
+      </w:r>
+      <w:r>
+        <w:t xml:space="preserve"> </w:t>
+      </w:r>
+      <m:oMath>
+        <m:r>
+          <m:t>i</m:t>
+        </m:r>
+      </m:oMath>
+      <w:r>
+        <w:t xml:space="preserve">,</w:t>
+      </w:r>
+      <w:r>
+        <w:t xml:space="preserve"> </w:t>
+      </w:r>
+      <w:r>
+        <w:t xml:space="preserve">and it does not involve</w:t>
+      </w:r>
+      <w:r>
+        <w:t xml:space="preserve"> </w:t>
+      </w:r>
+      <m:oMath>
+        <m:r>
+          <m:t>κ</m:t>
+        </m:r>
+        <m:r>
+          <m:rPr>
+            <m:sty m:val="p"/>
+          </m:rPr>
+          <m:t>(</m:t>
+        </m:r>
+        <m:r>
+          <m:t>i</m:t>
+        </m:r>
+        <m:r>
+          <m:rPr>
+            <m:sty m:val="p"/>
+          </m:rPr>
+          <m:t>)</m:t>
+        </m:r>
+      </m:oMath>
+      <w:r>
+        <w:t xml:space="preserve"> </w:t>
+      </w:r>
+      <w:r>
+        <w:t xml:space="preserve">itself.</w:t>
+      </w:r>
+      <w:r>
+        <w:t xml:space="preserve"> </w:t>
+      </w:r>
+      <w:r>
+        <w:t xml:space="preserve">(Step 3 depends on</w:t>
+      </w:r>
+      <w:r>
+        <w:t xml:space="preserve"> </w:t>
+      </w:r>
+      <m:oMath>
+        <m:r>
+          <m:t>i</m:t>
+        </m:r>
+      </m:oMath>
+      <w:r>
+        <w:t xml:space="preserve"> </w:t>
+      </w:r>
+      <w:r>
+        <w:t xml:space="preserve">and</w:t>
+      </w:r>
+      <w:r>
+        <w:t xml:space="preserve"> </w:t>
+      </w:r>
+      <m:oMath>
+        <m:r>
+          <m:t>g</m:t>
+        </m:r>
+      </m:oMath>
+      <w:r>
+        <w:t xml:space="preserve"> </w:t>
+      </w:r>
+      <w:r>
+        <w:t xml:space="preserve">only.)</w:t>
+      </w:r>
+    </w:p>
+    <w:p>
+      <w:pPr>
+        <w:numPr>
+          <w:ilvl w:val="0"/>
+          <w:numId w:val="1015"/>
+        </w:numPr>
+      </w:pPr>
+      <w:r>
+        <w:t xml:space="preserve">Hence each term</w:t>
+      </w:r>
+      <w:r>
+        <w:t xml:space="preserve"> </w:t>
+      </w:r>
+      <m:oMath>
+        <m:sSup>
+          <m:e>
+            <m:r>
+              <m:t>​</m:t>
+            </m:r>
+            <m:d>
+              <m:dPr>
+                <m:begChr m:val="("/>
+                <m:sepChr m:val=""/>
+                <m:endChr m:val=")"/>
+                <m:grow/>
+              </m:dPr>
+              <m:e>
+                <m:sSup>
+                  <m:e>
+                    <m:acc>
+                      <m:accPr>
+                        <m:chr m:val="̂"/>
+                      </m:accPr>
+                      <m:e>
+                        <m:r>
+                          <m:t>y</m:t>
+                        </m:r>
+                      </m:e>
+                    </m:acc>
+                  </m:e>
+                  <m:sup>
+                    <m:r>
+                      <m:rPr>
+                        <m:sty m:val="p"/>
+                      </m:rPr>
+                      <m:t>(</m:t>
+                    </m:r>
+                    <m:r>
+                      <m:rPr>
+                        <m:sty m:val="p"/>
+                      </m:rPr>
+                      <m:t>−</m:t>
+                    </m:r>
+                    <m:r>
+                      <m:t>κ</m:t>
+                    </m:r>
+                    <m:r>
+                      <m:rPr>
+                        <m:sty m:val="p"/>
+                      </m:rPr>
+                      <m:t>(</m:t>
+                    </m:r>
+                    <m:r>
+                      <m:t>i</m:t>
+                    </m:r>
+                    <m:r>
+                      <m:rPr>
+                        <m:sty m:val="p"/>
+                      </m:rPr>
+                      <m:t>)</m:t>
+                    </m:r>
+                    <m:r>
+                      <m:rPr>
+                        <m:sty m:val="p"/>
+                      </m:rPr>
+                      <m:t>)</m:t>
+                    </m:r>
+                  </m:sup>
+                </m:sSup>
+                <m:r>
+                  <m:t>​</m:t>
+                </m:r>
+                <m:d>
+                  <m:dPr>
+                    <m:begChr m:val="("/>
+                    <m:sepChr m:val=""/>
+                    <m:endChr m:val=")"/>
+                    <m:grow/>
+                  </m:dPr>
+                  <m:e>
+                    <m:sSub>
+                      <m:e>
+                        <m:r>
+                          <m:t>x</m:t>
+                        </m:r>
+                      </m:e>
+                      <m:sub>
+                        <m:r>
+                          <m:t>i</m:t>
+                        </m:r>
+                      </m:sub>
+                    </m:sSub>
+                  </m:e>
+                </m:d>
+                <m:r>
+                  <m:t>​</m:t>
+                </m:r>
+                <m:r>
+                  <m:rPr>
+                    <m:sty m:val="p"/>
+                  </m:rPr>
+                  <m:t>−</m:t>
+                </m:r>
+                <m:sSub>
+                  <m:e>
+                    <m:r>
+                      <m:t>y</m:t>
+                    </m:r>
+                  </m:e>
+                  <m:sub>
+                    <m:r>
+                      <m:t>i</m:t>
+                    </m:r>
+                  </m:sub>
+                </m:sSub>
+              </m:e>
+            </m:d>
+            <m:r>
+              <m:t>​</m:t>
+            </m:r>
+          </m:e>
+          <m:sup>
+            <m:r>
+              <m:t>2</m:t>
+            </m:r>
+          </m:sup>
+        </m:sSup>
+      </m:oMath>
+      <w:r>
+        <w:t xml:space="preserve"> </w:t>
+      </w:r>
+      <w:r>
+        <w:t xml:space="preserve">of</w:t>
+      </w:r>
+      <w:r>
+        <w:t xml:space="preserve"> </w:t>
+      </w:r>
+      <w:hyperlink w:anchor="eq-cv-estimate">
+        <w:r>
+          <w:rPr>
+            <w:rStyle w:val="Hyperlink"/>
+          </w:rPr>
+          <w:t xml:space="preserve">Equation 31</w:t>
+        </w:r>
+      </w:hyperlink>
+      <w:r>
+        <w:t xml:space="preserve"> </w:t>
+      </w:r>
+      <w:r>
+        <w:t xml:space="preserve">is the same</w:t>
+      </w:r>
+      <w:r>
+        <w:t xml:space="preserve"> </w:t>
+      </w:r>
+      <w:r>
+        <w:t xml:space="preserve">for every fold assignment.</w:t>
+      </w:r>
+      <w:r>
+        <w:t xml:space="preserve"> </w:t>
+      </w:r>
+      <w:r>
+        <w:t xml:space="preserve">(Each term is a function of the rule in step 4,</w:t>
+      </w:r>
+      <w:r>
+        <w:t xml:space="preserve"> </w:t>
+      </w:r>
+      <m:oMath>
+        <m:sSub>
+          <m:e>
+            <m:r>
+              <m:t>x</m:t>
+            </m:r>
+          </m:e>
+          <m:sub>
+            <m:r>
+              <m:t>i</m:t>
+            </m:r>
+          </m:sub>
+        </m:sSub>
+      </m:oMath>
+      <w:r>
+        <w:t xml:space="preserve"> </w:t>
+      </w:r>
+      <w:r>
+        <w:t xml:space="preserve">and</w:t>
+      </w:r>
+      <w:r>
+        <w:t xml:space="preserve"> </w:t>
+      </w:r>
+      <m:oMath>
+        <m:sSub>
+          <m:e>
+            <m:r>
+              <m:t>y</m:t>
+            </m:r>
+          </m:e>
+          <m:sub>
+            <m:r>
+              <m:t>i</m:t>
+            </m:r>
+          </m:sub>
+        </m:sSub>
+      </m:oMath>
+      <w:r>
+        <w:t xml:space="preserve">.)</w:t>
+      </w:r>
+    </w:p>
+    <w:p>
+      <w:pPr>
+        <w:numPr>
+          <w:ilvl w:val="0"/>
+          <w:numId w:val="1015"/>
+        </w:numPr>
+      </w:pPr>
+      <w:r>
+        <w:t xml:space="preserve">Therefore the sum over</w:t>
+      </w:r>
+      <w:r>
+        <w:t xml:space="preserve"> </w:t>
+      </w:r>
+      <m:oMath>
+        <m:r>
+          <m:t>i</m:t>
+        </m:r>
+        <m:r>
+          <m:rPr>
+            <m:sty m:val="p"/>
+          </m:rPr>
+          <m:t>∈</m:t>
+        </m:r>
+        <m:r>
+          <m:t>I</m:t>
+        </m:r>
+      </m:oMath>
+      <w:r>
+        <w:t xml:space="preserve"> </w:t>
+      </w:r>
+      <w:r>
+        <w:t xml:space="preserve">in</w:t>
+      </w:r>
+      <w:r>
+        <w:t xml:space="preserve"> </w:t>
+      </w:r>
+      <w:hyperlink w:anchor="eq-cv-estimate">
+        <w:r>
+          <w:rPr>
+            <w:rStyle w:val="Hyperlink"/>
+          </w:rPr>
+          <w:t xml:space="preserve">Equation 31</w:t>
+        </w:r>
+      </w:hyperlink>
+      <w:r>
+        <w:t xml:space="preserve">,</w:t>
+      </w:r>
+      <w:r>
+        <w:t xml:space="preserve"> </w:t>
+      </w:r>
+      <w:r>
+        <w:t xml:space="preserve">and its factor</w:t>
+      </w:r>
+      <w:r>
+        <w:t xml:space="preserve"> </w:t>
+      </w:r>
+      <m:oMath>
+        <m:r>
+          <m:t>1</m:t>
+        </m:r>
+        <m:r>
+          <m:rPr>
+            <m:sty m:val="p"/>
+          </m:rPr>
+          <m:t>/</m:t>
+        </m:r>
+        <m:r>
+          <m:t>n</m:t>
+        </m:r>
+      </m:oMath>
+      <w:r>
+        <w:t xml:space="preserve">, are the same for every fold assignment:</w:t>
+      </w:r>
+    </w:p>
+    <w:p>
+      <w:pPr>
+        <w:pStyle w:val="BodyText"/>
+      </w:pPr>
+      <m:oMathPara>
+        <m:oMathParaPr>
+          <m:jc m:val="center"/>
+        </m:oMathParaPr>
+        <m:oMath>
+          <m:sSub>
+            <m:e>
+              <m:acc>
+                <m:accPr>
+                  <m:chr m:val="̂"/>
+                </m:accPr>
+                <m:e>
+                  <m:r>
+                    <m:rPr>
+                      <m:sty m:val="p"/>
+                    </m:rPr>
+                    <m:t>Err</m:t>
+                  </m:r>
+                </m:e>
+              </m:acc>
+            </m:e>
+            <m:sub>
+              <m:r>
+                <m:rPr>
+                  <m:nor/>
+                  <m:sty m:val="p"/>
+                </m:rPr>
+                <m:t>CV</m:t>
+              </m:r>
+              <m:r>
+                <m:rPr>
+                  <m:sty m:val="p"/>
+                </m:rPr>
+                <m:t>(</m:t>
+              </m:r>
+              <m:r>
+                <m:t>n</m:t>
+              </m:r>
+              <m:r>
+                <m:rPr>
+                  <m:sty m:val="p"/>
+                </m:rPr>
+                <m:t>)</m:t>
+              </m:r>
+            </m:sub>
+          </m:sSub>
+          <m:r>
+            <m:rPr>
+              <m:sty m:val="p"/>
+            </m:rPr>
+            <m:t>=</m:t>
+          </m:r>
+          <m:f>
+            <m:fPr>
+              <m:type m:val="bar"/>
+            </m:fPr>
+            <m:num>
+              <m:r>
+                <m:t>1</m:t>
+              </m:r>
+            </m:num>
+            <m:den>
+              <m:r>
+                <m:t>n</m:t>
+              </m:r>
+            </m:den>
+          </m:f>
+          <m:nary>
+            <m:naryPr>
+              <m:chr m:val="∑"/>
+              <m:limLoc m:val="undOvr"/>
+              <m:subHide m:val="off"/>
+              <m:supHide m:val="on"/>
+            </m:naryPr>
+            <m:sub>
+              <m:r>
+                <m:t>i</m:t>
+              </m:r>
+              <m:r>
+                <m:rPr>
+                  <m:sty m:val="p"/>
+                </m:rPr>
+                <m:t>∈</m:t>
+              </m:r>
+              <m:r>
+                <m:t>I</m:t>
+              </m:r>
+            </m:sub>
+            <m:sup>
+              <m:r>
+                <m:t>​</m:t>
+              </m:r>
+            </m:sup>
+            <m:e>
+              <m:sSup>
+                <m:e>
+                  <m:r>
+                    <m:t>​</m:t>
+                  </m:r>
+                  <m:d>
+                    <m:dPr>
+                      <m:begChr m:val="("/>
+                      <m:sepChr m:val=""/>
+                      <m:endChr m:val=")"/>
+                      <m:grow/>
+                    </m:dPr>
+                    <m:e>
+                      <m:sSup>
+                        <m:e>
+                          <m:acc>
+                            <m:accPr>
+                              <m:chr m:val="̂"/>
+                            </m:accPr>
+                            <m:e>
+                              <m:r>
+                                <m:t>y</m:t>
+                              </m:r>
+                            </m:e>
+                          </m:acc>
+                        </m:e>
+                        <m:sup>
+                          <m:r>
+                            <m:rPr>
+                              <m:sty m:val="p"/>
+                            </m:rPr>
+                            <m:t>(</m:t>
+                          </m:r>
+                          <m:r>
+                            <m:rPr>
+                              <m:sty m:val="p"/>
+                            </m:rPr>
+                            <m:t>−</m:t>
+                          </m:r>
+                          <m:r>
+                            <m:t>κ</m:t>
+                          </m:r>
+                          <m:r>
+                            <m:rPr>
+                              <m:sty m:val="p"/>
+                            </m:rPr>
+                            <m:t>(</m:t>
+                          </m:r>
+                          <m:r>
+                            <m:t>i</m:t>
+                          </m:r>
+                          <m:r>
+                            <m:rPr>
+                              <m:sty m:val="p"/>
+                            </m:rPr>
+                            <m:t>)</m:t>
+                          </m:r>
+                          <m:r>
+                            <m:rPr>
+                              <m:sty m:val="p"/>
+                            </m:rPr>
+                            <m:t>)</m:t>
+                          </m:r>
+                        </m:sup>
+                      </m:sSup>
+                      <m:r>
+                        <m:t>​</m:t>
+                      </m:r>
+                      <m:d>
+                        <m:dPr>
+                          <m:begChr m:val="("/>
+                          <m:sepChr m:val=""/>
+                          <m:endChr m:val=")"/>
+                          <m:grow/>
+                        </m:dPr>
+                        <m:e>
+                          <m:sSub>
+                            <m:e>
+                              <m:r>
+                                <m:t>x</m:t>
+                              </m:r>
+                            </m:e>
+                            <m:sub>
+                              <m:r>
+                                <m:t>i</m:t>
+                              </m:r>
+                            </m:sub>
+                          </m:sSub>
+                        </m:e>
+                      </m:d>
+                      <m:r>
+                        <m:t>​</m:t>
+                      </m:r>
+                      <m:r>
+                        <m:rPr>
+                          <m:sty m:val="p"/>
+                        </m:rPr>
+                        <m:t>−</m:t>
+                      </m:r>
+                      <m:sSub>
+                        <m:e>
+                          <m:r>
+                            <m:t>y</m:t>
+                          </m:r>
+                        </m:e>
+                        <m:sub>
+                          <m:r>
+                            <m:t>i</m:t>
+                          </m:r>
+                        </m:sub>
+                      </m:sSub>
+                    </m:e>
+                  </m:d>
+                  <m:r>
+                    <m:t>​</m:t>
+                  </m:r>
+                </m:e>
+                <m:sup>
+                  <m:r>
+                    <m:t>2</m:t>
+                  </m:r>
+                </m:sup>
+              </m:sSup>
+            </m:e>
+          </m:nary>
+          <m:r>
+            <m:rPr>
+              <m:sty m:val="p"/>
+            </m:rPr>
+            <m:t>.</m:t>
+          </m:r>
+        </m:oMath>
+      </m:oMathPara>
+    </w:p>
+    <w:p>
+      <w:pPr>
+        <w:numPr>
+          <w:ilvl w:val="0"/>
+          <w:numId w:val="1000"/>
+        </w:numPr>
+      </w:pPr>
+      <w:r>
+        <w:t xml:space="preserve">Different assignments give the same</w:t>
+      </w:r>
+      <w:r>
+        <w:t xml:space="preserve"> </w:t>
+      </w:r>
+      <m:oMath>
+        <m:r>
+          <m:t>n</m:t>
+        </m:r>
+      </m:oMath>
+      <w:r>
+        <w:t xml:space="preserve"> </w:t>
+      </w:r>
+      <w:r>
+        <w:t xml:space="preserve">fits, with the folds numbered differently.</w:t>
+      </w:r>
+    </w:p>
+    <w:bookmarkStart w:id="207" w:name="def-term-vector"/>
+    <w:p>
+      <w:pPr>
+        <w:pStyle w:val="FirstParagraph"/>
       </w:pPr>
       <w:r>
         <w:rPr>
@@ -54057,7 +55933,7 @@
       <w:pPr>
         <w:pStyle w:val="BodyText"/>
       </w:pPr>
-      <w:bookmarkStart w:id="205" w:name="eq-term-vector"/>
+      <w:bookmarkStart w:id="206" w:name="eq-term-vector"/>
       <m:oMathPara>
         <m:oMathParaPr>
           <m:jc m:val="center"/>
@@ -54257,10 +56133,10 @@
           </m:r>
         </m:oMath>
       </m:oMathPara>
-      <w:bookmarkEnd w:id="205"/>
+      <w:bookmarkEnd w:id="206"/>
     </w:p>
-    <w:bookmarkEnd w:id="206"/>
-    <w:bookmarkStart w:id="208" w:name="rem-term-vector"/>
+    <w:bookmarkEnd w:id="207"/>
+    <w:bookmarkStart w:id="209" w:name="rem-term-vector"/>
     <w:p>
       <w:pPr>
         <w:pStyle w:val="FirstParagraph"/>
@@ -54353,7 +56229,7 @@
       <w:r>
         <w:t xml:space="preserve"> </w:t>
       </w:r>
-      <w:hyperlink r:id="rId207">
+      <w:hyperlink r:id="rId208">
         <w:r>
           <w:rPr>
             <w:rStyle w:val="Hyperlink"/>
@@ -54389,8 +56265,8 @@
         <w:t xml:space="preserve">.</w:t>
       </w:r>
     </w:p>
-    <w:bookmarkEnd w:id="208"/>
-    <w:bookmarkStart w:id="213" w:name="def-cross-product-matrix"/>
+    <w:bookmarkEnd w:id="209"/>
+    <w:bookmarkStart w:id="214" w:name="def-cross-product-matrix"/>
     <w:p>
       <w:pPr>
         <w:pStyle w:val="BodyText"/>
@@ -54512,7 +56388,7 @@
       <w:pPr>
         <w:pStyle w:val="BodyText"/>
       </w:pPr>
-      <w:bookmarkStart w:id="209" w:name="eq-cross-product-matrix"/>
+      <w:bookmarkStart w:id="210" w:name="eq-cross-product-matrix"/>
       <m:oMathPara>
         <m:oMathParaPr>
           <m:jc m:val="center"/>
@@ -54645,7 +56521,7 @@
           </m:r>
         </m:oMath>
       </m:oMathPara>
-      <w:bookmarkEnd w:id="209"/>
+      <w:bookmarkEnd w:id="210"/>
     </w:p>
     <w:tbl>
       <w:tblPr>
@@ -54688,12 +56564,12 @@
                 <wp:inline>
                   <wp:extent cx="152400" cy="152400"/>
                   <wp:effectExtent b="0" l="0" r="0" t="0"/>
-                  <wp:docPr descr="" title="" id="210" name="Picture"/>
+                  <wp:docPr descr="" title="" id="211" name="Picture"/>
                   <a:graphic>
                     <a:graphicData uri="http://schemas.openxmlformats.org/drawingml/2006/picture">
                       <pic:pic>
                         <pic:nvPicPr>
-                          <pic:cNvPr descr="/opt/quarto/share/formats/docx/note.png" id="211" name="Picture"/>
+                          <pic:cNvPr descr="/opt/quarto/share/formats/docx/note.png" id="212" name="Picture"/>
                           <pic:cNvPicPr>
                             <a:picLocks noChangeArrowheads="1" noChangeAspect="1"/>
                           </pic:cNvPicPr>
@@ -54779,7 +56655,7 @@
             <w:r>
               <w:t xml:space="preserve"> </w:t>
             </w:r>
-            <w:hyperlink r:id="rId212">
+            <w:hyperlink r:id="rId213">
               <w:r>
                 <w:rPr>
                   <w:rStyle w:val="Hyperlink"/>
@@ -54795,8 +56671,8 @@
         </w:tc>
       </w:tr>
     </w:tbl>
-    <w:bookmarkEnd w:id="213"/>
-    <w:bookmarkStart w:id="216" w:name="rem-cross-product-matrix"/>
+    <w:bookmarkEnd w:id="214"/>
+    <w:bookmarkStart w:id="217" w:name="rem-cross-product-matrix"/>
     <w:p>
       <w:pPr>
         <w:pStyle w:val="BodyText"/>
@@ -55105,12 +56981,12 @@
                 <wp:inline>
                   <wp:extent cx="152400" cy="152400"/>
                   <wp:effectExtent b="0" l="0" r="0" t="0"/>
-                  <wp:docPr descr="" title="" id="214" name="Picture"/>
+                  <wp:docPr descr="" title="" id="215" name="Picture"/>
                   <a:graphic>
                     <a:graphicData uri="http://schemas.openxmlformats.org/drawingml/2006/picture">
                       <pic:pic>
                         <pic:nvPicPr>
-                          <pic:cNvPr descr="/opt/quarto/share/formats/docx/note.png" id="215" name="Picture"/>
+                          <pic:cNvPr descr="/opt/quarto/share/formats/docx/note.png" id="216" name="Picture"/>
                           <pic:cNvPicPr>
                             <a:picLocks noChangeArrowheads="1" noChangeAspect="1"/>
                           </pic:cNvPicPr>
@@ -55196,7 +57072,7 @@
             <w:r>
               <w:t xml:space="preserve"> </w:t>
             </w:r>
-            <w:hyperlink r:id="rId212">
+            <w:hyperlink r:id="rId213">
               <w:r>
                 <w:rPr>
                   <w:rStyle w:val="Hyperlink"/>
@@ -55224,8 +57100,8 @@
         </w:tc>
       </w:tr>
     </w:tbl>
-    <w:bookmarkEnd w:id="216"/>
-    <w:bookmarkStart w:id="222" w:name="def-leverage"/>
+    <w:bookmarkEnd w:id="217"/>
+    <w:bookmarkStart w:id="223" w:name="def-leverage"/>
     <w:p>
       <w:pPr>
         <w:pStyle w:val="BodyText"/>
@@ -55246,7 +57122,7 @@
       <w:r>
         <w:t xml:space="preserve"> </w:t>
       </w:r>
-      <w:hyperlink r:id="rId217">
+      <w:hyperlink r:id="rId218">
         <w:r>
           <w:rPr>
             <w:rStyle w:val="Hyperlink"/>
@@ -55390,7 +57266,7 @@
       <w:pPr>
         <w:pStyle w:val="BodyText"/>
       </w:pPr>
-      <w:bookmarkStart w:id="218" w:name="eq-leverage"/>
+      <w:bookmarkStart w:id="219" w:name="eq-leverage"/>
       <m:oMathPara>
         <m:oMathParaPr>
           <m:jc m:val="center"/>
@@ -55521,7 +57397,7 @@
           </m:r>
         </m:oMath>
       </m:oMathPara>
-      <w:bookmarkEnd w:id="218"/>
+      <w:bookmarkEnd w:id="219"/>
     </w:p>
     <w:tbl>
       <w:tblPr>
@@ -55564,12 +57440,12 @@
                 <wp:inline>
                   <wp:extent cx="152400" cy="152400"/>
                   <wp:effectExtent b="0" l="0" r="0" t="0"/>
-                  <wp:docPr descr="" title="" id="219" name="Picture"/>
+                  <wp:docPr descr="" title="" id="220" name="Picture"/>
                   <a:graphic>
                     <a:graphicData uri="http://schemas.openxmlformats.org/drawingml/2006/picture">
                       <pic:pic>
                         <pic:nvPicPr>
-                          <pic:cNvPr descr="/opt/quarto/share/formats/docx/note.png" id="220" name="Picture"/>
+                          <pic:cNvPr descr="/opt/quarto/share/formats/docx/note.png" id="221" name="Picture"/>
                           <pic:cNvPicPr>
                             <a:picLocks noChangeArrowheads="1" noChangeAspect="1"/>
                           </pic:cNvPicPr>
@@ -55663,7 +57539,7 @@
             <w:r>
               <w:t xml:space="preserve"> </w:t>
             </w:r>
-            <w:hyperlink r:id="rId221">
+            <w:hyperlink r:id="rId222">
               <w:r>
                 <w:rPr>
                   <w:rStyle w:val="Hyperlink"/>
@@ -55679,8 +57555,8 @@
         </w:tc>
       </w:tr>
     </w:tbl>
-    <w:bookmarkEnd w:id="222"/>
-    <w:bookmarkStart w:id="226" w:name="thm-loocv-shortcut"/>
+    <w:bookmarkEnd w:id="223"/>
+    <w:bookmarkStart w:id="227" w:name="thm-loocv-shortcut"/>
     <w:p>
       <w:pPr>
         <w:pStyle w:val="BodyText"/>
@@ -55701,7 +57577,7 @@
       <w:r>
         <w:t xml:space="preserve"> </w:t>
       </w:r>
-      <w:hyperlink r:id="rId217">
+      <w:hyperlink r:id="rId218">
         <w:r>
           <w:rPr>
             <w:rStyle w:val="Hyperlink"/>
@@ -55927,7 +57803,7 @@
       <w:pPr>
         <w:pStyle w:val="BodyText"/>
       </w:pPr>
-      <w:bookmarkStart w:id="223" w:name="eq-loocv-shortcut"/>
+      <w:bookmarkStart w:id="224" w:name="eq-loocv-shortcut"/>
       <m:oMathPara>
         <m:oMathParaPr>
           <m:jc m:val="center"/>
@@ -56117,7 +57993,7 @@
           </m:r>
         </m:oMath>
       </m:oMathPara>
-      <w:bookmarkEnd w:id="223"/>
+      <w:bookmarkEnd w:id="224"/>
     </w:p>
     <w:tbl>
       <w:tblPr>
@@ -56160,12 +58036,12 @@
                 <wp:inline>
                   <wp:extent cx="152400" cy="152400"/>
                   <wp:effectExtent b="0" l="0" r="0" t="0"/>
-                  <wp:docPr descr="" title="" id="224" name="Picture"/>
+                  <wp:docPr descr="" title="" id="225" name="Picture"/>
                   <a:graphic>
                     <a:graphicData uri="http://schemas.openxmlformats.org/drawingml/2006/picture">
                       <pic:pic>
                         <pic:nvPicPr>
-                          <pic:cNvPr descr="/opt/quarto/share/formats/docx/note.png" id="225" name="Picture"/>
+                          <pic:cNvPr descr="/opt/quarto/share/formats/docx/note.png" id="226" name="Picture"/>
                           <pic:cNvPicPr>
                             <a:picLocks noChangeArrowheads="1" noChangeAspect="1"/>
                           </pic:cNvPicPr>
@@ -56259,7 +58135,7 @@
         </w:tc>
       </w:tr>
     </w:tbl>
-    <w:bookmarkEnd w:id="226"/>
+    <w:bookmarkEnd w:id="227"/>
     <w:p>
       <w:pPr>
         <w:pStyle w:val="BodyText"/>
@@ -56388,7 +58264,7 @@
         <w:t xml:space="preserve">which this page does not develop.</w:t>
       </w:r>
     </w:p>
-    <w:bookmarkStart w:id="227" w:name="exm-loocv-shortcut"/>
+    <w:bookmarkStart w:id="228" w:name="exm-loocv-shortcut"/>
     <w:p>
       <w:pPr>
         <w:pStyle w:val="BodyText"/>
@@ -57510,12 +59386,12 @@
       <w:r>
         <w:t xml:space="preserve">and because LOOCV is not random (</w:t>
       </w:r>
-      <w:hyperlink w:anchor="sol-loocv">
+      <w:hyperlink w:anchor="lem-loocv-not-random">
         <w:r>
           <w:rPr>
             <w:rStyle w:val="Hyperlink"/>
           </w:rPr>
-          <w:t xml:space="preserve">Solution 11</w:t>
+          <w:t xml:space="preserve">Lemma 1</w:t>
         </w:r>
       </w:hyperlink>
       <w:r>
@@ -57528,8 +59404,8 @@
         <w:t xml:space="preserve">rerunning it always gives the same choice.</w:t>
       </w:r>
     </w:p>
-    <w:bookmarkEnd w:id="227"/>
-    <w:bookmarkStart w:id="228" w:name="rem-loocv"/>
+    <w:bookmarkEnd w:id="228"/>
+    <w:bookmarkStart w:id="229" w:name="rem-loocv"/>
     <w:p>
       <w:pPr>
         <w:pStyle w:val="BodyText"/>
@@ -58001,9 +59877,9 @@
         <w:t xml:space="preserve">fits.</w:t>
       </w:r>
     </w:p>
-    <w:bookmarkEnd w:id="228"/>
     <w:bookmarkEnd w:id="229"/>
-    <w:bookmarkStart w:id="262" w:name="sec-cv-model-choice"/>
+    <w:bookmarkEnd w:id="230"/>
+    <w:bookmarkStart w:id="263" w:name="sec-cv-model-choice"/>
     <w:p>
       <w:pPr>
         <w:pStyle w:val="Heading2"/>
@@ -58012,7 +59888,7 @@
         <w:t xml:space="preserve">8 Choosing a model by cross-validation</w:t>
       </w:r>
     </w:p>
-    <w:bookmarkStart w:id="231" w:name="def-cv-estimate-indexed"/>
+    <w:bookmarkStart w:id="232" w:name="def-cv-estimate-indexed"/>
     <w:p>
       <w:pPr>
         <w:pStyle w:val="FirstParagraph"/>
@@ -58390,7 +60266,7 @@
       <w:pPr>
         <w:pStyle w:val="BodyText"/>
       </w:pPr>
-      <w:bookmarkStart w:id="230" w:name="eq-cv-estimate-indexed"/>
+      <w:bookmarkStart w:id="231" w:name="eq-cv-estimate-indexed"/>
       <m:oMathPara>
         <m:oMathParaPr>
           <m:jc m:val="center"/>
@@ -58796,10 +60672,10 @@
           </m:r>
         </m:oMath>
       </m:oMathPara>
-      <w:bookmarkEnd w:id="230"/>
+      <w:bookmarkEnd w:id="231"/>
     </w:p>
-    <w:bookmarkEnd w:id="231"/>
-    <w:bookmarkStart w:id="233" w:name="def-cv-choice"/>
+    <w:bookmarkEnd w:id="232"/>
+    <w:bookmarkStart w:id="234" w:name="def-cv-choice"/>
     <w:p>
       <w:pPr>
         <w:pStyle w:val="FirstParagraph"/>
@@ -59141,7 +61017,7 @@
       <w:pPr>
         <w:pStyle w:val="BodyText"/>
       </w:pPr>
-      <w:bookmarkStart w:id="232" w:name="eq-cv-choice"/>
+      <w:bookmarkStart w:id="233" w:name="eq-cv-choice"/>
       <m:oMathPara>
         <m:oMathParaPr>
           <m:jc m:val="center"/>
@@ -59425,10 +61301,10 @@
           </m:r>
         </m:oMath>
       </m:oMathPara>
-      <w:bookmarkEnd w:id="232"/>
+      <w:bookmarkEnd w:id="233"/>
     </w:p>
-    <w:bookmarkEnd w:id="233"/>
-    <w:bookmarkStart w:id="237" w:name="def-nested-cv"/>
+    <w:bookmarkEnd w:id="234"/>
+    <w:bookmarkStart w:id="238" w:name="def-nested-cv"/>
     <w:p>
       <w:pPr>
         <w:pStyle w:val="FirstParagraph"/>
@@ -59555,7 +61431,7 @@
       <w:pPr>
         <w:pStyle w:val="BodyText"/>
       </w:pPr>
-      <w:bookmarkStart w:id="234" w:name="eq-nested-cv"/>
+      <w:bookmarkStart w:id="235" w:name="eq-nested-cv"/>
       <m:oMathPara>
         <m:oMathParaPr>
           <m:jc m:val="center"/>
@@ -59682,7 +61558,7 @@
           </m:r>
         </m:oMath>
       </m:oMathPara>
-      <w:bookmarkEnd w:id="234"/>
+      <w:bookmarkEnd w:id="235"/>
     </w:p>
     <w:tbl>
       <w:tblPr>
@@ -59725,12 +61601,12 @@
                 <wp:inline>
                   <wp:extent cx="152400" cy="152400"/>
                   <wp:effectExtent b="0" l="0" r="0" t="0"/>
-                  <wp:docPr descr="" title="" id="235" name="Picture"/>
+                  <wp:docPr descr="" title="" id="236" name="Picture"/>
                   <a:graphic>
                     <a:graphicData uri="http://schemas.openxmlformats.org/drawingml/2006/picture">
                       <pic:pic>
                         <pic:nvPicPr>
-                          <pic:cNvPr descr="/opt/quarto/share/formats/docx/note.png" id="236" name="Picture"/>
+                          <pic:cNvPr descr="/opt/quarto/share/formats/docx/note.png" id="237" name="Picture"/>
                           <pic:cNvPicPr>
                             <a:picLocks noChangeArrowheads="1" noChangeAspect="1"/>
                           </pic:cNvPicPr>
@@ -59812,8 +61688,8 @@
         </w:tc>
       </w:tr>
     </w:tbl>
-    <w:bookmarkEnd w:id="237"/>
-    <w:bookmarkStart w:id="238" w:name="rem-nested-cv"/>
+    <w:bookmarkEnd w:id="238"/>
+    <w:bookmarkStart w:id="239" w:name="rem-nested-cv"/>
     <w:p>
       <w:pPr>
         <w:pStyle w:val="BodyText"/>
@@ -59969,8 +61845,8 @@
         <w:t xml:space="preserve">That inner cross-validation is the nested one.</w:t>
       </w:r>
     </w:p>
-    <w:bookmarkEnd w:id="238"/>
-    <w:bookmarkStart w:id="241" w:name="rem-cv-winner-optimistic"/>
+    <w:bookmarkEnd w:id="239"/>
+    <w:bookmarkStart w:id="242" w:name="rem-cv-winner-optimistic"/>
     <w:p>
       <w:pPr>
         <w:pStyle w:val="BodyText"/>
@@ -60163,12 +62039,12 @@
                 <wp:inline>
                   <wp:extent cx="152400" cy="152400"/>
                   <wp:effectExtent b="0" l="0" r="0" t="0"/>
-                  <wp:docPr descr="" title="" id="239" name="Picture"/>
+                  <wp:docPr descr="" title="" id="240" name="Picture"/>
                   <a:graphic>
                     <a:graphicData uri="http://schemas.openxmlformats.org/drawingml/2006/picture">
                       <pic:pic>
                         <pic:nvPicPr>
-                          <pic:cNvPr descr="/opt/quarto/share/formats/docx/note.png" id="240" name="Picture"/>
+                          <pic:cNvPr descr="/opt/quarto/share/formats/docx/note.png" id="241" name="Picture"/>
                           <pic:cNvPicPr>
                             <a:picLocks noChangeArrowheads="1" noChangeAspect="1"/>
                           </pic:cNvPicPr>
@@ -60238,8 +62114,8 @@
         </w:tc>
       </w:tr>
     </w:tbl>
-    <w:bookmarkEnd w:id="241"/>
-    <w:bookmarkStart w:id="246" w:name="def-cv-se"/>
+    <w:bookmarkEnd w:id="242"/>
+    <w:bookmarkStart w:id="247" w:name="def-cv-se"/>
     <w:p>
       <w:pPr>
         <w:pStyle w:val="BodyText"/>
@@ -60343,7 +62219,7 @@
       <w:r>
         <w:t xml:space="preserve"> </w:t>
       </w:r>
-      <w:hyperlink r:id="rId242">
+      <w:hyperlink r:id="rId243">
         <w:r>
           <w:rPr>
             <w:rStyle w:val="Hyperlink"/>
@@ -60409,7 +62285,7 @@
       <w:pPr>
         <w:pStyle w:val="BodyText"/>
       </w:pPr>
-      <w:bookmarkStart w:id="243" w:name="eq-cv-se"/>
+      <w:bookmarkStart w:id="244" w:name="eq-cv-se"/>
       <m:oMathPara>
         <m:oMathParaPr>
           <m:jc m:val="center"/>
@@ -60584,7 +62460,7 @@
           </m:r>
         </m:oMath>
       </m:oMathPara>
-      <w:bookmarkEnd w:id="243"/>
+      <w:bookmarkEnd w:id="244"/>
     </w:p>
     <w:tbl>
       <w:tblPr>
@@ -60627,12 +62503,12 @@
                 <wp:inline>
                   <wp:extent cx="152400" cy="152400"/>
                   <wp:effectExtent b="0" l="0" r="0" t="0"/>
-                  <wp:docPr descr="" title="" id="244" name="Picture"/>
+                  <wp:docPr descr="" title="" id="245" name="Picture"/>
                   <a:graphic>
                     <a:graphicData uri="http://schemas.openxmlformats.org/drawingml/2006/picture">
                       <pic:pic>
                         <pic:nvPicPr>
-                          <pic:cNvPr descr="/opt/quarto/share/formats/docx/note.png" id="245" name="Picture"/>
+                          <pic:cNvPr descr="/opt/quarto/share/formats/docx/note.png" id="246" name="Picture"/>
                           <pic:cNvPicPr>
                             <a:picLocks noChangeArrowheads="1" noChangeAspect="1"/>
                           </pic:cNvPicPr>
@@ -60705,8 +62581,8 @@
         </w:tc>
       </w:tr>
     </w:tbl>
-    <w:bookmarkEnd w:id="246"/>
-    <w:bookmarkStart w:id="248" w:name="rem-cv-se"/>
+    <w:bookmarkEnd w:id="247"/>
+    <w:bookmarkStart w:id="249" w:name="rem-cv-se"/>
     <w:p>
       <w:pPr>
         <w:pStyle w:val="BodyText"/>
@@ -60929,7 +62805,7 @@
       <w:r>
         <w:t xml:space="preserve"> </w:t>
       </w:r>
-      <w:hyperlink r:id="rId247">
+      <w:hyperlink r:id="rId248">
         <w:r>
           <w:rPr>
             <w:rStyle w:val="Hyperlink"/>
@@ -60993,8 +62869,8 @@
         <w:t xml:space="preserve">.</w:t>
       </w:r>
     </w:p>
-    <w:bookmarkEnd w:id="248"/>
-    <w:bookmarkStart w:id="250" w:name="def-fold-mse-indexed"/>
+    <w:bookmarkEnd w:id="249"/>
+    <w:bookmarkStart w:id="251" w:name="def-fold-mse-indexed"/>
     <w:p>
       <w:pPr>
         <w:pStyle w:val="BodyText"/>
@@ -61172,7 +63048,7 @@
       <w:pPr>
         <w:pStyle w:val="BodyText"/>
       </w:pPr>
-      <w:bookmarkStart w:id="249" w:name="eq-fold-mse-indexed"/>
+      <w:bookmarkStart w:id="250" w:name="eq-fold-mse-indexed"/>
       <m:oMathPara>
         <m:oMathParaPr>
           <m:jc m:val="center"/>
@@ -61559,10 +63435,10 @@
           </m:r>
         </m:oMath>
       </m:oMathPara>
-      <w:bookmarkEnd w:id="249"/>
+      <w:bookmarkEnd w:id="250"/>
     </w:p>
-    <w:bookmarkEnd w:id="250"/>
-    <w:bookmarkStart w:id="252" w:name="def-cv-se-indexed"/>
+    <w:bookmarkEnd w:id="251"/>
+    <w:bookmarkStart w:id="253" w:name="def-cv-se-indexed"/>
     <w:p>
       <w:pPr>
         <w:pStyle w:val="FirstParagraph"/>
@@ -61768,7 +63644,7 @@
       <w:pPr>
         <w:pStyle w:val="BodyText"/>
       </w:pPr>
-      <w:bookmarkStart w:id="251" w:name="eq-cv-se-indexed"/>
+      <w:bookmarkStart w:id="252" w:name="eq-cv-se-indexed"/>
       <m:oMathPara>
         <m:oMathParaPr>
           <m:jc m:val="center"/>
@@ -62066,10 +63942,10 @@
           </m:r>
         </m:oMath>
       </m:oMathPara>
-      <w:bookmarkEnd w:id="251"/>
+      <w:bookmarkEnd w:id="252"/>
     </w:p>
-    <w:bookmarkEnd w:id="252"/>
-    <w:bookmarkStart w:id="256" w:name="def-one-se-rule"/>
+    <w:bookmarkEnd w:id="253"/>
+    <w:bookmarkStart w:id="257" w:name="def-one-se-rule"/>
     <w:p>
       <w:pPr>
         <w:pStyle w:val="FirstParagraph"/>
@@ -62327,7 +64203,7 @@
       <w:pPr>
         <w:pStyle w:val="BodyText"/>
       </w:pPr>
-      <w:bookmarkStart w:id="253" w:name="eq-one-se-rule"/>
+      <w:bookmarkStart w:id="254" w:name="eq-one-se-rule"/>
       <m:oMathPara>
         <m:oMathParaPr>
           <m:jc m:val="center"/>
@@ -62661,7 +64537,7 @@
           </m:r>
         </m:oMath>
       </m:oMathPara>
-      <w:bookmarkEnd w:id="253"/>
+      <w:bookmarkEnd w:id="254"/>
     </w:p>
     <w:tbl>
       <w:tblPr>
@@ -62704,12 +64580,12 @@
                 <wp:inline>
                   <wp:extent cx="152400" cy="152400"/>
                   <wp:effectExtent b="0" l="0" r="0" t="0"/>
-                  <wp:docPr descr="" title="" id="254" name="Picture"/>
+                  <wp:docPr descr="" title="" id="255" name="Picture"/>
                   <a:graphic>
                     <a:graphicData uri="http://schemas.openxmlformats.org/drawingml/2006/picture">
                       <pic:pic>
                         <pic:nvPicPr>
-                          <pic:cNvPr descr="/opt/quarto/share/formats/docx/note.png" id="255" name="Picture"/>
+                          <pic:cNvPr descr="/opt/quarto/share/formats/docx/note.png" id="256" name="Picture"/>
                           <pic:cNvPicPr>
                             <a:picLocks noChangeArrowheads="1" noChangeAspect="1"/>
                           </pic:cNvPicPr>
@@ -62791,8 +64667,8 @@
         </w:tc>
       </w:tr>
     </w:tbl>
-    <w:bookmarkEnd w:id="256"/>
-    <w:bookmarkStart w:id="261" w:name="exm-one-se-rule"/>
+    <w:bookmarkEnd w:id="257"/>
+    <w:bookmarkStart w:id="262" w:name="exm-one-se-rule"/>
     <w:p>
       <w:pPr>
         <w:pStyle w:val="BodyText"/>
@@ -63864,7 +65740,7 @@
       <w:tr>
         <w:tc>
           <w:tcPr/>
-          <w:bookmarkStart w:id="260" w:name="fig-one-se-rule"/>
+          <w:bookmarkStart w:id="261" w:name="fig-one-se-rule"/>
           <w:p>
             <w:pPr>
               <w:pStyle w:val="SourceCode"/>
@@ -64477,18 +66353,18 @@
                 <wp:inline>
                   <wp:extent cx="4620126" cy="3696101"/>
                   <wp:effectExtent b="0" l="0" r="0" t="0"/>
-                  <wp:docPr descr="" title="" id="258" name="Picture"/>
+                  <wp:docPr descr="" title="" id="259" name="Picture"/>
                   <a:graphic>
                     <a:graphicData uri="http://schemas.openxmlformats.org/drawingml/2006/picture">
                       <pic:pic>
                         <pic:nvPicPr>
-                          <pic:cNvPr descr="model-validation_files/figure-docx/one-se-rule-plot-1.png" id="259" name="Picture"/>
+                          <pic:cNvPr descr="model-validation_files/figure-docx/one-se-rule-plot-1.png" id="260" name="Picture"/>
                           <pic:cNvPicPr>
                             <a:picLocks noChangeArrowheads="1" noChangeAspect="1"/>
                           </pic:cNvPicPr>
                         </pic:nvPicPr>
                         <pic:blipFill>
-                          <a:blip r:embed="rId257"/>
+                          <a:blip r:embed="rId258"/>
                           <a:stretch>
                             <a:fillRect/>
                           </a:stretch>
@@ -64568,7 +66444,7 @@
               <w:t xml:space="preserve">The dashed line is one fold-based standard error above the smallest estimate.</w:t>
             </w:r>
           </w:p>
-          <w:bookmarkEnd w:id="260"/>
+          <w:bookmarkEnd w:id="261"/>
         </w:tc>
       </w:tr>
     </w:tbl>
@@ -64657,9 +66533,9 @@
         <w:t xml:space="preserve">and 0.315 for degree 3.</w:t>
       </w:r>
     </w:p>
-    <w:bookmarkEnd w:id="261"/>
     <w:bookmarkEnd w:id="262"/>
-    <w:bookmarkStart w:id="269" w:name="sec-cv-whole-procedure"/>
+    <w:bookmarkEnd w:id="263"/>
+    <w:bookmarkStart w:id="270" w:name="sec-cv-whole-procedure"/>
     <w:p>
       <w:pPr>
         <w:pStyle w:val="Heading2"/>
@@ -64668,7 +66544,7 @@
         <w:t xml:space="preserve">9 Cross-validating the whole procedure</w:t>
       </w:r>
     </w:p>
-    <w:bookmarkStart w:id="265" w:name="exr-cv-screening"/>
+    <w:bookmarkStart w:id="266" w:name="exr-cv-screening"/>
     <w:p>
       <w:pPr>
         <w:pStyle w:val="FirstParagraph"/>
@@ -64776,64 +66652,6 @@
       </w:pPr>
       <w:r>
         <w:t xml:space="preserve">An analyst</w:t>
-      </w:r>
-    </w:p>
-    <w:p>
-      <w:pPr>
-        <w:pStyle w:val="Compact"/>
-        <w:numPr>
-          <w:ilvl w:val="0"/>
-          <w:numId w:val="1015"/>
-        </w:numPr>
-      </w:pPr>
-      <w:r>
-        <w:t xml:space="preserve">picks the 10 predictors most correlated with</w:t>
-      </w:r>
-      <w:r>
-        <w:t xml:space="preserve"> </w:t>
-      </w:r>
-      <m:oMath>
-        <m:r>
-          <m:t>Y</m:t>
-        </m:r>
-      </m:oMath>
-      <w:r>
-        <w:t xml:space="preserve"> </w:t>
-      </w:r>
-      <w:r>
-        <w:t xml:space="preserve">in all 50 observations,</w:t>
-      </w:r>
-      <w:r>
-        <w:t xml:space="preserve"> </w:t>
-      </w:r>
-      <w:r>
-        <w:t xml:space="preserve">then</w:t>
-      </w:r>
-    </w:p>
-    <w:p>
-      <w:pPr>
-        <w:pStyle w:val="Compact"/>
-        <w:numPr>
-          <w:ilvl w:val="0"/>
-          <w:numId w:val="1015"/>
-        </w:numPr>
-      </w:pPr>
-      <w:r>
-        <w:t xml:space="preserve">estimates the prediction error of a linear model in those 10 predictors</w:t>
-      </w:r>
-      <w:r>
-        <w:t xml:space="preserve"> </w:t>
-      </w:r>
-      <w:r>
-        <w:t xml:space="preserve">by 5-fold cross-validation.</w:t>
-      </w:r>
-    </w:p>
-    <w:p>
-      <w:pPr>
-        <w:pStyle w:val="FirstParagraph"/>
-      </w:pPr>
-      <w:r>
-        <w:t xml:space="preserve">Answer the following:</w:t>
       </w:r>
     </w:p>
     <w:p>
@@ -64845,24 +66663,7 @@
         </w:numPr>
       </w:pPr>
       <w:r>
-        <w:t xml:space="preserve">What is the smallest possible generalization error (</w:t>
-      </w:r>
-      <w:hyperlink w:anchor="eq-generalization-error">
-        <w:r>
-          <w:rPr>
-            <w:rStyle w:val="Hyperlink"/>
-          </w:rPr>
-          <w:t xml:space="preserve">Equation 7</w:t>
-        </w:r>
-      </w:hyperlink>
-      <w:r>
-        <w:t xml:space="preserve">)</w:t>
-      </w:r>
-      <w:r>
-        <w:t xml:space="preserve"> </w:t>
-      </w:r>
-      <w:r>
-        <w:t xml:space="preserve">of any prediction rule for</w:t>
+        <w:t xml:space="preserve">picks the 10 predictors most correlated with</w:t>
       </w:r>
       <w:r>
         <w:t xml:space="preserve"> </w:t>
@@ -64876,7 +66677,13 @@
         <w:t xml:space="preserve"> </w:t>
       </w:r>
       <w:r>
-        <w:t xml:space="preserve">here?</w:t>
+        <w:t xml:space="preserve">in all 50 observations,</w:t>
+      </w:r>
+      <w:r>
+        <w:t xml:space="preserve"> </w:t>
+      </w:r>
+      <w:r>
+        <w:t xml:space="preserve">then</w:t>
       </w:r>
     </w:p>
     <w:p>
@@ -64888,13 +66695,21 @@
         </w:numPr>
       </w:pPr>
       <w:r>
-        <w:t xml:space="preserve">Simulate the analyst’s procedure.</w:t>
-      </w:r>
-      <w:r>
-        <w:t xml:space="preserve"> </w:t>
-      </w:r>
-      <w:r>
-        <w:t xml:space="preserve">What cross-validation estimate does it report?</w:t>
+        <w:t xml:space="preserve">estimates the prediction error of a linear model in those 10 predictors</w:t>
+      </w:r>
+      <w:r>
+        <w:t xml:space="preserve"> </w:t>
+      </w:r>
+      <w:r>
+        <w:t xml:space="preserve">by 5-fold cross-validation.</w:t>
+      </w:r>
+    </w:p>
+    <w:p>
+      <w:pPr>
+        <w:pStyle w:val="FirstParagraph"/>
+      </w:pPr>
+      <w:r>
+        <w:t xml:space="preserve">Answer the following:</w:t>
       </w:r>
     </w:p>
     <w:p>
@@ -64902,7 +66717,68 @@
         <w:pStyle w:val="Compact"/>
         <w:numPr>
           <w:ilvl w:val="0"/>
-          <w:numId w:val="1016"/>
+          <w:numId w:val="1017"/>
+        </w:numPr>
+      </w:pPr>
+      <w:r>
+        <w:t xml:space="preserve">What is the smallest possible generalization error (</w:t>
+      </w:r>
+      <w:hyperlink w:anchor="eq-generalization-error">
+        <w:r>
+          <w:rPr>
+            <w:rStyle w:val="Hyperlink"/>
+          </w:rPr>
+          <w:t xml:space="preserve">Equation 7</w:t>
+        </w:r>
+      </w:hyperlink>
+      <w:r>
+        <w:t xml:space="preserve">)</w:t>
+      </w:r>
+      <w:r>
+        <w:t xml:space="preserve"> </w:t>
+      </w:r>
+      <w:r>
+        <w:t xml:space="preserve">of any prediction rule for</w:t>
+      </w:r>
+      <w:r>
+        <w:t xml:space="preserve"> </w:t>
+      </w:r>
+      <m:oMath>
+        <m:r>
+          <m:t>Y</m:t>
+        </m:r>
+      </m:oMath>
+      <w:r>
+        <w:t xml:space="preserve"> </w:t>
+      </w:r>
+      <w:r>
+        <w:t xml:space="preserve">here?</w:t>
+      </w:r>
+    </w:p>
+    <w:p>
+      <w:pPr>
+        <w:pStyle w:val="Compact"/>
+        <w:numPr>
+          <w:ilvl w:val="0"/>
+          <w:numId w:val="1017"/>
+        </w:numPr>
+      </w:pPr>
+      <w:r>
+        <w:t xml:space="preserve">Simulate the analyst’s procedure.</w:t>
+      </w:r>
+      <w:r>
+        <w:t xml:space="preserve"> </w:t>
+      </w:r>
+      <w:r>
+        <w:t xml:space="preserve">What cross-validation estimate does it report?</w:t>
+      </w:r>
+    </w:p>
+    <w:p>
+      <w:pPr>
+        <w:pStyle w:val="Compact"/>
+        <w:numPr>
+          <w:ilvl w:val="0"/>
+          <w:numId w:val="1017"/>
         </w:numPr>
       </w:pPr>
       <w:r>
@@ -64968,12 +66844,12 @@
                 <wp:inline>
                   <wp:extent cx="152400" cy="152400"/>
                   <wp:effectExtent b="0" l="0" r="0" t="0"/>
-                  <wp:docPr descr="" title="" id="263" name="Picture"/>
+                  <wp:docPr descr="" title="" id="264" name="Picture"/>
                   <a:graphic>
                     <a:graphicData uri="http://schemas.openxmlformats.org/drawingml/2006/picture">
                       <pic:pic>
                         <pic:nvPicPr>
-                          <pic:cNvPr descr="/opt/quarto/share/formats/docx/note.png" id="264" name="Picture"/>
+                          <pic:cNvPr descr="/opt/quarto/share/formats/docx/note.png" id="265" name="Picture"/>
                           <pic:cNvPicPr>
                             <a:picLocks noChangeArrowheads="1" noChangeAspect="1"/>
                           </pic:cNvPicPr>
@@ -65061,8 +66937,8 @@
         </w:tc>
       </w:tr>
     </w:tbl>
-    <w:bookmarkEnd w:id="265"/>
-    <w:bookmarkStart w:id="266" w:name="sol-cv-screening"/>
+    <w:bookmarkEnd w:id="266"/>
+    <w:bookmarkStart w:id="267" w:name="sol-cv-screening"/>
     <w:p>
       <w:pPr>
         <w:pStyle w:val="BodyText"/>
@@ -65082,7 +66958,7 @@
       <w:pPr>
         <w:numPr>
           <w:ilvl w:val="0"/>
-          <w:numId w:val="1017"/>
+          <w:numId w:val="1018"/>
         </w:numPr>
       </w:pPr>
       <m:oMath>
@@ -65173,7 +67049,7 @@
       <w:pPr>
         <w:numPr>
           <w:ilvl w:val="0"/>
-          <w:numId w:val="1017"/>
+          <w:numId w:val="1018"/>
         </w:numPr>
       </w:pPr>
       <w:r>
@@ -66850,191 +68726,6 @@
       </w:pPr>
       <w:r>
         <w:t xml:space="preserve">Averaged over 50 simulated data sets:</w:t>
-      </w:r>
-    </w:p>
-    <w:p>
-      <w:pPr>
-        <w:pStyle w:val="Compact"/>
-        <w:numPr>
-          <w:ilvl w:val="0"/>
-          <w:numId w:val="1018"/>
-        </w:numPr>
-      </w:pPr>
-      <w:r>
-        <w:t xml:space="preserve">Screening outside the folds gives a mean CV estimate of</w:t>
-      </w:r>
-      <w:r>
-        <w:t xml:space="preserve"> </w:t>
-      </w:r>
-      <w:r>
-        <w:t xml:space="preserve">0.54,</w:t>
-      </w:r>
-      <w:r>
-        <w:t xml:space="preserve"> </w:t>
-      </w:r>
-      <w:r>
-        <w:t xml:space="preserve">well below the smallest possible generalization error of 1.</w:t>
-      </w:r>
-      <w:r>
-        <w:t xml:space="preserve"> </w:t>
-      </w:r>
-      <w:r>
-        <w:t xml:space="preserve">The procedure reports that pure noise predicts</w:t>
-      </w:r>
-      <w:r>
-        <w:t xml:space="preserve"> </w:t>
-      </w:r>
-      <m:oMath>
-        <m:r>
-          <m:t>Y</m:t>
-        </m:r>
-      </m:oMath>
-      <w:r>
-        <w:t xml:space="preserve">.</w:t>
-      </w:r>
-    </w:p>
-    <w:p>
-      <w:pPr>
-        <w:pStyle w:val="Compact"/>
-        <w:numPr>
-          <w:ilvl w:val="0"/>
-          <w:numId w:val="1018"/>
-        </w:numPr>
-      </w:pPr>
-      <w:r>
-        <w:t xml:space="preserve">Screening inside the folds gives</w:t>
-      </w:r>
-      <w:r>
-        <w:t xml:space="preserve"> </w:t>
-      </w:r>
-      <w:r>
-        <w:t xml:space="preserve">1.52,</w:t>
-      </w:r>
-      <w:r>
-        <w:t xml:space="preserve"> </w:t>
-      </w:r>
-      <w:r>
-        <w:t xml:space="preserve">above 1, as an honest estimate for a rule built from noise should be.</w:t>
-      </w:r>
-    </w:p>
-    <w:p>
-      <w:pPr>
-        <w:pStyle w:val="FirstParagraph"/>
-      </w:pPr>
-      <w:r>
-        <w:t xml:space="preserve">The 10 predictors chosen from all 50 observations</w:t>
-      </w:r>
-      <w:r>
-        <w:t xml:space="preserve"> </w:t>
-      </w:r>
-      <w:r>
-        <w:t xml:space="preserve">were chosen</w:t>
-      </w:r>
-      <w:r>
-        <w:t xml:space="preserve"> </w:t>
-      </w:r>
-      <w:r>
-        <w:rPr>
-          <w:i/>
-          <w:iCs/>
-        </w:rPr>
-        <w:t xml:space="preserve">because</w:t>
-      </w:r>
-      <w:r>
-        <w:t xml:space="preserve"> </w:t>
-      </w:r>
-      <w:r>
-        <w:t xml:space="preserve">they happen to correlate with</w:t>
-      </w:r>
-      <w:r>
-        <w:t xml:space="preserve"> </w:t>
-      </w:r>
-      <m:oMath>
-        <m:r>
-          <m:t>Y</m:t>
-        </m:r>
-      </m:oMath>
-      <w:r>
-        <w:t xml:space="preserve"> </w:t>
-      </w:r>
-      <w:r>
-        <w:t xml:space="preserve">in the very observations that later serve as held-out folds.</w:t>
-      </w:r>
-      <w:r>
-        <w:t xml:space="preserve"> </w:t>
-      </w:r>
-      <w:r>
-        <w:t xml:space="preserve">Those observations were not held out from the whole fitting procedure,</w:t>
-      </w:r>
-      <w:r>
-        <w:t xml:space="preserve"> </w:t>
-      </w:r>
-      <w:r>
-        <w:t xml:space="preserve">so the independence that</w:t>
-      </w:r>
-      <w:r>
-        <w:t xml:space="preserve"> </w:t>
-      </w:r>
-      <w:hyperlink w:anchor="thm-held-out-unbiased">
-        <w:r>
-          <w:rPr>
-            <w:rStyle w:val="Hyperlink"/>
-          </w:rPr>
-          <w:t xml:space="preserve">Theorem 3</w:t>
-        </w:r>
-      </w:hyperlink>
-      <w:r>
-        <w:t xml:space="preserve"> </w:t>
-      </w:r>
-      <w:r>
-        <w:t xml:space="preserve">needs fails.</w:t>
-      </w:r>
-    </w:p>
-    <w:bookmarkEnd w:id="266"/>
-    <w:bookmarkStart w:id="268" w:name="rem-cv-every-step"/>
-    <w:p>
-      <w:pPr>
-        <w:pStyle w:val="BodyText"/>
-      </w:pPr>
-      <w:r>
-        <w:rPr>
-          <w:i/>
-          <w:iCs/>
-        </w:rPr>
-        <w:t xml:space="preserve">Remark 17</w:t>
-      </w:r>
-      <w:r>
-        <w:t xml:space="preserve"> (Cross-validate the whole procedure). </w:t>
-      </w:r>
-      <w:r>
-        <w:t xml:space="preserve">Every step that uses the outcome is part of fitting,</w:t>
-      </w:r>
-      <w:r>
-        <w:t xml:space="preserve"> </w:t>
-      </w:r>
-      <w:r>
-        <w:t xml:space="preserve">and must be repeated inside each fold</w:t>
-      </w:r>
-      <w:r>
-        <w:t xml:space="preserve"> </w:t>
-      </w:r>
-      <w:r>
-        <w:t xml:space="preserve">using only that fold’s training observations</w:t>
-      </w:r>
-      <w:r>
-        <w:t xml:space="preserve"> </w:t>
-      </w:r>
-      <w:r>
-        <w:t xml:space="preserve">(Hastie et al. 2009, sec. 7.10.2)</w:t>
-      </w:r>
-      <w:r>
-        <w:t xml:space="preserve">.</w:t>
-      </w:r>
-      <w:r>
-        <w:t xml:space="preserve"> </w:t>
-      </w:r>
-      <w:r>
-        <w:t xml:space="preserve">Such steps include:</w:t>
       </w:r>
     </w:p>
     <w:p>
@@ -67046,21 +68737,36 @@
         </w:numPr>
       </w:pPr>
       <w:r>
-        <w:t xml:space="preserve">screening or selecting predictors, as in</w:t>
-      </w:r>
-      <w:r>
-        <w:t xml:space="preserve"> </w:t>
-      </w:r>
-      <w:hyperlink w:anchor="exr-cv-screening">
-        <w:r>
-          <w:rPr>
-            <w:rStyle w:val="Hyperlink"/>
-          </w:rPr>
-          <w:t xml:space="preserve">Exercise 12</w:t>
-        </w:r>
-      </w:hyperlink>
-      <w:r>
-        <w:t xml:space="preserve">;</w:t>
+        <w:t xml:space="preserve">Screening outside the folds gives a mean CV estimate of</w:t>
+      </w:r>
+      <w:r>
+        <w:t xml:space="preserve"> </w:t>
+      </w:r>
+      <w:r>
+        <w:t xml:space="preserve">0.54,</w:t>
+      </w:r>
+      <w:r>
+        <w:t xml:space="preserve"> </w:t>
+      </w:r>
+      <w:r>
+        <w:t xml:space="preserve">well below the smallest possible generalization error of 1.</w:t>
+      </w:r>
+      <w:r>
+        <w:t xml:space="preserve"> </w:t>
+      </w:r>
+      <w:r>
+        <w:t xml:space="preserve">The procedure reports that pure noise predicts</w:t>
+      </w:r>
+      <w:r>
+        <w:t xml:space="preserve"> </w:t>
+      </w:r>
+      <m:oMath>
+        <m:r>
+          <m:t>Y</m:t>
+        </m:r>
+      </m:oMath>
+      <w:r>
+        <w:t xml:space="preserve">.</w:t>
       </w:r>
     </w:p>
     <w:p>
@@ -67072,7 +68778,139 @@
         </w:numPr>
       </w:pPr>
       <w:r>
-        <w:t xml:space="preserve">choosing transformations or a polynomial degree;</w:t>
+        <w:t xml:space="preserve">Screening inside the folds gives</w:t>
+      </w:r>
+      <w:r>
+        <w:t xml:space="preserve"> </w:t>
+      </w:r>
+      <w:r>
+        <w:t xml:space="preserve">1.52,</w:t>
+      </w:r>
+      <w:r>
+        <w:t xml:space="preserve"> </w:t>
+      </w:r>
+      <w:r>
+        <w:t xml:space="preserve">above 1, as an honest estimate for a rule built from noise should be.</w:t>
+      </w:r>
+    </w:p>
+    <w:p>
+      <w:pPr>
+        <w:pStyle w:val="FirstParagraph"/>
+      </w:pPr>
+      <w:r>
+        <w:t xml:space="preserve">The 10 predictors chosen from all 50 observations</w:t>
+      </w:r>
+      <w:r>
+        <w:t xml:space="preserve"> </w:t>
+      </w:r>
+      <w:r>
+        <w:t xml:space="preserve">were chosen</w:t>
+      </w:r>
+      <w:r>
+        <w:t xml:space="preserve"> </w:t>
+      </w:r>
+      <w:r>
+        <w:rPr>
+          <w:i/>
+          <w:iCs/>
+        </w:rPr>
+        <w:t xml:space="preserve">because</w:t>
+      </w:r>
+      <w:r>
+        <w:t xml:space="preserve"> </w:t>
+      </w:r>
+      <w:r>
+        <w:t xml:space="preserve">they happen to correlate with</w:t>
+      </w:r>
+      <w:r>
+        <w:t xml:space="preserve"> </w:t>
+      </w:r>
+      <m:oMath>
+        <m:r>
+          <m:t>Y</m:t>
+        </m:r>
+      </m:oMath>
+      <w:r>
+        <w:t xml:space="preserve"> </w:t>
+      </w:r>
+      <w:r>
+        <w:t xml:space="preserve">in the very observations that later serve as held-out folds.</w:t>
+      </w:r>
+      <w:r>
+        <w:t xml:space="preserve"> </w:t>
+      </w:r>
+      <w:r>
+        <w:t xml:space="preserve">Those observations were not held out from the whole fitting procedure,</w:t>
+      </w:r>
+      <w:r>
+        <w:t xml:space="preserve"> </w:t>
+      </w:r>
+      <w:r>
+        <w:t xml:space="preserve">so the independence that</w:t>
+      </w:r>
+      <w:r>
+        <w:t xml:space="preserve"> </w:t>
+      </w:r>
+      <w:hyperlink w:anchor="thm-held-out-unbiased">
+        <w:r>
+          <w:rPr>
+            <w:rStyle w:val="Hyperlink"/>
+          </w:rPr>
+          <w:t xml:space="preserve">Theorem 3</w:t>
+        </w:r>
+      </w:hyperlink>
+      <w:r>
+        <w:t xml:space="preserve"> </w:t>
+      </w:r>
+      <w:r>
+        <w:t xml:space="preserve">needs fails.</w:t>
+      </w:r>
+    </w:p>
+    <w:bookmarkEnd w:id="267"/>
+    <w:bookmarkStart w:id="269" w:name="rem-cv-every-step"/>
+    <w:p>
+      <w:pPr>
+        <w:pStyle w:val="BodyText"/>
+      </w:pPr>
+      <w:r>
+        <w:rPr>
+          <w:i/>
+          <w:iCs/>
+        </w:rPr>
+        <w:t xml:space="preserve">Remark 17</w:t>
+      </w:r>
+      <w:r>
+        <w:t xml:space="preserve"> (Cross-validate the whole procedure). </w:t>
+      </w:r>
+      <w:r>
+        <w:t xml:space="preserve">Every step that uses the outcome is part of fitting,</w:t>
+      </w:r>
+      <w:r>
+        <w:t xml:space="preserve"> </w:t>
+      </w:r>
+      <w:r>
+        <w:t xml:space="preserve">and must be repeated inside each fold</w:t>
+      </w:r>
+      <w:r>
+        <w:t xml:space="preserve"> </w:t>
+      </w:r>
+      <w:r>
+        <w:t xml:space="preserve">using only that fold’s training observations</w:t>
+      </w:r>
+      <w:r>
+        <w:t xml:space="preserve"> </w:t>
+      </w:r>
+      <w:r>
+        <w:t xml:space="preserve">(Hastie et al. 2009, sec. 7.10.2)</w:t>
+      </w:r>
+      <w:r>
+        <w:t xml:space="preserve">.</w:t>
+      </w:r>
+      <w:r>
+        <w:t xml:space="preserve"> </w:t>
+      </w:r>
+      <w:r>
+        <w:t xml:space="preserve">Such steps include:</w:t>
       </w:r>
     </w:p>
     <w:p>
@@ -67080,7 +68918,45 @@
         <w:pStyle w:val="Compact"/>
         <w:numPr>
           <w:ilvl w:val="0"/>
-          <w:numId w:val="1019"/>
+          <w:numId w:val="1020"/>
+        </w:numPr>
+      </w:pPr>
+      <w:r>
+        <w:t xml:space="preserve">screening or selecting predictors, as in</w:t>
+      </w:r>
+      <w:r>
+        <w:t xml:space="preserve"> </w:t>
+      </w:r>
+      <w:hyperlink w:anchor="exr-cv-screening">
+        <w:r>
+          <w:rPr>
+            <w:rStyle w:val="Hyperlink"/>
+          </w:rPr>
+          <w:t xml:space="preserve">Exercise 12</w:t>
+        </w:r>
+      </w:hyperlink>
+      <w:r>
+        <w:t xml:space="preserve">;</w:t>
+      </w:r>
+    </w:p>
+    <w:p>
+      <w:pPr>
+        <w:pStyle w:val="Compact"/>
+        <w:numPr>
+          <w:ilvl w:val="0"/>
+          <w:numId w:val="1020"/>
+        </w:numPr>
+      </w:pPr>
+      <w:r>
+        <w:t xml:space="preserve">choosing transformations or a polynomial degree;</w:t>
+      </w:r>
+    </w:p>
+    <w:p>
+      <w:pPr>
+        <w:pStyle w:val="Compact"/>
+        <w:numPr>
+          <w:ilvl w:val="0"/>
+          <w:numId w:val="1020"/>
         </w:numPr>
       </w:pPr>
       <w:r>
@@ -67147,7 +69023,7 @@
       <w:r>
         <w:t xml:space="preserve"> </w:t>
       </w:r>
-      <w:hyperlink r:id="rId267">
+      <w:hyperlink r:id="rId268">
         <w:r>
           <w:rPr>
             <w:rStyle w:val="Hyperlink"/>
@@ -67171,9 +69047,9 @@
         <w:t xml:space="preserve">when they are computed without the outcome.</w:t>
       </w:r>
     </w:p>
-    <w:bookmarkEnd w:id="268"/>
     <w:bookmarkEnd w:id="269"/>
-    <w:bookmarkStart w:id="270" w:name="further-reading"/>
+    <w:bookmarkEnd w:id="270"/>
+    <w:bookmarkStart w:id="271" w:name="further-reading"/>
     <w:p>
       <w:pPr>
         <w:pStyle w:val="Heading2"/>
@@ -67202,8 +69078,8 @@
         <w:t xml:space="preserve">including the covariance and correlation matrices that cross-products produce.</w:t>
       </w:r>
     </w:p>
-    <w:bookmarkEnd w:id="270"/>
-    <w:bookmarkStart w:id="278" w:name="references"/>
+    <w:bookmarkEnd w:id="271"/>
+    <w:bookmarkStart w:id="279" w:name="references"/>
     <w:p>
       <w:pPr>
         <w:pStyle w:val="Heading2"/>
@@ -67212,8 +69088,8 @@
         <w:t xml:space="preserve">References</w:t>
       </w:r>
     </w:p>
-    <w:bookmarkStart w:id="277" w:name="refs"/>
-    <w:bookmarkStart w:id="272" w:name="ref-hastie2009elements"/>
+    <w:bookmarkStart w:id="278" w:name="refs"/>
+    <w:bookmarkStart w:id="273" w:name="ref-hastie2009elements"/>
     <w:p>
       <w:pPr>
         <w:pStyle w:val="Bibliography"/>
@@ -67237,7 +69113,7 @@
       <w:r>
         <w:t xml:space="preserve"> </w:t>
       </w:r>
-      <w:hyperlink r:id="rId271">
+      <w:hyperlink r:id="rId272">
         <w:r>
           <w:rPr>
             <w:rStyle w:val="Hyperlink"/>
@@ -67249,8 +69125,8 @@
         <w:t xml:space="preserve">.</w:t>
       </w:r>
     </w:p>
-    <w:bookmarkEnd w:id="272"/>
-    <w:bookmarkStart w:id="274" w:name="ref-james2021islr2e"/>
+    <w:bookmarkEnd w:id="273"/>
+    <w:bookmarkStart w:id="275" w:name="ref-james2021islr2e"/>
     <w:p>
       <w:pPr>
         <w:pStyle w:val="Bibliography"/>
@@ -67288,7 +69164,7 @@
       <w:r>
         <w:t xml:space="preserve"> </w:t>
       </w:r>
-      <w:hyperlink r:id="rId273">
+      <w:hyperlink r:id="rId274">
         <w:r>
           <w:rPr>
             <w:rStyle w:val="Hyperlink"/>
@@ -67300,8 +69176,8 @@
         <w:t xml:space="preserve">.</w:t>
       </w:r>
     </w:p>
-    <w:bookmarkEnd w:id="274"/>
-    <w:bookmarkStart w:id="276" w:name="ref-sanchez2020matrix4sl"/>
+    <w:bookmarkEnd w:id="275"/>
+    <w:bookmarkStart w:id="277" w:name="ref-sanchez2020matrix4sl"/>
     <w:p>
       <w:pPr>
         <w:pStyle w:val="Bibliography"/>
@@ -67339,7 +69215,7 @@
       <w:r>
         <w:t xml:space="preserve"> </w:t>
       </w:r>
-      <w:hyperlink r:id="rId275">
+      <w:hyperlink r:id="rId276">
         <w:r>
           <w:rPr>
             <w:rStyle w:val="Hyperlink"/>
@@ -67351,9 +69227,9 @@
         <w:t xml:space="preserve">.</w:t>
       </w:r>
     </w:p>
-    <w:bookmarkEnd w:id="276"/>
     <w:bookmarkEnd w:id="277"/>
     <w:bookmarkEnd w:id="278"/>
+    <w:bookmarkEnd w:id="279"/>
     <w:sectPr>
       <w:footnotePr>
         <w:numRestart w:val="eachSect"/>
@@ -68085,9 +69961,39 @@
     </w:lvlOverride>
   </w:num>
   <w:num w:numId="1018">
+    <w:abstractNumId w:val="99411"/>
+    <w:lvlOverride w:ilvl="0">
+      <w:startOverride w:val="1"/>
+    </w:lvlOverride>
+    <w:lvlOverride w:ilvl="1">
+      <w:startOverride w:val="1"/>
+    </w:lvlOverride>
+    <w:lvlOverride w:ilvl="2">
+      <w:startOverride w:val="1"/>
+    </w:lvlOverride>
+    <w:lvlOverride w:ilvl="3">
+      <w:startOverride w:val="1"/>
+    </w:lvlOverride>
+    <w:lvlOverride w:ilvl="4">
+      <w:startOverride w:val="1"/>
+    </w:lvlOverride>
+    <w:lvlOverride w:ilvl="5">
+      <w:startOverride w:val="1"/>
+    </w:lvlOverride>
+    <w:lvlOverride w:ilvl="6">
+      <w:startOverride w:val="1"/>
+    </w:lvlOverride>
+    <w:lvlOverride w:ilvl="7">
+      <w:startOverride w:val="1"/>
+    </w:lvlOverride>
+    <w:lvlOverride w:ilvl="8">
+      <w:startOverride w:val="1"/>
+    </w:lvlOverride>
+  </w:num>
+  <w:num w:numId="1019">
     <w:abstractNumId w:val="991"/>
   </w:num>
-  <w:num w:numId="1019">
+  <w:num w:numId="1020">
     <w:abstractNumId w:val="991"/>
   </w:num>
 </w:numbering>

</xml_diff>

<commit_message>
Deploying to gh-pages from @ Morrison-Lab/sds@bdf080e7a3a4e1837180c2fb88b4b8b20a73513a 🚀
</commit_message>
<xml_diff>
--- a/model-validation-handout.docx
+++ b/model-validation-handout.docx
@@ -15,7 +15,7 @@
         <w:pStyle w:val="Date"/>
       </w:pPr>
       <w:r>
-        <w:t xml:space="preserve">Last modified: 2026-10-15 13:51:57 (PDT)</w:t>
+        <w:t xml:space="preserve">Last modified: 2026-10-15 14:34:20 (PDT)</w:t>
       </w:r>
     </w:p>
     <w:bookmarkStart w:id="17" w:name="sec-data-sets"/>
@@ -40255,19 +40255,23 @@
           <m:t>κ</m:t>
         </m:r>
         <m:r>
-          <m:rPr>
-            <m:sty m:val="p"/>
-          </m:rPr>
-          <m:t>(</m:t>
-        </m:r>
-        <m:r>
-          <m:t>i</m:t>
-        </m:r>
-        <m:r>
-          <m:rPr>
-            <m:sty m:val="p"/>
-          </m:rPr>
-          <m:t>)</m:t>
+          <m:t>​</m:t>
+        </m:r>
+        <m:d>
+          <m:dPr>
+            <m:begChr m:val="("/>
+            <m:sepChr m:val=""/>
+            <m:endChr m:val=")"/>
+            <m:grow/>
+          </m:dPr>
+          <m:e>
+            <m:r>
+              <m:t>i</m:t>
+            </m:r>
+          </m:e>
+        </m:d>
+        <m:r>
+          <m:t>​</m:t>
         </m:r>
       </m:oMath>
       <w:r>
@@ -40325,19 +40329,23 @@
                 <m:t>κ</m:t>
               </m:r>
               <m:r>
-                <m:rPr>
-                  <m:sty m:val="p"/>
-                </m:rPr>
-                <m:t>(</m:t>
-              </m:r>
-              <m:r>
-                <m:t>i</m:t>
-              </m:r>
-              <m:r>
-                <m:rPr>
-                  <m:sty m:val="p"/>
-                </m:rPr>
-                <m:t>)</m:t>
+                <m:t>​</m:t>
+              </m:r>
+              <m:d>
+                <m:dPr>
+                  <m:begChr m:val="("/>
+                  <m:sepChr m:val=""/>
+                  <m:endChr m:val=")"/>
+                  <m:grow/>
+                </m:dPr>
+                <m:e>
+                  <m:r>
+                    <m:t>i</m:t>
+                  </m:r>
+                </m:e>
+              </m:d>
+              <m:r>
+                <m:t>​</m:t>
               </m:r>
             </m:sub>
           </m:sSub>
@@ -40396,19 +40404,23 @@
           <m:t>κ</m:t>
         </m:r>
         <m:r>
-          <m:rPr>
-            <m:sty m:val="p"/>
-          </m:rPr>
-          <m:t>(</m:t>
-        </m:r>
-        <m:r>
-          <m:t>i</m:t>
-        </m:r>
-        <m:r>
-          <m:rPr>
-            <m:sty m:val="p"/>
-          </m:rPr>
-          <m:t>)</m:t>
+          <m:t>​</m:t>
+        </m:r>
+        <m:d>
+          <m:dPr>
+            <m:begChr m:val="("/>
+            <m:sepChr m:val=""/>
+            <m:endChr m:val=")"/>
+            <m:grow/>
+          </m:dPr>
+          <m:e>
+            <m:r>
+              <m:t>i</m:t>
+            </m:r>
+          </m:e>
+        </m:d>
+        <m:r>
+          <m:t>​</m:t>
         </m:r>
       </m:oMath>
       <w:r>
@@ -41547,19 +41559,23 @@
           <m:t>κ</m:t>
         </m:r>
         <m:r>
-          <m:rPr>
-            <m:sty m:val="p"/>
-          </m:rPr>
-          <m:t>(</m:t>
-        </m:r>
-        <m:r>
-          <m:t>i</m:t>
-        </m:r>
-        <m:r>
-          <m:rPr>
-            <m:sty m:val="p"/>
-          </m:rPr>
-          <m:t>)</m:t>
+          <m:t>​</m:t>
+        </m:r>
+        <m:d>
+          <m:dPr>
+            <m:begChr m:val="("/>
+            <m:sepChr m:val=""/>
+            <m:endChr m:val=")"/>
+            <m:grow/>
+          </m:dPr>
+          <m:e>
+            <m:r>
+              <m:t>i</m:t>
+            </m:r>
+          </m:e>
+        </m:d>
+        <m:r>
+          <m:t>​</m:t>
         </m:r>
       </m:oMath>
       <w:r>
@@ -41743,19 +41759,23 @@
                             <m:t>κ</m:t>
                           </m:r>
                           <m:r>
-                            <m:rPr>
-                              <m:sty m:val="p"/>
-                            </m:rPr>
-                            <m:t>(</m:t>
+                            <m:t>​</m:t>
                           </m:r>
+                          <m:d>
+                            <m:dPr>
+                              <m:begChr m:val="("/>
+                              <m:sepChr m:val=""/>
+                              <m:endChr m:val=")"/>
+                              <m:grow/>
+                            </m:dPr>
+                            <m:e>
+                              <m:r>
+                                <m:t>i</m:t>
+                              </m:r>
+                            </m:e>
+                          </m:d>
                           <m:r>
-                            <m:t>i</m:t>
-                          </m:r>
-                          <m:r>
-                            <m:rPr>
-                              <m:sty m:val="p"/>
-                            </m:rPr>
-                            <m:t>)</m:t>
+                            <m:t>​</m:t>
                           </m:r>
                           <m:r>
                             <m:rPr>
@@ -41883,19 +41903,23 @@
           <m:t>κ</m:t>
         </m:r>
         <m:r>
-          <m:rPr>
-            <m:sty m:val="p"/>
-          </m:rPr>
-          <m:t>(</m:t>
-        </m:r>
-        <m:r>
-          <m:t>i</m:t>
-        </m:r>
-        <m:r>
-          <m:rPr>
-            <m:sty m:val="p"/>
-          </m:rPr>
-          <m:t>)</m:t>
+          <m:t>​</m:t>
+        </m:r>
+        <m:d>
+          <m:dPr>
+            <m:begChr m:val="("/>
+            <m:sepChr m:val=""/>
+            <m:endChr m:val=")"/>
+            <m:grow/>
+          </m:dPr>
+          <m:e>
+            <m:r>
+              <m:t>i</m:t>
+            </m:r>
+          </m:e>
+        </m:d>
+        <m:r>
+          <m:t>​</m:t>
         </m:r>
       </m:oMath>
       <w:r>
@@ -42085,19 +42109,23 @@
           <m:t>κ</m:t>
         </m:r>
         <m:r>
-          <m:rPr>
-            <m:sty m:val="p"/>
-          </m:rPr>
-          <m:t>(</m:t>
-        </m:r>
-        <m:r>
-          <m:t>i</m:t>
-        </m:r>
-        <m:r>
-          <m:rPr>
-            <m:sty m:val="p"/>
-          </m:rPr>
-          <m:t>)</m:t>
+          <m:t>​</m:t>
+        </m:r>
+        <m:d>
+          <m:dPr>
+            <m:begChr m:val="("/>
+            <m:sepChr m:val=""/>
+            <m:endChr m:val=")"/>
+            <m:grow/>
+          </m:dPr>
+          <m:e>
+            <m:r>
+              <m:t>i</m:t>
+            </m:r>
+          </m:e>
+        </m:d>
+        <m:r>
+          <m:t>​</m:t>
         </m:r>
       </m:oMath>
       <w:r>
@@ -42327,19 +42355,23 @@
               <m:t>κ</m:t>
             </m:r>
             <m:r>
-              <m:rPr>
-                <m:sty m:val="p"/>
-              </m:rPr>
-              <m:t>(</m:t>
-            </m:r>
-            <m:r>
-              <m:t>i</m:t>
-            </m:r>
-            <m:r>
-              <m:rPr>
-                <m:sty m:val="p"/>
-              </m:rPr>
-              <m:t>)</m:t>
+              <m:t>​</m:t>
+            </m:r>
+            <m:d>
+              <m:dPr>
+                <m:begChr m:val="("/>
+                <m:sepChr m:val=""/>
+                <m:endChr m:val=")"/>
+                <m:grow/>
+              </m:dPr>
+              <m:e>
+                <m:r>
+                  <m:t>i</m:t>
+                </m:r>
+              </m:e>
+            </m:d>
+            <m:r>
+              <m:t>​</m:t>
             </m:r>
           </m:sub>
         </m:sSub>
@@ -42367,19 +42399,23 @@
           <m:t>κ</m:t>
         </m:r>
         <m:r>
-          <m:rPr>
-            <m:sty m:val="p"/>
-          </m:rPr>
-          <m:t>(</m:t>
-        </m:r>
-        <m:r>
-          <m:t>i</m:t>
-        </m:r>
-        <m:r>
-          <m:rPr>
-            <m:sty m:val="p"/>
-          </m:rPr>
-          <m:t>)</m:t>
+          <m:t>​</m:t>
+        </m:r>
+        <m:d>
+          <m:dPr>
+            <m:begChr m:val="("/>
+            <m:sepChr m:val=""/>
+            <m:endChr m:val=")"/>
+            <m:grow/>
+          </m:dPr>
+          <m:e>
+            <m:r>
+              <m:t>i</m:t>
+            </m:r>
+          </m:e>
+        </m:d>
+        <m:r>
+          <m:t>​</m:t>
         </m:r>
         <m:r>
           <m:rPr>
@@ -42547,19 +42583,23 @@
                                 <m:t>κ</m:t>
                               </m:r>
                               <m:r>
-                                <m:rPr>
-                                  <m:sty m:val="p"/>
-                                </m:rPr>
-                                <m:t>(</m:t>
+                                <m:t>​</m:t>
                               </m:r>
+                              <m:d>
+                                <m:dPr>
+                                  <m:begChr m:val="("/>
+                                  <m:sepChr m:val=""/>
+                                  <m:endChr m:val=")"/>
+                                  <m:grow/>
+                                </m:dPr>
+                                <m:e>
+                                  <m:r>
+                                    <m:t>i</m:t>
+                                  </m:r>
+                                </m:e>
+                              </m:d>
                               <m:r>
-                                <m:t>i</m:t>
-                              </m:r>
-                              <m:r>
-                                <m:rPr>
-                                  <m:sty m:val="p"/>
-                                </m:rPr>
-                                <m:t>)</m:t>
+                                <m:t>​</m:t>
                               </m:r>
                               <m:r>
                                 <m:rPr>
@@ -42778,19 +42818,23 @@
                                     <m:t>κ</m:t>
                                   </m:r>
                                   <m:r>
-                                    <m:rPr>
-                                      <m:sty m:val="p"/>
-                                    </m:rPr>
-                                    <m:t>(</m:t>
+                                    <m:t>​</m:t>
                                   </m:r>
+                                  <m:d>
+                                    <m:dPr>
+                                      <m:begChr m:val="("/>
+                                      <m:sepChr m:val=""/>
+                                      <m:endChr m:val=")"/>
+                                      <m:grow/>
+                                    </m:dPr>
+                                    <m:e>
+                                      <m:r>
+                                        <m:t>i</m:t>
+                                      </m:r>
+                                    </m:e>
+                                  </m:d>
                                   <m:r>
-                                    <m:t>i</m:t>
-                                  </m:r>
-                                  <m:r>
-                                    <m:rPr>
-                                      <m:sty m:val="p"/>
-                                    </m:rPr>
-                                    <m:t>)</m:t>
+                                    <m:t>​</m:t>
                                   </m:r>
                                   <m:r>
                                     <m:rPr>
@@ -43096,19 +43140,23 @@
                 <m:t>κ</m:t>
               </m:r>
               <m:r>
-                <m:rPr>
-                  <m:sty m:val="p"/>
-                </m:rPr>
-                <m:t>(</m:t>
-              </m:r>
-              <m:r>
-                <m:t>i</m:t>
-              </m:r>
-              <m:r>
-                <m:rPr>
-                  <m:sty m:val="p"/>
-                </m:rPr>
-                <m:t>)</m:t>
+                <m:t>​</m:t>
+              </m:r>
+              <m:d>
+                <m:dPr>
+                  <m:begChr m:val="("/>
+                  <m:sepChr m:val=""/>
+                  <m:endChr m:val=")"/>
+                  <m:grow/>
+                </m:dPr>
+                <m:e>
+                  <m:r>
+                    <m:t>i</m:t>
+                  </m:r>
+                </m:e>
+              </m:d>
+              <m:r>
+                <m:t>​</m:t>
               </m:r>
               <m:r>
                 <m:rPr>
@@ -51886,19 +51934,23 @@
               <m:t>κ</m:t>
             </m:r>
             <m:r>
-              <m:rPr>
-                <m:sty m:val="p"/>
-              </m:rPr>
-              <m:t>(</m:t>
-            </m:r>
-            <m:r>
-              <m:t>i</m:t>
-            </m:r>
-            <m:r>
-              <m:rPr>
-                <m:sty m:val="p"/>
-              </m:rPr>
-              <m:t>)</m:t>
+              <m:t>​</m:t>
+            </m:r>
+            <m:d>
+              <m:dPr>
+                <m:begChr m:val="("/>
+                <m:sepChr m:val=""/>
+                <m:endChr m:val=")"/>
+                <m:grow/>
+              </m:dPr>
+              <m:e>
+                <m:r>
+                  <m:t>i</m:t>
+                </m:r>
+              </m:e>
+            </m:d>
+            <m:r>
+              <m:t>​</m:t>
             </m:r>
             <m:r>
               <m:rPr>
@@ -52176,19 +52228,23 @@
                             <m:t>κ</m:t>
                           </m:r>
                           <m:r>
-                            <m:rPr>
-                              <m:sty m:val="p"/>
-                            </m:rPr>
-                            <m:t>(</m:t>
+                            <m:t>​</m:t>
                           </m:r>
+                          <m:d>
+                            <m:dPr>
+                              <m:begChr m:val="("/>
+                              <m:sepChr m:val=""/>
+                              <m:endChr m:val=")"/>
+                              <m:grow/>
+                            </m:dPr>
+                            <m:e>
+                              <m:r>
+                                <m:t>i</m:t>
+                              </m:r>
+                            </m:e>
+                          </m:d>
                           <m:r>
-                            <m:t>i</m:t>
-                          </m:r>
-                          <m:r>
-                            <m:rPr>
-                              <m:sty m:val="p"/>
-                            </m:rPr>
-                            <m:t>)</m:t>
+                            <m:t>​</m:t>
                           </m:r>
                           <m:r>
                             <m:rPr>
@@ -52636,19 +52692,23 @@
           <m:t>κ</m:t>
         </m:r>
         <m:r>
-          <m:rPr>
-            <m:sty m:val="p"/>
-          </m:rPr>
-          <m:t>(</m:t>
-        </m:r>
-        <m:r>
-          <m:t>i</m:t>
-        </m:r>
-        <m:r>
-          <m:rPr>
-            <m:sty m:val="p"/>
-          </m:rPr>
-          <m:t>)</m:t>
+          <m:t>​</m:t>
+        </m:r>
+        <m:d>
+          <m:dPr>
+            <m:begChr m:val="("/>
+            <m:sepChr m:val=""/>
+            <m:endChr m:val=")"/>
+            <m:grow/>
+          </m:dPr>
+          <m:e>
+            <m:r>
+              <m:t>i</m:t>
+            </m:r>
+          </m:e>
+        </m:d>
+        <m:r>
+          <m:t>​</m:t>
         </m:r>
       </m:oMath>
       <w:r>
@@ -52957,19 +53017,23 @@
               <m:t>κ</m:t>
             </m:r>
             <m:r>
-              <m:rPr>
-                <m:sty m:val="p"/>
-              </m:rPr>
-              <m:t>(</m:t>
-            </m:r>
-            <m:r>
-              <m:t>i</m:t>
-            </m:r>
-            <m:r>
-              <m:rPr>
-                <m:sty m:val="p"/>
-              </m:rPr>
-              <m:t>)</m:t>
+              <m:t>​</m:t>
+            </m:r>
+            <m:d>
+              <m:dPr>
+                <m:begChr m:val="("/>
+                <m:sepChr m:val=""/>
+                <m:endChr m:val=")"/>
+                <m:grow/>
+              </m:dPr>
+              <m:e>
+                <m:r>
+                  <m:t>i</m:t>
+                </m:r>
+              </m:e>
+            </m:d>
+            <m:r>
+              <m:t>​</m:t>
             </m:r>
           </m:sub>
         </m:sSub>
@@ -53002,19 +53066,23 @@
               <m:t>κ</m:t>
             </m:r>
             <m:r>
-              <m:rPr>
-                <m:sty m:val="p"/>
-              </m:rPr>
-              <m:t>(</m:t>
-            </m:r>
-            <m:r>
-              <m:t>i</m:t>
-            </m:r>
-            <m:r>
-              <m:rPr>
-                <m:sty m:val="p"/>
-              </m:rPr>
-              <m:t>)</m:t>
+              <m:t>​</m:t>
+            </m:r>
+            <m:d>
+              <m:dPr>
+                <m:begChr m:val="("/>
+                <m:sepChr m:val=""/>
+                <m:endChr m:val=")"/>
+                <m:grow/>
+              </m:dPr>
+              <m:e>
+                <m:r>
+                  <m:t>i</m:t>
+                </m:r>
+              </m:e>
+            </m:d>
+            <m:r>
+              <m:t>​</m:t>
             </m:r>
           </m:sub>
         </m:sSub>
@@ -53061,19 +53129,23 @@
           <m:t>κ</m:t>
         </m:r>
         <m:r>
-          <m:rPr>
-            <m:sty m:val="p"/>
-          </m:rPr>
-          <m:t>(</m:t>
-        </m:r>
-        <m:r>
-          <m:t>i</m:t>
-        </m:r>
-        <m:r>
-          <m:rPr>
-            <m:sty m:val="p"/>
-          </m:rPr>
-          <m:t>)</m:t>
+          <m:t>​</m:t>
+        </m:r>
+        <m:d>
+          <m:dPr>
+            <m:begChr m:val="("/>
+            <m:sepChr m:val=""/>
+            <m:endChr m:val=")"/>
+            <m:grow/>
+          </m:dPr>
+          <m:e>
+            <m:r>
+              <m:t>i</m:t>
+            </m:r>
+          </m:e>
+        </m:d>
+        <m:r>
+          <m:t>​</m:t>
         </m:r>
       </m:oMath>
       <w:r>
@@ -53209,19 +53281,23 @@
               <m:t>κ</m:t>
             </m:r>
             <m:r>
-              <m:rPr>
-                <m:sty m:val="p"/>
-              </m:rPr>
-              <m:t>(</m:t>
-            </m:r>
-            <m:r>
-              <m:t>i</m:t>
-            </m:r>
-            <m:r>
-              <m:rPr>
-                <m:sty m:val="p"/>
-              </m:rPr>
-              <m:t>)</m:t>
+              <m:t>​</m:t>
+            </m:r>
+            <m:d>
+              <m:dPr>
+                <m:begChr m:val="("/>
+                <m:sepChr m:val=""/>
+                <m:endChr m:val=")"/>
+                <m:grow/>
+              </m:dPr>
+              <m:e>
+                <m:r>
+                  <m:t>i</m:t>
+                </m:r>
+              </m:e>
+            </m:d>
+            <m:r>
+              <m:t>​</m:t>
             </m:r>
             <m:r>
               <m:rPr>
@@ -53464,19 +53540,23 @@
               <m:t>κ</m:t>
             </m:r>
             <m:r>
-              <m:rPr>
-                <m:sty m:val="p"/>
-              </m:rPr>
-              <m:t>(</m:t>
-            </m:r>
-            <m:r>
-              <m:t>i</m:t>
-            </m:r>
-            <m:r>
-              <m:rPr>
-                <m:sty m:val="p"/>
-              </m:rPr>
-              <m:t>)</m:t>
+              <m:t>​</m:t>
+            </m:r>
+            <m:d>
+              <m:dPr>
+                <m:begChr m:val="("/>
+                <m:sepChr m:val=""/>
+                <m:endChr m:val=")"/>
+                <m:grow/>
+              </m:dPr>
+              <m:e>
+                <m:r>
+                  <m:t>i</m:t>
+                </m:r>
+              </m:e>
+            </m:d>
+            <m:r>
+              <m:t>​</m:t>
             </m:r>
           </m:sub>
         </m:sSub>
@@ -53545,19 +53625,23 @@
           <m:t>κ</m:t>
         </m:r>
         <m:r>
-          <m:rPr>
-            <m:sty m:val="p"/>
-          </m:rPr>
-          <m:t>(</m:t>
-        </m:r>
-        <m:r>
-          <m:t>i</m:t>
-        </m:r>
-        <m:r>
-          <m:rPr>
-            <m:sty m:val="p"/>
-          </m:rPr>
-          <m:t>)</m:t>
+          <m:t>​</m:t>
+        </m:r>
+        <m:d>
+          <m:dPr>
+            <m:begChr m:val="("/>
+            <m:sepChr m:val=""/>
+            <m:endChr m:val=")"/>
+            <m:grow/>
+          </m:dPr>
+          <m:e>
+            <m:r>
+              <m:t>i</m:t>
+            </m:r>
+          </m:e>
+        </m:d>
+        <m:r>
+          <m:t>​</m:t>
         </m:r>
       </m:oMath>
       <w:r>
@@ -53658,19 +53742,23 @@
                       <m:t>κ</m:t>
                     </m:r>
                     <m:r>
-                      <m:rPr>
-                        <m:sty m:val="p"/>
-                      </m:rPr>
-                      <m:t>(</m:t>
+                      <m:t>​</m:t>
                     </m:r>
+                    <m:d>
+                      <m:dPr>
+                        <m:begChr m:val="("/>
+                        <m:sepChr m:val=""/>
+                        <m:endChr m:val=")"/>
+                        <m:grow/>
+                      </m:dPr>
+                      <m:e>
+                        <m:r>
+                          <m:t>i</m:t>
+                        </m:r>
+                      </m:e>
+                    </m:d>
                     <m:r>
-                      <m:t>i</m:t>
-                    </m:r>
-                    <m:r>
-                      <m:rPr>
-                        <m:sty m:val="p"/>
-                      </m:rPr>
-                      <m:t>)</m:t>
+                      <m:t>​</m:t>
                     </m:r>
                     <m:r>
                       <m:rPr>
@@ -54033,19 +54121,23 @@
                             <m:t>κ</m:t>
                           </m:r>
                           <m:r>
-                            <m:rPr>
-                              <m:sty m:val="p"/>
-                            </m:rPr>
-                            <m:t>(</m:t>
+                            <m:t>​</m:t>
                           </m:r>
+                          <m:d>
+                            <m:dPr>
+                              <m:begChr m:val="("/>
+                              <m:sepChr m:val=""/>
+                              <m:endChr m:val=")"/>
+                              <m:grow/>
+                            </m:dPr>
+                            <m:e>
+                              <m:r>
+                                <m:t>i</m:t>
+                              </m:r>
+                            </m:e>
+                          </m:d>
                           <m:r>
-                            <m:t>i</m:t>
-                          </m:r>
-                          <m:r>
-                            <m:rPr>
-                              <m:sty m:val="p"/>
-                            </m:rPr>
-                            <m:t>)</m:t>
+                            <m:t>​</m:t>
                           </m:r>
                           <m:r>
                             <m:rPr>
@@ -57554,7 +57646,7 @@
         <w:rPr>
           <w:rStyle w:val="CommentTok"/>
         </w:rPr>
-        <w:t xml:space="preserve">#&gt;    8.88178e-15    2.00000e+00</w:t>
+        <w:t xml:space="preserve">#&gt;    7.10543e-15    2.00000e+00</w:t>
       </w:r>
     </w:p>
     <w:p>
@@ -57562,7 +57654,7 @@
         <w:pStyle w:val="FirstParagraph"/>
       </w:pPr>
       <w:r>
-        <w:t xml:space="preserve">The two columns differ by at most 8.9e-15,</w:t>
+        <w:t xml:space="preserve">The two columns differ by at most 7.1e-15,</w:t>
       </w:r>
       <w:r>
         <w:t xml:space="preserve"> </w:t>
@@ -58793,19 +58885,23 @@
                                     <m:t>κ</m:t>
                                   </m:r>
                                   <m:r>
-                                    <m:rPr>
-                                      <m:sty m:val="p"/>
-                                    </m:rPr>
-                                    <m:t>(</m:t>
+                                    <m:t>​</m:t>
                                   </m:r>
+                                  <m:d>
+                                    <m:dPr>
+                                      <m:begChr m:val="("/>
+                                      <m:sepChr m:val=""/>
+                                      <m:endChr m:val=")"/>
+                                      <m:grow/>
+                                    </m:dPr>
+                                    <m:e>
+                                      <m:r>
+                                        <m:t>i</m:t>
+                                      </m:r>
+                                    </m:e>
+                                  </m:d>
                                   <m:r>
-                                    <m:t>i</m:t>
-                                  </m:r>
-                                  <m:r>
-                                    <m:rPr>
-                                      <m:sty m:val="p"/>
-                                    </m:rPr>
-                                    <m:t>)</m:t>
+                                    <m:t>​</m:t>
                                   </m:r>
                                 </m:sub>
                               </m:sSub>

</xml_diff>

<commit_message>
Deploying to gh-pages from @ Morrison-Lab/sds@c82ffca70d799f547c05457433586880e563aedf 🚀
</commit_message>
<xml_diff>
--- a/model-validation-handout.docx
+++ b/model-validation-handout.docx
@@ -15,7 +15,7 @@
         <w:pStyle w:val="Date"/>
       </w:pPr>
       <w:r>
-        <w:t xml:space="preserve">Last modified: 2026-10-15 15:04:33 (PDT)</w:t>
+        <w:t xml:space="preserve">Last modified: 2026-10-15 15:19:11 (PDT)</w:t>
       </w:r>
     </w:p>
     <w:bookmarkStart w:id="17" w:name="sec-data-sets"/>
@@ -3637,10 +3637,7 @@
         <w:t xml:space="preserve"> (Source: Held-out set (hold-out set)). </w:t>
       </w:r>
       <w:r>
-        <w:t xml:space="preserve">James et al. (2021, sec. 5.1.1)</w:t>
-      </w:r>
-      <w:r>
-        <w:t xml:space="preserve">, who call it a</w:t>
+        <w:t xml:space="preserve">Also called a</w:t>
       </w:r>
       <w:r>
         <w:t xml:space="preserve"> </w:t>
@@ -3651,6 +3648,12 @@
           <w:bCs/>
         </w:rPr>
         <w:t xml:space="preserve">hold-out set</w:t>
+      </w:r>
+      <w:r>
+        <w:t xml:space="preserve"> </w:t>
+      </w:r>
+      <w:r>
+        <w:t xml:space="preserve">(James et al. 2021, sec. 5.1.1)</w:t>
       </w:r>
       <w:r>
         <w:t xml:space="preserve">.</w:t>
@@ -7512,13 +7515,7 @@
         <w:t xml:space="preserve"> (Source: Expected generalization error (expected prediction error, expected test error)). </w:t>
       </w:r>
       <w:r>
-        <w:t xml:space="preserve">Hastie et al. (2009, sec. 7.2)</w:t>
-      </w:r>
-      <w:r>
-        <w:t xml:space="preserve"> </w:t>
-      </w:r>
-      <w:r>
-        <w:t xml:space="preserve">call this quantity the</w:t>
+        <w:t xml:space="preserve">Also called the</w:t>
       </w:r>
       <w:r>
         <w:t xml:space="preserve"> </w:t>
@@ -7534,7 +7531,7 @@
         <w:t xml:space="preserve"> </w:t>
       </w:r>
       <w:r>
-        <w:t xml:space="preserve">(or</w:t>
+        <w:t xml:space="preserve">or</w:t>
       </w:r>
       <w:r>
         <w:t xml:space="preserve"> </w:t>
@@ -7547,7 +7544,19 @@
         <w:t xml:space="preserve">expected test error</w:t>
       </w:r>
       <w:r>
-        <w:t xml:space="preserve">) and write it</w:t>
+        <w:t xml:space="preserve"> </w:t>
+      </w:r>
+      <w:r>
+        <w:t xml:space="preserve">(Hastie et al. 2009, sec. 7.2)</w:t>
+      </w:r>
+      <w:r>
+        <w:t xml:space="preserve">.</w:t>
+      </w:r>
+      <w:r>
+        <w:t xml:space="preserve"> </w:t>
+      </w:r>
+      <w:r>
+        <w:t xml:space="preserve">Hastie et al. write the quantity as</w:t>
       </w:r>
       <w:r>
         <w:t xml:space="preserve"> </w:t>
@@ -55109,13 +55118,23 @@
         <w:t xml:space="preserve"> (Source: Cross-product matrix (sum-of-squares and cross-products matrix)). </w:t>
       </w:r>
       <w:r>
-        <w:t xml:space="preserve">Sanchez</w:t>
-      </w:r>
-      <w:r>
-        <w:t xml:space="preserve"> </w:t>
-      </w:r>
-      <w:r>
-        <w:t xml:space="preserve">(2020, chap. </w:t>
+        <w:t xml:space="preserve">Also called a</w:t>
+      </w:r>
+      <w:r>
+        <w:t xml:space="preserve"> </w:t>
+      </w:r>
+      <w:r>
+        <w:rPr>
+          <w:b/>
+          <w:bCs/>
+        </w:rPr>
+        <w:t xml:space="preserve">sum-of-squares and cross-products matrix</w:t>
+      </w:r>
+      <w:r>
+        <w:t xml:space="preserve"> </w:t>
+      </w:r>
+      <w:r>
+        <w:t xml:space="preserve">(Sanchez 2020, chap. </w:t>
       </w:r>
       <w:r>
         <w:t xml:space="preserve">“Matrix Cross-Products”</w:t>
@@ -55141,20 +55160,7 @@
         </w:r>
       </w:hyperlink>
       <w:r>
-        <w:t xml:space="preserve">) names this matrix a</w:t>
-      </w:r>
-      <w:r>
-        <w:t xml:space="preserve"> </w:t>
-      </w:r>
-      <w:r>
-        <w:rPr>
-          <w:b/>
-          <w:bCs/>
-        </w:rPr>
-        <w:t xml:space="preserve">sum-of-squares and cross-products matrix</w:t>
-      </w:r>
-      <w:r>
-        <w:t xml:space="preserve">.</w:t>
+        <w:t xml:space="preserve">).</w:t>
       </w:r>
     </w:p>
     <w:bookmarkEnd w:id="197"/>
@@ -57646,7 +57652,7 @@
         <w:rPr>
           <w:rStyle w:val="CommentTok"/>
         </w:rPr>
-        <w:t xml:space="preserve">#&gt;    7.10543e-15    2.00000e+00</w:t>
+        <w:t xml:space="preserve">#&gt;    8.88178e-15    2.00000e+00</w:t>
       </w:r>
     </w:p>
     <w:p>
@@ -57654,7 +57660,7 @@
         <w:pStyle w:val="FirstParagraph"/>
       </w:pPr>
       <w:r>
-        <w:t xml:space="preserve">The two columns differ by at most 7.1e-15,</w:t>
+        <w:t xml:space="preserve">The two columns differ by at most 8.9e-15,</w:t>
       </w:r>
       <w:r>
         <w:t xml:space="preserve"> </w:t>

</xml_diff>

<commit_message>
Deploying to gh-pages from @ Morrison-Lab/sds@a8dc4869833f324adf160d2c979c1d2fb930453b 🚀
</commit_message>
<xml_diff>
--- a/model-validation-handout.docx
+++ b/model-validation-handout.docx
@@ -15,7 +15,7 @@
         <w:pStyle w:val="Date"/>
       </w:pPr>
       <w:r>
-        <w:t xml:space="preserve">Last modified: 2026-10-15 15:19:11 (PDT)</w:t>
+        <w:t xml:space="preserve">Last modified: 2026-10-15 18:39:30 (PDT)</w:t>
       </w:r>
     </w:p>
     <w:bookmarkStart w:id="17" w:name="sec-data-sets"/>
@@ -57652,7 +57652,7 @@
         <w:rPr>
           <w:rStyle w:val="CommentTok"/>
         </w:rPr>
-        <w:t xml:space="preserve">#&gt;    8.88178e-15    2.00000e+00</w:t>
+        <w:t xml:space="preserve">#&gt;    7.10543e-15    2.00000e+00</w:t>
       </w:r>
     </w:p>
     <w:p>
@@ -57660,7 +57660,7 @@
         <w:pStyle w:val="FirstParagraph"/>
       </w:pPr>
       <w:r>
-        <w:t xml:space="preserve">The two columns differ by at most 8.9e-15,</w:t>
+        <w:t xml:space="preserve">The two columns differ by at most 7.1e-15,</w:t>
       </w:r>
       <w:r>
         <w:t xml:space="preserve"> </w:t>

</xml_diff>

<commit_message>
Deploying to gh-pages from @ Morrison-Lab/sds@d8a4302294c92c4f4184355642cfcbae882a4e49 🚀
</commit_message>
<xml_diff>
--- a/model-validation-handout.docx
+++ b/model-validation-handout.docx
@@ -15,7 +15,7 @@
         <w:pStyle w:val="Date"/>
       </w:pPr>
       <w:r>
-        <w:t xml:space="preserve">Last modified: 2026-10-16 00:14:28 (PDT)</w:t>
+        <w:t xml:space="preserve">Last modified: 2026-10-16 00:48:26 (PDT)</w:t>
       </w:r>
     </w:p>
     <w:bookmarkStart w:id="17" w:name="sec-data-sets"/>
@@ -30941,7 +30941,7 @@
     </w:p>
     <w:bookmarkEnd w:id="102"/>
     <w:bookmarkEnd w:id="103"/>
-    <w:bookmarkStart w:id="145" w:name="sec-data-splits"/>
+    <w:bookmarkStart w:id="150" w:name="sec-data-splits"/>
     <w:p>
       <w:pPr>
         <w:pStyle w:val="Heading2"/>
@@ -32714,7 +32714,7 @@
       <w:bookmarkEnd w:id="112"/>
     </w:p>
     <w:bookmarkEnd w:id="113"/>
-    <w:bookmarkStart w:id="115" w:name="def-validation-choice"/>
+    <w:bookmarkStart w:id="115" w:name="def-validation-error"/>
     <w:p>
       <w:pPr>
         <w:pStyle w:val="FirstParagraph"/>
@@ -32724,7 +32724,428 @@
           <w:b/>
           <w:bCs/>
         </w:rPr>
-        <w:t xml:space="preserve">Definition 23 (Validation choice)</w:t>
+        <w:t xml:space="preserve">Definition 23 (Validation error)</w:t>
+      </w:r>
+      <w:r>
+        <w:t xml:space="preserve"> </w:t>
+      </w:r>
+      <w:r>
+        <w:t xml:space="preserve">The</w:t>
+      </w:r>
+      <w:r>
+        <w:t xml:space="preserve"> </w:t>
+      </w:r>
+      <w:r>
+        <w:rPr>
+          <w:b/>
+          <w:bCs/>
+        </w:rPr>
+        <w:t xml:space="preserve">validation error</w:t>
+      </w:r>
+      <w:r>
+        <w:t xml:space="preserve"> </w:t>
+      </w:r>
+      <w:r>
+        <w:t xml:space="preserve">of a</w:t>
+      </w:r>
+      <w:r>
+        <w:t xml:space="preserve"> </w:t>
+      </w:r>
+      <w:hyperlink w:anchor="def-prediction-rule">
+        <w:r>
+          <w:rPr>
+            <w:rStyle w:val="Hyperlink"/>
+          </w:rPr>
+          <w:t xml:space="preserve">prediction rule</w:t>
+        </w:r>
+      </w:hyperlink>
+      <w:r>
+        <w:t xml:space="preserve"> </w:t>
+      </w:r>
+      <m:oMath>
+        <m:acc>
+          <m:accPr>
+            <m:chr m:val="̂"/>
+          </m:accPr>
+          <m:e>
+            <m:r>
+              <m:t>y</m:t>
+            </m:r>
+          </m:e>
+        </m:acc>
+      </m:oMath>
+      <w:r>
+        <w:t xml:space="preserve"> </w:t>
+      </w:r>
+      <w:r>
+        <w:t xml:space="preserve">fitted to a</w:t>
+      </w:r>
+      <w:r>
+        <w:t xml:space="preserve"> </w:t>
+      </w:r>
+      <w:hyperlink w:anchor="def-training-set">
+        <w:r>
+          <w:rPr>
+            <w:rStyle w:val="Hyperlink"/>
+          </w:rPr>
+          <w:t xml:space="preserve">training set</w:t>
+        </w:r>
+      </w:hyperlink>
+      <w:r>
+        <w:t xml:space="preserve"> </w:t>
+      </w:r>
+      <m:oMath>
+        <m:sSub>
+          <m:e>
+            <m:r>
+              <m:rPr>
+                <m:scr m:val="script"/>
+                <m:sty m:val="p"/>
+              </m:rPr>
+              <m:t>D</m:t>
+            </m:r>
+          </m:e>
+          <m:sub>
+            <m:r>
+              <m:rPr>
+                <m:nor/>
+                <m:sty m:val="p"/>
+              </m:rPr>
+              <m:t>train</m:t>
+            </m:r>
+          </m:sub>
+        </m:sSub>
+      </m:oMath>
+      <w:r>
+        <w:t xml:space="preserve"> </w:t>
+      </w:r>
+      <w:r>
+        <w:t xml:space="preserve">is the</w:t>
+      </w:r>
+      <w:r>
+        <w:t xml:space="preserve"> </w:t>
+      </w:r>
+      <w:hyperlink r:id="rId34">
+        <w:r>
+          <w:rPr>
+            <w:rStyle w:val="Hyperlink"/>
+          </w:rPr>
+          <w:t xml:space="preserve">mean squared error</w:t>
+        </w:r>
+      </w:hyperlink>
+      <w:r>
+        <w:t xml:space="preserve"> </w:t>
+      </w:r>
+      <w:r>
+        <w:t xml:space="preserve">of its predictions for the</w:t>
+      </w:r>
+      <w:r>
+        <w:t xml:space="preserve"> </w:t>
+      </w:r>
+      <w:hyperlink w:anchor="def-validation-set">
+        <w:r>
+          <w:rPr>
+            <w:rStyle w:val="Hyperlink"/>
+          </w:rPr>
+          <w:t xml:space="preserve">validation set</w:t>
+        </w:r>
+      </w:hyperlink>
+      <w:r>
+        <w:t xml:space="preserve">,</w:t>
+      </w:r>
+      <w:r>
+        <w:t xml:space="preserve"> </w:t>
+      </w:r>
+      <w:r>
+        <w:t xml:space="preserve">indexed by</w:t>
+      </w:r>
+      <w:r>
+        <w:t xml:space="preserve"> </w:t>
+      </w:r>
+      <m:oMath>
+        <m:sSub>
+          <m:e>
+            <m:r>
+              <m:t>I</m:t>
+            </m:r>
+          </m:e>
+          <m:sub>
+            <m:r>
+              <m:rPr>
+                <m:nor/>
+                <m:sty m:val="p"/>
+              </m:rPr>
+              <m:t>val</m:t>
+            </m:r>
+          </m:sub>
+        </m:sSub>
+      </m:oMath>
+      <w:r>
+        <w:t xml:space="preserve">:</w:t>
+      </w:r>
+    </w:p>
+    <w:p>
+      <w:pPr>
+        <w:pStyle w:val="BodyText"/>
+      </w:pPr>
+      <w:bookmarkStart w:id="114" w:name="eq-validation-error"/>
+      <m:oMathPara>
+        <m:oMathParaPr>
+          <m:jc m:val="center"/>
+        </m:oMathParaPr>
+        <m:oMath>
+          <m:sSub>
+            <m:e>
+              <m:bar>
+                <m:barPr>
+                  <m:pos m:val="top"/>
+                </m:barPr>
+                <m:e>
+                  <m:r>
+                    <m:rPr>
+                      <m:sty m:val="p"/>
+                    </m:rPr>
+                    <m:t>err</m:t>
+                  </m:r>
+                </m:e>
+              </m:bar>
+            </m:e>
+            <m:sub>
+              <m:r>
+                <m:rPr>
+                  <m:nor/>
+                  <m:sty m:val="p"/>
+                </m:rPr>
+                <m:t>val</m:t>
+              </m:r>
+            </m:sub>
+          </m:sSub>
+          <m:limUpp>
+            <m:e>
+              <m:r>
+                <m:rPr>
+                  <m:sty m:val="p"/>
+                </m:rPr>
+                <m:t>=</m:t>
+              </m:r>
+            </m:e>
+            <m:lim>
+              <m:r>
+                <m:rPr>
+                  <m:nor/>
+                  <m:sty m:val="p"/>
+                </m:rPr>
+                <m:t>def</m:t>
+              </m:r>
+            </m:lim>
+          </m:limUpp>
+          <m:f>
+            <m:fPr>
+              <m:type m:val="bar"/>
+            </m:fPr>
+            <m:num>
+              <m:r>
+                <m:t>1</m:t>
+              </m:r>
+            </m:num>
+            <m:den>
+              <m:r>
+                <m:t>​</m:t>
+              </m:r>
+              <m:d>
+                <m:dPr>
+                  <m:begChr m:val="|"/>
+                  <m:sepChr m:val=""/>
+                  <m:endChr m:val="|"/>
+                  <m:grow/>
+                </m:dPr>
+                <m:e>
+                  <m:sSub>
+                    <m:e>
+                      <m:r>
+                        <m:t>I</m:t>
+                      </m:r>
+                    </m:e>
+                    <m:sub>
+                      <m:r>
+                        <m:rPr>
+                          <m:nor/>
+                          <m:sty m:val="p"/>
+                        </m:rPr>
+                        <m:t>val</m:t>
+                      </m:r>
+                    </m:sub>
+                  </m:sSub>
+                </m:e>
+              </m:d>
+              <m:r>
+                <m:t>​</m:t>
+              </m:r>
+            </m:den>
+          </m:f>
+          <m:nary>
+            <m:naryPr>
+              <m:chr m:val="∑"/>
+              <m:limLoc m:val="undOvr"/>
+              <m:subHide m:val="off"/>
+              <m:supHide m:val="on"/>
+            </m:naryPr>
+            <m:sub>
+              <m:r>
+                <m:t>i</m:t>
+              </m:r>
+              <m:r>
+                <m:rPr>
+                  <m:sty m:val="p"/>
+                </m:rPr>
+                <m:t>∈</m:t>
+              </m:r>
+              <m:sSub>
+                <m:e>
+                  <m:r>
+                    <m:t>I</m:t>
+                  </m:r>
+                </m:e>
+                <m:sub>
+                  <m:r>
+                    <m:rPr>
+                      <m:nor/>
+                      <m:sty m:val="p"/>
+                    </m:rPr>
+                    <m:t>val</m:t>
+                  </m:r>
+                </m:sub>
+              </m:sSub>
+            </m:sub>
+            <m:sup>
+              <m:r>
+                <m:t>​</m:t>
+              </m:r>
+            </m:sup>
+            <m:e>
+              <m:sSup>
+                <m:e>
+                  <m:r>
+                    <m:t>​</m:t>
+                  </m:r>
+                  <m:d>
+                    <m:dPr>
+                      <m:begChr m:val="("/>
+                      <m:sepChr m:val=""/>
+                      <m:endChr m:val=")"/>
+                      <m:grow/>
+                    </m:dPr>
+                    <m:e>
+                      <m:acc>
+                        <m:accPr>
+                          <m:chr m:val="̂"/>
+                        </m:accPr>
+                        <m:e>
+                          <m:r>
+                            <m:t>y</m:t>
+                          </m:r>
+                        </m:e>
+                      </m:acc>
+                      <m:r>
+                        <m:t>​</m:t>
+                      </m:r>
+                      <m:d>
+                        <m:dPr>
+                          <m:begChr m:val="("/>
+                          <m:sepChr m:val=""/>
+                          <m:endChr m:val=")"/>
+                          <m:grow/>
+                        </m:dPr>
+                        <m:e>
+                          <m:sSub>
+                            <m:e>
+                              <m:r>
+                                <m:t>x</m:t>
+                              </m:r>
+                            </m:e>
+                            <m:sub>
+                              <m:r>
+                                <m:t>i</m:t>
+                              </m:r>
+                            </m:sub>
+                          </m:sSub>
+                        </m:e>
+                      </m:d>
+                      <m:r>
+                        <m:t>​</m:t>
+                      </m:r>
+                      <m:r>
+                        <m:rPr>
+                          <m:sty m:val="p"/>
+                        </m:rPr>
+                        <m:t>−</m:t>
+                      </m:r>
+                      <m:sSub>
+                        <m:e>
+                          <m:r>
+                            <m:t>y</m:t>
+                          </m:r>
+                        </m:e>
+                        <m:sub>
+                          <m:r>
+                            <m:t>i</m:t>
+                          </m:r>
+                        </m:sub>
+                      </m:sSub>
+                    </m:e>
+                  </m:d>
+                  <m:r>
+                    <m:t>​</m:t>
+                  </m:r>
+                </m:e>
+                <m:sup>
+                  <m:r>
+                    <m:t>2</m:t>
+                  </m:r>
+                </m:sup>
+              </m:sSup>
+            </m:e>
+          </m:nary>
+          <m:r>
+            <m:rPr>
+              <m:sty m:val="p"/>
+            </m:rPr>
+            <m:t>.</m:t>
+          </m:r>
+          <m:r>
+            <m:t>  </m:t>
+          </m:r>
+          <m:r>
+            <m:rPr>
+              <m:sty m:val="p"/>
+            </m:rPr>
+            <m:t>(</m:t>
+          </m:r>
+          <m:r>
+            <m:t>25</m:t>
+          </m:r>
+          <m:r>
+            <m:rPr>
+              <m:sty m:val="p"/>
+            </m:rPr>
+            <m:t>)</m:t>
+          </m:r>
+        </m:oMath>
+      </m:oMathPara>
+      <w:bookmarkEnd w:id="114"/>
+    </w:p>
+    <w:bookmarkEnd w:id="115"/>
+    <w:bookmarkStart w:id="117" w:name="def-validation-choice"/>
+    <w:p>
+      <w:pPr>
+        <w:pStyle w:val="FirstParagraph"/>
+      </w:pPr>
+      <w:r>
+        <w:rPr>
+          <w:b/>
+          <w:bCs/>
+        </w:rPr>
+        <w:t xml:space="preserve">Definition 24 (Validation choice)</w:t>
       </w:r>
       <w:r>
         <w:t xml:space="preserve"> </w:t>
@@ -32920,7 +33341,7 @@
       <w:pPr>
         <w:pStyle w:val="BodyText"/>
       </w:pPr>
-      <w:bookmarkStart w:id="114" w:name="eq-validation-choice"/>
+      <w:bookmarkStart w:id="116" w:name="eq-validation-choice"/>
       <m:oMathPara>
         <m:oMathParaPr>
           <m:jc m:val="center"/>
@@ -33187,7 +33608,7 @@
             <m:t>(</m:t>
           </m:r>
           <m:r>
-            <m:t>25</m:t>
+            <m:t>26</m:t>
           </m:r>
           <m:r>
             <m:rPr>
@@ -33197,10 +33618,10 @@
           </m:r>
         </m:oMath>
       </m:oMathPara>
-      <w:bookmarkEnd w:id="114"/>
+      <w:bookmarkEnd w:id="116"/>
     </w:p>
-    <w:bookmarkEnd w:id="115"/>
-    <w:bookmarkStart w:id="117" w:name="def-test-set"/>
+    <w:bookmarkEnd w:id="117"/>
+    <w:bookmarkStart w:id="119" w:name="def-test-set"/>
     <w:p>
       <w:pPr>
         <w:pStyle w:val="FirstParagraph"/>
@@ -33210,7 +33631,7 @@
           <w:b/>
           <w:bCs/>
         </w:rPr>
-        <w:t xml:space="preserve">Definition 24 (Test set)</w:t>
+        <w:t xml:space="preserve">Definition 25 (Test set)</w:t>
       </w:r>
       <w:r>
         <w:t xml:space="preserve"> </w:t>
@@ -33344,7 +33765,7 @@
       <w:pPr>
         <w:pStyle w:val="BodyText"/>
       </w:pPr>
-      <w:bookmarkStart w:id="116" w:name="eq-test-set"/>
+      <w:bookmarkStart w:id="118" w:name="eq-test-set"/>
       <m:oMathPara>
         <m:oMathParaPr>
           <m:jc m:val="center"/>
@@ -33455,7 +33876,7 @@
             <m:t>(</m:t>
           </m:r>
           <m:r>
-            <m:t>26</m:t>
+            <m:t>27</m:t>
           </m:r>
           <m:r>
             <m:rPr>
@@ -33465,10 +33886,431 @@
           </m:r>
         </m:oMath>
       </m:oMathPara>
-      <w:bookmarkEnd w:id="116"/>
+      <w:bookmarkEnd w:id="118"/>
     </w:p>
-    <w:bookmarkEnd w:id="117"/>
-    <w:bookmarkStart w:id="121" w:name="rem-data-splits"/>
+    <w:bookmarkEnd w:id="119"/>
+    <w:bookmarkStart w:id="121" w:name="def-test-error"/>
+    <w:p>
+      <w:pPr>
+        <w:pStyle w:val="FirstParagraph"/>
+      </w:pPr>
+      <w:r>
+        <w:rPr>
+          <w:b/>
+          <w:bCs/>
+        </w:rPr>
+        <w:t xml:space="preserve">Definition 26 (Test error)</w:t>
+      </w:r>
+      <w:r>
+        <w:t xml:space="preserve"> </w:t>
+      </w:r>
+      <w:r>
+        <w:t xml:space="preserve">The</w:t>
+      </w:r>
+      <w:r>
+        <w:t xml:space="preserve"> </w:t>
+      </w:r>
+      <w:r>
+        <w:rPr>
+          <w:b/>
+          <w:bCs/>
+        </w:rPr>
+        <w:t xml:space="preserve">test error</w:t>
+      </w:r>
+      <w:r>
+        <w:t xml:space="preserve"> </w:t>
+      </w:r>
+      <w:r>
+        <w:t xml:space="preserve">of a</w:t>
+      </w:r>
+      <w:r>
+        <w:t xml:space="preserve"> </w:t>
+      </w:r>
+      <w:hyperlink w:anchor="def-prediction-rule">
+        <w:r>
+          <w:rPr>
+            <w:rStyle w:val="Hyperlink"/>
+          </w:rPr>
+          <w:t xml:space="preserve">prediction rule</w:t>
+        </w:r>
+      </w:hyperlink>
+      <w:r>
+        <w:t xml:space="preserve"> </w:t>
+      </w:r>
+      <m:oMath>
+        <m:acc>
+          <m:accPr>
+            <m:chr m:val="̂"/>
+          </m:accPr>
+          <m:e>
+            <m:r>
+              <m:t>y</m:t>
+            </m:r>
+          </m:e>
+        </m:acc>
+      </m:oMath>
+      <w:r>
+        <w:t xml:space="preserve"> </w:t>
+      </w:r>
+      <w:r>
+        <w:t xml:space="preserve">fitted to a</w:t>
+      </w:r>
+      <w:r>
+        <w:t xml:space="preserve"> </w:t>
+      </w:r>
+      <w:hyperlink w:anchor="def-training-set">
+        <w:r>
+          <w:rPr>
+            <w:rStyle w:val="Hyperlink"/>
+          </w:rPr>
+          <w:t xml:space="preserve">training set</w:t>
+        </w:r>
+      </w:hyperlink>
+      <w:r>
+        <w:t xml:space="preserve"> </w:t>
+      </w:r>
+      <m:oMath>
+        <m:sSub>
+          <m:e>
+            <m:r>
+              <m:rPr>
+                <m:scr m:val="script"/>
+                <m:sty m:val="p"/>
+              </m:rPr>
+              <m:t>D</m:t>
+            </m:r>
+          </m:e>
+          <m:sub>
+            <m:r>
+              <m:rPr>
+                <m:nor/>
+                <m:sty m:val="p"/>
+              </m:rPr>
+              <m:t>train</m:t>
+            </m:r>
+          </m:sub>
+        </m:sSub>
+      </m:oMath>
+      <w:r>
+        <w:t xml:space="preserve"> </w:t>
+      </w:r>
+      <w:r>
+        <w:t xml:space="preserve">is the</w:t>
+      </w:r>
+      <w:r>
+        <w:t xml:space="preserve"> </w:t>
+      </w:r>
+      <w:hyperlink r:id="rId34">
+        <w:r>
+          <w:rPr>
+            <w:rStyle w:val="Hyperlink"/>
+          </w:rPr>
+          <w:t xml:space="preserve">mean squared error</w:t>
+        </w:r>
+      </w:hyperlink>
+      <w:r>
+        <w:t xml:space="preserve"> </w:t>
+      </w:r>
+      <w:r>
+        <w:t xml:space="preserve">of its predictions for the</w:t>
+      </w:r>
+      <w:r>
+        <w:t xml:space="preserve"> </w:t>
+      </w:r>
+      <w:hyperlink w:anchor="def-test-set">
+        <w:r>
+          <w:rPr>
+            <w:rStyle w:val="Hyperlink"/>
+          </w:rPr>
+          <w:t xml:space="preserve">test set</w:t>
+        </w:r>
+      </w:hyperlink>
+      <w:r>
+        <w:t xml:space="preserve">,</w:t>
+      </w:r>
+      <w:r>
+        <w:t xml:space="preserve"> </w:t>
+      </w:r>
+      <w:r>
+        <w:t xml:space="preserve">indexed by</w:t>
+      </w:r>
+      <w:r>
+        <w:t xml:space="preserve"> </w:t>
+      </w:r>
+      <m:oMath>
+        <m:sSub>
+          <m:e>
+            <m:r>
+              <m:t>I</m:t>
+            </m:r>
+          </m:e>
+          <m:sub>
+            <m:r>
+              <m:rPr>
+                <m:nor/>
+                <m:sty m:val="p"/>
+              </m:rPr>
+              <m:t>test</m:t>
+            </m:r>
+          </m:sub>
+        </m:sSub>
+      </m:oMath>
+      <w:r>
+        <w:t xml:space="preserve">:</w:t>
+      </w:r>
+    </w:p>
+    <w:p>
+      <w:pPr>
+        <w:pStyle w:val="BodyText"/>
+      </w:pPr>
+      <w:bookmarkStart w:id="120" w:name="eq-test-error"/>
+      <m:oMathPara>
+        <m:oMathParaPr>
+          <m:jc m:val="center"/>
+        </m:oMathParaPr>
+        <m:oMath>
+          <m:sSub>
+            <m:e>
+              <m:bar>
+                <m:barPr>
+                  <m:pos m:val="top"/>
+                </m:barPr>
+                <m:e>
+                  <m:r>
+                    <m:rPr>
+                      <m:sty m:val="p"/>
+                    </m:rPr>
+                    <m:t>err</m:t>
+                  </m:r>
+                </m:e>
+              </m:bar>
+            </m:e>
+            <m:sub>
+              <m:r>
+                <m:rPr>
+                  <m:nor/>
+                  <m:sty m:val="p"/>
+                </m:rPr>
+                <m:t>test</m:t>
+              </m:r>
+            </m:sub>
+          </m:sSub>
+          <m:limUpp>
+            <m:e>
+              <m:r>
+                <m:rPr>
+                  <m:sty m:val="p"/>
+                </m:rPr>
+                <m:t>=</m:t>
+              </m:r>
+            </m:e>
+            <m:lim>
+              <m:r>
+                <m:rPr>
+                  <m:nor/>
+                  <m:sty m:val="p"/>
+                </m:rPr>
+                <m:t>def</m:t>
+              </m:r>
+            </m:lim>
+          </m:limUpp>
+          <m:f>
+            <m:fPr>
+              <m:type m:val="bar"/>
+            </m:fPr>
+            <m:num>
+              <m:r>
+                <m:t>1</m:t>
+              </m:r>
+            </m:num>
+            <m:den>
+              <m:r>
+                <m:t>​</m:t>
+              </m:r>
+              <m:d>
+                <m:dPr>
+                  <m:begChr m:val="|"/>
+                  <m:sepChr m:val=""/>
+                  <m:endChr m:val="|"/>
+                  <m:grow/>
+                </m:dPr>
+                <m:e>
+                  <m:sSub>
+                    <m:e>
+                      <m:r>
+                        <m:t>I</m:t>
+                      </m:r>
+                    </m:e>
+                    <m:sub>
+                      <m:r>
+                        <m:rPr>
+                          <m:nor/>
+                          <m:sty m:val="p"/>
+                        </m:rPr>
+                        <m:t>test</m:t>
+                      </m:r>
+                    </m:sub>
+                  </m:sSub>
+                </m:e>
+              </m:d>
+              <m:r>
+                <m:t>​</m:t>
+              </m:r>
+            </m:den>
+          </m:f>
+          <m:nary>
+            <m:naryPr>
+              <m:chr m:val="∑"/>
+              <m:limLoc m:val="undOvr"/>
+              <m:subHide m:val="off"/>
+              <m:supHide m:val="on"/>
+            </m:naryPr>
+            <m:sub>
+              <m:r>
+                <m:t>i</m:t>
+              </m:r>
+              <m:r>
+                <m:rPr>
+                  <m:sty m:val="p"/>
+                </m:rPr>
+                <m:t>∈</m:t>
+              </m:r>
+              <m:sSub>
+                <m:e>
+                  <m:r>
+                    <m:t>I</m:t>
+                  </m:r>
+                </m:e>
+                <m:sub>
+                  <m:r>
+                    <m:rPr>
+                      <m:nor/>
+                      <m:sty m:val="p"/>
+                    </m:rPr>
+                    <m:t>test</m:t>
+                  </m:r>
+                </m:sub>
+              </m:sSub>
+            </m:sub>
+            <m:sup>
+              <m:r>
+                <m:t>​</m:t>
+              </m:r>
+            </m:sup>
+            <m:e>
+              <m:sSup>
+                <m:e>
+                  <m:r>
+                    <m:t>​</m:t>
+                  </m:r>
+                  <m:d>
+                    <m:dPr>
+                      <m:begChr m:val="("/>
+                      <m:sepChr m:val=""/>
+                      <m:endChr m:val=")"/>
+                      <m:grow/>
+                    </m:dPr>
+                    <m:e>
+                      <m:acc>
+                        <m:accPr>
+                          <m:chr m:val="̂"/>
+                        </m:accPr>
+                        <m:e>
+                          <m:r>
+                            <m:t>y</m:t>
+                          </m:r>
+                        </m:e>
+                      </m:acc>
+                      <m:r>
+                        <m:t>​</m:t>
+                      </m:r>
+                      <m:d>
+                        <m:dPr>
+                          <m:begChr m:val="("/>
+                          <m:sepChr m:val=""/>
+                          <m:endChr m:val=")"/>
+                          <m:grow/>
+                        </m:dPr>
+                        <m:e>
+                          <m:sSub>
+                            <m:e>
+                              <m:r>
+                                <m:t>x</m:t>
+                              </m:r>
+                            </m:e>
+                            <m:sub>
+                              <m:r>
+                                <m:t>i</m:t>
+                              </m:r>
+                            </m:sub>
+                          </m:sSub>
+                        </m:e>
+                      </m:d>
+                      <m:r>
+                        <m:t>​</m:t>
+                      </m:r>
+                      <m:r>
+                        <m:rPr>
+                          <m:sty m:val="p"/>
+                        </m:rPr>
+                        <m:t>−</m:t>
+                      </m:r>
+                      <m:sSub>
+                        <m:e>
+                          <m:r>
+                            <m:t>y</m:t>
+                          </m:r>
+                        </m:e>
+                        <m:sub>
+                          <m:r>
+                            <m:t>i</m:t>
+                          </m:r>
+                        </m:sub>
+                      </m:sSub>
+                    </m:e>
+                  </m:d>
+                  <m:r>
+                    <m:t>​</m:t>
+                  </m:r>
+                </m:e>
+                <m:sup>
+                  <m:r>
+                    <m:t>2</m:t>
+                  </m:r>
+                </m:sup>
+              </m:sSup>
+            </m:e>
+          </m:nary>
+          <m:r>
+            <m:rPr>
+              <m:sty m:val="p"/>
+            </m:rPr>
+            <m:t>.</m:t>
+          </m:r>
+          <m:r>
+            <m:t>  </m:t>
+          </m:r>
+          <m:r>
+            <m:rPr>
+              <m:sty m:val="p"/>
+            </m:rPr>
+            <m:t>(</m:t>
+          </m:r>
+          <m:r>
+            <m:t>28</m:t>
+          </m:r>
+          <m:r>
+            <m:rPr>
+              <m:sty m:val="p"/>
+            </m:rPr>
+            <m:t>)</m:t>
+          </m:r>
+        </m:oMath>
+      </m:oMathPara>
+      <w:bookmarkEnd w:id="120"/>
+    </w:p>
+    <w:bookmarkEnd w:id="121"/>
+    <w:bookmarkStart w:id="125" w:name="rem-data-splits"/>
     <w:p>
       <w:pPr>
         <w:pStyle w:val="FirstParagraph"/>
@@ -33643,7 +34485,7 @@
       <w:r>
         <w:t xml:space="preserve"> </w:t>
       </w:r>
-      <w:hyperlink r:id="rId118">
+      <w:hyperlink r:id="rId122">
         <w:r>
           <w:rPr>
             <w:rStyle w:val="Hyperlink"/>
@@ -33663,7 +34505,7 @@
       <w:r>
         <w:t xml:space="preserve"> </w:t>
       </w:r>
-      <w:hyperlink r:id="rId119">
+      <w:hyperlink r:id="rId123">
         <w:r>
           <w:rPr>
             <w:rStyle w:val="Hyperlink"/>
@@ -33683,7 +34525,7 @@
       <w:r>
         <w:t xml:space="preserve"> </w:t>
       </w:r>
-      <w:hyperlink r:id="rId120">
+      <w:hyperlink r:id="rId124">
         <w:r>
           <w:rPr>
             <w:rStyle w:val="Hyperlink"/>
@@ -33701,8 +34543,219 @@
         <w:t xml:space="preserve">They use a different symbol for the training set and a parenthesized observation index, but the same three-way split.</w:t>
       </w:r>
     </w:p>
-    <w:bookmarkEnd w:id="121"/>
-    <w:bookmarkStart w:id="144" w:name="exm-train-validation-test-split"/>
+    <w:bookmarkEnd w:id="125"/>
+    <w:bookmarkStart w:id="126" w:name="rem-validation-test-error"/>
+    <w:p>
+      <w:pPr>
+        <w:pStyle w:val="BodyText"/>
+      </w:pPr>
+      <w:r>
+        <w:rPr>
+          <w:i/>
+          <w:iCs/>
+        </w:rPr>
+        <w:t xml:space="preserve">Remark 16</w:t>
+      </w:r>
+      <w:r>
+        <w:t xml:space="preserve"> (What the validation and test errors estimate). </w:t>
+      </w:r>
+      <w:r>
+        <w:t xml:space="preserve">The</w:t>
+      </w:r>
+      <w:r>
+        <w:t xml:space="preserve"> </w:t>
+      </w:r>
+      <w:hyperlink w:anchor="def-validation-error">
+        <w:r>
+          <w:rPr>
+            <w:rStyle w:val="Hyperlink"/>
+          </w:rPr>
+          <w:t xml:space="preserve">validation error</w:t>
+        </w:r>
+      </w:hyperlink>
+      <w:r>
+        <w:t xml:space="preserve"> </w:t>
+      </w:r>
+      <w:r>
+        <w:t xml:space="preserve">and the</w:t>
+      </w:r>
+      <w:r>
+        <w:t xml:space="preserve"> </w:t>
+      </w:r>
+      <w:hyperlink w:anchor="def-test-error">
+        <w:r>
+          <w:rPr>
+            <w:rStyle w:val="Hyperlink"/>
+          </w:rPr>
+          <w:t xml:space="preserve">test error</w:t>
+        </w:r>
+      </w:hyperlink>
+      <w:r>
+        <w:t xml:space="preserve"> </w:t>
+      </w:r>
+      <w:r>
+        <w:t xml:space="preserve">differ from the</w:t>
+      </w:r>
+      <w:r>
+        <w:t xml:space="preserve"> </w:t>
+      </w:r>
+      <w:hyperlink w:anchor="def-training-mse">
+        <w:r>
+          <w:rPr>
+            <w:rStyle w:val="Hyperlink"/>
+          </w:rPr>
+          <w:t xml:space="preserve">training error</w:t>
+        </w:r>
+      </w:hyperlink>
+      <w:r>
+        <w:t xml:space="preserve"> </w:t>
+      </w:r>
+      <m:oMath>
+        <m:bar>
+          <m:barPr>
+            <m:pos m:val="top"/>
+          </m:barPr>
+          <m:e>
+            <m:r>
+              <m:rPr>
+                <m:sty m:val="p"/>
+              </m:rPr>
+              <m:t>err</m:t>
+            </m:r>
+          </m:e>
+        </m:bar>
+      </m:oMath>
+      <w:r>
+        <w:t xml:space="preserve"> </w:t>
+      </w:r>
+      <w:r>
+        <w:t xml:space="preserve">only in the set that scores the rule.</w:t>
+      </w:r>
+      <w:r>
+        <w:t xml:space="preserve"> </w:t>
+      </w:r>
+      <w:r>
+        <w:t xml:space="preserve">The rule was not fitted to the validation or test set,</w:t>
+      </w:r>
+      <w:r>
+        <w:t xml:space="preserve"> </w:t>
+      </w:r>
+      <w:r>
+        <w:t xml:space="preserve">so each estimates the</w:t>
+      </w:r>
+      <w:r>
+        <w:t xml:space="preserve"> </w:t>
+      </w:r>
+      <w:hyperlink w:anchor="def-generalization-error">
+        <w:r>
+          <w:rPr>
+            <w:rStyle w:val="Hyperlink"/>
+          </w:rPr>
+          <w:t xml:space="preserve">generalization error</w:t>
+        </w:r>
+      </w:hyperlink>
+      <w:r>
+        <w:t xml:space="preserve"> </w:t>
+      </w:r>
+      <w:r>
+        <w:t xml:space="preserve">of the fitted rule</w:t>
+      </w:r>
+      <w:r>
+        <w:t xml:space="preserve"> </w:t>
+      </w:r>
+      <w:r>
+        <w:t xml:space="preserve">without the optimism of the training error.</w:t>
+      </w:r>
+      <w:r>
+        <w:t xml:space="preserve"> </w:t>
+      </w:r>
+      <w:r>
+        <w:t xml:space="preserve">The</w:t>
+      </w:r>
+      <w:r>
+        <w:t xml:space="preserve"> </w:t>
+      </w:r>
+      <w:hyperlink w:anchor="def-validation-choice">
+        <w:r>
+          <w:rPr>
+            <w:rStyle w:val="Hyperlink"/>
+          </w:rPr>
+          <w:t xml:space="preserve">validation choice</w:t>
+        </w:r>
+      </w:hyperlink>
+      <w:r>
+        <w:t xml:space="preserve"> </w:t>
+      </w:r>
+      <w:r>
+        <w:t xml:space="preserve">selects the rule with the smallest validation error,</w:t>
+      </w:r>
+      <w:r>
+        <w:t xml:space="preserve"> </w:t>
+      </w:r>
+      <w:r>
+        <w:t xml:space="preserve">so the validation error of the chosen rule is still optimistic;</w:t>
+      </w:r>
+      <w:r>
+        <w:t xml:space="preserve"> </w:t>
+      </w:r>
+      <w:r>
+        <w:t xml:space="preserve">the test error is computed once, after the choice, so it is not.</w:t>
+      </w:r>
+    </w:p>
+    <w:p>
+      <w:pPr>
+        <w:pStyle w:val="BodyText"/>
+      </w:pPr>
+      <w:r>
+        <w:t xml:space="preserve">Hastie et al. (2009, sec. 7.2)</w:t>
+      </w:r>
+      <w:r>
+        <w:t xml:space="preserve"> </w:t>
+      </w:r>
+      <w:r>
+        <w:t xml:space="preserve">use</w:t>
+      </w:r>
+      <w:r>
+        <w:t xml:space="preserve"> </w:t>
+      </w:r>
+      <w:r>
+        <w:t xml:space="preserve">“test error”</w:t>
+      </w:r>
+      <w:r>
+        <w:t xml:space="preserve"> </w:t>
+      </w:r>
+      <w:r>
+        <w:t xml:space="preserve">for the generalization error of the fitted rule itself.</w:t>
+      </w:r>
+      <w:r>
+        <w:t xml:space="preserve"> </w:t>
+      </w:r>
+      <w:r>
+        <w:t xml:space="preserve">Here the test error is the number computed from the test set, and the generalization error is what it estimates.</w:t>
+      </w:r>
+    </w:p>
+    <w:p>
+      <w:pPr>
+        <w:pStyle w:val="BodyText"/>
+      </w:pPr>
+      <w:r>
+        <w:t xml:space="preserve">This page scores predictions by squared error throughout, so both errors are mean squared errors.</w:t>
+      </w:r>
+      <w:r>
+        <w:t xml:space="preserve"> </w:t>
+      </w:r>
+      <w:r>
+        <w:t xml:space="preserve">Averaging any other loss over the same set, such as the absolute error,</w:t>
+      </w:r>
+      <w:r>
+        <w:t xml:space="preserve"> </w:t>
+      </w:r>
+      <w:r>
+        <w:t xml:space="preserve">gives the corresponding validation and test errors.</w:t>
+      </w:r>
+    </w:p>
+    <w:bookmarkEnd w:id="126"/>
+    <w:bookmarkStart w:id="149" w:name="exm-train-validation-test-split"/>
     <w:p>
       <w:pPr>
         <w:pStyle w:val="BodyText"/>
@@ -33936,7 +34989,7 @@
       <w:tr>
         <w:tc>
           <w:tcPr/>
-          <w:bookmarkStart w:id="122" w:name="tbl-train-validation-test-split-sizes"/>
+          <w:bookmarkStart w:id="127" w:name="tbl-train-validation-test-split-sizes"/>
           <w:p>
             <w:pPr>
               <w:jc w:val="center"/>
@@ -34568,7 +35621,7 @@
               <w:t xml:space="preserve">#&gt; 3 test           7</w:t>
             </w:r>
           </w:p>
-          <w:bookmarkEnd w:id="122"/>
+          <w:bookmarkEnd w:id="127"/>
         </w:tc>
       </w:tr>
     </w:tbl>
@@ -38426,7 +39479,7 @@
       <w:tr>
         <w:tc>
           <w:tcPr/>
-          <w:bookmarkStart w:id="126" w:name="fig-linear-model-superimposed"/>
+          <w:bookmarkStart w:id="131" w:name="fig-linear-model-superimposed"/>
           <w:p>
             <w:pPr>
               <w:pStyle w:val="SourceCode"/>
@@ -38466,18 +39519,18 @@
                 <wp:inline>
                   <wp:extent cx="4620126" cy="3696101"/>
                   <wp:effectExtent b="0" l="0" r="0" t="0"/>
-                  <wp:docPr descr="" title="" id="124" name="Picture"/>
+                  <wp:docPr descr="" title="" id="129" name="Picture"/>
                   <a:graphic>
                     <a:graphicData uri="http://schemas.openxmlformats.org/drawingml/2006/picture">
                       <pic:pic>
                         <pic:nvPicPr>
-                          <pic:cNvPr descr="model-validation_files/figure-docx/unnamed-chunk-3-1.png" id="125" name="Picture"/>
+                          <pic:cNvPr descr="model-validation_files/figure-docx/unnamed-chunk-3-1.png" id="130" name="Picture"/>
                           <pic:cNvPicPr>
                             <a:picLocks noChangeArrowheads="1" noChangeAspect="1"/>
                           </pic:cNvPicPr>
                         </pic:nvPicPr>
                         <pic:blipFill>
-                          <a:blip r:embed="rId123"/>
+                          <a:blip r:embed="rId128"/>
                           <a:stretch>
                             <a:fillRect/>
                           </a:stretch>
@@ -38517,7 +39570,7 @@
               <w:t xml:space="preserve">Figure 2: Linear model fit superimposed on data partitions</w:t>
             </w:r>
           </w:p>
-          <w:bookmarkEnd w:id="126"/>
+          <w:bookmarkEnd w:id="131"/>
         </w:tc>
       </w:tr>
     </w:tbl>
@@ -38542,7 +39595,7 @@
       <w:tr>
         <w:tc>
           <w:tcPr/>
-          <w:bookmarkStart w:id="130" w:name="fig-quadratic-model-superimposed"/>
+          <w:bookmarkStart w:id="135" w:name="fig-quadratic-model-superimposed"/>
           <w:p>
             <w:pPr>
               <w:pStyle w:val="SourceCode"/>
@@ -38582,18 +39635,18 @@
                 <wp:inline>
                   <wp:extent cx="4620126" cy="3696101"/>
                   <wp:effectExtent b="0" l="0" r="0" t="0"/>
-                  <wp:docPr descr="" title="" id="128" name="Picture"/>
+                  <wp:docPr descr="" title="" id="133" name="Picture"/>
                   <a:graphic>
                     <a:graphicData uri="http://schemas.openxmlformats.org/drawingml/2006/picture">
                       <pic:pic>
                         <pic:nvPicPr>
-                          <pic:cNvPr descr="model-validation_files/figure-docx/unnamed-chunk-4-1.png" id="129" name="Picture"/>
+                          <pic:cNvPr descr="model-validation_files/figure-docx/unnamed-chunk-4-1.png" id="134" name="Picture"/>
                           <pic:cNvPicPr>
                             <a:picLocks noChangeArrowheads="1" noChangeAspect="1"/>
                           </pic:cNvPicPr>
                         </pic:nvPicPr>
                         <pic:blipFill>
-                          <a:blip r:embed="rId127"/>
+                          <a:blip r:embed="rId132"/>
                           <a:stretch>
                             <a:fillRect/>
                           </a:stretch>
@@ -38633,7 +39686,7 @@
               <w:t xml:space="preserve">Figure 3: Quadratic model fit superimposed on data partitions</w:t>
             </w:r>
           </w:p>
-          <w:bookmarkEnd w:id="130"/>
+          <w:bookmarkEnd w:id="135"/>
         </w:tc>
       </w:tr>
     </w:tbl>
@@ -38658,7 +39711,7 @@
       <w:tr>
         <w:tc>
           <w:tcPr/>
-          <w:bookmarkStart w:id="134" w:name="fig-cubic-model-superimposed"/>
+          <w:bookmarkStart w:id="139" w:name="fig-cubic-model-superimposed"/>
           <w:p>
             <w:pPr>
               <w:pStyle w:val="SourceCode"/>
@@ -38698,18 +39751,18 @@
                 <wp:inline>
                   <wp:extent cx="4620126" cy="3696101"/>
                   <wp:effectExtent b="0" l="0" r="0" t="0"/>
-                  <wp:docPr descr="" title="" id="132" name="Picture"/>
+                  <wp:docPr descr="" title="" id="137" name="Picture"/>
                   <a:graphic>
                     <a:graphicData uri="http://schemas.openxmlformats.org/drawingml/2006/picture">
                       <pic:pic>
                         <pic:nvPicPr>
-                          <pic:cNvPr descr="model-validation_files/figure-docx/unnamed-chunk-5-1.png" id="133" name="Picture"/>
+                          <pic:cNvPr descr="model-validation_files/figure-docx/unnamed-chunk-5-1.png" id="138" name="Picture"/>
                           <pic:cNvPicPr>
                             <a:picLocks noChangeArrowheads="1" noChangeAspect="1"/>
                           </pic:cNvPicPr>
                         </pic:nvPicPr>
                         <pic:blipFill>
-                          <a:blip r:embed="rId131"/>
+                          <a:blip r:embed="rId136"/>
                           <a:stretch>
                             <a:fillRect/>
                           </a:stretch>
@@ -38749,7 +39802,7 @@
               <w:t xml:space="preserve">Figure 4: Cubic model fit superimposed on data partitions</w:t>
             </w:r>
           </w:p>
-          <w:bookmarkEnd w:id="134"/>
+          <w:bookmarkEnd w:id="139"/>
         </w:tc>
       </w:tr>
     </w:tbl>
@@ -38774,7 +39827,7 @@
       <w:tr>
         <w:tc>
           <w:tcPr/>
-          <w:bookmarkStart w:id="138" w:name="fig-quartic-model-superimposed"/>
+          <w:bookmarkStart w:id="143" w:name="fig-quartic-model-superimposed"/>
           <w:p>
             <w:pPr>
               <w:pStyle w:val="SourceCode"/>
@@ -38814,18 +39867,18 @@
                 <wp:inline>
                   <wp:extent cx="4620126" cy="3696101"/>
                   <wp:effectExtent b="0" l="0" r="0" t="0"/>
-                  <wp:docPr descr="" title="" id="136" name="Picture"/>
+                  <wp:docPr descr="" title="" id="141" name="Picture"/>
                   <a:graphic>
                     <a:graphicData uri="http://schemas.openxmlformats.org/drawingml/2006/picture">
                       <pic:pic>
                         <pic:nvPicPr>
-                          <pic:cNvPr descr="model-validation_files/figure-docx/unnamed-chunk-6-1.png" id="137" name="Picture"/>
+                          <pic:cNvPr descr="model-validation_files/figure-docx/unnamed-chunk-6-1.png" id="142" name="Picture"/>
                           <pic:cNvPicPr>
                             <a:picLocks noChangeArrowheads="1" noChangeAspect="1"/>
                           </pic:cNvPicPr>
                         </pic:nvPicPr>
                         <pic:blipFill>
-                          <a:blip r:embed="rId135"/>
+                          <a:blip r:embed="rId140"/>
                           <a:stretch>
                             <a:fillRect/>
                           </a:stretch>
@@ -38865,7 +39918,7 @@
               <w:t xml:space="preserve">Figure 5: Quartic model fit superimposed on data partitions</w:t>
             </w:r>
           </w:p>
-          <w:bookmarkEnd w:id="138"/>
+          <w:bookmarkEnd w:id="143"/>
         </w:tc>
       </w:tr>
     </w:tbl>
@@ -38890,7 +39943,7 @@
       <w:tr>
         <w:tc>
           <w:tcPr/>
-          <w:bookmarkStart w:id="139" w:name="tbl-train-validation-results"/>
+          <w:bookmarkStart w:id="144" w:name="tbl-train-validation-results"/>
           <w:p>
             <w:pPr>
               <w:jc w:val="center"/>
@@ -38979,7 +40032,7 @@
               <w:t xml:space="preserve">#&gt; 4 quartic            1.90            3.97</w:t>
             </w:r>
           </w:p>
-          <w:bookmarkEnd w:id="139"/>
+          <w:bookmarkEnd w:id="144"/>
         </w:tc>
       </w:tr>
     </w:tbl>
@@ -39048,7 +40101,7 @@
       <w:tr>
         <w:tc>
           <w:tcPr/>
-          <w:bookmarkStart w:id="140" w:name="tbl-train-validation-test-rmse"/>
+          <w:bookmarkStart w:id="145" w:name="tbl-train-validation-test-rmse"/>
           <w:p>
             <w:pPr>
               <w:jc w:val="center"/>
@@ -39125,7 +40178,7 @@
               <w:t xml:space="preserve">#&gt; 2 test       linear  2.44</w:t>
             </w:r>
           </w:p>
-          <w:bookmarkEnd w:id="140"/>
+          <w:bookmarkEnd w:id="145"/>
         </w:tc>
       </w:tr>
     </w:tbl>
@@ -39178,18 +40231,18 @@
                 <wp:inline>
                   <wp:extent cx="152400" cy="152400"/>
                   <wp:effectExtent b="0" l="0" r="0" t="0"/>
-                  <wp:docPr descr="" title="" id="142" name="Picture"/>
+                  <wp:docPr descr="" title="" id="147" name="Picture"/>
                   <a:graphic>
                     <a:graphicData uri="http://schemas.openxmlformats.org/drawingml/2006/picture">
                       <pic:pic>
                         <pic:nvPicPr>
-                          <pic:cNvPr descr="/opt/quarto/share/formats/docx/note.png" id="143" name="Picture"/>
+                          <pic:cNvPr descr="/opt/quarto/share/formats/docx/note.png" id="148" name="Picture"/>
                           <pic:cNvPicPr>
                             <a:picLocks noChangeArrowheads="1" noChangeAspect="1"/>
                           </pic:cNvPicPr>
                         </pic:nvPicPr>
                         <pic:blipFill>
-                          <a:blip r:embed="rId141"/>
+                          <a:blip r:embed="rId146"/>
                           <a:stretch>
                             <a:fillRect/>
                           </a:stretch>
@@ -39262,9 +40315,9 @@
         </w:tc>
       </w:tr>
     </w:tbl>
-    <w:bookmarkEnd w:id="144"/>
-    <w:bookmarkEnd w:id="145"/>
-    <w:bookmarkStart w:id="181" w:name="sec-kfold"/>
+    <w:bookmarkEnd w:id="149"/>
+    <w:bookmarkEnd w:id="150"/>
+    <w:bookmarkStart w:id="186" w:name="sec-kfold"/>
     <w:p>
       <w:pPr>
         <w:pStyle w:val="Heading2"/>
@@ -39284,7 +40337,7 @@
         <w:t xml:space="preserve">-fold cross-validation</w:t>
       </w:r>
     </w:p>
-    <w:bookmarkStart w:id="146" w:name="exr-kfold"/>
+    <w:bookmarkStart w:id="151" w:name="exr-kfold"/>
     <w:p>
       <w:pPr>
         <w:pStyle w:val="FirstParagraph"/>
@@ -39435,8 +40488,8 @@
         <w:t xml:space="preserve">How many times is a given car used for fitting, and how many times for prediction?</w:t>
       </w:r>
     </w:p>
-    <w:bookmarkEnd w:id="146"/>
-    <w:bookmarkStart w:id="147" w:name="sol-kfold"/>
+    <w:bookmarkEnd w:id="151"/>
+    <w:bookmarkStart w:id="152" w:name="sol-kfold"/>
     <w:p>
       <w:pPr>
         <w:pStyle w:val="FirstParagraph"/>
@@ -39610,8 +40663,8 @@
         <w:t xml:space="preserve">fits.</w:t>
       </w:r>
     </w:p>
-    <w:bookmarkEnd w:id="147"/>
-    <w:bookmarkStart w:id="149" w:name="def-folds"/>
+    <w:bookmarkEnd w:id="152"/>
+    <w:bookmarkStart w:id="154" w:name="def-folds"/>
     <w:p>
       <w:pPr>
         <w:pStyle w:val="FirstParagraph"/>
@@ -39621,7 +40674,7 @@
           <w:b/>
           <w:bCs/>
         </w:rPr>
-        <w:t xml:space="preserve">Definition 25 (Folds)</w:t>
+        <w:t xml:space="preserve">Definition 27 (Folds)</w:t>
       </w:r>
       <w:r>
         <w:t xml:space="preserve"> </w:t>
@@ -39800,7 +40853,7 @@
       <w:pPr>
         <w:pStyle w:val="BodyText"/>
       </w:pPr>
-      <w:bookmarkStart w:id="148" w:name="eq-folds"/>
+      <w:bookmarkStart w:id="153" w:name="eq-folds"/>
       <m:oMathPara>
         <m:oMathParaPr>
           <m:jc m:val="center"/>
@@ -39881,7 +40934,7 @@
             <m:t>(</m:t>
           </m:r>
           <m:r>
-            <m:t>27</m:t>
+            <m:t>29</m:t>
           </m:r>
           <m:r>
             <m:rPr>
@@ -39891,10 +40944,10 @@
           </m:r>
         </m:oMath>
       </m:oMathPara>
-      <w:bookmarkEnd w:id="148"/>
+      <w:bookmarkEnd w:id="153"/>
     </w:p>
-    <w:bookmarkEnd w:id="149"/>
-    <w:bookmarkStart w:id="150" w:name="rem-source-folds"/>
+    <w:bookmarkEnd w:id="154"/>
+    <w:bookmarkStart w:id="155" w:name="rem-source-folds"/>
     <w:p>
       <w:pPr>
         <w:pStyle w:val="FirstParagraph"/>
@@ -39904,7 +40957,7 @@
           <w:i/>
           <w:iCs/>
         </w:rPr>
-        <w:t xml:space="preserve">Remark 16</w:t>
+        <w:t xml:space="preserve">Remark 17</w:t>
       </w:r>
       <w:r>
         <w:t xml:space="preserve"> (Source: Folds). </w:t>
@@ -39948,8 +41001,8 @@
         <w:t xml:space="preserve">roughly equal-sized parts.</w:t>
       </w:r>
     </w:p>
-    <w:bookmarkEnd w:id="150"/>
-    <w:bookmarkStart w:id="152" w:name="def-fold-size"/>
+    <w:bookmarkEnd w:id="155"/>
+    <w:bookmarkStart w:id="157" w:name="def-fold-size"/>
     <w:p>
       <w:pPr>
         <w:pStyle w:val="BodyText"/>
@@ -39959,7 +41012,7 @@
           <w:b/>
           <w:bCs/>
         </w:rPr>
-        <w:t xml:space="preserve">Definition 26 (Fold size)</w:t>
+        <w:t xml:space="preserve">Definition 28 (Fold size)</w:t>
       </w:r>
       <w:r>
         <w:t xml:space="preserve"> </w:t>
@@ -40043,7 +41096,7 @@
       <w:pPr>
         <w:pStyle w:val="BodyText"/>
       </w:pPr>
-      <w:bookmarkStart w:id="151" w:name="eq-fold-size"/>
+      <w:bookmarkStart w:id="156" w:name="eq-fold-size"/>
       <m:oMathPara>
         <m:oMathParaPr>
           <m:jc m:val="center"/>
@@ -40128,7 +41181,7 @@
             <m:t>(</m:t>
           </m:r>
           <m:r>
-            <m:t>28</m:t>
+            <m:t>30</m:t>
           </m:r>
           <m:r>
             <m:rPr>
@@ -40138,10 +41191,10 @@
           </m:r>
         </m:oMath>
       </m:oMathPara>
-      <w:bookmarkEnd w:id="151"/>
+      <w:bookmarkEnd w:id="156"/>
     </w:p>
-    <w:bookmarkEnd w:id="152"/>
-    <w:bookmarkStart w:id="154" w:name="def-fold-assignment"/>
+    <w:bookmarkEnd w:id="157"/>
+    <w:bookmarkStart w:id="159" w:name="def-fold-assignment"/>
     <w:p>
       <w:pPr>
         <w:pStyle w:val="FirstParagraph"/>
@@ -40151,7 +41204,7 @@
           <w:b/>
           <w:bCs/>
         </w:rPr>
-        <w:t xml:space="preserve">Definition 27 (Fold assignment)</w:t>
+        <w:t xml:space="preserve">Definition 29 (Fold assignment)</w:t>
       </w:r>
       <w:r>
         <w:t xml:space="preserve"> </w:t>
@@ -40296,7 +41349,7 @@
       <w:pPr>
         <w:pStyle w:val="BodyText"/>
       </w:pPr>
-      <w:bookmarkStart w:id="153" w:name="eq-fold-assignment"/>
+      <w:bookmarkStart w:id="158" w:name="eq-fold-assignment"/>
       <m:oMathPara>
         <m:oMathParaPr>
           <m:jc m:val="center"/>
@@ -40362,7 +41415,7 @@
             <m:t>(</m:t>
           </m:r>
           <m:r>
-            <m:t>29</m:t>
+            <m:t>31</m:t>
           </m:r>
           <m:r>
             <m:rPr>
@@ -40372,10 +41425,10 @@
           </m:r>
         </m:oMath>
       </m:oMathPara>
-      <w:bookmarkEnd w:id="153"/>
+      <w:bookmarkEnd w:id="158"/>
     </w:p>
-    <w:bookmarkEnd w:id="154"/>
-    <w:bookmarkStart w:id="155" w:name="rem-source-fold-assignment"/>
+    <w:bookmarkEnd w:id="159"/>
+    <w:bookmarkStart w:id="160" w:name="rem-source-fold-assignment"/>
     <w:p>
       <w:pPr>
         <w:pStyle w:val="FirstParagraph"/>
@@ -40385,7 +41438,7 @@
           <w:i/>
           <w:iCs/>
         </w:rPr>
-        <w:t xml:space="preserve">Remark 17</w:t>
+        <w:t xml:space="preserve">Remark 18</w:t>
       </w:r>
       <w:r>
         <w:t xml:space="preserve"> (Source: Fold assignment). </w:t>
@@ -40436,8 +41489,8 @@
         <w:t xml:space="preserve">.</w:t>
       </w:r>
     </w:p>
-    <w:bookmarkEnd w:id="155"/>
-    <w:bookmarkStart w:id="157" w:name="def-fold-out-rule"/>
+    <w:bookmarkEnd w:id="160"/>
+    <w:bookmarkStart w:id="162" w:name="def-fold-out-rule"/>
     <w:p>
       <w:pPr>
         <w:pStyle w:val="BodyText"/>
@@ -40447,7 +41500,7 @@
           <w:b/>
           <w:bCs/>
         </w:rPr>
-        <w:t xml:space="preserve">Definition 28 (Fold-out rule)</w:t>
+        <w:t xml:space="preserve">Definition 30 (Fold-out rule)</w:t>
       </w:r>
       <w:r>
         <w:t xml:space="preserve"> </w:t>
@@ -40629,7 +41682,7 @@
       <w:pPr>
         <w:pStyle w:val="BodyText"/>
       </w:pPr>
-      <w:bookmarkStart w:id="156" w:name="eq-fold-out-rule"/>
+      <w:bookmarkStart w:id="161" w:name="eq-fold-out-rule"/>
       <m:oMathPara>
         <m:oMathParaPr>
           <m:jc m:val="center"/>
@@ -40852,7 +41905,7 @@
             <m:t>(</m:t>
           </m:r>
           <m:r>
-            <m:t>30</m:t>
+            <m:t>32</m:t>
           </m:r>
           <m:r>
             <m:rPr>
@@ -40862,10 +41915,10 @@
           </m:r>
         </m:oMath>
       </m:oMathPara>
-      <w:bookmarkEnd w:id="156"/>
+      <w:bookmarkEnd w:id="161"/>
     </w:p>
-    <w:bookmarkEnd w:id="157"/>
-    <w:bookmarkStart w:id="158" w:name="rem-source-fold-out-rule"/>
+    <w:bookmarkEnd w:id="162"/>
+    <w:bookmarkStart w:id="163" w:name="rem-source-fold-out-rule"/>
     <w:p>
       <w:pPr>
         <w:pStyle w:val="FirstParagraph"/>
@@ -40875,7 +41928,7 @@
           <w:i/>
           <w:iCs/>
         </w:rPr>
-        <w:t xml:space="preserve">Remark 18</w:t>
+        <w:t xml:space="preserve">Remark 19</w:t>
       </w:r>
       <w:r>
         <w:t xml:space="preserve"> (Source: Fold-out rule). </w:t>
@@ -40937,8 +41990,8 @@
         <w:t xml:space="preserve">.</w:t>
       </w:r>
     </w:p>
-    <w:bookmarkEnd w:id="158"/>
-    <w:bookmarkStart w:id="159" w:name="def-kfold"/>
+    <w:bookmarkEnd w:id="163"/>
+    <w:bookmarkStart w:id="164" w:name="def-kfold"/>
     <w:p>
       <w:pPr>
         <w:pStyle w:val="BodyText"/>
@@ -40948,7 +42001,7 @@
           <w:b/>
           <w:bCs/>
         </w:rPr>
-        <w:t xml:space="preserve">Definition 29 (</w:t>
+        <w:t xml:space="preserve">Definition 31 (</w:t>
       </w:r>
       <m:oMath>
         <m:r>
@@ -41285,8 +42338,8 @@
         <w:t xml:space="preserve">Compute a summary prediction-error measure across all folds.</w:t>
       </w:r>
     </w:p>
-    <w:bookmarkEnd w:id="159"/>
-    <w:bookmarkStart w:id="160" w:name="rem-kfold-vs-validation-set"/>
+    <w:bookmarkEnd w:id="164"/>
+    <w:bookmarkStart w:id="165" w:name="rem-kfold-vs-validation-set"/>
     <w:p>
       <w:pPr>
         <w:pStyle w:val="FirstParagraph"/>
@@ -41296,7 +42349,7 @@
           <w:i/>
           <w:iCs/>
         </w:rPr>
-        <w:t xml:space="preserve">Remark 19</w:t>
+        <w:t xml:space="preserve">Remark 20</w:t>
       </w:r>
       <w:r>
         <w:t xml:space="preserve"> (Cross-validation instead of a single validation set). </w:t>
@@ -41388,8 +42441,8 @@
         <w:t xml:space="preserve">give 4 fits on 24 cars each.</w:t>
       </w:r>
     </w:p>
-    <w:bookmarkEnd w:id="160"/>
-    <w:bookmarkStart w:id="162" w:name="def-cv-estimate"/>
+    <w:bookmarkEnd w:id="165"/>
+    <w:bookmarkStart w:id="167" w:name="def-cv-estimate"/>
     <w:p>
       <w:pPr>
         <w:pStyle w:val="BodyText"/>
@@ -41399,7 +42452,7 @@
           <w:b/>
           <w:bCs/>
         </w:rPr>
-        <w:t xml:space="preserve">Definition 30 (Cross-validation estimate)</w:t>
+        <w:t xml:space="preserve">Definition 32 (Cross-validation estimate)</w:t>
       </w:r>
       <w:r>
         <w:t xml:space="preserve"> </w:t>
@@ -41605,7 +42658,7 @@
       <w:pPr>
         <w:pStyle w:val="BodyText"/>
       </w:pPr>
-      <w:bookmarkStart w:id="161" w:name="eq-cv-estimate"/>
+      <w:bookmarkStart w:id="166" w:name="eq-cv-estimate"/>
       <m:oMathPara>
         <m:oMathParaPr>
           <m:jc m:val="center"/>
@@ -41858,7 +42911,7 @@
             <m:t>(</m:t>
           </m:r>
           <m:r>
-            <m:t>31</m:t>
+            <m:t>33</m:t>
           </m:r>
           <m:r>
             <m:rPr>
@@ -41868,10 +42921,10 @@
           </m:r>
         </m:oMath>
       </m:oMathPara>
-      <w:bookmarkEnd w:id="161"/>
+      <w:bookmarkEnd w:id="166"/>
     </w:p>
-    <w:bookmarkEnd w:id="162"/>
-    <w:bookmarkStart w:id="163" w:name="rem-source-cv-estimate"/>
+    <w:bookmarkEnd w:id="167"/>
+    <w:bookmarkStart w:id="168" w:name="rem-source-cv-estimate"/>
     <w:p>
       <w:pPr>
         <w:pStyle w:val="FirstParagraph"/>
@@ -41881,7 +42934,7 @@
           <w:i/>
           <w:iCs/>
         </w:rPr>
-        <w:t xml:space="preserve">Remark 20</w:t>
+        <w:t xml:space="preserve">Remark 21</w:t>
       </w:r>
       <w:r>
         <w:t xml:space="preserve"> (Source: Cross-validation estimate). </w:t>
@@ -41923,8 +42976,8 @@
         <w:t xml:space="preserve">.</w:t>
       </w:r>
     </w:p>
-    <w:bookmarkEnd w:id="163"/>
-    <w:bookmarkStart w:id="164" w:name="exr-cv-estimate-by-fold"/>
+    <w:bookmarkEnd w:id="168"/>
+    <w:bookmarkStart w:id="169" w:name="exr-cv-estimate-by-fold"/>
     <w:p>
       <w:pPr>
         <w:pStyle w:val="BodyText"/>
@@ -41961,7 +43014,7 @@
           <w:rPr>
             <w:rStyle w:val="Hyperlink"/>
           </w:rPr>
-          <w:t xml:space="preserve">Equation 31</w:t>
+          <w:t xml:space="preserve">Equation 33</w:t>
         </w:r>
       </w:hyperlink>
       <w:r>
@@ -42129,8 +43182,8 @@
         <w:t xml:space="preserve">.</w:t>
       </w:r>
     </w:p>
-    <w:bookmarkEnd w:id="164"/>
-    <w:bookmarkStart w:id="165" w:name="sol-cv-estimate-by-fold"/>
+    <w:bookmarkEnd w:id="169"/>
+    <w:bookmarkStart w:id="170" w:name="sol-cv-estimate-by-fold"/>
     <w:p>
       <w:pPr>
         <w:pStyle w:val="BodyText"/>
@@ -42228,7 +43281,7 @@
           <w:rPr>
             <w:rStyle w:val="Hyperlink"/>
           </w:rPr>
-          <w:t xml:space="preserve">Definition 25</w:t>
+          <w:t xml:space="preserve">Definition 27</w:t>
         </w:r>
       </w:hyperlink>
       <w:r>
@@ -42254,7 +43307,7 @@
           <w:rPr>
             <w:rStyle w:val="Hyperlink"/>
           </w:rPr>
-          <w:t xml:space="preserve">Equation 31</w:t>
+          <w:t xml:space="preserve">Equation 33</w:t>
         </w:r>
       </w:hyperlink>
       <w:r>
@@ -42310,7 +43363,7 @@
           <w:rPr>
             <w:rStyle w:val="Hyperlink"/>
           </w:rPr>
-          <w:t xml:space="preserve">Equation 29</w:t>
+          <w:t xml:space="preserve">Equation 31</w:t>
         </w:r>
       </w:hyperlink>
       <w:r>
@@ -43291,8 +44344,8 @@
         <w:t xml:space="preserve">so each inner sum uses a single fitted rule.</w:t>
       </w:r>
     </w:p>
-    <w:bookmarkEnd w:id="165"/>
-    <w:bookmarkStart w:id="167" w:name="thm-cv-estimate-by-fold"/>
+    <w:bookmarkEnd w:id="170"/>
+    <w:bookmarkStart w:id="172" w:name="thm-cv-estimate-by-fold"/>
     <w:p>
       <w:pPr>
         <w:pStyle w:val="BodyText"/>
@@ -43381,7 +44434,7 @@
       <w:pPr>
         <w:pStyle w:val="BodyText"/>
       </w:pPr>
-      <w:bookmarkStart w:id="166" w:name="eq-cv-estimate-by-fold"/>
+      <w:bookmarkStart w:id="171" w:name="eq-cv-estimate-by-fold"/>
       <m:oMathPara>
         <m:oMathParaPr>
           <m:jc m:val="center"/>
@@ -43644,7 +44697,7 @@
             <m:t>(</m:t>
           </m:r>
           <m:r>
-            <m:t>32</m:t>
+            <m:t>34</m:t>
           </m:r>
           <m:r>
             <m:rPr>
@@ -43654,9 +44707,9 @@
           </m:r>
         </m:oMath>
       </m:oMathPara>
-      <w:bookmarkEnd w:id="166"/>
+      <w:bookmarkEnd w:id="171"/>
     </w:p>
-    <w:bookmarkEnd w:id="167"/>
+    <w:bookmarkEnd w:id="172"/>
     <w:p>
       <w:pPr>
         <w:pStyle w:val="FirstParagraph"/>
@@ -43689,7 +44742,7 @@
         <w:t xml:space="preserve">.</w:t>
       </w:r>
     </w:p>
-    <w:bookmarkStart w:id="169" w:name="def-fold-mse"/>
+    <w:bookmarkStart w:id="174" w:name="def-fold-mse"/>
     <w:p>
       <w:pPr>
         <w:pStyle w:val="BodyText"/>
@@ -43699,7 +44752,7 @@
           <w:b/>
           <w:bCs/>
         </w:rPr>
-        <w:t xml:space="preserve">Definition 31 (Fold mean squared error)</w:t>
+        <w:t xml:space="preserve">Definition 33 (Fold mean squared error)</w:t>
       </w:r>
       <w:r>
         <w:t xml:space="preserve"> </w:t>
@@ -43857,7 +44910,7 @@
       <w:pPr>
         <w:pStyle w:val="BodyText"/>
       </w:pPr>
-      <w:bookmarkStart w:id="168" w:name="eq-fold-mse"/>
+      <w:bookmarkStart w:id="173" w:name="eq-fold-mse"/>
       <m:oMathPara>
         <m:oMathParaPr>
           <m:jc m:val="center"/>
@@ -44087,7 +45140,7 @@
             <m:t>(</m:t>
           </m:r>
           <m:r>
-            <m:t>33</m:t>
+            <m:t>35</m:t>
           </m:r>
           <m:r>
             <m:rPr>
@@ -44097,10 +45150,10 @@
           </m:r>
         </m:oMath>
       </m:oMathPara>
-      <w:bookmarkEnd w:id="168"/>
+      <w:bookmarkEnd w:id="173"/>
     </w:p>
-    <w:bookmarkEnd w:id="169"/>
-    <w:bookmarkStart w:id="170" w:name="rem-source-fold-mse"/>
+    <w:bookmarkEnd w:id="174"/>
+    <w:bookmarkStart w:id="175" w:name="rem-source-fold-mse"/>
     <w:p>
       <w:pPr>
         <w:pStyle w:val="FirstParagraph"/>
@@ -44110,7 +45163,7 @@
           <w:i/>
           <w:iCs/>
         </w:rPr>
-        <w:t xml:space="preserve">Remark 21</w:t>
+        <w:t xml:space="preserve">Remark 22</w:t>
       </w:r>
       <w:r>
         <w:t xml:space="preserve"> (Source: Fold mean squared error). </w:t>
@@ -44180,8 +45233,8 @@
         <w:t xml:space="preserve">.</w:t>
       </w:r>
     </w:p>
-    <w:bookmarkEnd w:id="170"/>
-    <w:bookmarkStart w:id="171" w:name="rem-cv-estimate"/>
+    <w:bookmarkEnd w:id="175"/>
+    <w:bookmarkStart w:id="176" w:name="rem-cv-estimate"/>
     <w:p>
       <w:pPr>
         <w:pStyle w:val="BodyText"/>
@@ -44191,7 +45244,7 @@
           <w:i/>
           <w:iCs/>
         </w:rPr>
-        <w:t xml:space="preserve">Remark 22</w:t>
+        <w:t xml:space="preserve">Remark 23</w:t>
       </w:r>
       <w:r>
         <w:t xml:space="preserve"> (What the cross-validation estimate estimates). </w:t>
@@ -44207,7 +45260,7 @@
           <w:rPr>
             <w:rStyle w:val="Hyperlink"/>
           </w:rPr>
-          <w:t xml:space="preserve">Equation 31</w:t>
+          <w:t xml:space="preserve">Equation 33</w:t>
         </w:r>
       </w:hyperlink>
       <w:r>
@@ -44860,8 +45913,8 @@
         <w:t xml:space="preserve">use.</w:t>
       </w:r>
     </w:p>
-    <w:bookmarkEnd w:id="171"/>
-    <w:bookmarkStart w:id="172" w:name="rem-choosing-k"/>
+    <w:bookmarkEnd w:id="176"/>
+    <w:bookmarkStart w:id="177" w:name="rem-choosing-k"/>
     <w:p>
       <w:pPr>
         <w:pStyle w:val="BodyText"/>
@@ -44871,7 +45924,7 @@
           <w:i/>
           <w:iCs/>
         </w:rPr>
-        <w:t xml:space="preserve">Remark 23</w:t>
+        <w:t xml:space="preserve">Remark 24</w:t>
       </w:r>
       <w:r>
         <w:t xml:space="preserve"> (Choosing the number of folds). </w:t>
@@ -44938,7 +45991,7 @@
           <w:rPr>
             <w:rStyle w:val="Hyperlink"/>
           </w:rPr>
-          <w:t xml:space="preserve">Equation 31</w:t>
+          <w:t xml:space="preserve">Equation 33</w:t>
         </w:r>
       </w:hyperlink>
       <w:r>
@@ -45268,8 +46321,8 @@
         <w:t xml:space="preserve">is the usual compromise.</w:t>
       </w:r>
     </w:p>
-    <w:bookmarkEnd w:id="172"/>
-    <w:bookmarkStart w:id="177" w:name="exm-kfold-simulated"/>
+    <w:bookmarkEnd w:id="177"/>
+    <w:bookmarkStart w:id="182" w:name="exm-kfold-simulated"/>
     <w:p>
       <w:pPr>
         <w:pStyle w:val="BodyText"/>
@@ -45423,7 +46476,7 @@
           <w:rPr>
             <w:rStyle w:val="Hyperlink"/>
           </w:rPr>
-          <w:t xml:space="preserve">Equation 31</w:t>
+          <w:t xml:space="preserve">Equation 33</w:t>
         </w:r>
       </w:hyperlink>
       <w:r>
@@ -46501,7 +47554,7 @@
       <w:tr>
         <w:tc>
           <w:tcPr/>
-          <w:bookmarkStart w:id="176" w:name="fig-cv-simulated"/>
+          <w:bookmarkStart w:id="181" w:name="fig-cv-simulated"/>
           <w:p>
             <w:pPr>
               <w:pStyle w:val="SourceCode"/>
@@ -47447,18 +48500,18 @@
                 <wp:inline>
                   <wp:extent cx="4620126" cy="3696101"/>
                   <wp:effectExtent b="0" l="0" r="0" t="0"/>
-                  <wp:docPr descr="" title="" id="174" name="Picture"/>
+                  <wp:docPr descr="" title="" id="179" name="Picture"/>
                   <a:graphic>
                     <a:graphicData uri="http://schemas.openxmlformats.org/drawingml/2006/picture">
                       <pic:pic>
                         <pic:nvPicPr>
-                          <pic:cNvPr descr="model-validation_files/figure-docx/cv-simulated-plot-1.png" id="175" name="Picture"/>
+                          <pic:cNvPr descr="model-validation_files/figure-docx/cv-simulated-plot-1.png" id="180" name="Picture"/>
                           <pic:cNvPicPr>
                             <a:picLocks noChangeArrowheads="1" noChangeAspect="1"/>
                           </pic:cNvPicPr>
                         </pic:nvPicPr>
                         <pic:blipFill>
-                          <a:blip r:embed="rId173"/>
+                          <a:blip r:embed="rId178"/>
                           <a:stretch>
                             <a:fillRect/>
                           </a:stretch>
@@ -47527,7 +48580,7 @@
               <w:t xml:space="preserve">could be computed from real data.</w:t>
             </w:r>
           </w:p>
-          <w:bookmarkEnd w:id="176"/>
+          <w:bookmarkEnd w:id="181"/>
         </w:tc>
       </w:tr>
     </w:tbl>
@@ -48014,7 +49067,7 @@
           <w:rPr>
             <w:rStyle w:val="Hyperlink"/>
           </w:rPr>
-          <w:t xml:space="preserve">Remark 22</w:t>
+          <w:t xml:space="preserve">Remark 23</w:t>
         </w:r>
       </w:hyperlink>
       <w:r>
@@ -48078,7 +49131,7 @@
           <w:rPr>
             <w:rStyle w:val="Hyperlink"/>
           </w:rPr>
-          <w:t xml:space="preserve">Remark 22</w:t>
+          <w:t xml:space="preserve">Remark 23</w:t>
         </w:r>
       </w:hyperlink>
       <w:r>
@@ -49428,8 +50481,8 @@
         <w:t xml:space="preserve">new ones.</w:t>
       </w:r>
     </w:p>
-    <w:bookmarkEnd w:id="177"/>
-    <w:bookmarkStart w:id="180" w:name="exm-kfold-mtcars"/>
+    <w:bookmarkEnd w:id="182"/>
+    <w:bookmarkStart w:id="185" w:name="exm-kfold-mtcars"/>
     <w:p>
       <w:pPr>
         <w:pStyle w:val="BodyText"/>
@@ -49632,7 +50685,7 @@
       <w:tr>
         <w:tc>
           <w:tcPr/>
-          <w:bookmarkStart w:id="178" w:name="tbl-cv-mtcars-repeats"/>
+          <w:bookmarkStart w:id="183" w:name="tbl-cv-mtcars-repeats"/>
           <w:p>
             <w:pPr>
               <w:jc w:val="center"/>
@@ -50288,7 +51341,7 @@
               <w:t xml:space="preserve">#&gt; 5         5     3.38     2.74     2.78     2.81</w:t>
             </w:r>
           </w:p>
-          <w:bookmarkEnd w:id="178"/>
+          <w:bookmarkEnd w:id="183"/>
         </w:tc>
       </w:tr>
     </w:tbl>
@@ -50313,7 +51366,7 @@
       <w:tr>
         <w:tc>
           <w:tcPr/>
-          <w:bookmarkStart w:id="179" w:name="tbl-cv-mtcars"/>
+          <w:bookmarkStart w:id="184" w:name="tbl-cv-mtcars"/>
           <w:p>
             <w:pPr>
               <w:jc w:val="center"/>
@@ -50669,7 +51722,7 @@
               <w:t xml:space="preserve">#&gt; 5         5 2       2.74</w:t>
             </w:r>
           </w:p>
-          <w:bookmarkEnd w:id="179"/>
+          <w:bookmarkEnd w:id="184"/>
         </w:tc>
       </w:tr>
     </w:tbl>
@@ -51293,7 +52346,7 @@
           <w:rPr>
             <w:rStyle w:val="Hyperlink"/>
           </w:rPr>
-          <w:t xml:space="preserve">Equation 31</w:t>
+          <w:t xml:space="preserve">Equation 33</w:t>
         </w:r>
       </w:hyperlink>
       <w:r>
@@ -51359,9 +52412,9 @@
         <w:t xml:space="preserve">may not survive a different split.</w:t>
       </w:r>
     </w:p>
-    <w:bookmarkEnd w:id="180"/>
-    <w:bookmarkEnd w:id="181"/>
-    <w:bookmarkStart w:id="208" w:name="sec-loocv"/>
+    <w:bookmarkEnd w:id="185"/>
+    <w:bookmarkEnd w:id="186"/>
+    <w:bookmarkStart w:id="213" w:name="sec-loocv"/>
     <w:p>
       <w:pPr>
         <w:pStyle w:val="Heading2"/>
@@ -51370,7 +52423,7 @@
         <w:t xml:space="preserve">7 Leave-one-out cross-validation</w:t>
       </w:r>
     </w:p>
-    <w:bookmarkStart w:id="182" w:name="exr-loocv"/>
+    <w:bookmarkStart w:id="187" w:name="exr-loocv"/>
     <w:p>
       <w:pPr>
         <w:pStyle w:val="FirstParagraph"/>
@@ -51573,15 +52626,15 @@
           <w:rPr>
             <w:rStyle w:val="Hyperlink"/>
           </w:rPr>
-          <w:t xml:space="preserve">Equation 31</w:t>
+          <w:t xml:space="preserve">Equation 33</w:t>
         </w:r>
       </w:hyperlink>
       <w:r>
         <w:t xml:space="preserve">) differ?</w:t>
       </w:r>
     </w:p>
-    <w:bookmarkEnd w:id="182"/>
-    <w:bookmarkStart w:id="183" w:name="sol-loocv"/>
+    <w:bookmarkEnd w:id="187"/>
+    <w:bookmarkStart w:id="188" w:name="sol-loocv"/>
     <w:p>
       <w:pPr>
         <w:pStyle w:val="FirstParagraph"/>
@@ -51742,7 +52795,7 @@
           <w:rPr>
             <w:rStyle w:val="Hyperlink"/>
           </w:rPr>
-          <w:t xml:space="preserve">Equation 31</w:t>
+          <w:t xml:space="preserve">Equation 33</w:t>
         </w:r>
       </w:hyperlink>
       <w:r>
@@ -51778,8 +52831,8 @@
         <w:t xml:space="preserve">the estimate is not random.</w:t>
       </w:r>
     </w:p>
-    <w:bookmarkEnd w:id="183"/>
-    <w:bookmarkStart w:id="185" w:name="def-loocv"/>
+    <w:bookmarkEnd w:id="188"/>
+    <w:bookmarkStart w:id="190" w:name="def-loocv"/>
     <w:p>
       <w:pPr>
         <w:pStyle w:val="FirstParagraph"/>
@@ -51789,7 +52842,7 @@
           <w:b/>
           <w:bCs/>
         </w:rPr>
-        <w:t xml:space="preserve">Definition 32 (Leave-one-out cross-validation)</w:t>
+        <w:t xml:space="preserve">Definition 34 (Leave-one-out cross-validation)</w:t>
       </w:r>
       <w:r>
         <w:t xml:space="preserve"> </w:t>
@@ -52053,7 +53106,7 @@
           <w:rPr>
             <w:rStyle w:val="Hyperlink"/>
           </w:rPr>
-          <w:t xml:space="preserve">Equation 31</w:t>
+          <w:t xml:space="preserve">Equation 33</w:t>
         </w:r>
       </w:hyperlink>
       <w:r>
@@ -52087,7 +53140,7 @@
       <w:pPr>
         <w:pStyle w:val="BodyText"/>
       </w:pPr>
-      <w:bookmarkStart w:id="184" w:name="eq-loocv"/>
+      <w:bookmarkStart w:id="189" w:name="eq-loocv"/>
       <m:oMathPara>
         <m:oMathParaPr>
           <m:jc m:val="center"/>
@@ -52327,7 +53380,7 @@
             <m:t>(</m:t>
           </m:r>
           <m:r>
-            <m:t>34</m:t>
+            <m:t>36</m:t>
           </m:r>
           <m:r>
             <m:rPr>
@@ -52337,7 +53390,7 @@
           </m:r>
         </m:oMath>
       </m:oMathPara>
-      <w:bookmarkEnd w:id="184"/>
+      <w:bookmarkEnd w:id="189"/>
     </w:p>
     <w:p>
       <w:pPr>
@@ -52356,8 +53409,8 @@
         <w:t xml:space="preserve">.</w:t>
       </w:r>
     </w:p>
-    <w:bookmarkEnd w:id="185"/>
-    <w:bookmarkStart w:id="186" w:name="lem-loocv-not-random"/>
+    <w:bookmarkEnd w:id="190"/>
+    <w:bookmarkStart w:id="191" w:name="lem-loocv-not-random"/>
     <w:p>
       <w:pPr>
         <w:pStyle w:val="BodyText"/>
@@ -52706,7 +53759,7 @@
         <w:t xml:space="preserve">.</w:t>
       </w:r>
     </w:p>
-    <w:bookmarkEnd w:id="186"/>
+    <w:bookmarkEnd w:id="191"/>
     <w:p>
       <w:pPr>
         <w:pStyle w:val="BodyText"/>
@@ -52766,7 +53819,7 @@
           <w:rPr>
             <w:rStyle w:val="Hyperlink"/>
           </w:rPr>
-          <w:t xml:space="preserve">Equation 31</w:t>
+          <w:t xml:space="preserve">Equation 33</w:t>
         </w:r>
       </w:hyperlink>
       <w:r>
@@ -52783,7 +53836,7 @@
           <w:rPr>
             <w:rStyle w:val="Hyperlink"/>
           </w:rPr>
-          <w:t xml:space="preserve">Equation 30</w:t>
+          <w:t xml:space="preserve">Equation 32</w:t>
         </w:r>
       </w:hyperlink>
       <w:r>
@@ -52867,7 +53920,7 @@
           <w:rPr>
             <w:rStyle w:val="Hyperlink"/>
           </w:rPr>
-          <w:t xml:space="preserve">Equation 27</w:t>
+          <w:t xml:space="preserve">Equation 29</w:t>
         </w:r>
       </w:hyperlink>
       <w:r>
@@ -52971,7 +54024,7 @@
           <w:rPr>
             <w:rStyle w:val="Hyperlink"/>
           </w:rPr>
-          <w:t xml:space="preserve">Equation 29</w:t>
+          <w:t xml:space="preserve">Equation 31</w:t>
         </w:r>
       </w:hyperlink>
       <w:r>
@@ -53503,7 +54556,7 @@
           <w:rPr>
             <w:rStyle w:val="Hyperlink"/>
           </w:rPr>
-          <w:t xml:space="preserve">Equation 30</w:t>
+          <w:t xml:space="preserve">Equation 32</w:t>
         </w:r>
       </w:hyperlink>
       <w:r>
@@ -53832,7 +54885,7 @@
           <w:rPr>
             <w:rStyle w:val="Hyperlink"/>
           </w:rPr>
-          <w:t xml:space="preserve">Equation 31</w:t>
+          <w:t xml:space="preserve">Equation 33</w:t>
         </w:r>
       </w:hyperlink>
       <w:r>
@@ -53938,7 +54991,7 @@
           <w:rPr>
             <w:rStyle w:val="Hyperlink"/>
           </w:rPr>
-          <w:t xml:space="preserve">Equation 31</w:t>
+          <w:t xml:space="preserve">Equation 33</w:t>
         </w:r>
       </w:hyperlink>
       <w:r>
@@ -54232,7 +55285,7 @@
         <w:t xml:space="preserve">fits, with the folds numbered differently.</w:t>
       </w:r>
     </w:p>
-    <w:bookmarkStart w:id="188" w:name="def-term-vector"/>
+    <w:bookmarkStart w:id="193" w:name="def-term-vector"/>
     <w:p>
       <w:pPr>
         <w:pStyle w:val="FirstParagraph"/>
@@ -54242,7 +55295,7 @@
           <w:b/>
           <w:bCs/>
         </w:rPr>
-        <w:t xml:space="preserve">Definition 33 (Term vector)</w:t>
+        <w:t xml:space="preserve">Definition 35 (Term vector)</w:t>
       </w:r>
       <w:r>
         <w:t xml:space="preserve"> </w:t>
@@ -54493,7 +55546,7 @@
       <w:pPr>
         <w:pStyle w:val="BodyText"/>
       </w:pPr>
-      <w:bookmarkStart w:id="187" w:name="eq-term-vector"/>
+      <w:bookmarkStart w:id="192" w:name="eq-term-vector"/>
       <m:oMathPara>
         <m:oMathParaPr>
           <m:jc m:val="center"/>
@@ -54683,7 +55736,7 @@
             <m:t>(</m:t>
           </m:r>
           <m:r>
-            <m:t>35</m:t>
+            <m:t>37</m:t>
           </m:r>
           <m:r>
             <m:rPr>
@@ -54693,10 +55746,10 @@
           </m:r>
         </m:oMath>
       </m:oMathPara>
-      <w:bookmarkEnd w:id="187"/>
+      <w:bookmarkEnd w:id="192"/>
     </w:p>
-    <w:bookmarkEnd w:id="188"/>
-    <w:bookmarkStart w:id="190" w:name="rem-term-vector"/>
+    <w:bookmarkEnd w:id="193"/>
+    <w:bookmarkStart w:id="195" w:name="rem-term-vector"/>
     <w:p>
       <w:pPr>
         <w:pStyle w:val="FirstParagraph"/>
@@ -54706,7 +55759,7 @@
           <w:i/>
           <w:iCs/>
         </w:rPr>
-        <w:t xml:space="preserve">Remark 24</w:t>
+        <w:t xml:space="preserve">Remark 25</w:t>
       </w:r>
       <w:r>
         <w:t xml:space="preserve"> (The term vector of simple linear regression). </w:t>
@@ -54789,7 +55842,7 @@
       <w:r>
         <w:t xml:space="preserve"> </w:t>
       </w:r>
-      <w:hyperlink r:id="rId189">
+      <w:hyperlink r:id="rId194">
         <w:r>
           <w:rPr>
             <w:rStyle w:val="Hyperlink"/>
@@ -54825,8 +55878,8 @@
         <w:t xml:space="preserve">.</w:t>
       </w:r>
     </w:p>
-    <w:bookmarkEnd w:id="190"/>
-    <w:bookmarkStart w:id="192" w:name="def-cross-product-matrix"/>
+    <w:bookmarkEnd w:id="195"/>
+    <w:bookmarkStart w:id="197" w:name="def-cross-product-matrix"/>
     <w:p>
       <w:pPr>
         <w:pStyle w:val="BodyText"/>
@@ -54836,7 +55889,7 @@
           <w:b/>
           <w:bCs/>
         </w:rPr>
-        <w:t xml:space="preserve">Definition 34 (Cross-product matrix (sum-of-squares and cross-products matrix))</w:t>
+        <w:t xml:space="preserve">Definition 36 (Cross-product matrix (sum-of-squares and cross-products matrix))</w:t>
       </w:r>
       <w:r>
         <w:t xml:space="preserve"> </w:t>
@@ -54948,7 +56001,7 @@
       <w:pPr>
         <w:pStyle w:val="BodyText"/>
       </w:pPr>
-      <w:bookmarkStart w:id="191" w:name="eq-cross-product-matrix"/>
+      <w:bookmarkStart w:id="196" w:name="eq-cross-product-matrix"/>
       <m:oMathPara>
         <m:oMathParaPr>
           <m:jc m:val="center"/>
@@ -55071,7 +56124,7 @@
             <m:t>(</m:t>
           </m:r>
           <m:r>
-            <m:t>36</m:t>
+            <m:t>38</m:t>
           </m:r>
           <m:r>
             <m:rPr>
@@ -55081,10 +56134,10 @@
           </m:r>
         </m:oMath>
       </m:oMathPara>
-      <w:bookmarkEnd w:id="191"/>
+      <w:bookmarkEnd w:id="196"/>
     </w:p>
-    <w:bookmarkEnd w:id="192"/>
-    <w:bookmarkStart w:id="194" w:name="rem-source-cross-product-matrix"/>
+    <w:bookmarkEnd w:id="197"/>
+    <w:bookmarkStart w:id="199" w:name="rem-source-cross-product-matrix"/>
     <w:p>
       <w:pPr>
         <w:pStyle w:val="FirstParagraph"/>
@@ -55094,7 +56147,7 @@
           <w:i/>
           <w:iCs/>
         </w:rPr>
-        <w:t xml:space="preserve">Remark 25</w:t>
+        <w:t xml:space="preserve">Remark 26</w:t>
       </w:r>
       <w:r>
         <w:t xml:space="preserve"> (Source: Cross-product matrix (sum-of-squares and cross-products matrix)). </w:t>
@@ -55133,7 +56186,7 @@
       <w:r>
         <w:t xml:space="preserve"> </w:t>
       </w:r>
-      <w:hyperlink r:id="rId193">
+      <w:hyperlink r:id="rId198">
         <w:r>
           <w:rPr>
             <w:rStyle w:val="Hyperlink"/>
@@ -55145,8 +56198,8 @@
         <w:t xml:space="preserve">).</w:t>
       </w:r>
     </w:p>
-    <w:bookmarkEnd w:id="194"/>
-    <w:bookmarkStart w:id="197" w:name="rem-cross-product-matrix"/>
+    <w:bookmarkEnd w:id="199"/>
+    <w:bookmarkStart w:id="202" w:name="rem-cross-product-matrix"/>
     <w:p>
       <w:pPr>
         <w:pStyle w:val="BodyText"/>
@@ -55156,7 +56209,7 @@
           <w:i/>
           <w:iCs/>
         </w:rPr>
-        <w:t xml:space="preserve">Remark 26</w:t>
+        <w:t xml:space="preserve">Remark 27</w:t>
       </w:r>
       <w:r>
         <w:t xml:space="preserve"> (Cross-product matrix as a matrix product). </w:t>
@@ -55455,18 +56508,18 @@
                 <wp:inline>
                   <wp:extent cx="152400" cy="152400"/>
                   <wp:effectExtent b="0" l="0" r="0" t="0"/>
-                  <wp:docPr descr="" title="" id="195" name="Picture"/>
+                  <wp:docPr descr="" title="" id="200" name="Picture"/>
                   <a:graphic>
                     <a:graphicData uri="http://schemas.openxmlformats.org/drawingml/2006/picture">
                       <pic:pic>
                         <pic:nvPicPr>
-                          <pic:cNvPr descr="/opt/quarto/share/formats/docx/note.png" id="196" name="Picture"/>
+                          <pic:cNvPr descr="/opt/quarto/share/formats/docx/note.png" id="201" name="Picture"/>
                           <pic:cNvPicPr>
                             <a:picLocks noChangeArrowheads="1" noChangeAspect="1"/>
                           </pic:cNvPicPr>
                         </pic:nvPicPr>
                         <pic:blipFill>
-                          <a:blip r:embed="rId141"/>
+                          <a:blip r:embed="rId146"/>
                           <a:stretch>
                             <a:fillRect/>
                           </a:stretch>
@@ -55546,7 +56599,7 @@
             <w:r>
               <w:t xml:space="preserve"> </w:t>
             </w:r>
-            <w:hyperlink r:id="rId193">
+            <w:hyperlink r:id="rId198">
               <w:r>
                 <w:rPr>
                   <w:rStyle w:val="Hyperlink"/>
@@ -55574,8 +56627,8 @@
         </w:tc>
       </w:tr>
     </w:tbl>
-    <w:bookmarkEnd w:id="197"/>
-    <w:bookmarkStart w:id="200" w:name="def-leverage"/>
+    <w:bookmarkEnd w:id="202"/>
+    <w:bookmarkStart w:id="205" w:name="def-leverage"/>
     <w:p>
       <w:pPr>
         <w:pStyle w:val="BodyText"/>
@@ -55585,7 +56638,7 @@
           <w:b/>
           <w:bCs/>
         </w:rPr>
-        <w:t xml:space="preserve">Definition 35 (Leverage)</w:t>
+        <w:t xml:space="preserve">Definition 37 (Leverage)</w:t>
       </w:r>
       <w:r>
         <w:t xml:space="preserve"> </w:t>
@@ -55596,7 +56649,7 @@
       <w:r>
         <w:t xml:space="preserve"> </w:t>
       </w:r>
-      <w:hyperlink r:id="rId198">
+      <w:hyperlink r:id="rId203">
         <w:r>
           <w:rPr>
             <w:rStyle w:val="Hyperlink"/>
@@ -55740,7 +56793,7 @@
       <w:pPr>
         <w:pStyle w:val="BodyText"/>
       </w:pPr>
-      <w:bookmarkStart w:id="199" w:name="eq-leverage"/>
+      <w:bookmarkStart w:id="204" w:name="eq-leverage"/>
       <m:oMathPara>
         <m:oMathParaPr>
           <m:jc m:val="center"/>
@@ -55861,7 +56914,7 @@
             <m:t>(</m:t>
           </m:r>
           <m:r>
-            <m:t>37</m:t>
+            <m:t>39</m:t>
           </m:r>
           <m:r>
             <m:rPr>
@@ -55871,10 +56924,10 @@
           </m:r>
         </m:oMath>
       </m:oMathPara>
-      <w:bookmarkEnd w:id="199"/>
+      <w:bookmarkEnd w:id="204"/>
     </w:p>
-    <w:bookmarkEnd w:id="200"/>
-    <w:bookmarkStart w:id="202" w:name="rem-source-leverage"/>
+    <w:bookmarkEnd w:id="205"/>
+    <w:bookmarkStart w:id="207" w:name="rem-source-leverage"/>
     <w:p>
       <w:pPr>
         <w:pStyle w:val="FirstParagraph"/>
@@ -55884,7 +56937,7 @@
           <w:i/>
           <w:iCs/>
         </w:rPr>
-        <w:t xml:space="preserve">Remark 27</w:t>
+        <w:t xml:space="preserve">Remark 28</w:t>
       </w:r>
       <w:r>
         <w:t xml:space="preserve"> (Source: Leverage). </w:t>
@@ -55921,7 +56974,7 @@
       <w:r>
         <w:t xml:space="preserve"> </w:t>
       </w:r>
-      <w:hyperlink r:id="rId201">
+      <w:hyperlink r:id="rId206">
         <w:r>
           <w:rPr>
             <w:rStyle w:val="Hyperlink"/>
@@ -55933,8 +56986,8 @@
         <w:t xml:space="preserve">.</w:t>
       </w:r>
     </w:p>
-    <w:bookmarkEnd w:id="202"/>
-    <w:bookmarkStart w:id="204" w:name="thm-loocv-shortcut"/>
+    <w:bookmarkEnd w:id="207"/>
+    <w:bookmarkStart w:id="209" w:name="thm-loocv-shortcut"/>
     <w:p>
       <w:pPr>
         <w:pStyle w:val="BodyText"/>
@@ -55955,7 +57008,7 @@
       <w:r>
         <w:t xml:space="preserve"> </w:t>
       </w:r>
-      <w:hyperlink r:id="rId198">
+      <w:hyperlink r:id="rId203">
         <w:r>
           <w:rPr>
             <w:rStyle w:val="Hyperlink"/>
@@ -56181,7 +57234,7 @@
       <w:pPr>
         <w:pStyle w:val="BodyText"/>
       </w:pPr>
-      <w:bookmarkStart w:id="203" w:name="eq-loocv-shortcut"/>
+      <w:bookmarkStart w:id="208" w:name="eq-loocv-shortcut"/>
       <m:oMathPara>
         <m:oMathParaPr>
           <m:jc m:val="center"/>
@@ -56361,7 +57414,7 @@
             <m:t>(</m:t>
           </m:r>
           <m:r>
-            <m:t>38</m:t>
+            <m:t>40</m:t>
           </m:r>
           <m:r>
             <m:rPr>
@@ -56371,9 +57424,9 @@
           </m:r>
         </m:oMath>
       </m:oMathPara>
-      <w:bookmarkEnd w:id="203"/>
+      <w:bookmarkEnd w:id="208"/>
     </w:p>
-    <w:bookmarkEnd w:id="204"/>
+    <w:bookmarkEnd w:id="209"/>
     <w:p>
       <w:pPr>
         <w:pStyle w:val="FirstParagraph"/>
@@ -56502,7 +57555,7 @@
         <w:t xml:space="preserve">which this page does not develop.</w:t>
       </w:r>
     </w:p>
-    <w:bookmarkStart w:id="205" w:name="rem-source-loocv-shortcut"/>
+    <w:bookmarkStart w:id="210" w:name="rem-source-loocv-shortcut"/>
     <w:p>
       <w:pPr>
         <w:pStyle w:val="BodyText"/>
@@ -56512,7 +57565,7 @@
           <w:i/>
           <w:iCs/>
         </w:rPr>
-        <w:t xml:space="preserve">Remark 28</w:t>
+        <w:t xml:space="preserve">Remark 29</w:t>
       </w:r>
       <w:r>
         <w:t xml:space="preserve"> (Source: Leave-one-out cross-validation for least squares). </w:t>
@@ -56545,8 +57598,8 @@
         <w:t xml:space="preserve">for many linear fitting methods.</w:t>
       </w:r>
     </w:p>
-    <w:bookmarkEnd w:id="205"/>
-    <w:bookmarkStart w:id="206" w:name="exm-loocv-shortcut"/>
+    <w:bookmarkEnd w:id="210"/>
+    <w:bookmarkStart w:id="211" w:name="exm-loocv-shortcut"/>
     <w:p>
       <w:pPr>
         <w:pStyle w:val="BodyText"/>
@@ -56697,7 +57750,7 @@
           <w:rPr>
             <w:rStyle w:val="Hyperlink"/>
           </w:rPr>
-          <w:t xml:space="preserve">Equation 34</w:t>
+          <w:t xml:space="preserve">Equation 36</w:t>
         </w:r>
       </w:hyperlink>
       <w:r>
@@ -57634,7 +58687,7 @@
         <w:rPr>
           <w:rStyle w:val="CommentTok"/>
         </w:rPr>
-        <w:t xml:space="preserve">#&gt;    7.10543e-15    2.00000e+00</w:t>
+        <w:t xml:space="preserve">#&gt;    8.88178e-15    2.00000e+00</w:t>
       </w:r>
     </w:p>
     <w:p>
@@ -57642,7 +58695,7 @@
         <w:pStyle w:val="FirstParagraph"/>
       </w:pPr>
       <w:r>
-        <w:t xml:space="preserve">The two columns differ by at most 7.1e-15,</w:t>
+        <w:t xml:space="preserve">The two columns differ by at most 8.9e-15,</w:t>
       </w:r>
       <w:r>
         <w:t xml:space="preserve"> </w:t>
@@ -57686,8 +58739,8 @@
         <w:t xml:space="preserve">rerunning it always gives the same choice.</w:t>
       </w:r>
     </w:p>
-    <w:bookmarkEnd w:id="206"/>
-    <w:bookmarkStart w:id="207" w:name="rem-loocv"/>
+    <w:bookmarkEnd w:id="211"/>
+    <w:bookmarkStart w:id="212" w:name="rem-loocv"/>
     <w:p>
       <w:pPr>
         <w:pStyle w:val="BodyText"/>
@@ -57697,7 +58750,7 @@
           <w:i/>
           <w:iCs/>
         </w:rPr>
-        <w:t xml:space="preserve">Remark 29</w:t>
+        <w:t xml:space="preserve">Remark 30</w:t>
       </w:r>
       <w:r>
         <w:t xml:space="preserve"> (When to use leave-one-out cross-validation). </w:t>
@@ -57736,7 +58789,7 @@
           <w:rPr>
             <w:rStyle w:val="Hyperlink"/>
           </w:rPr>
-          <w:t xml:space="preserve">Remark 23</w:t>
+          <w:t xml:space="preserve">Remark 24</w:t>
         </w:r>
       </w:hyperlink>
       <w:r>
@@ -57756,7 +58809,7 @@
           <w:rPr>
             <w:rStyle w:val="Hyperlink"/>
           </w:rPr>
-          <w:t xml:space="preserve">Remark 22</w:t>
+          <w:t xml:space="preserve">Remark 23</w:t>
         </w:r>
       </w:hyperlink>
       <w:r>
@@ -58159,9 +59212,9 @@
         <w:t xml:space="preserve">fits.</w:t>
       </w:r>
     </w:p>
-    <w:bookmarkEnd w:id="207"/>
-    <w:bookmarkEnd w:id="208"/>
-    <w:bookmarkStart w:id="237" w:name="sec-cv-model-choice"/>
+    <w:bookmarkEnd w:id="212"/>
+    <w:bookmarkEnd w:id="213"/>
+    <w:bookmarkStart w:id="242" w:name="sec-cv-model-choice"/>
     <w:p>
       <w:pPr>
         <w:pStyle w:val="Heading2"/>
@@ -58170,7 +59223,7 @@
         <w:t xml:space="preserve">8 Choosing a model by cross-validation</w:t>
       </w:r>
     </w:p>
-    <w:bookmarkStart w:id="210" w:name="def-cv-estimate-indexed"/>
+    <w:bookmarkStart w:id="215" w:name="def-cv-estimate-indexed"/>
     <w:p>
       <w:pPr>
         <w:pStyle w:val="FirstParagraph"/>
@@ -58180,7 +59233,7 @@
           <w:b/>
           <w:bCs/>
         </w:rPr>
-        <w:t xml:space="preserve">Definition 36 (Cross-validation estimate of a named procedure)</w:t>
+        <w:t xml:space="preserve">Definition 38 (Cross-validation estimate of a named procedure)</w:t>
       </w:r>
       <w:r>
         <w:t xml:space="preserve"> </w:t>
@@ -58548,7 +59601,7 @@
       <w:pPr>
         <w:pStyle w:val="BodyText"/>
       </w:pPr>
-      <w:bookmarkStart w:id="209" w:name="eq-cv-estimate-indexed"/>
+      <w:bookmarkStart w:id="214" w:name="eq-cv-estimate-indexed"/>
       <m:oMathPara>
         <m:oMathParaPr>
           <m:jc m:val="center"/>
@@ -58948,7 +60001,7 @@
             <m:t>(</m:t>
           </m:r>
           <m:r>
-            <m:t>39</m:t>
+            <m:t>41</m:t>
           </m:r>
           <m:r>
             <m:rPr>
@@ -58958,10 +60011,10 @@
           </m:r>
         </m:oMath>
       </m:oMathPara>
-      <w:bookmarkEnd w:id="209"/>
+      <w:bookmarkEnd w:id="214"/>
     </w:p>
-    <w:bookmarkEnd w:id="210"/>
-    <w:bookmarkStart w:id="212" w:name="def-cv-choice"/>
+    <w:bookmarkEnd w:id="215"/>
+    <w:bookmarkStart w:id="217" w:name="def-cv-choice"/>
     <w:p>
       <w:pPr>
         <w:pStyle w:val="FirstParagraph"/>
@@ -58971,7 +60024,7 @@
           <w:b/>
           <w:bCs/>
         </w:rPr>
-        <w:t xml:space="preserve">Definition 37 (Cross-validation choice procedure)</w:t>
+        <w:t xml:space="preserve">Definition 39 (Cross-validation choice procedure)</w:t>
       </w:r>
       <w:r>
         <w:t xml:space="preserve"> </w:t>
@@ -59303,7 +60356,7 @@
       <w:pPr>
         <w:pStyle w:val="BodyText"/>
       </w:pPr>
-      <w:bookmarkStart w:id="211" w:name="eq-cv-choice"/>
+      <w:bookmarkStart w:id="216" w:name="eq-cv-choice"/>
       <m:oMathPara>
         <m:oMathParaPr>
           <m:jc m:val="center"/>
@@ -59577,7 +60630,7 @@
             <m:t>(</m:t>
           </m:r>
           <m:r>
-            <m:t>40</m:t>
+            <m:t>42</m:t>
           </m:r>
           <m:r>
             <m:rPr>
@@ -59587,10 +60640,10 @@
           </m:r>
         </m:oMath>
       </m:oMathPara>
-      <w:bookmarkEnd w:id="211"/>
+      <w:bookmarkEnd w:id="216"/>
     </w:p>
-    <w:bookmarkEnd w:id="212"/>
-    <w:bookmarkStart w:id="214" w:name="def-nested-cv"/>
+    <w:bookmarkEnd w:id="217"/>
+    <w:bookmarkStart w:id="219" w:name="def-nested-cv"/>
     <w:p>
       <w:pPr>
         <w:pStyle w:val="FirstParagraph"/>
@@ -59600,7 +60653,7 @@
           <w:b/>
           <w:bCs/>
         </w:rPr>
-        <w:t xml:space="preserve">Definition 38 (Nested cross-validation)</w:t>
+        <w:t xml:space="preserve">Definition 40 (Nested cross-validation)</w:t>
       </w:r>
       <w:r>
         <w:t xml:space="preserve"> </w:t>
@@ -59717,7 +60770,7 @@
       <w:pPr>
         <w:pStyle w:val="BodyText"/>
       </w:pPr>
-      <w:bookmarkStart w:id="213" w:name="eq-nested-cv"/>
+      <w:bookmarkStart w:id="218" w:name="eq-nested-cv"/>
       <m:oMathPara>
         <m:oMathParaPr>
           <m:jc m:val="center"/>
@@ -59834,7 +60887,7 @@
             <m:t>(</m:t>
           </m:r>
           <m:r>
-            <m:t>41</m:t>
+            <m:t>43</m:t>
           </m:r>
           <m:r>
             <m:rPr>
@@ -59844,10 +60897,10 @@
           </m:r>
         </m:oMath>
       </m:oMathPara>
-      <w:bookmarkEnd w:id="213"/>
+      <w:bookmarkEnd w:id="218"/>
     </w:p>
-    <w:bookmarkEnd w:id="214"/>
-    <w:bookmarkStart w:id="215" w:name="rem-source-nested-cv"/>
+    <w:bookmarkEnd w:id="219"/>
+    <w:bookmarkStart w:id="220" w:name="rem-source-nested-cv"/>
     <w:p>
       <w:pPr>
         <w:pStyle w:val="FirstParagraph"/>
@@ -59857,7 +60910,7 @@
           <w:i/>
           <w:iCs/>
         </w:rPr>
-        <w:t xml:space="preserve">Remark 30</w:t>
+        <w:t xml:space="preserve">Remark 31</w:t>
       </w:r>
       <w:r>
         <w:t xml:space="preserve"> (Source: Nested cross-validation). </w:t>
@@ -59878,8 +60931,8 @@
         <w:t xml:space="preserve">choices included.</w:t>
       </w:r>
     </w:p>
-    <w:bookmarkEnd w:id="215"/>
-    <w:bookmarkStart w:id="216" w:name="rem-nested-cv"/>
+    <w:bookmarkEnd w:id="220"/>
+    <w:bookmarkStart w:id="221" w:name="rem-nested-cv"/>
     <w:p>
       <w:pPr>
         <w:pStyle w:val="BodyText"/>
@@ -59889,7 +60942,7 @@
           <w:i/>
           <w:iCs/>
         </w:rPr>
-        <w:t xml:space="preserve">Remark 31</w:t>
+        <w:t xml:space="preserve">Remark 32</w:t>
       </w:r>
       <w:r>
         <w:t xml:space="preserve"> (What is nested). </w:t>
@@ -60035,8 +61088,8 @@
         <w:t xml:space="preserve">That inner cross-validation is the nested one.</w:t>
       </w:r>
     </w:p>
-    <w:bookmarkEnd w:id="216"/>
-    <w:bookmarkStart w:id="219" w:name="rem-cv-winner-optimistic"/>
+    <w:bookmarkEnd w:id="221"/>
+    <w:bookmarkStart w:id="224" w:name="rem-cv-winner-optimistic"/>
     <w:p>
       <w:pPr>
         <w:pStyle w:val="BodyText"/>
@@ -60046,7 +61099,7 @@
           <w:i/>
           <w:iCs/>
         </w:rPr>
-        <w:t xml:space="preserve">Remark 32</w:t>
+        <w:t xml:space="preserve">Remark 33</w:t>
       </w:r>
       <w:r>
         <w:t xml:space="preserve"> (Cross-validation replaces the validation set, not the test set). </w:t>
@@ -60229,18 +61282,18 @@
                 <wp:inline>
                   <wp:extent cx="152400" cy="152400"/>
                   <wp:effectExtent b="0" l="0" r="0" t="0"/>
-                  <wp:docPr descr="" title="" id="217" name="Picture"/>
+                  <wp:docPr descr="" title="" id="222" name="Picture"/>
                   <a:graphic>
                     <a:graphicData uri="http://schemas.openxmlformats.org/drawingml/2006/picture">
                       <pic:pic>
                         <pic:nvPicPr>
-                          <pic:cNvPr descr="/opt/quarto/share/formats/docx/note.png" id="218" name="Picture"/>
+                          <pic:cNvPr descr="/opt/quarto/share/formats/docx/note.png" id="223" name="Picture"/>
                           <pic:cNvPicPr>
                             <a:picLocks noChangeArrowheads="1" noChangeAspect="1"/>
                           </pic:cNvPicPr>
                         </pic:nvPicPr>
                         <pic:blipFill>
-                          <a:blip r:embed="rId141"/>
+                          <a:blip r:embed="rId146"/>
                           <a:stretch>
                             <a:fillRect/>
                           </a:stretch>
@@ -60304,8 +61357,8 @@
         </w:tc>
       </w:tr>
     </w:tbl>
-    <w:bookmarkEnd w:id="219"/>
-    <w:bookmarkStart w:id="222" w:name="def-cv-se"/>
+    <w:bookmarkEnd w:id="224"/>
+    <w:bookmarkStart w:id="227" w:name="def-cv-se"/>
     <w:p>
       <w:pPr>
         <w:pStyle w:val="BodyText"/>
@@ -60315,7 +61368,7 @@
           <w:b/>
           <w:bCs/>
         </w:rPr>
-        <w:t xml:space="preserve">Definition 39 (Fold-based standard error)</w:t>
+        <w:t xml:space="preserve">Definition 41 (Fold-based standard error)</w:t>
       </w:r>
       <w:r>
         <w:t xml:space="preserve"> </w:t>
@@ -60409,7 +61462,7 @@
       <w:r>
         <w:t xml:space="preserve"> </w:t>
       </w:r>
-      <w:hyperlink r:id="rId220">
+      <w:hyperlink r:id="rId225">
         <w:r>
           <w:rPr>
             <w:rStyle w:val="Hyperlink"/>
@@ -60475,7 +61528,7 @@
       <w:pPr>
         <w:pStyle w:val="BodyText"/>
       </w:pPr>
-      <w:bookmarkStart w:id="221" w:name="eq-cv-se"/>
+      <w:bookmarkStart w:id="226" w:name="eq-cv-se"/>
       <m:oMathPara>
         <m:oMathParaPr>
           <m:jc m:val="center"/>
@@ -60640,7 +61693,7 @@
             <m:t>(</m:t>
           </m:r>
           <m:r>
-            <m:t>42</m:t>
+            <m:t>44</m:t>
           </m:r>
           <m:r>
             <m:rPr>
@@ -60650,10 +61703,10 @@
           </m:r>
         </m:oMath>
       </m:oMathPara>
-      <w:bookmarkEnd w:id="221"/>
+      <w:bookmarkEnd w:id="226"/>
     </w:p>
-    <w:bookmarkEnd w:id="222"/>
-    <w:bookmarkStart w:id="223" w:name="rem-source-cv-se"/>
+    <w:bookmarkEnd w:id="227"/>
+    <w:bookmarkStart w:id="228" w:name="rem-source-cv-se"/>
     <w:p>
       <w:pPr>
         <w:pStyle w:val="FirstParagraph"/>
@@ -60663,7 +61716,7 @@
           <w:i/>
           <w:iCs/>
         </w:rPr>
-        <w:t xml:space="preserve">Remark 33</w:t>
+        <w:t xml:space="preserve">Remark 34</w:t>
       </w:r>
       <w:r>
         <w:t xml:space="preserve"> (Source: Fold-based standard error). </w:t>
@@ -60675,8 +61728,8 @@
         <w:t xml:space="preserve">, who call the result a standard error.</w:t>
       </w:r>
     </w:p>
-    <w:bookmarkEnd w:id="223"/>
-    <w:bookmarkStart w:id="225" w:name="rem-cv-se"/>
+    <w:bookmarkEnd w:id="228"/>
+    <w:bookmarkStart w:id="230" w:name="rem-cv-se"/>
     <w:p>
       <w:pPr>
         <w:pStyle w:val="BodyText"/>
@@ -60686,7 +61739,7 @@
           <w:i/>
           <w:iCs/>
         </w:rPr>
-        <w:t xml:space="preserve">Remark 34</w:t>
+        <w:t xml:space="preserve">Remark 35</w:t>
       </w:r>
       <w:r>
         <w:t xml:space="preserve"> (The fold-based standard error is only a rough guide). </w:t>
@@ -60714,7 +61767,7 @@
           <w:rPr>
             <w:rStyle w:val="Hyperlink"/>
           </w:rPr>
-          <w:t xml:space="preserve">Equation 42</w:t>
+          <w:t xml:space="preserve">Equation 44</w:t>
         </w:r>
       </w:hyperlink>
       <w:r>
@@ -60899,7 +61952,7 @@
       <w:r>
         <w:t xml:space="preserve"> </w:t>
       </w:r>
-      <w:hyperlink r:id="rId224">
+      <w:hyperlink r:id="rId229">
         <w:r>
           <w:rPr>
             <w:rStyle w:val="Hyperlink"/>
@@ -60963,8 +62016,8 @@
         <w:t xml:space="preserve">.</w:t>
       </w:r>
     </w:p>
-    <w:bookmarkEnd w:id="225"/>
-    <w:bookmarkStart w:id="227" w:name="def-fold-mse-indexed"/>
+    <w:bookmarkEnd w:id="230"/>
+    <w:bookmarkStart w:id="232" w:name="def-fold-mse-indexed"/>
     <w:p>
       <w:pPr>
         <w:pStyle w:val="BodyText"/>
@@ -60974,7 +62027,7 @@
           <w:b/>
           <w:bCs/>
         </w:rPr>
-        <w:t xml:space="preserve">Definition 40 (Fold mean squared error of a named procedure)</w:t>
+        <w:t xml:space="preserve">Definition 42 (Fold mean squared error of a named procedure)</w:t>
       </w:r>
       <w:r>
         <w:t xml:space="preserve"> </w:t>
@@ -61142,7 +62195,7 @@
       <w:pPr>
         <w:pStyle w:val="BodyText"/>
       </w:pPr>
-      <w:bookmarkStart w:id="226" w:name="eq-fold-mse-indexed"/>
+      <w:bookmarkStart w:id="231" w:name="eq-fold-mse-indexed"/>
       <m:oMathPara>
         <m:oMathParaPr>
           <m:jc m:val="center"/>
@@ -61519,7 +62572,7 @@
             <m:t>(</m:t>
           </m:r>
           <m:r>
-            <m:t>43</m:t>
+            <m:t>45</m:t>
           </m:r>
           <m:r>
             <m:rPr>
@@ -61529,10 +62582,10 @@
           </m:r>
         </m:oMath>
       </m:oMathPara>
-      <w:bookmarkEnd w:id="226"/>
+      <w:bookmarkEnd w:id="231"/>
     </w:p>
-    <w:bookmarkEnd w:id="227"/>
-    <w:bookmarkStart w:id="229" w:name="def-cv-se-indexed"/>
+    <w:bookmarkEnd w:id="232"/>
+    <w:bookmarkStart w:id="234" w:name="def-cv-se-indexed"/>
     <w:p>
       <w:pPr>
         <w:pStyle w:val="FirstParagraph"/>
@@ -61542,7 +62595,7 @@
           <w:b/>
           <w:bCs/>
         </w:rPr>
-        <w:t xml:space="preserve">Definition 41 (Fold-based standard error of a named procedure)</w:t>
+        <w:t xml:space="preserve">Definition 43 (Fold-based standard error of a named procedure)</w:t>
       </w:r>
       <w:r>
         <w:t xml:space="preserve"> </w:t>
@@ -61738,7 +62791,7 @@
       <w:pPr>
         <w:pStyle w:val="BodyText"/>
       </w:pPr>
-      <w:bookmarkStart w:id="228" w:name="eq-cv-se-indexed"/>
+      <w:bookmarkStart w:id="233" w:name="eq-cv-se-indexed"/>
       <m:oMathPara>
         <m:oMathParaPr>
           <m:jc m:val="center"/>
@@ -62026,7 +63079,7 @@
             <m:t>(</m:t>
           </m:r>
           <m:r>
-            <m:t>44</m:t>
+            <m:t>46</m:t>
           </m:r>
           <m:r>
             <m:rPr>
@@ -62036,10 +63089,10 @@
           </m:r>
         </m:oMath>
       </m:oMathPara>
-      <w:bookmarkEnd w:id="228"/>
+      <w:bookmarkEnd w:id="233"/>
     </w:p>
-    <w:bookmarkEnd w:id="229"/>
-    <w:bookmarkStart w:id="231" w:name="def-one-se-rule"/>
+    <w:bookmarkEnd w:id="234"/>
+    <w:bookmarkStart w:id="236" w:name="def-one-se-rule"/>
     <w:p>
       <w:pPr>
         <w:pStyle w:val="FirstParagraph"/>
@@ -62049,7 +63102,7 @@
           <w:b/>
           <w:bCs/>
         </w:rPr>
-        <w:t xml:space="preserve">Definition 42 (One-standard-error rule)</w:t>
+        <w:t xml:space="preserve">Definition 44 (One-standard-error rule)</w:t>
       </w:r>
       <w:r>
         <w:t xml:space="preserve"> </w:t>
@@ -62297,7 +63350,7 @@
       <w:pPr>
         <w:pStyle w:val="BodyText"/>
       </w:pPr>
-      <w:bookmarkStart w:id="230" w:name="eq-one-se-rule"/>
+      <w:bookmarkStart w:id="235" w:name="eq-one-se-rule"/>
       <m:oMathPara>
         <m:oMathParaPr>
           <m:jc m:val="center"/>
@@ -62621,7 +63674,7 @@
             <m:t>(</m:t>
           </m:r>
           <m:r>
-            <m:t>45</m:t>
+            <m:t>47</m:t>
           </m:r>
           <m:r>
             <m:rPr>
@@ -62631,7 +63684,7 @@
           </m:r>
         </m:oMath>
       </m:oMathPara>
-      <w:bookmarkEnd w:id="230"/>
+      <w:bookmarkEnd w:id="235"/>
     </w:p>
     <w:p>
       <w:pPr>
@@ -62650,8 +63703,8 @@
         <w:t xml:space="preserve">.</w:t>
       </w:r>
     </w:p>
-    <w:bookmarkEnd w:id="231"/>
-    <w:bookmarkStart w:id="236" w:name="exm-one-se-rule"/>
+    <w:bookmarkEnd w:id="236"/>
+    <w:bookmarkStart w:id="241" w:name="exm-one-se-rule"/>
     <w:p>
       <w:pPr>
         <w:pStyle w:val="BodyText"/>
@@ -62709,7 +63762,7 @@
           <w:rPr>
             <w:rStyle w:val="Hyperlink"/>
           </w:rPr>
-          <w:t xml:space="preserve">Definition 42</w:t>
+          <w:t xml:space="preserve">Definition 44</w:t>
         </w:r>
       </w:hyperlink>
       <w:r>
@@ -63703,7 +64756,7 @@
           <w:rPr>
             <w:rStyle w:val="Hyperlink"/>
           </w:rPr>
-          <w:t xml:space="preserve">Remark 22</w:t>
+          <w:t xml:space="preserve">Remark 23</w:t>
         </w:r>
       </w:hyperlink>
       <w:r>
@@ -63723,7 +64776,7 @@
       <w:tr>
         <w:tc>
           <w:tcPr/>
-          <w:bookmarkStart w:id="235" w:name="fig-one-se-rule"/>
+          <w:bookmarkStart w:id="240" w:name="fig-one-se-rule"/>
           <w:p>
             <w:pPr>
               <w:pStyle w:val="SourceCode"/>
@@ -64336,18 +65389,18 @@
                 <wp:inline>
                   <wp:extent cx="4620126" cy="3696101"/>
                   <wp:effectExtent b="0" l="0" r="0" t="0"/>
-                  <wp:docPr descr="" title="" id="233" name="Picture"/>
+                  <wp:docPr descr="" title="" id="238" name="Picture"/>
                   <a:graphic>
                     <a:graphicData uri="http://schemas.openxmlformats.org/drawingml/2006/picture">
                       <pic:pic>
                         <pic:nvPicPr>
-                          <pic:cNvPr descr="model-validation_files/figure-docx/one-se-rule-plot-1.png" id="234" name="Picture"/>
+                          <pic:cNvPr descr="model-validation_files/figure-docx/one-se-rule-plot-1.png" id="239" name="Picture"/>
                           <pic:cNvPicPr>
                             <a:picLocks noChangeArrowheads="1" noChangeAspect="1"/>
                           </pic:cNvPicPr>
                         </pic:nvPicPr>
                         <pic:blipFill>
-                          <a:blip r:embed="rId232"/>
+                          <a:blip r:embed="rId237"/>
                           <a:stretch>
                             <a:fillRect/>
                           </a:stretch>
@@ -64414,7 +65467,7 @@
                 <w:rPr>
                   <w:rStyle w:val="Hyperlink"/>
                 </w:rPr>
-                <w:t xml:space="preserve">Equation 42</w:t>
+                <w:t xml:space="preserve">Equation 44</w:t>
               </w:r>
             </w:hyperlink>
             <w:r>
@@ -64427,7 +65480,7 @@
               <w:t xml:space="preserve">The dashed line is one fold-based standard error above the smallest estimate.</w:t>
             </w:r>
           </w:p>
-          <w:bookmarkEnd w:id="235"/>
+          <w:bookmarkEnd w:id="240"/>
         </w:tc>
       </w:tr>
     </w:tbl>
@@ -64516,9 +65569,9 @@
         <w:t xml:space="preserve">and 0.315 for degree 3.</w:t>
       </w:r>
     </w:p>
-    <w:bookmarkEnd w:id="236"/>
-    <w:bookmarkEnd w:id="237"/>
-    <w:bookmarkStart w:id="244" w:name="sec-cv-whole-procedure"/>
+    <w:bookmarkEnd w:id="241"/>
+    <w:bookmarkEnd w:id="242"/>
+    <w:bookmarkStart w:id="249" w:name="sec-cv-whole-procedure"/>
     <w:p>
       <w:pPr>
         <w:pStyle w:val="Heading2"/>
@@ -64527,7 +65580,7 @@
         <w:t xml:space="preserve">9 Cross-validating the whole procedure</w:t>
       </w:r>
     </w:p>
-    <w:bookmarkStart w:id="240" w:name="exr-cv-screening"/>
+    <w:bookmarkStart w:id="245" w:name="exr-cv-screening"/>
     <w:p>
       <w:pPr>
         <w:pStyle w:val="FirstParagraph"/>
@@ -64827,18 +65880,18 @@
                 <wp:inline>
                   <wp:extent cx="152400" cy="152400"/>
                   <wp:effectExtent b="0" l="0" r="0" t="0"/>
-                  <wp:docPr descr="" title="" id="238" name="Picture"/>
+                  <wp:docPr descr="" title="" id="243" name="Picture"/>
                   <a:graphic>
                     <a:graphicData uri="http://schemas.openxmlformats.org/drawingml/2006/picture">
                       <pic:pic>
                         <pic:nvPicPr>
-                          <pic:cNvPr descr="/opt/quarto/share/formats/docx/note.png" id="239" name="Picture"/>
+                          <pic:cNvPr descr="/opt/quarto/share/formats/docx/note.png" id="244" name="Picture"/>
                           <pic:cNvPicPr>
                             <a:picLocks noChangeArrowheads="1" noChangeAspect="1"/>
                           </pic:cNvPicPr>
                         </pic:nvPicPr>
                         <pic:blipFill>
-                          <a:blip r:embed="rId141"/>
+                          <a:blip r:embed="rId146"/>
                           <a:stretch>
                             <a:fillRect/>
                           </a:stretch>
@@ -64920,8 +65973,8 @@
         </w:tc>
       </w:tr>
     </w:tbl>
-    <w:bookmarkEnd w:id="240"/>
-    <w:bookmarkStart w:id="241" w:name="sol-cv-screening"/>
+    <w:bookmarkEnd w:id="245"/>
+    <w:bookmarkStart w:id="246" w:name="sol-cv-screening"/>
     <w:p>
       <w:pPr>
         <w:pStyle w:val="BodyText"/>
@@ -66849,8 +67902,8 @@
         <w:t xml:space="preserve">needs fails.</w:t>
       </w:r>
     </w:p>
-    <w:bookmarkEnd w:id="241"/>
-    <w:bookmarkStart w:id="243" w:name="rem-cv-every-step"/>
+    <w:bookmarkEnd w:id="246"/>
+    <w:bookmarkStart w:id="248" w:name="rem-cv-every-step"/>
     <w:p>
       <w:pPr>
         <w:pStyle w:val="BodyText"/>
@@ -66860,7 +67913,7 @@
           <w:i/>
           <w:iCs/>
         </w:rPr>
-        <w:t xml:space="preserve">Remark 35</w:t>
+        <w:t xml:space="preserve">Remark 36</w:t>
       </w:r>
       <w:r>
         <w:t xml:space="preserve"> (Cross-validate the whole procedure). </w:t>
@@ -67006,7 +68059,7 @@
       <w:r>
         <w:t xml:space="preserve"> </w:t>
       </w:r>
-      <w:hyperlink r:id="rId242">
+      <w:hyperlink r:id="rId247">
         <w:r>
           <w:rPr>
             <w:rStyle w:val="Hyperlink"/>
@@ -67030,9 +68083,9 @@
         <w:t xml:space="preserve">when they are computed without the outcome.</w:t>
       </w:r>
     </w:p>
-    <w:bookmarkEnd w:id="243"/>
-    <w:bookmarkEnd w:id="244"/>
-    <w:bookmarkStart w:id="245" w:name="further-reading"/>
+    <w:bookmarkEnd w:id="248"/>
+    <w:bookmarkEnd w:id="249"/>
+    <w:bookmarkStart w:id="250" w:name="further-reading"/>
     <w:p>
       <w:pPr>
         <w:pStyle w:val="Heading2"/>
@@ -67061,8 +68114,8 @@
         <w:t xml:space="preserve">including the covariance and correlation matrices that cross-products produce.</w:t>
       </w:r>
     </w:p>
-    <w:bookmarkEnd w:id="245"/>
-    <w:bookmarkStart w:id="253" w:name="references"/>
+    <w:bookmarkEnd w:id="250"/>
+    <w:bookmarkStart w:id="258" w:name="references"/>
     <w:p>
       <w:pPr>
         <w:pStyle w:val="Heading2"/>
@@ -67071,8 +68124,8 @@
         <w:t xml:space="preserve">References</w:t>
       </w:r>
     </w:p>
-    <w:bookmarkStart w:id="252" w:name="refs"/>
-    <w:bookmarkStart w:id="247" w:name="ref-hastie2009elements"/>
+    <w:bookmarkStart w:id="257" w:name="refs"/>
+    <w:bookmarkStart w:id="252" w:name="ref-hastie2009elements"/>
     <w:p>
       <w:pPr>
         <w:pStyle w:val="Bibliography"/>
@@ -67096,7 +68149,7 @@
       <w:r>
         <w:t xml:space="preserve"> </w:t>
       </w:r>
-      <w:hyperlink r:id="rId246">
+      <w:hyperlink r:id="rId251">
         <w:r>
           <w:rPr>
             <w:rStyle w:val="Hyperlink"/>
@@ -67108,8 +68161,8 @@
         <w:t xml:space="preserve">.</w:t>
       </w:r>
     </w:p>
-    <w:bookmarkEnd w:id="247"/>
-    <w:bookmarkStart w:id="249" w:name="ref-james2021islr2e"/>
+    <w:bookmarkEnd w:id="252"/>
+    <w:bookmarkStart w:id="254" w:name="ref-james2021islr2e"/>
     <w:p>
       <w:pPr>
         <w:pStyle w:val="Bibliography"/>
@@ -67147,7 +68200,7 @@
       <w:r>
         <w:t xml:space="preserve"> </w:t>
       </w:r>
-      <w:hyperlink r:id="rId248">
+      <w:hyperlink r:id="rId253">
         <w:r>
           <w:rPr>
             <w:rStyle w:val="Hyperlink"/>
@@ -67159,8 +68212,8 @@
         <w:t xml:space="preserve">.</w:t>
       </w:r>
     </w:p>
-    <w:bookmarkEnd w:id="249"/>
-    <w:bookmarkStart w:id="251" w:name="ref-sanchez2020matrix4sl"/>
+    <w:bookmarkEnd w:id="254"/>
+    <w:bookmarkStart w:id="256" w:name="ref-sanchez2020matrix4sl"/>
     <w:p>
       <w:pPr>
         <w:pStyle w:val="Bibliography"/>
@@ -67198,7 +68251,7 @@
       <w:r>
         <w:t xml:space="preserve"> </w:t>
       </w:r>
-      <w:hyperlink r:id="rId250">
+      <w:hyperlink r:id="rId255">
         <w:r>
           <w:rPr>
             <w:rStyle w:val="Hyperlink"/>
@@ -67210,9 +68263,9 @@
         <w:t xml:space="preserve">.</w:t>
       </w:r>
     </w:p>
-    <w:bookmarkEnd w:id="251"/>
-    <w:bookmarkEnd w:id="252"/>
-    <w:bookmarkEnd w:id="253"/>
+    <w:bookmarkEnd w:id="256"/>
+    <w:bookmarkEnd w:id="257"/>
+    <w:bookmarkEnd w:id="258"/>
     <w:sectPr>
       <w:footnotePr>
         <w:numRestart w:val="eachSect"/>

</xml_diff>

<commit_message>
Deploying to gh-pages from @ Morrison-Lab/sds@16d2203d4a2d7527fba5c5993b6eb31cafbdcd49 🚀
</commit_message>
<xml_diff>
--- a/model-validation-handout.docx
+++ b/model-validation-handout.docx
@@ -15,7 +15,7 @@
         <w:pStyle w:val="Date"/>
       </w:pPr>
       <w:r>
-        <w:t xml:space="preserve">Last modified: 2026-10-16 02:40:23 (PDT)</w:t>
+        <w:t xml:space="preserve">Last modified: 2026-10-16 02:59:55 (PDT)</w:t>
       </w:r>
     </w:p>
     <w:bookmarkStart w:id="17" w:name="sec-data-sets"/>
@@ -6741,7 +6741,7 @@
     </w:p>
     <w:bookmarkEnd w:id="48"/>
     <w:bookmarkEnd w:id="49"/>
-    <w:bookmarkStart w:id="106" w:name="sec-generalization-error"/>
+    <w:bookmarkStart w:id="107" w:name="sec-generalization-error"/>
     <w:p>
       <w:pPr>
         <w:pStyle w:val="Heading2"/>
@@ -12094,7 +12094,7 @@
       </m:oMathPara>
     </w:p>
     <w:bookmarkEnd w:id="67"/>
-    <w:bookmarkStart w:id="70" w:name="def-prediction-bias"/>
+    <w:bookmarkStart w:id="71" w:name="def-prediction-bias"/>
     <w:p>
       <w:pPr>
         <w:pStyle w:val="FirstParagraph"/>
@@ -12299,33 +12299,7 @@
         <w:t xml:space="preserve"> </w:t>
       </w:r>
       <w:r>
-        <w:t xml:space="preserve">of the prediction, as a prediction of</w:t>
-      </w:r>
-      <w:r>
-        <w:t xml:space="preserve"> </w:t>
-      </w:r>
-      <m:oMath>
-        <m:r>
-          <m:t>μ</m:t>
-        </m:r>
-        <m:r>
-          <m:rPr>
-            <m:sty m:val="p"/>
-          </m:rPr>
-          <m:t>(</m:t>
-        </m:r>
-        <m:r>
-          <m:t>x</m:t>
-        </m:r>
-        <m:r>
-          <m:rPr>
-            <m:sty m:val="p"/>
-          </m:rPr>
-          <m:t>)</m:t>
-        </m:r>
-      </m:oMath>
-      <w:r>
-        <w:t xml:space="preserve">,</w:t>
+        <w:t xml:space="preserve">of the prediction</w:t>
       </w:r>
       <w:r>
         <w:t xml:space="preserve"> </w:t>
@@ -12407,7 +12381,24 @@
         <w:t xml:space="preserve"> </w:t>
       </w:r>
       <w:r>
-        <w:t xml:space="preserve">as an estimator of the</w:t>
+        <w:t xml:space="preserve">used as an</w:t>
+      </w:r>
+      <w:r>
+        <w:t xml:space="preserve"> </w:t>
+      </w:r>
+      <w:hyperlink r:id="rId69">
+        <w:r>
+          <w:rPr>
+            <w:rStyle w:val="Hyperlink"/>
+          </w:rPr>
+          <w:t xml:space="preserve">estimator</w:t>
+        </w:r>
+      </w:hyperlink>
+      <w:r>
+        <w:t xml:space="preserve"> </w:t>
+      </w:r>
+      <w:r>
+        <w:t xml:space="preserve">of the</w:t>
       </w:r>
       <w:r>
         <w:t xml:space="preserve"> </w:t>
@@ -12450,14 +12441,20 @@
         </m:r>
       </m:oMath>
       <w:r>
-        <w:t xml:space="preserve">:</w:t>
+        <w:t xml:space="preserve">,</w:t>
+      </w:r>
+      <w:r>
+        <w:t xml:space="preserve"> </w:t>
+      </w:r>
+      <w:r>
+        <w:t xml:space="preserve">which is its estimand here, not the new outcome it predicts:</w:t>
       </w:r>
     </w:p>
     <w:p>
       <w:pPr>
         <w:pStyle w:val="BodyText"/>
       </w:pPr>
-      <w:bookmarkStart w:id="69" w:name="eq-prediction-bias"/>
+      <w:bookmarkStart w:id="70" w:name="eq-prediction-bias"/>
       <m:oMathPara>
         <m:oMathParaPr>
           <m:jc m:val="center"/>
@@ -12659,7 +12656,7 @@
           </m:r>
         </m:oMath>
       </m:oMathPara>
-      <w:bookmarkEnd w:id="69"/>
+      <w:bookmarkEnd w:id="70"/>
     </w:p>
     <w:p>
       <w:pPr>
@@ -12746,7 +12743,7 @@
         <w:t xml:space="preserve">.</w:t>
       </w:r>
     </w:p>
-    <w:bookmarkEnd w:id="70"/>
+    <w:bookmarkEnd w:id="71"/>
     <w:p>
       <w:pPr>
         <w:pStyle w:val="BodyText"/>
@@ -12780,7 +12777,7 @@
         <w:t xml:space="preserve">the bias reflects the error introduced by approximating a real-world relationship by a model.</w:t>
       </w:r>
     </w:p>
-    <w:bookmarkStart w:id="71" w:name="exm-prediction-bias"/>
+    <w:bookmarkStart w:id="72" w:name="exm-prediction-bias"/>
     <w:p>
       <w:pPr>
         <w:pStyle w:val="BodyText"/>
@@ -13109,8 +13106,8 @@
         <w:t xml:space="preserve">.</w:t>
       </w:r>
     </w:p>
-    <w:bookmarkEnd w:id="71"/>
-    <w:bookmarkStart w:id="72" w:name="exr-epe-three-sources"/>
+    <w:bookmarkEnd w:id="72"/>
+    <w:bookmarkStart w:id="73" w:name="exr-epe-three-sources"/>
     <w:p>
       <w:pPr>
         <w:pStyle w:val="BodyText"/>
@@ -13902,8 +13899,8 @@
         <w:t xml:space="preserve">and which cannot?</w:t>
       </w:r>
     </w:p>
-    <w:bookmarkEnd w:id="72"/>
-    <w:bookmarkStart w:id="73" w:name="sol-epe-three-sources"/>
+    <w:bookmarkEnd w:id="73"/>
+    <w:bookmarkStart w:id="74" w:name="sol-epe-three-sources"/>
     <w:p>
       <w:pPr>
         <w:pStyle w:val="FirstParagraph"/>
@@ -14202,8 +14199,8 @@
         <w:t xml:space="preserve">in the new outcome.</w:t>
       </w:r>
     </w:p>
-    <w:bookmarkEnd w:id="73"/>
-    <w:bookmarkStart w:id="74" w:name="exr-epe-split-noise"/>
+    <w:bookmarkEnd w:id="74"/>
+    <w:bookmarkStart w:id="75" w:name="exr-epe-split-noise"/>
     <w:p>
       <w:pPr>
         <w:pStyle w:val="FirstParagraph"/>
@@ -14690,8 +14687,8 @@
         <w:t xml:space="preserve">and name the assumptions that make the cross term zero.</w:t>
       </w:r>
     </w:p>
-    <w:bookmarkEnd w:id="74"/>
-    <w:bookmarkStart w:id="78" w:name="sol-epe-split-noise"/>
+    <w:bookmarkEnd w:id="75"/>
+    <w:bookmarkStart w:id="79" w:name="sol-epe-split-noise"/>
     <w:p>
       <w:pPr>
         <w:pStyle w:val="BodyText"/>
@@ -14707,7 +14704,41 @@
         <w:t xml:space="preserve">. </w:t>
       </w:r>
       <w:r>
-        <w:t xml:space="preserve">Write the prediction error as noise plus the error of the prediction as an estimate of</w:t>
+        <w:t xml:space="preserve">Write the prediction error as noise plus the error of the prediction, used as an</w:t>
+      </w:r>
+      <w:r>
+        <w:t xml:space="preserve"> </w:t>
+      </w:r>
+      <w:hyperlink r:id="rId69">
+        <w:r>
+          <w:rPr>
+            <w:rStyle w:val="Hyperlink"/>
+          </w:rPr>
+          <w:t xml:space="preserve">estimator</w:t>
+        </w:r>
+      </w:hyperlink>
+      <w:r>
+        <w:t xml:space="preserve"> </w:t>
+      </w:r>
+      <w:r>
+        <w:t xml:space="preserve">of the</w:t>
+      </w:r>
+      <w:r>
+        <w:t xml:space="preserve"> </w:t>
+      </w:r>
+      <w:hyperlink w:anchor="def-mean-function">
+        <w:r>
+          <w:rPr>
+            <w:rStyle w:val="Hyperlink"/>
+          </w:rPr>
+          <w:t xml:space="preserve">mean function</w:t>
+        </w:r>
+      </w:hyperlink>
+      <w:r>
+        <w:t xml:space="preserve"> </w:t>
+      </w:r>
+      <w:r>
+        <w:t xml:space="preserve">value</w:t>
       </w:r>
       <w:r>
         <w:t xml:space="preserve"> </w:t>
@@ -15525,7 +15556,7 @@
       <w:r>
         <w:t xml:space="preserve"> </w:t>
       </w:r>
-      <w:hyperlink r:id="rId75">
+      <w:hyperlink r:id="rId76">
         <w:r>
           <w:rPr>
             <w:rStyle w:val="Hyperlink"/>
@@ -15556,7 +15587,7 @@
       <w:r>
         <w:t xml:space="preserve"> </w:t>
       </w:r>
-      <w:hyperlink r:id="rId76">
+      <w:hyperlink r:id="rId77">
         <w:r>
           <w:rPr>
             <w:rStyle w:val="Hyperlink"/>
@@ -16954,7 +16985,7 @@
       <w:pPr>
         <w:pStyle w:val="BodyText"/>
       </w:pPr>
-      <w:bookmarkStart w:id="77" w:name="eq-epe-after-noise"/>
+      <w:bookmarkStart w:id="78" w:name="eq-epe-after-noise"/>
       <m:oMathPara>
         <m:oMathParaPr>
           <m:jc m:val="center"/>
@@ -17245,7 +17276,7 @@
           </m:r>
         </m:oMath>
       </m:oMathPara>
-      <w:bookmarkEnd w:id="77"/>
+      <w:bookmarkEnd w:id="78"/>
     </w:p>
     <w:p>
       <w:pPr>
@@ -17440,8 +17471,8 @@
         <w:t xml:space="preserve">whose noise helped determine the prediction.</w:t>
       </w:r>
     </w:p>
-    <w:bookmarkEnd w:id="78"/>
-    <w:bookmarkStart w:id="79" w:name="exr-epe-split-bias"/>
+    <w:bookmarkEnd w:id="79"/>
+    <w:bookmarkStart w:id="80" w:name="exr-epe-split-bias"/>
     <w:p>
       <w:pPr>
         <w:pStyle w:val="BodyText"/>
@@ -17765,8 +17796,8 @@
         <w:t xml:space="preserve">and what makes the cross term zero this time?</w:t>
       </w:r>
     </w:p>
-    <w:bookmarkEnd w:id="79"/>
-    <w:bookmarkStart w:id="82" w:name="sol-epe-split-bias"/>
+    <w:bookmarkEnd w:id="80"/>
+    <w:bookmarkStart w:id="83" w:name="sol-epe-split-bias"/>
     <w:p>
       <w:pPr>
         <w:pStyle w:val="BodyText"/>
@@ -20176,7 +20207,7 @@
       <w:r>
         <w:t xml:space="preserve"> </w:t>
       </w:r>
-      <w:hyperlink r:id="rId80">
+      <w:hyperlink r:id="rId81">
         <w:r>
           <w:rPr>
             <w:rStyle w:val="Hyperlink"/>
@@ -20790,7 +20821,7 @@
       <w:pPr>
         <w:pStyle w:val="BodyText"/>
       </w:pPr>
-      <w:bookmarkStart w:id="81" w:name="eq-epe-after-bias"/>
+      <w:bookmarkStart w:id="82" w:name="eq-epe-after-bias"/>
       <m:oMathPara>
         <m:oMathParaPr>
           <m:jc m:val="center"/>
@@ -21118,7 +21149,7 @@
           </m:r>
         </m:oMath>
       </m:oMathPara>
-      <w:bookmarkEnd w:id="81"/>
+      <w:bookmarkEnd w:id="82"/>
     </w:p>
     <w:p>
       <w:pPr>
@@ -21154,8 +21185,8 @@
         <w:t xml:space="preserve">This split is specific to squared-error loss, the loss these notes use.</w:t>
       </w:r>
     </w:p>
-    <w:bookmarkEnd w:id="82"/>
-    <w:bookmarkStart w:id="84" w:name="thm-epe-decomposition"/>
+    <w:bookmarkEnd w:id="83"/>
+    <w:bookmarkStart w:id="85" w:name="thm-epe-decomposition"/>
     <w:p>
       <w:pPr>
         <w:pStyle w:val="BodyText"/>
@@ -21636,10 +21667,24 @@
         </m:r>
       </m:oMath>
       <w:r>
-        <w:t xml:space="preserve"> </w:t>
-      </w:r>
-      <w:r>
-        <w:t xml:space="preserve">as a prediction of</w:t>
+        <w:t xml:space="preserve">, used as an</w:t>
+      </w:r>
+      <w:r>
+        <w:t xml:space="preserve"> </w:t>
+      </w:r>
+      <w:hyperlink r:id="rId69">
+        <w:r>
+          <w:rPr>
+            <w:rStyle w:val="Hyperlink"/>
+          </w:rPr>
+          <w:t xml:space="preserve">estimator</w:t>
+        </w:r>
+      </w:hyperlink>
+      <w:r>
+        <w:t xml:space="preserve"> </w:t>
+      </w:r>
+      <w:r>
+        <w:t xml:space="preserve">of</w:t>
       </w:r>
       <w:r>
         <w:t xml:space="preserve"> </w:t>
@@ -21676,7 +21721,7 @@
       <w:r>
         <w:t xml:space="preserve"> </w:t>
       </w:r>
-      <w:hyperlink r:id="rId80">
+      <w:hyperlink r:id="rId81">
         <w:r>
           <w:rPr>
             <w:rStyle w:val="Hyperlink"/>
@@ -21718,7 +21763,7 @@
       <w:pPr>
         <w:pStyle w:val="BodyText"/>
       </w:pPr>
-      <w:bookmarkStart w:id="83" w:name="eq-epe-decomposition"/>
+      <w:bookmarkStart w:id="84" w:name="eq-epe-decomposition"/>
       <m:oMathPara>
         <m:oMathParaPr>
           <m:jc m:val="center"/>
@@ -21984,9 +22029,9 @@
           </m:r>
         </m:oMath>
       </m:oMathPara>
-      <w:bookmarkEnd w:id="83"/>
+      <w:bookmarkEnd w:id="84"/>
     </w:p>
-    <w:bookmarkEnd w:id="84"/>
+    <w:bookmarkEnd w:id="85"/>
     <w:p>
       <w:pPr>
         <w:pStyle w:val="FirstParagraph"/>
@@ -22054,7 +22099,24 @@
         </w:r>
       </w:hyperlink>
       <w:r>
-        <w:t xml:space="preserve">, the expected squared prediction error is the noise variance plus the mean squared error of the prediction as an estimate of</w:t>
+        <w:t xml:space="preserve">, the expected squared prediction error is the noise variance plus the mean squared error of the prediction, used as an</w:t>
+      </w:r>
+      <w:r>
+        <w:t xml:space="preserve"> </w:t>
+      </w:r>
+      <w:hyperlink r:id="rId69">
+        <w:r>
+          <w:rPr>
+            <w:rStyle w:val="Hyperlink"/>
+          </w:rPr>
+          <w:t xml:space="preserve">estimator</w:t>
+        </w:r>
+      </w:hyperlink>
+      <w:r>
+        <w:t xml:space="preserve"> </w:t>
+      </w:r>
+      <w:r>
+        <w:t xml:space="preserve">of</w:t>
       </w:r>
       <w:r>
         <w:t xml:space="preserve"> </w:t>
@@ -22780,7 +22842,7 @@
         </m:oMath>
       </m:oMathPara>
     </w:p>
-    <w:bookmarkStart w:id="85" w:name="def-irreducible-error"/>
+    <w:bookmarkStart w:id="86" w:name="def-irreducible-error"/>
     <w:p>
       <w:pPr>
         <w:pStyle w:val="FirstParagraph"/>
@@ -23027,7 +23089,7 @@
         <w:t xml:space="preserve">.</w:t>
       </w:r>
     </w:p>
-    <w:bookmarkEnd w:id="85"/>
+    <w:bookmarkEnd w:id="86"/>
     <w:p>
       <w:pPr>
         <w:pStyle w:val="BodyText"/>
@@ -23055,7 +23117,7 @@
         <w:t xml:space="preserve">.</w:t>
       </w:r>
     </w:p>
-    <w:bookmarkStart w:id="88" w:name="rem-generalization-error"/>
+    <w:bookmarkStart w:id="89" w:name="rem-generalization-error"/>
     <w:p>
       <w:pPr>
         <w:pStyle w:val="BodyText"/>
@@ -23166,7 +23228,7 @@
       <w:r>
         <w:t xml:space="preserve"> </w:t>
       </w:r>
-      <w:hyperlink r:id="rId86">
+      <w:hyperlink r:id="rId87">
         <w:r>
           <w:rPr>
             <w:rStyle w:val="Hyperlink"/>
@@ -23231,7 +23293,7 @@
       <w:r>
         <w:t xml:space="preserve"> </w:t>
       </w:r>
-      <w:hyperlink r:id="rId87">
+      <w:hyperlink r:id="rId88">
         <w:r>
           <w:rPr>
             <w:rStyle w:val="Hyperlink"/>
@@ -23441,8 +23503,8 @@
         <w:t xml:space="preserve">into a squared bias, a variance and a noise variance.</w:t>
       </w:r>
     </w:p>
-    <w:bookmarkEnd w:id="88"/>
-    <w:bookmarkStart w:id="90" w:name="def-flexibility"/>
+    <w:bookmarkEnd w:id="89"/>
+    <w:bookmarkStart w:id="91" w:name="def-flexibility"/>
     <w:p>
       <w:pPr>
         <w:pStyle w:val="BodyText"/>
@@ -23716,7 +23778,7 @@
       <w:pPr>
         <w:pStyle w:val="BodyText"/>
       </w:pPr>
-      <w:bookmarkStart w:id="89" w:name="eq-flexibility"/>
+      <w:bookmarkStart w:id="90" w:name="eq-flexibility"/>
       <m:oMathPara>
         <m:oMathParaPr>
           <m:jc m:val="center"/>
@@ -23786,10 +23848,10 @@
           </m:r>
         </m:oMath>
       </m:oMathPara>
-      <w:bookmarkEnd w:id="89"/>
+      <w:bookmarkEnd w:id="90"/>
     </w:p>
-    <w:bookmarkEnd w:id="90"/>
-    <w:bookmarkStart w:id="91" w:name="rem-source-flexibility"/>
+    <w:bookmarkEnd w:id="91"/>
+    <w:bookmarkStart w:id="92" w:name="rem-source-flexibility"/>
     <w:p>
       <w:pPr>
         <w:pStyle w:val="FirstParagraph"/>
@@ -23814,8 +23876,8 @@
         <w:t xml:space="preserve">use flexibility without a formal definition.</w:t>
       </w:r>
     </w:p>
-    <w:bookmarkEnd w:id="91"/>
-    <w:bookmarkStart w:id="92" w:name="rem-flexibility"/>
+    <w:bookmarkEnd w:id="92"/>
+    <w:bookmarkStart w:id="93" w:name="rem-flexibility"/>
     <w:p>
       <w:pPr>
         <w:pStyle w:val="BodyText"/>
@@ -24048,8 +24110,8 @@
         <w:t xml:space="preserve">.</w:t>
       </w:r>
     </w:p>
-    <w:bookmarkEnd w:id="92"/>
-    <w:bookmarkStart w:id="94" w:name="def-bias-variance-tradeoff"/>
+    <w:bookmarkEnd w:id="93"/>
+    <w:bookmarkStart w:id="95" w:name="def-bias-variance-tradeoff"/>
     <w:p>
       <w:pPr>
         <w:pStyle w:val="BodyText"/>
@@ -24308,7 +24370,24 @@
         <w:t xml:space="preserve"> </w:t>
       </w:r>
       <w:r>
-        <w:t xml:space="preserve">of the prediction, as a prediction of</w:t>
+        <w:t xml:space="preserve">of the prediction, used as an</w:t>
+      </w:r>
+      <w:r>
+        <w:t xml:space="preserve"> </w:t>
+      </w:r>
+      <w:hyperlink r:id="rId69">
+        <w:r>
+          <w:rPr>
+            <w:rStyle w:val="Hyperlink"/>
+          </w:rPr>
+          <w:t xml:space="preserve">estimator</w:t>
+        </w:r>
+      </w:hyperlink>
+      <w:r>
+        <w:t xml:space="preserve"> </w:t>
+      </w:r>
+      <w:r>
+        <w:t xml:space="preserve">of</w:t>
       </w:r>
       <w:r>
         <w:t xml:space="preserve"> </w:t>
@@ -24345,7 +24424,7 @@
       <w:r>
         <w:t xml:space="preserve"> </w:t>
       </w:r>
-      <w:hyperlink r:id="rId80">
+      <w:hyperlink r:id="rId81">
         <w:r>
           <w:rPr>
             <w:rStyle w:val="Hyperlink"/>
@@ -24364,7 +24443,7 @@
       <w:pPr>
         <w:pStyle w:val="BodyText"/>
       </w:pPr>
-      <w:bookmarkStart w:id="93" w:name="eq-bias-variance-tradeoff"/>
+      <w:bookmarkStart w:id="94" w:name="eq-bias-variance-tradeoff"/>
       <m:oMathPara>
         <m:oMathParaPr>
           <m:jc m:val="center"/>
@@ -24861,7 +24940,7 @@
           </m:r>
         </m:oMath>
       </m:oMathPara>
-      <w:bookmarkEnd w:id="93"/>
+      <w:bookmarkEnd w:id="94"/>
     </w:p>
     <w:p>
       <w:pPr>
@@ -24880,8 +24959,8 @@
         <w:t xml:space="preserve">.</w:t>
       </w:r>
     </w:p>
-    <w:bookmarkEnd w:id="94"/>
-    <w:bookmarkStart w:id="95" w:name="rem-overfitting-tradeoff"/>
+    <w:bookmarkEnd w:id="95"/>
+    <w:bookmarkStart w:id="96" w:name="rem-overfitting-tradeoff"/>
     <w:p>
       <w:pPr>
         <w:pStyle w:val="BodyText"/>
@@ -25496,8 +25575,8 @@
         <w:t xml:space="preserve">but predict new observations worse.</w:t>
       </w:r>
     </w:p>
-    <w:bookmarkEnd w:id="95"/>
-    <w:bookmarkStart w:id="96" w:name="rem-overfitting-causes"/>
+    <w:bookmarkEnd w:id="96"/>
+    <w:bookmarkStart w:id="97" w:name="rem-overfitting-causes"/>
     <w:p>
       <w:pPr>
         <w:pStyle w:val="BodyText"/>
@@ -25615,8 +25694,8 @@
         <w:t xml:space="preserve">the degree-4 fit has five coefficients for those 20 cars.</w:t>
       </w:r>
     </w:p>
-    <w:bookmarkEnd w:id="96"/>
-    <w:bookmarkStart w:id="97" w:name="exr-held-out-unbiased"/>
+    <w:bookmarkEnd w:id="97"/>
+    <w:bookmarkStart w:id="98" w:name="exr-held-out-unbiased"/>
     <w:p>
       <w:pPr>
         <w:pStyle w:val="BodyText"/>
@@ -26327,8 +26406,8 @@
         </m:oMath>
       </m:oMathPara>
     </w:p>
-    <w:bookmarkEnd w:id="97"/>
-    <w:bookmarkStart w:id="98" w:name="sol-held-out-unbiased"/>
+    <w:bookmarkEnd w:id="98"/>
+    <w:bookmarkStart w:id="99" w:name="sol-held-out-unbiased"/>
     <w:p>
       <w:pPr>
         <w:pStyle w:val="FirstParagraph"/>
@@ -27924,8 +28003,8 @@
         <w:t xml:space="preserve">.</w:t>
       </w:r>
     </w:p>
-    <w:bookmarkEnd w:id="98"/>
-    <w:bookmarkStart w:id="99" w:name="thm-held-out-unbiased"/>
+    <w:bookmarkEnd w:id="99"/>
+    <w:bookmarkStart w:id="100" w:name="thm-held-out-unbiased"/>
     <w:p>
       <w:pPr>
         <w:pStyle w:val="BodyText"/>
@@ -28629,7 +28708,7 @@
         </m:oMath>
       </m:oMathPara>
     </w:p>
-    <w:bookmarkEnd w:id="99"/>
+    <w:bookmarkEnd w:id="100"/>
     <w:p>
       <w:pPr>
         <w:pStyle w:val="FirstParagraph"/>
@@ -28662,7 +28741,7 @@
         <w:t xml:space="preserve">.</w:t>
       </w:r>
     </w:p>
-    <w:bookmarkStart w:id="100" w:name="rem-training-mse-optimistic"/>
+    <w:bookmarkStart w:id="101" w:name="rem-training-mse-optimistic"/>
     <w:p>
       <w:pPr>
         <w:pStyle w:val="BodyText"/>
@@ -28980,8 +29059,8 @@
         <w:t xml:space="preserve">while held-out RMSE does not.</w:t>
       </w:r>
     </w:p>
-    <w:bookmarkEnd w:id="100"/>
-    <w:bookmarkStart w:id="105" w:name="exm-train-test-error-simulated"/>
+    <w:bookmarkEnd w:id="101"/>
+    <w:bookmarkStart w:id="106" w:name="exm-train-test-error-simulated"/>
     <w:p>
       <w:pPr>
         <w:pStyle w:val="BodyText"/>
@@ -30345,7 +30424,7 @@
       <w:tr>
         <w:tc>
           <w:tcPr/>
-          <w:bookmarkStart w:id="104" w:name="fig-train-test-error"/>
+          <w:bookmarkStart w:id="105" w:name="fig-train-test-error"/>
           <w:p>
             <w:pPr>
               <w:pStyle w:val="SourceCode"/>
@@ -31060,18 +31139,18 @@
                 <wp:inline>
                   <wp:extent cx="4620126" cy="3696101"/>
                   <wp:effectExtent b="0" l="0" r="0" t="0"/>
-                  <wp:docPr descr="" title="" id="102" name="Picture"/>
+                  <wp:docPr descr="" title="" id="103" name="Picture"/>
                   <a:graphic>
                     <a:graphicData uri="http://schemas.openxmlformats.org/drawingml/2006/picture">
                       <pic:pic>
                         <pic:nvPicPr>
-                          <pic:cNvPr descr="model-validation_files/figure-docx/train-test-error-plot-1.png" id="103" name="Picture"/>
+                          <pic:cNvPr descr="model-validation_files/figure-docx/train-test-error-plot-1.png" id="104" name="Picture"/>
                           <pic:cNvPicPr>
                             <a:picLocks noChangeArrowheads="1" noChangeAspect="1"/>
                           </pic:cNvPicPr>
                         </pic:nvPicPr>
                         <pic:blipFill>
-                          <a:blip r:embed="rId101"/>
+                          <a:blip r:embed="rId102"/>
                           <a:stretch>
                             <a:fillRect/>
                           </a:stretch>
@@ -31203,7 +31282,7 @@
               <w:t xml:space="preserve">.</w:t>
             </w:r>
           </w:p>
-          <w:bookmarkEnd w:id="104"/>
+          <w:bookmarkEnd w:id="105"/>
         </w:tc>
       </w:tr>
     </w:tbl>
@@ -31709,9 +31788,9 @@
         <w:t xml:space="preserve">.</w:t>
       </w:r>
     </w:p>
-    <w:bookmarkEnd w:id="105"/>
     <w:bookmarkEnd w:id="106"/>
-    <w:bookmarkStart w:id="153" w:name="sec-data-splits"/>
+    <w:bookmarkEnd w:id="107"/>
+    <w:bookmarkStart w:id="154" w:name="sec-data-splits"/>
     <w:p>
       <w:pPr>
         <w:pStyle w:val="Heading2"/>
@@ -31720,7 +31799,7 @@
         <w:t xml:space="preserve">5 Training, validation, and test sets</w:t>
       </w:r>
     </w:p>
-    <w:bookmarkStart w:id="107" w:name="exr-data-splits"/>
+    <w:bookmarkStart w:id="108" w:name="exr-data-splits"/>
     <w:p>
       <w:pPr>
         <w:pStyle w:val="FirstParagraph"/>
@@ -31853,8 +31932,8 @@
         <w:t xml:space="preserve">How many cars are in each set?</w:t>
       </w:r>
     </w:p>
-    <w:bookmarkEnd w:id="107"/>
-    <w:bookmarkStart w:id="108" w:name="sol-data-splits"/>
+    <w:bookmarkEnd w:id="108"/>
+    <w:bookmarkStart w:id="109" w:name="sol-data-splits"/>
     <w:p>
       <w:pPr>
         <w:pStyle w:val="BodyText"/>
@@ -32089,8 +32168,8 @@
         <w:t xml:space="preserve">test cars.</w:t>
       </w:r>
     </w:p>
-    <w:bookmarkEnd w:id="108"/>
-    <w:bookmarkStart w:id="110" w:name="def-data-splits"/>
+    <w:bookmarkEnd w:id="109"/>
+    <w:bookmarkStart w:id="111" w:name="def-data-splits"/>
     <w:p>
       <w:pPr>
         <w:pStyle w:val="BodyText"/>
@@ -32292,7 +32371,7 @@
       <w:pPr>
         <w:pStyle w:val="BodyText"/>
       </w:pPr>
-      <w:bookmarkStart w:id="109" w:name="eq-data-splits"/>
+      <w:bookmarkStart w:id="110" w:name="eq-data-splits"/>
       <m:oMathPara>
         <m:oMathParaPr>
           <m:jc m:val="center"/>
@@ -32746,7 +32825,7 @@
           </m:r>
         </m:oMath>
       </m:oMathPara>
-      <w:bookmarkEnd w:id="109"/>
+      <w:bookmarkEnd w:id="110"/>
     </w:p>
     <w:p>
       <w:pPr>
@@ -32765,8 +32844,8 @@
         <w:t xml:space="preserve">.</w:t>
       </w:r>
     </w:p>
-    <w:bookmarkEnd w:id="110"/>
-    <w:bookmarkStart w:id="111" w:name="exm-data-splits-sizes"/>
+    <w:bookmarkEnd w:id="111"/>
+    <w:bookmarkStart w:id="112" w:name="exm-data-splits-sizes"/>
     <w:p>
       <w:pPr>
         <w:pStyle w:val="BodyText"/>
@@ -32840,8 +32919,8 @@
         <w:t xml:space="preserve">and the 7 test cars are used only once, after the model is chosen.</w:t>
       </w:r>
     </w:p>
-    <w:bookmarkEnd w:id="111"/>
-    <w:bookmarkStart w:id="113" w:name="def-tuning-parameter"/>
+    <w:bookmarkEnd w:id="112"/>
+    <w:bookmarkStart w:id="114" w:name="def-tuning-parameter"/>
     <w:p>
       <w:pPr>
         <w:pStyle w:val="BodyText"/>
@@ -32931,7 +33010,7 @@
       <w:pPr>
         <w:pStyle w:val="BodyText"/>
       </w:pPr>
-      <w:bookmarkStart w:id="112" w:name="eq-tuning-parameter"/>
+      <w:bookmarkStart w:id="113" w:name="eq-tuning-parameter"/>
       <m:oMathPara>
         <m:oMathParaPr>
           <m:jc m:val="center"/>
@@ -33051,10 +33130,10 @@
           </m:r>
         </m:oMath>
       </m:oMathPara>
-      <w:bookmarkEnd w:id="112"/>
+      <w:bookmarkEnd w:id="113"/>
     </w:p>
-    <w:bookmarkEnd w:id="113"/>
-    <w:bookmarkStart w:id="114" w:name="exm-tuning-parameter"/>
+    <w:bookmarkEnd w:id="114"/>
+    <w:bookmarkStart w:id="115" w:name="exm-tuning-parameter"/>
     <w:p>
       <w:pPr>
         <w:pStyle w:val="FirstParagraph"/>
@@ -33239,8 +33318,8 @@
         <w:t xml:space="preserve">.</w:t>
       </w:r>
     </w:p>
-    <w:bookmarkEnd w:id="114"/>
-    <w:bookmarkStart w:id="116" w:name="def-validation-set"/>
+    <w:bookmarkEnd w:id="115"/>
+    <w:bookmarkStart w:id="117" w:name="def-validation-set"/>
     <w:p>
       <w:pPr>
         <w:pStyle w:val="BodyText"/>
@@ -33360,7 +33439,7 @@
       <w:pPr>
         <w:pStyle w:val="BodyText"/>
       </w:pPr>
-      <w:bookmarkStart w:id="115" w:name="eq-validation-set"/>
+      <w:bookmarkStart w:id="116" w:name="eq-validation-set"/>
       <m:oMathPara>
         <m:oMathParaPr>
           <m:jc m:val="center"/>
@@ -33481,10 +33560,10 @@
           </m:r>
         </m:oMath>
       </m:oMathPara>
-      <w:bookmarkEnd w:id="115"/>
+      <w:bookmarkEnd w:id="116"/>
     </w:p>
-    <w:bookmarkEnd w:id="116"/>
-    <w:bookmarkStart w:id="118" w:name="def-validation-error"/>
+    <w:bookmarkEnd w:id="117"/>
+    <w:bookmarkStart w:id="119" w:name="def-validation-error"/>
     <w:p>
       <w:pPr>
         <w:pStyle w:val="FirstParagraph"/>
@@ -33658,7 +33737,7 @@
       <w:pPr>
         <w:pStyle w:val="BodyText"/>
       </w:pPr>
-      <w:bookmarkStart w:id="117" w:name="eq-validation-error"/>
+      <w:bookmarkStart w:id="118" w:name="eq-validation-error"/>
       <m:oMathPara>
         <m:oMathParaPr>
           <m:jc m:val="center"/>
@@ -33902,10 +33981,10 @@
           </m:r>
         </m:oMath>
       </m:oMathPara>
-      <w:bookmarkEnd w:id="117"/>
+      <w:bookmarkEnd w:id="118"/>
     </w:p>
-    <w:bookmarkEnd w:id="118"/>
-    <w:bookmarkStart w:id="120" w:name="def-validation-choice"/>
+    <w:bookmarkEnd w:id="119"/>
+    <w:bookmarkStart w:id="121" w:name="def-validation-choice"/>
     <w:p>
       <w:pPr>
         <w:pStyle w:val="FirstParagraph"/>
@@ -34111,7 +34190,7 @@
       <w:pPr>
         <w:pStyle w:val="BodyText"/>
       </w:pPr>
-      <w:bookmarkStart w:id="119" w:name="eq-validation-choice"/>
+      <w:bookmarkStart w:id="120" w:name="eq-validation-choice"/>
       <m:oMathPara>
         <m:oMathParaPr>
           <m:jc m:val="center"/>
@@ -34388,10 +34467,10 @@
           </m:r>
         </m:oMath>
       </m:oMathPara>
-      <w:bookmarkEnd w:id="119"/>
+      <w:bookmarkEnd w:id="120"/>
     </w:p>
-    <w:bookmarkEnd w:id="120"/>
-    <w:bookmarkStart w:id="122" w:name="def-test-set"/>
+    <w:bookmarkEnd w:id="121"/>
+    <w:bookmarkStart w:id="123" w:name="def-test-set"/>
     <w:p>
       <w:pPr>
         <w:pStyle w:val="FirstParagraph"/>
@@ -34535,7 +34614,7 @@
       <w:pPr>
         <w:pStyle w:val="BodyText"/>
       </w:pPr>
-      <w:bookmarkStart w:id="121" w:name="eq-test-set"/>
+      <w:bookmarkStart w:id="122" w:name="eq-test-set"/>
       <m:oMathPara>
         <m:oMathParaPr>
           <m:jc m:val="center"/>
@@ -34656,10 +34735,10 @@
           </m:r>
         </m:oMath>
       </m:oMathPara>
-      <w:bookmarkEnd w:id="121"/>
+      <w:bookmarkEnd w:id="122"/>
     </w:p>
-    <w:bookmarkEnd w:id="122"/>
-    <w:bookmarkStart w:id="124" w:name="def-test-error"/>
+    <w:bookmarkEnd w:id="123"/>
+    <w:bookmarkStart w:id="125" w:name="def-test-error"/>
     <w:p>
       <w:pPr>
         <w:pStyle w:val="FirstParagraph"/>
@@ -34833,7 +34912,7 @@
       <w:pPr>
         <w:pStyle w:val="BodyText"/>
       </w:pPr>
-      <w:bookmarkStart w:id="123" w:name="eq-test-error"/>
+      <w:bookmarkStart w:id="124" w:name="eq-test-error"/>
       <m:oMathPara>
         <m:oMathParaPr>
           <m:jc m:val="center"/>
@@ -35077,10 +35156,10 @@
           </m:r>
         </m:oMath>
       </m:oMathPara>
-      <w:bookmarkEnd w:id="123"/>
+      <w:bookmarkEnd w:id="124"/>
     </w:p>
-    <w:bookmarkEnd w:id="124"/>
-    <w:bookmarkStart w:id="128" w:name="rem-data-splits"/>
+    <w:bookmarkEnd w:id="125"/>
+    <w:bookmarkStart w:id="129" w:name="rem-data-splits"/>
     <w:p>
       <w:pPr>
         <w:pStyle w:val="FirstParagraph"/>
@@ -35255,7 +35334,7 @@
       <w:r>
         <w:t xml:space="preserve"> </w:t>
       </w:r>
-      <w:hyperlink r:id="rId125">
+      <w:hyperlink r:id="rId126">
         <w:r>
           <w:rPr>
             <w:rStyle w:val="Hyperlink"/>
@@ -35275,7 +35354,7 @@
       <w:r>
         <w:t xml:space="preserve"> </w:t>
       </w:r>
-      <w:hyperlink r:id="rId126">
+      <w:hyperlink r:id="rId127">
         <w:r>
           <w:rPr>
             <w:rStyle w:val="Hyperlink"/>
@@ -35295,7 +35374,7 @@
       <w:r>
         <w:t xml:space="preserve"> </w:t>
       </w:r>
-      <w:hyperlink r:id="rId127">
+      <w:hyperlink r:id="rId128">
         <w:r>
           <w:rPr>
             <w:rStyle w:val="Hyperlink"/>
@@ -35313,8 +35392,8 @@
         <w:t xml:space="preserve">They use a different symbol for the training set and a parenthesized observation index, but the same three-way split.</w:t>
       </w:r>
     </w:p>
-    <w:bookmarkEnd w:id="128"/>
-    <w:bookmarkStart w:id="129" w:name="rem-validation-test-error"/>
+    <w:bookmarkEnd w:id="129"/>
+    <w:bookmarkStart w:id="130" w:name="rem-validation-test-error"/>
     <w:p>
       <w:pPr>
         <w:pStyle w:val="BodyText"/>
@@ -35524,8 +35603,8 @@
         <w:t xml:space="preserve">gives the corresponding validation and test errors.</w:t>
       </w:r>
     </w:p>
-    <w:bookmarkEnd w:id="129"/>
-    <w:bookmarkStart w:id="152" w:name="exm-train-validation-test-split"/>
+    <w:bookmarkEnd w:id="130"/>
+    <w:bookmarkStart w:id="153" w:name="exm-train-validation-test-split"/>
     <w:p>
       <w:pPr>
         <w:pStyle w:val="BodyText"/>
@@ -35759,7 +35838,7 @@
       <w:tr>
         <w:tc>
           <w:tcPr/>
-          <w:bookmarkStart w:id="130" w:name="tbl-train-validation-test-split-sizes"/>
+          <w:bookmarkStart w:id="131" w:name="tbl-train-validation-test-split-sizes"/>
           <w:p>
             <w:pPr>
               <w:jc w:val="center"/>
@@ -36391,7 +36470,7 @@
               <w:t xml:space="preserve">#&gt; 3 test           7</w:t>
             </w:r>
           </w:p>
-          <w:bookmarkEnd w:id="130"/>
+          <w:bookmarkEnd w:id="131"/>
         </w:tc>
       </w:tr>
     </w:tbl>
@@ -40249,7 +40328,7 @@
       <w:tr>
         <w:tc>
           <w:tcPr/>
-          <w:bookmarkStart w:id="134" w:name="fig-linear-model-superimposed"/>
+          <w:bookmarkStart w:id="135" w:name="fig-linear-model-superimposed"/>
           <w:p>
             <w:pPr>
               <w:pStyle w:val="SourceCode"/>
@@ -40289,18 +40368,18 @@
                 <wp:inline>
                   <wp:extent cx="4620126" cy="3696101"/>
                   <wp:effectExtent b="0" l="0" r="0" t="0"/>
-                  <wp:docPr descr="" title="" id="132" name="Picture"/>
+                  <wp:docPr descr="" title="" id="133" name="Picture"/>
                   <a:graphic>
                     <a:graphicData uri="http://schemas.openxmlformats.org/drawingml/2006/picture">
                       <pic:pic>
                         <pic:nvPicPr>
-                          <pic:cNvPr descr="model-validation_files/figure-docx/unnamed-chunk-3-1.png" id="133" name="Picture"/>
+                          <pic:cNvPr descr="model-validation_files/figure-docx/unnamed-chunk-3-1.png" id="134" name="Picture"/>
                           <pic:cNvPicPr>
                             <a:picLocks noChangeArrowheads="1" noChangeAspect="1"/>
                           </pic:cNvPicPr>
                         </pic:nvPicPr>
                         <pic:blipFill>
-                          <a:blip r:embed="rId131"/>
+                          <a:blip r:embed="rId132"/>
                           <a:stretch>
                             <a:fillRect/>
                           </a:stretch>
@@ -40340,7 +40419,7 @@
               <w:t xml:space="preserve">Figure 2: Linear model fit superimposed on data partitions</w:t>
             </w:r>
           </w:p>
-          <w:bookmarkEnd w:id="134"/>
+          <w:bookmarkEnd w:id="135"/>
         </w:tc>
       </w:tr>
     </w:tbl>
@@ -40365,7 +40444,7 @@
       <w:tr>
         <w:tc>
           <w:tcPr/>
-          <w:bookmarkStart w:id="138" w:name="fig-quadratic-model-superimposed"/>
+          <w:bookmarkStart w:id="139" w:name="fig-quadratic-model-superimposed"/>
           <w:p>
             <w:pPr>
               <w:pStyle w:val="SourceCode"/>
@@ -40405,18 +40484,18 @@
                 <wp:inline>
                   <wp:extent cx="4620126" cy="3696101"/>
                   <wp:effectExtent b="0" l="0" r="0" t="0"/>
-                  <wp:docPr descr="" title="" id="136" name="Picture"/>
+                  <wp:docPr descr="" title="" id="137" name="Picture"/>
                   <a:graphic>
                     <a:graphicData uri="http://schemas.openxmlformats.org/drawingml/2006/picture">
                       <pic:pic>
                         <pic:nvPicPr>
-                          <pic:cNvPr descr="model-validation_files/figure-docx/unnamed-chunk-4-1.png" id="137" name="Picture"/>
+                          <pic:cNvPr descr="model-validation_files/figure-docx/unnamed-chunk-4-1.png" id="138" name="Picture"/>
                           <pic:cNvPicPr>
                             <a:picLocks noChangeArrowheads="1" noChangeAspect="1"/>
                           </pic:cNvPicPr>
                         </pic:nvPicPr>
                         <pic:blipFill>
-                          <a:blip r:embed="rId135"/>
+                          <a:blip r:embed="rId136"/>
                           <a:stretch>
                             <a:fillRect/>
                           </a:stretch>
@@ -40456,7 +40535,7 @@
               <w:t xml:space="preserve">Figure 3: Quadratic model fit superimposed on data partitions</w:t>
             </w:r>
           </w:p>
-          <w:bookmarkEnd w:id="138"/>
+          <w:bookmarkEnd w:id="139"/>
         </w:tc>
       </w:tr>
     </w:tbl>
@@ -40481,7 +40560,7 @@
       <w:tr>
         <w:tc>
           <w:tcPr/>
-          <w:bookmarkStart w:id="142" w:name="fig-cubic-model-superimposed"/>
+          <w:bookmarkStart w:id="143" w:name="fig-cubic-model-superimposed"/>
           <w:p>
             <w:pPr>
               <w:pStyle w:val="SourceCode"/>
@@ -40521,18 +40600,18 @@
                 <wp:inline>
                   <wp:extent cx="4620126" cy="3696101"/>
                   <wp:effectExtent b="0" l="0" r="0" t="0"/>
-                  <wp:docPr descr="" title="" id="140" name="Picture"/>
+                  <wp:docPr descr="" title="" id="141" name="Picture"/>
                   <a:graphic>
                     <a:graphicData uri="http://schemas.openxmlformats.org/drawingml/2006/picture">
                       <pic:pic>
                         <pic:nvPicPr>
-                          <pic:cNvPr descr="model-validation_files/figure-docx/unnamed-chunk-5-1.png" id="141" name="Picture"/>
+                          <pic:cNvPr descr="model-validation_files/figure-docx/unnamed-chunk-5-1.png" id="142" name="Picture"/>
                           <pic:cNvPicPr>
                             <a:picLocks noChangeArrowheads="1" noChangeAspect="1"/>
                           </pic:cNvPicPr>
                         </pic:nvPicPr>
                         <pic:blipFill>
-                          <a:blip r:embed="rId139"/>
+                          <a:blip r:embed="rId140"/>
                           <a:stretch>
                             <a:fillRect/>
                           </a:stretch>
@@ -40572,7 +40651,7 @@
               <w:t xml:space="preserve">Figure 4: Cubic model fit superimposed on data partitions</w:t>
             </w:r>
           </w:p>
-          <w:bookmarkEnd w:id="142"/>
+          <w:bookmarkEnd w:id="143"/>
         </w:tc>
       </w:tr>
     </w:tbl>
@@ -40597,7 +40676,7 @@
       <w:tr>
         <w:tc>
           <w:tcPr/>
-          <w:bookmarkStart w:id="146" w:name="fig-quartic-model-superimposed"/>
+          <w:bookmarkStart w:id="147" w:name="fig-quartic-model-superimposed"/>
           <w:p>
             <w:pPr>
               <w:pStyle w:val="SourceCode"/>
@@ -40637,18 +40716,18 @@
                 <wp:inline>
                   <wp:extent cx="4620126" cy="3696101"/>
                   <wp:effectExtent b="0" l="0" r="0" t="0"/>
-                  <wp:docPr descr="" title="" id="144" name="Picture"/>
+                  <wp:docPr descr="" title="" id="145" name="Picture"/>
                   <a:graphic>
                     <a:graphicData uri="http://schemas.openxmlformats.org/drawingml/2006/picture">
                       <pic:pic>
                         <pic:nvPicPr>
-                          <pic:cNvPr descr="model-validation_files/figure-docx/unnamed-chunk-6-1.png" id="145" name="Picture"/>
+                          <pic:cNvPr descr="model-validation_files/figure-docx/unnamed-chunk-6-1.png" id="146" name="Picture"/>
                           <pic:cNvPicPr>
                             <a:picLocks noChangeArrowheads="1" noChangeAspect="1"/>
                           </pic:cNvPicPr>
                         </pic:nvPicPr>
                         <pic:blipFill>
-                          <a:blip r:embed="rId143"/>
+                          <a:blip r:embed="rId144"/>
                           <a:stretch>
                             <a:fillRect/>
                           </a:stretch>
@@ -40688,7 +40767,7 @@
               <w:t xml:space="preserve">Figure 5: Quartic model fit superimposed on data partitions</w:t>
             </w:r>
           </w:p>
-          <w:bookmarkEnd w:id="146"/>
+          <w:bookmarkEnd w:id="147"/>
         </w:tc>
       </w:tr>
     </w:tbl>
@@ -40713,7 +40792,7 @@
       <w:tr>
         <w:tc>
           <w:tcPr/>
-          <w:bookmarkStart w:id="147" w:name="tbl-train-validation-results"/>
+          <w:bookmarkStart w:id="148" w:name="tbl-train-validation-results"/>
           <w:p>
             <w:pPr>
               <w:jc w:val="center"/>
@@ -40802,7 +40881,7 @@
               <w:t xml:space="preserve">#&gt; 4 quartic            1.90            3.97</w:t>
             </w:r>
           </w:p>
-          <w:bookmarkEnd w:id="147"/>
+          <w:bookmarkEnd w:id="148"/>
         </w:tc>
       </w:tr>
     </w:tbl>
@@ -40871,7 +40950,7 @@
       <w:tr>
         <w:tc>
           <w:tcPr/>
-          <w:bookmarkStart w:id="148" w:name="tbl-train-validation-test-rmse"/>
+          <w:bookmarkStart w:id="149" w:name="tbl-train-validation-test-rmse"/>
           <w:p>
             <w:pPr>
               <w:jc w:val="center"/>
@@ -40948,7 +41027,7 @@
               <w:t xml:space="preserve">#&gt; 2 test       linear  2.44</w:t>
             </w:r>
           </w:p>
-          <w:bookmarkEnd w:id="148"/>
+          <w:bookmarkEnd w:id="149"/>
         </w:tc>
       </w:tr>
     </w:tbl>
@@ -41001,18 +41080,18 @@
                 <wp:inline>
                   <wp:extent cx="152400" cy="152400"/>
                   <wp:effectExtent b="0" l="0" r="0" t="0"/>
-                  <wp:docPr descr="" title="" id="150" name="Picture"/>
+                  <wp:docPr descr="" title="" id="151" name="Picture"/>
                   <a:graphic>
                     <a:graphicData uri="http://schemas.openxmlformats.org/drawingml/2006/picture">
                       <pic:pic>
                         <pic:nvPicPr>
-                          <pic:cNvPr descr="/opt/quarto/share/formats/docx/note.png" id="151" name="Picture"/>
+                          <pic:cNvPr descr="/opt/quarto/share/formats/docx/note.png" id="152" name="Picture"/>
                           <pic:cNvPicPr>
                             <a:picLocks noChangeArrowheads="1" noChangeAspect="1"/>
                           </pic:cNvPicPr>
                         </pic:nvPicPr>
                         <pic:blipFill>
-                          <a:blip r:embed="rId149"/>
+                          <a:blip r:embed="rId150"/>
                           <a:stretch>
                             <a:fillRect/>
                           </a:stretch>
@@ -41085,9 +41164,9 @@
         </w:tc>
       </w:tr>
     </w:tbl>
-    <w:bookmarkEnd w:id="152"/>
     <w:bookmarkEnd w:id="153"/>
-    <w:bookmarkStart w:id="189" w:name="sec-kfold"/>
+    <w:bookmarkEnd w:id="154"/>
+    <w:bookmarkStart w:id="190" w:name="sec-kfold"/>
     <w:p>
       <w:pPr>
         <w:pStyle w:val="Heading2"/>
@@ -41107,7 +41186,7 @@
         <w:t xml:space="preserve">-fold cross-validation</w:t>
       </w:r>
     </w:p>
-    <w:bookmarkStart w:id="154" w:name="exr-kfold"/>
+    <w:bookmarkStart w:id="155" w:name="exr-kfold"/>
     <w:p>
       <w:pPr>
         <w:pStyle w:val="FirstParagraph"/>
@@ -41258,8 +41337,8 @@
         <w:t xml:space="preserve">How many times is a given car used for fitting, and how many times for prediction?</w:t>
       </w:r>
     </w:p>
-    <w:bookmarkEnd w:id="154"/>
-    <w:bookmarkStart w:id="155" w:name="sol-kfold"/>
+    <w:bookmarkEnd w:id="155"/>
+    <w:bookmarkStart w:id="156" w:name="sol-kfold"/>
     <w:p>
       <w:pPr>
         <w:pStyle w:val="FirstParagraph"/>
@@ -41433,8 +41512,8 @@
         <w:t xml:space="preserve">fits.</w:t>
       </w:r>
     </w:p>
-    <w:bookmarkEnd w:id="155"/>
-    <w:bookmarkStart w:id="157" w:name="def-folds"/>
+    <w:bookmarkEnd w:id="156"/>
+    <w:bookmarkStart w:id="158" w:name="def-folds"/>
     <w:p>
       <w:pPr>
         <w:pStyle w:val="FirstParagraph"/>
@@ -41623,7 +41702,7 @@
       <w:pPr>
         <w:pStyle w:val="BodyText"/>
       </w:pPr>
-      <w:bookmarkStart w:id="156" w:name="eq-folds"/>
+      <w:bookmarkStart w:id="157" w:name="eq-folds"/>
       <m:oMathPara>
         <m:oMathParaPr>
           <m:jc m:val="center"/>
@@ -41714,10 +41793,10 @@
           </m:r>
         </m:oMath>
       </m:oMathPara>
-      <w:bookmarkEnd w:id="156"/>
+      <w:bookmarkEnd w:id="157"/>
     </w:p>
-    <w:bookmarkEnd w:id="157"/>
-    <w:bookmarkStart w:id="158" w:name="rem-source-folds"/>
+    <w:bookmarkEnd w:id="158"/>
+    <w:bookmarkStart w:id="159" w:name="rem-source-folds"/>
     <w:p>
       <w:pPr>
         <w:pStyle w:val="FirstParagraph"/>
@@ -41771,8 +41850,8 @@
         <w:t xml:space="preserve">roughly equal-sized parts.</w:t>
       </w:r>
     </w:p>
-    <w:bookmarkEnd w:id="158"/>
-    <w:bookmarkStart w:id="160" w:name="def-fold-size"/>
+    <w:bookmarkEnd w:id="159"/>
+    <w:bookmarkStart w:id="161" w:name="def-fold-size"/>
     <w:p>
       <w:pPr>
         <w:pStyle w:val="BodyText"/>
@@ -41866,7 +41945,7 @@
       <w:pPr>
         <w:pStyle w:val="BodyText"/>
       </w:pPr>
-      <w:bookmarkStart w:id="159" w:name="eq-fold-size"/>
+      <w:bookmarkStart w:id="160" w:name="eq-fold-size"/>
       <m:oMathPara>
         <m:oMathParaPr>
           <m:jc m:val="center"/>
@@ -41961,10 +42040,10 @@
           </m:r>
         </m:oMath>
       </m:oMathPara>
-      <w:bookmarkEnd w:id="159"/>
+      <w:bookmarkEnd w:id="160"/>
     </w:p>
-    <w:bookmarkEnd w:id="160"/>
-    <w:bookmarkStart w:id="162" w:name="def-fold-assignment"/>
+    <w:bookmarkEnd w:id="161"/>
+    <w:bookmarkStart w:id="163" w:name="def-fold-assignment"/>
     <w:p>
       <w:pPr>
         <w:pStyle w:val="FirstParagraph"/>
@@ -42119,7 +42198,7 @@
       <w:pPr>
         <w:pStyle w:val="BodyText"/>
       </w:pPr>
-      <w:bookmarkStart w:id="161" w:name="eq-fold-assignment"/>
+      <w:bookmarkStart w:id="162" w:name="eq-fold-assignment"/>
       <m:oMathPara>
         <m:oMathParaPr>
           <m:jc m:val="center"/>
@@ -42195,10 +42274,10 @@
           </m:r>
         </m:oMath>
       </m:oMathPara>
-      <w:bookmarkEnd w:id="161"/>
+      <w:bookmarkEnd w:id="162"/>
     </w:p>
-    <w:bookmarkEnd w:id="162"/>
-    <w:bookmarkStart w:id="163" w:name="rem-source-fold-assignment"/>
+    <w:bookmarkEnd w:id="163"/>
+    <w:bookmarkStart w:id="164" w:name="rem-source-fold-assignment"/>
     <w:p>
       <w:pPr>
         <w:pStyle w:val="FirstParagraph"/>
@@ -42259,8 +42338,8 @@
         <w:t xml:space="preserve">.</w:t>
       </w:r>
     </w:p>
-    <w:bookmarkEnd w:id="163"/>
-    <w:bookmarkStart w:id="165" w:name="def-fold-out-rule"/>
+    <w:bookmarkEnd w:id="164"/>
+    <w:bookmarkStart w:id="166" w:name="def-fold-out-rule"/>
     <w:p>
       <w:pPr>
         <w:pStyle w:val="BodyText"/>
@@ -42452,7 +42531,7 @@
       <w:pPr>
         <w:pStyle w:val="BodyText"/>
       </w:pPr>
-      <w:bookmarkStart w:id="164" w:name="eq-fold-out-rule"/>
+      <w:bookmarkStart w:id="165" w:name="eq-fold-out-rule"/>
       <m:oMathPara>
         <m:oMathParaPr>
           <m:jc m:val="center"/>
@@ -42685,10 +42764,10 @@
           </m:r>
         </m:oMath>
       </m:oMathPara>
-      <w:bookmarkEnd w:id="164"/>
+      <w:bookmarkEnd w:id="165"/>
     </w:p>
-    <w:bookmarkEnd w:id="165"/>
-    <w:bookmarkStart w:id="166" w:name="rem-source-fold-out-rule"/>
+    <w:bookmarkEnd w:id="166"/>
+    <w:bookmarkStart w:id="167" w:name="rem-source-fold-out-rule"/>
     <w:p>
       <w:pPr>
         <w:pStyle w:val="FirstParagraph"/>
@@ -42760,8 +42839,8 @@
         <w:t xml:space="preserve">.</w:t>
       </w:r>
     </w:p>
-    <w:bookmarkEnd w:id="166"/>
-    <w:bookmarkStart w:id="167" w:name="def-kfold"/>
+    <w:bookmarkEnd w:id="167"/>
+    <w:bookmarkStart w:id="168" w:name="def-kfold"/>
     <w:p>
       <w:pPr>
         <w:pStyle w:val="BodyText"/>
@@ -43108,8 +43187,8 @@
         <w:t xml:space="preserve">Compute a summary prediction-error measure across all folds.</w:t>
       </w:r>
     </w:p>
-    <w:bookmarkEnd w:id="167"/>
-    <w:bookmarkStart w:id="168" w:name="rem-kfold-vs-validation-set"/>
+    <w:bookmarkEnd w:id="168"/>
+    <w:bookmarkStart w:id="169" w:name="rem-kfold-vs-validation-set"/>
     <w:p>
       <w:pPr>
         <w:pStyle w:val="FirstParagraph"/>
@@ -43211,8 +43290,8 @@
         <w:t xml:space="preserve">give 4 fits on 24 cars each.</w:t>
       </w:r>
     </w:p>
-    <w:bookmarkEnd w:id="168"/>
-    <w:bookmarkStart w:id="170" w:name="def-cv-estimate"/>
+    <w:bookmarkEnd w:id="169"/>
+    <w:bookmarkStart w:id="171" w:name="def-cv-estimate"/>
     <w:p>
       <w:pPr>
         <w:pStyle w:val="BodyText"/>
@@ -43428,7 +43507,7 @@
       <w:pPr>
         <w:pStyle w:val="BodyText"/>
       </w:pPr>
-      <w:bookmarkStart w:id="169" w:name="eq-cv-estimate"/>
+      <w:bookmarkStart w:id="170" w:name="eq-cv-estimate"/>
       <m:oMathPara>
         <m:oMathParaPr>
           <m:jc m:val="center"/>
@@ -43691,10 +43770,10 @@
           </m:r>
         </m:oMath>
       </m:oMathPara>
-      <w:bookmarkEnd w:id="169"/>
+      <w:bookmarkEnd w:id="170"/>
     </w:p>
-    <w:bookmarkEnd w:id="170"/>
-    <w:bookmarkStart w:id="171" w:name="rem-source-cv-estimate"/>
+    <w:bookmarkEnd w:id="171"/>
+    <w:bookmarkStart w:id="172" w:name="rem-source-cv-estimate"/>
     <w:p>
       <w:pPr>
         <w:pStyle w:val="FirstParagraph"/>
@@ -43746,8 +43825,8 @@
         <w:t xml:space="preserve">.</w:t>
       </w:r>
     </w:p>
-    <w:bookmarkEnd w:id="171"/>
-    <w:bookmarkStart w:id="172" w:name="exr-cv-estimate-by-fold"/>
+    <w:bookmarkEnd w:id="172"/>
+    <w:bookmarkStart w:id="173" w:name="exr-cv-estimate-by-fold"/>
     <w:p>
       <w:pPr>
         <w:pStyle w:val="BodyText"/>
@@ -43952,8 +44031,8 @@
         <w:t xml:space="preserve">.</w:t>
       </w:r>
     </w:p>
-    <w:bookmarkEnd w:id="172"/>
-    <w:bookmarkStart w:id="173" w:name="sol-cv-estimate-by-fold"/>
+    <w:bookmarkEnd w:id="173"/>
+    <w:bookmarkStart w:id="174" w:name="sol-cv-estimate-by-fold"/>
     <w:p>
       <w:pPr>
         <w:pStyle w:val="BodyText"/>
@@ -45114,8 +45193,8 @@
         <w:t xml:space="preserve">so each inner sum uses a single fitted rule.</w:t>
       </w:r>
     </w:p>
-    <w:bookmarkEnd w:id="173"/>
-    <w:bookmarkStart w:id="175" w:name="thm-cv-estimate-by-fold"/>
+    <w:bookmarkEnd w:id="174"/>
+    <w:bookmarkStart w:id="176" w:name="thm-cv-estimate-by-fold"/>
     <w:p>
       <w:pPr>
         <w:pStyle w:val="BodyText"/>
@@ -45204,7 +45283,7 @@
       <w:pPr>
         <w:pStyle w:val="BodyText"/>
       </w:pPr>
-      <w:bookmarkStart w:id="174" w:name="eq-cv-estimate-by-fold"/>
+      <w:bookmarkStart w:id="175" w:name="eq-cv-estimate-by-fold"/>
       <m:oMathPara>
         <m:oMathParaPr>
           <m:jc m:val="center"/>
@@ -45477,9 +45556,9 @@
           </m:r>
         </m:oMath>
       </m:oMathPara>
-      <w:bookmarkEnd w:id="174"/>
+      <w:bookmarkEnd w:id="175"/>
     </w:p>
-    <w:bookmarkEnd w:id="175"/>
+    <w:bookmarkEnd w:id="176"/>
     <w:p>
       <w:pPr>
         <w:pStyle w:val="FirstParagraph"/>
@@ -45512,7 +45591,7 @@
         <w:t xml:space="preserve">.</w:t>
       </w:r>
     </w:p>
-    <w:bookmarkStart w:id="177" w:name="def-fold-mse"/>
+    <w:bookmarkStart w:id="178" w:name="def-fold-mse"/>
     <w:p>
       <w:pPr>
         <w:pStyle w:val="BodyText"/>
@@ -45680,7 +45759,7 @@
       <w:pPr>
         <w:pStyle w:val="BodyText"/>
       </w:pPr>
-      <w:bookmarkStart w:id="176" w:name="eq-fold-mse"/>
+      <w:bookmarkStart w:id="177" w:name="eq-fold-mse"/>
       <m:oMathPara>
         <m:oMathParaPr>
           <m:jc m:val="center"/>
@@ -45920,10 +45999,10 @@
           </m:r>
         </m:oMath>
       </m:oMathPara>
-      <w:bookmarkEnd w:id="176"/>
+      <w:bookmarkEnd w:id="177"/>
     </w:p>
-    <w:bookmarkEnd w:id="177"/>
-    <w:bookmarkStart w:id="178" w:name="rem-source-fold-mse"/>
+    <w:bookmarkEnd w:id="178"/>
+    <w:bookmarkStart w:id="179" w:name="rem-source-fold-mse"/>
     <w:p>
       <w:pPr>
         <w:pStyle w:val="FirstParagraph"/>
@@ -46003,8 +46082,8 @@
         <w:t xml:space="preserve">.</w:t>
       </w:r>
     </w:p>
-    <w:bookmarkEnd w:id="178"/>
-    <w:bookmarkStart w:id="179" w:name="rem-cv-estimate"/>
+    <w:bookmarkEnd w:id="179"/>
+    <w:bookmarkStart w:id="180" w:name="rem-cv-estimate"/>
     <w:p>
       <w:pPr>
         <w:pStyle w:val="BodyText"/>
@@ -46683,8 +46762,8 @@
         <w:t xml:space="preserve">use.</w:t>
       </w:r>
     </w:p>
-    <w:bookmarkEnd w:id="179"/>
-    <w:bookmarkStart w:id="180" w:name="rem-choosing-k"/>
+    <w:bookmarkEnd w:id="180"/>
+    <w:bookmarkStart w:id="181" w:name="rem-choosing-k"/>
     <w:p>
       <w:pPr>
         <w:pStyle w:val="BodyText"/>
@@ -47091,8 +47170,8 @@
         <w:t xml:space="preserve">is the usual compromise.</w:t>
       </w:r>
     </w:p>
-    <w:bookmarkEnd w:id="180"/>
-    <w:bookmarkStart w:id="185" w:name="exm-kfold-simulated"/>
+    <w:bookmarkEnd w:id="181"/>
+    <w:bookmarkStart w:id="186" w:name="exm-kfold-simulated"/>
     <w:p>
       <w:pPr>
         <w:pStyle w:val="BodyText"/>
@@ -48324,7 +48403,7 @@
       <w:tr>
         <w:tc>
           <w:tcPr/>
-          <w:bookmarkStart w:id="184" w:name="fig-cv-simulated"/>
+          <w:bookmarkStart w:id="185" w:name="fig-cv-simulated"/>
           <w:p>
             <w:pPr>
               <w:pStyle w:val="SourceCode"/>
@@ -49270,18 +49349,18 @@
                 <wp:inline>
                   <wp:extent cx="4620126" cy="3696101"/>
                   <wp:effectExtent b="0" l="0" r="0" t="0"/>
-                  <wp:docPr descr="" title="" id="182" name="Picture"/>
+                  <wp:docPr descr="" title="" id="183" name="Picture"/>
                   <a:graphic>
                     <a:graphicData uri="http://schemas.openxmlformats.org/drawingml/2006/picture">
                       <pic:pic>
                         <pic:nvPicPr>
-                          <pic:cNvPr descr="model-validation_files/figure-docx/cv-simulated-plot-1.png" id="183" name="Picture"/>
+                          <pic:cNvPr descr="model-validation_files/figure-docx/cv-simulated-plot-1.png" id="184" name="Picture"/>
                           <pic:cNvPicPr>
                             <a:picLocks noChangeArrowheads="1" noChangeAspect="1"/>
                           </pic:cNvPicPr>
                         </pic:nvPicPr>
                         <pic:blipFill>
-                          <a:blip r:embed="rId181"/>
+                          <a:blip r:embed="rId182"/>
                           <a:stretch>
                             <a:fillRect/>
                           </a:stretch>
@@ -49350,7 +49429,7 @@
               <w:t xml:space="preserve">could be computed from real data.</w:t>
             </w:r>
           </w:p>
-          <w:bookmarkEnd w:id="184"/>
+          <w:bookmarkEnd w:id="185"/>
         </w:tc>
       </w:tr>
     </w:tbl>
@@ -51251,8 +51330,8 @@
         <w:t xml:space="preserve">new ones.</w:t>
       </w:r>
     </w:p>
-    <w:bookmarkEnd w:id="185"/>
-    <w:bookmarkStart w:id="188" w:name="exm-kfold-mtcars"/>
+    <w:bookmarkEnd w:id="186"/>
+    <w:bookmarkStart w:id="189" w:name="exm-kfold-mtcars"/>
     <w:p>
       <w:pPr>
         <w:pStyle w:val="BodyText"/>
@@ -51455,7 +51534,7 @@
       <w:tr>
         <w:tc>
           <w:tcPr/>
-          <w:bookmarkStart w:id="186" w:name="tbl-cv-mtcars-repeats"/>
+          <w:bookmarkStart w:id="187" w:name="tbl-cv-mtcars-repeats"/>
           <w:p>
             <w:pPr>
               <w:jc w:val="center"/>
@@ -52111,7 +52190,7 @@
               <w:t xml:space="preserve">#&gt; 5         5     3.38     2.74     2.78     2.81</w:t>
             </w:r>
           </w:p>
-          <w:bookmarkEnd w:id="186"/>
+          <w:bookmarkEnd w:id="187"/>
         </w:tc>
       </w:tr>
     </w:tbl>
@@ -52136,7 +52215,7 @@
       <w:tr>
         <w:tc>
           <w:tcPr/>
-          <w:bookmarkStart w:id="187" w:name="tbl-cv-mtcars"/>
+          <w:bookmarkStart w:id="188" w:name="tbl-cv-mtcars"/>
           <w:p>
             <w:pPr>
               <w:jc w:val="center"/>
@@ -52492,7 +52571,7 @@
               <w:t xml:space="preserve">#&gt; 5         5 2       2.74</w:t>
             </w:r>
           </w:p>
-          <w:bookmarkEnd w:id="187"/>
+          <w:bookmarkEnd w:id="188"/>
         </w:tc>
       </w:tr>
     </w:tbl>
@@ -53182,9 +53261,9 @@
         <w:t xml:space="preserve">may not survive a different split.</w:t>
       </w:r>
     </w:p>
-    <w:bookmarkEnd w:id="188"/>
     <w:bookmarkEnd w:id="189"/>
-    <w:bookmarkStart w:id="216" w:name="sec-loocv"/>
+    <w:bookmarkEnd w:id="190"/>
+    <w:bookmarkStart w:id="217" w:name="sec-loocv"/>
     <w:p>
       <w:pPr>
         <w:pStyle w:val="Heading2"/>
@@ -53193,7 +53272,7 @@
         <w:t xml:space="preserve">7 Leave-one-out cross-validation</w:t>
       </w:r>
     </w:p>
-    <w:bookmarkStart w:id="190" w:name="exr-loocv"/>
+    <w:bookmarkStart w:id="191" w:name="exr-loocv"/>
     <w:p>
       <w:pPr>
         <w:pStyle w:val="FirstParagraph"/>
@@ -53403,8 +53482,8 @@
         <w:t xml:space="preserve">) differ?</w:t>
       </w:r>
     </w:p>
-    <w:bookmarkEnd w:id="190"/>
-    <w:bookmarkStart w:id="191" w:name="sol-loocv"/>
+    <w:bookmarkEnd w:id="191"/>
+    <w:bookmarkStart w:id="192" w:name="sol-loocv"/>
     <w:p>
       <w:pPr>
         <w:pStyle w:val="FirstParagraph"/>
@@ -53601,8 +53680,8 @@
         <w:t xml:space="preserve">the estimate is not random.</w:t>
       </w:r>
     </w:p>
-    <w:bookmarkEnd w:id="191"/>
-    <w:bookmarkStart w:id="193" w:name="def-loocv"/>
+    <w:bookmarkEnd w:id="192"/>
+    <w:bookmarkStart w:id="194" w:name="def-loocv"/>
     <w:p>
       <w:pPr>
         <w:pStyle w:val="FirstParagraph"/>
@@ -53910,7 +53989,7 @@
       <w:pPr>
         <w:pStyle w:val="BodyText"/>
       </w:pPr>
-      <w:bookmarkStart w:id="192" w:name="eq-loocv"/>
+      <w:bookmarkStart w:id="193" w:name="eq-loocv"/>
       <m:oMathPara>
         <m:oMathParaPr>
           <m:jc m:val="center"/>
@@ -54160,7 +54239,7 @@
           </m:r>
         </m:oMath>
       </m:oMathPara>
-      <w:bookmarkEnd w:id="192"/>
+      <w:bookmarkEnd w:id="193"/>
     </w:p>
     <w:p>
       <w:pPr>
@@ -54179,8 +54258,8 @@
         <w:t xml:space="preserve">.</w:t>
       </w:r>
     </w:p>
-    <w:bookmarkEnd w:id="193"/>
-    <w:bookmarkStart w:id="194" w:name="lem-loocv-not-random"/>
+    <w:bookmarkEnd w:id="194"/>
+    <w:bookmarkStart w:id="195" w:name="lem-loocv-not-random"/>
     <w:p>
       <w:pPr>
         <w:pStyle w:val="BodyText"/>
@@ -54529,7 +54608,7 @@
         <w:t xml:space="preserve">.</w:t>
       </w:r>
     </w:p>
-    <w:bookmarkEnd w:id="194"/>
+    <w:bookmarkEnd w:id="195"/>
     <w:p>
       <w:pPr>
         <w:pStyle w:val="BodyText"/>
@@ -56055,7 +56134,7 @@
         <w:t xml:space="preserve">fits, with the folds numbered differently.</w:t>
       </w:r>
     </w:p>
-    <w:bookmarkStart w:id="196" w:name="def-term-vector"/>
+    <w:bookmarkStart w:id="197" w:name="def-term-vector"/>
     <w:p>
       <w:pPr>
         <w:pStyle w:val="FirstParagraph"/>
@@ -56321,7 +56400,7 @@
       <w:pPr>
         <w:pStyle w:val="BodyText"/>
       </w:pPr>
-      <w:bookmarkStart w:id="195" w:name="eq-term-vector"/>
+      <w:bookmarkStart w:id="196" w:name="eq-term-vector"/>
       <m:oMathPara>
         <m:oMathParaPr>
           <m:jc m:val="center"/>
@@ -56526,10 +56605,10 @@
           </m:r>
         </m:oMath>
       </m:oMathPara>
-      <w:bookmarkEnd w:id="195"/>
+      <w:bookmarkEnd w:id="196"/>
     </w:p>
-    <w:bookmarkEnd w:id="196"/>
-    <w:bookmarkStart w:id="198" w:name="rem-term-vector"/>
+    <w:bookmarkEnd w:id="197"/>
+    <w:bookmarkStart w:id="199" w:name="rem-term-vector"/>
     <w:p>
       <w:pPr>
         <w:pStyle w:val="FirstParagraph"/>
@@ -56627,7 +56706,7 @@
       <w:r>
         <w:t xml:space="preserve"> </w:t>
       </w:r>
-      <w:hyperlink r:id="rId197">
+      <w:hyperlink r:id="rId198">
         <w:r>
           <w:rPr>
             <w:rStyle w:val="Hyperlink"/>
@@ -56668,8 +56747,8 @@
         <w:t xml:space="preserve">.</w:t>
       </w:r>
     </w:p>
-    <w:bookmarkEnd w:id="198"/>
-    <w:bookmarkStart w:id="200" w:name="def-cross-product-matrix"/>
+    <w:bookmarkEnd w:id="199"/>
+    <w:bookmarkStart w:id="201" w:name="def-cross-product-matrix"/>
     <w:p>
       <w:pPr>
         <w:pStyle w:val="BodyText"/>
@@ -56796,7 +56875,7 @@
       <w:pPr>
         <w:pStyle w:val="BodyText"/>
       </w:pPr>
-      <w:bookmarkStart w:id="199" w:name="eq-cross-product-matrix"/>
+      <w:bookmarkStart w:id="200" w:name="eq-cross-product-matrix"/>
       <m:oMathPara>
         <m:oMathParaPr>
           <m:jc m:val="center"/>
@@ -56939,10 +57018,10 @@
           </m:r>
         </m:oMath>
       </m:oMathPara>
-      <w:bookmarkEnd w:id="199"/>
+      <w:bookmarkEnd w:id="200"/>
     </w:p>
-    <w:bookmarkEnd w:id="200"/>
-    <w:bookmarkStart w:id="202" w:name="rem-source-cross-product-matrix"/>
+    <w:bookmarkEnd w:id="201"/>
+    <w:bookmarkStart w:id="203" w:name="rem-source-cross-product-matrix"/>
     <w:p>
       <w:pPr>
         <w:pStyle w:val="FirstParagraph"/>
@@ -56991,7 +57070,7 @@
       <w:r>
         <w:t xml:space="preserve"> </w:t>
       </w:r>
-      <w:hyperlink r:id="rId201">
+      <w:hyperlink r:id="rId202">
         <w:r>
           <w:rPr>
             <w:rStyle w:val="Hyperlink"/>
@@ -57003,8 +57082,8 @@
         <w:t xml:space="preserve">).</w:t>
       </w:r>
     </w:p>
-    <w:bookmarkEnd w:id="202"/>
-    <w:bookmarkStart w:id="205" w:name="rem-cross-product-matrix"/>
+    <w:bookmarkEnd w:id="203"/>
+    <w:bookmarkStart w:id="206" w:name="rem-cross-product-matrix"/>
     <w:p>
       <w:pPr>
         <w:pStyle w:val="BodyText"/>
@@ -57318,18 +57397,18 @@
                 <wp:inline>
                   <wp:extent cx="152400" cy="152400"/>
                   <wp:effectExtent b="0" l="0" r="0" t="0"/>
-                  <wp:docPr descr="" title="" id="203" name="Picture"/>
+                  <wp:docPr descr="" title="" id="204" name="Picture"/>
                   <a:graphic>
                     <a:graphicData uri="http://schemas.openxmlformats.org/drawingml/2006/picture">
                       <pic:pic>
                         <pic:nvPicPr>
-                          <pic:cNvPr descr="/opt/quarto/share/formats/docx/note.png" id="204" name="Picture"/>
+                          <pic:cNvPr descr="/opt/quarto/share/formats/docx/note.png" id="205" name="Picture"/>
                           <pic:cNvPicPr>
                             <a:picLocks noChangeArrowheads="1" noChangeAspect="1"/>
                           </pic:cNvPicPr>
                         </pic:nvPicPr>
                         <pic:blipFill>
-                          <a:blip r:embed="rId149"/>
+                          <a:blip r:embed="rId150"/>
                           <a:stretch>
                             <a:fillRect/>
                           </a:stretch>
@@ -57409,7 +57488,7 @@
             <w:r>
               <w:t xml:space="preserve"> </w:t>
             </w:r>
-            <w:hyperlink r:id="rId201">
+            <w:hyperlink r:id="rId202">
               <w:r>
                 <w:rPr>
                   <w:rStyle w:val="Hyperlink"/>
@@ -57437,8 +57516,8 @@
         </w:tc>
       </w:tr>
     </w:tbl>
-    <w:bookmarkEnd w:id="205"/>
-    <w:bookmarkStart w:id="208" w:name="def-leverage"/>
+    <w:bookmarkEnd w:id="206"/>
+    <w:bookmarkStart w:id="209" w:name="def-leverage"/>
     <w:p>
       <w:pPr>
         <w:pStyle w:val="BodyText"/>
@@ -57459,7 +57538,7 @@
       <w:r>
         <w:t xml:space="preserve"> </w:t>
       </w:r>
-      <w:hyperlink r:id="rId206">
+      <w:hyperlink r:id="rId207">
         <w:r>
           <w:rPr>
             <w:rStyle w:val="Hyperlink"/>
@@ -57608,7 +57687,7 @@
       <w:pPr>
         <w:pStyle w:val="BodyText"/>
       </w:pPr>
-      <w:bookmarkStart w:id="207" w:name="eq-leverage"/>
+      <w:bookmarkStart w:id="208" w:name="eq-leverage"/>
       <m:oMathPara>
         <m:oMathParaPr>
           <m:jc m:val="center"/>
@@ -57749,10 +57828,10 @@
           </m:r>
         </m:oMath>
       </m:oMathPara>
-      <w:bookmarkEnd w:id="207"/>
+      <w:bookmarkEnd w:id="208"/>
     </w:p>
-    <w:bookmarkEnd w:id="208"/>
-    <w:bookmarkStart w:id="210" w:name="rem-source-leverage"/>
+    <w:bookmarkEnd w:id="209"/>
+    <w:bookmarkStart w:id="211" w:name="rem-source-leverage"/>
     <w:p>
       <w:pPr>
         <w:pStyle w:val="FirstParagraph"/>
@@ -57799,7 +57878,7 @@
       <w:r>
         <w:t xml:space="preserve"> </w:t>
       </w:r>
-      <w:hyperlink r:id="rId209">
+      <w:hyperlink r:id="rId210">
         <w:r>
           <w:rPr>
             <w:rStyle w:val="Hyperlink"/>
@@ -57811,8 +57890,8 @@
         <w:t xml:space="preserve">.</w:t>
       </w:r>
     </w:p>
-    <w:bookmarkEnd w:id="210"/>
-    <w:bookmarkStart w:id="212" w:name="thm-loocv-shortcut"/>
+    <w:bookmarkEnd w:id="211"/>
+    <w:bookmarkStart w:id="213" w:name="thm-loocv-shortcut"/>
     <w:p>
       <w:pPr>
         <w:pStyle w:val="BodyText"/>
@@ -57833,7 +57912,7 @@
       <w:r>
         <w:t xml:space="preserve"> </w:t>
       </w:r>
-      <w:hyperlink r:id="rId206">
+      <w:hyperlink r:id="rId207">
         <w:r>
           <w:rPr>
             <w:rStyle w:val="Hyperlink"/>
@@ -58059,7 +58138,7 @@
       <w:pPr>
         <w:pStyle w:val="BodyText"/>
       </w:pPr>
-      <w:bookmarkStart w:id="211" w:name="eq-loocv-shortcut"/>
+      <w:bookmarkStart w:id="212" w:name="eq-loocv-shortcut"/>
       <m:oMathPara>
         <m:oMathParaPr>
           <m:jc m:val="center"/>
@@ -58249,9 +58328,9 @@
           </m:r>
         </m:oMath>
       </m:oMathPara>
-      <w:bookmarkEnd w:id="211"/>
+      <w:bookmarkEnd w:id="212"/>
     </w:p>
-    <w:bookmarkEnd w:id="212"/>
+    <w:bookmarkEnd w:id="213"/>
     <w:p>
       <w:pPr>
         <w:pStyle w:val="FirstParagraph"/>
@@ -58390,7 +58469,7 @@
         <w:t xml:space="preserve">which this page does not develop.</w:t>
       </w:r>
     </w:p>
-    <w:bookmarkStart w:id="213" w:name="rem-source-loocv-shortcut"/>
+    <w:bookmarkStart w:id="214" w:name="rem-source-loocv-shortcut"/>
     <w:p>
       <w:pPr>
         <w:pStyle w:val="BodyText"/>
@@ -58433,8 +58512,8 @@
         <w:t xml:space="preserve">for many linear fitting methods.</w:t>
       </w:r>
     </w:p>
-    <w:bookmarkEnd w:id="213"/>
-    <w:bookmarkStart w:id="214" w:name="exm-loocv-shortcut"/>
+    <w:bookmarkEnd w:id="214"/>
+    <w:bookmarkStart w:id="215" w:name="exm-loocv-shortcut"/>
     <w:p>
       <w:pPr>
         <w:pStyle w:val="BodyText"/>
@@ -59574,8 +59653,8 @@
         <w:t xml:space="preserve">rerunning it always gives the same choice.</w:t>
       </w:r>
     </w:p>
-    <w:bookmarkEnd w:id="214"/>
-    <w:bookmarkStart w:id="215" w:name="rem-loocv"/>
+    <w:bookmarkEnd w:id="215"/>
+    <w:bookmarkStart w:id="216" w:name="rem-loocv"/>
     <w:p>
       <w:pPr>
         <w:pStyle w:val="BodyText"/>
@@ -60047,9 +60126,9 @@
         <w:t xml:space="preserve">fits.</w:t>
       </w:r>
     </w:p>
-    <w:bookmarkEnd w:id="215"/>
     <w:bookmarkEnd w:id="216"/>
-    <w:bookmarkStart w:id="245" w:name="sec-cv-model-choice"/>
+    <w:bookmarkEnd w:id="217"/>
+    <w:bookmarkStart w:id="246" w:name="sec-cv-model-choice"/>
     <w:p>
       <w:pPr>
         <w:pStyle w:val="Heading2"/>
@@ -60058,7 +60137,7 @@
         <w:t xml:space="preserve">8 Choosing a model by cross-validation</w:t>
       </w:r>
     </w:p>
-    <w:bookmarkStart w:id="218" w:name="def-cv-estimate-indexed"/>
+    <w:bookmarkStart w:id="219" w:name="def-cv-estimate-indexed"/>
     <w:p>
       <w:pPr>
         <w:pStyle w:val="FirstParagraph"/>
@@ -60436,7 +60515,7 @@
       <w:pPr>
         <w:pStyle w:val="BodyText"/>
       </w:pPr>
-      <w:bookmarkStart w:id="217" w:name="eq-cv-estimate-indexed"/>
+      <w:bookmarkStart w:id="218" w:name="eq-cv-estimate-indexed"/>
       <m:oMathPara>
         <m:oMathParaPr>
           <m:jc m:val="center"/>
@@ -60846,10 +60925,10 @@
           </m:r>
         </m:oMath>
       </m:oMathPara>
-      <w:bookmarkEnd w:id="217"/>
+      <w:bookmarkEnd w:id="218"/>
     </w:p>
-    <w:bookmarkEnd w:id="218"/>
-    <w:bookmarkStart w:id="220" w:name="def-cv-choice"/>
+    <w:bookmarkEnd w:id="219"/>
+    <w:bookmarkStart w:id="221" w:name="def-cv-choice"/>
     <w:p>
       <w:pPr>
         <w:pStyle w:val="FirstParagraph"/>
@@ -61191,7 +61270,7 @@
       <w:pPr>
         <w:pStyle w:val="BodyText"/>
       </w:pPr>
-      <w:bookmarkStart w:id="219" w:name="eq-cv-choice"/>
+      <w:bookmarkStart w:id="220" w:name="eq-cv-choice"/>
       <m:oMathPara>
         <m:oMathParaPr>
           <m:jc m:val="center"/>
@@ -61475,10 +61554,10 @@
           </m:r>
         </m:oMath>
       </m:oMathPara>
-      <w:bookmarkEnd w:id="219"/>
+      <w:bookmarkEnd w:id="220"/>
     </w:p>
-    <w:bookmarkEnd w:id="220"/>
-    <w:bookmarkStart w:id="222" w:name="def-nested-cv"/>
+    <w:bookmarkEnd w:id="221"/>
+    <w:bookmarkStart w:id="223" w:name="def-nested-cv"/>
     <w:p>
       <w:pPr>
         <w:pStyle w:val="FirstParagraph"/>
@@ -61605,7 +61684,7 @@
       <w:pPr>
         <w:pStyle w:val="BodyText"/>
       </w:pPr>
-      <w:bookmarkStart w:id="221" w:name="eq-nested-cv"/>
+      <w:bookmarkStart w:id="222" w:name="eq-nested-cv"/>
       <m:oMathPara>
         <m:oMathParaPr>
           <m:jc m:val="center"/>
@@ -61732,10 +61811,10 @@
           </m:r>
         </m:oMath>
       </m:oMathPara>
-      <w:bookmarkEnd w:id="221"/>
+      <w:bookmarkEnd w:id="222"/>
     </w:p>
-    <w:bookmarkEnd w:id="222"/>
-    <w:bookmarkStart w:id="223" w:name="rem-source-nested-cv"/>
+    <w:bookmarkEnd w:id="223"/>
+    <w:bookmarkStart w:id="224" w:name="rem-source-nested-cv"/>
     <w:p>
       <w:pPr>
         <w:pStyle w:val="FirstParagraph"/>
@@ -61766,8 +61845,8 @@
         <w:t xml:space="preserve">choices included.</w:t>
       </w:r>
     </w:p>
-    <w:bookmarkEnd w:id="223"/>
-    <w:bookmarkStart w:id="224" w:name="rem-nested-cv"/>
+    <w:bookmarkEnd w:id="224"/>
+    <w:bookmarkStart w:id="225" w:name="rem-nested-cv"/>
     <w:p>
       <w:pPr>
         <w:pStyle w:val="BodyText"/>
@@ -61923,8 +62002,8 @@
         <w:t xml:space="preserve">That inner cross-validation is the nested one.</w:t>
       </w:r>
     </w:p>
-    <w:bookmarkEnd w:id="224"/>
-    <w:bookmarkStart w:id="227" w:name="rem-cv-winner-optimistic"/>
+    <w:bookmarkEnd w:id="225"/>
+    <w:bookmarkStart w:id="228" w:name="rem-cv-winner-optimistic"/>
     <w:p>
       <w:pPr>
         <w:pStyle w:val="BodyText"/>
@@ -62117,18 +62196,18 @@
                 <wp:inline>
                   <wp:extent cx="152400" cy="152400"/>
                   <wp:effectExtent b="0" l="0" r="0" t="0"/>
-                  <wp:docPr descr="" title="" id="225" name="Picture"/>
+                  <wp:docPr descr="" title="" id="226" name="Picture"/>
                   <a:graphic>
                     <a:graphicData uri="http://schemas.openxmlformats.org/drawingml/2006/picture">
                       <pic:pic>
                         <pic:nvPicPr>
-                          <pic:cNvPr descr="/opt/quarto/share/formats/docx/note.png" id="226" name="Picture"/>
+                          <pic:cNvPr descr="/opt/quarto/share/formats/docx/note.png" id="227" name="Picture"/>
                           <pic:cNvPicPr>
                             <a:picLocks noChangeArrowheads="1" noChangeAspect="1"/>
                           </pic:cNvPicPr>
                         </pic:nvPicPr>
                         <pic:blipFill>
-                          <a:blip r:embed="rId149"/>
+                          <a:blip r:embed="rId150"/>
                           <a:stretch>
                             <a:fillRect/>
                           </a:stretch>
@@ -62192,8 +62271,8 @@
         </w:tc>
       </w:tr>
     </w:tbl>
-    <w:bookmarkEnd w:id="227"/>
-    <w:bookmarkStart w:id="230" w:name="def-cv-se"/>
+    <w:bookmarkEnd w:id="228"/>
+    <w:bookmarkStart w:id="231" w:name="def-cv-se"/>
     <w:p>
       <w:pPr>
         <w:pStyle w:val="BodyText"/>
@@ -62297,7 +62376,7 @@
       <w:r>
         <w:t xml:space="preserve"> </w:t>
       </w:r>
-      <w:hyperlink r:id="rId228">
+      <w:hyperlink r:id="rId229">
         <w:r>
           <w:rPr>
             <w:rStyle w:val="Hyperlink"/>
@@ -62363,7 +62442,7 @@
       <w:pPr>
         <w:pStyle w:val="BodyText"/>
       </w:pPr>
-      <w:bookmarkStart w:id="229" w:name="eq-cv-se"/>
+      <w:bookmarkStart w:id="230" w:name="eq-cv-se"/>
       <m:oMathPara>
         <m:oMathParaPr>
           <m:jc m:val="center"/>
@@ -62538,10 +62617,10 @@
           </m:r>
         </m:oMath>
       </m:oMathPara>
-      <w:bookmarkEnd w:id="229"/>
+      <w:bookmarkEnd w:id="230"/>
     </w:p>
-    <w:bookmarkEnd w:id="230"/>
-    <w:bookmarkStart w:id="231" w:name="rem-source-cv-se"/>
+    <w:bookmarkEnd w:id="231"/>
+    <w:bookmarkStart w:id="232" w:name="rem-source-cv-se"/>
     <w:p>
       <w:pPr>
         <w:pStyle w:val="FirstParagraph"/>
@@ -62563,8 +62642,8 @@
         <w:t xml:space="preserve">, who call the result a standard error.</w:t>
       </w:r>
     </w:p>
-    <w:bookmarkEnd w:id="231"/>
-    <w:bookmarkStart w:id="233" w:name="rem-cv-se"/>
+    <w:bookmarkEnd w:id="232"/>
+    <w:bookmarkStart w:id="234" w:name="rem-cv-se"/>
     <w:p>
       <w:pPr>
         <w:pStyle w:val="BodyText"/>
@@ -62787,7 +62866,7 @@
       <w:r>
         <w:t xml:space="preserve"> </w:t>
       </w:r>
-      <w:hyperlink r:id="rId232">
+      <w:hyperlink r:id="rId233">
         <w:r>
           <w:rPr>
             <w:rStyle w:val="Hyperlink"/>
@@ -62851,8 +62930,8 @@
         <w:t xml:space="preserve">.</w:t>
       </w:r>
     </w:p>
-    <w:bookmarkEnd w:id="233"/>
-    <w:bookmarkStart w:id="235" w:name="def-fold-mse-indexed"/>
+    <w:bookmarkEnd w:id="234"/>
+    <w:bookmarkStart w:id="236" w:name="def-fold-mse-indexed"/>
     <w:p>
       <w:pPr>
         <w:pStyle w:val="BodyText"/>
@@ -63030,7 +63109,7 @@
       <w:pPr>
         <w:pStyle w:val="BodyText"/>
       </w:pPr>
-      <w:bookmarkStart w:id="234" w:name="eq-fold-mse-indexed"/>
+      <w:bookmarkStart w:id="235" w:name="eq-fold-mse-indexed"/>
       <m:oMathPara>
         <m:oMathParaPr>
           <m:jc m:val="center"/>
@@ -63417,10 +63496,10 @@
           </m:r>
         </m:oMath>
       </m:oMathPara>
-      <w:bookmarkEnd w:id="234"/>
+      <w:bookmarkEnd w:id="235"/>
     </w:p>
-    <w:bookmarkEnd w:id="235"/>
-    <w:bookmarkStart w:id="237" w:name="def-cv-se-indexed"/>
+    <w:bookmarkEnd w:id="236"/>
+    <w:bookmarkStart w:id="238" w:name="def-cv-se-indexed"/>
     <w:p>
       <w:pPr>
         <w:pStyle w:val="FirstParagraph"/>
@@ -63626,7 +63705,7 @@
       <w:pPr>
         <w:pStyle w:val="BodyText"/>
       </w:pPr>
-      <w:bookmarkStart w:id="236" w:name="eq-cv-se-indexed"/>
+      <w:bookmarkStart w:id="237" w:name="eq-cv-se-indexed"/>
       <m:oMathPara>
         <m:oMathParaPr>
           <m:jc m:val="center"/>
@@ -63924,10 +64003,10 @@
           </m:r>
         </m:oMath>
       </m:oMathPara>
-      <w:bookmarkEnd w:id="236"/>
+      <w:bookmarkEnd w:id="237"/>
     </w:p>
-    <w:bookmarkEnd w:id="237"/>
-    <w:bookmarkStart w:id="239" w:name="def-one-se-rule"/>
+    <w:bookmarkEnd w:id="238"/>
+    <w:bookmarkStart w:id="240" w:name="def-one-se-rule"/>
     <w:p>
       <w:pPr>
         <w:pStyle w:val="FirstParagraph"/>
@@ -64185,7 +64264,7 @@
       <w:pPr>
         <w:pStyle w:val="BodyText"/>
       </w:pPr>
-      <w:bookmarkStart w:id="238" w:name="eq-one-se-rule"/>
+      <w:bookmarkStart w:id="239" w:name="eq-one-se-rule"/>
       <m:oMathPara>
         <m:oMathParaPr>
           <m:jc m:val="center"/>
@@ -64519,7 +64598,7 @@
           </m:r>
         </m:oMath>
       </m:oMathPara>
-      <w:bookmarkEnd w:id="238"/>
+      <w:bookmarkEnd w:id="239"/>
     </w:p>
     <w:p>
       <w:pPr>
@@ -64538,8 +64617,8 @@
         <w:t xml:space="preserve">.</w:t>
       </w:r>
     </w:p>
-    <w:bookmarkEnd w:id="239"/>
-    <w:bookmarkStart w:id="244" w:name="exm-one-se-rule"/>
+    <w:bookmarkEnd w:id="240"/>
+    <w:bookmarkStart w:id="245" w:name="exm-one-se-rule"/>
     <w:p>
       <w:pPr>
         <w:pStyle w:val="BodyText"/>
@@ -65611,7 +65690,7 @@
       <w:tr>
         <w:tc>
           <w:tcPr/>
-          <w:bookmarkStart w:id="243" w:name="fig-one-se-rule"/>
+          <w:bookmarkStart w:id="244" w:name="fig-one-se-rule"/>
           <w:p>
             <w:pPr>
               <w:pStyle w:val="SourceCode"/>
@@ -66224,18 +66303,18 @@
                 <wp:inline>
                   <wp:extent cx="4620126" cy="3696101"/>
                   <wp:effectExtent b="0" l="0" r="0" t="0"/>
-                  <wp:docPr descr="" title="" id="241" name="Picture"/>
+                  <wp:docPr descr="" title="" id="242" name="Picture"/>
                   <a:graphic>
                     <a:graphicData uri="http://schemas.openxmlformats.org/drawingml/2006/picture">
                       <pic:pic>
                         <pic:nvPicPr>
-                          <pic:cNvPr descr="model-validation_files/figure-docx/one-se-rule-plot-1.png" id="242" name="Picture"/>
+                          <pic:cNvPr descr="model-validation_files/figure-docx/one-se-rule-plot-1.png" id="243" name="Picture"/>
                           <pic:cNvPicPr>
                             <a:picLocks noChangeArrowheads="1" noChangeAspect="1"/>
                           </pic:cNvPicPr>
                         </pic:nvPicPr>
                         <pic:blipFill>
-                          <a:blip r:embed="rId240"/>
+                          <a:blip r:embed="rId241"/>
                           <a:stretch>
                             <a:fillRect/>
                           </a:stretch>
@@ -66315,7 +66394,7 @@
               <w:t xml:space="preserve">The dashed line is one fold-based standard error above the smallest estimate.</w:t>
             </w:r>
           </w:p>
-          <w:bookmarkEnd w:id="243"/>
+          <w:bookmarkEnd w:id="244"/>
         </w:tc>
       </w:tr>
     </w:tbl>
@@ -66404,9 +66483,9 @@
         <w:t xml:space="preserve">and 0.315 for degree 3.</w:t>
       </w:r>
     </w:p>
-    <w:bookmarkEnd w:id="244"/>
     <w:bookmarkEnd w:id="245"/>
-    <w:bookmarkStart w:id="252" w:name="sec-cv-whole-procedure"/>
+    <w:bookmarkEnd w:id="246"/>
+    <w:bookmarkStart w:id="253" w:name="sec-cv-whole-procedure"/>
     <w:p>
       <w:pPr>
         <w:pStyle w:val="Heading2"/>
@@ -66415,7 +66494,7 @@
         <w:t xml:space="preserve">9 Cross-validating the whole procedure</w:t>
       </w:r>
     </w:p>
-    <w:bookmarkStart w:id="248" w:name="exr-cv-screening"/>
+    <w:bookmarkStart w:id="249" w:name="exr-cv-screening"/>
     <w:p>
       <w:pPr>
         <w:pStyle w:val="FirstParagraph"/>
@@ -66715,18 +66794,18 @@
                 <wp:inline>
                   <wp:extent cx="152400" cy="152400"/>
                   <wp:effectExtent b="0" l="0" r="0" t="0"/>
-                  <wp:docPr descr="" title="" id="246" name="Picture"/>
+                  <wp:docPr descr="" title="" id="247" name="Picture"/>
                   <a:graphic>
                     <a:graphicData uri="http://schemas.openxmlformats.org/drawingml/2006/picture">
                       <pic:pic>
                         <pic:nvPicPr>
-                          <pic:cNvPr descr="/opt/quarto/share/formats/docx/note.png" id="247" name="Picture"/>
+                          <pic:cNvPr descr="/opt/quarto/share/formats/docx/note.png" id="248" name="Picture"/>
                           <pic:cNvPicPr>
                             <a:picLocks noChangeArrowheads="1" noChangeAspect="1"/>
                           </pic:cNvPicPr>
                         </pic:nvPicPr>
                         <pic:blipFill>
-                          <a:blip r:embed="rId149"/>
+                          <a:blip r:embed="rId150"/>
                           <a:stretch>
                             <a:fillRect/>
                           </a:stretch>
@@ -66808,8 +66887,8 @@
         </w:tc>
       </w:tr>
     </w:tbl>
-    <w:bookmarkEnd w:id="248"/>
-    <w:bookmarkStart w:id="249" w:name="sol-cv-screening"/>
+    <w:bookmarkEnd w:id="249"/>
+    <w:bookmarkStart w:id="250" w:name="sol-cv-screening"/>
     <w:p>
       <w:pPr>
         <w:pStyle w:val="BodyText"/>
@@ -68737,8 +68816,8 @@
         <w:t xml:space="preserve">needs fails.</w:t>
       </w:r>
     </w:p>
-    <w:bookmarkEnd w:id="249"/>
-    <w:bookmarkStart w:id="251" w:name="rem-cv-every-step"/>
+    <w:bookmarkEnd w:id="250"/>
+    <w:bookmarkStart w:id="252" w:name="rem-cv-every-step"/>
     <w:p>
       <w:pPr>
         <w:pStyle w:val="BodyText"/>
@@ -68894,7 +68973,7 @@
       <w:r>
         <w:t xml:space="preserve"> </w:t>
       </w:r>
-      <w:hyperlink r:id="rId250">
+      <w:hyperlink r:id="rId251">
         <w:r>
           <w:rPr>
             <w:rStyle w:val="Hyperlink"/>
@@ -68918,9 +68997,9 @@
         <w:t xml:space="preserve">when they are computed without the outcome.</w:t>
       </w:r>
     </w:p>
-    <w:bookmarkEnd w:id="251"/>
     <w:bookmarkEnd w:id="252"/>
-    <w:bookmarkStart w:id="253" w:name="further-reading"/>
+    <w:bookmarkEnd w:id="253"/>
+    <w:bookmarkStart w:id="254" w:name="further-reading"/>
     <w:p>
       <w:pPr>
         <w:pStyle w:val="Heading2"/>
@@ -68949,8 +69028,8 @@
         <w:t xml:space="preserve">including the covariance and correlation matrices that cross-products produce.</w:t>
       </w:r>
     </w:p>
-    <w:bookmarkEnd w:id="253"/>
-    <w:bookmarkStart w:id="261" w:name="references"/>
+    <w:bookmarkEnd w:id="254"/>
+    <w:bookmarkStart w:id="262" w:name="references"/>
     <w:p>
       <w:pPr>
         <w:pStyle w:val="Heading2"/>
@@ -68959,8 +69038,8 @@
         <w:t xml:space="preserve">References</w:t>
       </w:r>
     </w:p>
-    <w:bookmarkStart w:id="260" w:name="refs"/>
-    <w:bookmarkStart w:id="255" w:name="ref-hastie2009elements"/>
+    <w:bookmarkStart w:id="261" w:name="refs"/>
+    <w:bookmarkStart w:id="256" w:name="ref-hastie2009elements"/>
     <w:p>
       <w:pPr>
         <w:pStyle w:val="Bibliography"/>
@@ -68984,7 +69063,7 @@
       <w:r>
         <w:t xml:space="preserve"> </w:t>
       </w:r>
-      <w:hyperlink r:id="rId254">
+      <w:hyperlink r:id="rId255">
         <w:r>
           <w:rPr>
             <w:rStyle w:val="Hyperlink"/>
@@ -68996,8 +69075,8 @@
         <w:t xml:space="preserve">.</w:t>
       </w:r>
     </w:p>
-    <w:bookmarkEnd w:id="255"/>
-    <w:bookmarkStart w:id="257" w:name="ref-james2021islr2e"/>
+    <w:bookmarkEnd w:id="256"/>
+    <w:bookmarkStart w:id="258" w:name="ref-james2021islr2e"/>
     <w:p>
       <w:pPr>
         <w:pStyle w:val="Bibliography"/>
@@ -69035,7 +69114,7 @@
       <w:r>
         <w:t xml:space="preserve"> </w:t>
       </w:r>
-      <w:hyperlink r:id="rId256">
+      <w:hyperlink r:id="rId257">
         <w:r>
           <w:rPr>
             <w:rStyle w:val="Hyperlink"/>
@@ -69047,8 +69126,8 @@
         <w:t xml:space="preserve">.</w:t>
       </w:r>
     </w:p>
-    <w:bookmarkEnd w:id="257"/>
-    <w:bookmarkStart w:id="259" w:name="ref-sanchez2020matrix4sl"/>
+    <w:bookmarkEnd w:id="258"/>
+    <w:bookmarkStart w:id="260" w:name="ref-sanchez2020matrix4sl"/>
     <w:p>
       <w:pPr>
         <w:pStyle w:val="Bibliography"/>
@@ -69086,7 +69165,7 @@
       <w:r>
         <w:t xml:space="preserve"> </w:t>
       </w:r>
-      <w:hyperlink r:id="rId258">
+      <w:hyperlink r:id="rId259">
         <w:r>
           <w:rPr>
             <w:rStyle w:val="Hyperlink"/>
@@ -69098,9 +69177,9 @@
         <w:t xml:space="preserve">.</w:t>
       </w:r>
     </w:p>
-    <w:bookmarkEnd w:id="259"/>
     <w:bookmarkEnd w:id="260"/>
     <w:bookmarkEnd w:id="261"/>
+    <w:bookmarkEnd w:id="262"/>
     <w:sectPr>
       <w:footnotePr>
         <w:numRestart w:val="eachSect"/>

</xml_diff>

<commit_message>
Deploying to gh-pages from @ Morrison-Lab/sds@4d9a488ed82ec8168c8ade12017aaa6392d2467a 🚀
</commit_message>
<xml_diff>
--- a/model-validation-handout.docx
+++ b/model-validation-handout.docx
@@ -15,7 +15,7 @@
         <w:pStyle w:val="Date"/>
       </w:pPr>
       <w:r>
-        <w:t xml:space="preserve">Last modified: 2026-10-16 04:40:51 (PDT)</w:t>
+        <w:t xml:space="preserve">Last modified: 2026-10-16 04:59:09 (PDT)</w:t>
       </w:r>
     </w:p>
     <w:bookmarkStart w:id="17" w:name="sec-data-sets"/>
@@ -1576,7 +1576,7 @@
     </w:p>
     <w:bookmarkEnd w:id="16"/>
     <w:bookmarkEnd w:id="17"/>
-    <w:bookmarkStart w:id="47" w:name="sec-prediction-rules"/>
+    <w:bookmarkStart w:id="49" w:name="sec-prediction-rules"/>
     <w:p>
       <w:pPr>
         <w:pStyle w:val="Heading2"/>
@@ -2763,7 +2763,7 @@
       <w:bookmarkEnd w:id="25"/>
     </w:p>
     <w:bookmarkEnd w:id="26"/>
-    <w:bookmarkStart w:id="28" w:name="def-new-observation"/>
+    <w:bookmarkStart w:id="30" w:name="def-new-observation"/>
     <w:p>
       <w:pPr>
         <w:pStyle w:val="FirstParagraph"/>
@@ -2794,12 +2794,6 @@
       <w:r>
         <w:t xml:space="preserve"> </w:t>
       </w:r>
-      <w:r>
-        <w:t xml:space="preserve">is a pair</w:t>
-      </w:r>
-      <w:r>
-        <w:t xml:space="preserve"> </w:t>
-      </w:r>
       <m:oMath>
         <m:r>
           <m:rPr>
@@ -2854,13 +2848,7 @@
         <w:t xml:space="preserve"> </w:t>
       </w:r>
       <w:r>
-        <w:t xml:space="preserve">of a covariate value and an outcome</w:t>
-      </w:r>
-      <w:r>
-        <w:t xml:space="preserve"> </w:t>
-      </w:r>
-      <w:r>
-        <w:t xml:space="preserve">drawn from the same population as the observations of a</w:t>
+        <w:t xml:space="preserve">relative to a</w:t>
       </w:r>
       <w:r>
         <w:t xml:space="preserve"> </w:t>
@@ -2899,7 +2887,50 @@
         </m:sSub>
       </m:oMath>
       <w:r>
+        <w:t xml:space="preserve"> </w:t>
+      </w:r>
+      <w:r>
+        <w:t xml:space="preserve">is a covariate value and an outcome</w:t>
+      </w:r>
+      <w:r>
+        <w:t xml:space="preserve"> </w:t>
+      </w:r>
+      <w:r>
+        <w:t xml:space="preserve">drawn from the same population as the observations of</w:t>
+      </w:r>
+      <w:r>
+        <w:t xml:space="preserve"> </w:t>
+      </w:r>
+      <m:oMath>
+        <m:sSub>
+          <m:e>
+            <m:r>
+              <m:rPr>
+                <m:scr m:val="script"/>
+                <m:sty m:val="p"/>
+              </m:rPr>
+              <m:t>D</m:t>
+            </m:r>
+          </m:e>
+          <m:sub>
+            <m:r>
+              <m:rPr>
+                <m:nor/>
+                <m:sty m:val="p"/>
+              </m:rPr>
+              <m:t>train</m:t>
+            </m:r>
+          </m:sub>
+        </m:sSub>
+      </m:oMath>
+      <w:r>
         <w:t xml:space="preserve">,</w:t>
+      </w:r>
+      <w:r>
+        <w:t xml:space="preserve"> </w:t>
+      </w:r>
+      <w:r>
+        <w:t xml:space="preserve">and</w:t>
       </w:r>
       <w:r>
         <w:t xml:space="preserve"> </w:t>
@@ -3123,9 +3154,106 @@
       <w:r>
         <w:t xml:space="preserve">.</w:t>
       </w:r>
+      <w:r>
+        <w:t xml:space="preserve"> </w:t>
+      </w:r>
+      <w:r>
+        <w:t xml:space="preserve">It is the</w:t>
+      </w:r>
+      <w:r>
+        <w:t xml:space="preserve"> </w:t>
+      </w:r>
+      <w:hyperlink r:id="rId28">
+        <w:r>
+          <w:rPr>
+            <w:rStyle w:val="Hyperlink"/>
+          </w:rPr>
+          <w:t xml:space="preserve">new observation</w:t>
+        </w:r>
+      </w:hyperlink>
+      <w:r>
+        <w:t xml:space="preserve"> </w:t>
+      </w:r>
+      <w:r>
+        <w:t xml:space="preserve">of the pds notes,</w:t>
+      </w:r>
+      <w:r>
+        <w:t xml:space="preserve"> </w:t>
+      </w:r>
+      <w:r>
+        <w:t xml:space="preserve">where the data used to choose the</w:t>
+      </w:r>
+      <w:r>
+        <w:t xml:space="preserve"> </w:t>
+      </w:r>
+      <w:hyperlink r:id="rId29">
+        <w:r>
+          <w:rPr>
+            <w:rStyle w:val="Hyperlink"/>
+          </w:rPr>
+          <w:t xml:space="preserve">prediction function</w:t>
+        </w:r>
+      </w:hyperlink>
+      <w:r>
+        <w:t xml:space="preserve"> </w:t>
+      </w:r>
+      <w:r>
+        <w:t xml:space="preserve">is</w:t>
+      </w:r>
+      <w:r>
+        <w:t xml:space="preserve"> </w:t>
+      </w:r>
+      <m:oMath>
+        <m:sSub>
+          <m:e>
+            <m:r>
+              <m:rPr>
+                <m:scr m:val="script"/>
+                <m:sty m:val="p"/>
+              </m:rPr>
+              <m:t>D</m:t>
+            </m:r>
+          </m:e>
+          <m:sub>
+            <m:r>
+              <m:rPr>
+                <m:nor/>
+                <m:sty m:val="p"/>
+              </m:rPr>
+              <m:t>train</m:t>
+            </m:r>
+          </m:sub>
+        </m:sSub>
+      </m:oMath>
+      <w:r>
+        <w:t xml:space="preserve">,</w:t>
+      </w:r>
+      <w:r>
+        <w:t xml:space="preserve"> </w:t>
+      </w:r>
+      <w:r>
+        <w:t xml:space="preserve">to which a</w:t>
+      </w:r>
+      <w:r>
+        <w:t xml:space="preserve"> </w:t>
+      </w:r>
+      <w:hyperlink w:anchor="def-fitting-procedure">
+        <w:r>
+          <w:rPr>
+            <w:rStyle w:val="Hyperlink"/>
+          </w:rPr>
+          <w:t xml:space="preserve">fitting procedure</w:t>
+        </w:r>
+      </w:hyperlink>
+      <w:r>
+        <w:t xml:space="preserve"> </w:t>
+      </w:r>
+      <w:r>
+        <w:t xml:space="preserve">is applied.</w:t>
+      </w:r>
     </w:p>
-    <w:bookmarkEnd w:id="28"/>
-    <w:bookmarkStart w:id="29" w:name="exm-new-observation"/>
+    <w:bookmarkEnd w:id="30"/>
+    <w:bookmarkStart w:id="31" w:name="exm-new-observation"/>
     <w:p>
       <w:pPr>
         <w:pStyle w:val="BodyText"/>
@@ -3507,8 +3635,8 @@
         <w:t xml:space="preserve">.</w:t>
       </w:r>
     </w:p>
-    <w:bookmarkEnd w:id="29"/>
-    <w:bookmarkStart w:id="32" w:name="def-observation-loss"/>
+    <w:bookmarkEnd w:id="31"/>
+    <w:bookmarkStart w:id="34" w:name="def-observation-loss"/>
     <w:p>
       <w:pPr>
         <w:pStyle w:val="BodyText"/>
@@ -3630,7 +3758,7 @@
       <w:r>
         <w:t xml:space="preserve"> </w:t>
       </w:r>
-      <w:hyperlink r:id="rId30">
+      <w:hyperlink r:id="rId32">
         <w:r>
           <w:rPr>
             <w:rStyle w:val="Hyperlink"/>
@@ -3725,7 +3853,7 @@
       <w:pPr>
         <w:pStyle w:val="BodyText"/>
       </w:pPr>
-      <w:bookmarkStart w:id="31" w:name="eq-observation-loss"/>
+      <w:bookmarkStart w:id="33" w:name="eq-observation-loss"/>
       <m:oMathPara>
         <m:oMathParaPr>
           <m:jc m:val="center"/>
@@ -3859,7 +3987,7 @@
           </m:r>
         </m:oMath>
       </m:oMathPara>
-      <w:bookmarkEnd w:id="31"/>
+      <w:bookmarkEnd w:id="33"/>
     </w:p>
     <w:p>
       <w:pPr>
@@ -4054,8 +4182,8 @@
         <w:t xml:space="preserve">.</w:t>
       </w:r>
     </w:p>
-    <w:bookmarkEnd w:id="32"/>
-    <w:bookmarkStart w:id="34" w:name="rem-squared-error-loss"/>
+    <w:bookmarkEnd w:id="34"/>
+    <w:bookmarkStart w:id="36" w:name="rem-squared-error-loss"/>
     <w:p>
       <w:pPr>
         <w:pStyle w:val="BodyText"/>
@@ -4217,7 +4345,7 @@
       <w:r>
         <w:t xml:space="preserve"> </w:t>
       </w:r>
-      <w:hyperlink r:id="rId33">
+      <w:hyperlink r:id="rId35">
         <w:r>
           <w:rPr>
             <w:rStyle w:val="Hyperlink"/>
@@ -4278,8 +4406,8 @@
         <w:t xml:space="preserve">and each average loss below is a mean squared error.</w:t>
       </w:r>
     </w:p>
-    <w:bookmarkEnd w:id="34"/>
-    <w:bookmarkStart w:id="36" w:name="def-generalization-error"/>
+    <w:bookmarkEnd w:id="36"/>
+    <w:bookmarkStart w:id="38" w:name="def-generalization-error"/>
     <w:p>
       <w:pPr>
         <w:pStyle w:val="BodyText"/>
@@ -4533,7 +4661,7 @@
       <w:pPr>
         <w:pStyle w:val="BodyText"/>
       </w:pPr>
-      <w:bookmarkStart w:id="35" w:name="eq-generalization-error"/>
+      <w:bookmarkStart w:id="37" w:name="eq-generalization-error"/>
       <m:oMathPara>
         <m:oMathParaPr>
           <m:jc m:val="center"/>
@@ -4679,10 +4807,10 @@
           </m:r>
         </m:oMath>
       </m:oMathPara>
-      <w:bookmarkEnd w:id="35"/>
+      <w:bookmarkEnd w:id="37"/>
     </w:p>
-    <w:bookmarkEnd w:id="36"/>
-    <w:bookmarkStart w:id="37" w:name="rem-source-generalization-error"/>
+    <w:bookmarkEnd w:id="38"/>
+    <w:bookmarkStart w:id="39" w:name="rem-source-generalization-error"/>
     <w:p>
       <w:pPr>
         <w:pStyle w:val="FirstParagraph"/>
@@ -4722,8 +4850,8 @@
         <w:t xml:space="preserve">.</w:t>
       </w:r>
     </w:p>
-    <w:bookmarkEnd w:id="37"/>
-    <w:bookmarkStart w:id="39" w:name="def-held-out-set"/>
+    <w:bookmarkEnd w:id="39"/>
+    <w:bookmarkStart w:id="41" w:name="def-held-out-set"/>
     <w:p>
       <w:pPr>
         <w:pStyle w:val="BodyText"/>
@@ -4913,7 +5041,7 @@
       <w:pPr>
         <w:pStyle w:val="BodyText"/>
       </w:pPr>
-      <w:bookmarkStart w:id="38" w:name="eq-held-out-set"/>
+      <w:bookmarkStart w:id="40" w:name="eq-held-out-set"/>
       <m:oMathPara>
         <m:oMathParaPr>
           <m:jc m:val="center"/>
@@ -5111,10 +5239,10 @@
           </m:r>
         </m:oMath>
       </m:oMathPara>
-      <w:bookmarkEnd w:id="38"/>
+      <w:bookmarkEnd w:id="40"/>
     </w:p>
-    <w:bookmarkEnd w:id="39"/>
-    <w:bookmarkStart w:id="40" w:name="rem-source-held-out-set"/>
+    <w:bookmarkEnd w:id="41"/>
+    <w:bookmarkStart w:id="42" w:name="rem-source-held-out-set"/>
     <w:p>
       <w:pPr>
         <w:pStyle w:val="FirstParagraph"/>
@@ -5152,8 +5280,8 @@
         <w:t xml:space="preserve">.</w:t>
       </w:r>
     </w:p>
-    <w:bookmarkEnd w:id="40"/>
-    <w:bookmarkStart w:id="43" w:name="def-prediction-rmse"/>
+    <w:bookmarkEnd w:id="42"/>
+    <w:bookmarkStart w:id="45" w:name="def-prediction-rmse"/>
     <w:p>
       <w:pPr>
         <w:pStyle w:val="BodyText"/>
@@ -5310,7 +5438,7 @@
       <w:r>
         <w:t xml:space="preserve"> </w:t>
       </w:r>
-      <w:hyperlink r:id="rId41">
+      <w:hyperlink r:id="rId43">
         <w:r>
           <w:rPr>
             <w:rStyle w:val="Hyperlink"/>
@@ -5326,7 +5454,7 @@
       <w:pPr>
         <w:pStyle w:val="BodyText"/>
       </w:pPr>
-      <w:bookmarkStart w:id="42" w:name="eq-prediction-rmse"/>
+      <w:bookmarkStart w:id="44" w:name="eq-prediction-rmse"/>
       <m:oMathPara>
         <m:oMathParaPr>
           <m:jc m:val="center"/>
@@ -5449,10 +5577,10 @@
           </m:r>
         </m:oMath>
       </m:oMathPara>
-      <w:bookmarkEnd w:id="42"/>
+      <w:bookmarkEnd w:id="44"/>
     </w:p>
-    <w:bookmarkEnd w:id="43"/>
-    <w:bookmarkStart w:id="45" w:name="def-training-mse"/>
+    <w:bookmarkEnd w:id="45"/>
+    <w:bookmarkStart w:id="47" w:name="def-training-mse"/>
     <w:p>
       <w:pPr>
         <w:pStyle w:val="FirstParagraph"/>
@@ -5619,7 +5747,7 @@
       <w:pPr>
         <w:pStyle w:val="BodyText"/>
       </w:pPr>
-      <w:bookmarkStart w:id="44" w:name="eq-training-mse"/>
+      <w:bookmarkStart w:id="46" w:name="eq-training-mse"/>
       <m:oMathPara>
         <m:oMathParaPr>
           <m:jc m:val="center"/>
@@ -5739,10 +5867,10 @@
           </m:r>
         </m:oMath>
       </m:oMathPara>
-      <w:bookmarkEnd w:id="44"/>
+      <w:bookmarkEnd w:id="46"/>
     </w:p>
-    <w:bookmarkEnd w:id="45"/>
-    <w:bookmarkStart w:id="46" w:name="rem-source-training-mse"/>
+    <w:bookmarkEnd w:id="47"/>
+    <w:bookmarkStart w:id="48" w:name="rem-source-training-mse"/>
     <w:p>
       <w:pPr>
         <w:pStyle w:val="FirstParagraph"/>
@@ -5789,9 +5917,9 @@
         <w:t xml:space="preserve">and define it for any loss.</w:t>
       </w:r>
     </w:p>
-    <w:bookmarkEnd w:id="46"/>
-    <w:bookmarkEnd w:id="47"/>
-    <w:bookmarkStart w:id="52" w:name="overfitting"/>
+    <w:bookmarkEnd w:id="48"/>
+    <w:bookmarkEnd w:id="49"/>
+    <w:bookmarkStart w:id="54" w:name="overfitting"/>
     <w:p>
       <w:pPr>
         <w:pStyle w:val="Heading2"/>
@@ -5800,7 +5928,7 @@
         <w:t xml:space="preserve">3 Overfitting</w:t>
       </w:r>
     </w:p>
-    <w:bookmarkStart w:id="48" w:name="exr-overfitting"/>
+    <w:bookmarkStart w:id="50" w:name="exr-overfitting"/>
     <w:p>
       <w:pPr>
         <w:pStyle w:val="FirstParagraph"/>
@@ -6013,8 +6141,8 @@
         <w:t xml:space="preserve">improve predictions for the held-out cars?</w:t>
       </w:r>
     </w:p>
-    <w:bookmarkEnd w:id="48"/>
-    <w:bookmarkStart w:id="49" w:name="sol-overfitting"/>
+    <w:bookmarkEnd w:id="50"/>
+    <w:bookmarkStart w:id="51" w:name="sol-overfitting"/>
     <w:p>
       <w:pPr>
         <w:pStyle w:val="FirstParagraph"/>
@@ -7237,8 +7365,8 @@
         <w:t xml:space="preserve">there the held-out RMSE also falls.</w:t>
       </w:r>
     </w:p>
-    <w:bookmarkEnd w:id="49"/>
-    <w:bookmarkStart w:id="50" w:name="def-overfitting"/>
+    <w:bookmarkEnd w:id="51"/>
+    <w:bookmarkStart w:id="52" w:name="def-overfitting"/>
     <w:p>
       <w:pPr>
         <w:pStyle w:val="FirstParagraph"/>
@@ -7307,8 +7435,8 @@
         <w:t xml:space="preserve">but predicts poorly for new observations.</w:t>
       </w:r>
     </w:p>
-    <w:bookmarkEnd w:id="50"/>
-    <w:bookmarkStart w:id="51" w:name="exm-overfitting-polynomial-cars"/>
+    <w:bookmarkEnd w:id="52"/>
+    <w:bookmarkStart w:id="53" w:name="exm-overfitting-polynomial-cars"/>
     <w:p>
       <w:pPr>
         <w:pStyle w:val="BodyText"/>
@@ -7365,9 +7493,9 @@
         <w:t xml:space="preserve">it is the beginning of overfitting, not a dramatic case.</w:t>
       </w:r>
     </w:p>
-    <w:bookmarkEnd w:id="51"/>
-    <w:bookmarkEnd w:id="52"/>
-    <w:bookmarkStart w:id="114" w:name="sec-generalization-error"/>
+    <w:bookmarkEnd w:id="53"/>
+    <w:bookmarkEnd w:id="54"/>
+    <w:bookmarkStart w:id="116" w:name="sec-generalization-error"/>
     <w:p>
       <w:pPr>
         <w:pStyle w:val="Heading2"/>
@@ -7376,7 +7504,7 @@
         <w:t xml:space="preserve">4 Generalization error</w:t>
       </w:r>
     </w:p>
-    <w:bookmarkStart w:id="53" w:name="exr-generalization-error"/>
+    <w:bookmarkStart w:id="55" w:name="exr-generalization-error"/>
     <w:p>
       <w:pPr>
         <w:pStyle w:val="FirstParagraph"/>
@@ -7729,7 +7857,7 @@
       <w:r>
         <w:t xml:space="preserve"> </w:t>
       </w:r>
-      <w:hyperlink r:id="rId33">
+      <w:hyperlink r:id="rId35">
         <w:r>
           <w:rPr>
             <w:rStyle w:val="Hyperlink"/>
@@ -7853,8 +7981,8 @@
         <w:t xml:space="preserve">use in place of your expectation?</w:t>
       </w:r>
     </w:p>
-    <w:bookmarkEnd w:id="53"/>
-    <w:bookmarkStart w:id="54" w:name="sol-generalization-error"/>
+    <w:bookmarkEnd w:id="55"/>
+    <w:bookmarkStart w:id="56" w:name="sol-generalization-error"/>
     <w:p>
       <w:pPr>
         <w:pStyle w:val="FirstParagraph"/>
@@ -8454,8 +8582,8 @@
         <w:t xml:space="preserve">was chosen to fit them.</w:t>
       </w:r>
     </w:p>
-    <w:bookmarkEnd w:id="54"/>
-    <w:bookmarkStart w:id="56" w:name="def-expected-generalization-error"/>
+    <w:bookmarkEnd w:id="56"/>
+    <w:bookmarkStart w:id="58" w:name="def-expected-generalization-error"/>
     <w:p>
       <w:pPr>
         <w:pStyle w:val="FirstParagraph"/>
@@ -8683,7 +8811,7 @@
       <w:pPr>
         <w:pStyle w:val="BodyText"/>
       </w:pPr>
-      <w:bookmarkStart w:id="55" w:name="eq-expected-generalization-error"/>
+      <w:bookmarkStart w:id="57" w:name="eq-expected-generalization-error"/>
       <m:oMathPara>
         <m:oMathParaPr>
           <m:jc m:val="center"/>
@@ -8970,10 +9098,10 @@
           </m:r>
         </m:oMath>
       </m:oMathPara>
-      <w:bookmarkEnd w:id="55"/>
+      <w:bookmarkEnd w:id="57"/>
     </w:p>
-    <w:bookmarkEnd w:id="56"/>
-    <w:bookmarkStart w:id="57" w:name="rem-source-expected-generalization-error"/>
+    <w:bookmarkEnd w:id="58"/>
+    <w:bookmarkStart w:id="59" w:name="rem-source-expected-generalization-error"/>
     <w:p>
       <w:pPr>
         <w:pStyle w:val="FirstParagraph"/>
@@ -9058,8 +9186,8 @@
         <w:t xml:space="preserve">.</w:t>
       </w:r>
     </w:p>
-    <w:bookmarkEnd w:id="57"/>
-    <w:bookmarkStart w:id="59" w:name="def-mean-function"/>
+    <w:bookmarkEnd w:id="59"/>
+    <w:bookmarkStart w:id="61" w:name="def-mean-function"/>
     <w:p>
       <w:pPr>
         <w:pStyle w:val="BodyText"/>
@@ -9182,7 +9310,7 @@
       <w:pPr>
         <w:pStyle w:val="BodyText"/>
       </w:pPr>
-      <w:bookmarkStart w:id="58" w:name="eq-mean-function"/>
+      <w:bookmarkStart w:id="60" w:name="eq-mean-function"/>
       <m:oMathPara>
         <m:oMathParaPr>
           <m:jc m:val="center"/>
@@ -9294,10 +9422,10 @@
           </m:r>
         </m:oMath>
       </m:oMathPara>
-      <w:bookmarkEnd w:id="58"/>
+      <w:bookmarkEnd w:id="60"/>
     </w:p>
-    <w:bookmarkEnd w:id="59"/>
-    <w:bookmarkStart w:id="61" w:name="def-epl"/>
+    <w:bookmarkEnd w:id="61"/>
+    <w:bookmarkStart w:id="63" w:name="def-epl"/>
     <w:p>
       <w:pPr>
         <w:pStyle w:val="FirstParagraph"/>
@@ -9694,7 +9822,7 @@
       <w:pPr>
         <w:pStyle w:val="BodyText"/>
       </w:pPr>
-      <w:bookmarkStart w:id="60" w:name="eq-epl"/>
+      <w:bookmarkStart w:id="62" w:name="eq-epl"/>
       <m:oMathPara>
         <m:oMathParaPr>
           <m:jc m:val="center"/>
@@ -9851,10 +9979,10 @@
           </m:r>
         </m:oMath>
       </m:oMathPara>
-      <w:bookmarkEnd w:id="60"/>
+      <w:bookmarkEnd w:id="62"/>
     </w:p>
-    <w:bookmarkEnd w:id="61"/>
-    <w:bookmarkStart w:id="62" w:name="rem-epl-generalization-error"/>
+    <w:bookmarkEnd w:id="63"/>
+    <w:bookmarkStart w:id="64" w:name="rem-epl-generalization-error"/>
     <w:p>
       <w:pPr>
         <w:pStyle w:val="FirstParagraph"/>
@@ -9985,8 +10113,8 @@
         <w:t xml:space="preserve">so it estimates the generalization error without equalling it.</w:t>
       </w:r>
     </w:p>
-    <w:bookmarkEnd w:id="62"/>
-    <w:bookmarkStart w:id="64" w:name="def-epe"/>
+    <w:bookmarkEnd w:id="64"/>
+    <w:bookmarkStart w:id="66" w:name="def-epe"/>
     <w:p>
       <w:pPr>
         <w:pStyle w:val="BodyText"/>
@@ -10127,7 +10255,7 @@
       <w:r>
         <w:t xml:space="preserve"> </w:t>
       </w:r>
-      <w:hyperlink r:id="rId33">
+      <w:hyperlink r:id="rId35">
         <w:r>
           <w:rPr>
             <w:rStyle w:val="Hyperlink"/>
@@ -10163,7 +10291,7 @@
       <w:pPr>
         <w:pStyle w:val="BodyText"/>
       </w:pPr>
-      <w:bookmarkStart w:id="63" w:name="eq-epe"/>
+      <w:bookmarkStart w:id="65" w:name="eq-epe"/>
       <m:oMathPara>
         <m:oMathParaPr>
           <m:jc m:val="center"/>
@@ -10325,10 +10453,10 @@
           </m:r>
         </m:oMath>
       </m:oMathPara>
-      <w:bookmarkEnd w:id="63"/>
+      <w:bookmarkEnd w:id="65"/>
     </w:p>
-    <w:bookmarkEnd w:id="64"/>
-    <w:bookmarkStart w:id="66" w:name="rem-epe-mse"/>
+    <w:bookmarkEnd w:id="66"/>
+    <w:bookmarkStart w:id="68" w:name="rem-epe-mse"/>
     <w:p>
       <w:pPr>
         <w:pStyle w:val="FirstParagraph"/>
@@ -10349,7 +10477,7 @@
       <w:r>
         <w:t xml:space="preserve"> </w:t>
       </w:r>
-      <w:hyperlink r:id="rId41">
+      <w:hyperlink r:id="rId43">
         <w:r>
           <w:rPr>
             <w:rStyle w:val="Hyperlink"/>
@@ -10566,7 +10694,7 @@
       <w:r>
         <w:t xml:space="preserve"> </w:t>
       </w:r>
-      <w:hyperlink r:id="rId65">
+      <w:hyperlink r:id="rId67">
         <w:r>
           <w:rPr>
             <w:rStyle w:val="Hyperlink"/>
@@ -10683,8 +10811,8 @@
         <w:t xml:space="preserve">Another loss gives an expected prediction loss, not an EPE.</w:t>
       </w:r>
     </w:p>
-    <w:bookmarkEnd w:id="66"/>
-    <w:bookmarkStart w:id="67" w:name="rem-source-epe"/>
+    <w:bookmarkEnd w:id="68"/>
+    <w:bookmarkStart w:id="69" w:name="rem-source-epe"/>
     <w:p>
       <w:pPr>
         <w:pStyle w:val="BodyText"/>
@@ -10750,8 +10878,8 @@
         <w:t xml:space="preserve">for squared-error loss.</w:t>
       </w:r>
     </w:p>
-    <w:bookmarkEnd w:id="67"/>
-    <w:bookmarkStart w:id="68" w:name="exr-expected-error-epe"/>
+    <w:bookmarkEnd w:id="69"/>
+    <w:bookmarkStart w:id="70" w:name="exr-expected-error-epe"/>
     <w:p>
       <w:pPr>
         <w:pStyle w:val="BodyText"/>
@@ -11085,8 +11213,8 @@
         <w:t xml:space="preserve">.</w:t>
       </w:r>
     </w:p>
-    <w:bookmarkEnd w:id="68"/>
-    <w:bookmarkStart w:id="70" w:name="sol-expected-error-epe"/>
+    <w:bookmarkEnd w:id="70"/>
+    <w:bookmarkStart w:id="72" w:name="sol-expected-error-epe"/>
     <w:p>
       <w:pPr>
         <w:pStyle w:val="BodyText"/>
@@ -11884,7 +12012,7 @@
       <w:r>
         <w:t xml:space="preserve"> </w:t>
       </w:r>
-      <w:hyperlink r:id="rId69">
+      <w:hyperlink r:id="rId71">
         <w:r>
           <w:rPr>
             <w:rStyle w:val="Hyperlink"/>
@@ -12141,8 +12269,8 @@
         <w:t xml:space="preserve">requires.</w:t>
       </w:r>
     </w:p>
-    <w:bookmarkEnd w:id="70"/>
-    <w:bookmarkStart w:id="72" w:name="thm-expected-error-epe"/>
+    <w:bookmarkEnd w:id="72"/>
+    <w:bookmarkStart w:id="74" w:name="thm-expected-error-epe"/>
     <w:p>
       <w:pPr>
         <w:pStyle w:val="BodyText"/>
@@ -12362,7 +12490,7 @@
       <w:pPr>
         <w:pStyle w:val="BodyText"/>
       </w:pPr>
-      <w:bookmarkStart w:id="71" w:name="eq-expected-error-epe"/>
+      <w:bookmarkStart w:id="73" w:name="eq-expected-error-epe"/>
       <m:oMathPara>
         <m:oMathParaPr>
           <m:jc m:val="center"/>
@@ -12507,9 +12635,9 @@
           </m:r>
         </m:oMath>
       </m:oMathPara>
-      <w:bookmarkEnd w:id="71"/>
+      <w:bookmarkEnd w:id="73"/>
     </w:p>
-    <w:bookmarkEnd w:id="72"/>
+    <w:bookmarkEnd w:id="74"/>
     <w:p>
       <w:pPr>
         <w:pStyle w:val="FirstParagraph"/>
@@ -12542,7 +12670,7 @@
         <w:t xml:space="preserve">.</w:t>
       </w:r>
     </w:p>
-    <w:bookmarkStart w:id="74" w:name="def-average-fit"/>
+    <w:bookmarkStart w:id="76" w:name="def-average-fit"/>
     <w:p>
       <w:pPr>
         <w:pStyle w:val="BodyText"/>
@@ -12753,7 +12881,7 @@
       <w:pPr>
         <w:pStyle w:val="BodyText"/>
       </w:pPr>
-      <w:bookmarkStart w:id="73" w:name="eq-average-fit"/>
+      <w:bookmarkStart w:id="75" w:name="eq-average-fit"/>
       <m:oMathPara>
         <m:oMathParaPr>
           <m:jc m:val="center"/>
@@ -12903,9 +13031,9 @@
           </m:r>
         </m:oMath>
       </m:oMathPara>
-      <w:bookmarkEnd w:id="73"/>
+      <w:bookmarkEnd w:id="75"/>
     </w:p>
-    <w:bookmarkEnd w:id="74"/>
+    <w:bookmarkEnd w:id="76"/>
     <w:p>
       <w:pPr>
         <w:pStyle w:val="FirstParagraph"/>
@@ -12959,7 +13087,7 @@
         <w:t xml:space="preserve">and from each other.</w:t>
       </w:r>
     </w:p>
-    <w:bookmarkStart w:id="75" w:name="exm-average-fit"/>
+    <w:bookmarkStart w:id="77" w:name="exm-average-fit"/>
     <w:p>
       <w:pPr>
         <w:pStyle w:val="BodyText"/>
@@ -13203,8 +13331,8 @@
         </m:oMath>
       </m:oMathPara>
     </w:p>
-    <w:bookmarkEnd w:id="75"/>
-    <w:bookmarkStart w:id="79" w:name="def-prediction-bias"/>
+    <w:bookmarkEnd w:id="77"/>
+    <w:bookmarkStart w:id="81" w:name="def-prediction-bias"/>
     <w:p>
       <w:pPr>
         <w:pStyle w:val="FirstParagraph"/>
@@ -13420,7 +13548,7 @@
       <w:r>
         <w:t xml:space="preserve"> </w:t>
       </w:r>
-      <w:hyperlink r:id="rId76">
+      <w:hyperlink r:id="rId78">
         <w:r>
           <w:rPr>
             <w:rStyle w:val="Hyperlink"/>
@@ -13496,7 +13624,7 @@
       <w:r>
         <w:t xml:space="preserve"> </w:t>
       </w:r>
-      <w:hyperlink r:id="rId77">
+      <w:hyperlink r:id="rId79">
         <w:r>
           <w:rPr>
             <w:rStyle w:val="Hyperlink"/>
@@ -13564,7 +13692,7 @@
       <w:pPr>
         <w:pStyle w:val="BodyText"/>
       </w:pPr>
-      <w:bookmarkStart w:id="78" w:name="eq-prediction-bias"/>
+      <w:bookmarkStart w:id="80" w:name="eq-prediction-bias"/>
       <m:oMathPara>
         <m:oMathParaPr>
           <m:jc m:val="center"/>
@@ -13766,7 +13894,7 @@
           </m:r>
         </m:oMath>
       </m:oMathPara>
-      <w:bookmarkEnd w:id="78"/>
+      <w:bookmarkEnd w:id="80"/>
     </w:p>
     <w:p>
       <w:pPr>
@@ -13853,7 +13981,7 @@
         <w:t xml:space="preserve">.</w:t>
       </w:r>
     </w:p>
-    <w:bookmarkEnd w:id="79"/>
+    <w:bookmarkEnd w:id="81"/>
     <w:p>
       <w:pPr>
         <w:pStyle w:val="BodyText"/>
@@ -13887,7 +14015,7 @@
         <w:t xml:space="preserve">the bias reflects the error introduced by approximating a real-world relationship by a model.</w:t>
       </w:r>
     </w:p>
-    <w:bookmarkStart w:id="80" w:name="exm-prediction-bias"/>
+    <w:bookmarkStart w:id="82" w:name="exm-prediction-bias"/>
     <w:p>
       <w:pPr>
         <w:pStyle w:val="BodyText"/>
@@ -14216,8 +14344,8 @@
         <w:t xml:space="preserve">.</w:t>
       </w:r>
     </w:p>
-    <w:bookmarkEnd w:id="80"/>
-    <w:bookmarkStart w:id="81" w:name="exr-epe-three-sources"/>
+    <w:bookmarkEnd w:id="82"/>
+    <w:bookmarkStart w:id="83" w:name="exr-epe-three-sources"/>
     <w:p>
       <w:pPr>
         <w:pStyle w:val="BodyText"/>
@@ -15009,8 +15137,8 @@
         <w:t xml:space="preserve">and which cannot?</w:t>
       </w:r>
     </w:p>
-    <w:bookmarkEnd w:id="81"/>
-    <w:bookmarkStart w:id="82" w:name="sol-epe-three-sources"/>
+    <w:bookmarkEnd w:id="83"/>
+    <w:bookmarkStart w:id="84" w:name="sol-epe-three-sources"/>
     <w:p>
       <w:pPr>
         <w:pStyle w:val="FirstParagraph"/>
@@ -15309,8 +15437,8 @@
         <w:t xml:space="preserve">in the new outcome.</w:t>
       </w:r>
     </w:p>
-    <w:bookmarkEnd w:id="82"/>
-    <w:bookmarkStart w:id="83" w:name="exr-epe-split-noise"/>
+    <w:bookmarkEnd w:id="84"/>
+    <w:bookmarkStart w:id="85" w:name="exr-epe-split-noise"/>
     <w:p>
       <w:pPr>
         <w:pStyle w:val="FirstParagraph"/>
@@ -15797,8 +15925,8 @@
         <w:t xml:space="preserve">and name the assumptions that make the cross term zero.</w:t>
       </w:r>
     </w:p>
-    <w:bookmarkEnd w:id="83"/>
-    <w:bookmarkStart w:id="87" w:name="sol-epe-split-noise"/>
+    <w:bookmarkEnd w:id="85"/>
+    <w:bookmarkStart w:id="89" w:name="sol-epe-split-noise"/>
     <w:p>
       <w:pPr>
         <w:pStyle w:val="BodyText"/>
@@ -15819,7 +15947,7 @@
       <w:r>
         <w:t xml:space="preserve"> </w:t>
       </w:r>
-      <w:hyperlink r:id="rId77">
+      <w:hyperlink r:id="rId79">
         <w:r>
           <w:rPr>
             <w:rStyle w:val="Hyperlink"/>
@@ -16666,7 +16794,7 @@
       <w:r>
         <w:t xml:space="preserve"> </w:t>
       </w:r>
-      <w:hyperlink r:id="rId84">
+      <w:hyperlink r:id="rId86">
         <w:r>
           <w:rPr>
             <w:rStyle w:val="Hyperlink"/>
@@ -16697,7 +16825,7 @@
       <w:r>
         <w:t xml:space="preserve"> </w:t>
       </w:r>
-      <w:hyperlink r:id="rId85">
+      <w:hyperlink r:id="rId87">
         <w:r>
           <w:rPr>
             <w:rStyle w:val="Hyperlink"/>
@@ -18095,7 +18223,7 @@
       <w:pPr>
         <w:pStyle w:val="BodyText"/>
       </w:pPr>
-      <w:bookmarkStart w:id="86" w:name="eq-epe-after-noise"/>
+      <w:bookmarkStart w:id="88" w:name="eq-epe-after-noise"/>
       <m:oMathPara>
         <m:oMathParaPr>
           <m:jc m:val="center"/>
@@ -18386,7 +18514,7 @@
           </m:r>
         </m:oMath>
       </m:oMathPara>
-      <w:bookmarkEnd w:id="86"/>
+      <w:bookmarkEnd w:id="88"/>
     </w:p>
     <w:p>
       <w:pPr>
@@ -18581,8 +18709,8 @@
         <w:t xml:space="preserve">whose noise helped determine the prediction.</w:t>
       </w:r>
     </w:p>
-    <w:bookmarkEnd w:id="87"/>
-    <w:bookmarkStart w:id="88" w:name="exr-epe-split-bias"/>
+    <w:bookmarkEnd w:id="89"/>
+    <w:bookmarkStart w:id="90" w:name="exr-epe-split-bias"/>
     <w:p>
       <w:pPr>
         <w:pStyle w:val="BodyText"/>
@@ -18906,8 +19034,8 @@
         <w:t xml:space="preserve">and what makes the cross term zero this time?</w:t>
       </w:r>
     </w:p>
-    <w:bookmarkEnd w:id="88"/>
-    <w:bookmarkStart w:id="91" w:name="sol-epe-split-bias"/>
+    <w:bookmarkEnd w:id="90"/>
+    <w:bookmarkStart w:id="93" w:name="sol-epe-split-bias"/>
     <w:p>
       <w:pPr>
         <w:pStyle w:val="BodyText"/>
@@ -21317,7 +21445,7 @@
       <w:r>
         <w:t xml:space="preserve"> </w:t>
       </w:r>
-      <w:hyperlink r:id="rId89">
+      <w:hyperlink r:id="rId91">
         <w:r>
           <w:rPr>
             <w:rStyle w:val="Hyperlink"/>
@@ -21931,7 +22059,7 @@
       <w:pPr>
         <w:pStyle w:val="BodyText"/>
       </w:pPr>
-      <w:bookmarkStart w:id="90" w:name="eq-epe-after-bias"/>
+      <w:bookmarkStart w:id="92" w:name="eq-epe-after-bias"/>
       <m:oMathPara>
         <m:oMathParaPr>
           <m:jc m:val="center"/>
@@ -22259,7 +22387,7 @@
           </m:r>
         </m:oMath>
       </m:oMathPara>
-      <w:bookmarkEnd w:id="90"/>
+      <w:bookmarkEnd w:id="92"/>
     </w:p>
     <w:p>
       <w:pPr>
@@ -22295,8 +22423,8 @@
         <w:t xml:space="preserve">This split is specific to squared-error loss, the loss of this chapter’s examples.</w:t>
       </w:r>
     </w:p>
-    <w:bookmarkEnd w:id="91"/>
-    <w:bookmarkStart w:id="93" w:name="thm-epe-decomposition"/>
+    <w:bookmarkEnd w:id="93"/>
+    <w:bookmarkStart w:id="95" w:name="thm-epe-decomposition"/>
     <w:p>
       <w:pPr>
         <w:pStyle w:val="BodyText"/>
@@ -22782,7 +22910,7 @@
       <w:r>
         <w:t xml:space="preserve"> </w:t>
       </w:r>
-      <w:hyperlink r:id="rId77">
+      <w:hyperlink r:id="rId79">
         <w:r>
           <w:rPr>
             <w:rStyle w:val="Hyperlink"/>
@@ -22831,7 +22959,7 @@
       <w:r>
         <w:t xml:space="preserve"> </w:t>
       </w:r>
-      <w:hyperlink r:id="rId89">
+      <w:hyperlink r:id="rId91">
         <w:r>
           <w:rPr>
             <w:rStyle w:val="Hyperlink"/>
@@ -22873,7 +23001,7 @@
       <w:pPr>
         <w:pStyle w:val="BodyText"/>
       </w:pPr>
-      <w:bookmarkStart w:id="92" w:name="eq-epe-decomposition"/>
+      <w:bookmarkStart w:id="94" w:name="eq-epe-decomposition"/>
       <m:oMathPara>
         <m:oMathParaPr>
           <m:jc m:val="center"/>
@@ -23139,9 +23267,9 @@
           </m:r>
         </m:oMath>
       </m:oMathPara>
-      <w:bookmarkEnd w:id="92"/>
+      <w:bookmarkEnd w:id="94"/>
     </w:p>
-    <w:bookmarkEnd w:id="93"/>
+    <w:bookmarkEnd w:id="95"/>
     <w:p>
       <w:pPr>
         <w:pStyle w:val="FirstParagraph"/>
@@ -23214,7 +23342,7 @@
       <w:r>
         <w:t xml:space="preserve"> </w:t>
       </w:r>
-      <w:hyperlink r:id="rId77">
+      <w:hyperlink r:id="rId79">
         <w:r>
           <w:rPr>
             <w:rStyle w:val="Hyperlink"/>
@@ -23952,7 +24080,7 @@
         </m:oMath>
       </m:oMathPara>
     </w:p>
-    <w:bookmarkStart w:id="94" w:name="def-irreducible-error"/>
+    <w:bookmarkStart w:id="96" w:name="def-irreducible-error"/>
     <w:p>
       <w:pPr>
         <w:pStyle w:val="FirstParagraph"/>
@@ -24199,7 +24327,7 @@
         <w:t xml:space="preserve">.</w:t>
       </w:r>
     </w:p>
-    <w:bookmarkEnd w:id="94"/>
+    <w:bookmarkEnd w:id="96"/>
     <w:p>
       <w:pPr>
         <w:pStyle w:val="BodyText"/>
@@ -24227,7 +24355,7 @@
         <w:t xml:space="preserve">.</w:t>
       </w:r>
     </w:p>
-    <w:bookmarkStart w:id="96" w:name="rem-generalization-error"/>
+    <w:bookmarkStart w:id="98" w:name="rem-generalization-error"/>
     <w:p>
       <w:pPr>
         <w:pStyle w:val="BodyText"/>
@@ -24338,7 +24466,7 @@
       <w:r>
         <w:t xml:space="preserve"> </w:t>
       </w:r>
-      <w:hyperlink r:id="rId95">
+      <w:hyperlink r:id="rId97">
         <w:r>
           <w:rPr>
             <w:rStyle w:val="Hyperlink"/>
@@ -24403,7 +24531,7 @@
       <w:r>
         <w:t xml:space="preserve"> </w:t>
       </w:r>
-      <w:hyperlink r:id="rId30">
+      <w:hyperlink r:id="rId32">
         <w:r>
           <w:rPr>
             <w:rStyle w:val="Hyperlink"/>
@@ -24621,8 +24749,8 @@
         <w:t xml:space="preserve">into a squared bias, a variance and a noise variance.</w:t>
       </w:r>
     </w:p>
-    <w:bookmarkEnd w:id="96"/>
-    <w:bookmarkStart w:id="98" w:name="def-flexibility"/>
+    <w:bookmarkEnd w:id="98"/>
+    <w:bookmarkStart w:id="100" w:name="def-flexibility"/>
     <w:p>
       <w:pPr>
         <w:pStyle w:val="BodyText"/>
@@ -24896,7 +25024,7 @@
       <w:pPr>
         <w:pStyle w:val="BodyText"/>
       </w:pPr>
-      <w:bookmarkStart w:id="97" w:name="eq-flexibility"/>
+      <w:bookmarkStart w:id="99" w:name="eq-flexibility"/>
       <m:oMathPara>
         <m:oMathParaPr>
           <m:jc m:val="center"/>
@@ -24966,10 +25094,10 @@
           </m:r>
         </m:oMath>
       </m:oMathPara>
-      <w:bookmarkEnd w:id="97"/>
+      <w:bookmarkEnd w:id="99"/>
     </w:p>
-    <w:bookmarkEnd w:id="98"/>
-    <w:bookmarkStart w:id="99" w:name="rem-source-flexibility"/>
+    <w:bookmarkEnd w:id="100"/>
+    <w:bookmarkStart w:id="101" w:name="rem-source-flexibility"/>
     <w:p>
       <w:pPr>
         <w:pStyle w:val="FirstParagraph"/>
@@ -24994,8 +25122,8 @@
         <w:t xml:space="preserve">use flexibility without a formal definition.</w:t>
       </w:r>
     </w:p>
-    <w:bookmarkEnd w:id="99"/>
-    <w:bookmarkStart w:id="100" w:name="rem-flexibility"/>
+    <w:bookmarkEnd w:id="101"/>
+    <w:bookmarkStart w:id="102" w:name="rem-flexibility"/>
     <w:p>
       <w:pPr>
         <w:pStyle w:val="BodyText"/>
@@ -25228,8 +25356,8 @@
         <w:t xml:space="preserve">.</w:t>
       </w:r>
     </w:p>
-    <w:bookmarkEnd w:id="100"/>
-    <w:bookmarkStart w:id="102" w:name="def-bias-variance-tradeoff"/>
+    <w:bookmarkEnd w:id="102"/>
+    <w:bookmarkStart w:id="104" w:name="def-bias-variance-tradeoff"/>
     <w:p>
       <w:pPr>
         <w:pStyle w:val="BodyText"/>
@@ -25493,7 +25621,7 @@
       <w:r>
         <w:t xml:space="preserve"> </w:t>
       </w:r>
-      <w:hyperlink r:id="rId77">
+      <w:hyperlink r:id="rId79">
         <w:r>
           <w:rPr>
             <w:rStyle w:val="Hyperlink"/>
@@ -25542,7 +25670,7 @@
       <w:r>
         <w:t xml:space="preserve"> </w:t>
       </w:r>
-      <w:hyperlink r:id="rId89">
+      <w:hyperlink r:id="rId91">
         <w:r>
           <w:rPr>
             <w:rStyle w:val="Hyperlink"/>
@@ -25561,7 +25689,7 @@
       <w:pPr>
         <w:pStyle w:val="BodyText"/>
       </w:pPr>
-      <w:bookmarkStart w:id="101" w:name="eq-bias-variance-tradeoff"/>
+      <w:bookmarkStart w:id="103" w:name="eq-bias-variance-tradeoff"/>
       <m:oMathPara>
         <m:oMathParaPr>
           <m:jc m:val="center"/>
@@ -26058,7 +26186,7 @@
           </m:r>
         </m:oMath>
       </m:oMathPara>
-      <w:bookmarkEnd w:id="101"/>
+      <w:bookmarkEnd w:id="103"/>
     </w:p>
     <w:p>
       <w:pPr>
@@ -26077,8 +26205,8 @@
         <w:t xml:space="preserve">.</w:t>
       </w:r>
     </w:p>
-    <w:bookmarkEnd w:id="102"/>
-    <w:bookmarkStart w:id="103" w:name="rem-overfitting-tradeoff"/>
+    <w:bookmarkEnd w:id="104"/>
+    <w:bookmarkStart w:id="105" w:name="rem-overfitting-tradeoff"/>
     <w:p>
       <w:pPr>
         <w:pStyle w:val="BodyText"/>
@@ -26693,8 +26821,8 @@
         <w:t xml:space="preserve">but predict new observations worse.</w:t>
       </w:r>
     </w:p>
-    <w:bookmarkEnd w:id="103"/>
-    <w:bookmarkStart w:id="104" w:name="rem-overfitting-causes"/>
+    <w:bookmarkEnd w:id="105"/>
+    <w:bookmarkStart w:id="106" w:name="rem-overfitting-causes"/>
     <w:p>
       <w:pPr>
         <w:pStyle w:val="BodyText"/>
@@ -26812,8 +26940,8 @@
         <w:t xml:space="preserve">the degree-4 fit has five coefficients for those 20 cars.</w:t>
       </w:r>
     </w:p>
-    <w:bookmarkEnd w:id="104"/>
-    <w:bookmarkStart w:id="105" w:name="exr-held-out-unbiased"/>
+    <w:bookmarkEnd w:id="106"/>
+    <w:bookmarkStart w:id="107" w:name="exr-held-out-unbiased"/>
     <w:p>
       <w:pPr>
         <w:pStyle w:val="BodyText"/>
@@ -27520,8 +27648,8 @@
         </m:oMath>
       </m:oMathPara>
     </w:p>
-    <w:bookmarkEnd w:id="105"/>
-    <w:bookmarkStart w:id="106" w:name="sol-held-out-unbiased"/>
+    <w:bookmarkEnd w:id="107"/>
+    <w:bookmarkStart w:id="108" w:name="sol-held-out-unbiased"/>
     <w:p>
       <w:pPr>
         <w:pStyle w:val="FirstParagraph"/>
@@ -28809,8 +28937,8 @@
         <w:t xml:space="preserve">.</w:t>
       </w:r>
     </w:p>
-    <w:bookmarkEnd w:id="106"/>
-    <w:bookmarkStart w:id="107" w:name="thm-held-out-unbiased"/>
+    <w:bookmarkEnd w:id="108"/>
+    <w:bookmarkStart w:id="109" w:name="thm-held-out-unbiased"/>
     <w:p>
       <w:pPr>
         <w:pStyle w:val="BodyText"/>
@@ -29510,7 +29638,7 @@
         </m:oMath>
       </m:oMathPara>
     </w:p>
-    <w:bookmarkEnd w:id="107"/>
+    <w:bookmarkEnd w:id="109"/>
     <w:p>
       <w:pPr>
         <w:pStyle w:val="FirstParagraph"/>
@@ -29543,7 +29671,7 @@
         <w:t xml:space="preserve">.</w:t>
       </w:r>
     </w:p>
-    <w:bookmarkStart w:id="108" w:name="rem-training-mse-optimistic"/>
+    <w:bookmarkStart w:id="110" w:name="rem-training-mse-optimistic"/>
     <w:p>
       <w:pPr>
         <w:pStyle w:val="BodyText"/>
@@ -29861,8 +29989,8 @@
         <w:t xml:space="preserve">while held-out RMSE does not.</w:t>
       </w:r>
     </w:p>
-    <w:bookmarkEnd w:id="108"/>
-    <w:bookmarkStart w:id="113" w:name="exm-train-test-error-simulated"/>
+    <w:bookmarkEnd w:id="110"/>
+    <w:bookmarkStart w:id="115" w:name="exm-train-test-error-simulated"/>
     <w:p>
       <w:pPr>
         <w:pStyle w:val="BodyText"/>
@@ -31226,7 +31354,7 @@
       <w:tr>
         <w:tc>
           <w:tcPr/>
-          <w:bookmarkStart w:id="112" w:name="fig-train-test-error"/>
+          <w:bookmarkStart w:id="114" w:name="fig-train-test-error"/>
           <w:p>
             <w:pPr>
               <w:pStyle w:val="SourceCode"/>
@@ -31941,18 +32069,18 @@
                 <wp:inline>
                   <wp:extent cx="4620126" cy="3696101"/>
                   <wp:effectExtent b="0" l="0" r="0" t="0"/>
-                  <wp:docPr descr="" title="" id="110" name="Picture"/>
+                  <wp:docPr descr="" title="" id="112" name="Picture"/>
                   <a:graphic>
                     <a:graphicData uri="http://schemas.openxmlformats.org/drawingml/2006/picture">
                       <pic:pic>
                         <pic:nvPicPr>
-                          <pic:cNvPr descr="model-validation_files/figure-docx/train-test-error-plot-1.png" id="111" name="Picture"/>
+                          <pic:cNvPr descr="model-validation_files/figure-docx/train-test-error-plot-1.png" id="113" name="Picture"/>
                           <pic:cNvPicPr>
                             <a:picLocks noChangeArrowheads="1" noChangeAspect="1"/>
                           </pic:cNvPicPr>
                         </pic:nvPicPr>
                         <pic:blipFill>
-                          <a:blip r:embed="rId109"/>
+                          <a:blip r:embed="rId111"/>
                           <a:stretch>
                             <a:fillRect/>
                           </a:stretch>
@@ -32084,7 +32212,7 @@
               <w:t xml:space="preserve">.</w:t>
             </w:r>
           </w:p>
-          <w:bookmarkEnd w:id="112"/>
+          <w:bookmarkEnd w:id="114"/>
         </w:tc>
       </w:tr>
     </w:tbl>
@@ -32590,9 +32718,9 @@
         <w:t xml:space="preserve">.</w:t>
       </w:r>
     </w:p>
-    <w:bookmarkEnd w:id="113"/>
-    <w:bookmarkEnd w:id="114"/>
-    <w:bookmarkStart w:id="161" w:name="sec-data-splits"/>
+    <w:bookmarkEnd w:id="115"/>
+    <w:bookmarkEnd w:id="116"/>
+    <w:bookmarkStart w:id="163" w:name="sec-data-splits"/>
     <w:p>
       <w:pPr>
         <w:pStyle w:val="Heading2"/>
@@ -32601,7 +32729,7 @@
         <w:t xml:space="preserve">5 Training, validation, and test sets</w:t>
       </w:r>
     </w:p>
-    <w:bookmarkStart w:id="115" w:name="exr-data-splits"/>
+    <w:bookmarkStart w:id="117" w:name="exr-data-splits"/>
     <w:p>
       <w:pPr>
         <w:pStyle w:val="FirstParagraph"/>
@@ -32734,8 +32862,8 @@
         <w:t xml:space="preserve">How many cars are in each set?</w:t>
       </w:r>
     </w:p>
-    <w:bookmarkEnd w:id="115"/>
-    <w:bookmarkStart w:id="116" w:name="sol-data-splits"/>
+    <w:bookmarkEnd w:id="117"/>
+    <w:bookmarkStart w:id="118" w:name="sol-data-splits"/>
     <w:p>
       <w:pPr>
         <w:pStyle w:val="BodyText"/>
@@ -32970,8 +33098,8 @@
         <w:t xml:space="preserve">test cars.</w:t>
       </w:r>
     </w:p>
-    <w:bookmarkEnd w:id="116"/>
-    <w:bookmarkStart w:id="118" w:name="def-data-splits"/>
+    <w:bookmarkEnd w:id="118"/>
+    <w:bookmarkStart w:id="120" w:name="def-data-splits"/>
     <w:p>
       <w:pPr>
         <w:pStyle w:val="BodyText"/>
@@ -33173,7 +33301,7 @@
       <w:pPr>
         <w:pStyle w:val="BodyText"/>
       </w:pPr>
-      <w:bookmarkStart w:id="117" w:name="eq-data-splits"/>
+      <w:bookmarkStart w:id="119" w:name="eq-data-splits"/>
       <m:oMathPara>
         <m:oMathParaPr>
           <m:jc m:val="center"/>
@@ -33627,7 +33755,7 @@
           </m:r>
         </m:oMath>
       </m:oMathPara>
-      <w:bookmarkEnd w:id="117"/>
+      <w:bookmarkEnd w:id="119"/>
     </w:p>
     <w:p>
       <w:pPr>
@@ -33646,8 +33774,8 @@
         <w:t xml:space="preserve">.</w:t>
       </w:r>
     </w:p>
-    <w:bookmarkEnd w:id="118"/>
-    <w:bookmarkStart w:id="119" w:name="exm-data-splits-sizes"/>
+    <w:bookmarkEnd w:id="120"/>
+    <w:bookmarkStart w:id="121" w:name="exm-data-splits-sizes"/>
     <w:p>
       <w:pPr>
         <w:pStyle w:val="BodyText"/>
@@ -33721,8 +33849,8 @@
         <w:t xml:space="preserve">and the 7 test cars are used only once, after the model is chosen.</w:t>
       </w:r>
     </w:p>
-    <w:bookmarkEnd w:id="119"/>
-    <w:bookmarkStart w:id="121" w:name="def-tuning-parameter"/>
+    <w:bookmarkEnd w:id="121"/>
+    <w:bookmarkStart w:id="123" w:name="def-tuning-parameter"/>
     <w:p>
       <w:pPr>
         <w:pStyle w:val="BodyText"/>
@@ -33812,7 +33940,7 @@
       <w:pPr>
         <w:pStyle w:val="BodyText"/>
       </w:pPr>
-      <w:bookmarkStart w:id="120" w:name="eq-tuning-parameter"/>
+      <w:bookmarkStart w:id="122" w:name="eq-tuning-parameter"/>
       <m:oMathPara>
         <m:oMathParaPr>
           <m:jc m:val="center"/>
@@ -33932,10 +34060,10 @@
           </m:r>
         </m:oMath>
       </m:oMathPara>
-      <w:bookmarkEnd w:id="120"/>
+      <w:bookmarkEnd w:id="122"/>
     </w:p>
-    <w:bookmarkEnd w:id="121"/>
-    <w:bookmarkStart w:id="122" w:name="exm-tuning-parameter"/>
+    <w:bookmarkEnd w:id="123"/>
+    <w:bookmarkStart w:id="124" w:name="exm-tuning-parameter"/>
     <w:p>
       <w:pPr>
         <w:pStyle w:val="FirstParagraph"/>
@@ -34120,8 +34248,8 @@
         <w:t xml:space="preserve">.</w:t>
       </w:r>
     </w:p>
-    <w:bookmarkEnd w:id="122"/>
-    <w:bookmarkStart w:id="124" w:name="def-validation-set"/>
+    <w:bookmarkEnd w:id="124"/>
+    <w:bookmarkStart w:id="126" w:name="def-validation-set"/>
     <w:p>
       <w:pPr>
         <w:pStyle w:val="BodyText"/>
@@ -34241,7 +34369,7 @@
       <w:pPr>
         <w:pStyle w:val="BodyText"/>
       </w:pPr>
-      <w:bookmarkStart w:id="123" w:name="eq-validation-set"/>
+      <w:bookmarkStart w:id="125" w:name="eq-validation-set"/>
       <m:oMathPara>
         <m:oMathParaPr>
           <m:jc m:val="center"/>
@@ -34362,10 +34490,10 @@
           </m:r>
         </m:oMath>
       </m:oMathPara>
-      <w:bookmarkEnd w:id="123"/>
+      <w:bookmarkEnd w:id="125"/>
     </w:p>
-    <w:bookmarkEnd w:id="124"/>
-    <w:bookmarkStart w:id="126" w:name="def-validation-error"/>
+    <w:bookmarkEnd w:id="126"/>
+    <w:bookmarkStart w:id="128" w:name="def-validation-error"/>
     <w:p>
       <w:pPr>
         <w:pStyle w:val="FirstParagraph"/>
@@ -34550,7 +34678,7 @@
       <w:pPr>
         <w:pStyle w:val="BodyText"/>
       </w:pPr>
-      <w:bookmarkStart w:id="125" w:name="eq-validation-error"/>
+      <w:bookmarkStart w:id="127" w:name="eq-validation-error"/>
       <m:oMathPara>
         <m:oMathParaPr>
           <m:jc m:val="center"/>
@@ -34725,10 +34853,10 @@
           </m:r>
         </m:oMath>
       </m:oMathPara>
-      <w:bookmarkEnd w:id="125"/>
+      <w:bookmarkEnd w:id="127"/>
     </w:p>
-    <w:bookmarkEnd w:id="126"/>
-    <w:bookmarkStart w:id="128" w:name="def-validation-choice"/>
+    <w:bookmarkEnd w:id="128"/>
+    <w:bookmarkStart w:id="130" w:name="def-validation-choice"/>
     <w:p>
       <w:pPr>
         <w:pStyle w:val="FirstParagraph"/>
@@ -34917,7 +35045,7 @@
       <w:pPr>
         <w:pStyle w:val="BodyText"/>
       </w:pPr>
-      <w:bookmarkStart w:id="127" w:name="eq-validation-choice"/>
+      <w:bookmarkStart w:id="129" w:name="eq-validation-choice"/>
       <m:oMathPara>
         <m:oMathParaPr>
           <m:jc m:val="center"/>
@@ -35188,10 +35316,10 @@
           </m:r>
         </m:oMath>
       </m:oMathPara>
-      <w:bookmarkEnd w:id="127"/>
+      <w:bookmarkEnd w:id="129"/>
     </w:p>
-    <w:bookmarkEnd w:id="128"/>
-    <w:bookmarkStart w:id="130" w:name="def-test-set"/>
+    <w:bookmarkEnd w:id="130"/>
+    <w:bookmarkStart w:id="132" w:name="def-test-set"/>
     <w:p>
       <w:pPr>
         <w:pStyle w:val="FirstParagraph"/>
@@ -35335,7 +35463,7 @@
       <w:pPr>
         <w:pStyle w:val="BodyText"/>
       </w:pPr>
-      <w:bookmarkStart w:id="129" w:name="eq-test-set"/>
+      <w:bookmarkStart w:id="131" w:name="eq-test-set"/>
       <m:oMathPara>
         <m:oMathParaPr>
           <m:jc m:val="center"/>
@@ -35456,10 +35584,10 @@
           </m:r>
         </m:oMath>
       </m:oMathPara>
-      <w:bookmarkEnd w:id="129"/>
+      <w:bookmarkEnd w:id="131"/>
     </w:p>
-    <w:bookmarkEnd w:id="130"/>
-    <w:bookmarkStart w:id="132" w:name="def-test-error"/>
+    <w:bookmarkEnd w:id="132"/>
+    <w:bookmarkStart w:id="134" w:name="def-test-error"/>
     <w:p>
       <w:pPr>
         <w:pStyle w:val="FirstParagraph"/>
@@ -35644,7 +35772,7 @@
       <w:pPr>
         <w:pStyle w:val="BodyText"/>
       </w:pPr>
-      <w:bookmarkStart w:id="131" w:name="eq-test-error"/>
+      <w:bookmarkStart w:id="133" w:name="eq-test-error"/>
       <m:oMathPara>
         <m:oMathParaPr>
           <m:jc m:val="center"/>
@@ -35819,10 +35947,10 @@
           </m:r>
         </m:oMath>
       </m:oMathPara>
-      <w:bookmarkEnd w:id="131"/>
+      <w:bookmarkEnd w:id="133"/>
     </w:p>
-    <w:bookmarkEnd w:id="132"/>
-    <w:bookmarkStart w:id="136" w:name="rem-data-splits"/>
+    <w:bookmarkEnd w:id="134"/>
+    <w:bookmarkStart w:id="138" w:name="rem-data-splits"/>
     <w:p>
       <w:pPr>
         <w:pStyle w:val="FirstParagraph"/>
@@ -35997,7 +36125,7 @@
       <w:r>
         <w:t xml:space="preserve"> </w:t>
       </w:r>
-      <w:hyperlink r:id="rId133">
+      <w:hyperlink r:id="rId135">
         <w:r>
           <w:rPr>
             <w:rStyle w:val="Hyperlink"/>
@@ -36017,7 +36145,7 @@
       <w:r>
         <w:t xml:space="preserve"> </w:t>
       </w:r>
-      <w:hyperlink r:id="rId134">
+      <w:hyperlink r:id="rId136">
         <w:r>
           <w:rPr>
             <w:rStyle w:val="Hyperlink"/>
@@ -36037,7 +36165,7 @@
       <w:r>
         <w:t xml:space="preserve"> </w:t>
       </w:r>
-      <w:hyperlink r:id="rId135">
+      <w:hyperlink r:id="rId137">
         <w:r>
           <w:rPr>
             <w:rStyle w:val="Hyperlink"/>
@@ -36055,8 +36183,8 @@
         <w:t xml:space="preserve">They use a different symbol for the training set and a parenthesized observation index, but the same three-way split.</w:t>
       </w:r>
     </w:p>
-    <w:bookmarkEnd w:id="136"/>
-    <w:bookmarkStart w:id="137" w:name="rem-validation-test-error"/>
+    <w:bookmarkEnd w:id="138"/>
+    <w:bookmarkStart w:id="139" w:name="rem-validation-test-error"/>
     <w:p>
       <w:pPr>
         <w:pStyle w:val="BodyText"/>
@@ -36280,8 +36408,8 @@
         <w:t xml:space="preserve">under absolute-error loss, they are mean absolute errors.</w:t>
       </w:r>
     </w:p>
-    <w:bookmarkEnd w:id="137"/>
-    <w:bookmarkStart w:id="160" w:name="exm-train-validation-test-split"/>
+    <w:bookmarkEnd w:id="139"/>
+    <w:bookmarkStart w:id="162" w:name="exm-train-validation-test-split"/>
     <w:p>
       <w:pPr>
         <w:pStyle w:val="BodyText"/>
@@ -36515,7 +36643,7 @@
       <w:tr>
         <w:tc>
           <w:tcPr/>
-          <w:bookmarkStart w:id="138" w:name="tbl-train-validation-test-split-sizes"/>
+          <w:bookmarkStart w:id="140" w:name="tbl-train-validation-test-split-sizes"/>
           <w:p>
             <w:pPr>
               <w:jc w:val="center"/>
@@ -37147,7 +37275,7 @@
               <w:t xml:space="preserve">#&gt; 3 test           7</w:t>
             </w:r>
           </w:p>
-          <w:bookmarkEnd w:id="138"/>
+          <w:bookmarkEnd w:id="140"/>
         </w:tc>
       </w:tr>
     </w:tbl>
@@ -41005,7 +41133,7 @@
       <w:tr>
         <w:tc>
           <w:tcPr/>
-          <w:bookmarkStart w:id="142" w:name="fig-linear-model-superimposed"/>
+          <w:bookmarkStart w:id="144" w:name="fig-linear-model-superimposed"/>
           <w:p>
             <w:pPr>
               <w:pStyle w:val="SourceCode"/>
@@ -41045,18 +41173,18 @@
                 <wp:inline>
                   <wp:extent cx="4620126" cy="3696101"/>
                   <wp:effectExtent b="0" l="0" r="0" t="0"/>
-                  <wp:docPr descr="" title="" id="140" name="Picture"/>
+                  <wp:docPr descr="" title="" id="142" name="Picture"/>
                   <a:graphic>
                     <a:graphicData uri="http://schemas.openxmlformats.org/drawingml/2006/picture">
                       <pic:pic>
                         <pic:nvPicPr>
-                          <pic:cNvPr descr="model-validation_files/figure-docx/unnamed-chunk-3-1.png" id="141" name="Picture"/>
+                          <pic:cNvPr descr="model-validation_files/figure-docx/unnamed-chunk-3-1.png" id="143" name="Picture"/>
                           <pic:cNvPicPr>
                             <a:picLocks noChangeArrowheads="1" noChangeAspect="1"/>
                           </pic:cNvPicPr>
                         </pic:nvPicPr>
                         <pic:blipFill>
-                          <a:blip r:embed="rId139"/>
+                          <a:blip r:embed="rId141"/>
                           <a:stretch>
                             <a:fillRect/>
                           </a:stretch>
@@ -41096,7 +41224,7 @@
               <w:t xml:space="preserve">Figure 2: Linear model fit superimposed on data partitions</w:t>
             </w:r>
           </w:p>
-          <w:bookmarkEnd w:id="142"/>
+          <w:bookmarkEnd w:id="144"/>
         </w:tc>
       </w:tr>
     </w:tbl>
@@ -41121,7 +41249,7 @@
       <w:tr>
         <w:tc>
           <w:tcPr/>
-          <w:bookmarkStart w:id="146" w:name="fig-quadratic-model-superimposed"/>
+          <w:bookmarkStart w:id="148" w:name="fig-quadratic-model-superimposed"/>
           <w:p>
             <w:pPr>
               <w:pStyle w:val="SourceCode"/>
@@ -41161,18 +41289,18 @@
                 <wp:inline>
                   <wp:extent cx="4620126" cy="3696101"/>
                   <wp:effectExtent b="0" l="0" r="0" t="0"/>
-                  <wp:docPr descr="" title="" id="144" name="Picture"/>
+                  <wp:docPr descr="" title="" id="146" name="Picture"/>
                   <a:graphic>
                     <a:graphicData uri="http://schemas.openxmlformats.org/drawingml/2006/picture">
                       <pic:pic>
                         <pic:nvPicPr>
-                          <pic:cNvPr descr="model-validation_files/figure-docx/unnamed-chunk-4-1.png" id="145" name="Picture"/>
+                          <pic:cNvPr descr="model-validation_files/figure-docx/unnamed-chunk-4-1.png" id="147" name="Picture"/>
                           <pic:cNvPicPr>
                             <a:picLocks noChangeArrowheads="1" noChangeAspect="1"/>
                           </pic:cNvPicPr>
                         </pic:nvPicPr>
                         <pic:blipFill>
-                          <a:blip r:embed="rId143"/>
+                          <a:blip r:embed="rId145"/>
                           <a:stretch>
                             <a:fillRect/>
                           </a:stretch>
@@ -41212,7 +41340,7 @@
               <w:t xml:space="preserve">Figure 3: Quadratic model fit superimposed on data partitions</w:t>
             </w:r>
           </w:p>
-          <w:bookmarkEnd w:id="146"/>
+          <w:bookmarkEnd w:id="148"/>
         </w:tc>
       </w:tr>
     </w:tbl>
@@ -41237,7 +41365,7 @@
       <w:tr>
         <w:tc>
           <w:tcPr/>
-          <w:bookmarkStart w:id="150" w:name="fig-cubic-model-superimposed"/>
+          <w:bookmarkStart w:id="152" w:name="fig-cubic-model-superimposed"/>
           <w:p>
             <w:pPr>
               <w:pStyle w:val="SourceCode"/>
@@ -41277,18 +41405,18 @@
                 <wp:inline>
                   <wp:extent cx="4620126" cy="3696101"/>
                   <wp:effectExtent b="0" l="0" r="0" t="0"/>
-                  <wp:docPr descr="" title="" id="148" name="Picture"/>
+                  <wp:docPr descr="" title="" id="150" name="Picture"/>
                   <a:graphic>
                     <a:graphicData uri="http://schemas.openxmlformats.org/drawingml/2006/picture">
                       <pic:pic>
                         <pic:nvPicPr>
-                          <pic:cNvPr descr="model-validation_files/figure-docx/unnamed-chunk-5-1.png" id="149" name="Picture"/>
+                          <pic:cNvPr descr="model-validation_files/figure-docx/unnamed-chunk-5-1.png" id="151" name="Picture"/>
                           <pic:cNvPicPr>
                             <a:picLocks noChangeArrowheads="1" noChangeAspect="1"/>
                           </pic:cNvPicPr>
                         </pic:nvPicPr>
                         <pic:blipFill>
-                          <a:blip r:embed="rId147"/>
+                          <a:blip r:embed="rId149"/>
                           <a:stretch>
                             <a:fillRect/>
                           </a:stretch>
@@ -41328,7 +41456,7 @@
               <w:t xml:space="preserve">Figure 4: Cubic model fit superimposed on data partitions</w:t>
             </w:r>
           </w:p>
-          <w:bookmarkEnd w:id="150"/>
+          <w:bookmarkEnd w:id="152"/>
         </w:tc>
       </w:tr>
     </w:tbl>
@@ -41353,7 +41481,7 @@
       <w:tr>
         <w:tc>
           <w:tcPr/>
-          <w:bookmarkStart w:id="154" w:name="fig-quartic-model-superimposed"/>
+          <w:bookmarkStart w:id="156" w:name="fig-quartic-model-superimposed"/>
           <w:p>
             <w:pPr>
               <w:pStyle w:val="SourceCode"/>
@@ -41393,18 +41521,18 @@
                 <wp:inline>
                   <wp:extent cx="4620126" cy="3696101"/>
                   <wp:effectExtent b="0" l="0" r="0" t="0"/>
-                  <wp:docPr descr="" title="" id="152" name="Picture"/>
+                  <wp:docPr descr="" title="" id="154" name="Picture"/>
                   <a:graphic>
                     <a:graphicData uri="http://schemas.openxmlformats.org/drawingml/2006/picture">
                       <pic:pic>
                         <pic:nvPicPr>
-                          <pic:cNvPr descr="model-validation_files/figure-docx/unnamed-chunk-6-1.png" id="153" name="Picture"/>
+                          <pic:cNvPr descr="model-validation_files/figure-docx/unnamed-chunk-6-1.png" id="155" name="Picture"/>
                           <pic:cNvPicPr>
                             <a:picLocks noChangeArrowheads="1" noChangeAspect="1"/>
                           </pic:cNvPicPr>
                         </pic:nvPicPr>
                         <pic:blipFill>
-                          <a:blip r:embed="rId151"/>
+                          <a:blip r:embed="rId153"/>
                           <a:stretch>
                             <a:fillRect/>
                           </a:stretch>
@@ -41444,7 +41572,7 @@
               <w:t xml:space="preserve">Figure 5: Quartic model fit superimposed on data partitions</w:t>
             </w:r>
           </w:p>
-          <w:bookmarkEnd w:id="154"/>
+          <w:bookmarkEnd w:id="156"/>
         </w:tc>
       </w:tr>
     </w:tbl>
@@ -41469,7 +41597,7 @@
       <w:tr>
         <w:tc>
           <w:tcPr/>
-          <w:bookmarkStart w:id="155" w:name="tbl-train-validation-results"/>
+          <w:bookmarkStart w:id="157" w:name="tbl-train-validation-results"/>
           <w:p>
             <w:pPr>
               <w:jc w:val="center"/>
@@ -41558,7 +41686,7 @@
               <w:t xml:space="preserve">#&gt; 4 quartic            1.90            3.97</w:t>
             </w:r>
           </w:p>
-          <w:bookmarkEnd w:id="155"/>
+          <w:bookmarkEnd w:id="157"/>
         </w:tc>
       </w:tr>
     </w:tbl>
@@ -41627,7 +41755,7 @@
       <w:tr>
         <w:tc>
           <w:tcPr/>
-          <w:bookmarkStart w:id="156" w:name="tbl-train-validation-test-rmse"/>
+          <w:bookmarkStart w:id="158" w:name="tbl-train-validation-test-rmse"/>
           <w:p>
             <w:pPr>
               <w:jc w:val="center"/>
@@ -41704,7 +41832,7 @@
               <w:t xml:space="preserve">#&gt; 2 test       linear  2.44</w:t>
             </w:r>
           </w:p>
-          <w:bookmarkEnd w:id="156"/>
+          <w:bookmarkEnd w:id="158"/>
         </w:tc>
       </w:tr>
     </w:tbl>
@@ -41757,18 +41885,18 @@
                 <wp:inline>
                   <wp:extent cx="152400" cy="152400"/>
                   <wp:effectExtent b="0" l="0" r="0" t="0"/>
-                  <wp:docPr descr="" title="" id="158" name="Picture"/>
+                  <wp:docPr descr="" title="" id="160" name="Picture"/>
                   <a:graphic>
                     <a:graphicData uri="http://schemas.openxmlformats.org/drawingml/2006/picture">
                       <pic:pic>
                         <pic:nvPicPr>
-                          <pic:cNvPr descr="/opt/quarto/share/formats/docx/note.png" id="159" name="Picture"/>
+                          <pic:cNvPr descr="/opt/quarto/share/formats/docx/note.png" id="161" name="Picture"/>
                           <pic:cNvPicPr>
                             <a:picLocks noChangeArrowheads="1" noChangeAspect="1"/>
                           </pic:cNvPicPr>
                         </pic:nvPicPr>
                         <pic:blipFill>
-                          <a:blip r:embed="rId157"/>
+                          <a:blip r:embed="rId159"/>
                           <a:stretch>
                             <a:fillRect/>
                           </a:stretch>
@@ -41841,9 +41969,9 @@
         </w:tc>
       </w:tr>
     </w:tbl>
-    <w:bookmarkEnd w:id="160"/>
-    <w:bookmarkEnd w:id="161"/>
-    <w:bookmarkStart w:id="197" w:name="sec-kfold"/>
+    <w:bookmarkEnd w:id="162"/>
+    <w:bookmarkEnd w:id="163"/>
+    <w:bookmarkStart w:id="199" w:name="sec-kfold"/>
     <w:p>
       <w:pPr>
         <w:pStyle w:val="Heading2"/>
@@ -41863,7 +41991,7 @@
         <w:t xml:space="preserve">-fold cross-validation</w:t>
       </w:r>
     </w:p>
-    <w:bookmarkStart w:id="162" w:name="exr-kfold"/>
+    <w:bookmarkStart w:id="164" w:name="exr-kfold"/>
     <w:p>
       <w:pPr>
         <w:pStyle w:val="FirstParagraph"/>
@@ -42014,8 +42142,8 @@
         <w:t xml:space="preserve">How many times is a given car used for fitting, and how many times for prediction?</w:t>
       </w:r>
     </w:p>
-    <w:bookmarkEnd w:id="162"/>
-    <w:bookmarkStart w:id="163" w:name="sol-kfold"/>
+    <w:bookmarkEnd w:id="164"/>
+    <w:bookmarkStart w:id="165" w:name="sol-kfold"/>
     <w:p>
       <w:pPr>
         <w:pStyle w:val="FirstParagraph"/>
@@ -42189,8 +42317,8 @@
         <w:t xml:space="preserve">fits.</w:t>
       </w:r>
     </w:p>
-    <w:bookmarkEnd w:id="163"/>
-    <w:bookmarkStart w:id="165" w:name="def-folds"/>
+    <w:bookmarkEnd w:id="165"/>
+    <w:bookmarkStart w:id="167" w:name="def-folds"/>
     <w:p>
       <w:pPr>
         <w:pStyle w:val="FirstParagraph"/>
@@ -42379,7 +42507,7 @@
       <w:pPr>
         <w:pStyle w:val="BodyText"/>
       </w:pPr>
-      <w:bookmarkStart w:id="164" w:name="eq-folds"/>
+      <w:bookmarkStart w:id="166" w:name="eq-folds"/>
       <m:oMathPara>
         <m:oMathParaPr>
           <m:jc m:val="center"/>
@@ -42470,10 +42598,10 @@
           </m:r>
         </m:oMath>
       </m:oMathPara>
-      <w:bookmarkEnd w:id="164"/>
+      <w:bookmarkEnd w:id="166"/>
     </w:p>
-    <w:bookmarkEnd w:id="165"/>
-    <w:bookmarkStart w:id="166" w:name="rem-source-folds"/>
+    <w:bookmarkEnd w:id="167"/>
+    <w:bookmarkStart w:id="168" w:name="rem-source-folds"/>
     <w:p>
       <w:pPr>
         <w:pStyle w:val="FirstParagraph"/>
@@ -42527,8 +42655,8 @@
         <w:t xml:space="preserve">roughly equal-sized parts.</w:t>
       </w:r>
     </w:p>
-    <w:bookmarkEnd w:id="166"/>
-    <w:bookmarkStart w:id="168" w:name="def-fold-size"/>
+    <w:bookmarkEnd w:id="168"/>
+    <w:bookmarkStart w:id="170" w:name="def-fold-size"/>
     <w:p>
       <w:pPr>
         <w:pStyle w:val="BodyText"/>
@@ -42622,7 +42750,7 @@
       <w:pPr>
         <w:pStyle w:val="BodyText"/>
       </w:pPr>
-      <w:bookmarkStart w:id="167" w:name="eq-fold-size"/>
+      <w:bookmarkStart w:id="169" w:name="eq-fold-size"/>
       <m:oMathPara>
         <m:oMathParaPr>
           <m:jc m:val="center"/>
@@ -42717,10 +42845,10 @@
           </m:r>
         </m:oMath>
       </m:oMathPara>
-      <w:bookmarkEnd w:id="167"/>
+      <w:bookmarkEnd w:id="169"/>
     </w:p>
-    <w:bookmarkEnd w:id="168"/>
-    <w:bookmarkStart w:id="170" w:name="def-fold-assignment"/>
+    <w:bookmarkEnd w:id="170"/>
+    <w:bookmarkStart w:id="172" w:name="def-fold-assignment"/>
     <w:p>
       <w:pPr>
         <w:pStyle w:val="FirstParagraph"/>
@@ -42875,7 +43003,7 @@
       <w:pPr>
         <w:pStyle w:val="BodyText"/>
       </w:pPr>
-      <w:bookmarkStart w:id="169" w:name="eq-fold-assignment"/>
+      <w:bookmarkStart w:id="171" w:name="eq-fold-assignment"/>
       <m:oMathPara>
         <m:oMathParaPr>
           <m:jc m:val="center"/>
@@ -42951,10 +43079,10 @@
           </m:r>
         </m:oMath>
       </m:oMathPara>
-      <w:bookmarkEnd w:id="169"/>
+      <w:bookmarkEnd w:id="171"/>
     </w:p>
-    <w:bookmarkEnd w:id="170"/>
-    <w:bookmarkStart w:id="171" w:name="rem-source-fold-assignment"/>
+    <w:bookmarkEnd w:id="172"/>
+    <w:bookmarkStart w:id="173" w:name="rem-source-fold-assignment"/>
     <w:p>
       <w:pPr>
         <w:pStyle w:val="FirstParagraph"/>
@@ -43015,8 +43143,8 @@
         <w:t xml:space="preserve">.</w:t>
       </w:r>
     </w:p>
-    <w:bookmarkEnd w:id="171"/>
-    <w:bookmarkStart w:id="173" w:name="def-fold-out-rule"/>
+    <w:bookmarkEnd w:id="173"/>
+    <w:bookmarkStart w:id="175" w:name="def-fold-out-rule"/>
     <w:p>
       <w:pPr>
         <w:pStyle w:val="BodyText"/>
@@ -43208,7 +43336,7 @@
       <w:pPr>
         <w:pStyle w:val="BodyText"/>
       </w:pPr>
-      <w:bookmarkStart w:id="172" w:name="eq-fold-out-rule"/>
+      <w:bookmarkStart w:id="174" w:name="eq-fold-out-rule"/>
       <m:oMathPara>
         <m:oMathParaPr>
           <m:jc m:val="center"/>
@@ -43441,10 +43569,10 @@
           </m:r>
         </m:oMath>
       </m:oMathPara>
-      <w:bookmarkEnd w:id="172"/>
+      <w:bookmarkEnd w:id="174"/>
     </w:p>
-    <w:bookmarkEnd w:id="173"/>
-    <w:bookmarkStart w:id="174" w:name="rem-source-fold-out-rule"/>
+    <w:bookmarkEnd w:id="175"/>
+    <w:bookmarkStart w:id="176" w:name="rem-source-fold-out-rule"/>
     <w:p>
       <w:pPr>
         <w:pStyle w:val="FirstParagraph"/>
@@ -43516,8 +43644,8 @@
         <w:t xml:space="preserve">.</w:t>
       </w:r>
     </w:p>
-    <w:bookmarkEnd w:id="174"/>
-    <w:bookmarkStart w:id="175" w:name="def-kfold"/>
+    <w:bookmarkEnd w:id="176"/>
+    <w:bookmarkStart w:id="177" w:name="def-kfold"/>
     <w:p>
       <w:pPr>
         <w:pStyle w:val="BodyText"/>
@@ -43864,8 +43992,8 @@
         <w:t xml:space="preserve">Compute a summary prediction-error measure across all folds.</w:t>
       </w:r>
     </w:p>
-    <w:bookmarkEnd w:id="175"/>
-    <w:bookmarkStart w:id="176" w:name="rem-kfold-vs-validation-set"/>
+    <w:bookmarkEnd w:id="177"/>
+    <w:bookmarkStart w:id="178" w:name="rem-kfold-vs-validation-set"/>
     <w:p>
       <w:pPr>
         <w:pStyle w:val="FirstParagraph"/>
@@ -43967,8 +44095,8 @@
         <w:t xml:space="preserve">give 4 fits on 24 cars each.</w:t>
       </w:r>
     </w:p>
-    <w:bookmarkEnd w:id="176"/>
-    <w:bookmarkStart w:id="178" w:name="def-cv-estimate"/>
+    <w:bookmarkEnd w:id="178"/>
+    <w:bookmarkStart w:id="180" w:name="def-cv-estimate"/>
     <w:p>
       <w:pPr>
         <w:pStyle w:val="BodyText"/>
@@ -44056,7 +44184,7 @@
       <w:r>
         <w:t xml:space="preserve"> </w:t>
       </w:r>
-      <w:hyperlink r:id="rId41">
+      <w:hyperlink r:id="rId43">
         <w:r>
           <w:rPr>
             <w:rStyle w:val="Hyperlink"/>
@@ -44184,7 +44312,7 @@
       <w:pPr>
         <w:pStyle w:val="BodyText"/>
       </w:pPr>
-      <w:bookmarkStart w:id="177" w:name="eq-cv-estimate"/>
+      <w:bookmarkStart w:id="179" w:name="eq-cv-estimate"/>
       <m:oMathPara>
         <m:oMathParaPr>
           <m:jc m:val="center"/>
@@ -44447,10 +44575,10 @@
           </m:r>
         </m:oMath>
       </m:oMathPara>
-      <w:bookmarkEnd w:id="177"/>
+      <w:bookmarkEnd w:id="179"/>
     </w:p>
-    <w:bookmarkEnd w:id="178"/>
-    <w:bookmarkStart w:id="179" w:name="rem-source-cv-estimate"/>
+    <w:bookmarkEnd w:id="180"/>
+    <w:bookmarkStart w:id="181" w:name="rem-source-cv-estimate"/>
     <w:p>
       <w:pPr>
         <w:pStyle w:val="FirstParagraph"/>
@@ -44502,8 +44630,8 @@
         <w:t xml:space="preserve">.</w:t>
       </w:r>
     </w:p>
-    <w:bookmarkEnd w:id="179"/>
-    <w:bookmarkStart w:id="180" w:name="exr-cv-estimate-by-fold"/>
+    <w:bookmarkEnd w:id="181"/>
+    <w:bookmarkStart w:id="182" w:name="exr-cv-estimate-by-fold"/>
     <w:p>
       <w:pPr>
         <w:pStyle w:val="BodyText"/>
@@ -44708,8 +44836,8 @@
         <w:t xml:space="preserve">.</w:t>
       </w:r>
     </w:p>
-    <w:bookmarkEnd w:id="180"/>
-    <w:bookmarkStart w:id="181" w:name="sol-cv-estimate-by-fold"/>
+    <w:bookmarkEnd w:id="182"/>
+    <w:bookmarkStart w:id="183" w:name="sol-cv-estimate-by-fold"/>
     <w:p>
       <w:pPr>
         <w:pStyle w:val="BodyText"/>
@@ -45870,8 +45998,8 @@
         <w:t xml:space="preserve">so each inner sum uses a single fitted rule.</w:t>
       </w:r>
     </w:p>
-    <w:bookmarkEnd w:id="181"/>
-    <w:bookmarkStart w:id="183" w:name="thm-cv-estimate-by-fold"/>
+    <w:bookmarkEnd w:id="183"/>
+    <w:bookmarkStart w:id="185" w:name="thm-cv-estimate-by-fold"/>
     <w:p>
       <w:pPr>
         <w:pStyle w:val="BodyText"/>
@@ -45960,7 +46088,7 @@
       <w:pPr>
         <w:pStyle w:val="BodyText"/>
       </w:pPr>
-      <w:bookmarkStart w:id="182" w:name="eq-cv-estimate-by-fold"/>
+      <w:bookmarkStart w:id="184" w:name="eq-cv-estimate-by-fold"/>
       <m:oMathPara>
         <m:oMathParaPr>
           <m:jc m:val="center"/>
@@ -46233,9 +46361,9 @@
           </m:r>
         </m:oMath>
       </m:oMathPara>
-      <w:bookmarkEnd w:id="182"/>
+      <w:bookmarkEnd w:id="184"/>
     </w:p>
-    <w:bookmarkEnd w:id="183"/>
+    <w:bookmarkEnd w:id="185"/>
     <w:p>
       <w:pPr>
         <w:pStyle w:val="FirstParagraph"/>
@@ -46268,7 +46396,7 @@
         <w:t xml:space="preserve">.</w:t>
       </w:r>
     </w:p>
-    <w:bookmarkStart w:id="185" w:name="def-fold-mse"/>
+    <w:bookmarkStart w:id="187" w:name="def-fold-mse"/>
     <w:p>
       <w:pPr>
         <w:pStyle w:val="BodyText"/>
@@ -46363,7 +46491,7 @@
       <w:r>
         <w:t xml:space="preserve"> </w:t>
       </w:r>
-      <w:hyperlink r:id="rId41">
+      <w:hyperlink r:id="rId43">
         <w:r>
           <w:rPr>
             <w:rStyle w:val="Hyperlink"/>
@@ -46436,7 +46564,7 @@
       <w:pPr>
         <w:pStyle w:val="BodyText"/>
       </w:pPr>
-      <w:bookmarkStart w:id="184" w:name="eq-fold-mse"/>
+      <w:bookmarkStart w:id="186" w:name="eq-fold-mse"/>
       <m:oMathPara>
         <m:oMathParaPr>
           <m:jc m:val="center"/>
@@ -46676,10 +46804,10 @@
           </m:r>
         </m:oMath>
       </m:oMathPara>
-      <w:bookmarkEnd w:id="184"/>
+      <w:bookmarkEnd w:id="186"/>
     </w:p>
-    <w:bookmarkEnd w:id="185"/>
-    <w:bookmarkStart w:id="186" w:name="rem-source-fold-mse"/>
+    <w:bookmarkEnd w:id="187"/>
+    <w:bookmarkStart w:id="188" w:name="rem-source-fold-mse"/>
     <w:p>
       <w:pPr>
         <w:pStyle w:val="FirstParagraph"/>
@@ -46759,8 +46887,8 @@
         <w:t xml:space="preserve">.</w:t>
       </w:r>
     </w:p>
-    <w:bookmarkEnd w:id="186"/>
-    <w:bookmarkStart w:id="187" w:name="rem-cv-estimate"/>
+    <w:bookmarkEnd w:id="188"/>
+    <w:bookmarkStart w:id="189" w:name="rem-cv-estimate"/>
     <w:p>
       <w:pPr>
         <w:pStyle w:val="BodyText"/>
@@ -47439,8 +47567,8 @@
         <w:t xml:space="preserve">use.</w:t>
       </w:r>
     </w:p>
-    <w:bookmarkEnd w:id="187"/>
-    <w:bookmarkStart w:id="188" w:name="rem-choosing-k"/>
+    <w:bookmarkEnd w:id="189"/>
+    <w:bookmarkStart w:id="190" w:name="rem-choosing-k"/>
     <w:p>
       <w:pPr>
         <w:pStyle w:val="BodyText"/>
@@ -47847,8 +47975,8 @@
         <w:t xml:space="preserve">is the usual compromise.</w:t>
       </w:r>
     </w:p>
-    <w:bookmarkEnd w:id="188"/>
-    <w:bookmarkStart w:id="193" w:name="exm-kfold-simulated"/>
+    <w:bookmarkEnd w:id="190"/>
+    <w:bookmarkStart w:id="195" w:name="exm-kfold-simulated"/>
     <w:p>
       <w:pPr>
         <w:pStyle w:val="BodyText"/>
@@ -49080,7 +49208,7 @@
       <w:tr>
         <w:tc>
           <w:tcPr/>
-          <w:bookmarkStart w:id="192" w:name="fig-cv-simulated"/>
+          <w:bookmarkStart w:id="194" w:name="fig-cv-simulated"/>
           <w:p>
             <w:pPr>
               <w:pStyle w:val="SourceCode"/>
@@ -50026,18 +50154,18 @@
                 <wp:inline>
                   <wp:extent cx="4620126" cy="3696101"/>
                   <wp:effectExtent b="0" l="0" r="0" t="0"/>
-                  <wp:docPr descr="" title="" id="190" name="Picture"/>
+                  <wp:docPr descr="" title="" id="192" name="Picture"/>
                   <a:graphic>
                     <a:graphicData uri="http://schemas.openxmlformats.org/drawingml/2006/picture">
                       <pic:pic>
                         <pic:nvPicPr>
-                          <pic:cNvPr descr="model-validation_files/figure-docx/cv-simulated-plot-1.png" id="191" name="Picture"/>
+                          <pic:cNvPr descr="model-validation_files/figure-docx/cv-simulated-plot-1.png" id="193" name="Picture"/>
                           <pic:cNvPicPr>
                             <a:picLocks noChangeArrowheads="1" noChangeAspect="1"/>
                           </pic:cNvPicPr>
                         </pic:nvPicPr>
                         <pic:blipFill>
-                          <a:blip r:embed="rId189"/>
+                          <a:blip r:embed="rId191"/>
                           <a:stretch>
                             <a:fillRect/>
                           </a:stretch>
@@ -50106,7 +50234,7 @@
               <w:t xml:space="preserve">could be computed from real data.</w:t>
             </w:r>
           </w:p>
-          <w:bookmarkEnd w:id="192"/>
+          <w:bookmarkEnd w:id="194"/>
         </w:tc>
       </w:tr>
     </w:tbl>
@@ -52007,8 +52135,8 @@
         <w:t xml:space="preserve">new ones.</w:t>
       </w:r>
     </w:p>
-    <w:bookmarkEnd w:id="193"/>
-    <w:bookmarkStart w:id="196" w:name="exm-kfold-mtcars"/>
+    <w:bookmarkEnd w:id="195"/>
+    <w:bookmarkStart w:id="198" w:name="exm-kfold-mtcars"/>
     <w:p>
       <w:pPr>
         <w:pStyle w:val="BodyText"/>
@@ -52211,7 +52339,7 @@
       <w:tr>
         <w:tc>
           <w:tcPr/>
-          <w:bookmarkStart w:id="194" w:name="tbl-cv-mtcars-repeats"/>
+          <w:bookmarkStart w:id="196" w:name="tbl-cv-mtcars-repeats"/>
           <w:p>
             <w:pPr>
               <w:jc w:val="center"/>
@@ -52867,7 +52995,7 @@
               <w:t xml:space="preserve">#&gt; 5         5     3.38     2.74     2.78     2.81</w:t>
             </w:r>
           </w:p>
-          <w:bookmarkEnd w:id="194"/>
+          <w:bookmarkEnd w:id="196"/>
         </w:tc>
       </w:tr>
     </w:tbl>
@@ -52892,7 +53020,7 @@
       <w:tr>
         <w:tc>
           <w:tcPr/>
-          <w:bookmarkStart w:id="195" w:name="tbl-cv-mtcars"/>
+          <w:bookmarkStart w:id="197" w:name="tbl-cv-mtcars"/>
           <w:p>
             <w:pPr>
               <w:jc w:val="center"/>
@@ -53248,7 +53376,7 @@
               <w:t xml:space="preserve">#&gt; 5         5 2       2.74</w:t>
             </w:r>
           </w:p>
-          <w:bookmarkEnd w:id="195"/>
+          <w:bookmarkEnd w:id="197"/>
         </w:tc>
       </w:tr>
     </w:tbl>
@@ -53938,9 +54066,9 @@
         <w:t xml:space="preserve">may not survive a different split.</w:t>
       </w:r>
     </w:p>
-    <w:bookmarkEnd w:id="196"/>
-    <w:bookmarkEnd w:id="197"/>
-    <w:bookmarkStart w:id="225" w:name="sec-loocv"/>
+    <w:bookmarkEnd w:id="198"/>
+    <w:bookmarkEnd w:id="199"/>
+    <w:bookmarkStart w:id="227" w:name="sec-loocv"/>
     <w:p>
       <w:pPr>
         <w:pStyle w:val="Heading2"/>
@@ -53949,7 +54077,7 @@
         <w:t xml:space="preserve">7 Leave-one-out cross-validation</w:t>
       </w:r>
     </w:p>
-    <w:bookmarkStart w:id="198" w:name="exr-loocv"/>
+    <w:bookmarkStart w:id="200" w:name="exr-loocv"/>
     <w:p>
       <w:pPr>
         <w:pStyle w:val="FirstParagraph"/>
@@ -54159,8 +54287,8 @@
         <w:t xml:space="preserve">) differ?</w:t>
       </w:r>
     </w:p>
-    <w:bookmarkEnd w:id="198"/>
-    <w:bookmarkStart w:id="199" w:name="sol-loocv"/>
+    <w:bookmarkEnd w:id="200"/>
+    <w:bookmarkStart w:id="201" w:name="sol-loocv"/>
     <w:p>
       <w:pPr>
         <w:pStyle w:val="FirstParagraph"/>
@@ -54357,8 +54485,8 @@
         <w:t xml:space="preserve">the estimate is not random.</w:t>
       </w:r>
     </w:p>
-    <w:bookmarkEnd w:id="199"/>
-    <w:bookmarkStart w:id="201" w:name="def-loocv"/>
+    <w:bookmarkEnd w:id="201"/>
+    <w:bookmarkStart w:id="203" w:name="def-loocv"/>
     <w:p>
       <w:pPr>
         <w:pStyle w:val="FirstParagraph"/>
@@ -54666,7 +54794,7 @@
       <w:pPr>
         <w:pStyle w:val="BodyText"/>
       </w:pPr>
-      <w:bookmarkStart w:id="200" w:name="eq-loocv"/>
+      <w:bookmarkStart w:id="202" w:name="eq-loocv"/>
       <m:oMathPara>
         <m:oMathParaPr>
           <m:jc m:val="center"/>
@@ -54916,7 +55044,7 @@
           </m:r>
         </m:oMath>
       </m:oMathPara>
-      <w:bookmarkEnd w:id="200"/>
+      <w:bookmarkEnd w:id="202"/>
     </w:p>
     <w:p>
       <w:pPr>
@@ -54935,8 +55063,8 @@
         <w:t xml:space="preserve">.</w:t>
       </w:r>
     </w:p>
-    <w:bookmarkEnd w:id="201"/>
-    <w:bookmarkStart w:id="202" w:name="lem-loocv-not-random"/>
+    <w:bookmarkEnd w:id="203"/>
+    <w:bookmarkStart w:id="204" w:name="lem-loocv-not-random"/>
     <w:p>
       <w:pPr>
         <w:pStyle w:val="BodyText"/>
@@ -55285,7 +55413,7 @@
         <w:t xml:space="preserve">.</w:t>
       </w:r>
     </w:p>
-    <w:bookmarkEnd w:id="202"/>
+    <w:bookmarkEnd w:id="204"/>
     <w:p>
       <w:pPr>
         <w:pStyle w:val="BodyText"/>
@@ -56811,7 +56939,7 @@
         <w:t xml:space="preserve">fits, with the folds numbered differently.</w:t>
       </w:r>
     </w:p>
-    <w:bookmarkStart w:id="204" w:name="def-term-vector"/>
+    <w:bookmarkStart w:id="206" w:name="def-term-vector"/>
     <w:p>
       <w:pPr>
         <w:pStyle w:val="FirstParagraph"/>
@@ -57077,7 +57205,7 @@
       <w:pPr>
         <w:pStyle w:val="BodyText"/>
       </w:pPr>
-      <w:bookmarkStart w:id="203" w:name="eq-term-vector"/>
+      <w:bookmarkStart w:id="205" w:name="eq-term-vector"/>
       <m:oMathPara>
         <m:oMathParaPr>
           <m:jc m:val="center"/>
@@ -57282,10 +57410,10 @@
           </m:r>
         </m:oMath>
       </m:oMathPara>
-      <w:bookmarkEnd w:id="203"/>
+      <w:bookmarkEnd w:id="205"/>
     </w:p>
-    <w:bookmarkEnd w:id="204"/>
-    <w:bookmarkStart w:id="206" w:name="rem-term-vector"/>
+    <w:bookmarkEnd w:id="206"/>
+    <w:bookmarkStart w:id="208" w:name="rem-term-vector"/>
     <w:p>
       <w:pPr>
         <w:pStyle w:val="FirstParagraph"/>
@@ -57383,7 +57511,7 @@
       <w:r>
         <w:t xml:space="preserve"> </w:t>
       </w:r>
-      <w:hyperlink r:id="rId205">
+      <w:hyperlink r:id="rId207">
         <w:r>
           <w:rPr>
             <w:rStyle w:val="Hyperlink"/>
@@ -57424,8 +57552,8 @@
         <w:t xml:space="preserve">.</w:t>
       </w:r>
     </w:p>
-    <w:bookmarkEnd w:id="206"/>
-    <w:bookmarkStart w:id="208" w:name="def-cross-product-matrix"/>
+    <w:bookmarkEnd w:id="208"/>
+    <w:bookmarkStart w:id="210" w:name="def-cross-product-matrix"/>
     <w:p>
       <w:pPr>
         <w:pStyle w:val="BodyText"/>
@@ -57552,7 +57680,7 @@
       <w:pPr>
         <w:pStyle w:val="BodyText"/>
       </w:pPr>
-      <w:bookmarkStart w:id="207" w:name="eq-cross-product-matrix"/>
+      <w:bookmarkStart w:id="209" w:name="eq-cross-product-matrix"/>
       <m:oMathPara>
         <m:oMathParaPr>
           <m:jc m:val="center"/>
@@ -57695,10 +57823,10 @@
           </m:r>
         </m:oMath>
       </m:oMathPara>
-      <w:bookmarkEnd w:id="207"/>
+      <w:bookmarkEnd w:id="209"/>
     </w:p>
-    <w:bookmarkEnd w:id="208"/>
-    <w:bookmarkStart w:id="210" w:name="rem-source-cross-product-matrix"/>
+    <w:bookmarkEnd w:id="210"/>
+    <w:bookmarkStart w:id="212" w:name="rem-source-cross-product-matrix"/>
     <w:p>
       <w:pPr>
         <w:pStyle w:val="FirstParagraph"/>
@@ -57747,7 +57875,7 @@
       <w:r>
         <w:t xml:space="preserve"> </w:t>
       </w:r>
-      <w:hyperlink r:id="rId209">
+      <w:hyperlink r:id="rId211">
         <w:r>
           <w:rPr>
             <w:rStyle w:val="Hyperlink"/>
@@ -57759,8 +57887,8 @@
         <w:t xml:space="preserve">).</w:t>
       </w:r>
     </w:p>
-    <w:bookmarkEnd w:id="210"/>
-    <w:bookmarkStart w:id="213" w:name="rem-cross-product-matrix"/>
+    <w:bookmarkEnd w:id="212"/>
+    <w:bookmarkStart w:id="215" w:name="rem-cross-product-matrix"/>
     <w:p>
       <w:pPr>
         <w:pStyle w:val="BodyText"/>
@@ -58074,18 +58202,18 @@
                 <wp:inline>
                   <wp:extent cx="152400" cy="152400"/>
                   <wp:effectExtent b="0" l="0" r="0" t="0"/>
-                  <wp:docPr descr="" title="" id="211" name="Picture"/>
+                  <wp:docPr descr="" title="" id="213" name="Picture"/>
                   <a:graphic>
                     <a:graphicData uri="http://schemas.openxmlformats.org/drawingml/2006/picture">
                       <pic:pic>
                         <pic:nvPicPr>
-                          <pic:cNvPr descr="/opt/quarto/share/formats/docx/note.png" id="212" name="Picture"/>
+                          <pic:cNvPr descr="/opt/quarto/share/formats/docx/note.png" id="214" name="Picture"/>
                           <pic:cNvPicPr>
                             <a:picLocks noChangeArrowheads="1" noChangeAspect="1"/>
                           </pic:cNvPicPr>
                         </pic:nvPicPr>
                         <pic:blipFill>
-                          <a:blip r:embed="rId157"/>
+                          <a:blip r:embed="rId159"/>
                           <a:stretch>
                             <a:fillRect/>
                           </a:stretch>
@@ -58165,7 +58293,7 @@
             <w:r>
               <w:t xml:space="preserve"> </w:t>
             </w:r>
-            <w:hyperlink r:id="rId209">
+            <w:hyperlink r:id="rId211">
               <w:r>
                 <w:rPr>
                   <w:rStyle w:val="Hyperlink"/>
@@ -58193,8 +58321,8 @@
         </w:tc>
       </w:tr>
     </w:tbl>
-    <w:bookmarkEnd w:id="213"/>
-    <w:bookmarkStart w:id="216" w:name="def-leverage"/>
+    <w:bookmarkEnd w:id="215"/>
+    <w:bookmarkStart w:id="218" w:name="def-leverage"/>
     <w:p>
       <w:pPr>
         <w:pStyle w:val="BodyText"/>
@@ -58215,7 +58343,7 @@
       <w:r>
         <w:t xml:space="preserve"> </w:t>
       </w:r>
-      <w:hyperlink r:id="rId214">
+      <w:hyperlink r:id="rId216">
         <w:r>
           <w:rPr>
             <w:rStyle w:val="Hyperlink"/>
@@ -58364,7 +58492,7 @@
       <w:pPr>
         <w:pStyle w:val="BodyText"/>
       </w:pPr>
-      <w:bookmarkStart w:id="215" w:name="eq-leverage"/>
+      <w:bookmarkStart w:id="217" w:name="eq-leverage"/>
       <m:oMathPara>
         <m:oMathParaPr>
           <m:jc m:val="center"/>
@@ -58505,10 +58633,10 @@
           </m:r>
         </m:oMath>
       </m:oMathPara>
-      <w:bookmarkEnd w:id="215"/>
+      <w:bookmarkEnd w:id="217"/>
     </w:p>
-    <w:bookmarkEnd w:id="216"/>
-    <w:bookmarkStart w:id="218" w:name="rem-source-leverage"/>
+    <w:bookmarkEnd w:id="218"/>
+    <w:bookmarkStart w:id="220" w:name="rem-source-leverage"/>
     <w:p>
       <w:pPr>
         <w:pStyle w:val="FirstParagraph"/>
@@ -58555,7 +58683,7 @@
       <w:r>
         <w:t xml:space="preserve"> </w:t>
       </w:r>
-      <w:hyperlink r:id="rId217">
+      <w:hyperlink r:id="rId219">
         <w:r>
           <w:rPr>
             <w:rStyle w:val="Hyperlink"/>
@@ -58567,8 +58695,8 @@
         <w:t xml:space="preserve">.</w:t>
       </w:r>
     </w:p>
-    <w:bookmarkEnd w:id="218"/>
-    <w:bookmarkStart w:id="221" w:name="thm-loocv-shortcut"/>
+    <w:bookmarkEnd w:id="220"/>
+    <w:bookmarkStart w:id="223" w:name="thm-loocv-shortcut"/>
     <w:p>
       <w:pPr>
         <w:pStyle w:val="BodyText"/>
@@ -58589,7 +58717,7 @@
       <w:r>
         <w:t xml:space="preserve"> </w:t>
       </w:r>
-      <w:hyperlink r:id="rId214">
+      <w:hyperlink r:id="rId216">
         <w:r>
           <w:rPr>
             <w:rStyle w:val="Hyperlink"/>
@@ -58689,7 +58817,7 @@
       <w:r>
         <w:t xml:space="preserve"> </w:t>
       </w:r>
-      <w:hyperlink r:id="rId219">
+      <w:hyperlink r:id="rId221">
         <w:r>
           <w:rPr>
             <w:rStyle w:val="Hyperlink"/>
@@ -58733,7 +58861,7 @@
       <w:r>
         <w:t xml:space="preserve"> </w:t>
       </w:r>
-      <w:hyperlink r:id="rId33">
+      <w:hyperlink r:id="rId35">
         <w:r>
           <w:rPr>
             <w:rStyle w:val="Hyperlink"/>
@@ -58815,7 +58943,7 @@
       <w:pPr>
         <w:pStyle w:val="BodyText"/>
       </w:pPr>
-      <w:bookmarkStart w:id="220" w:name="eq-loocv-shortcut"/>
+      <w:bookmarkStart w:id="222" w:name="eq-loocv-shortcut"/>
       <m:oMathPara>
         <m:oMathParaPr>
           <m:jc m:val="center"/>
@@ -59005,9 +59133,9 @@
           </m:r>
         </m:oMath>
       </m:oMathPara>
-      <w:bookmarkEnd w:id="220"/>
+      <w:bookmarkEnd w:id="222"/>
     </w:p>
-    <w:bookmarkEnd w:id="221"/>
+    <w:bookmarkEnd w:id="223"/>
     <w:p>
       <w:pPr>
         <w:pStyle w:val="FirstParagraph"/>
@@ -59146,7 +59274,7 @@
         <w:t xml:space="preserve">which this page does not develop.</w:t>
       </w:r>
     </w:p>
-    <w:bookmarkStart w:id="222" w:name="rem-source-loocv-shortcut"/>
+    <w:bookmarkStart w:id="224" w:name="rem-source-loocv-shortcut"/>
     <w:p>
       <w:pPr>
         <w:pStyle w:val="BodyText"/>
@@ -59189,8 +59317,8 @@
         <w:t xml:space="preserve">for many linear fitting methods.</w:t>
       </w:r>
     </w:p>
-    <w:bookmarkEnd w:id="222"/>
-    <w:bookmarkStart w:id="223" w:name="exm-loocv-shortcut"/>
+    <w:bookmarkEnd w:id="224"/>
+    <w:bookmarkStart w:id="225" w:name="exm-loocv-shortcut"/>
     <w:p>
       <w:pPr>
         <w:pStyle w:val="BodyText"/>
@@ -60278,7 +60406,7 @@
         <w:rPr>
           <w:rStyle w:val="CommentTok"/>
         </w:rPr>
-        <w:t xml:space="preserve">#&gt;    8.88178e-15    2.00000e+00</w:t>
+        <w:t xml:space="preserve">#&gt;    7.10543e-15    2.00000e+00</w:t>
       </w:r>
     </w:p>
     <w:p>
@@ -60286,7 +60414,7 @@
         <w:pStyle w:val="FirstParagraph"/>
       </w:pPr>
       <w:r>
-        <w:t xml:space="preserve">The two columns differ by at most 8.9e-15,</w:t>
+        <w:t xml:space="preserve">The two columns differ by at most 7.1e-15,</w:t>
       </w:r>
       <w:r>
         <w:t xml:space="preserve"> </w:t>
@@ -60330,8 +60458,8 @@
         <w:t xml:space="preserve">rerunning it always gives the same choice.</w:t>
       </w:r>
     </w:p>
-    <w:bookmarkEnd w:id="223"/>
-    <w:bookmarkStart w:id="224" w:name="rem-loocv"/>
+    <w:bookmarkEnd w:id="225"/>
+    <w:bookmarkStart w:id="226" w:name="rem-loocv"/>
     <w:p>
       <w:pPr>
         <w:pStyle w:val="BodyText"/>
@@ -60803,9 +60931,9 @@
         <w:t xml:space="preserve">fits.</w:t>
       </w:r>
     </w:p>
-    <w:bookmarkEnd w:id="224"/>
-    <w:bookmarkEnd w:id="225"/>
-    <w:bookmarkStart w:id="254" w:name="sec-cv-model-choice"/>
+    <w:bookmarkEnd w:id="226"/>
+    <w:bookmarkEnd w:id="227"/>
+    <w:bookmarkStart w:id="256" w:name="sec-cv-model-choice"/>
     <w:p>
       <w:pPr>
         <w:pStyle w:val="Heading2"/>
@@ -60814,7 +60942,7 @@
         <w:t xml:space="preserve">8 Choosing a model by cross-validation</w:t>
       </w:r>
     </w:p>
-    <w:bookmarkStart w:id="227" w:name="def-cv-estimate-indexed"/>
+    <w:bookmarkStart w:id="229" w:name="def-cv-estimate-indexed"/>
     <w:p>
       <w:pPr>
         <w:pStyle w:val="FirstParagraph"/>
@@ -61192,7 +61320,7 @@
       <w:pPr>
         <w:pStyle w:val="BodyText"/>
       </w:pPr>
-      <w:bookmarkStart w:id="226" w:name="eq-cv-estimate-indexed"/>
+      <w:bookmarkStart w:id="228" w:name="eq-cv-estimate-indexed"/>
       <m:oMathPara>
         <m:oMathParaPr>
           <m:jc m:val="center"/>
@@ -61602,10 +61730,10 @@
           </m:r>
         </m:oMath>
       </m:oMathPara>
-      <w:bookmarkEnd w:id="226"/>
+      <w:bookmarkEnd w:id="228"/>
     </w:p>
-    <w:bookmarkEnd w:id="227"/>
-    <w:bookmarkStart w:id="229" w:name="def-cv-choice"/>
+    <w:bookmarkEnd w:id="229"/>
+    <w:bookmarkStart w:id="231" w:name="def-cv-choice"/>
     <w:p>
       <w:pPr>
         <w:pStyle w:val="FirstParagraph"/>
@@ -61947,7 +62075,7 @@
       <w:pPr>
         <w:pStyle w:val="BodyText"/>
       </w:pPr>
-      <w:bookmarkStart w:id="228" w:name="eq-cv-choice"/>
+      <w:bookmarkStart w:id="230" w:name="eq-cv-choice"/>
       <m:oMathPara>
         <m:oMathParaPr>
           <m:jc m:val="center"/>
@@ -62231,10 +62359,10 @@
           </m:r>
         </m:oMath>
       </m:oMathPara>
-      <w:bookmarkEnd w:id="228"/>
+      <w:bookmarkEnd w:id="230"/>
     </w:p>
-    <w:bookmarkEnd w:id="229"/>
-    <w:bookmarkStart w:id="231" w:name="def-nested-cv"/>
+    <w:bookmarkEnd w:id="231"/>
+    <w:bookmarkStart w:id="233" w:name="def-nested-cv"/>
     <w:p>
       <w:pPr>
         <w:pStyle w:val="FirstParagraph"/>
@@ -62361,7 +62489,7 @@
       <w:pPr>
         <w:pStyle w:val="BodyText"/>
       </w:pPr>
-      <w:bookmarkStart w:id="230" w:name="eq-nested-cv"/>
+      <w:bookmarkStart w:id="232" w:name="eq-nested-cv"/>
       <m:oMathPara>
         <m:oMathParaPr>
           <m:jc m:val="center"/>
@@ -62488,10 +62616,10 @@
           </m:r>
         </m:oMath>
       </m:oMathPara>
-      <w:bookmarkEnd w:id="230"/>
+      <w:bookmarkEnd w:id="232"/>
     </w:p>
-    <w:bookmarkEnd w:id="231"/>
-    <w:bookmarkStart w:id="232" w:name="rem-source-nested-cv"/>
+    <w:bookmarkEnd w:id="233"/>
+    <w:bookmarkStart w:id="234" w:name="rem-source-nested-cv"/>
     <w:p>
       <w:pPr>
         <w:pStyle w:val="FirstParagraph"/>
@@ -62522,8 +62650,8 @@
         <w:t xml:space="preserve">choices included.</w:t>
       </w:r>
     </w:p>
-    <w:bookmarkEnd w:id="232"/>
-    <w:bookmarkStart w:id="233" w:name="rem-nested-cv"/>
+    <w:bookmarkEnd w:id="234"/>
+    <w:bookmarkStart w:id="235" w:name="rem-nested-cv"/>
     <w:p>
       <w:pPr>
         <w:pStyle w:val="BodyText"/>
@@ -62679,8 +62807,8 @@
         <w:t xml:space="preserve">That inner cross-validation is the nested one.</w:t>
       </w:r>
     </w:p>
-    <w:bookmarkEnd w:id="233"/>
-    <w:bookmarkStart w:id="236" w:name="rem-cv-winner-optimistic"/>
+    <w:bookmarkEnd w:id="235"/>
+    <w:bookmarkStart w:id="238" w:name="rem-cv-winner-optimistic"/>
     <w:p>
       <w:pPr>
         <w:pStyle w:val="BodyText"/>
@@ -62873,18 +63001,18 @@
                 <wp:inline>
                   <wp:extent cx="152400" cy="152400"/>
                   <wp:effectExtent b="0" l="0" r="0" t="0"/>
-                  <wp:docPr descr="" title="" id="234" name="Picture"/>
+                  <wp:docPr descr="" title="" id="236" name="Picture"/>
                   <a:graphic>
                     <a:graphicData uri="http://schemas.openxmlformats.org/drawingml/2006/picture">
                       <pic:pic>
                         <pic:nvPicPr>
-                          <pic:cNvPr descr="/opt/quarto/share/formats/docx/note.png" id="235" name="Picture"/>
+                          <pic:cNvPr descr="/opt/quarto/share/formats/docx/note.png" id="237" name="Picture"/>
                           <pic:cNvPicPr>
                             <a:picLocks noChangeArrowheads="1" noChangeAspect="1"/>
                           </pic:cNvPicPr>
                         </pic:nvPicPr>
                         <pic:blipFill>
-                          <a:blip r:embed="rId157"/>
+                          <a:blip r:embed="rId159"/>
                           <a:stretch>
                             <a:fillRect/>
                           </a:stretch>
@@ -62948,8 +63076,8 @@
         </w:tc>
       </w:tr>
     </w:tbl>
-    <w:bookmarkEnd w:id="236"/>
-    <w:bookmarkStart w:id="239" w:name="def-cv-se"/>
+    <w:bookmarkEnd w:id="238"/>
+    <w:bookmarkStart w:id="241" w:name="def-cv-se"/>
     <w:p>
       <w:pPr>
         <w:pStyle w:val="BodyText"/>
@@ -63053,7 +63181,7 @@
       <w:r>
         <w:t xml:space="preserve"> </w:t>
       </w:r>
-      <w:hyperlink r:id="rId237">
+      <w:hyperlink r:id="rId239">
         <w:r>
           <w:rPr>
             <w:rStyle w:val="Hyperlink"/>
@@ -63119,7 +63247,7 @@
       <w:pPr>
         <w:pStyle w:val="BodyText"/>
       </w:pPr>
-      <w:bookmarkStart w:id="238" w:name="eq-cv-se"/>
+      <w:bookmarkStart w:id="240" w:name="eq-cv-se"/>
       <m:oMathPara>
         <m:oMathParaPr>
           <m:jc m:val="center"/>
@@ -63294,10 +63422,10 @@
           </m:r>
         </m:oMath>
       </m:oMathPara>
-      <w:bookmarkEnd w:id="238"/>
+      <w:bookmarkEnd w:id="240"/>
     </w:p>
-    <w:bookmarkEnd w:id="239"/>
-    <w:bookmarkStart w:id="240" w:name="rem-source-cv-se"/>
+    <w:bookmarkEnd w:id="241"/>
+    <w:bookmarkStart w:id="242" w:name="rem-source-cv-se"/>
     <w:p>
       <w:pPr>
         <w:pStyle w:val="FirstParagraph"/>
@@ -63319,8 +63447,8 @@
         <w:t xml:space="preserve">, who call the result a standard error.</w:t>
       </w:r>
     </w:p>
-    <w:bookmarkEnd w:id="240"/>
-    <w:bookmarkStart w:id="242" w:name="rem-cv-se"/>
+    <w:bookmarkEnd w:id="242"/>
+    <w:bookmarkStart w:id="244" w:name="rem-cv-se"/>
     <w:p>
       <w:pPr>
         <w:pStyle w:val="BodyText"/>
@@ -63543,7 +63671,7 @@
       <w:r>
         <w:t xml:space="preserve"> </w:t>
       </w:r>
-      <w:hyperlink r:id="rId241">
+      <w:hyperlink r:id="rId243">
         <w:r>
           <w:rPr>
             <w:rStyle w:val="Hyperlink"/>
@@ -63607,8 +63735,8 @@
         <w:t xml:space="preserve">.</w:t>
       </w:r>
     </w:p>
-    <w:bookmarkEnd w:id="242"/>
-    <w:bookmarkStart w:id="244" w:name="def-fold-mse-indexed"/>
+    <w:bookmarkEnd w:id="244"/>
+    <w:bookmarkStart w:id="246" w:name="def-fold-mse-indexed"/>
     <w:p>
       <w:pPr>
         <w:pStyle w:val="BodyText"/>
@@ -63786,7 +63914,7 @@
       <w:pPr>
         <w:pStyle w:val="BodyText"/>
       </w:pPr>
-      <w:bookmarkStart w:id="243" w:name="eq-fold-mse-indexed"/>
+      <w:bookmarkStart w:id="245" w:name="eq-fold-mse-indexed"/>
       <m:oMathPara>
         <m:oMathParaPr>
           <m:jc m:val="center"/>
@@ -64173,10 +64301,10 @@
           </m:r>
         </m:oMath>
       </m:oMathPara>
-      <w:bookmarkEnd w:id="243"/>
+      <w:bookmarkEnd w:id="245"/>
     </w:p>
-    <w:bookmarkEnd w:id="244"/>
-    <w:bookmarkStart w:id="246" w:name="def-cv-se-indexed"/>
+    <w:bookmarkEnd w:id="246"/>
+    <w:bookmarkStart w:id="248" w:name="def-cv-se-indexed"/>
     <w:p>
       <w:pPr>
         <w:pStyle w:val="FirstParagraph"/>
@@ -64382,7 +64510,7 @@
       <w:pPr>
         <w:pStyle w:val="BodyText"/>
       </w:pPr>
-      <w:bookmarkStart w:id="245" w:name="eq-cv-se-indexed"/>
+      <w:bookmarkStart w:id="247" w:name="eq-cv-se-indexed"/>
       <m:oMathPara>
         <m:oMathParaPr>
           <m:jc m:val="center"/>
@@ -64680,10 +64808,10 @@
           </m:r>
         </m:oMath>
       </m:oMathPara>
-      <w:bookmarkEnd w:id="245"/>
+      <w:bookmarkEnd w:id="247"/>
     </w:p>
-    <w:bookmarkEnd w:id="246"/>
-    <w:bookmarkStart w:id="248" w:name="def-one-se-rule"/>
+    <w:bookmarkEnd w:id="248"/>
+    <w:bookmarkStart w:id="250" w:name="def-one-se-rule"/>
     <w:p>
       <w:pPr>
         <w:pStyle w:val="FirstParagraph"/>
@@ -64941,7 +65069,7 @@
       <w:pPr>
         <w:pStyle w:val="BodyText"/>
       </w:pPr>
-      <w:bookmarkStart w:id="247" w:name="eq-one-se-rule"/>
+      <w:bookmarkStart w:id="249" w:name="eq-one-se-rule"/>
       <m:oMathPara>
         <m:oMathParaPr>
           <m:jc m:val="center"/>
@@ -65275,7 +65403,7 @@
           </m:r>
         </m:oMath>
       </m:oMathPara>
-      <w:bookmarkEnd w:id="247"/>
+      <w:bookmarkEnd w:id="249"/>
     </w:p>
     <w:p>
       <w:pPr>
@@ -65294,8 +65422,8 @@
         <w:t xml:space="preserve">.</w:t>
       </w:r>
     </w:p>
-    <w:bookmarkEnd w:id="248"/>
-    <w:bookmarkStart w:id="253" w:name="exm-one-se-rule"/>
+    <w:bookmarkEnd w:id="250"/>
+    <w:bookmarkStart w:id="255" w:name="exm-one-se-rule"/>
     <w:p>
       <w:pPr>
         <w:pStyle w:val="BodyText"/>
@@ -66367,7 +66495,7 @@
       <w:tr>
         <w:tc>
           <w:tcPr/>
-          <w:bookmarkStart w:id="252" w:name="fig-one-se-rule"/>
+          <w:bookmarkStart w:id="254" w:name="fig-one-se-rule"/>
           <w:p>
             <w:pPr>
               <w:pStyle w:val="SourceCode"/>
@@ -66980,18 +67108,18 @@
                 <wp:inline>
                   <wp:extent cx="4620126" cy="3696101"/>
                   <wp:effectExtent b="0" l="0" r="0" t="0"/>
-                  <wp:docPr descr="" title="" id="250" name="Picture"/>
+                  <wp:docPr descr="" title="" id="252" name="Picture"/>
                   <a:graphic>
                     <a:graphicData uri="http://schemas.openxmlformats.org/drawingml/2006/picture">
                       <pic:pic>
                         <pic:nvPicPr>
-                          <pic:cNvPr descr="model-validation_files/figure-docx/one-se-rule-plot-1.png" id="251" name="Picture"/>
+                          <pic:cNvPr descr="model-validation_files/figure-docx/one-se-rule-plot-1.png" id="253" name="Picture"/>
                           <pic:cNvPicPr>
                             <a:picLocks noChangeArrowheads="1" noChangeAspect="1"/>
                           </pic:cNvPicPr>
                         </pic:nvPicPr>
                         <pic:blipFill>
-                          <a:blip r:embed="rId249"/>
+                          <a:blip r:embed="rId251"/>
                           <a:stretch>
                             <a:fillRect/>
                           </a:stretch>
@@ -67071,7 +67199,7 @@
               <w:t xml:space="preserve">The dashed line is one fold-based standard error above the smallest estimate.</w:t>
             </w:r>
           </w:p>
-          <w:bookmarkEnd w:id="252"/>
+          <w:bookmarkEnd w:id="254"/>
         </w:tc>
       </w:tr>
     </w:tbl>
@@ -67160,9 +67288,9 @@
         <w:t xml:space="preserve">and 0.315 for degree 3.</w:t>
       </w:r>
     </w:p>
-    <w:bookmarkEnd w:id="253"/>
-    <w:bookmarkEnd w:id="254"/>
-    <w:bookmarkStart w:id="261" w:name="sec-cv-whole-procedure"/>
+    <w:bookmarkEnd w:id="255"/>
+    <w:bookmarkEnd w:id="256"/>
+    <w:bookmarkStart w:id="263" w:name="sec-cv-whole-procedure"/>
     <w:p>
       <w:pPr>
         <w:pStyle w:val="Heading2"/>
@@ -67171,7 +67299,7 @@
         <w:t xml:space="preserve">9 Cross-validating the whole procedure</w:t>
       </w:r>
     </w:p>
-    <w:bookmarkStart w:id="257" w:name="exr-cv-screening"/>
+    <w:bookmarkStart w:id="259" w:name="exr-cv-screening"/>
     <w:p>
       <w:pPr>
         <w:pStyle w:val="FirstParagraph"/>
@@ -67471,18 +67599,18 @@
                 <wp:inline>
                   <wp:extent cx="152400" cy="152400"/>
                   <wp:effectExtent b="0" l="0" r="0" t="0"/>
-                  <wp:docPr descr="" title="" id="255" name="Picture"/>
+                  <wp:docPr descr="" title="" id="257" name="Picture"/>
                   <a:graphic>
                     <a:graphicData uri="http://schemas.openxmlformats.org/drawingml/2006/picture">
                       <pic:pic>
                         <pic:nvPicPr>
-                          <pic:cNvPr descr="/opt/quarto/share/formats/docx/note.png" id="256" name="Picture"/>
+                          <pic:cNvPr descr="/opt/quarto/share/formats/docx/note.png" id="258" name="Picture"/>
                           <pic:cNvPicPr>
                             <a:picLocks noChangeArrowheads="1" noChangeAspect="1"/>
                           </pic:cNvPicPr>
                         </pic:nvPicPr>
                         <pic:blipFill>
-                          <a:blip r:embed="rId157"/>
+                          <a:blip r:embed="rId159"/>
                           <a:stretch>
                             <a:fillRect/>
                           </a:stretch>
@@ -67564,8 +67692,8 @@
         </w:tc>
       </w:tr>
     </w:tbl>
-    <w:bookmarkEnd w:id="257"/>
-    <w:bookmarkStart w:id="258" w:name="sol-cv-screening"/>
+    <w:bookmarkEnd w:id="259"/>
+    <w:bookmarkStart w:id="260" w:name="sol-cv-screening"/>
     <w:p>
       <w:pPr>
         <w:pStyle w:val="BodyText"/>
@@ -69493,8 +69621,8 @@
         <w:t xml:space="preserve">needs fails.</w:t>
       </w:r>
     </w:p>
-    <w:bookmarkEnd w:id="258"/>
-    <w:bookmarkStart w:id="260" w:name="rem-cv-every-step"/>
+    <w:bookmarkEnd w:id="260"/>
+    <w:bookmarkStart w:id="262" w:name="rem-cv-every-step"/>
     <w:p>
       <w:pPr>
         <w:pStyle w:val="BodyText"/>
@@ -69650,7 +69778,7 @@
       <w:r>
         <w:t xml:space="preserve"> </w:t>
       </w:r>
-      <w:hyperlink r:id="rId259">
+      <w:hyperlink r:id="rId261">
         <w:r>
           <w:rPr>
             <w:rStyle w:val="Hyperlink"/>
@@ -69674,9 +69802,9 @@
         <w:t xml:space="preserve">when they are computed without the outcome.</w:t>
       </w:r>
     </w:p>
-    <w:bookmarkEnd w:id="260"/>
-    <w:bookmarkEnd w:id="261"/>
-    <w:bookmarkStart w:id="262" w:name="further-reading"/>
+    <w:bookmarkEnd w:id="262"/>
+    <w:bookmarkEnd w:id="263"/>
+    <w:bookmarkStart w:id="264" w:name="further-reading"/>
     <w:p>
       <w:pPr>
         <w:pStyle w:val="Heading2"/>
@@ -69705,8 +69833,8 @@
         <w:t xml:space="preserve">including the covariance and correlation matrices that cross-products produce.</w:t>
       </w:r>
     </w:p>
-    <w:bookmarkEnd w:id="262"/>
-    <w:bookmarkStart w:id="270" w:name="references"/>
+    <w:bookmarkEnd w:id="264"/>
+    <w:bookmarkStart w:id="272" w:name="references"/>
     <w:p>
       <w:pPr>
         <w:pStyle w:val="Heading2"/>
@@ -69715,8 +69843,8 @@
         <w:t xml:space="preserve">References</w:t>
       </w:r>
     </w:p>
-    <w:bookmarkStart w:id="269" w:name="refs"/>
-    <w:bookmarkStart w:id="264" w:name="ref-hastie2009elements"/>
+    <w:bookmarkStart w:id="271" w:name="refs"/>
+    <w:bookmarkStart w:id="266" w:name="ref-hastie2009elements"/>
     <w:p>
       <w:pPr>
         <w:pStyle w:val="Bibliography"/>
@@ -69740,7 +69868,7 @@
       <w:r>
         <w:t xml:space="preserve"> </w:t>
       </w:r>
-      <w:hyperlink r:id="rId263">
+      <w:hyperlink r:id="rId265">
         <w:r>
           <w:rPr>
             <w:rStyle w:val="Hyperlink"/>
@@ -69752,8 +69880,8 @@
         <w:t xml:space="preserve">.</w:t>
       </w:r>
     </w:p>
-    <w:bookmarkEnd w:id="264"/>
-    <w:bookmarkStart w:id="266" w:name="ref-james2021islr2e"/>
+    <w:bookmarkEnd w:id="266"/>
+    <w:bookmarkStart w:id="268" w:name="ref-james2021islr2e"/>
     <w:p>
       <w:pPr>
         <w:pStyle w:val="Bibliography"/>
@@ -69791,7 +69919,7 @@
       <w:r>
         <w:t xml:space="preserve"> </w:t>
       </w:r>
-      <w:hyperlink r:id="rId265">
+      <w:hyperlink r:id="rId267">
         <w:r>
           <w:rPr>
             <w:rStyle w:val="Hyperlink"/>
@@ -69803,8 +69931,8 @@
         <w:t xml:space="preserve">.</w:t>
       </w:r>
     </w:p>
-    <w:bookmarkEnd w:id="266"/>
-    <w:bookmarkStart w:id="268" w:name="ref-sanchez2020matrix4sl"/>
+    <w:bookmarkEnd w:id="268"/>
+    <w:bookmarkStart w:id="270" w:name="ref-sanchez2020matrix4sl"/>
     <w:p>
       <w:pPr>
         <w:pStyle w:val="Bibliography"/>
@@ -69842,7 +69970,7 @@
       <w:r>
         <w:t xml:space="preserve"> </w:t>
       </w:r>
-      <w:hyperlink r:id="rId267">
+      <w:hyperlink r:id="rId269">
         <w:r>
           <w:rPr>
             <w:rStyle w:val="Hyperlink"/>
@@ -69854,9 +69982,9 @@
         <w:t xml:space="preserve">.</w:t>
       </w:r>
     </w:p>
-    <w:bookmarkEnd w:id="268"/>
-    <w:bookmarkEnd w:id="269"/>
     <w:bookmarkEnd w:id="270"/>
+    <w:bookmarkEnd w:id="271"/>
+    <w:bookmarkEnd w:id="272"/>
     <w:sectPr>
       <w:footnotePr>
         <w:numRestart w:val="eachSect"/>

</xml_diff>

<commit_message>
Deploying to gh-pages from @ Morrison-Lab/sds@d26452d69ecfeaf9e6b114b4e51bfac712543add 🚀
</commit_message>
<xml_diff>
--- a/model-validation-handout.docx
+++ b/model-validation-handout.docx
@@ -15,7 +15,7 @@
         <w:pStyle w:val="Date"/>
       </w:pPr>
       <w:r>
-        <w:t xml:space="preserve">Last modified: 2026-10-16 10:20:46 (PDT)</w:t>
+        <w:t xml:space="preserve">Last modified: 2026-10-16 11:26:47 (PDT)</w:t>
       </w:r>
     </w:p>
     <w:bookmarkStart w:id="17" w:name="sec-data-sets"/>
@@ -13562,7 +13562,7 @@
         <w:t xml:space="preserve"> </w:t>
       </w:r>
       <w:r>
-        <w:t xml:space="preserve">is the</w:t>
+        <w:t xml:space="preserve">is the expected</w:t>
       </w:r>
       <w:r>
         <w:t xml:space="preserve"> </w:t>
@@ -13572,73 +13572,20 @@
           <w:rPr>
             <w:rStyle w:val="Hyperlink"/>
           </w:rPr>
-          <w:t xml:space="preserve">bias</w:t>
+          <w:t xml:space="preserve">estimation error</w:t>
         </w:r>
       </w:hyperlink>
       <w:r>
         <w:t xml:space="preserve"> </w:t>
       </w:r>
       <w:r>
-        <w:t xml:space="preserve">of</w:t>
-      </w:r>
-      <w:r>
-        <w:t xml:space="preserve"> </w:t>
-      </w:r>
-      <m:oMath>
-        <m:r>
-          <m:t>g</m:t>
-        </m:r>
-        <m:r>
-          <m:t>​</m:t>
-        </m:r>
-        <m:d>
-          <m:dPr>
-            <m:begChr m:val="("/>
-            <m:sepChr m:val=""/>
-            <m:endChr m:val=")"/>
-            <m:grow/>
-          </m:dPr>
-          <m:e>
-            <m:r>
-              <m:t>x</m:t>
-            </m:r>
-            <m:r>
-              <m:rPr>
-                <m:sty m:val="p"/>
-              </m:rPr>
-              <m:t>;</m:t>
-            </m:r>
-            <m:sSub>
-              <m:e>
-                <m:r>
-                  <m:rPr>
-                    <m:scr m:val="script"/>
-                    <m:sty m:val="p"/>
-                  </m:rPr>
-                  <m:t>D</m:t>
-                </m:r>
-              </m:e>
-              <m:sub>
-                <m:r>
-                  <m:rPr>
-                    <m:nor/>
-                    <m:sty m:val="p"/>
-                  </m:rPr>
-                  <m:t>train</m:t>
-                </m:r>
-              </m:sub>
-            </m:sSub>
-          </m:e>
-        </m:d>
-        <m:r>
-          <m:t>​</m:t>
-        </m:r>
-      </m:oMath>
-      <w:r>
-        <w:t xml:space="preserve"> </w:t>
-      </w:r>
-      <w:r>
-        <w:t xml:space="preserve">used as an</w:t>
+        <w:t xml:space="preserve">of the prediction</w:t>
+      </w:r>
+      <w:r>
+        <w:t xml:space="preserve"> </w:t>
+      </w:r>
+      <w:r>
+        <w:t xml:space="preserve">as an</w:t>
       </w:r>
       <w:r>
         <w:t xml:space="preserve"> </w:t>
@@ -13811,390 +13758,7 @@
             </m:dPr>
             <m:e>
               <m:r>
-                <m:t>g</m:t>
-              </m:r>
-              <m:r>
-                <m:t>​</m:t>
-              </m:r>
-              <m:d>
-                <m:dPr>
-                  <m:begChr m:val="("/>
-                  <m:sepChr m:val=""/>
-                  <m:endChr m:val=")"/>
-                  <m:grow/>
-                </m:dPr>
-                <m:e>
-                  <m:r>
-                    <m:t>x</m:t>
-                  </m:r>
-                  <m:r>
-                    <m:rPr>
-                      <m:sty m:val="p"/>
-                    </m:rPr>
-                    <m:t>;</m:t>
-                  </m:r>
-                  <m:sSub>
-                    <m:e>
-                      <m:r>
-                        <m:rPr>
-                          <m:scr m:val="script"/>
-                          <m:sty m:val="p"/>
-                        </m:rPr>
-                        <m:t>D</m:t>
-                      </m:r>
-                    </m:e>
-                    <m:sub>
-                      <m:r>
-                        <m:rPr>
-                          <m:nor/>
-                          <m:sty m:val="p"/>
-                        </m:rPr>
-                        <m:t>train</m:t>
-                      </m:r>
-                    </m:sub>
-                  </m:sSub>
-                </m:e>
-              </m:d>
-              <m:r>
-                <m:t>​</m:t>
-              </m:r>
-            </m:e>
-          </m:d>
-          <m:r>
-            <m:t>​</m:t>
-          </m:r>
-          <m:r>
-            <m:rPr>
-              <m:sty m:val="p"/>
-            </m:rPr>
-            <m:t>−</m:t>
-          </m:r>
-          <m:r>
-            <m:t>μ</m:t>
-          </m:r>
-          <m:r>
-            <m:rPr>
-              <m:sty m:val="p"/>
-            </m:rPr>
-            <m:t>(</m:t>
-          </m:r>
-          <m:r>
-            <m:t>x</m:t>
-          </m:r>
-          <m:r>
-            <m:rPr>
-              <m:sty m:val="p"/>
-            </m:rPr>
-            <m:t>)</m:t>
-          </m:r>
-          <m:r>
-            <m:rPr>
-              <m:sty m:val="p"/>
-            </m:rPr>
-            <m:t>,</m:t>
-          </m:r>
-          <m:r>
-            <m:t>  </m:t>
-          </m:r>
-          <m:r>
-            <m:rPr>
-              <m:sty m:val="p"/>
-            </m:rPr>
-            <m:t>(</m:t>
-          </m:r>
-          <m:r>
-            <m:t>18</m:t>
-          </m:r>
-          <m:r>
-            <m:rPr>
-              <m:sty m:val="p"/>
-            </m:rPr>
-            <m:t>)</m:t>
-          </m:r>
-        </m:oMath>
-      </m:oMathPara>
-      <w:bookmarkEnd w:id="80"/>
-    </w:p>
-    <w:p>
-      <w:pPr>
-        <w:pStyle w:val="FirstParagraph"/>
-      </w:pPr>
-      <w:r>
-        <w:t xml:space="preserve">which is the</w:t>
-      </w:r>
-      <w:r>
-        <w:t xml:space="preserve"> </w:t>
-      </w:r>
-      <w:hyperlink w:anchor="def-average-fit">
-        <w:r>
-          <w:rPr>
-            <w:rStyle w:val="Hyperlink"/>
-          </w:rPr>
-          <w:t xml:space="preserve">average fit</w:t>
-        </w:r>
-      </w:hyperlink>
-      <w:r>
-        <w:t xml:space="preserve"> </w:t>
-      </w:r>
-      <m:oMath>
-        <m:acc>
-          <m:accPr>
-            <m:chr m:val="‾"/>
-          </m:accPr>
-          <m:e>
-            <m:r>
-              <m:t>h</m:t>
-            </m:r>
-          </m:e>
-        </m:acc>
-        <m:r>
-          <m:t>​</m:t>
-        </m:r>
-        <m:d>
-          <m:dPr>
-            <m:begChr m:val="("/>
-            <m:sepChr m:val=""/>
-            <m:endChr m:val=")"/>
-            <m:grow/>
-          </m:dPr>
-          <m:e>
-            <m:r>
-              <m:t>x</m:t>
-            </m:r>
-          </m:e>
-        </m:d>
-        <m:r>
-          <m:t>​</m:t>
-        </m:r>
-      </m:oMath>
-      <w:r>
-        <w:t xml:space="preserve"> </w:t>
-      </w:r>
-      <w:r>
-        <w:t xml:space="preserve">minus</w:t>
-      </w:r>
-      <w:r>
-        <w:t xml:space="preserve"> </w:t>
-      </w:r>
-      <m:oMath>
-        <m:r>
-          <m:t>μ</m:t>
-        </m:r>
-        <m:r>
-          <m:rPr>
-            <m:sty m:val="p"/>
-          </m:rPr>
-          <m:t>(</m:t>
-        </m:r>
-        <m:r>
-          <m:t>x</m:t>
-        </m:r>
-        <m:r>
-          <m:rPr>
-            <m:sty m:val="p"/>
-          </m:rPr>
-          <m:t>)</m:t>
-        </m:r>
-      </m:oMath>
-      <w:r>
-        <w:t xml:space="preserve">.</w:t>
-      </w:r>
-    </w:p>
-    <w:bookmarkEnd w:id="81"/>
-    <w:p>
-      <w:pPr>
-        <w:pStyle w:val="BodyText"/>
-      </w:pPr>
-      <w:r>
-        <w:rPr>
-          <w:i/>
-          <w:iCs/>
-        </w:rPr>
-        <w:t xml:space="preserve">Remark</w:t>
-      </w:r>
-      <w:r>
-        <w:t xml:space="preserve">. </w:t>
-      </w:r>
-      <w:r>
-        <w:t xml:space="preserve">In expected prediction error decompositions</w:t>
-      </w:r>
-      <w:r>
-        <w:t xml:space="preserve"> </w:t>
-      </w:r>
-      <w:r>
-        <w:t xml:space="preserve">(James et al. 2021, sec. 2.2.2)</w:t>
-      </w:r>
-      <w:r>
-        <w:t xml:space="preserve">,</w:t>
-      </w:r>
-      <w:r>
-        <w:t xml:space="preserve"> </w:t>
-      </w:r>
-      <w:r>
-        <w:t xml:space="preserve">the bias reflects the error introduced by approximating a real-world relationship by a model.</w:t>
-      </w:r>
-    </w:p>
-    <w:bookmarkStart w:id="82" w:name="exm-prediction-bias"/>
-    <w:p>
-      <w:pPr>
-        <w:pStyle w:val="BodyText"/>
-      </w:pPr>
-      <w:r>
-        <w:rPr>
-          <w:b/>
-          <w:bCs/>
-        </w:rPr>
-        <w:t xml:space="preserve">Example 5 (Computing the bias of a prediction)</w:t>
-      </w:r>
-      <w:r>
-        <w:t xml:space="preserve"> </w:t>
-      </w:r>
-      <w:r>
-        <w:t xml:space="preserve">Suppose</w:t>
-      </w:r>
-      <w:r>
-        <w:t xml:space="preserve"> </w:t>
-      </w:r>
-      <m:oMath>
-        <m:r>
-          <m:t>μ</m:t>
-        </m:r>
-        <m:r>
-          <m:rPr>
-            <m:sty m:val="p"/>
-          </m:rPr>
-          <m:t>(</m:t>
-        </m:r>
-        <m:r>
-          <m:t>x</m:t>
-        </m:r>
-        <m:r>
-          <m:rPr>
-            <m:sty m:val="p"/>
-          </m:rPr>
-          <m:t>)</m:t>
-        </m:r>
-        <m:r>
-          <m:rPr>
-            <m:sty m:val="p"/>
-          </m:rPr>
-          <m:t>=</m:t>
-        </m:r>
-        <m:r>
-          <m:t>10</m:t>
-        </m:r>
-      </m:oMath>
-      <w:r>
-        <w:t xml:space="preserve">,</w:t>
-      </w:r>
-      <w:r>
-        <w:t xml:space="preserve"> </w:t>
-      </w:r>
-      <w:r>
-        <w:t xml:space="preserve">and the predictions</w:t>
-      </w:r>
-      <w:r>
-        <w:t xml:space="preserve"> </w:t>
-      </w:r>
-      <m:oMath>
-        <m:r>
-          <m:t>g</m:t>
-        </m:r>
-        <m:r>
-          <m:t>​</m:t>
-        </m:r>
-        <m:d>
-          <m:dPr>
-            <m:begChr m:val="("/>
-            <m:sepChr m:val=""/>
-            <m:endChr m:val=")"/>
-            <m:grow/>
-          </m:dPr>
-          <m:e>
-            <m:r>
-              <m:t>x</m:t>
-            </m:r>
-            <m:r>
-              <m:rPr>
-                <m:sty m:val="p"/>
-              </m:rPr>
-              <m:t>;</m:t>
-            </m:r>
-            <m:sSub>
-              <m:e>
-                <m:r>
-                  <m:rPr>
-                    <m:scr m:val="script"/>
-                    <m:sty m:val="p"/>
-                  </m:rPr>
-                  <m:t>D</m:t>
-                </m:r>
-              </m:e>
-              <m:sub>
-                <m:r>
-                  <m:rPr>
-                    <m:nor/>
-                    <m:sty m:val="p"/>
-                  </m:rPr>
-                  <m:t>train</m:t>
-                </m:r>
-              </m:sub>
-            </m:sSub>
-          </m:e>
-        </m:d>
-        <m:r>
-          <m:t>​</m:t>
-        </m:r>
-      </m:oMath>
-      <w:r>
-        <w:t xml:space="preserve">,</w:t>
-      </w:r>
-      <w:r>
-        <w:t xml:space="preserve"> </w:t>
-      </w:r>
-      <w:r>
-        <w:t xml:space="preserve">over repeated training sets,</w:t>
-      </w:r>
-      <w:r>
-        <w:t xml:space="preserve"> </w:t>
-      </w:r>
-      <w:r>
-        <w:t xml:space="preserve">average</w:t>
-      </w:r>
-      <w:r>
-        <w:t xml:space="preserve"> </w:t>
-      </w:r>
-      <m:oMath>
-        <m:r>
-          <m:t>11</m:t>
-        </m:r>
-      </m:oMath>
-      <w:r>
-        <w:t xml:space="preserve">.</w:t>
-      </w:r>
-      <w:r>
-        <w:t xml:space="preserve"> </w:t>
-      </w:r>
-      <w:r>
-        <w:t xml:space="preserve">Then</w:t>
-      </w:r>
-    </w:p>
-    <w:p>
-      <w:pPr>
-        <w:pStyle w:val="BodyText"/>
-      </w:pPr>
-      <m:oMathPara>
-        <m:oMathParaPr>
-          <m:jc m:val="center"/>
-        </m:oMathParaPr>
-        <m:oMath>
-          <m:eqArr>
-            <m:e>
-              <m:r>
-                <m:rPr>
-                  <m:sty m:val="p"/>
-                </m:rPr>
-                <m:t>Bias</m:t>
+                <m:t>ε</m:t>
               </m:r>
               <m:r>
                 <m:t>​</m:t>
@@ -14260,6 +13824,504 @@
               <m:r>
                 <m:t>​</m:t>
               </m:r>
+            </m:e>
+          </m:d>
+          <m:r>
+            <m:t>​</m:t>
+          </m:r>
+          <m:r>
+            <m:rPr>
+              <m:sty m:val="p"/>
+            </m:rPr>
+            <m:t>.</m:t>
+          </m:r>
+          <m:r>
+            <m:t>  </m:t>
+          </m:r>
+          <m:r>
+            <m:rPr>
+              <m:sty m:val="p"/>
+            </m:rPr>
+            <m:t>(</m:t>
+          </m:r>
+          <m:r>
+            <m:t>18</m:t>
+          </m:r>
+          <m:r>
+            <m:rPr>
+              <m:sty m:val="p"/>
+            </m:rPr>
+            <m:t>)</m:t>
+          </m:r>
+        </m:oMath>
+      </m:oMathPara>
+      <w:bookmarkEnd w:id="80"/>
+    </w:p>
+    <w:bookmarkEnd w:id="81"/>
+    <w:p>
+      <w:pPr>
+        <w:pStyle w:val="FirstParagraph"/>
+      </w:pPr>
+      <w:r>
+        <w:rPr>
+          <w:i/>
+          <w:iCs/>
+        </w:rPr>
+        <w:t xml:space="preserve">Remark</w:t>
+      </w:r>
+      <w:r>
+        <w:t xml:space="preserve">. </w:t>
+      </w:r>
+      <w:r>
+        <w:t xml:space="preserve">In expected prediction error decompositions</w:t>
+      </w:r>
+      <w:r>
+        <w:t xml:space="preserve"> </w:t>
+      </w:r>
+      <w:r>
+        <w:t xml:space="preserve">(James et al. 2021, sec. 2.2.2)</w:t>
+      </w:r>
+      <w:r>
+        <w:t xml:space="preserve">,</w:t>
+      </w:r>
+      <w:r>
+        <w:t xml:space="preserve"> </w:t>
+      </w:r>
+      <w:r>
+        <w:t xml:space="preserve">the bias reflects the error introduced by approximating a real-world relationship by a model.</w:t>
+      </w:r>
+    </w:p>
+    <w:bookmarkStart w:id="82" w:name="exm-prediction-bias"/>
+    <w:p>
+      <w:pPr>
+        <w:pStyle w:val="BodyText"/>
+      </w:pPr>
+      <w:r>
+        <w:rPr>
+          <w:b/>
+          <w:bCs/>
+        </w:rPr>
+        <w:t xml:space="preserve">Example 5 (Computing the bias of a prediction)</w:t>
+      </w:r>
+      <w:r>
+        <w:t xml:space="preserve"> </w:t>
+      </w:r>
+      <w:r>
+        <w:t xml:space="preserve">Suppose</w:t>
+      </w:r>
+      <w:r>
+        <w:t xml:space="preserve"> </w:t>
+      </w:r>
+      <m:oMath>
+        <m:r>
+          <m:t>μ</m:t>
+        </m:r>
+        <m:r>
+          <m:rPr>
+            <m:sty m:val="p"/>
+          </m:rPr>
+          <m:t>(</m:t>
+        </m:r>
+        <m:r>
+          <m:t>x</m:t>
+        </m:r>
+        <m:r>
+          <m:rPr>
+            <m:sty m:val="p"/>
+          </m:rPr>
+          <m:t>)</m:t>
+        </m:r>
+        <m:r>
+          <m:rPr>
+            <m:sty m:val="p"/>
+          </m:rPr>
+          <m:t>=</m:t>
+        </m:r>
+        <m:r>
+          <m:t>10</m:t>
+        </m:r>
+      </m:oMath>
+      <w:r>
+        <w:t xml:space="preserve">,</w:t>
+      </w:r>
+      <w:r>
+        <w:t xml:space="preserve"> </w:t>
+      </w:r>
+      <w:r>
+        <w:t xml:space="preserve">and the predictions</w:t>
+      </w:r>
+      <w:r>
+        <w:t xml:space="preserve"> </w:t>
+      </w:r>
+      <m:oMath>
+        <m:r>
+          <m:t>g</m:t>
+        </m:r>
+        <m:r>
+          <m:t>​</m:t>
+        </m:r>
+        <m:d>
+          <m:dPr>
+            <m:begChr m:val="("/>
+            <m:sepChr m:val=""/>
+            <m:endChr m:val=")"/>
+            <m:grow/>
+          </m:dPr>
+          <m:e>
+            <m:r>
+              <m:t>x</m:t>
+            </m:r>
+            <m:r>
+              <m:rPr>
+                <m:sty m:val="p"/>
+              </m:rPr>
+              <m:t>;</m:t>
+            </m:r>
+            <m:sSub>
+              <m:e>
+                <m:r>
+                  <m:rPr>
+                    <m:scr m:val="script"/>
+                    <m:sty m:val="p"/>
+                  </m:rPr>
+                  <m:t>D</m:t>
+                </m:r>
+              </m:e>
+              <m:sub>
+                <m:r>
+                  <m:rPr>
+                    <m:nor/>
+                    <m:sty m:val="p"/>
+                  </m:rPr>
+                  <m:t>train</m:t>
+                </m:r>
+              </m:sub>
+            </m:sSub>
+          </m:e>
+        </m:d>
+        <m:r>
+          <m:t>​</m:t>
+        </m:r>
+      </m:oMath>
+      <w:r>
+        <w:t xml:space="preserve">,</w:t>
+      </w:r>
+      <w:r>
+        <w:t xml:space="preserve"> </w:t>
+      </w:r>
+      <w:r>
+        <w:t xml:space="preserve">over repeated training sets,</w:t>
+      </w:r>
+      <w:r>
+        <w:t xml:space="preserve"> </w:t>
+      </w:r>
+      <w:r>
+        <w:t xml:space="preserve">average</w:t>
+      </w:r>
+      <w:r>
+        <w:t xml:space="preserve"> </w:t>
+      </w:r>
+      <m:oMath>
+        <m:r>
+          <m:t>11</m:t>
+        </m:r>
+      </m:oMath>
+      <w:r>
+        <w:t xml:space="preserve">.</w:t>
+      </w:r>
+      <w:r>
+        <w:t xml:space="preserve"> </w:t>
+      </w:r>
+      <w:r>
+        <w:t xml:space="preserve">Then</w:t>
+      </w:r>
+    </w:p>
+    <w:p>
+      <w:pPr>
+        <w:pStyle w:val="BodyText"/>
+      </w:pPr>
+      <m:oMathPara>
+        <m:oMathParaPr>
+          <m:jc m:val="center"/>
+        </m:oMathParaPr>
+        <m:oMath>
+          <m:eqArr>
+            <m:e>
+              <m:r>
+                <m:rPr>
+                  <m:sty m:val="p"/>
+                </m:rPr>
+                <m:t>Bias</m:t>
+              </m:r>
+              <m:r>
+                <m:t>​</m:t>
+              </m:r>
+              <m:d>
+                <m:dPr>
+                  <m:begChr m:val="("/>
+                  <m:sepChr m:val=""/>
+                  <m:endChr m:val=")"/>
+                  <m:grow/>
+                </m:dPr>
+                <m:e>
+                  <m:r>
+                    <m:t>g</m:t>
+                  </m:r>
+                  <m:r>
+                    <m:t>​</m:t>
+                  </m:r>
+                  <m:d>
+                    <m:dPr>
+                      <m:begChr m:val="("/>
+                      <m:sepChr m:val=""/>
+                      <m:endChr m:val=")"/>
+                      <m:grow/>
+                    </m:dPr>
+                    <m:e>
+                      <m:r>
+                        <m:t>x</m:t>
+                      </m:r>
+                      <m:r>
+                        <m:rPr>
+                          <m:sty m:val="p"/>
+                        </m:rPr>
+                        <m:t>;</m:t>
+                      </m:r>
+                      <m:sSub>
+                        <m:e>
+                          <m:r>
+                            <m:rPr>
+                              <m:scr m:val="script"/>
+                              <m:sty m:val="p"/>
+                            </m:rPr>
+                            <m:t>D</m:t>
+                          </m:r>
+                        </m:e>
+                        <m:sub>
+                          <m:r>
+                            <m:rPr>
+                              <m:nor/>
+                              <m:sty m:val="p"/>
+                            </m:rPr>
+                            <m:t>train</m:t>
+                          </m:r>
+                        </m:sub>
+                      </m:sSub>
+                    </m:e>
+                  </m:d>
+                  <m:r>
+                    <m:t>​</m:t>
+                  </m:r>
+                </m:e>
+              </m:d>
+              <m:r>
+                <m:t>​</m:t>
+              </m:r>
+              <m:r>
+                <m:t>&amp;</m:t>
+              </m:r>
+              <m:r>
+                <m:rPr>
+                  <m:sty m:val="p"/>
+                </m:rPr>
+                <m:t>=</m:t>
+              </m:r>
+              <m:r>
+                <m:rPr>
+                  <m:sty m:val="p"/>
+                </m:rPr>
+                <m:t>E</m:t>
+              </m:r>
+              <m:r>
+                <m:t>​</m:t>
+              </m:r>
+              <m:d>
+                <m:dPr>
+                  <m:begChr m:val="["/>
+                  <m:sepChr m:val=""/>
+                  <m:endChr m:val="]"/>
+                  <m:grow/>
+                </m:dPr>
+                <m:e>
+                  <m:r>
+                    <m:t>ε</m:t>
+                  </m:r>
+                  <m:r>
+                    <m:t>​</m:t>
+                  </m:r>
+                  <m:d>
+                    <m:dPr>
+                      <m:begChr m:val="("/>
+                      <m:sepChr m:val=""/>
+                      <m:endChr m:val=")"/>
+                      <m:grow/>
+                    </m:dPr>
+                    <m:e>
+                      <m:r>
+                        <m:t>g</m:t>
+                      </m:r>
+                      <m:r>
+                        <m:t>​</m:t>
+                      </m:r>
+                      <m:d>
+                        <m:dPr>
+                          <m:begChr m:val="("/>
+                          <m:sepChr m:val=""/>
+                          <m:endChr m:val=")"/>
+                          <m:grow/>
+                        </m:dPr>
+                        <m:e>
+                          <m:r>
+                            <m:t>x</m:t>
+                          </m:r>
+                          <m:r>
+                            <m:rPr>
+                              <m:sty m:val="p"/>
+                            </m:rPr>
+                            <m:t>;</m:t>
+                          </m:r>
+                          <m:sSub>
+                            <m:e>
+                              <m:r>
+                                <m:rPr>
+                                  <m:scr m:val="script"/>
+                                  <m:sty m:val="p"/>
+                                </m:rPr>
+                                <m:t>D</m:t>
+                              </m:r>
+                            </m:e>
+                            <m:sub>
+                              <m:r>
+                                <m:rPr>
+                                  <m:nor/>
+                                  <m:sty m:val="p"/>
+                                </m:rPr>
+                                <m:t>train</m:t>
+                              </m:r>
+                            </m:sub>
+                          </m:sSub>
+                        </m:e>
+                      </m:d>
+                      <m:r>
+                        <m:t>​</m:t>
+                      </m:r>
+                    </m:e>
+                  </m:d>
+                  <m:r>
+                    <m:t>​</m:t>
+                  </m:r>
+                </m:e>
+              </m:d>
+              <m:r>
+                <m:t>​</m:t>
+              </m:r>
+            </m:e>
+            <m:e>
+              <m:r>
+                <m:t>&amp;</m:t>
+              </m:r>
+              <m:r>
+                <m:rPr>
+                  <m:sty m:val="p"/>
+                </m:rPr>
+                <m:t>=</m:t>
+              </m:r>
+              <m:r>
+                <m:rPr>
+                  <m:sty m:val="p"/>
+                </m:rPr>
+                <m:t>E</m:t>
+              </m:r>
+              <m:r>
+                <m:t>​</m:t>
+              </m:r>
+              <m:d>
+                <m:dPr>
+                  <m:begChr m:val="["/>
+                  <m:sepChr m:val=""/>
+                  <m:endChr m:val="]"/>
+                  <m:grow/>
+                </m:dPr>
+                <m:e>
+                  <m:r>
+                    <m:t>g</m:t>
+                  </m:r>
+                  <m:r>
+                    <m:t>​</m:t>
+                  </m:r>
+                  <m:d>
+                    <m:dPr>
+                      <m:begChr m:val="("/>
+                      <m:sepChr m:val=""/>
+                      <m:endChr m:val=")"/>
+                      <m:grow/>
+                    </m:dPr>
+                    <m:e>
+                      <m:r>
+                        <m:t>x</m:t>
+                      </m:r>
+                      <m:r>
+                        <m:rPr>
+                          <m:sty m:val="p"/>
+                        </m:rPr>
+                        <m:t>;</m:t>
+                      </m:r>
+                      <m:sSub>
+                        <m:e>
+                          <m:r>
+                            <m:rPr>
+                              <m:scr m:val="script"/>
+                              <m:sty m:val="p"/>
+                            </m:rPr>
+                            <m:t>D</m:t>
+                          </m:r>
+                        </m:e>
+                        <m:sub>
+                          <m:r>
+                            <m:rPr>
+                              <m:nor/>
+                              <m:sty m:val="p"/>
+                            </m:rPr>
+                            <m:t>train</m:t>
+                          </m:r>
+                        </m:sub>
+                      </m:sSub>
+                    </m:e>
+                  </m:d>
+                  <m:r>
+                    <m:t>​</m:t>
+                  </m:r>
+                </m:e>
+              </m:d>
+              <m:r>
+                <m:t>​</m:t>
+              </m:r>
+              <m:r>
+                <m:rPr>
+                  <m:sty m:val="p"/>
+                </m:rPr>
+                <m:t>−</m:t>
+              </m:r>
+              <m:r>
+                <m:t>μ</m:t>
+              </m:r>
+              <m:r>
+                <m:rPr>
+                  <m:sty m:val="p"/>
+                </m:rPr>
+                <m:t>(</m:t>
+              </m:r>
+              <m:r>
+                <m:t>x</m:t>
+              </m:r>
+              <m:r>
+                <m:rPr>
+                  <m:sty m:val="p"/>
+                </m:rPr>
+                <m:t>)</m:t>
+              </m:r>
+            </m:e>
+            <m:e>
               <m:r>
                 <m:t>&amp;</m:t>
               </m:r>
@@ -60425,7 +60487,7 @@
         <w:rPr>
           <w:rStyle w:val="CommentTok"/>
         </w:rPr>
-        <w:t xml:space="preserve">#&gt;    8.88178e-15    2.00000e+00</w:t>
+        <w:t xml:space="preserve">#&gt;    7.10543e-15    2.00000e+00</w:t>
       </w:r>
     </w:p>
     <w:p>
@@ -60433,7 +60495,7 @@
         <w:pStyle w:val="FirstParagraph"/>
       </w:pPr>
       <w:r>
-        <w:t xml:space="preserve">The two columns differ by at most 8.9e-15,</w:t>
+        <w:t xml:space="preserve">The two columns differ by at most 7.1e-15,</w:t>
       </w:r>
       <w:r>
         <w:t xml:space="preserve"> </w:t>

</xml_diff>

<commit_message>
Deploying to gh-pages from @ Morrison-Lab/sds@1621b6d93f204cde3b086f26e008066a6adcf60a 🚀
</commit_message>
<xml_diff>
--- a/model-validation-handout.docx
+++ b/model-validation-handout.docx
@@ -15,7 +15,7 @@
         <w:pStyle w:val="Date"/>
       </w:pPr>
       <w:r>
-        <w:t xml:space="preserve">Last modified: 2026-10-16 23:52:56 (PDT)</w:t>
+        <w:t xml:space="preserve">Last modified: 2026-10-17 00:12:44 (PDT)</w:t>
       </w:r>
     </w:p>
     <w:bookmarkStart w:id="17" w:name="sec-data-sets"/>
@@ -33840,7 +33840,7 @@
     </w:p>
     <w:bookmarkEnd w:id="135"/>
     <w:bookmarkEnd w:id="136"/>
-    <w:bookmarkStart w:id="183" w:name="sec-data-splits"/>
+    <w:bookmarkStart w:id="185" w:name="sec-data-splits"/>
     <w:p>
       <w:pPr>
         <w:pStyle w:val="Heading2"/>
@@ -35369,7 +35369,7 @@
       </w:r>
     </w:p>
     <w:bookmarkEnd w:id="144"/>
-    <w:bookmarkStart w:id="146" w:name="def-validation-set"/>
+    <w:bookmarkStart w:id="145" w:name="def-model-selection"/>
     <w:p>
       <w:pPr>
         <w:pStyle w:val="BodyText"/>
@@ -35379,7 +35379,220 @@
           <w:b/>
           <w:bCs/>
         </w:rPr>
-        <w:t xml:space="preserve">Definition 32 (Validation set)</w:t>
+        <w:t xml:space="preserve">Definition 32 (Model selection)</w:t>
+      </w:r>
+      <w:r>
+        <w:t xml:space="preserve"> </w:t>
+      </w:r>
+      <w:r>
+        <w:rPr>
+          <w:b/>
+          <w:bCs/>
+        </w:rPr>
+        <w:t xml:space="preserve">Model selection</w:t>
+      </w:r>
+      <w:r>
+        <w:t xml:space="preserve"> </w:t>
+      </w:r>
+      <w:r>
+        <w:t xml:space="preserve">is choosing one fitting procedure</w:t>
+      </w:r>
+      <w:r>
+        <w:t xml:space="preserve"> </w:t>
+      </w:r>
+      <w:r>
+        <w:t xml:space="preserve">from a set of candidate</w:t>
+      </w:r>
+      <w:r>
+        <w:t xml:space="preserve"> </w:t>
+      </w:r>
+      <w:hyperlink w:anchor="def-fitting-procedure">
+        <w:r>
+          <w:rPr>
+            <w:rStyle w:val="Hyperlink"/>
+          </w:rPr>
+          <w:t xml:space="preserve">fitting procedures</w:t>
+        </w:r>
+      </w:hyperlink>
+      <w:r>
+        <w:t xml:space="preserve"> </w:t>
+      </w:r>
+      <m:oMath>
+        <m:sSub>
+          <m:e>
+            <m:r>
+              <m:t>g</m:t>
+            </m:r>
+          </m:e>
+          <m:sub>
+            <m:r>
+              <m:t>1</m:t>
+            </m:r>
+          </m:sub>
+        </m:sSub>
+        <m:r>
+          <m:rPr>
+            <m:sty m:val="p"/>
+          </m:rPr>
+          <m:t>,</m:t>
+        </m:r>
+        <m:r>
+          <m:rPr>
+            <m:sty m:val="p"/>
+          </m:rPr>
+          <m:t>…</m:t>
+        </m:r>
+        <m:r>
+          <m:rPr>
+            <m:sty m:val="p"/>
+          </m:rPr>
+          <m:t>,</m:t>
+        </m:r>
+        <m:sSub>
+          <m:e>
+            <m:r>
+              <m:t>g</m:t>
+            </m:r>
+          </m:e>
+          <m:sub>
+            <m:r>
+              <m:t>L</m:t>
+            </m:r>
+          </m:sub>
+        </m:sSub>
+      </m:oMath>
+      <w:r>
+        <w:t xml:space="preserve">,</w:t>
+      </w:r>
+      <w:r>
+        <w:t xml:space="preserve"> </w:t>
+      </w:r>
+      <w:r>
+        <w:t xml:space="preserve">using observations that were</w:t>
+      </w:r>
+      <w:r>
+        <w:t xml:space="preserve"> </w:t>
+      </w:r>
+      <w:hyperlink w:anchor="def-held-out-set">
+        <w:r>
+          <w:rPr>
+            <w:rStyle w:val="Hyperlink"/>
+          </w:rPr>
+          <w:t xml:space="preserve">held out</w:t>
+        </w:r>
+      </w:hyperlink>
+      <w:r>
+        <w:t xml:space="preserve"> </w:t>
+      </w:r>
+      <w:r>
+        <w:t xml:space="preserve">from fitting.</w:t>
+      </w:r>
+    </w:p>
+    <w:bookmarkEnd w:id="145"/>
+    <w:bookmarkStart w:id="146" w:name="exm-model-selection"/>
+    <w:p>
+      <w:pPr>
+        <w:pStyle w:val="BodyText"/>
+      </w:pPr>
+      <w:r>
+        <w:rPr>
+          <w:b/>
+          <w:bCs/>
+        </w:rPr>
+        <w:t xml:space="preserve">Example 17 (Choosing a polynomial degree)</w:t>
+      </w:r>
+      <w:r>
+        <w:t xml:space="preserve"> </w:t>
+      </w:r>
+      <w:r>
+        <w:t xml:space="preserve">In</w:t>
+      </w:r>
+      <w:r>
+        <w:t xml:space="preserve"> </w:t>
+      </w:r>
+      <w:hyperlink w:anchor="exm-tuning-parameter">
+        <w:r>
+          <w:rPr>
+            <w:rStyle w:val="Hyperlink"/>
+          </w:rPr>
+          <w:t xml:space="preserve">Example 16</w:t>
+        </w:r>
+      </w:hyperlink>
+      <w:r>
+        <w:t xml:space="preserve">,</w:t>
+      </w:r>
+      <w:r>
+        <w:t xml:space="preserve"> </w:t>
+      </w:r>
+      <w:r>
+        <w:t xml:space="preserve">the candidates are least-squares polynomial fits of degree</w:t>
+      </w:r>
+      <w:r>
+        <w:t xml:space="preserve"> </w:t>
+      </w:r>
+      <m:oMath>
+        <m:r>
+          <m:t>1</m:t>
+        </m:r>
+        <m:r>
+          <m:rPr>
+            <m:sty m:val="p"/>
+          </m:rPr>
+          <m:t>,</m:t>
+        </m:r>
+        <m:r>
+          <m:t>2</m:t>
+        </m:r>
+        <m:r>
+          <m:rPr>
+            <m:sty m:val="p"/>
+          </m:rPr>
+          <m:t>,</m:t>
+        </m:r>
+        <m:r>
+          <m:t>3</m:t>
+        </m:r>
+        <m:r>
+          <m:rPr>
+            <m:sty m:val="p"/>
+          </m:rPr>
+          <m:t>,</m:t>
+        </m:r>
+        <m:r>
+          <m:t>4</m:t>
+        </m:r>
+      </m:oMath>
+      <w:r>
+        <w:t xml:space="preserve"> </w:t>
+      </w:r>
+      <w:r>
+        <w:t xml:space="preserve">to the training cars.</w:t>
+      </w:r>
+      <w:r>
+        <w:t xml:space="preserve"> </w:t>
+      </w:r>
+      <w:r>
+        <w:t xml:space="preserve">Choosing among these four degrees is model selection,</w:t>
+      </w:r>
+      <w:r>
+        <w:t xml:space="preserve"> </w:t>
+      </w:r>
+      <w:r>
+        <w:t xml:space="preserve">and the observations it uses are cars held out from fitting.</w:t>
+      </w:r>
+    </w:p>
+    <w:bookmarkEnd w:id="146"/>
+    <w:bookmarkStart w:id="148" w:name="def-validation-set"/>
+    <w:p>
+      <w:pPr>
+        <w:pStyle w:val="BodyText"/>
+      </w:pPr>
+      <w:r>
+        <w:rPr>
+          <w:b/>
+          <w:bCs/>
+        </w:rPr>
+        <w:t xml:space="preserve">Definition 33 (Validation set)</w:t>
       </w:r>
       <w:r>
         <w:t xml:space="preserve"> </w:t>
@@ -35489,7 +35702,7 @@
       <w:pPr>
         <w:pStyle w:val="BodyText"/>
       </w:pPr>
-      <w:bookmarkStart w:id="145" w:name="eq-validation-set"/>
+      <w:bookmarkStart w:id="147" w:name="eq-validation-set"/>
       <m:oMathPara>
         <m:oMathParaPr>
           <m:jc m:val="center"/>
@@ -35610,10 +35823,10 @@
           </m:r>
         </m:oMath>
       </m:oMathPara>
-      <w:bookmarkEnd w:id="145"/>
+      <w:bookmarkEnd w:id="147"/>
     </w:p>
-    <w:bookmarkEnd w:id="146"/>
-    <w:bookmarkStart w:id="148" w:name="def-validation-error"/>
+    <w:bookmarkEnd w:id="148"/>
+    <w:bookmarkStart w:id="150" w:name="def-validation-error"/>
     <w:p>
       <w:pPr>
         <w:pStyle w:val="FirstParagraph"/>
@@ -35623,7 +35836,7 @@
           <w:b/>
           <w:bCs/>
         </w:rPr>
-        <w:t xml:space="preserve">Definition 33 (Validation error)</w:t>
+        <w:t xml:space="preserve">Definition 34 (Validation error)</w:t>
       </w:r>
       <w:r>
         <w:t xml:space="preserve"> </w:t>
@@ -35798,7 +36011,7 @@
       <w:pPr>
         <w:pStyle w:val="BodyText"/>
       </w:pPr>
-      <w:bookmarkStart w:id="147" w:name="eq-validation-error"/>
+      <w:bookmarkStart w:id="149" w:name="eq-validation-error"/>
       <m:oMathPara>
         <m:oMathParaPr>
           <m:jc m:val="center"/>
@@ -35973,10 +36186,10 @@
           </m:r>
         </m:oMath>
       </m:oMathPara>
-      <w:bookmarkEnd w:id="147"/>
+      <w:bookmarkEnd w:id="149"/>
     </w:p>
-    <w:bookmarkEnd w:id="148"/>
-    <w:bookmarkStart w:id="150" w:name="def-validation-choice"/>
+    <w:bookmarkEnd w:id="150"/>
+    <w:bookmarkStart w:id="152" w:name="def-validation-choice"/>
     <w:p>
       <w:pPr>
         <w:pStyle w:val="FirstParagraph"/>
@@ -35986,7 +36199,7 @@
           <w:b/>
           <w:bCs/>
         </w:rPr>
-        <w:t xml:space="preserve">Definition 34 (Validation choice)</w:t>
+        <w:t xml:space="preserve">Definition 35 (Validation choice)</w:t>
       </w:r>
       <w:r>
         <w:t xml:space="preserve"> </w:t>
@@ -36165,7 +36378,7 @@
       <w:pPr>
         <w:pStyle w:val="BodyText"/>
       </w:pPr>
-      <w:bookmarkStart w:id="149" w:name="eq-validation-choice"/>
+      <w:bookmarkStart w:id="151" w:name="eq-validation-choice"/>
       <m:oMathPara>
         <m:oMathParaPr>
           <m:jc m:val="center"/>
@@ -36436,10 +36649,10 @@
           </m:r>
         </m:oMath>
       </m:oMathPara>
-      <w:bookmarkEnd w:id="149"/>
+      <w:bookmarkEnd w:id="151"/>
     </w:p>
-    <w:bookmarkEnd w:id="150"/>
-    <w:bookmarkStart w:id="152" w:name="def-test-set"/>
+    <w:bookmarkEnd w:id="152"/>
+    <w:bookmarkStart w:id="154" w:name="def-test-set"/>
     <w:p>
       <w:pPr>
         <w:pStyle w:val="FirstParagraph"/>
@@ -36449,7 +36662,7 @@
           <w:b/>
           <w:bCs/>
         </w:rPr>
-        <w:t xml:space="preserve">Definition 35 (Test set)</w:t>
+        <w:t xml:space="preserve">Definition 36 (Test set)</w:t>
       </w:r>
       <w:r>
         <w:t xml:space="preserve"> </w:t>
@@ -36583,7 +36796,7 @@
       <w:pPr>
         <w:pStyle w:val="BodyText"/>
       </w:pPr>
-      <w:bookmarkStart w:id="151" w:name="eq-test-set"/>
+      <w:bookmarkStart w:id="153" w:name="eq-test-set"/>
       <m:oMathPara>
         <m:oMathParaPr>
           <m:jc m:val="center"/>
@@ -36704,10 +36917,10 @@
           </m:r>
         </m:oMath>
       </m:oMathPara>
-      <w:bookmarkEnd w:id="151"/>
+      <w:bookmarkEnd w:id="153"/>
     </w:p>
-    <w:bookmarkEnd w:id="152"/>
-    <w:bookmarkStart w:id="154" w:name="def-test-error"/>
+    <w:bookmarkEnd w:id="154"/>
+    <w:bookmarkStart w:id="156" w:name="def-test-error"/>
     <w:p>
       <w:pPr>
         <w:pStyle w:val="FirstParagraph"/>
@@ -36717,7 +36930,7 @@
           <w:b/>
           <w:bCs/>
         </w:rPr>
-        <w:t xml:space="preserve">Definition 36 (Test error)</w:t>
+        <w:t xml:space="preserve">Definition 37 (Test error)</w:t>
       </w:r>
       <w:r>
         <w:t xml:space="preserve"> </w:t>
@@ -36892,7 +37105,7 @@
       <w:pPr>
         <w:pStyle w:val="BodyText"/>
       </w:pPr>
-      <w:bookmarkStart w:id="153" w:name="eq-test-error"/>
+      <w:bookmarkStart w:id="155" w:name="eq-test-error"/>
       <m:oMathPara>
         <m:oMathParaPr>
           <m:jc m:val="center"/>
@@ -37067,10 +37280,10 @@
           </m:r>
         </m:oMath>
       </m:oMathPara>
-      <w:bookmarkEnd w:id="153"/>
+      <w:bookmarkEnd w:id="155"/>
     </w:p>
-    <w:bookmarkEnd w:id="154"/>
-    <w:bookmarkStart w:id="158" w:name="rem-data-splits"/>
+    <w:bookmarkEnd w:id="156"/>
+    <w:bookmarkStart w:id="160" w:name="rem-data-splits"/>
     <w:p>
       <w:pPr>
         <w:pStyle w:val="FirstParagraph"/>
@@ -37245,7 +37458,7 @@
       <w:r>
         <w:t xml:space="preserve"> </w:t>
       </w:r>
-      <w:hyperlink r:id="rId155">
+      <w:hyperlink r:id="rId157">
         <w:r>
           <w:rPr>
             <w:rStyle w:val="Hyperlink"/>
@@ -37265,7 +37478,7 @@
       <w:r>
         <w:t xml:space="preserve"> </w:t>
       </w:r>
-      <w:hyperlink r:id="rId156">
+      <w:hyperlink r:id="rId158">
         <w:r>
           <w:rPr>
             <w:rStyle w:val="Hyperlink"/>
@@ -37285,7 +37498,7 @@
       <w:r>
         <w:t xml:space="preserve"> </w:t>
       </w:r>
-      <w:hyperlink r:id="rId157">
+      <w:hyperlink r:id="rId159">
         <w:r>
           <w:rPr>
             <w:rStyle w:val="Hyperlink"/>
@@ -37303,8 +37516,8 @@
         <w:t xml:space="preserve">They use a different symbol for the training set and a parenthesized observation index, but the same three-way split.</w:t>
       </w:r>
     </w:p>
-    <w:bookmarkEnd w:id="158"/>
-    <w:bookmarkStart w:id="159" w:name="rem-validation-test-error"/>
+    <w:bookmarkEnd w:id="160"/>
+    <w:bookmarkStart w:id="161" w:name="rem-validation-test-error"/>
     <w:p>
       <w:pPr>
         <w:pStyle w:val="BodyText"/>
@@ -37528,8 +37741,8 @@
         <w:t xml:space="preserve">under absolute-error loss, they are sample mean absolute errors.</w:t>
       </w:r>
     </w:p>
-    <w:bookmarkEnd w:id="159"/>
-    <w:bookmarkStart w:id="182" w:name="exm-train-validation-test-split"/>
+    <w:bookmarkEnd w:id="161"/>
+    <w:bookmarkStart w:id="184" w:name="exm-train-validation-test-split"/>
     <w:p>
       <w:pPr>
         <w:pStyle w:val="BodyText"/>
@@ -37539,7 +37752,7 @@
           <w:b/>
           <w:bCs/>
         </w:rPr>
-        <w:t xml:space="preserve">Example 17 (Numerical example)</w:t>
+        <w:t xml:space="preserve">Example 18 (Numerical example)</w:t>
       </w:r>
       <w:r>
         <w:t xml:space="preserve"> </w:t>
@@ -37552,7 +37765,7 @@
           <w:rPr>
             <w:rStyle w:val="Hyperlink"/>
           </w:rPr>
-          <w:t xml:space="preserve">Example 17</w:t>
+          <w:t xml:space="preserve">Example 18</w:t>
         </w:r>
       </w:hyperlink>
       <w:r>
@@ -37763,7 +37976,7 @@
       <w:tr>
         <w:tc>
           <w:tcPr/>
-          <w:bookmarkStart w:id="160" w:name="tbl-train-validation-test-split-sizes"/>
+          <w:bookmarkStart w:id="162" w:name="tbl-train-validation-test-split-sizes"/>
           <w:p>
             <w:pPr>
               <w:jc w:val="center"/>
@@ -38395,7 +38608,7 @@
               <w:t xml:space="preserve">#&gt; 3 test           7</w:t>
             </w:r>
           </w:p>
-          <w:bookmarkEnd w:id="160"/>
+          <w:bookmarkEnd w:id="162"/>
         </w:tc>
       </w:tr>
     </w:tbl>
@@ -42253,7 +42466,7 @@
       <w:tr>
         <w:tc>
           <w:tcPr/>
-          <w:bookmarkStart w:id="164" w:name="fig-linear-model-superimposed"/>
+          <w:bookmarkStart w:id="166" w:name="fig-linear-model-superimposed"/>
           <w:p>
             <w:pPr>
               <w:pStyle w:val="SourceCode"/>
@@ -42293,18 +42506,18 @@
                 <wp:inline>
                   <wp:extent cx="4620126" cy="3696101"/>
                   <wp:effectExtent b="0" l="0" r="0" t="0"/>
-                  <wp:docPr descr="" title="" id="162" name="Picture"/>
+                  <wp:docPr descr="" title="" id="164" name="Picture"/>
                   <a:graphic>
                     <a:graphicData uri="http://schemas.openxmlformats.org/drawingml/2006/picture">
                       <pic:pic>
                         <pic:nvPicPr>
-                          <pic:cNvPr descr="model-validation_files/figure-docx/unnamed-chunk-3-1.png" id="163" name="Picture"/>
+                          <pic:cNvPr descr="model-validation_files/figure-docx/unnamed-chunk-3-1.png" id="165" name="Picture"/>
                           <pic:cNvPicPr>
                             <a:picLocks noChangeArrowheads="1" noChangeAspect="1"/>
                           </pic:cNvPicPr>
                         </pic:nvPicPr>
                         <pic:blipFill>
-                          <a:blip r:embed="rId161"/>
+                          <a:blip r:embed="rId163"/>
                           <a:stretch>
                             <a:fillRect/>
                           </a:stretch>
@@ -42344,7 +42557,7 @@
               <w:t xml:space="preserve">Figure 2: Linear model fit superimposed on data partitions</w:t>
             </w:r>
           </w:p>
-          <w:bookmarkEnd w:id="164"/>
+          <w:bookmarkEnd w:id="166"/>
         </w:tc>
       </w:tr>
     </w:tbl>
@@ -42369,7 +42582,7 @@
       <w:tr>
         <w:tc>
           <w:tcPr/>
-          <w:bookmarkStart w:id="168" w:name="fig-quadratic-model-superimposed"/>
+          <w:bookmarkStart w:id="170" w:name="fig-quadratic-model-superimposed"/>
           <w:p>
             <w:pPr>
               <w:pStyle w:val="SourceCode"/>
@@ -42409,18 +42622,18 @@
                 <wp:inline>
                   <wp:extent cx="4620126" cy="3696101"/>
                   <wp:effectExtent b="0" l="0" r="0" t="0"/>
-                  <wp:docPr descr="" title="" id="166" name="Picture"/>
+                  <wp:docPr descr="" title="" id="168" name="Picture"/>
                   <a:graphic>
                     <a:graphicData uri="http://schemas.openxmlformats.org/drawingml/2006/picture">
                       <pic:pic>
                         <pic:nvPicPr>
-                          <pic:cNvPr descr="model-validation_files/figure-docx/unnamed-chunk-4-1.png" id="167" name="Picture"/>
+                          <pic:cNvPr descr="model-validation_files/figure-docx/unnamed-chunk-4-1.png" id="169" name="Picture"/>
                           <pic:cNvPicPr>
                             <a:picLocks noChangeArrowheads="1" noChangeAspect="1"/>
                           </pic:cNvPicPr>
                         </pic:nvPicPr>
                         <pic:blipFill>
-                          <a:blip r:embed="rId165"/>
+                          <a:blip r:embed="rId167"/>
                           <a:stretch>
                             <a:fillRect/>
                           </a:stretch>
@@ -42460,7 +42673,7 @@
               <w:t xml:space="preserve">Figure 3: Quadratic model fit superimposed on data partitions</w:t>
             </w:r>
           </w:p>
-          <w:bookmarkEnd w:id="168"/>
+          <w:bookmarkEnd w:id="170"/>
         </w:tc>
       </w:tr>
     </w:tbl>
@@ -42485,7 +42698,7 @@
       <w:tr>
         <w:tc>
           <w:tcPr/>
-          <w:bookmarkStart w:id="172" w:name="fig-cubic-model-superimposed"/>
+          <w:bookmarkStart w:id="174" w:name="fig-cubic-model-superimposed"/>
           <w:p>
             <w:pPr>
               <w:pStyle w:val="SourceCode"/>
@@ -42525,18 +42738,18 @@
                 <wp:inline>
                   <wp:extent cx="4620126" cy="3696101"/>
                   <wp:effectExtent b="0" l="0" r="0" t="0"/>
-                  <wp:docPr descr="" title="" id="170" name="Picture"/>
+                  <wp:docPr descr="" title="" id="172" name="Picture"/>
                   <a:graphic>
                     <a:graphicData uri="http://schemas.openxmlformats.org/drawingml/2006/picture">
                       <pic:pic>
                         <pic:nvPicPr>
-                          <pic:cNvPr descr="model-validation_files/figure-docx/unnamed-chunk-5-1.png" id="171" name="Picture"/>
+                          <pic:cNvPr descr="model-validation_files/figure-docx/unnamed-chunk-5-1.png" id="173" name="Picture"/>
                           <pic:cNvPicPr>
                             <a:picLocks noChangeArrowheads="1" noChangeAspect="1"/>
                           </pic:cNvPicPr>
                         </pic:nvPicPr>
                         <pic:blipFill>
-                          <a:blip r:embed="rId169"/>
+                          <a:blip r:embed="rId171"/>
                           <a:stretch>
                             <a:fillRect/>
                           </a:stretch>
@@ -42576,7 +42789,7 @@
               <w:t xml:space="preserve">Figure 4: Cubic model fit superimposed on data partitions</w:t>
             </w:r>
           </w:p>
-          <w:bookmarkEnd w:id="172"/>
+          <w:bookmarkEnd w:id="174"/>
         </w:tc>
       </w:tr>
     </w:tbl>
@@ -42601,7 +42814,7 @@
       <w:tr>
         <w:tc>
           <w:tcPr/>
-          <w:bookmarkStart w:id="176" w:name="fig-quartic-model-superimposed"/>
+          <w:bookmarkStart w:id="178" w:name="fig-quartic-model-superimposed"/>
           <w:p>
             <w:pPr>
               <w:pStyle w:val="SourceCode"/>
@@ -42641,18 +42854,18 @@
                 <wp:inline>
                   <wp:extent cx="4620126" cy="3696101"/>
                   <wp:effectExtent b="0" l="0" r="0" t="0"/>
-                  <wp:docPr descr="" title="" id="174" name="Picture"/>
+                  <wp:docPr descr="" title="" id="176" name="Picture"/>
                   <a:graphic>
                     <a:graphicData uri="http://schemas.openxmlformats.org/drawingml/2006/picture">
                       <pic:pic>
                         <pic:nvPicPr>
-                          <pic:cNvPr descr="model-validation_files/figure-docx/unnamed-chunk-6-1.png" id="175" name="Picture"/>
+                          <pic:cNvPr descr="model-validation_files/figure-docx/unnamed-chunk-6-1.png" id="177" name="Picture"/>
                           <pic:cNvPicPr>
                             <a:picLocks noChangeArrowheads="1" noChangeAspect="1"/>
                           </pic:cNvPicPr>
                         </pic:nvPicPr>
                         <pic:blipFill>
-                          <a:blip r:embed="rId173"/>
+                          <a:blip r:embed="rId175"/>
                           <a:stretch>
                             <a:fillRect/>
                           </a:stretch>
@@ -42692,7 +42905,7 @@
               <w:t xml:space="preserve">Figure 5: Quartic model fit superimposed on data partitions</w:t>
             </w:r>
           </w:p>
-          <w:bookmarkEnd w:id="176"/>
+          <w:bookmarkEnd w:id="178"/>
         </w:tc>
       </w:tr>
     </w:tbl>
@@ -42717,7 +42930,7 @@
       <w:tr>
         <w:tc>
           <w:tcPr/>
-          <w:bookmarkStart w:id="177" w:name="tbl-train-validation-results"/>
+          <w:bookmarkStart w:id="179" w:name="tbl-train-validation-results"/>
           <w:p>
             <w:pPr>
               <w:jc w:val="center"/>
@@ -42806,7 +43019,7 @@
               <w:t xml:space="preserve">#&gt; 4 quartic            1.90            3.97</w:t>
             </w:r>
           </w:p>
-          <w:bookmarkEnd w:id="177"/>
+          <w:bookmarkEnd w:id="179"/>
         </w:tc>
       </w:tr>
     </w:tbl>
@@ -42875,7 +43088,7 @@
       <w:tr>
         <w:tc>
           <w:tcPr/>
-          <w:bookmarkStart w:id="178" w:name="tbl-train-validation-test-rmse"/>
+          <w:bookmarkStart w:id="180" w:name="tbl-train-validation-test-rmse"/>
           <w:p>
             <w:pPr>
               <w:jc w:val="center"/>
@@ -42952,7 +43165,7 @@
               <w:t xml:space="preserve">#&gt; 2 test       linear  2.44</w:t>
             </w:r>
           </w:p>
-          <w:bookmarkEnd w:id="178"/>
+          <w:bookmarkEnd w:id="180"/>
         </w:tc>
       </w:tr>
     </w:tbl>
@@ -43005,18 +43218,18 @@
                 <wp:inline>
                   <wp:extent cx="152400" cy="152400"/>
                   <wp:effectExtent b="0" l="0" r="0" t="0"/>
-                  <wp:docPr descr="" title="" id="180" name="Picture"/>
+                  <wp:docPr descr="" title="" id="182" name="Picture"/>
                   <a:graphic>
                     <a:graphicData uri="http://schemas.openxmlformats.org/drawingml/2006/picture">
                       <pic:pic>
                         <pic:nvPicPr>
-                          <pic:cNvPr descr="/opt/quarto/share/formats/docx/note.png" id="181" name="Picture"/>
+                          <pic:cNvPr descr="/opt/quarto/share/formats/docx/note.png" id="183" name="Picture"/>
                           <pic:cNvPicPr>
                             <a:picLocks noChangeArrowheads="1" noChangeAspect="1"/>
                           </pic:cNvPicPr>
                         </pic:nvPicPr>
                         <pic:blipFill>
-                          <a:blip r:embed="rId179"/>
+                          <a:blip r:embed="rId181"/>
                           <a:stretch>
                             <a:fillRect/>
                           </a:stretch>
@@ -43089,9 +43302,9 @@
         </w:tc>
       </w:tr>
     </w:tbl>
-    <w:bookmarkEnd w:id="182"/>
-    <w:bookmarkEnd w:id="183"/>
-    <w:bookmarkStart w:id="219" w:name="sec-kfold"/>
+    <w:bookmarkEnd w:id="184"/>
+    <w:bookmarkEnd w:id="185"/>
+    <w:bookmarkStart w:id="221" w:name="sec-kfold"/>
     <w:p>
       <w:pPr>
         <w:pStyle w:val="Heading2"/>
@@ -43111,7 +43324,7 @@
         <w:t xml:space="preserve">-fold cross-validation</w:t>
       </w:r>
     </w:p>
-    <w:bookmarkStart w:id="184" w:name="exr-kfold"/>
+    <w:bookmarkStart w:id="186" w:name="exr-kfold"/>
     <w:p>
       <w:pPr>
         <w:pStyle w:val="FirstParagraph"/>
@@ -43262,8 +43475,8 @@
         <w:t xml:space="preserve">How many times is a given car used for fitting, and how many times for prediction?</w:t>
       </w:r>
     </w:p>
-    <w:bookmarkEnd w:id="184"/>
-    <w:bookmarkStart w:id="185" w:name="sol-kfold"/>
+    <w:bookmarkEnd w:id="186"/>
+    <w:bookmarkStart w:id="187" w:name="sol-kfold"/>
     <w:p>
       <w:pPr>
         <w:pStyle w:val="FirstParagraph"/>
@@ -43437,8 +43650,8 @@
         <w:t xml:space="preserve">fits.</w:t>
       </w:r>
     </w:p>
-    <w:bookmarkEnd w:id="185"/>
-    <w:bookmarkStart w:id="187" w:name="def-folds"/>
+    <w:bookmarkEnd w:id="187"/>
+    <w:bookmarkStart w:id="189" w:name="def-folds"/>
     <w:p>
       <w:pPr>
         <w:pStyle w:val="FirstParagraph"/>
@@ -43448,7 +43661,7 @@
           <w:b/>
           <w:bCs/>
         </w:rPr>
-        <w:t xml:space="preserve">Definition 37 (Folds)</w:t>
+        <w:t xml:space="preserve">Definition 38 (Folds)</w:t>
       </w:r>
       <w:r>
         <w:t xml:space="preserve"> </w:t>
@@ -43627,7 +43840,7 @@
       <w:pPr>
         <w:pStyle w:val="BodyText"/>
       </w:pPr>
-      <w:bookmarkStart w:id="186" w:name="eq-folds"/>
+      <w:bookmarkStart w:id="188" w:name="eq-folds"/>
       <m:oMathPara>
         <m:oMathParaPr>
           <m:jc m:val="center"/>
@@ -43718,10 +43931,10 @@
           </m:r>
         </m:oMath>
       </m:oMathPara>
-      <w:bookmarkEnd w:id="186"/>
+      <w:bookmarkEnd w:id="188"/>
     </w:p>
-    <w:bookmarkEnd w:id="187"/>
-    <w:bookmarkStart w:id="188" w:name="rem-source-folds"/>
+    <w:bookmarkEnd w:id="189"/>
+    <w:bookmarkStart w:id="190" w:name="rem-source-folds"/>
     <w:p>
       <w:pPr>
         <w:pStyle w:val="FirstParagraph"/>
@@ -43775,8 +43988,8 @@
         <w:t xml:space="preserve">roughly equal-sized parts.</w:t>
       </w:r>
     </w:p>
-    <w:bookmarkEnd w:id="188"/>
-    <w:bookmarkStart w:id="190" w:name="def-fold-size"/>
+    <w:bookmarkEnd w:id="190"/>
+    <w:bookmarkStart w:id="192" w:name="def-fold-size"/>
     <w:p>
       <w:pPr>
         <w:pStyle w:val="BodyText"/>
@@ -43786,7 +43999,7 @@
           <w:b/>
           <w:bCs/>
         </w:rPr>
-        <w:t xml:space="preserve">Definition 38 (Fold size)</w:t>
+        <w:t xml:space="preserve">Definition 39 (Fold size)</w:t>
       </w:r>
       <w:r>
         <w:t xml:space="preserve"> </w:t>
@@ -43870,7 +44083,7 @@
       <w:pPr>
         <w:pStyle w:val="BodyText"/>
       </w:pPr>
-      <w:bookmarkStart w:id="189" w:name="eq-fold-size"/>
+      <w:bookmarkStart w:id="191" w:name="eq-fold-size"/>
       <m:oMathPara>
         <m:oMathParaPr>
           <m:jc m:val="center"/>
@@ -43965,10 +44178,10 @@
           </m:r>
         </m:oMath>
       </m:oMathPara>
-      <w:bookmarkEnd w:id="189"/>
+      <w:bookmarkEnd w:id="191"/>
     </w:p>
-    <w:bookmarkEnd w:id="190"/>
-    <w:bookmarkStart w:id="192" w:name="def-fold-assignment"/>
+    <w:bookmarkEnd w:id="192"/>
+    <w:bookmarkStart w:id="194" w:name="def-fold-assignment"/>
     <w:p>
       <w:pPr>
         <w:pStyle w:val="FirstParagraph"/>
@@ -43978,7 +44191,7 @@
           <w:b/>
           <w:bCs/>
         </w:rPr>
-        <w:t xml:space="preserve">Definition 39 (Fold assignment)</w:t>
+        <w:t xml:space="preserve">Definition 40 (Fold assignment)</w:t>
       </w:r>
       <w:r>
         <w:t xml:space="preserve"> </w:t>
@@ -44123,7 +44336,7 @@
       <w:pPr>
         <w:pStyle w:val="BodyText"/>
       </w:pPr>
-      <w:bookmarkStart w:id="191" w:name="eq-fold-assignment"/>
+      <w:bookmarkStart w:id="193" w:name="eq-fold-assignment"/>
       <m:oMathPara>
         <m:oMathParaPr>
           <m:jc m:val="center"/>
@@ -44199,10 +44412,10 @@
           </m:r>
         </m:oMath>
       </m:oMathPara>
-      <w:bookmarkEnd w:id="191"/>
+      <w:bookmarkEnd w:id="193"/>
     </w:p>
-    <w:bookmarkEnd w:id="192"/>
-    <w:bookmarkStart w:id="193" w:name="rem-source-fold-assignment"/>
+    <w:bookmarkEnd w:id="194"/>
+    <w:bookmarkStart w:id="195" w:name="rem-source-fold-assignment"/>
     <w:p>
       <w:pPr>
         <w:pStyle w:val="FirstParagraph"/>
@@ -44263,8 +44476,8 @@
         <w:t xml:space="preserve">.</w:t>
       </w:r>
     </w:p>
-    <w:bookmarkEnd w:id="193"/>
-    <w:bookmarkStart w:id="195" w:name="def-fold-out-rule"/>
+    <w:bookmarkEnd w:id="195"/>
+    <w:bookmarkStart w:id="197" w:name="def-fold-out-rule"/>
     <w:p>
       <w:pPr>
         <w:pStyle w:val="BodyText"/>
@@ -44274,7 +44487,7 @@
           <w:b/>
           <w:bCs/>
         </w:rPr>
-        <w:t xml:space="preserve">Definition 40 (Fold-out rule)</w:t>
+        <w:t xml:space="preserve">Definition 41 (Fold-out rule)</w:t>
       </w:r>
       <w:r>
         <w:t xml:space="preserve"> </w:t>
@@ -44456,7 +44669,7 @@
       <w:pPr>
         <w:pStyle w:val="BodyText"/>
       </w:pPr>
-      <w:bookmarkStart w:id="194" w:name="eq-fold-out-rule"/>
+      <w:bookmarkStart w:id="196" w:name="eq-fold-out-rule"/>
       <m:oMathPara>
         <m:oMathParaPr>
           <m:jc m:val="center"/>
@@ -44689,10 +44902,10 @@
           </m:r>
         </m:oMath>
       </m:oMathPara>
-      <w:bookmarkEnd w:id="194"/>
+      <w:bookmarkEnd w:id="196"/>
     </w:p>
-    <w:bookmarkEnd w:id="195"/>
-    <w:bookmarkStart w:id="196" w:name="rem-source-fold-out-rule"/>
+    <w:bookmarkEnd w:id="197"/>
+    <w:bookmarkStart w:id="198" w:name="rem-source-fold-out-rule"/>
     <w:p>
       <w:pPr>
         <w:pStyle w:val="FirstParagraph"/>
@@ -44764,8 +44977,8 @@
         <w:t xml:space="preserve">.</w:t>
       </w:r>
     </w:p>
-    <w:bookmarkEnd w:id="196"/>
-    <w:bookmarkStart w:id="197" w:name="def-kfold"/>
+    <w:bookmarkEnd w:id="198"/>
+    <w:bookmarkStart w:id="199" w:name="def-kfold"/>
     <w:p>
       <w:pPr>
         <w:pStyle w:val="BodyText"/>
@@ -44775,7 +44988,7 @@
           <w:b/>
           <w:bCs/>
         </w:rPr>
-        <w:t xml:space="preserve">Definition 41 (</w:t>
+        <w:t xml:space="preserve">Definition 42 (</w:t>
       </w:r>
       <m:oMath>
         <m:r>
@@ -45112,8 +45325,8 @@
         <w:t xml:space="preserve">Compute a summary prediction-error measure across all folds.</w:t>
       </w:r>
     </w:p>
-    <w:bookmarkEnd w:id="197"/>
-    <w:bookmarkStart w:id="198" w:name="rem-kfold-vs-validation-set"/>
+    <w:bookmarkEnd w:id="199"/>
+    <w:bookmarkStart w:id="200" w:name="rem-kfold-vs-validation-set"/>
     <w:p>
       <w:pPr>
         <w:pStyle w:val="FirstParagraph"/>
@@ -45215,8 +45428,8 @@
         <w:t xml:space="preserve">give 4 fits on 24 cars each.</w:t>
       </w:r>
     </w:p>
-    <w:bookmarkEnd w:id="198"/>
-    <w:bookmarkStart w:id="200" w:name="def-cv-estimate"/>
+    <w:bookmarkEnd w:id="200"/>
+    <w:bookmarkStart w:id="202" w:name="def-cv-estimate"/>
     <w:p>
       <w:pPr>
         <w:pStyle w:val="BodyText"/>
@@ -45226,7 +45439,7 @@
           <w:b/>
           <w:bCs/>
         </w:rPr>
-        <w:t xml:space="preserve">Definition 42 (Cross-validation estimate)</w:t>
+        <w:t xml:space="preserve">Definition 43 (Cross-validation estimate)</w:t>
       </w:r>
       <w:r>
         <w:t xml:space="preserve"> </w:t>
@@ -45432,7 +45645,7 @@
       <w:pPr>
         <w:pStyle w:val="BodyText"/>
       </w:pPr>
-      <w:bookmarkStart w:id="199" w:name="eq-cv-estimate"/>
+      <w:bookmarkStart w:id="201" w:name="eq-cv-estimate"/>
       <m:oMathPara>
         <m:oMathParaPr>
           <m:jc m:val="center"/>
@@ -45695,10 +45908,10 @@
           </m:r>
         </m:oMath>
       </m:oMathPara>
-      <w:bookmarkEnd w:id="199"/>
+      <w:bookmarkEnd w:id="201"/>
     </w:p>
-    <w:bookmarkEnd w:id="200"/>
-    <w:bookmarkStart w:id="201" w:name="rem-source-cv-estimate"/>
+    <w:bookmarkEnd w:id="202"/>
+    <w:bookmarkStart w:id="203" w:name="rem-source-cv-estimate"/>
     <w:p>
       <w:pPr>
         <w:pStyle w:val="FirstParagraph"/>
@@ -45750,8 +45963,8 @@
         <w:t xml:space="preserve">.</w:t>
       </w:r>
     </w:p>
-    <w:bookmarkEnd w:id="201"/>
-    <w:bookmarkStart w:id="202" w:name="exr-cv-estimate-by-fold"/>
+    <w:bookmarkEnd w:id="203"/>
+    <w:bookmarkStart w:id="204" w:name="exr-cv-estimate-by-fold"/>
     <w:p>
       <w:pPr>
         <w:pStyle w:val="BodyText"/>
@@ -45956,8 +46169,8 @@
         <w:t xml:space="preserve">.</w:t>
       </w:r>
     </w:p>
-    <w:bookmarkEnd w:id="202"/>
-    <w:bookmarkStart w:id="203" w:name="sol-cv-estimate-by-fold"/>
+    <w:bookmarkEnd w:id="204"/>
+    <w:bookmarkStart w:id="205" w:name="sol-cv-estimate-by-fold"/>
     <w:p>
       <w:pPr>
         <w:pStyle w:val="BodyText"/>
@@ -46055,7 +46268,7 @@
           <w:rPr>
             <w:rStyle w:val="Hyperlink"/>
           </w:rPr>
-          <w:t xml:space="preserve">Definition 37</w:t>
+          <w:t xml:space="preserve">Definition 38</w:t>
         </w:r>
       </w:hyperlink>
       <w:r>
@@ -47118,8 +47331,8 @@
         <w:t xml:space="preserve">so each inner sum uses a single fitted rule.</w:t>
       </w:r>
     </w:p>
-    <w:bookmarkEnd w:id="203"/>
-    <w:bookmarkStart w:id="205" w:name="thm-cv-estimate-by-fold"/>
+    <w:bookmarkEnd w:id="205"/>
+    <w:bookmarkStart w:id="207" w:name="thm-cv-estimate-by-fold"/>
     <w:p>
       <w:pPr>
         <w:pStyle w:val="BodyText"/>
@@ -47208,7 +47421,7 @@
       <w:pPr>
         <w:pStyle w:val="BodyText"/>
       </w:pPr>
-      <w:bookmarkStart w:id="204" w:name="eq-cv-estimate-by-fold"/>
+      <w:bookmarkStart w:id="206" w:name="eq-cv-estimate-by-fold"/>
       <m:oMathPara>
         <m:oMathParaPr>
           <m:jc m:val="center"/>
@@ -47481,9 +47694,9 @@
           </m:r>
         </m:oMath>
       </m:oMathPara>
-      <w:bookmarkEnd w:id="204"/>
+      <w:bookmarkEnd w:id="206"/>
     </w:p>
-    <w:bookmarkEnd w:id="205"/>
+    <w:bookmarkEnd w:id="207"/>
     <w:p>
       <w:pPr>
         <w:pStyle w:val="FirstParagraph"/>
@@ -47516,7 +47729,7 @@
         <w:t xml:space="preserve">.</w:t>
       </w:r>
     </w:p>
-    <w:bookmarkStart w:id="207" w:name="def-fold-mse"/>
+    <w:bookmarkStart w:id="209" w:name="def-fold-mse"/>
     <w:p>
       <w:pPr>
         <w:pStyle w:val="BodyText"/>
@@ -47526,7 +47739,7 @@
           <w:b/>
           <w:bCs/>
         </w:rPr>
-        <w:t xml:space="preserve">Definition 43 (Fold mean squared error)</w:t>
+        <w:t xml:space="preserve">Definition 44 (Fold mean squared error)</w:t>
       </w:r>
       <w:r>
         <w:t xml:space="preserve"> </w:t>
@@ -47684,7 +47897,7 @@
       <w:pPr>
         <w:pStyle w:val="BodyText"/>
       </w:pPr>
-      <w:bookmarkStart w:id="206" w:name="eq-fold-mse"/>
+      <w:bookmarkStart w:id="208" w:name="eq-fold-mse"/>
       <m:oMathPara>
         <m:oMathParaPr>
           <m:jc m:val="center"/>
@@ -47924,10 +48137,10 @@
           </m:r>
         </m:oMath>
       </m:oMathPara>
-      <w:bookmarkEnd w:id="206"/>
+      <w:bookmarkEnd w:id="208"/>
     </w:p>
-    <w:bookmarkEnd w:id="207"/>
-    <w:bookmarkStart w:id="208" w:name="rem-source-fold-mse"/>
+    <w:bookmarkEnd w:id="209"/>
+    <w:bookmarkStart w:id="210" w:name="rem-source-fold-mse"/>
     <w:p>
       <w:pPr>
         <w:pStyle w:val="FirstParagraph"/>
@@ -48007,8 +48220,8 @@
         <w:t xml:space="preserve">.</w:t>
       </w:r>
     </w:p>
-    <w:bookmarkEnd w:id="208"/>
-    <w:bookmarkStart w:id="209" w:name="rem-cv-estimate"/>
+    <w:bookmarkEnd w:id="210"/>
+    <w:bookmarkStart w:id="211" w:name="rem-cv-estimate"/>
     <w:p>
       <w:pPr>
         <w:pStyle w:val="BodyText"/>
@@ -48687,8 +48900,8 @@
         <w:t xml:space="preserve">use.</w:t>
       </w:r>
     </w:p>
-    <w:bookmarkEnd w:id="209"/>
-    <w:bookmarkStart w:id="210" w:name="rem-choosing-k"/>
+    <w:bookmarkEnd w:id="211"/>
+    <w:bookmarkStart w:id="212" w:name="rem-choosing-k"/>
     <w:p>
       <w:pPr>
         <w:pStyle w:val="BodyText"/>
@@ -49095,8 +49308,8 @@
         <w:t xml:space="preserve">is the usual compromise.</w:t>
       </w:r>
     </w:p>
-    <w:bookmarkEnd w:id="210"/>
-    <w:bookmarkStart w:id="215" w:name="exm-kfold-simulated"/>
+    <w:bookmarkEnd w:id="212"/>
+    <w:bookmarkStart w:id="217" w:name="exm-kfold-simulated"/>
     <w:p>
       <w:pPr>
         <w:pStyle w:val="BodyText"/>
@@ -49106,7 +49319,7 @@
           <w:b/>
           <w:bCs/>
         </w:rPr>
-        <w:t xml:space="preserve">Example 18 (Cross-validation versus the generalization error)</w:t>
+        <w:t xml:space="preserve">Example 19 (Cross-validation versus the generalization error)</w:t>
       </w:r>
       <w:r>
         <w:t xml:space="preserve"> </w:t>
@@ -50328,7 +50541,7 @@
       <w:tr>
         <w:tc>
           <w:tcPr/>
-          <w:bookmarkStart w:id="214" w:name="fig-cv-simulated"/>
+          <w:bookmarkStart w:id="216" w:name="fig-cv-simulated"/>
           <w:p>
             <w:pPr>
               <w:pStyle w:val="SourceCode"/>
@@ -51274,18 +51487,18 @@
                 <wp:inline>
                   <wp:extent cx="4620126" cy="3696101"/>
                   <wp:effectExtent b="0" l="0" r="0" t="0"/>
-                  <wp:docPr descr="" title="" id="212" name="Picture"/>
+                  <wp:docPr descr="" title="" id="214" name="Picture"/>
                   <a:graphic>
                     <a:graphicData uri="http://schemas.openxmlformats.org/drawingml/2006/picture">
                       <pic:pic>
                         <pic:nvPicPr>
-                          <pic:cNvPr descr="model-validation_files/figure-docx/cv-simulated-plot-1.png" id="213" name="Picture"/>
+                          <pic:cNvPr descr="model-validation_files/figure-docx/cv-simulated-plot-1.png" id="215" name="Picture"/>
                           <pic:cNvPicPr>
                             <a:picLocks noChangeArrowheads="1" noChangeAspect="1"/>
                           </pic:cNvPicPr>
                         </pic:nvPicPr>
                         <pic:blipFill>
-                          <a:blip r:embed="rId211"/>
+                          <a:blip r:embed="rId213"/>
                           <a:stretch>
                             <a:fillRect/>
                           </a:stretch>
@@ -51354,7 +51567,7 @@
               <w:t xml:space="preserve">could be computed from real data.</w:t>
             </w:r>
           </w:p>
-          <w:bookmarkEnd w:id="214"/>
+          <w:bookmarkEnd w:id="216"/>
         </w:tc>
       </w:tr>
     </w:tbl>
@@ -53255,8 +53468,8 @@
         <w:t xml:space="preserve">new ones.</w:t>
       </w:r>
     </w:p>
-    <w:bookmarkEnd w:id="215"/>
-    <w:bookmarkStart w:id="218" w:name="exm-kfold-mtcars"/>
+    <w:bookmarkEnd w:id="217"/>
+    <w:bookmarkStart w:id="220" w:name="exm-kfold-mtcars"/>
     <w:p>
       <w:pPr>
         <w:pStyle w:val="BodyText"/>
@@ -53266,7 +53479,7 @@
           <w:b/>
           <w:bCs/>
         </w:rPr>
-        <w:t xml:space="preserve">Example 19 (Four-fold cross-validation of the</w:t>
+        <w:t xml:space="preserve">Example 20 (Four-fold cross-validation of the</w:t>
       </w:r>
       <w:r>
         <w:rPr>
@@ -53415,7 +53628,7 @@
           <w:rPr>
             <w:rStyle w:val="Hyperlink"/>
           </w:rPr>
-          <w:t xml:space="preserve">Example 18</w:t>
+          <w:t xml:space="preserve">Example 19</w:t>
         </w:r>
       </w:hyperlink>
       <w:r>
@@ -53459,7 +53672,7 @@
       <w:tr>
         <w:tc>
           <w:tcPr/>
-          <w:bookmarkStart w:id="216" w:name="tbl-cv-mtcars-repeats"/>
+          <w:bookmarkStart w:id="218" w:name="tbl-cv-mtcars-repeats"/>
           <w:p>
             <w:pPr>
               <w:jc w:val="center"/>
@@ -54115,7 +54328,7 @@
               <w:t xml:space="preserve">#&gt; 5         5     3.38     2.74     2.78     2.81</w:t>
             </w:r>
           </w:p>
-          <w:bookmarkEnd w:id="216"/>
+          <w:bookmarkEnd w:id="218"/>
         </w:tc>
       </w:tr>
     </w:tbl>
@@ -54140,7 +54353,7 @@
       <w:tr>
         <w:tc>
           <w:tcPr/>
-          <w:bookmarkStart w:id="217" w:name="tbl-cv-mtcars"/>
+          <w:bookmarkStart w:id="219" w:name="tbl-cv-mtcars"/>
           <w:p>
             <w:pPr>
               <w:jc w:val="center"/>
@@ -54496,7 +54709,7 @@
               <w:t xml:space="preserve">#&gt; 5         5 2       2.74</w:t>
             </w:r>
           </w:p>
-          <w:bookmarkEnd w:id="217"/>
+          <w:bookmarkEnd w:id="219"/>
         </w:tc>
       </w:tr>
     </w:tbl>
@@ -55186,9 +55399,9 @@
         <w:t xml:space="preserve">may not survive a different split.</w:t>
       </w:r>
     </w:p>
-    <w:bookmarkEnd w:id="218"/>
-    <w:bookmarkEnd w:id="219"/>
-    <w:bookmarkStart w:id="247" w:name="sec-loocv"/>
+    <w:bookmarkEnd w:id="220"/>
+    <w:bookmarkEnd w:id="221"/>
+    <w:bookmarkStart w:id="249" w:name="sec-loocv"/>
     <w:p>
       <w:pPr>
         <w:pStyle w:val="Heading2"/>
@@ -55197,7 +55410,7 @@
         <w:t xml:space="preserve">7 Leave-one-out cross-validation</w:t>
       </w:r>
     </w:p>
-    <w:bookmarkStart w:id="220" w:name="exr-loocv"/>
+    <w:bookmarkStart w:id="222" w:name="exr-loocv"/>
     <w:p>
       <w:pPr>
         <w:pStyle w:val="FirstParagraph"/>
@@ -55407,8 +55620,8 @@
         <w:t xml:space="preserve">) differ?</w:t>
       </w:r>
     </w:p>
-    <w:bookmarkEnd w:id="220"/>
-    <w:bookmarkStart w:id="221" w:name="sol-loocv"/>
+    <w:bookmarkEnd w:id="222"/>
+    <w:bookmarkStart w:id="223" w:name="sol-loocv"/>
     <w:p>
       <w:pPr>
         <w:pStyle w:val="FirstParagraph"/>
@@ -55592,7 +55805,7 @@
           <w:rPr>
             <w:rStyle w:val="Hyperlink"/>
           </w:rPr>
-          <w:t xml:space="preserve">Example 19</w:t>
+          <w:t xml:space="preserve">Example 20</w:t>
         </w:r>
       </w:hyperlink>
       <w:r>
@@ -55605,8 +55818,8 @@
         <w:t xml:space="preserve">the estimate is not random.</w:t>
       </w:r>
     </w:p>
-    <w:bookmarkEnd w:id="221"/>
-    <w:bookmarkStart w:id="223" w:name="def-loocv"/>
+    <w:bookmarkEnd w:id="223"/>
+    <w:bookmarkStart w:id="225" w:name="def-loocv"/>
     <w:p>
       <w:pPr>
         <w:pStyle w:val="FirstParagraph"/>
@@ -55616,7 +55829,7 @@
           <w:b/>
           <w:bCs/>
         </w:rPr>
-        <w:t xml:space="preserve">Definition 44 (Leave-one-out cross-validation)</w:t>
+        <w:t xml:space="preserve">Definition 45 (Leave-one-out cross-validation)</w:t>
       </w:r>
       <w:r>
         <w:t xml:space="preserve"> </w:t>
@@ -55914,7 +56127,7 @@
       <w:pPr>
         <w:pStyle w:val="BodyText"/>
       </w:pPr>
-      <w:bookmarkStart w:id="222" w:name="eq-loocv"/>
+      <w:bookmarkStart w:id="224" w:name="eq-loocv"/>
       <m:oMathPara>
         <m:oMathParaPr>
           <m:jc m:val="center"/>
@@ -56164,7 +56377,7 @@
           </m:r>
         </m:oMath>
       </m:oMathPara>
-      <w:bookmarkEnd w:id="222"/>
+      <w:bookmarkEnd w:id="224"/>
     </w:p>
     <w:p>
       <w:pPr>
@@ -56183,8 +56396,8 @@
         <w:t xml:space="preserve">.</w:t>
       </w:r>
     </w:p>
-    <w:bookmarkEnd w:id="223"/>
-    <w:bookmarkStart w:id="224" w:name="lem-loocv-not-random"/>
+    <w:bookmarkEnd w:id="225"/>
+    <w:bookmarkStart w:id="226" w:name="lem-loocv-not-random"/>
     <w:p>
       <w:pPr>
         <w:pStyle w:val="BodyText"/>
@@ -56533,7 +56746,7 @@
         <w:t xml:space="preserve">.</w:t>
       </w:r>
     </w:p>
-    <w:bookmarkEnd w:id="224"/>
+    <w:bookmarkEnd w:id="226"/>
     <w:p>
       <w:pPr>
         <w:pStyle w:val="BodyText"/>
@@ -58059,7 +58272,7 @@
         <w:t xml:space="preserve">fits, with the folds numbered differently.</w:t>
       </w:r>
     </w:p>
-    <w:bookmarkStart w:id="226" w:name="def-term-vector"/>
+    <w:bookmarkStart w:id="228" w:name="def-term-vector"/>
     <w:p>
       <w:pPr>
         <w:pStyle w:val="FirstParagraph"/>
@@ -58069,7 +58282,7 @@
           <w:b/>
           <w:bCs/>
         </w:rPr>
-        <w:t xml:space="preserve">Definition 45 (Term vector)</w:t>
+        <w:t xml:space="preserve">Definition 46 (Term vector)</w:t>
       </w:r>
       <w:r>
         <w:t xml:space="preserve"> </w:t>
@@ -58302,16 +58515,16 @@
       <w:pPr>
         <w:pStyle w:val="BodyText"/>
       </w:pPr>
-      <w:bookmarkStart w:id="225" w:name="eq-term-vector"/>
+      <w:bookmarkStart w:id="227" w:name="eq-term-vector"/>
       <w:r>
         <w:t xml:space="preserve">$$
     \mathord{\smash[b]{\underset{\raise.3ex\hbox{$\scriptstyle\sim$}}{t}}\vphantom{t}}_{i} \stackrel{\text{def}}{=}{\mathopen{}\left(t_{1}(x_{i}), \ldots, t_{p^{*}}(x_{i})\right)\mathclose{}}^{\top}.
      \qquad(41)$$</w:t>
       </w:r>
-      <w:bookmarkEnd w:id="225"/>
+      <w:bookmarkEnd w:id="227"/>
     </w:p>
-    <w:bookmarkEnd w:id="226"/>
-    <w:bookmarkStart w:id="228" w:name="rem-term-vector"/>
+    <w:bookmarkEnd w:id="228"/>
+    <w:bookmarkStart w:id="230" w:name="rem-term-vector"/>
     <w:p>
       <w:pPr>
         <w:pStyle w:val="FirstParagraph"/>
@@ -58386,7 +58599,7 @@
       <w:r>
         <w:t xml:space="preserve"> </w:t>
       </w:r>
-      <w:hyperlink r:id="rId227">
+      <w:hyperlink r:id="rId229">
         <w:r>
           <w:rPr>
             <w:rStyle w:val="Hyperlink"/>
@@ -58404,8 +58617,8 @@
         <w:t xml:space="preserve">.</w:t>
       </w:r>
     </w:p>
-    <w:bookmarkEnd w:id="228"/>
-    <w:bookmarkStart w:id="230" w:name="def-cross-product-matrix"/>
+    <w:bookmarkEnd w:id="230"/>
+    <w:bookmarkStart w:id="232" w:name="def-cross-product-matrix"/>
     <w:p>
       <w:pPr>
         <w:pStyle w:val="BodyText"/>
@@ -58415,7 +58628,7 @@
           <w:b/>
           <w:bCs/>
         </w:rPr>
-        <w:t xml:space="preserve">Definition 46 (Cross-product matrix (sum-of-squares and cross-products matrix))</w:t>
+        <w:t xml:space="preserve">Definition 47 (Cross-product matrix (sum-of-squares and cross-products matrix))</w:t>
       </w:r>
       <w:r>
         <w:t xml:space="preserve"> </w:t>
@@ -58509,16 +58722,16 @@
       <w:pPr>
         <w:pStyle w:val="BodyText"/>
       </w:pPr>
-      <w:bookmarkStart w:id="229" w:name="eq-cross-product-matrix"/>
+      <w:bookmarkStart w:id="231" w:name="eq-cross-product-matrix"/>
       <w:r>
         <w:t xml:space="preserve">$$
     A\stackrel{\text{def}}{=}\sum_{i\in I} \mathord{\smash[b]{\underset{\raise.3ex\hbox{$\scriptstyle\sim$}}{t}}\vphantom{t}}_{i} {\mathord{\smash[b]{\underset{\raise.3ex\hbox{$\scriptstyle\sim$}}{t}}\vphantom{t}}_{i}}^{\top}.
      \qquad(42)$$</w:t>
       </w:r>
-      <w:bookmarkEnd w:id="229"/>
+      <w:bookmarkEnd w:id="231"/>
     </w:p>
-    <w:bookmarkEnd w:id="230"/>
-    <w:bookmarkStart w:id="232" w:name="rem-source-cross-product-matrix"/>
+    <w:bookmarkEnd w:id="232"/>
+    <w:bookmarkStart w:id="234" w:name="rem-source-cross-product-matrix"/>
     <w:p>
       <w:pPr>
         <w:pStyle w:val="FirstParagraph"/>
@@ -58567,7 +58780,7 @@
       <w:r>
         <w:t xml:space="preserve"> </w:t>
       </w:r>
-      <w:hyperlink r:id="rId231">
+      <w:hyperlink r:id="rId233">
         <w:r>
           <w:rPr>
             <w:rStyle w:val="Hyperlink"/>
@@ -58579,8 +58792,8 @@
         <w:t xml:space="preserve">).</w:t>
       </w:r>
     </w:p>
-    <w:bookmarkEnd w:id="232"/>
-    <w:bookmarkStart w:id="235" w:name="rem-cross-product-matrix"/>
+    <w:bookmarkEnd w:id="234"/>
+    <w:bookmarkStart w:id="237" w:name="rem-cross-product-matrix"/>
     <w:p>
       <w:pPr>
         <w:pStyle w:val="BodyText"/>
@@ -58859,18 +59072,18 @@
                 <wp:inline>
                   <wp:extent cx="152400" cy="152400"/>
                   <wp:effectExtent b="0" l="0" r="0" t="0"/>
-                  <wp:docPr descr="" title="" id="233" name="Picture"/>
+                  <wp:docPr descr="" title="" id="235" name="Picture"/>
                   <a:graphic>
                     <a:graphicData uri="http://schemas.openxmlformats.org/drawingml/2006/picture">
                       <pic:pic>
                         <pic:nvPicPr>
-                          <pic:cNvPr descr="/opt/quarto/share/formats/docx/note.png" id="234" name="Picture"/>
+                          <pic:cNvPr descr="/opt/quarto/share/formats/docx/note.png" id="236" name="Picture"/>
                           <pic:cNvPicPr>
                             <a:picLocks noChangeArrowheads="1" noChangeAspect="1"/>
                           </pic:cNvPicPr>
                         </pic:nvPicPr>
                         <pic:blipFill>
-                          <a:blip r:embed="rId179"/>
+                          <a:blip r:embed="rId181"/>
                           <a:stretch>
                             <a:fillRect/>
                           </a:stretch>
@@ -58950,7 +59163,7 @@
             <w:r>
               <w:t xml:space="preserve"> </w:t>
             </w:r>
-            <w:hyperlink r:id="rId231">
+            <w:hyperlink r:id="rId233">
               <w:r>
                 <w:rPr>
                   <w:rStyle w:val="Hyperlink"/>
@@ -58978,8 +59191,8 @@
         </w:tc>
       </w:tr>
     </w:tbl>
-    <w:bookmarkEnd w:id="235"/>
-    <w:bookmarkStart w:id="238" w:name="def-leverage"/>
+    <w:bookmarkEnd w:id="237"/>
+    <w:bookmarkStart w:id="240" w:name="def-leverage"/>
     <w:p>
       <w:pPr>
         <w:pStyle w:val="BodyText"/>
@@ -58989,7 +59202,7 @@
           <w:b/>
           <w:bCs/>
         </w:rPr>
-        <w:t xml:space="preserve">Definition 47 (Leverage)</w:t>
+        <w:t xml:space="preserve">Definition 48 (Leverage)</w:t>
       </w:r>
       <w:r>
         <w:t xml:space="preserve"> </w:t>
@@ -59000,7 +59213,7 @@
       <w:r>
         <w:t xml:space="preserve"> </w:t>
       </w:r>
-      <w:hyperlink r:id="rId236">
+      <w:hyperlink r:id="rId238">
         <w:r>
           <w:rPr>
             <w:rStyle w:val="Hyperlink"/>
@@ -59126,16 +59339,16 @@
       <w:pPr>
         <w:pStyle w:val="BodyText"/>
       </w:pPr>
-      <w:bookmarkStart w:id="237" w:name="eq-leverage"/>
+      <w:bookmarkStart w:id="239" w:name="eq-leverage"/>
       <w:r>
         <w:t xml:space="preserve">$$
     h_{i} \stackrel{\text{def}}{=}{\mathord{\smash[b]{\underset{\raise.3ex\hbox{$\scriptstyle\sim$}}{t}}\vphantom{t}}_{i}}^{\top} A^{-1} \mathord{\smash[b]{\underset{\raise.3ex\hbox{$\scriptstyle\sim$}}{t}}\vphantom{t}}_{i}.
      \qquad(43)$$</w:t>
       </w:r>
-      <w:bookmarkEnd w:id="237"/>
+      <w:bookmarkEnd w:id="239"/>
     </w:p>
-    <w:bookmarkEnd w:id="238"/>
-    <w:bookmarkStart w:id="240" w:name="rem-source-leverage"/>
+    <w:bookmarkEnd w:id="240"/>
+    <w:bookmarkStart w:id="242" w:name="rem-source-leverage"/>
     <w:p>
       <w:pPr>
         <w:pStyle w:val="FirstParagraph"/>
@@ -59182,7 +59395,7 @@
       <w:r>
         <w:t xml:space="preserve"> </w:t>
       </w:r>
-      <w:hyperlink r:id="rId239">
+      <w:hyperlink r:id="rId241">
         <w:r>
           <w:rPr>
             <w:rStyle w:val="Hyperlink"/>
@@ -59194,8 +59407,8 @@
         <w:t xml:space="preserve">.</w:t>
       </w:r>
     </w:p>
-    <w:bookmarkEnd w:id="240"/>
-    <w:bookmarkStart w:id="243" w:name="thm-loocv-shortcut"/>
+    <w:bookmarkEnd w:id="242"/>
+    <w:bookmarkStart w:id="245" w:name="thm-loocv-shortcut"/>
     <w:p>
       <w:pPr>
         <w:pStyle w:val="BodyText"/>
@@ -59216,7 +59429,7 @@
       <w:r>
         <w:t xml:space="preserve"> </w:t>
       </w:r>
-      <w:hyperlink r:id="rId236">
+      <w:hyperlink r:id="rId238">
         <w:r>
           <w:rPr>
             <w:rStyle w:val="Hyperlink"/>
@@ -59316,7 +59529,7 @@
       <w:r>
         <w:t xml:space="preserve"> </w:t>
       </w:r>
-      <w:hyperlink r:id="rId241">
+      <w:hyperlink r:id="rId243">
         <w:r>
           <w:rPr>
             <w:rStyle w:val="Hyperlink"/>
@@ -59442,7 +59655,7 @@
       <w:pPr>
         <w:pStyle w:val="BodyText"/>
       </w:pPr>
-      <w:bookmarkStart w:id="242" w:name="eq-loocv-shortcut"/>
+      <w:bookmarkStart w:id="244" w:name="eq-loocv-shortcut"/>
       <m:oMathPara>
         <m:oMathParaPr>
           <m:jc m:val="center"/>
@@ -59632,9 +59845,9 @@
           </m:r>
         </m:oMath>
       </m:oMathPara>
-      <w:bookmarkEnd w:id="242"/>
+      <w:bookmarkEnd w:id="244"/>
     </w:p>
-    <w:bookmarkEnd w:id="243"/>
+    <w:bookmarkEnd w:id="245"/>
     <w:p>
       <w:pPr>
         <w:pStyle w:val="FirstParagraph"/>
@@ -59714,7 +59927,7 @@
         <w:t xml:space="preserve">which this page does not develop.</w:t>
       </w:r>
     </w:p>
-    <w:bookmarkStart w:id="244" w:name="rem-source-loocv-shortcut"/>
+    <w:bookmarkStart w:id="246" w:name="rem-source-loocv-shortcut"/>
     <w:p>
       <w:pPr>
         <w:pStyle w:val="BodyText"/>
@@ -59757,8 +59970,8 @@
         <w:t xml:space="preserve">for many linear fitting methods.</w:t>
       </w:r>
     </w:p>
-    <w:bookmarkEnd w:id="244"/>
-    <w:bookmarkStart w:id="245" w:name="exm-loocv-shortcut"/>
+    <w:bookmarkEnd w:id="246"/>
+    <w:bookmarkStart w:id="247" w:name="exm-loocv-shortcut"/>
     <w:p>
       <w:pPr>
         <w:pStyle w:val="BodyText"/>
@@ -59768,7 +59981,7 @@
           <w:b/>
           <w:bCs/>
         </w:rPr>
-        <w:t xml:space="preserve">Example 20 (Leave-one-out cross-validation of the</w:t>
+        <w:t xml:space="preserve">Example 21 (Leave-one-out cross-validation of the</w:t>
       </w:r>
       <w:r>
         <w:rPr>
@@ -60846,7 +61059,7 @@
         <w:rPr>
           <w:rStyle w:val="CommentTok"/>
         </w:rPr>
-        <w:t xml:space="preserve">#&gt;    8.88178e-15    2.00000e+00</w:t>
+        <w:t xml:space="preserve">#&gt;    7.10543e-15    2.00000e+00</w:t>
       </w:r>
     </w:p>
     <w:p>
@@ -60854,7 +61067,7 @@
         <w:pStyle w:val="FirstParagraph"/>
       </w:pPr>
       <w:r>
-        <w:t xml:space="preserve">The two columns differ by at most 8.9e-15,</w:t>
+        <w:t xml:space="preserve">The two columns differ by at most 7.1e-15,</w:t>
       </w:r>
       <w:r>
         <w:t xml:space="preserve"> </w:t>
@@ -60898,8 +61111,8 @@
         <w:t xml:space="preserve">rerunning it always gives the same choice.</w:t>
       </w:r>
     </w:p>
-    <w:bookmarkEnd w:id="245"/>
-    <w:bookmarkStart w:id="246" w:name="rem-loocv"/>
+    <w:bookmarkEnd w:id="247"/>
+    <w:bookmarkStart w:id="248" w:name="rem-loocv"/>
     <w:p>
       <w:pPr>
         <w:pStyle w:val="BodyText"/>
@@ -61371,9 +61584,9 @@
         <w:t xml:space="preserve">fits.</w:t>
       </w:r>
     </w:p>
-    <w:bookmarkEnd w:id="246"/>
-    <w:bookmarkEnd w:id="247"/>
-    <w:bookmarkStart w:id="277" w:name="sec-cv-model-choice"/>
+    <w:bookmarkEnd w:id="248"/>
+    <w:bookmarkEnd w:id="249"/>
+    <w:bookmarkStart w:id="279" w:name="sec-cv-model-choice"/>
     <w:p>
       <w:pPr>
         <w:pStyle w:val="Heading2"/>
@@ -61382,7 +61595,7 @@
         <w:t xml:space="preserve">8 Choosing a model by cross-validation</w:t>
       </w:r>
     </w:p>
-    <w:bookmarkStart w:id="249" w:name="def-cv-estimate-indexed"/>
+    <w:bookmarkStart w:id="251" w:name="def-cv-estimate-indexed"/>
     <w:p>
       <w:pPr>
         <w:pStyle w:val="FirstParagraph"/>
@@ -61392,7 +61605,7 @@
           <w:b/>
           <w:bCs/>
         </w:rPr>
-        <w:t xml:space="preserve">Definition 48 (Cross-validation estimate of a named procedure)</w:t>
+        <w:t xml:space="preserve">Definition 49 (Cross-validation estimate of a named procedure)</w:t>
       </w:r>
       <w:r>
         <w:t xml:space="preserve"> </w:t>
@@ -61760,7 +61973,7 @@
       <w:pPr>
         <w:pStyle w:val="BodyText"/>
       </w:pPr>
-      <w:bookmarkStart w:id="248" w:name="eq-cv-estimate-indexed"/>
+      <w:bookmarkStart w:id="250" w:name="eq-cv-estimate-indexed"/>
       <m:oMathPara>
         <m:oMathParaPr>
           <m:jc m:val="center"/>
@@ -62170,10 +62383,10 @@
           </m:r>
         </m:oMath>
       </m:oMathPara>
-      <w:bookmarkEnd w:id="248"/>
+      <w:bookmarkEnd w:id="250"/>
     </w:p>
-    <w:bookmarkEnd w:id="249"/>
-    <w:bookmarkStart w:id="251" w:name="def-cv-choice"/>
+    <w:bookmarkEnd w:id="251"/>
+    <w:bookmarkStart w:id="253" w:name="def-cv-choice"/>
     <w:p>
       <w:pPr>
         <w:pStyle w:val="FirstParagraph"/>
@@ -62183,7 +62396,7 @@
           <w:b/>
           <w:bCs/>
         </w:rPr>
-        <w:t xml:space="preserve">Definition 49 (Cross-validation choice procedure)</w:t>
+        <w:t xml:space="preserve">Definition 50 (Cross-validation choice procedure)</w:t>
       </w:r>
       <w:r>
         <w:t xml:space="preserve"> </w:t>
@@ -62515,7 +62728,7 @@
       <w:pPr>
         <w:pStyle w:val="BodyText"/>
       </w:pPr>
-      <w:bookmarkStart w:id="250" w:name="eq-cv-choice"/>
+      <w:bookmarkStart w:id="252" w:name="eq-cv-choice"/>
       <m:oMathPara>
         <m:oMathParaPr>
           <m:jc m:val="center"/>
@@ -62799,10 +63012,10 @@
           </m:r>
         </m:oMath>
       </m:oMathPara>
-      <w:bookmarkEnd w:id="250"/>
+      <w:bookmarkEnd w:id="252"/>
     </w:p>
-    <w:bookmarkEnd w:id="251"/>
-    <w:bookmarkStart w:id="252" w:name="exm-cv-choice-inputs"/>
+    <w:bookmarkEnd w:id="253"/>
+    <w:bookmarkStart w:id="254" w:name="exm-cv-choice-inputs"/>
     <w:p>
       <w:pPr>
         <w:pStyle w:val="FirstParagraph"/>
@@ -62812,7 +63025,7 @@
           <w:b/>
           <w:bCs/>
         </w:rPr>
-        <w:t xml:space="preserve">Example 21 (Inputs of the cross-validation choice procedure)</w:t>
+        <w:t xml:space="preserve">Example 22 (Inputs of the cross-validation choice procedure)</w:t>
       </w:r>
       <w:r>
         <w:t xml:space="preserve"> </w:t>
@@ -63123,8 +63336,8 @@
         <w:t xml:space="preserve">: none.</w:t>
       </w:r>
     </w:p>
-    <w:bookmarkEnd w:id="252"/>
-    <w:bookmarkStart w:id="254" w:name="def-nested-cv"/>
+    <w:bookmarkEnd w:id="254"/>
+    <w:bookmarkStart w:id="256" w:name="def-nested-cv"/>
     <w:p>
       <w:pPr>
         <w:pStyle w:val="FirstParagraph"/>
@@ -63134,7 +63347,7 @@
           <w:b/>
           <w:bCs/>
         </w:rPr>
-        <w:t xml:space="preserve">Definition 50 (Nested cross-validation)</w:t>
+        <w:t xml:space="preserve">Definition 51 (Nested cross-validation)</w:t>
       </w:r>
       <w:r>
         <w:t xml:space="preserve"> </w:t>
@@ -63251,7 +63464,7 @@
       <w:pPr>
         <w:pStyle w:val="BodyText"/>
       </w:pPr>
-      <w:bookmarkStart w:id="253" w:name="eq-nested-cv"/>
+      <w:bookmarkStart w:id="255" w:name="eq-nested-cv"/>
       <m:oMathPara>
         <m:oMathParaPr>
           <m:jc m:val="center"/>
@@ -63378,10 +63591,10 @@
           </m:r>
         </m:oMath>
       </m:oMathPara>
-      <w:bookmarkEnd w:id="253"/>
+      <w:bookmarkEnd w:id="255"/>
     </w:p>
-    <w:bookmarkEnd w:id="254"/>
-    <w:bookmarkStart w:id="255" w:name="rem-source-nested-cv"/>
+    <w:bookmarkEnd w:id="256"/>
+    <w:bookmarkStart w:id="257" w:name="rem-source-nested-cv"/>
     <w:p>
       <w:pPr>
         <w:pStyle w:val="FirstParagraph"/>
@@ -63412,8 +63625,8 @@
         <w:t xml:space="preserve">choices included.</w:t>
       </w:r>
     </w:p>
-    <w:bookmarkEnd w:id="255"/>
-    <w:bookmarkStart w:id="256" w:name="rem-nested-cv"/>
+    <w:bookmarkEnd w:id="257"/>
+    <w:bookmarkStart w:id="258" w:name="rem-nested-cv"/>
     <w:p>
       <w:pPr>
         <w:pStyle w:val="BodyText"/>
@@ -63569,8 +63782,8 @@
         <w:t xml:space="preserve">That inner cross-validation is the nested one.</w:t>
       </w:r>
     </w:p>
-    <w:bookmarkEnd w:id="256"/>
-    <w:bookmarkStart w:id="259" w:name="rem-cv-winner-optimistic"/>
+    <w:bookmarkEnd w:id="258"/>
+    <w:bookmarkStart w:id="261" w:name="rem-cv-winner-optimistic"/>
     <w:p>
       <w:pPr>
         <w:pStyle w:val="BodyText"/>
@@ -63763,18 +63976,18 @@
                 <wp:inline>
                   <wp:extent cx="152400" cy="152400"/>
                   <wp:effectExtent b="0" l="0" r="0" t="0"/>
-                  <wp:docPr descr="" title="" id="257" name="Picture"/>
+                  <wp:docPr descr="" title="" id="259" name="Picture"/>
                   <a:graphic>
                     <a:graphicData uri="http://schemas.openxmlformats.org/drawingml/2006/picture">
                       <pic:pic>
                         <pic:nvPicPr>
-                          <pic:cNvPr descr="/opt/quarto/share/formats/docx/note.png" id="258" name="Picture"/>
+                          <pic:cNvPr descr="/opt/quarto/share/formats/docx/note.png" id="260" name="Picture"/>
                           <pic:cNvPicPr>
                             <a:picLocks noChangeArrowheads="1" noChangeAspect="1"/>
                           </pic:cNvPicPr>
                         </pic:nvPicPr>
                         <pic:blipFill>
-                          <a:blip r:embed="rId179"/>
+                          <a:blip r:embed="rId181"/>
                           <a:stretch>
                             <a:fillRect/>
                           </a:stretch>
@@ -63838,8 +64051,8 @@
         </w:tc>
       </w:tr>
     </w:tbl>
-    <w:bookmarkEnd w:id="259"/>
-    <w:bookmarkStart w:id="262" w:name="def-cv-se"/>
+    <w:bookmarkEnd w:id="261"/>
+    <w:bookmarkStart w:id="264" w:name="def-cv-se"/>
     <w:p>
       <w:pPr>
         <w:pStyle w:val="BodyText"/>
@@ -63849,7 +64062,7 @@
           <w:b/>
           <w:bCs/>
         </w:rPr>
-        <w:t xml:space="preserve">Definition 51 (Fold-based standard error)</w:t>
+        <w:t xml:space="preserve">Definition 52 (Fold-based standard error)</w:t>
       </w:r>
       <w:r>
         <w:t xml:space="preserve"> </w:t>
@@ -63943,7 +64156,7 @@
       <w:r>
         <w:t xml:space="preserve"> </w:t>
       </w:r>
-      <w:hyperlink r:id="rId260">
+      <w:hyperlink r:id="rId262">
         <w:r>
           <w:rPr>
             <w:rStyle w:val="Hyperlink"/>
@@ -64009,7 +64222,7 @@
       <w:pPr>
         <w:pStyle w:val="BodyText"/>
       </w:pPr>
-      <w:bookmarkStart w:id="261" w:name="eq-cv-se"/>
+      <w:bookmarkStart w:id="263" w:name="eq-cv-se"/>
       <m:oMathPara>
         <m:oMathParaPr>
           <m:jc m:val="center"/>
@@ -64184,10 +64397,10 @@
           </m:r>
         </m:oMath>
       </m:oMathPara>
-      <w:bookmarkEnd w:id="261"/>
+      <w:bookmarkEnd w:id="263"/>
     </w:p>
-    <w:bookmarkEnd w:id="262"/>
-    <w:bookmarkStart w:id="263" w:name="rem-source-cv-se"/>
+    <w:bookmarkEnd w:id="264"/>
+    <w:bookmarkStart w:id="265" w:name="rem-source-cv-se"/>
     <w:p>
       <w:pPr>
         <w:pStyle w:val="FirstParagraph"/>
@@ -64209,8 +64422,8 @@
         <w:t xml:space="preserve">, who call the result a standard error.</w:t>
       </w:r>
     </w:p>
-    <w:bookmarkEnd w:id="263"/>
-    <w:bookmarkStart w:id="265" w:name="rem-cv-se"/>
+    <w:bookmarkEnd w:id="265"/>
+    <w:bookmarkStart w:id="267" w:name="rem-cv-se"/>
     <w:p>
       <w:pPr>
         <w:pStyle w:val="BodyText"/>
@@ -64433,7 +64646,7 @@
       <w:r>
         <w:t xml:space="preserve"> </w:t>
       </w:r>
-      <w:hyperlink r:id="rId264">
+      <w:hyperlink r:id="rId266">
         <w:r>
           <w:rPr>
             <w:rStyle w:val="Hyperlink"/>
@@ -64497,8 +64710,8 @@
         <w:t xml:space="preserve">.</w:t>
       </w:r>
     </w:p>
-    <w:bookmarkEnd w:id="265"/>
-    <w:bookmarkStart w:id="267" w:name="def-fold-mse-indexed"/>
+    <w:bookmarkEnd w:id="267"/>
+    <w:bookmarkStart w:id="269" w:name="def-fold-mse-indexed"/>
     <w:p>
       <w:pPr>
         <w:pStyle w:val="BodyText"/>
@@ -64508,7 +64721,7 @@
           <w:b/>
           <w:bCs/>
         </w:rPr>
-        <w:t xml:space="preserve">Definition 52 (Fold mean squared error of a named procedure)</w:t>
+        <w:t xml:space="preserve">Definition 53 (Fold mean squared error of a named procedure)</w:t>
       </w:r>
       <w:r>
         <w:t xml:space="preserve"> </w:t>
@@ -64676,7 +64889,7 @@
       <w:pPr>
         <w:pStyle w:val="BodyText"/>
       </w:pPr>
-      <w:bookmarkStart w:id="266" w:name="eq-fold-mse-indexed"/>
+      <w:bookmarkStart w:id="268" w:name="eq-fold-mse-indexed"/>
       <m:oMathPara>
         <m:oMathParaPr>
           <m:jc m:val="center"/>
@@ -65063,10 +65276,10 @@
           </m:r>
         </m:oMath>
       </m:oMathPara>
-      <w:bookmarkEnd w:id="266"/>
+      <w:bookmarkEnd w:id="268"/>
     </w:p>
-    <w:bookmarkEnd w:id="267"/>
-    <w:bookmarkStart w:id="269" w:name="def-cv-se-indexed"/>
+    <w:bookmarkEnd w:id="269"/>
+    <w:bookmarkStart w:id="271" w:name="def-cv-se-indexed"/>
     <w:p>
       <w:pPr>
         <w:pStyle w:val="FirstParagraph"/>
@@ -65076,7 +65289,7 @@
           <w:b/>
           <w:bCs/>
         </w:rPr>
-        <w:t xml:space="preserve">Definition 53 (Fold-based standard error of a named procedure)</w:t>
+        <w:t xml:space="preserve">Definition 54 (Fold-based standard error of a named procedure)</w:t>
       </w:r>
       <w:r>
         <w:t xml:space="preserve"> </w:t>
@@ -65272,7 +65485,7 @@
       <w:pPr>
         <w:pStyle w:val="BodyText"/>
       </w:pPr>
-      <w:bookmarkStart w:id="268" w:name="eq-cv-se-indexed"/>
+      <w:bookmarkStart w:id="270" w:name="eq-cv-se-indexed"/>
       <m:oMathPara>
         <m:oMathParaPr>
           <m:jc m:val="center"/>
@@ -65570,10 +65783,10 @@
           </m:r>
         </m:oMath>
       </m:oMathPara>
-      <w:bookmarkEnd w:id="268"/>
+      <w:bookmarkEnd w:id="270"/>
     </w:p>
-    <w:bookmarkEnd w:id="269"/>
-    <w:bookmarkStart w:id="271" w:name="def-one-se-rule"/>
+    <w:bookmarkEnd w:id="271"/>
+    <w:bookmarkStart w:id="273" w:name="def-one-se-rule"/>
     <w:p>
       <w:pPr>
         <w:pStyle w:val="FirstParagraph"/>
@@ -65583,7 +65796,7 @@
           <w:b/>
           <w:bCs/>
         </w:rPr>
-        <w:t xml:space="preserve">Definition 54 (One-standard-error rule)</w:t>
+        <w:t xml:space="preserve">Definition 55 (One-standard-error rule)</w:t>
       </w:r>
       <w:r>
         <w:t xml:space="preserve"> </w:t>
@@ -65831,7 +66044,7 @@
       <w:pPr>
         <w:pStyle w:val="BodyText"/>
       </w:pPr>
-      <w:bookmarkStart w:id="270" w:name="eq-one-se-rule"/>
+      <w:bookmarkStart w:id="272" w:name="eq-one-se-rule"/>
       <m:oMathPara>
         <m:oMathParaPr>
           <m:jc m:val="center"/>
@@ -66165,7 +66378,7 @@
           </m:r>
         </m:oMath>
       </m:oMathPara>
-      <w:bookmarkEnd w:id="270"/>
+      <w:bookmarkEnd w:id="272"/>
     </w:p>
     <w:p>
       <w:pPr>
@@ -66184,8 +66397,8 @@
         <w:t xml:space="preserve">.</w:t>
       </w:r>
     </w:p>
-    <w:bookmarkEnd w:id="271"/>
-    <w:bookmarkStart w:id="276" w:name="exm-one-se-rule"/>
+    <w:bookmarkEnd w:id="273"/>
+    <w:bookmarkStart w:id="278" w:name="exm-one-se-rule"/>
     <w:p>
       <w:pPr>
         <w:pStyle w:val="BodyText"/>
@@ -66195,7 +66408,7 @@
           <w:b/>
           <w:bCs/>
         </w:rPr>
-        <w:t xml:space="preserve">Example 22 (The one-standard-error rule for the simulated polynomials)</w:t>
+        <w:t xml:space="preserve">Example 23 (The one-standard-error rule for the simulated polynomials)</w:t>
       </w:r>
       <w:r>
         <w:t xml:space="preserve"> </w:t>
@@ -66243,7 +66456,7 @@
           <w:rPr>
             <w:rStyle w:val="Hyperlink"/>
           </w:rPr>
-          <w:t xml:space="preserve">Definition 54</w:t>
+          <w:t xml:space="preserve">Definition 55</w:t>
         </w:r>
       </w:hyperlink>
       <w:r>
@@ -67257,7 +67470,7 @@
       <w:tr>
         <w:tc>
           <w:tcPr/>
-          <w:bookmarkStart w:id="275" w:name="fig-one-se-rule"/>
+          <w:bookmarkStart w:id="277" w:name="fig-one-se-rule"/>
           <w:p>
             <w:pPr>
               <w:pStyle w:val="SourceCode"/>
@@ -67870,18 +68083,18 @@
                 <wp:inline>
                   <wp:extent cx="4620126" cy="3696101"/>
                   <wp:effectExtent b="0" l="0" r="0" t="0"/>
-                  <wp:docPr descr="" title="" id="273" name="Picture"/>
+                  <wp:docPr descr="" title="" id="275" name="Picture"/>
                   <a:graphic>
                     <a:graphicData uri="http://schemas.openxmlformats.org/drawingml/2006/picture">
                       <pic:pic>
                         <pic:nvPicPr>
-                          <pic:cNvPr descr="model-validation_files/figure-docx/one-se-rule-plot-1.png" id="274" name="Picture"/>
+                          <pic:cNvPr descr="model-validation_files/figure-docx/one-se-rule-plot-1.png" id="276" name="Picture"/>
                           <pic:cNvPicPr>
                             <a:picLocks noChangeArrowheads="1" noChangeAspect="1"/>
                           </pic:cNvPicPr>
                         </pic:nvPicPr>
                         <pic:blipFill>
-                          <a:blip r:embed="rId272"/>
+                          <a:blip r:embed="rId274"/>
                           <a:stretch>
                             <a:fillRect/>
                           </a:stretch>
@@ -67961,7 +68174,7 @@
               <w:t xml:space="preserve">The dashed line is one fold-based standard error above the smallest estimate.</w:t>
             </w:r>
           </w:p>
-          <w:bookmarkEnd w:id="275"/>
+          <w:bookmarkEnd w:id="277"/>
         </w:tc>
       </w:tr>
     </w:tbl>
@@ -68050,9 +68263,9 @@
         <w:t xml:space="preserve">and 0.315 for degree 3.</w:t>
       </w:r>
     </w:p>
-    <w:bookmarkEnd w:id="276"/>
-    <w:bookmarkEnd w:id="277"/>
-    <w:bookmarkStart w:id="283" w:name="sec-cv-whole-procedure"/>
+    <w:bookmarkEnd w:id="278"/>
+    <w:bookmarkEnd w:id="279"/>
+    <w:bookmarkStart w:id="285" w:name="sec-cv-whole-procedure"/>
     <w:p>
       <w:pPr>
         <w:pStyle w:val="Heading2"/>
@@ -68061,7 +68274,7 @@
         <w:t xml:space="preserve">9 Cross-validating the whole procedure</w:t>
       </w:r>
     </w:p>
-    <w:bookmarkStart w:id="280" w:name="exr-cv-screening"/>
+    <w:bookmarkStart w:id="282" w:name="exr-cv-screening"/>
     <w:p>
       <w:pPr>
         <w:pStyle w:val="FirstParagraph"/>
@@ -68361,18 +68574,18 @@
                 <wp:inline>
                   <wp:extent cx="152400" cy="152400"/>
                   <wp:effectExtent b="0" l="0" r="0" t="0"/>
-                  <wp:docPr descr="" title="" id="278" name="Picture"/>
+                  <wp:docPr descr="" title="" id="280" name="Picture"/>
                   <a:graphic>
                     <a:graphicData uri="http://schemas.openxmlformats.org/drawingml/2006/picture">
                       <pic:pic>
                         <pic:nvPicPr>
-                          <pic:cNvPr descr="/opt/quarto/share/formats/docx/note.png" id="279" name="Picture"/>
+                          <pic:cNvPr descr="/opt/quarto/share/formats/docx/note.png" id="281" name="Picture"/>
                           <pic:cNvPicPr>
                             <a:picLocks noChangeArrowheads="1" noChangeAspect="1"/>
                           </pic:cNvPicPr>
                         </pic:nvPicPr>
                         <pic:blipFill>
-                          <a:blip r:embed="rId179"/>
+                          <a:blip r:embed="rId181"/>
                           <a:stretch>
                             <a:fillRect/>
                           </a:stretch>
@@ -68454,8 +68667,8 @@
         </w:tc>
       </w:tr>
     </w:tbl>
-    <w:bookmarkEnd w:id="280"/>
-    <w:bookmarkStart w:id="281" w:name="sol-cv-screening"/>
+    <w:bookmarkEnd w:id="282"/>
+    <w:bookmarkStart w:id="283" w:name="sol-cv-screening"/>
     <w:p>
       <w:pPr>
         <w:pStyle w:val="BodyText"/>
@@ -70383,8 +70596,8 @@
         <w:t xml:space="preserve">needs fails.</w:t>
       </w:r>
     </w:p>
-    <w:bookmarkEnd w:id="281"/>
-    <w:bookmarkStart w:id="282" w:name="rem-cv-every-step"/>
+    <w:bookmarkEnd w:id="283"/>
+    <w:bookmarkStart w:id="284" w:name="rem-cv-every-step"/>
     <w:p>
       <w:pPr>
         <w:pStyle w:val="BodyText"/>
@@ -70564,9 +70777,9 @@
         <w:t xml:space="preserve">when they are computed without the outcome.</w:t>
       </w:r>
     </w:p>
-    <w:bookmarkEnd w:id="282"/>
-    <w:bookmarkEnd w:id="283"/>
-    <w:bookmarkStart w:id="284" w:name="further-reading"/>
+    <w:bookmarkEnd w:id="284"/>
+    <w:bookmarkEnd w:id="285"/>
+    <w:bookmarkStart w:id="286" w:name="further-reading"/>
     <w:p>
       <w:pPr>
         <w:pStyle w:val="Heading2"/>
@@ -70595,8 +70808,8 @@
         <w:t xml:space="preserve">including the covariance and correlation matrices that cross-products produce.</w:t>
       </w:r>
     </w:p>
-    <w:bookmarkEnd w:id="284"/>
-    <w:bookmarkStart w:id="292" w:name="references"/>
+    <w:bookmarkEnd w:id="286"/>
+    <w:bookmarkStart w:id="294" w:name="references"/>
     <w:p>
       <w:pPr>
         <w:pStyle w:val="Heading2"/>
@@ -70605,8 +70818,8 @@
         <w:t xml:space="preserve">References</w:t>
       </w:r>
     </w:p>
-    <w:bookmarkStart w:id="291" w:name="refs"/>
-    <w:bookmarkStart w:id="286" w:name="ref-hastie2009elements"/>
+    <w:bookmarkStart w:id="293" w:name="refs"/>
+    <w:bookmarkStart w:id="288" w:name="ref-hastie2009elements"/>
     <w:p>
       <w:pPr>
         <w:pStyle w:val="Bibliography"/>
@@ -70630,7 +70843,7 @@
       <w:r>
         <w:t xml:space="preserve"> </w:t>
       </w:r>
-      <w:hyperlink r:id="rId285">
+      <w:hyperlink r:id="rId287">
         <w:r>
           <w:rPr>
             <w:rStyle w:val="Hyperlink"/>
@@ -70642,8 +70855,8 @@
         <w:t xml:space="preserve">.</w:t>
       </w:r>
     </w:p>
-    <w:bookmarkEnd w:id="286"/>
-    <w:bookmarkStart w:id="288" w:name="ref-james2021islr2e"/>
+    <w:bookmarkEnd w:id="288"/>
+    <w:bookmarkStart w:id="290" w:name="ref-james2021islr2e"/>
     <w:p>
       <w:pPr>
         <w:pStyle w:val="Bibliography"/>
@@ -70681,7 +70894,7 @@
       <w:r>
         <w:t xml:space="preserve"> </w:t>
       </w:r>
-      <w:hyperlink r:id="rId287">
+      <w:hyperlink r:id="rId289">
         <w:r>
           <w:rPr>
             <w:rStyle w:val="Hyperlink"/>
@@ -70693,8 +70906,8 @@
         <w:t xml:space="preserve">.</w:t>
       </w:r>
     </w:p>
-    <w:bookmarkEnd w:id="288"/>
-    <w:bookmarkStart w:id="290" w:name="ref-sanchez2020matrix4sl"/>
+    <w:bookmarkEnd w:id="290"/>
+    <w:bookmarkStart w:id="292" w:name="ref-sanchez2020matrix4sl"/>
     <w:p>
       <w:pPr>
         <w:pStyle w:val="Bibliography"/>
@@ -70732,7 +70945,7 @@
       <w:r>
         <w:t xml:space="preserve"> </w:t>
       </w:r>
-      <w:hyperlink r:id="rId289">
+      <w:hyperlink r:id="rId291">
         <w:r>
           <w:rPr>
             <w:rStyle w:val="Hyperlink"/>
@@ -70744,9 +70957,9 @@
         <w:t xml:space="preserve">.</w:t>
       </w:r>
     </w:p>
-    <w:bookmarkEnd w:id="290"/>
-    <w:bookmarkEnd w:id="291"/>
     <w:bookmarkEnd w:id="292"/>
+    <w:bookmarkEnd w:id="293"/>
+    <w:bookmarkEnd w:id="294"/>
     <w:sectPr>
       <w:footnotePr>
         <w:numRestart w:val="eachSect"/>

</xml_diff>

<commit_message>
Deploying to gh-pages from @ Morrison-Lab/sds@27215dccd09b6c957bce8b4a8a8e95e6b93822e0 🚀
</commit_message>
<xml_diff>
--- a/model-validation-handout.docx
+++ b/model-validation-handout.docx
@@ -15,7 +15,7 @@
         <w:pStyle w:val="Date"/>
       </w:pPr>
       <w:r>
-        <w:t xml:space="preserve">Last modified: 2026-10-17 00:12:44 (PDT)</w:t>
+        <w:t xml:space="preserve">Last modified: 2026-10-17 00:53:34 (PDT)</w:t>
       </w:r>
     </w:p>
     <w:bookmarkStart w:id="17" w:name="sec-data-sets"/>
@@ -35395,72 +35395,36 @@
         <w:t xml:space="preserve"> </w:t>
       </w:r>
       <w:r>
-        <w:t xml:space="preserve">is choosing one fitting procedure</w:t>
-      </w:r>
-      <w:r>
-        <w:t xml:space="preserve"> </w:t>
-      </w:r>
-      <w:r>
-        <w:t xml:space="preserve">from a set of candidate</w:t>
-      </w:r>
-      <w:r>
-        <w:t xml:space="preserve"> </w:t>
-      </w:r>
-      <w:hyperlink w:anchor="def-fitting-procedure">
+        <w:t xml:space="preserve">is choosing one</w:t>
+      </w:r>
+      <w:r>
+        <w:t xml:space="preserve"> </w:t>
+      </w:r>
+      <w:hyperlink w:anchor="def-fitted-model">
         <w:r>
           <w:rPr>
             <w:rStyle w:val="Hyperlink"/>
           </w:rPr>
-          <w:t xml:space="preserve">fitting procedures</w:t>
+          <w:t xml:space="preserve">fitted model</w:t>
         </w:r>
       </w:hyperlink>
       <w:r>
         <w:t xml:space="preserve"> </w:t>
       </w:r>
-      <m:oMath>
-        <m:sSub>
-          <m:e>
-            <m:r>
-              <m:t>g</m:t>
-            </m:r>
-          </m:e>
-          <m:sub>
-            <m:r>
-              <m:t>1</m:t>
-            </m:r>
-          </m:sub>
-        </m:sSub>
-        <m:r>
-          <m:rPr>
-            <m:sty m:val="p"/>
-          </m:rPr>
-          <m:t>,</m:t>
-        </m:r>
-        <m:r>
-          <m:rPr>
-            <m:sty m:val="p"/>
-          </m:rPr>
-          <m:t>…</m:t>
-        </m:r>
-        <m:r>
-          <m:rPr>
-            <m:sty m:val="p"/>
-          </m:rPr>
-          <m:t>,</m:t>
-        </m:r>
-        <m:sSub>
-          <m:e>
-            <m:r>
-              <m:t>g</m:t>
-            </m:r>
-          </m:e>
-          <m:sub>
-            <m:r>
-              <m:t>L</m:t>
-            </m:r>
-          </m:sub>
-        </m:sSub>
-      </m:oMath>
+      <w:r>
+        <w:t xml:space="preserve">from a set of candidate fitted models from different</w:t>
+      </w:r>
+      <w:r>
+        <w:t xml:space="preserve"> </w:t>
+      </w:r>
+      <w:hyperlink w:anchor="def-model-family">
+        <w:r>
+          <w:rPr>
+            <w:rStyle w:val="Hyperlink"/>
+          </w:rPr>
+          <w:t xml:space="preserve">model families</w:t>
+        </w:r>
+      </w:hyperlink>
       <w:r>
         <w:t xml:space="preserve">,</w:t>
       </w:r>
@@ -35525,7 +35489,13 @@
         <w:t xml:space="preserve"> </w:t>
       </w:r>
       <w:r>
-        <w:t xml:space="preserve">the candidates are least-squares polynomial fits of degree</w:t>
+        <w:t xml:space="preserve">the candidates are the least-squares fitted models from four polynomial model families,</w:t>
+      </w:r>
+      <w:r>
+        <w:t xml:space="preserve"> </w:t>
+      </w:r>
+      <w:r>
+        <w:t xml:space="preserve">the families of degree</w:t>
       </w:r>
       <w:r>
         <w:t xml:space="preserve"> </w:t>
@@ -35534,30 +35504,63 @@
         <m:r>
           <m:t>1</m:t>
         </m:r>
-        <m:r>
-          <m:rPr>
-            <m:sty m:val="p"/>
-          </m:rPr>
-          <m:t>,</m:t>
-        </m:r>
+      </m:oMath>
+      <w:r>
+        <w:t xml:space="preserve"> </w:t>
+      </w:r>
+      <w:r>
+        <w:t xml:space="preserve">(</w:t>
+      </w:r>
+      <w:r>
+        <w:t xml:space="preserve">“linear”</w:t>
+      </w:r>
+      <w:r>
+        <w:t xml:space="preserve">),</w:t>
+      </w:r>
+      <w:r>
+        <w:t xml:space="preserve"> </w:t>
+      </w:r>
+      <m:oMath>
         <m:r>
           <m:t>2</m:t>
         </m:r>
-        <m:r>
-          <m:rPr>
-            <m:sty m:val="p"/>
-          </m:rPr>
-          <m:t>,</m:t>
-        </m:r>
+      </m:oMath>
+      <w:r>
+        <w:t xml:space="preserve"> </w:t>
+      </w:r>
+      <w:r>
+        <w:t xml:space="preserve">(</w:t>
+      </w:r>
+      <w:r>
+        <w:t xml:space="preserve">“quadratic”</w:t>
+      </w:r>
+      <w:r>
+        <w:t xml:space="preserve">),</w:t>
+      </w:r>
+      <w:r>
+        <w:t xml:space="preserve"> </w:t>
+      </w:r>
+      <m:oMath>
         <m:r>
           <m:t>3</m:t>
         </m:r>
-        <m:r>
-          <m:rPr>
-            <m:sty m:val="p"/>
-          </m:rPr>
-          <m:t>,</m:t>
-        </m:r>
+      </m:oMath>
+      <w:r>
+        <w:t xml:space="preserve"> </w:t>
+      </w:r>
+      <w:r>
+        <w:t xml:space="preserve">(</w:t>
+      </w:r>
+      <w:r>
+        <w:t xml:space="preserve">“cubic”</w:t>
+      </w:r>
+      <w:r>
+        <w:t xml:space="preserve">) and</w:t>
+      </w:r>
+      <w:r>
+        <w:t xml:space="preserve"> </w:t>
+      </w:r>
+      <m:oMath>
         <m:r>
           <m:t>4</m:t>
         </m:r>
@@ -35566,13 +35569,19 @@
         <w:t xml:space="preserve"> </w:t>
       </w:r>
       <w:r>
-        <w:t xml:space="preserve">to the training cars.</w:t>
-      </w:r>
-      <w:r>
-        <w:t xml:space="preserve"> </w:t>
-      </w:r>
-      <w:r>
-        <w:t xml:space="preserve">Choosing among these four degrees is model selection,</w:t>
+        <w:t xml:space="preserve">(</w:t>
+      </w:r>
+      <w:r>
+        <w:t xml:space="preserve">“quartic”</w:t>
+      </w:r>
+      <w:r>
+        <w:t xml:space="preserve">).</w:t>
+      </w:r>
+      <w:r>
+        <w:t xml:space="preserve"> </w:t>
+      </w:r>
+      <w:r>
+        <w:t xml:space="preserve">Choosing among these four fitted models is model selection,</w:t>
       </w:r>
       <w:r>
         <w:t xml:space="preserve"> </w:t>
@@ -35678,17 +35687,34 @@
         <w:t xml:space="preserve"> </w:t>
       </w:r>
       <w:r>
-        <w:t xml:space="preserve">used to choose among candidate</w:t>
-      </w:r>
-      <w:r>
-        <w:t xml:space="preserve"> </w:t>
-      </w:r>
-      <w:hyperlink w:anchor="def-fitting-procedure">
+        <w:t xml:space="preserve">used for</w:t>
+      </w:r>
+      <w:r>
+        <w:t xml:space="preserve"> </w:t>
+      </w:r>
+      <w:hyperlink w:anchor="def-model-selection">
         <w:r>
           <w:rPr>
             <w:rStyle w:val="Hyperlink"/>
           </w:rPr>
-          <w:t xml:space="preserve">fitting procedures</w:t>
+          <w:t xml:space="preserve">model selection</w:t>
+        </w:r>
+      </w:hyperlink>
+      <w:r>
+        <w:t xml:space="preserve"> </w:t>
+      </w:r>
+      <w:r>
+        <w:t xml:space="preserve">among candidate</w:t>
+      </w:r>
+      <w:r>
+        <w:t xml:space="preserve"> </w:t>
+      </w:r>
+      <w:hyperlink w:anchor="def-fitted-model">
+        <w:r>
+          <w:rPr>
+            <w:rStyle w:val="Hyperlink"/>
+          </w:rPr>
+          <w:t xml:space="preserve">fitted models</w:t>
         </w:r>
       </w:hyperlink>
       <w:r>
@@ -61059,7 +61085,7 @@
         <w:rPr>
           <w:rStyle w:val="CommentTok"/>
         </w:rPr>
-        <w:t xml:space="preserve">#&gt;    7.10543e-15    2.00000e+00</w:t>
+        <w:t xml:space="preserve">#&gt;    8.88178e-15    2.00000e+00</w:t>
       </w:r>
     </w:p>
     <w:p>
@@ -61067,7 +61093,7 @@
         <w:pStyle w:val="FirstParagraph"/>
       </w:pPr>
       <w:r>
-        <w:t xml:space="preserve">The two columns differ by at most 7.1e-15,</w:t>
+        <w:t xml:space="preserve">The two columns differ by at most 8.9e-15,</w:t>
       </w:r>
       <w:r>
         <w:t xml:space="preserve"> </w:t>

</xml_diff>

<commit_message>
Deploying to gh-pages from @ Morrison-Lab/sds@f68c1f08edb9e5d6df4220564ae2d00073acdade 🚀
</commit_message>
<xml_diff>
--- a/model-validation-handout.docx
+++ b/model-validation-handout.docx
@@ -15,7 +15,7 @@
         <w:pStyle w:val="Date"/>
       </w:pPr>
       <w:r>
-        <w:t xml:space="preserve">Last modified: 2026-10-17 00:53:34 (PDT)</w:t>
+        <w:t xml:space="preserve">Last modified: 2026-10-17 02:02:33 (PDT)</w:t>
       </w:r>
     </w:p>
     <w:bookmarkStart w:id="17" w:name="sec-data-sets"/>
@@ -14879,7 +14879,7 @@
         <w:t xml:space="preserve"> </w:t>
       </w:r>
       <w:r>
-        <w:t xml:space="preserve">the bias reflects the error introduced by approximating a real-world relationship by a model.</w:t>
+        <w:t xml:space="preserve">the bias reflects the approximation error that comes from approximating a real-world relationship by a model.</w:t>
       </w:r>
     </w:p>
     <w:bookmarkStart w:id="102" w:name="exm-prediction-bias"/>
@@ -25860,7 +25860,13 @@
         <w:t xml:space="preserve"> </w:t>
       </w:r>
       <w:r>
-        <w:t xml:space="preserve">splits that error, under squared-error loss,</w:t>
+        <w:t xml:space="preserve">splits each of those expected prediction errors,</w:t>
+      </w:r>
+      <w:r>
+        <w:t xml:space="preserve"> </w:t>
+      </w:r>
+      <w:r>
+        <w:t xml:space="preserve">under squared-error loss,</w:t>
       </w:r>
       <w:r>
         <w:t xml:space="preserve"> </w:t>
@@ -49122,7 +49128,7 @@
         <w:t xml:space="preserve"> </w:t>
       </w:r>
       <w:r>
-        <w:t xml:space="preserve">tends to overstate the error of a rule fitted to all</w:t>
+        <w:t xml:space="preserve">tends to overstate the expected generalization error of a rule fitted to all</w:t>
       </w:r>
       <w:r>
         <w:t xml:space="preserve"> </w:t>
@@ -52222,7 +52228,7 @@
         <w:t xml:space="preserve"> </w:t>
       </w:r>
       <w:r>
-        <w:t xml:space="preserve">not the error of a fit to 30 points.</w:t>
+        <w:t xml:space="preserve">not the expected generalization error of a fit to 30 points.</w:t>
       </w:r>
       <w:r>
         <w:t xml:space="preserve"> </w:t>
@@ -61085,7 +61091,7 @@
         <w:rPr>
           <w:rStyle w:val="CommentTok"/>
         </w:rPr>
-        <w:t xml:space="preserve">#&gt;    8.88178e-15    2.00000e+00</w:t>
+        <w:t xml:space="preserve">#&gt;    7.10543e-15    2.00000e+00</w:t>
       </w:r>
     </w:p>
     <w:p>
@@ -61093,7 +61099,7 @@
         <w:pStyle w:val="FirstParagraph"/>
       </w:pPr>
       <w:r>
-        <w:t xml:space="preserve">The two columns differ by at most 8.9e-15,</w:t>
+        <w:t xml:space="preserve">The two columns differ by at most 7.1e-15,</w:t>
       </w:r>
       <w:r>
         <w:t xml:space="preserve"> </w:t>

</xml_diff>

<commit_message>
Deploying to gh-pages from @ Morrison-Lab/sds@ff77f17c53975bb68bc9bc233415a300d706571a 🚀
</commit_message>
<xml_diff>
--- a/model-validation-handout.docx
+++ b/model-validation-handout.docx
@@ -15,7 +15,7 @@
         <w:pStyle w:val="Date"/>
       </w:pPr>
       <w:r>
-        <w:t xml:space="preserve">Last modified: 2026-10-17 02:34:28 (PDT)</w:t>
+        <w:t xml:space="preserve">Last modified: 2026-10-17 03:00:25 (PDT)</w:t>
       </w:r>
     </w:p>
     <w:bookmarkStart w:id="17" w:name="sec-data-sets"/>
@@ -27472,9 +27472,16 @@
       <m:oMath>
         <m:sSub>
           <m:e>
-            <m:r>
-              <m:t>g</m:t>
-            </m:r>
+            <m:acc>
+              <m:accPr>
+                <m:chr m:val="̂"/>
+              </m:accPr>
+              <m:e>
+                <m:r>
+                  <m:t>y</m:t>
+                </m:r>
+              </m:e>
+            </m:acc>
           </m:e>
           <m:sub>
             <m:r>
@@ -27502,9 +27509,16 @@
         </m:r>
         <m:sSub>
           <m:e>
-            <m:r>
-              <m:t>g</m:t>
-            </m:r>
+            <m:acc>
+              <m:accPr>
+                <m:chr m:val="̂"/>
+              </m:accPr>
+              <m:e>
+                <m:r>
+                  <m:t>y</m:t>
+                </m:r>
+              </m:e>
+            </m:acc>
           </m:e>
           <m:sub>
             <m:r>
@@ -27528,9 +27542,16 @@
       <m:oMath>
         <m:sSub>
           <m:e>
-            <m:r>
-              <m:t>g</m:t>
-            </m:r>
+            <m:acc>
+              <m:accPr>
+                <m:chr m:val="̂"/>
+              </m:accPr>
+              <m:e>
+                <m:r>
+                  <m:t>y</m:t>
+                </m:r>
+              </m:e>
+            </m:acc>
           </m:e>
           <m:sub>
             <m:r>
@@ -27551,9 +27572,16 @@
       <m:oMath>
         <m:sSub>
           <m:e>
-            <m:r>
-              <m:t>g</m:t>
-            </m:r>
+            <m:acc>
+              <m:accPr>
+                <m:chr m:val="̂"/>
+              </m:accPr>
+              <m:e>
+                <m:r>
+                  <m:t>y</m:t>
+                </m:r>
+              </m:e>
+            </m:acc>
           </m:e>
           <m:sub>
             <m:r>
@@ -27810,7 +27838,27 @@
         <w:t xml:space="preserve"> </w:t>
       </w:r>
       <w:r>
-        <w:t xml:space="preserve">is a candidate of</w:t>
+        <w:t xml:space="preserve">is among the functions that candidate</w:t>
+      </w:r>
+      <w:r>
+        <w:t xml:space="preserve"> </w:t>
+      </w:r>
+      <m:oMath>
+        <m:r>
+          <m:t>1</m:t>
+        </m:r>
+      </m:oMath>
+      <w:r>
+        <w:t xml:space="preserve"> </w:t>
+      </w:r>
+      <w:r>
+        <w:t xml:space="preserve">can fit,</w:t>
+      </w:r>
+      <w:r>
+        <w:t xml:space="preserve"> </w:t>
+      </w:r>
+      <w:r>
+        <w:t xml:space="preserve">the squared bias of</w:t>
       </w:r>
       <w:r>
         <w:t xml:space="preserve"> </w:t>
@@ -27818,9 +27866,16 @@
       <m:oMath>
         <m:sSub>
           <m:e>
-            <m:r>
-              <m:t>g</m:t>
-            </m:r>
+            <m:acc>
+              <m:accPr>
+                <m:chr m:val="̂"/>
+              </m:accPr>
+              <m:e>
+                <m:r>
+                  <m:t>y</m:t>
+                </m:r>
+              </m:e>
+            </m:acc>
           </m:e>
           <m:sub>
             <m:r>
@@ -27830,13 +27885,16 @@
         </m:sSub>
       </m:oMath>
       <w:r>
-        <w:t xml:space="preserve">,</w:t>
-      </w:r>
-      <w:r>
-        <w:t xml:space="preserve"> </w:t>
-      </w:r>
-      <w:r>
-        <w:t xml:space="preserve">the squared bias of</w:t>
+        <w:t xml:space="preserve"> </w:t>
+      </w:r>
+      <w:r>
+        <w:t xml:space="preserve">can be zero,</w:t>
+      </w:r>
+      <w:r>
+        <w:t xml:space="preserve"> </w:t>
+      </w:r>
+      <w:r>
+        <w:t xml:space="preserve">and then no more flexible</w:t>
       </w:r>
       <w:r>
         <w:t xml:space="preserve"> </w:t>
@@ -27844,13 +27902,20 @@
       <m:oMath>
         <m:sSub>
           <m:e>
-            <m:r>
-              <m:t>g</m:t>
-            </m:r>
+            <m:acc>
+              <m:accPr>
+                <m:chr m:val="̂"/>
+              </m:accPr>
+              <m:e>
+                <m:r>
+                  <m:t>y</m:t>
+                </m:r>
+              </m:e>
+            </m:acc>
           </m:e>
           <m:sub>
             <m:r>
-              <m:t>1</m:t>
+              <m:t>l</m:t>
             </m:r>
           </m:sub>
         </m:sSub>
@@ -27859,35 +27924,6 @@
         <w:t xml:space="preserve"> </w:t>
       </w:r>
       <w:r>
-        <w:t xml:space="preserve">can be zero,</w:t>
-      </w:r>
-      <w:r>
-        <w:t xml:space="preserve"> </w:t>
-      </w:r>
-      <w:r>
-        <w:t xml:space="preserve">and then no later</w:t>
-      </w:r>
-      <w:r>
-        <w:t xml:space="preserve"> </w:t>
-      </w:r>
-      <m:oMath>
-        <m:sSub>
-          <m:e>
-            <m:r>
-              <m:t>g</m:t>
-            </m:r>
-          </m:e>
-          <m:sub>
-            <m:r>
-              <m:t>l</m:t>
-            </m:r>
-          </m:sub>
-        </m:sSub>
-      </m:oMath>
-      <w:r>
-        <w:t xml:space="preserve"> </w:t>
-      </w:r>
-      <w:r>
         <w:t xml:space="preserve">has a smaller squared bias</w:t>
       </w:r>
       <w:r>
@@ -27906,19 +27942,19 @@
         <w:t xml:space="preserve"> </w:t>
       </w:r>
       <w:r>
-        <w:t xml:space="preserve">The procedures past the smallest error</w:t>
-      </w:r>
-      <w:r>
-        <w:t xml:space="preserve"> </w:t>
-      </w:r>
-      <w:r>
-        <w:t xml:space="preserve">have lowered their squared bias by less than they have raised their variance,</w:t>
-      </w:r>
-      <w:r>
-        <w:t xml:space="preserve"> </w:t>
-      </w:r>
-      <w:r>
-        <w:t xml:space="preserve">and the rules they produce tend to</w:t>
+        <w:t xml:space="preserve">Past the candidate with the smallest expected squared prediction error,</w:t>
+      </w:r>
+      <w:r>
+        <w:t xml:space="preserve"> </w:t>
+      </w:r>
+      <w:r>
+        <w:t xml:space="preserve">the more flexible candidates have lowered their squared bias by less than they have raised their variance,</w:t>
+      </w:r>
+      <w:r>
+        <w:t xml:space="preserve"> </w:t>
+      </w:r>
+      <w:r>
+        <w:t xml:space="preserve">and their fitted models tend to</w:t>
       </w:r>
       <w:r>
         <w:t xml:space="preserve"> </w:t>
@@ -27938,7 +27974,7 @@
         <w:t xml:space="preserve"> </w:t>
       </w:r>
       <w:r>
-        <w:t xml:space="preserve">they fit their training sets more closely than the procedure with the smallest error</w:t>
+        <w:t xml:space="preserve">they fit their training sets more closely than the fitted model of the candidate with the smallest expected squared prediction error</w:t>
       </w:r>
       <w:r>
         <w:t xml:space="preserve"> </w:t>
@@ -36780,17 +36816,17 @@
         <w:t xml:space="preserve"> </w:t>
       </w:r>
       <w:r>
-        <w:t xml:space="preserve">on which the rule of the</w:t>
-      </w:r>
-      <w:r>
-        <w:t xml:space="preserve"> </w:t>
-      </w:r>
-      <w:hyperlink w:anchor="def-validation-choice">
+        <w:t xml:space="preserve">on which the</w:t>
+      </w:r>
+      <w:r>
+        <w:t xml:space="preserve"> </w:t>
+      </w:r>
+      <w:hyperlink w:anchor="def-fitted-model">
         <w:r>
           <w:rPr>
             <w:rStyle w:val="Hyperlink"/>
           </w:rPr>
-          <w:t xml:space="preserve">validation choice</w:t>
+          <w:t xml:space="preserve">fitted model</w:t>
         </w:r>
       </w:hyperlink>
       <w:r>
@@ -36799,9 +36835,16 @@
       <m:oMath>
         <m:sSub>
           <m:e>
-            <m:r>
-              <m:t>g</m:t>
-            </m:r>
+            <m:acc>
+              <m:accPr>
+                <m:chr m:val="̂"/>
+              </m:accPr>
+              <m:e>
+                <m:r>
+                  <m:t>y</m:t>
+                </m:r>
+              </m:e>
+            </m:acc>
           </m:e>
           <m:sub>
             <m:acc>
@@ -36821,7 +36864,24 @@
         <w:t xml:space="preserve"> </w:t>
       </w:r>
       <w:r>
-        <w:t xml:space="preserve">is scored:</w:t>
+        <w:t xml:space="preserve">that the</w:t>
+      </w:r>
+      <w:r>
+        <w:t xml:space="preserve"> </w:t>
+      </w:r>
+      <w:hyperlink w:anchor="def-validation-choice">
+        <w:r>
+          <w:rPr>
+            <w:rStyle w:val="Hyperlink"/>
+          </w:rPr>
+          <w:t xml:space="preserve">validation choice</w:t>
+        </w:r>
+      </w:hyperlink>
+      <w:r>
+        <w:t xml:space="preserve"> </w:t>
+      </w:r>
+      <w:r>
+        <w:t xml:space="preserve">picks is scored:</w:t>
       </w:r>
     </w:p>
     <w:p>
@@ -37360,7 +37420,7 @@
         </w:numPr>
       </w:pPr>
       <w:r>
-        <w:t xml:space="preserve">the training set is used to fit each candidate procedure,</w:t>
+        <w:t xml:space="preserve">the training set is used to fit each candidate model,</w:t>
       </w:r>
       <w:r>
         <w:t xml:space="preserve"> </w:t>
@@ -37439,7 +37499,7 @@
         <w:t xml:space="preserve"> </w:t>
       </w:r>
       <w:r>
-        <w:t xml:space="preserve">of the chosen rule.</w:t>
+        <w:t xml:space="preserve">of the chosen fitted model.</w:t>
       </w:r>
     </w:p>
     <w:p>
@@ -37447,7 +37507,7 @@
         <w:pStyle w:val="FirstParagraph"/>
       </w:pPr>
       <w:r>
-        <w:t xml:space="preserve">The chosen procedure won on the validation set</w:t>
+        <w:t xml:space="preserve">The chosen fitted model won on the validation set</w:t>
       </w:r>
       <w:r>
         <w:t xml:space="preserve"> </w:t>
@@ -37459,7 +37519,7 @@
         <w:t xml:space="preserve"> </w:t>
       </w:r>
       <w:r>
-        <w:t xml:space="preserve">so its validation error is optimistic.</w:t>
+        <w:t xml:space="preserve">so its prediction error on the validation set is optimistic as an estimate of its generalization error.</w:t>
       </w:r>
       <w:r>
         <w:t xml:space="preserve"> </w:t>

</xml_diff>

<commit_message>
Deploying to gh-pages from @ Morrison-Lab/sds@83995331e971fa127db94f84ccfa236a5d6a4837 🚀
</commit_message>
<xml_diff>
--- a/model-validation-handout.docx
+++ b/model-validation-handout.docx
@@ -15,7 +15,7 @@
         <w:pStyle w:val="Date"/>
       </w:pPr>
       <w:r>
-        <w:t xml:space="preserve">Last modified: 2026-10-17 08:14:32 (PDT)</w:t>
+        <w:t xml:space="preserve">Last modified: 2026-10-17 08:57:23 (PDT)</w:t>
       </w:r>
     </w:p>
     <w:bookmarkStart w:id="17" w:name="sec-data-sets"/>
@@ -21982,15 +21982,61 @@
         <m:sSub>
           <m:e>
             <m:r>
-              <m:t>μ</m:t>
+              <m:rPr>
+                <m:sty m:val="p"/>
+              </m:rPr>
+              <m:t>E</m:t>
             </m:r>
           </m:e>
           <m:sub>
-            <m:r>
-              <m:t>h</m:t>
-            </m:r>
+            <m:sSub>
+              <m:e>
+                <m:r>
+                  <m:rPr>
+                    <m:scr m:val="script"/>
+                    <m:sty m:val="p"/>
+                  </m:rPr>
+                  <m:t>D</m:t>
+                </m:r>
+              </m:e>
+              <m:sub>
+                <m:r>
+                  <m:rPr>
+                    <m:nor/>
+                    <m:sty m:val="p"/>
+                  </m:rPr>
+                  <m:t>train</m:t>
+                </m:r>
+              </m:sub>
+            </m:sSub>
           </m:sub>
         </m:sSub>
+        <m:r>
+          <m:t>​</m:t>
+        </m:r>
+        <m:d>
+          <m:dPr>
+            <m:begChr m:val="["/>
+            <m:sepChr m:val=""/>
+            <m:endChr m:val="]"/>
+            <m:grow/>
+          </m:dPr>
+          <m:e>
+            <m:acc>
+              <m:accPr>
+                <m:chr m:val="̂"/>
+              </m:accPr>
+              <m:e>
+                <m:r>
+                  <m:t>y</m:t>
+                </m:r>
+              </m:e>
+            </m:acc>
+          </m:e>
+        </m:d>
+        <m:r>
+          <m:t>​</m:t>
+        </m:r>
       </m:oMath>
       <w:r>
         <w:t xml:space="preserve"> </w:t>
@@ -22103,1120 +22149,6 @@
                   <m:r>
                     <m:t>μ</m:t>
                   </m:r>
-                  <m:r>
-                    <m:rPr>
-                      <m:sty m:val="p"/>
-                    </m:rPr>
-                    <m:t>−</m:t>
-                  </m:r>
-                  <m:sSub>
-                    <m:e>
-                      <m:r>
-                        <m:t>μ</m:t>
-                      </m:r>
-                    </m:e>
-                    <m:sub>
-                      <m:r>
-                        <m:t>h</m:t>
-                      </m:r>
-                    </m:sub>
-                  </m:sSub>
-                </m:e>
-              </m:d>
-              <m:r>
-                <m:t>​</m:t>
-              </m:r>
-              <m:r>
-                <m:rPr>
-                  <m:sty m:val="p"/>
-                </m:rPr>
-                <m:t>+</m:t>
-              </m:r>
-              <m:r>
-                <m:t>​</m:t>
-              </m:r>
-              <m:d>
-                <m:dPr>
-                  <m:begChr m:val="("/>
-                  <m:sepChr m:val=""/>
-                  <m:endChr m:val=")"/>
-                  <m:grow/>
-                </m:dPr>
-                <m:e>
-                  <m:sSub>
-                    <m:e>
-                      <m:r>
-                        <m:t>μ</m:t>
-                      </m:r>
-                    </m:e>
-                    <m:sub>
-                      <m:r>
-                        <m:t>h</m:t>
-                      </m:r>
-                    </m:sub>
-                  </m:sSub>
-                  <m:r>
-                    <m:rPr>
-                      <m:sty m:val="p"/>
-                    </m:rPr>
-                    <m:t>−</m:t>
-                  </m:r>
-                  <m:acc>
-                    <m:accPr>
-                      <m:chr m:val="̂"/>
-                    </m:accPr>
-                    <m:e>
-                      <m:r>
-                        <m:t>y</m:t>
-                      </m:r>
-                    </m:e>
-                  </m:acc>
-                </m:e>
-              </m:d>
-              <m:r>
-                <m:t>​</m:t>
-              </m:r>
-              <m:r>
-                <m:t>&amp;</m:t>
-              </m:r>
-              <m:r>
-                <m:t>&amp;</m:t>
-              </m:r>
-              <m:r>
-                <m:rPr>
-                  <m:nor/>
-                  <m:sty m:val="p"/>
-                </m:rPr>
-                <m:t>(add and subtract </m:t>
-              </m:r>
-              <m:sSub>
-                <m:e>
-                  <m:r>
-                    <m:t>μ</m:t>
-                  </m:r>
-                </m:e>
-                <m:sub>
-                  <m:r>
-                    <m:t>h</m:t>
-                  </m:r>
-                </m:sub>
-              </m:sSub>
-              <m:r>
-                <m:rPr>
-                  <m:nor/>
-                  <m:sty m:val="p"/>
-                </m:rPr>
-                <m:t>)</m:t>
-              </m:r>
-            </m:e>
-          </m:eqArr>
-        </m:oMath>
-      </m:oMathPara>
-    </w:p>
-    <w:p>
-      <w:pPr>
-        <w:pStyle w:val="FirstParagraph"/>
-      </w:pPr>
-      <w:r>
-        <w:t xml:space="preserve">Square it:</w:t>
-      </w:r>
-    </w:p>
-    <w:p>
-      <w:pPr>
-        <w:pStyle w:val="BodyText"/>
-      </w:pPr>
-      <m:oMathPara>
-        <m:oMathParaPr>
-          <m:jc m:val="center"/>
-        </m:oMathParaPr>
-        <m:oMath>
-          <m:eqArr>
-            <m:e>
-              <m:sSup>
-                <m:e>
-                  <m:r>
-                    <m:t>​</m:t>
-                  </m:r>
-                  <m:d>
-                    <m:dPr>
-                      <m:begChr m:val="("/>
-                      <m:sepChr m:val=""/>
-                      <m:endChr m:val=")"/>
-                      <m:grow/>
-                    </m:dPr>
-                    <m:e>
-                      <m:r>
-                        <m:t>μ</m:t>
-                      </m:r>
-                      <m:r>
-                        <m:rPr>
-                          <m:sty m:val="p"/>
-                        </m:rPr>
-                        <m:t>−</m:t>
-                      </m:r>
-                      <m:acc>
-                        <m:accPr>
-                          <m:chr m:val="̂"/>
-                        </m:accPr>
-                        <m:e>
-                          <m:r>
-                            <m:t>y</m:t>
-                          </m:r>
-                        </m:e>
-                      </m:acc>
-                    </m:e>
-                  </m:d>
-                  <m:r>
-                    <m:t>​</m:t>
-                  </m:r>
-                </m:e>
-                <m:sup>
-                  <m:r>
-                    <m:t>2</m:t>
-                  </m:r>
-                </m:sup>
-              </m:sSup>
-              <m:r>
-                <m:t>&amp;</m:t>
-              </m:r>
-              <m:r>
-                <m:rPr>
-                  <m:sty m:val="p"/>
-                </m:rPr>
-                <m:t>=</m:t>
-              </m:r>
-              <m:sSup>
-                <m:e>
-                  <m:r>
-                    <m:t>​</m:t>
-                  </m:r>
-                  <m:d>
-                    <m:dPr>
-                      <m:begChr m:val="("/>
-                      <m:sepChr m:val=""/>
-                      <m:endChr m:val=")"/>
-                      <m:grow/>
-                    </m:dPr>
-                    <m:e>
-                      <m:r>
-                        <m:t>μ</m:t>
-                      </m:r>
-                      <m:r>
-                        <m:rPr>
-                          <m:sty m:val="p"/>
-                        </m:rPr>
-                        <m:t>−</m:t>
-                      </m:r>
-                      <m:sSub>
-                        <m:e>
-                          <m:r>
-                            <m:t>μ</m:t>
-                          </m:r>
-                        </m:e>
-                        <m:sub>
-                          <m:r>
-                            <m:t>h</m:t>
-                          </m:r>
-                        </m:sub>
-                      </m:sSub>
-                    </m:e>
-                  </m:d>
-                  <m:r>
-                    <m:t>​</m:t>
-                  </m:r>
-                </m:e>
-                <m:sup>
-                  <m:r>
-                    <m:t>2</m:t>
-                  </m:r>
-                </m:sup>
-              </m:sSup>
-              <m:r>
-                <m:rPr>
-                  <m:sty m:val="p"/>
-                </m:rPr>
-                <m:t>+</m:t>
-              </m:r>
-              <m:r>
-                <m:t>2</m:t>
-              </m:r>
-              <m:r>
-                <m:t>​</m:t>
-              </m:r>
-              <m:d>
-                <m:dPr>
-                  <m:begChr m:val="("/>
-                  <m:sepChr m:val=""/>
-                  <m:endChr m:val=")"/>
-                  <m:grow/>
-                </m:dPr>
-                <m:e>
-                  <m:r>
-                    <m:t>μ</m:t>
-                  </m:r>
-                  <m:r>
-                    <m:rPr>
-                      <m:sty m:val="p"/>
-                    </m:rPr>
-                    <m:t>−</m:t>
-                  </m:r>
-                  <m:sSub>
-                    <m:e>
-                      <m:r>
-                        <m:t>μ</m:t>
-                      </m:r>
-                    </m:e>
-                    <m:sub>
-                      <m:r>
-                        <m:t>h</m:t>
-                      </m:r>
-                    </m:sub>
-                  </m:sSub>
-                </m:e>
-              </m:d>
-              <m:r>
-                <m:t>​</m:t>
-              </m:r>
-              <m:r>
-                <m:t>​</m:t>
-              </m:r>
-              <m:d>
-                <m:dPr>
-                  <m:begChr m:val="("/>
-                  <m:sepChr m:val=""/>
-                  <m:endChr m:val=")"/>
-                  <m:grow/>
-                </m:dPr>
-                <m:e>
-                  <m:sSub>
-                    <m:e>
-                      <m:r>
-                        <m:t>μ</m:t>
-                      </m:r>
-                    </m:e>
-                    <m:sub>
-                      <m:r>
-                        <m:t>h</m:t>
-                      </m:r>
-                    </m:sub>
-                  </m:sSub>
-                  <m:r>
-                    <m:rPr>
-                      <m:sty m:val="p"/>
-                    </m:rPr>
-                    <m:t>−</m:t>
-                  </m:r>
-                  <m:acc>
-                    <m:accPr>
-                      <m:chr m:val="̂"/>
-                    </m:accPr>
-                    <m:e>
-                      <m:r>
-                        <m:t>y</m:t>
-                      </m:r>
-                    </m:e>
-                  </m:acc>
-                </m:e>
-              </m:d>
-              <m:r>
-                <m:t>​</m:t>
-              </m:r>
-              <m:r>
-                <m:rPr>
-                  <m:sty m:val="p"/>
-                </m:rPr>
-                <m:t>+</m:t>
-              </m:r>
-              <m:sSup>
-                <m:e>
-                  <m:r>
-                    <m:t>​</m:t>
-                  </m:r>
-                  <m:d>
-                    <m:dPr>
-                      <m:begChr m:val="("/>
-                      <m:sepChr m:val=""/>
-                      <m:endChr m:val=")"/>
-                      <m:grow/>
-                    </m:dPr>
-                    <m:e>
-                      <m:sSub>
-                        <m:e>
-                          <m:r>
-                            <m:t>μ</m:t>
-                          </m:r>
-                        </m:e>
-                        <m:sub>
-                          <m:r>
-                            <m:t>h</m:t>
-                          </m:r>
-                        </m:sub>
-                      </m:sSub>
-                      <m:r>
-                        <m:rPr>
-                          <m:sty m:val="p"/>
-                        </m:rPr>
-                        <m:t>−</m:t>
-                      </m:r>
-                      <m:acc>
-                        <m:accPr>
-                          <m:chr m:val="̂"/>
-                        </m:accPr>
-                        <m:e>
-                          <m:r>
-                            <m:t>y</m:t>
-                          </m:r>
-                        </m:e>
-                      </m:acc>
-                    </m:e>
-                  </m:d>
-                  <m:r>
-                    <m:t>​</m:t>
-                  </m:r>
-                </m:e>
-                <m:sup>
-                  <m:r>
-                    <m:t>2</m:t>
-                  </m:r>
-                </m:sup>
-              </m:sSup>
-              <m:r>
-                <m:t>&amp;</m:t>
-              </m:r>
-              <m:r>
-                <m:t>&amp;</m:t>
-              </m:r>
-              <m:r>
-                <m:rPr>
-                  <m:nor/>
-                  <m:sty m:val="p"/>
-                </m:rPr>
-                <m:t>(expand the square of a sum)</m:t>
-              </m:r>
-            </m:e>
-          </m:eqArr>
-        </m:oMath>
-      </m:oMathPara>
-    </w:p>
-    <w:p>
-      <w:pPr>
-        <w:pStyle w:val="FirstParagraph"/>
-      </w:pPr>
-      <w:r>
-        <w:t xml:space="preserve">Take the expectation of each term in turn.</w:t>
-      </w:r>
-    </w:p>
-    <w:p>
-      <w:pPr>
-        <w:pStyle w:val="BodyText"/>
-      </w:pPr>
-      <w:r>
-        <w:t xml:space="preserve">The first term does not depend on</w:t>
-      </w:r>
-      <w:r>
-        <w:t xml:space="preserve"> </w:t>
-      </w:r>
-      <m:oMath>
-        <m:sSub>
-          <m:e>
-            <m:r>
-              <m:rPr>
-                <m:scr m:val="script"/>
-                <m:sty m:val="p"/>
-              </m:rPr>
-              <m:t>D</m:t>
-            </m:r>
-          </m:e>
-          <m:sub>
-            <m:r>
-              <m:rPr>
-                <m:nor/>
-                <m:sty m:val="p"/>
-              </m:rPr>
-              <m:t>train</m:t>
-            </m:r>
-          </m:sub>
-        </m:sSub>
-      </m:oMath>
-      <w:r>
-        <w:t xml:space="preserve">:</w:t>
-      </w:r>
-      <w:r>
-        <w:t xml:space="preserve"> </w:t>
-      </w:r>
-      <m:oMath>
-        <m:r>
-          <m:t>μ</m:t>
-        </m:r>
-      </m:oMath>
-      <w:r>
-        <w:t xml:space="preserve"> </w:t>
-      </w:r>
-      <w:r>
-        <w:t xml:space="preserve">is a constant,</w:t>
-      </w:r>
-      <w:r>
-        <w:t xml:space="preserve"> </w:t>
-      </w:r>
-      <w:r>
-        <w:t xml:space="preserve">and</w:t>
-      </w:r>
-      <w:r>
-        <w:t xml:space="preserve"> </w:t>
-      </w:r>
-      <m:oMath>
-        <m:sSub>
-          <m:e>
-            <m:r>
-              <m:t>μ</m:t>
-            </m:r>
-          </m:e>
-          <m:sub>
-            <m:r>
-              <m:t>h</m:t>
-            </m:r>
-          </m:sub>
-        </m:sSub>
-      </m:oMath>
-      <w:r>
-        <w:t xml:space="preserve"> </w:t>
-      </w:r>
-      <w:r>
-        <w:t xml:space="preserve">has already been averaged over training sets.</w:t>
-      </w:r>
-      <w:r>
-        <w:t xml:space="preserve"> </w:t>
-      </w:r>
-      <w:r>
-        <w:t xml:space="preserve">The expectation of a constant is that constant:</w:t>
-      </w:r>
-    </w:p>
-    <w:p>
-      <w:pPr>
-        <w:pStyle w:val="BodyText"/>
-      </w:pPr>
-      <m:oMathPara>
-        <m:oMathParaPr>
-          <m:jc m:val="center"/>
-        </m:oMathParaPr>
-        <m:oMath>
-          <m:eqArr>
-            <m:e>
-              <m:r>
-                <m:rPr>
-                  <m:sty m:val="p"/>
-                </m:rPr>
-                <m:t>E</m:t>
-              </m:r>
-              <m:r>
-                <m:t>​</m:t>
-              </m:r>
-              <m:d>
-                <m:dPr>
-                  <m:begChr m:val="["/>
-                  <m:sepChr m:val=""/>
-                  <m:endChr m:val="]"/>
-                  <m:grow/>
-                </m:dPr>
-                <m:e>
-                  <m:sSup>
-                    <m:e>
-                      <m:r>
-                        <m:t>​</m:t>
-                      </m:r>
-                      <m:d>
-                        <m:dPr>
-                          <m:begChr m:val="("/>
-                          <m:sepChr m:val=""/>
-                          <m:endChr m:val=")"/>
-                          <m:grow/>
-                        </m:dPr>
-                        <m:e>
-                          <m:r>
-                            <m:t>μ</m:t>
-                          </m:r>
-                          <m:r>
-                            <m:rPr>
-                              <m:sty m:val="p"/>
-                            </m:rPr>
-                            <m:t>−</m:t>
-                          </m:r>
-                          <m:sSub>
-                            <m:e>
-                              <m:r>
-                                <m:t>μ</m:t>
-                              </m:r>
-                            </m:e>
-                            <m:sub>
-                              <m:r>
-                                <m:t>h</m:t>
-                              </m:r>
-                            </m:sub>
-                          </m:sSub>
-                        </m:e>
-                      </m:d>
-                      <m:r>
-                        <m:t>​</m:t>
-                      </m:r>
-                    </m:e>
-                    <m:sup>
-                      <m:r>
-                        <m:t>2</m:t>
-                      </m:r>
-                    </m:sup>
-                  </m:sSup>
-                </m:e>
-              </m:d>
-              <m:r>
-                <m:t>​</m:t>
-              </m:r>
-              <m:r>
-                <m:t>&amp;</m:t>
-              </m:r>
-              <m:r>
-                <m:rPr>
-                  <m:sty m:val="p"/>
-                </m:rPr>
-                <m:t>=</m:t>
-              </m:r>
-              <m:sSup>
-                <m:e>
-                  <m:r>
-                    <m:t>​</m:t>
-                  </m:r>
-                  <m:d>
-                    <m:dPr>
-                      <m:begChr m:val="("/>
-                      <m:sepChr m:val=""/>
-                      <m:endChr m:val=")"/>
-                      <m:grow/>
-                    </m:dPr>
-                    <m:e>
-                      <m:r>
-                        <m:t>μ</m:t>
-                      </m:r>
-                      <m:r>
-                        <m:rPr>
-                          <m:sty m:val="p"/>
-                        </m:rPr>
-                        <m:t>−</m:t>
-                      </m:r>
-                      <m:sSub>
-                        <m:e>
-                          <m:r>
-                            <m:t>μ</m:t>
-                          </m:r>
-                        </m:e>
-                        <m:sub>
-                          <m:r>
-                            <m:t>h</m:t>
-                          </m:r>
-                        </m:sub>
-                      </m:sSub>
-                    </m:e>
-                  </m:d>
-                  <m:r>
-                    <m:t>​</m:t>
-                  </m:r>
-                </m:e>
-                <m:sup>
-                  <m:r>
-                    <m:t>2</m:t>
-                  </m:r>
-                </m:sup>
-              </m:sSup>
-              <m:r>
-                <m:t>&amp;</m:t>
-              </m:r>
-              <m:r>
-                <m:t>&amp;</m:t>
-              </m:r>
-              <m:r>
-                <m:rPr>
-                  <m:nor/>
-                  <m:sty m:val="p"/>
-                </m:rPr>
-                <m:t>(expectation of a constant)</m:t>
-              </m:r>
-            </m:e>
-            <m:e>
-              <m:r>
-                <m:t>&amp;</m:t>
-              </m:r>
-              <m:r>
-                <m:rPr>
-                  <m:sty m:val="p"/>
-                </m:rPr>
-                <m:t>=</m:t>
-              </m:r>
-              <m:sSup>
-                <m:e>
-                  <m:r>
-                    <m:t>​</m:t>
-                  </m:r>
-                  <m:d>
-                    <m:dPr>
-                      <m:begChr m:val="("/>
-                      <m:sepChr m:val=""/>
-                      <m:endChr m:val=")"/>
-                      <m:grow/>
-                    </m:dPr>
-                    <m:e>
-                      <m:sSub>
-                        <m:e>
-                          <m:r>
-                            <m:t>μ</m:t>
-                          </m:r>
-                        </m:e>
-                        <m:sub>
-                          <m:r>
-                            <m:t>h</m:t>
-                          </m:r>
-                        </m:sub>
-                      </m:sSub>
-                      <m:r>
-                        <m:rPr>
-                          <m:sty m:val="p"/>
-                        </m:rPr>
-                        <m:t>−</m:t>
-                      </m:r>
-                      <m:r>
-                        <m:t>μ</m:t>
-                      </m:r>
-                    </m:e>
-                  </m:d>
-                  <m:r>
-                    <m:t>​</m:t>
-                  </m:r>
-                </m:e>
-                <m:sup>
-                  <m:r>
-                    <m:t>2</m:t>
-                  </m:r>
-                </m:sup>
-              </m:sSup>
-              <m:r>
-                <m:t>&amp;</m:t>
-              </m:r>
-              <m:r>
-                <m:t>&amp;</m:t>
-              </m:r>
-              <m:r>
-                <m:rPr>
-                  <m:nor/>
-                  <m:sty m:val="p"/>
-                </m:rPr>
-                <m:t>(a number and its negative have the same square)</m:t>
-              </m:r>
-            </m:e>
-            <m:e>
-              <m:r>
-                <m:t>&amp;</m:t>
-              </m:r>
-              <m:r>
-                <m:rPr>
-                  <m:sty m:val="p"/>
-                </m:rPr>
-                <m:t>=</m:t>
-              </m:r>
-              <m:sSup>
-                <m:e>
-                  <m:r>
-                    <m:t>​</m:t>
-                  </m:r>
-                  <m:d>
-                    <m:dPr>
-                      <m:begChr m:val="("/>
-                      <m:sepChr m:val=""/>
-                      <m:endChr m:val=")"/>
-                      <m:grow/>
-                    </m:dPr>
-                    <m:e>
-                      <m:r>
-                        <m:rPr>
-                          <m:sty m:val="p"/>
-                        </m:rPr>
-                        <m:t>Bias</m:t>
-                      </m:r>
-                      <m:r>
-                        <m:t>​</m:t>
-                      </m:r>
-                      <m:d>
-                        <m:dPr>
-                          <m:begChr m:val="("/>
-                          <m:sepChr m:val=""/>
-                          <m:endChr m:val=")"/>
-                          <m:grow/>
-                        </m:dPr>
-                        <m:e>
-                          <m:acc>
-                            <m:accPr>
-                              <m:chr m:val="̂"/>
-                            </m:accPr>
-                            <m:e>
-                              <m:r>
-                                <m:t>y</m:t>
-                              </m:r>
-                            </m:e>
-                          </m:acc>
-                        </m:e>
-                      </m:d>
-                      <m:r>
-                        <m:t>​</m:t>
-                      </m:r>
-                    </m:e>
-                  </m:d>
-                  <m:r>
-                    <m:t>​</m:t>
-                  </m:r>
-                </m:e>
-                <m:sup>
-                  <m:r>
-                    <m:t>2</m:t>
-                  </m:r>
-                </m:sup>
-              </m:sSup>
-              <m:r>
-                <m:t>&amp;</m:t>
-              </m:r>
-              <m:r>
-                <m:t>&amp;</m:t>
-              </m:r>
-              <m:r>
-                <m:rPr>
-                  <m:nor/>
-                  <m:sty m:val="p"/>
-                </m:rPr>
-                <m:t>(definitions of the expected prediction and of bias)</m:t>
-              </m:r>
-            </m:e>
-          </m:eqArr>
-        </m:oMath>
-      </m:oMathPara>
-    </w:p>
-    <w:p>
-      <w:pPr>
-        <w:pStyle w:val="FirstParagraph"/>
-      </w:pPr>
-      <w:r>
-        <w:t xml:space="preserve">The cross term vanishes, and this time not by independence</w:t>
-      </w:r>
-      <w:r>
-        <w:t xml:space="preserve"> </w:t>
-      </w:r>
-      <w:r>
-        <w:t xml:space="preserve">but by the definition of the expected prediction.</w:t>
-      </w:r>
-      <w:r>
-        <w:t xml:space="preserve"> </w:t>
-      </w:r>
-      <w:r>
-        <w:t xml:space="preserve">The first factor is a constant, so it comes out of the expectation:</w:t>
-      </w:r>
-    </w:p>
-    <w:p>
-      <w:pPr>
-        <w:pStyle w:val="BodyText"/>
-      </w:pPr>
-      <m:oMathPara>
-        <m:oMathParaPr>
-          <m:jc m:val="center"/>
-        </m:oMathParaPr>
-        <m:oMath>
-          <m:eqArr>
-            <m:e>
-              <m:r>
-                <m:rPr>
-                  <m:sty m:val="p"/>
-                </m:rPr>
-                <m:t>E</m:t>
-              </m:r>
-              <m:r>
-                <m:t>​</m:t>
-              </m:r>
-              <m:d>
-                <m:dPr>
-                  <m:begChr m:val="["/>
-                  <m:sepChr m:val=""/>
-                  <m:endChr m:val="]"/>
-                  <m:grow/>
-                </m:dPr>
-                <m:e>
-                  <m:r>
-                    <m:t>2</m:t>
-                  </m:r>
-                  <m:r>
-                    <m:t>​</m:t>
-                  </m:r>
-                  <m:d>
-                    <m:dPr>
-                      <m:begChr m:val="("/>
-                      <m:sepChr m:val=""/>
-                      <m:endChr m:val=")"/>
-                      <m:grow/>
-                    </m:dPr>
-                    <m:e>
-                      <m:r>
-                        <m:t>μ</m:t>
-                      </m:r>
-                      <m:r>
-                        <m:rPr>
-                          <m:sty m:val="p"/>
-                        </m:rPr>
-                        <m:t>−</m:t>
-                      </m:r>
-                      <m:sSub>
-                        <m:e>
-                          <m:r>
-                            <m:t>μ</m:t>
-                          </m:r>
-                        </m:e>
-                        <m:sub>
-                          <m:r>
-                            <m:t>h</m:t>
-                          </m:r>
-                        </m:sub>
-                      </m:sSub>
-                    </m:e>
-                  </m:d>
-                  <m:r>
-                    <m:t>​</m:t>
-                  </m:r>
-                  <m:r>
-                    <m:t>​</m:t>
-                  </m:r>
-                  <m:d>
-                    <m:dPr>
-                      <m:begChr m:val="("/>
-                      <m:sepChr m:val=""/>
-                      <m:endChr m:val=")"/>
-                      <m:grow/>
-                    </m:dPr>
-                    <m:e>
-                      <m:sSub>
-                        <m:e>
-                          <m:r>
-                            <m:t>μ</m:t>
-                          </m:r>
-                        </m:e>
-                        <m:sub>
-                          <m:r>
-                            <m:t>h</m:t>
-                          </m:r>
-                        </m:sub>
-                      </m:sSub>
-                      <m:r>
-                        <m:rPr>
-                          <m:sty m:val="p"/>
-                        </m:rPr>
-                        <m:t>−</m:t>
-                      </m:r>
-                      <m:acc>
-                        <m:accPr>
-                          <m:chr m:val="̂"/>
-                        </m:accPr>
-                        <m:e>
-                          <m:r>
-                            <m:t>y</m:t>
-                          </m:r>
-                        </m:e>
-                      </m:acc>
-                    </m:e>
-                  </m:d>
-                  <m:r>
-                    <m:t>​</m:t>
-                  </m:r>
-                </m:e>
-              </m:d>
-              <m:r>
-                <m:t>​</m:t>
-              </m:r>
-              <m:r>
-                <m:t>&amp;</m:t>
-              </m:r>
-              <m:r>
-                <m:rPr>
-                  <m:sty m:val="p"/>
-                </m:rPr>
-                <m:t>=</m:t>
-              </m:r>
-              <m:r>
-                <m:t>2</m:t>
-              </m:r>
-              <m:r>
-                <m:t>​</m:t>
-              </m:r>
-              <m:d>
-                <m:dPr>
-                  <m:begChr m:val="("/>
-                  <m:sepChr m:val=""/>
-                  <m:endChr m:val=")"/>
-                  <m:grow/>
-                </m:dPr>
-                <m:e>
-                  <m:r>
-                    <m:t>μ</m:t>
-                  </m:r>
-                  <m:r>
-                    <m:rPr>
-                      <m:sty m:val="p"/>
-                    </m:rPr>
-                    <m:t>−</m:t>
-                  </m:r>
-                  <m:sSub>
-                    <m:e>
-                      <m:r>
-                        <m:t>μ</m:t>
-                      </m:r>
-                    </m:e>
-                    <m:sub>
-                      <m:r>
-                        <m:t>h</m:t>
-                      </m:r>
-                    </m:sub>
-                  </m:sSub>
-                </m:e>
-              </m:d>
-              <m:r>
-                <m:t>​</m:t>
-              </m:r>
-              <m:r>
-                <m:rPr>
-                  <m:sty m:val="p"/>
-                </m:rPr>
-                <m:t>E</m:t>
-              </m:r>
-              <m:r>
-                <m:t>​</m:t>
-              </m:r>
-              <m:d>
-                <m:dPr>
-                  <m:begChr m:val="["/>
-                  <m:sepChr m:val=""/>
-                  <m:endChr m:val="]"/>
-                  <m:grow/>
-                </m:dPr>
-                <m:e>
-                  <m:sSub>
-                    <m:e>
-                      <m:r>
-                        <m:t>μ</m:t>
-                      </m:r>
-                    </m:e>
-                    <m:sub>
-                      <m:r>
-                        <m:t>h</m:t>
-                      </m:r>
-                    </m:sub>
-                  </m:sSub>
-                  <m:r>
-                    <m:rPr>
-                      <m:sty m:val="p"/>
-                    </m:rPr>
-                    <m:t>−</m:t>
-                  </m:r>
-                  <m:acc>
-                    <m:accPr>
-                      <m:chr m:val="̂"/>
-                    </m:accPr>
-                    <m:e>
-                      <m:r>
-                        <m:t>y</m:t>
-                      </m:r>
-                    </m:e>
-                  </m:acc>
-                </m:e>
-              </m:d>
-              <m:r>
-                <m:t>​</m:t>
-              </m:r>
-              <m:r>
-                <m:t>&amp;</m:t>
-              </m:r>
-              <m:r>
-                <m:t>&amp;</m:t>
-              </m:r>
-              <m:r>
-                <m:rPr>
-                  <m:nor/>
-                  <m:sty m:val="p"/>
-                </m:rPr>
-                <m:t>(constant factors)</m:t>
-              </m:r>
-            </m:e>
-            <m:e>
-              <m:r>
-                <m:t>&amp;</m:t>
-              </m:r>
-              <m:r>
-                <m:rPr>
-                  <m:sty m:val="p"/>
-                </m:rPr>
-                <m:t>=</m:t>
-              </m:r>
-              <m:r>
-                <m:t>2</m:t>
-              </m:r>
-              <m:r>
-                <m:t>​</m:t>
-              </m:r>
-              <m:d>
-                <m:dPr>
-                  <m:begChr m:val="("/>
-                  <m:sepChr m:val=""/>
-                  <m:endChr m:val=")"/>
-                  <m:grow/>
-                </m:dPr>
-                <m:e>
-                  <m:r>
-                    <m:t>μ</m:t>
-                  </m:r>
-                  <m:r>
-                    <m:rPr>
-                      <m:sty m:val="p"/>
-                    </m:rPr>
-                    <m:t>−</m:t>
-                  </m:r>
-                  <m:sSub>
-                    <m:e>
-                      <m:r>
-                        <m:t>μ</m:t>
-                      </m:r>
-                    </m:e>
-                    <m:sub>
-                      <m:r>
-                        <m:t>h</m:t>
-                      </m:r>
-                    </m:sub>
-                  </m:sSub>
-                </m:e>
-              </m:d>
-              <m:r>
-                <m:t>​</m:t>
-              </m:r>
-              <m:r>
-                <m:t>​</m:t>
-              </m:r>
-              <m:d>
-                <m:dPr>
-                  <m:begChr m:val="("/>
-                  <m:sepChr m:val=""/>
-                  <m:endChr m:val=")"/>
-                  <m:grow/>
-                </m:dPr>
-                <m:e>
-                  <m:sSub>
-                    <m:e>
-                      <m:r>
-                        <m:t>μ</m:t>
-                      </m:r>
-                    </m:e>
-                    <m:sub>
-                      <m:r>
-                        <m:t>h</m:t>
-                      </m:r>
-                    </m:sub>
-                  </m:sSub>
                   <m:r>
                     <m:rPr>
                       <m:sty m:val="p"/>
@@ -23287,6 +22219,102 @@
                 <m:t>​</m:t>
               </m:r>
               <m:r>
+                <m:rPr>
+                  <m:sty m:val="p"/>
+                </m:rPr>
+                <m:t>+</m:t>
+              </m:r>
+              <m:r>
+                <m:t>​</m:t>
+              </m:r>
+              <m:d>
+                <m:dPr>
+                  <m:begChr m:val="("/>
+                  <m:sepChr m:val=""/>
+                  <m:endChr m:val=")"/>
+                  <m:grow/>
+                </m:dPr>
+                <m:e>
+                  <m:sSub>
+                    <m:e>
+                      <m:r>
+                        <m:rPr>
+                          <m:sty m:val="p"/>
+                        </m:rPr>
+                        <m:t>E</m:t>
+                      </m:r>
+                    </m:e>
+                    <m:sub>
+                      <m:sSub>
+                        <m:e>
+                          <m:r>
+                            <m:rPr>
+                              <m:scr m:val="script"/>
+                              <m:sty m:val="p"/>
+                            </m:rPr>
+                            <m:t>D</m:t>
+                          </m:r>
+                        </m:e>
+                        <m:sub>
+                          <m:r>
+                            <m:rPr>
+                              <m:nor/>
+                              <m:sty m:val="p"/>
+                            </m:rPr>
+                            <m:t>train</m:t>
+                          </m:r>
+                        </m:sub>
+                      </m:sSub>
+                    </m:sub>
+                  </m:sSub>
+                  <m:r>
+                    <m:t>​</m:t>
+                  </m:r>
+                  <m:d>
+                    <m:dPr>
+                      <m:begChr m:val="["/>
+                      <m:sepChr m:val=""/>
+                      <m:endChr m:val="]"/>
+                      <m:grow/>
+                    </m:dPr>
+                    <m:e>
+                      <m:acc>
+                        <m:accPr>
+                          <m:chr m:val="̂"/>
+                        </m:accPr>
+                        <m:e>
+                          <m:r>
+                            <m:t>y</m:t>
+                          </m:r>
+                        </m:e>
+                      </m:acc>
+                    </m:e>
+                  </m:d>
+                  <m:r>
+                    <m:t>​</m:t>
+                  </m:r>
+                  <m:r>
+                    <m:rPr>
+                      <m:sty m:val="p"/>
+                    </m:rPr>
+                    <m:t>−</m:t>
+                  </m:r>
+                  <m:acc>
+                    <m:accPr>
+                      <m:chr m:val="̂"/>
+                    </m:accPr>
+                    <m:e>
+                      <m:r>
+                        <m:t>y</m:t>
+                      </m:r>
+                    </m:e>
+                  </m:acc>
+                </m:e>
+              </m:d>
+              <m:r>
+                <m:t>​</m:t>
+              </m:r>
+              <m:r>
                 <m:t>&amp;</m:t>
               </m:r>
               <m:r>
@@ -23297,10 +22325,141 @@
                   <m:nor/>
                   <m:sty m:val="p"/>
                 </m:rPr>
-                <m:t>(expectation of a difference of a constant and a variable)</m:t>
+                <m:t>(add and subtract </m:t>
+              </m:r>
+              <m:sSub>
+                <m:e>
+                  <m:r>
+                    <m:rPr>
+                      <m:sty m:val="p"/>
+                    </m:rPr>
+                    <m:t>E</m:t>
+                  </m:r>
+                </m:e>
+                <m:sub>
+                  <m:sSub>
+                    <m:e>
+                      <m:r>
+                        <m:rPr>
+                          <m:scr m:val="script"/>
+                          <m:sty m:val="p"/>
+                        </m:rPr>
+                        <m:t>D</m:t>
+                      </m:r>
+                    </m:e>
+                    <m:sub>
+                      <m:r>
+                        <m:rPr>
+                          <m:nor/>
+                          <m:sty m:val="p"/>
+                        </m:rPr>
+                        <m:t>train</m:t>
+                      </m:r>
+                    </m:sub>
+                  </m:sSub>
+                </m:sub>
+              </m:sSub>
+              <m:r>
+                <m:t>​</m:t>
+              </m:r>
+              <m:d>
+                <m:dPr>
+                  <m:begChr m:val="["/>
+                  <m:sepChr m:val=""/>
+                  <m:endChr m:val="]"/>
+                  <m:grow/>
+                </m:dPr>
+                <m:e>
+                  <m:acc>
+                    <m:accPr>
+                      <m:chr m:val="̂"/>
+                    </m:accPr>
+                    <m:e>
+                      <m:r>
+                        <m:t>y</m:t>
+                      </m:r>
+                    </m:e>
+                  </m:acc>
+                </m:e>
+              </m:d>
+              <m:r>
+                <m:t>​</m:t>
+              </m:r>
+              <m:r>
+                <m:rPr>
+                  <m:nor/>
+                  <m:sty m:val="p"/>
+                </m:rPr>
+                <m:t>)</m:t>
               </m:r>
             </m:e>
+          </m:eqArr>
+        </m:oMath>
+      </m:oMathPara>
+    </w:p>
+    <w:p>
+      <w:pPr>
+        <w:pStyle w:val="FirstParagraph"/>
+      </w:pPr>
+      <w:r>
+        <w:t xml:space="preserve">Square it:</w:t>
+      </w:r>
+    </w:p>
+    <w:p>
+      <w:pPr>
+        <w:pStyle w:val="BodyText"/>
+      </w:pPr>
+      <m:oMathPara>
+        <m:oMathParaPr>
+          <m:jc m:val="center"/>
+        </m:oMathParaPr>
+        <m:oMath>
+          <m:eqArr>
             <m:e>
+              <m:sSup>
+                <m:e>
+                  <m:r>
+                    <m:t>​</m:t>
+                  </m:r>
+                  <m:d>
+                    <m:dPr>
+                      <m:begChr m:val="("/>
+                      <m:sepChr m:val=""/>
+                      <m:endChr m:val=")"/>
+                      <m:grow/>
+                    </m:dPr>
+                    <m:e>
+                      <m:r>
+                        <m:t>μ</m:t>
+                      </m:r>
+                      <m:r>
+                        <m:rPr>
+                          <m:sty m:val="p"/>
+                        </m:rPr>
+                        <m:t>−</m:t>
+                      </m:r>
+                      <m:acc>
+                        <m:accPr>
+                          <m:chr m:val="̂"/>
+                        </m:accPr>
+                        <m:e>
+                          <m:r>
+                            <m:t>y</m:t>
+                          </m:r>
+                        </m:e>
+                      </m:acc>
+                    </m:e>
+                  </m:d>
+                  <m:r>
+                    <m:t>​</m:t>
+                  </m:r>
+                </m:e>
+                <m:sup>
+                  <m:r>
+                    <m:t>2</m:t>
+                  </m:r>
+                </m:sup>
+              </m:sSup>
               <m:r>
                 <m:t>&amp;</m:t>
               </m:r>
@@ -23309,6 +22468,104 @@
                   <m:sty m:val="p"/>
                 </m:rPr>
                 <m:t>=</m:t>
+              </m:r>
+              <m:sSup>
+                <m:e>
+                  <m:r>
+                    <m:t>​</m:t>
+                  </m:r>
+                  <m:d>
+                    <m:dPr>
+                      <m:begChr m:val="("/>
+                      <m:sepChr m:val=""/>
+                      <m:endChr m:val=")"/>
+                      <m:grow/>
+                    </m:dPr>
+                    <m:e>
+                      <m:r>
+                        <m:t>μ</m:t>
+                      </m:r>
+                      <m:r>
+                        <m:rPr>
+                          <m:sty m:val="p"/>
+                        </m:rPr>
+                        <m:t>−</m:t>
+                      </m:r>
+                      <m:sSub>
+                        <m:e>
+                          <m:r>
+                            <m:rPr>
+                              <m:sty m:val="p"/>
+                            </m:rPr>
+                            <m:t>E</m:t>
+                          </m:r>
+                        </m:e>
+                        <m:sub>
+                          <m:sSub>
+                            <m:e>
+                              <m:r>
+                                <m:rPr>
+                                  <m:scr m:val="script"/>
+                                  <m:sty m:val="p"/>
+                                </m:rPr>
+                                <m:t>D</m:t>
+                              </m:r>
+                            </m:e>
+                            <m:sub>
+                              <m:r>
+                                <m:rPr>
+                                  <m:nor/>
+                                  <m:sty m:val="p"/>
+                                </m:rPr>
+                                <m:t>train</m:t>
+                              </m:r>
+                            </m:sub>
+                          </m:sSub>
+                        </m:sub>
+                      </m:sSub>
+                      <m:r>
+                        <m:t>​</m:t>
+                      </m:r>
+                      <m:d>
+                        <m:dPr>
+                          <m:begChr m:val="["/>
+                          <m:sepChr m:val=""/>
+                          <m:endChr m:val="]"/>
+                          <m:grow/>
+                        </m:dPr>
+                        <m:e>
+                          <m:acc>
+                            <m:accPr>
+                              <m:chr m:val="̂"/>
+                            </m:accPr>
+                            <m:e>
+                              <m:r>
+                                <m:t>y</m:t>
+                              </m:r>
+                            </m:e>
+                          </m:acc>
+                        </m:e>
+                      </m:d>
+                      <m:r>
+                        <m:t>​</m:t>
+                      </m:r>
+                    </m:e>
+                  </m:d>
+                  <m:r>
+                    <m:t>​</m:t>
+                  </m:r>
+                </m:e>
+                <m:sup>
+                  <m:r>
+                    <m:t>2</m:t>
+                  </m:r>
+                </m:sup>
+              </m:sSup>
+              <m:r>
+                <m:rPr>
+                  <m:sty m:val="p"/>
+                </m:rPr>
+                <m:t>+</m:t>
               </m:r>
               <m:r>
                 <m:t>2</m:t>
@@ -23336,15 +22593,61 @@
                   <m:sSub>
                     <m:e>
                       <m:r>
-                        <m:t>μ</m:t>
+                        <m:rPr>
+                          <m:sty m:val="p"/>
+                        </m:rPr>
+                        <m:t>E</m:t>
                       </m:r>
                     </m:e>
                     <m:sub>
-                      <m:r>
-                        <m:t>h</m:t>
-                      </m:r>
+                      <m:sSub>
+                        <m:e>
+                          <m:r>
+                            <m:rPr>
+                              <m:scr m:val="script"/>
+                              <m:sty m:val="p"/>
+                            </m:rPr>
+                            <m:t>D</m:t>
+                          </m:r>
+                        </m:e>
+                        <m:sub>
+                          <m:r>
+                            <m:rPr>
+                              <m:nor/>
+                              <m:sty m:val="p"/>
+                            </m:rPr>
+                            <m:t>train</m:t>
+                          </m:r>
+                        </m:sub>
+                      </m:sSub>
                     </m:sub>
                   </m:sSub>
+                  <m:r>
+                    <m:t>​</m:t>
+                  </m:r>
+                  <m:d>
+                    <m:dPr>
+                      <m:begChr m:val="["/>
+                      <m:sepChr m:val=""/>
+                      <m:endChr m:val="]"/>
+                      <m:grow/>
+                    </m:dPr>
+                    <m:e>
+                      <m:acc>
+                        <m:accPr>
+                          <m:chr m:val="̂"/>
+                        </m:accPr>
+                        <m:e>
+                          <m:r>
+                            <m:t>y</m:t>
+                          </m:r>
+                        </m:e>
+                      </m:acc>
+                    </m:e>
+                  </m:d>
+                  <m:r>
+                    <m:t>​</m:t>
+                  </m:r>
                 </m:e>
               </m:d>
               <m:r>
@@ -23364,38 +22667,570 @@
                   <m:sSub>
                     <m:e>
                       <m:r>
-                        <m:t>μ</m:t>
+                        <m:rPr>
+                          <m:sty m:val="p"/>
+                        </m:rPr>
+                        <m:t>E</m:t>
                       </m:r>
                     </m:e>
                     <m:sub>
-                      <m:r>
-                        <m:t>h</m:t>
-                      </m:r>
+                      <m:sSub>
+                        <m:e>
+                          <m:r>
+                            <m:rPr>
+                              <m:scr m:val="script"/>
+                              <m:sty m:val="p"/>
+                            </m:rPr>
+                            <m:t>D</m:t>
+                          </m:r>
+                        </m:e>
+                        <m:sub>
+                          <m:r>
+                            <m:rPr>
+                              <m:nor/>
+                              <m:sty m:val="p"/>
+                            </m:rPr>
+                            <m:t>train</m:t>
+                          </m:r>
+                        </m:sub>
+                      </m:sSub>
                     </m:sub>
                   </m:sSub>
+                  <m:r>
+                    <m:t>​</m:t>
+                  </m:r>
+                  <m:d>
+                    <m:dPr>
+                      <m:begChr m:val="["/>
+                      <m:sepChr m:val=""/>
+                      <m:endChr m:val="]"/>
+                      <m:grow/>
+                    </m:dPr>
+                    <m:e>
+                      <m:acc>
+                        <m:accPr>
+                          <m:chr m:val="̂"/>
+                        </m:accPr>
+                        <m:e>
+                          <m:r>
+                            <m:t>y</m:t>
+                          </m:r>
+                        </m:e>
+                      </m:acc>
+                    </m:e>
+                  </m:d>
+                  <m:r>
+                    <m:t>​</m:t>
+                  </m:r>
                   <m:r>
                     <m:rPr>
                       <m:sty m:val="p"/>
                     </m:rPr>
                     <m:t>−</m:t>
                   </m:r>
-                  <m:sSub>
+                  <m:acc>
+                    <m:accPr>
+                      <m:chr m:val="̂"/>
+                    </m:accPr>
+                    <m:e>
+                      <m:r>
+                        <m:t>y</m:t>
+                      </m:r>
+                    </m:e>
+                  </m:acc>
+                </m:e>
+              </m:d>
+              <m:r>
+                <m:t>​</m:t>
+              </m:r>
+              <m:r>
+                <m:rPr>
+                  <m:sty m:val="p"/>
+                </m:rPr>
+                <m:t>+</m:t>
+              </m:r>
+              <m:sSup>
+                <m:e>
+                  <m:r>
+                    <m:t>​</m:t>
+                  </m:r>
+                  <m:d>
+                    <m:dPr>
+                      <m:begChr m:val="("/>
+                      <m:sepChr m:val=""/>
+                      <m:endChr m:val=")"/>
+                      <m:grow/>
+                    </m:dPr>
+                    <m:e>
+                      <m:sSub>
+                        <m:e>
+                          <m:r>
+                            <m:rPr>
+                              <m:sty m:val="p"/>
+                            </m:rPr>
+                            <m:t>E</m:t>
+                          </m:r>
+                        </m:e>
+                        <m:sub>
+                          <m:sSub>
+                            <m:e>
+                              <m:r>
+                                <m:rPr>
+                                  <m:scr m:val="script"/>
+                                  <m:sty m:val="p"/>
+                                </m:rPr>
+                                <m:t>D</m:t>
+                              </m:r>
+                            </m:e>
+                            <m:sub>
+                              <m:r>
+                                <m:rPr>
+                                  <m:nor/>
+                                  <m:sty m:val="p"/>
+                                </m:rPr>
+                                <m:t>train</m:t>
+                              </m:r>
+                            </m:sub>
+                          </m:sSub>
+                        </m:sub>
+                      </m:sSub>
+                      <m:r>
+                        <m:t>​</m:t>
+                      </m:r>
+                      <m:d>
+                        <m:dPr>
+                          <m:begChr m:val="["/>
+                          <m:sepChr m:val=""/>
+                          <m:endChr m:val="]"/>
+                          <m:grow/>
+                        </m:dPr>
+                        <m:e>
+                          <m:acc>
+                            <m:accPr>
+                              <m:chr m:val="̂"/>
+                            </m:accPr>
+                            <m:e>
+                              <m:r>
+                                <m:t>y</m:t>
+                              </m:r>
+                            </m:e>
+                          </m:acc>
+                        </m:e>
+                      </m:d>
+                      <m:r>
+                        <m:t>​</m:t>
+                      </m:r>
+                      <m:r>
+                        <m:rPr>
+                          <m:sty m:val="p"/>
+                        </m:rPr>
+                        <m:t>−</m:t>
+                      </m:r>
+                      <m:acc>
+                        <m:accPr>
+                          <m:chr m:val="̂"/>
+                        </m:accPr>
+                        <m:e>
+                          <m:r>
+                            <m:t>y</m:t>
+                          </m:r>
+                        </m:e>
+                      </m:acc>
+                    </m:e>
+                  </m:d>
+                  <m:r>
+                    <m:t>​</m:t>
+                  </m:r>
+                </m:e>
+                <m:sup>
+                  <m:r>
+                    <m:t>2</m:t>
+                  </m:r>
+                </m:sup>
+              </m:sSup>
+              <m:r>
+                <m:t>&amp;</m:t>
+              </m:r>
+              <m:r>
+                <m:t>&amp;</m:t>
+              </m:r>
+              <m:r>
+                <m:rPr>
+                  <m:nor/>
+                  <m:sty m:val="p"/>
+                </m:rPr>
+                <m:t>(expand the square of a sum)</m:t>
+              </m:r>
+            </m:e>
+          </m:eqArr>
+        </m:oMath>
+      </m:oMathPara>
+    </w:p>
+    <w:p>
+      <w:pPr>
+        <w:pStyle w:val="FirstParagraph"/>
+      </w:pPr>
+      <w:r>
+        <w:t xml:space="preserve">Take the expectation of each term in turn.</w:t>
+      </w:r>
+    </w:p>
+    <w:p>
+      <w:pPr>
+        <w:pStyle w:val="BodyText"/>
+      </w:pPr>
+      <w:r>
+        <w:t xml:space="preserve">The first term does not depend on</w:t>
+      </w:r>
+      <w:r>
+        <w:t xml:space="preserve"> </w:t>
+      </w:r>
+      <m:oMath>
+        <m:sSub>
+          <m:e>
+            <m:r>
+              <m:rPr>
+                <m:scr m:val="script"/>
+                <m:sty m:val="p"/>
+              </m:rPr>
+              <m:t>D</m:t>
+            </m:r>
+          </m:e>
+          <m:sub>
+            <m:r>
+              <m:rPr>
+                <m:nor/>
+                <m:sty m:val="p"/>
+              </m:rPr>
+              <m:t>train</m:t>
+            </m:r>
+          </m:sub>
+        </m:sSub>
+      </m:oMath>
+      <w:r>
+        <w:t xml:space="preserve">:</w:t>
+      </w:r>
+      <w:r>
+        <w:t xml:space="preserve"> </w:t>
+      </w:r>
+      <m:oMath>
+        <m:r>
+          <m:t>μ</m:t>
+        </m:r>
+      </m:oMath>
+      <w:r>
+        <w:t xml:space="preserve"> </w:t>
+      </w:r>
+      <w:r>
+        <w:t xml:space="preserve">is a constant,</w:t>
+      </w:r>
+      <w:r>
+        <w:t xml:space="preserve"> </w:t>
+      </w:r>
+      <w:r>
+        <w:t xml:space="preserve">and</w:t>
+      </w:r>
+      <w:r>
+        <w:t xml:space="preserve"> </w:t>
+      </w:r>
+      <m:oMath>
+        <m:sSub>
+          <m:e>
+            <m:r>
+              <m:rPr>
+                <m:sty m:val="p"/>
+              </m:rPr>
+              <m:t>E</m:t>
+            </m:r>
+          </m:e>
+          <m:sub>
+            <m:sSub>
+              <m:e>
+                <m:r>
+                  <m:rPr>
+                    <m:scr m:val="script"/>
+                    <m:sty m:val="p"/>
+                  </m:rPr>
+                  <m:t>D</m:t>
+                </m:r>
+              </m:e>
+              <m:sub>
+                <m:r>
+                  <m:rPr>
+                    <m:nor/>
+                    <m:sty m:val="p"/>
+                  </m:rPr>
+                  <m:t>train</m:t>
+                </m:r>
+              </m:sub>
+            </m:sSub>
+          </m:sub>
+        </m:sSub>
+        <m:r>
+          <m:t>​</m:t>
+        </m:r>
+        <m:d>
+          <m:dPr>
+            <m:begChr m:val="["/>
+            <m:sepChr m:val=""/>
+            <m:endChr m:val="]"/>
+            <m:grow/>
+          </m:dPr>
+          <m:e>
+            <m:acc>
+              <m:accPr>
+                <m:chr m:val="̂"/>
+              </m:accPr>
+              <m:e>
+                <m:r>
+                  <m:t>y</m:t>
+                </m:r>
+              </m:e>
+            </m:acc>
+          </m:e>
+        </m:d>
+        <m:r>
+          <m:t>​</m:t>
+        </m:r>
+      </m:oMath>
+      <w:r>
+        <w:t xml:space="preserve"> </w:t>
+      </w:r>
+      <w:r>
+        <w:t xml:space="preserve">has already been averaged over training sets.</w:t>
+      </w:r>
+      <w:r>
+        <w:t xml:space="preserve"> </w:t>
+      </w:r>
+      <w:r>
+        <w:t xml:space="preserve">The expectation of a constant is that constant:</w:t>
+      </w:r>
+    </w:p>
+    <w:p>
+      <w:pPr>
+        <w:pStyle w:val="BodyText"/>
+      </w:pPr>
+      <m:oMathPara>
+        <m:oMathParaPr>
+          <m:jc m:val="center"/>
+        </m:oMathParaPr>
+        <m:oMath>
+          <m:eqArr>
+            <m:e>
+              <m:r>
+                <m:rPr>
+                  <m:sty m:val="p"/>
+                </m:rPr>
+                <m:t>E</m:t>
+              </m:r>
+              <m:r>
+                <m:t>​</m:t>
+              </m:r>
+              <m:d>
+                <m:dPr>
+                  <m:begChr m:val="["/>
+                  <m:sepChr m:val=""/>
+                  <m:endChr m:val="]"/>
+                  <m:grow/>
+                </m:dPr>
+                <m:e>
+                  <m:sSup>
+                    <m:e>
+                      <m:r>
+                        <m:t>​</m:t>
+                      </m:r>
+                      <m:d>
+                        <m:dPr>
+                          <m:begChr m:val="("/>
+                          <m:sepChr m:val=""/>
+                          <m:endChr m:val=")"/>
+                          <m:grow/>
+                        </m:dPr>
+                        <m:e>
+                          <m:r>
+                            <m:t>μ</m:t>
+                          </m:r>
+                          <m:r>
+                            <m:rPr>
+                              <m:sty m:val="p"/>
+                            </m:rPr>
+                            <m:t>−</m:t>
+                          </m:r>
+                          <m:sSub>
+                            <m:e>
+                              <m:r>
+                                <m:rPr>
+                                  <m:sty m:val="p"/>
+                                </m:rPr>
+                                <m:t>E</m:t>
+                              </m:r>
+                            </m:e>
+                            <m:sub>
+                              <m:sSub>
+                                <m:e>
+                                  <m:r>
+                                    <m:rPr>
+                                      <m:scr m:val="script"/>
+                                      <m:sty m:val="p"/>
+                                    </m:rPr>
+                                    <m:t>D</m:t>
+                                  </m:r>
+                                </m:e>
+                                <m:sub>
+                                  <m:r>
+                                    <m:rPr>
+                                      <m:nor/>
+                                      <m:sty m:val="p"/>
+                                    </m:rPr>
+                                    <m:t>train</m:t>
+                                  </m:r>
+                                </m:sub>
+                              </m:sSub>
+                            </m:sub>
+                          </m:sSub>
+                          <m:r>
+                            <m:t>​</m:t>
+                          </m:r>
+                          <m:d>
+                            <m:dPr>
+                              <m:begChr m:val="["/>
+                              <m:sepChr m:val=""/>
+                              <m:endChr m:val="]"/>
+                              <m:grow/>
+                            </m:dPr>
+                            <m:e>
+                              <m:acc>
+                                <m:accPr>
+                                  <m:chr m:val="̂"/>
+                                </m:accPr>
+                                <m:e>
+                                  <m:r>
+                                    <m:t>y</m:t>
+                                  </m:r>
+                                </m:e>
+                              </m:acc>
+                            </m:e>
+                          </m:d>
+                          <m:r>
+                            <m:t>​</m:t>
+                          </m:r>
+                        </m:e>
+                      </m:d>
+                      <m:r>
+                        <m:t>​</m:t>
+                      </m:r>
+                    </m:e>
+                    <m:sup>
+                      <m:r>
+                        <m:t>2</m:t>
+                      </m:r>
+                    </m:sup>
+                  </m:sSup>
+                </m:e>
+              </m:d>
+              <m:r>
+                <m:t>​</m:t>
+              </m:r>
+              <m:r>
+                <m:t>&amp;</m:t>
+              </m:r>
+              <m:r>
+                <m:rPr>
+                  <m:sty m:val="p"/>
+                </m:rPr>
+                <m:t>=</m:t>
+              </m:r>
+              <m:sSup>
+                <m:e>
+                  <m:r>
+                    <m:t>​</m:t>
+                  </m:r>
+                  <m:d>
+                    <m:dPr>
+                      <m:begChr m:val="("/>
+                      <m:sepChr m:val=""/>
+                      <m:endChr m:val=")"/>
+                      <m:grow/>
+                    </m:dPr>
                     <m:e>
                       <m:r>
                         <m:t>μ</m:t>
                       </m:r>
+                      <m:r>
+                        <m:rPr>
+                          <m:sty m:val="p"/>
+                        </m:rPr>
+                        <m:t>−</m:t>
+                      </m:r>
+                      <m:sSub>
+                        <m:e>
+                          <m:r>
+                            <m:rPr>
+                              <m:sty m:val="p"/>
+                            </m:rPr>
+                            <m:t>E</m:t>
+                          </m:r>
+                        </m:e>
+                        <m:sub>
+                          <m:sSub>
+                            <m:e>
+                              <m:r>
+                                <m:rPr>
+                                  <m:scr m:val="script"/>
+                                  <m:sty m:val="p"/>
+                                </m:rPr>
+                                <m:t>D</m:t>
+                              </m:r>
+                            </m:e>
+                            <m:sub>
+                              <m:r>
+                                <m:rPr>
+                                  <m:nor/>
+                                  <m:sty m:val="p"/>
+                                </m:rPr>
+                                <m:t>train</m:t>
+                              </m:r>
+                            </m:sub>
+                          </m:sSub>
+                        </m:sub>
+                      </m:sSub>
+                      <m:r>
+                        <m:t>​</m:t>
+                      </m:r>
+                      <m:d>
+                        <m:dPr>
+                          <m:begChr m:val="["/>
+                          <m:sepChr m:val=""/>
+                          <m:endChr m:val="]"/>
+                          <m:grow/>
+                        </m:dPr>
+                        <m:e>
+                          <m:acc>
+                            <m:accPr>
+                              <m:chr m:val="̂"/>
+                            </m:accPr>
+                            <m:e>
+                              <m:r>
+                                <m:t>y</m:t>
+                              </m:r>
+                            </m:e>
+                          </m:acc>
+                        </m:e>
+                      </m:d>
+                      <m:r>
+                        <m:t>​</m:t>
+                      </m:r>
                     </m:e>
-                    <m:sub>
-                      <m:r>
-                        <m:t>h</m:t>
-                      </m:r>
-                    </m:sub>
-                  </m:sSub>
+                  </m:d>
+                  <m:r>
+                    <m:t>​</m:t>
+                  </m:r>
                 </m:e>
-              </m:d>
-              <m:r>
-                <m:t>​</m:t>
-              </m:r>
+                <m:sup>
+                  <m:r>
+                    <m:t>2</m:t>
+                  </m:r>
+                </m:sup>
+              </m:sSup>
               <m:r>
                 <m:t>&amp;</m:t>
               </m:r>
@@ -23407,10 +23242,439 @@
                   <m:nor/>
                   <m:sty m:val="p"/>
                 </m:rPr>
-                <m:t>(definition of the expected prediction)</m:t>
+                <m:t>(expectation of a constant)</m:t>
               </m:r>
             </m:e>
             <m:e>
+              <m:r>
+                <m:t>&amp;</m:t>
+              </m:r>
+              <m:r>
+                <m:rPr>
+                  <m:sty m:val="p"/>
+                </m:rPr>
+                <m:t>=</m:t>
+              </m:r>
+              <m:sSup>
+                <m:e>
+                  <m:r>
+                    <m:t>​</m:t>
+                  </m:r>
+                  <m:d>
+                    <m:dPr>
+                      <m:begChr m:val="("/>
+                      <m:sepChr m:val=""/>
+                      <m:endChr m:val=")"/>
+                      <m:grow/>
+                    </m:dPr>
+                    <m:e>
+                      <m:sSub>
+                        <m:e>
+                          <m:r>
+                            <m:rPr>
+                              <m:sty m:val="p"/>
+                            </m:rPr>
+                            <m:t>E</m:t>
+                          </m:r>
+                        </m:e>
+                        <m:sub>
+                          <m:sSub>
+                            <m:e>
+                              <m:r>
+                                <m:rPr>
+                                  <m:scr m:val="script"/>
+                                  <m:sty m:val="p"/>
+                                </m:rPr>
+                                <m:t>D</m:t>
+                              </m:r>
+                            </m:e>
+                            <m:sub>
+                              <m:r>
+                                <m:rPr>
+                                  <m:nor/>
+                                  <m:sty m:val="p"/>
+                                </m:rPr>
+                                <m:t>train</m:t>
+                              </m:r>
+                            </m:sub>
+                          </m:sSub>
+                        </m:sub>
+                      </m:sSub>
+                      <m:r>
+                        <m:t>​</m:t>
+                      </m:r>
+                      <m:d>
+                        <m:dPr>
+                          <m:begChr m:val="["/>
+                          <m:sepChr m:val=""/>
+                          <m:endChr m:val="]"/>
+                          <m:grow/>
+                        </m:dPr>
+                        <m:e>
+                          <m:acc>
+                            <m:accPr>
+                              <m:chr m:val="̂"/>
+                            </m:accPr>
+                            <m:e>
+                              <m:r>
+                                <m:t>y</m:t>
+                              </m:r>
+                            </m:e>
+                          </m:acc>
+                        </m:e>
+                      </m:d>
+                      <m:r>
+                        <m:t>​</m:t>
+                      </m:r>
+                      <m:r>
+                        <m:rPr>
+                          <m:sty m:val="p"/>
+                        </m:rPr>
+                        <m:t>−</m:t>
+                      </m:r>
+                      <m:r>
+                        <m:t>μ</m:t>
+                      </m:r>
+                    </m:e>
+                  </m:d>
+                  <m:r>
+                    <m:t>​</m:t>
+                  </m:r>
+                </m:e>
+                <m:sup>
+                  <m:r>
+                    <m:t>2</m:t>
+                  </m:r>
+                </m:sup>
+              </m:sSup>
+              <m:r>
+                <m:t>&amp;</m:t>
+              </m:r>
+              <m:r>
+                <m:t>&amp;</m:t>
+              </m:r>
+              <m:r>
+                <m:rPr>
+                  <m:nor/>
+                  <m:sty m:val="p"/>
+                </m:rPr>
+                <m:t>(a number and its negative have the same square)</m:t>
+              </m:r>
+            </m:e>
+            <m:e>
+              <m:r>
+                <m:t>&amp;</m:t>
+              </m:r>
+              <m:r>
+                <m:rPr>
+                  <m:sty m:val="p"/>
+                </m:rPr>
+                <m:t>=</m:t>
+              </m:r>
+              <m:sSup>
+                <m:e>
+                  <m:r>
+                    <m:t>​</m:t>
+                  </m:r>
+                  <m:d>
+                    <m:dPr>
+                      <m:begChr m:val="("/>
+                      <m:sepChr m:val=""/>
+                      <m:endChr m:val=")"/>
+                      <m:grow/>
+                    </m:dPr>
+                    <m:e>
+                      <m:r>
+                        <m:rPr>
+                          <m:sty m:val="p"/>
+                        </m:rPr>
+                        <m:t>Bias</m:t>
+                      </m:r>
+                      <m:r>
+                        <m:t>​</m:t>
+                      </m:r>
+                      <m:d>
+                        <m:dPr>
+                          <m:begChr m:val="("/>
+                          <m:sepChr m:val=""/>
+                          <m:endChr m:val=")"/>
+                          <m:grow/>
+                        </m:dPr>
+                        <m:e>
+                          <m:acc>
+                            <m:accPr>
+                              <m:chr m:val="̂"/>
+                            </m:accPr>
+                            <m:e>
+                              <m:r>
+                                <m:t>y</m:t>
+                              </m:r>
+                            </m:e>
+                          </m:acc>
+                        </m:e>
+                      </m:d>
+                      <m:r>
+                        <m:t>​</m:t>
+                      </m:r>
+                    </m:e>
+                  </m:d>
+                  <m:r>
+                    <m:t>​</m:t>
+                  </m:r>
+                </m:e>
+                <m:sup>
+                  <m:r>
+                    <m:t>2</m:t>
+                  </m:r>
+                </m:sup>
+              </m:sSup>
+              <m:r>
+                <m:t>&amp;</m:t>
+              </m:r>
+              <m:r>
+                <m:t>&amp;</m:t>
+              </m:r>
+              <m:r>
+                <m:rPr>
+                  <m:nor/>
+                  <m:sty m:val="p"/>
+                </m:rPr>
+                <m:t>(definition of bias)</m:t>
+              </m:r>
+            </m:e>
+          </m:eqArr>
+        </m:oMath>
+      </m:oMathPara>
+    </w:p>
+    <w:p>
+      <w:pPr>
+        <w:pStyle w:val="FirstParagraph"/>
+      </w:pPr>
+      <w:r>
+        <w:t xml:space="preserve">The cross term vanishes, and this time not by independence</w:t>
+      </w:r>
+      <w:r>
+        <w:t xml:space="preserve"> </w:t>
+      </w:r>
+      <w:r>
+        <w:t xml:space="preserve">but because the expected prediction is the expectation of the prediction.</w:t>
+      </w:r>
+      <w:r>
+        <w:t xml:space="preserve"> </w:t>
+      </w:r>
+      <w:r>
+        <w:t xml:space="preserve">The first factor is a constant, so it comes out of the expectation:</w:t>
+      </w:r>
+    </w:p>
+    <w:p>
+      <w:pPr>
+        <w:pStyle w:val="BodyText"/>
+      </w:pPr>
+      <m:oMathPara>
+        <m:oMathParaPr>
+          <m:jc m:val="center"/>
+        </m:oMathParaPr>
+        <m:oMath>
+          <m:eqArr>
+            <m:e>
+              <m:r>
+                <m:rPr>
+                  <m:sty m:val="p"/>
+                </m:rPr>
+                <m:t>E</m:t>
+              </m:r>
+              <m:r>
+                <m:t>​</m:t>
+              </m:r>
+              <m:d>
+                <m:dPr>
+                  <m:begChr m:val="["/>
+                  <m:sepChr m:val=""/>
+                  <m:endChr m:val="]"/>
+                  <m:grow/>
+                </m:dPr>
+                <m:e>
+                  <m:r>
+                    <m:t>2</m:t>
+                  </m:r>
+                  <m:r>
+                    <m:t>​</m:t>
+                  </m:r>
+                  <m:d>
+                    <m:dPr>
+                      <m:begChr m:val="("/>
+                      <m:sepChr m:val=""/>
+                      <m:endChr m:val=")"/>
+                      <m:grow/>
+                    </m:dPr>
+                    <m:e>
+                      <m:r>
+                        <m:t>μ</m:t>
+                      </m:r>
+                      <m:r>
+                        <m:rPr>
+                          <m:sty m:val="p"/>
+                        </m:rPr>
+                        <m:t>−</m:t>
+                      </m:r>
+                      <m:sSub>
+                        <m:e>
+                          <m:r>
+                            <m:rPr>
+                              <m:sty m:val="p"/>
+                            </m:rPr>
+                            <m:t>E</m:t>
+                          </m:r>
+                        </m:e>
+                        <m:sub>
+                          <m:sSub>
+                            <m:e>
+                              <m:r>
+                                <m:rPr>
+                                  <m:scr m:val="script"/>
+                                  <m:sty m:val="p"/>
+                                </m:rPr>
+                                <m:t>D</m:t>
+                              </m:r>
+                            </m:e>
+                            <m:sub>
+                              <m:r>
+                                <m:rPr>
+                                  <m:nor/>
+                                  <m:sty m:val="p"/>
+                                </m:rPr>
+                                <m:t>train</m:t>
+                              </m:r>
+                            </m:sub>
+                          </m:sSub>
+                        </m:sub>
+                      </m:sSub>
+                      <m:r>
+                        <m:t>​</m:t>
+                      </m:r>
+                      <m:d>
+                        <m:dPr>
+                          <m:begChr m:val="["/>
+                          <m:sepChr m:val=""/>
+                          <m:endChr m:val="]"/>
+                          <m:grow/>
+                        </m:dPr>
+                        <m:e>
+                          <m:acc>
+                            <m:accPr>
+                              <m:chr m:val="̂"/>
+                            </m:accPr>
+                            <m:e>
+                              <m:r>
+                                <m:t>y</m:t>
+                              </m:r>
+                            </m:e>
+                          </m:acc>
+                        </m:e>
+                      </m:d>
+                      <m:r>
+                        <m:t>​</m:t>
+                      </m:r>
+                    </m:e>
+                  </m:d>
+                  <m:r>
+                    <m:t>​</m:t>
+                  </m:r>
+                  <m:r>
+                    <m:t>​</m:t>
+                  </m:r>
+                  <m:d>
+                    <m:dPr>
+                      <m:begChr m:val="("/>
+                      <m:sepChr m:val=""/>
+                      <m:endChr m:val=")"/>
+                      <m:grow/>
+                    </m:dPr>
+                    <m:e>
+                      <m:sSub>
+                        <m:e>
+                          <m:r>
+                            <m:rPr>
+                              <m:sty m:val="p"/>
+                            </m:rPr>
+                            <m:t>E</m:t>
+                          </m:r>
+                        </m:e>
+                        <m:sub>
+                          <m:sSub>
+                            <m:e>
+                              <m:r>
+                                <m:rPr>
+                                  <m:scr m:val="script"/>
+                                  <m:sty m:val="p"/>
+                                </m:rPr>
+                                <m:t>D</m:t>
+                              </m:r>
+                            </m:e>
+                            <m:sub>
+                              <m:r>
+                                <m:rPr>
+                                  <m:nor/>
+                                  <m:sty m:val="p"/>
+                                </m:rPr>
+                                <m:t>train</m:t>
+                              </m:r>
+                            </m:sub>
+                          </m:sSub>
+                        </m:sub>
+                      </m:sSub>
+                      <m:r>
+                        <m:t>​</m:t>
+                      </m:r>
+                      <m:d>
+                        <m:dPr>
+                          <m:begChr m:val="["/>
+                          <m:sepChr m:val=""/>
+                          <m:endChr m:val="]"/>
+                          <m:grow/>
+                        </m:dPr>
+                        <m:e>
+                          <m:acc>
+                            <m:accPr>
+                              <m:chr m:val="̂"/>
+                            </m:accPr>
+                            <m:e>
+                              <m:r>
+                                <m:t>y</m:t>
+                              </m:r>
+                            </m:e>
+                          </m:acc>
+                        </m:e>
+                      </m:d>
+                      <m:r>
+                        <m:t>​</m:t>
+                      </m:r>
+                      <m:r>
+                        <m:rPr>
+                          <m:sty m:val="p"/>
+                        </m:rPr>
+                        <m:t>−</m:t>
+                      </m:r>
+                      <m:acc>
+                        <m:accPr>
+                          <m:chr m:val="̂"/>
+                        </m:accPr>
+                        <m:e>
+                          <m:r>
+                            <m:t>y</m:t>
+                          </m:r>
+                        </m:e>
+                      </m:acc>
+                    </m:e>
+                  </m:d>
+                  <m:r>
+                    <m:t>​</m:t>
+                  </m:r>
+                </m:e>
+              </m:d>
+              <m:r>
+                <m:t>​</m:t>
+              </m:r>
               <m:r>
                 <m:t>&amp;</m:t>
               </m:r>
@@ -23446,15 +23710,981 @@
                   <m:sSub>
                     <m:e>
                       <m:r>
-                        <m:t>μ</m:t>
+                        <m:rPr>
+                          <m:sty m:val="p"/>
+                        </m:rPr>
+                        <m:t>E</m:t>
                       </m:r>
                     </m:e>
                     <m:sub>
-                      <m:r>
-                        <m:t>h</m:t>
-                      </m:r>
+                      <m:sSub>
+                        <m:e>
+                          <m:r>
+                            <m:rPr>
+                              <m:scr m:val="script"/>
+                              <m:sty m:val="p"/>
+                            </m:rPr>
+                            <m:t>D</m:t>
+                          </m:r>
+                        </m:e>
+                        <m:sub>
+                          <m:r>
+                            <m:rPr>
+                              <m:nor/>
+                              <m:sty m:val="p"/>
+                            </m:rPr>
+                            <m:t>train</m:t>
+                          </m:r>
+                        </m:sub>
+                      </m:sSub>
                     </m:sub>
                   </m:sSub>
+                  <m:r>
+                    <m:t>​</m:t>
+                  </m:r>
+                  <m:d>
+                    <m:dPr>
+                      <m:begChr m:val="["/>
+                      <m:sepChr m:val=""/>
+                      <m:endChr m:val="]"/>
+                      <m:grow/>
+                    </m:dPr>
+                    <m:e>
+                      <m:acc>
+                        <m:accPr>
+                          <m:chr m:val="̂"/>
+                        </m:accPr>
+                        <m:e>
+                          <m:r>
+                            <m:t>y</m:t>
+                          </m:r>
+                        </m:e>
+                      </m:acc>
+                    </m:e>
+                  </m:d>
+                  <m:r>
+                    <m:t>​</m:t>
+                  </m:r>
+                </m:e>
+              </m:d>
+              <m:r>
+                <m:t>​</m:t>
+              </m:r>
+              <m:r>
+                <m:rPr>
+                  <m:sty m:val="p"/>
+                </m:rPr>
+                <m:t>E</m:t>
+              </m:r>
+              <m:r>
+                <m:t>​</m:t>
+              </m:r>
+              <m:d>
+                <m:dPr>
+                  <m:begChr m:val="["/>
+                  <m:sepChr m:val=""/>
+                  <m:endChr m:val="]"/>
+                  <m:grow/>
+                </m:dPr>
+                <m:e>
+                  <m:sSub>
+                    <m:e>
+                      <m:r>
+                        <m:rPr>
+                          <m:sty m:val="p"/>
+                        </m:rPr>
+                        <m:t>E</m:t>
+                      </m:r>
+                    </m:e>
+                    <m:sub>
+                      <m:sSub>
+                        <m:e>
+                          <m:r>
+                            <m:rPr>
+                              <m:scr m:val="script"/>
+                              <m:sty m:val="p"/>
+                            </m:rPr>
+                            <m:t>D</m:t>
+                          </m:r>
+                        </m:e>
+                        <m:sub>
+                          <m:r>
+                            <m:rPr>
+                              <m:nor/>
+                              <m:sty m:val="p"/>
+                            </m:rPr>
+                            <m:t>train</m:t>
+                          </m:r>
+                        </m:sub>
+                      </m:sSub>
+                    </m:sub>
+                  </m:sSub>
+                  <m:r>
+                    <m:t>​</m:t>
+                  </m:r>
+                  <m:d>
+                    <m:dPr>
+                      <m:begChr m:val="["/>
+                      <m:sepChr m:val=""/>
+                      <m:endChr m:val="]"/>
+                      <m:grow/>
+                    </m:dPr>
+                    <m:e>
+                      <m:acc>
+                        <m:accPr>
+                          <m:chr m:val="̂"/>
+                        </m:accPr>
+                        <m:e>
+                          <m:r>
+                            <m:t>y</m:t>
+                          </m:r>
+                        </m:e>
+                      </m:acc>
+                    </m:e>
+                  </m:d>
+                  <m:r>
+                    <m:t>​</m:t>
+                  </m:r>
+                  <m:r>
+                    <m:rPr>
+                      <m:sty m:val="p"/>
+                    </m:rPr>
+                    <m:t>−</m:t>
+                  </m:r>
+                  <m:acc>
+                    <m:accPr>
+                      <m:chr m:val="̂"/>
+                    </m:accPr>
+                    <m:e>
+                      <m:r>
+                        <m:t>y</m:t>
+                      </m:r>
+                    </m:e>
+                  </m:acc>
+                </m:e>
+              </m:d>
+              <m:r>
+                <m:t>​</m:t>
+              </m:r>
+              <m:r>
+                <m:t>&amp;</m:t>
+              </m:r>
+              <m:r>
+                <m:t>&amp;</m:t>
+              </m:r>
+              <m:r>
+                <m:rPr>
+                  <m:nor/>
+                  <m:sty m:val="p"/>
+                </m:rPr>
+                <m:t>(constant factors)</m:t>
+              </m:r>
+            </m:e>
+            <m:e>
+              <m:r>
+                <m:t>&amp;</m:t>
+              </m:r>
+              <m:r>
+                <m:rPr>
+                  <m:sty m:val="p"/>
+                </m:rPr>
+                <m:t>=</m:t>
+              </m:r>
+              <m:r>
+                <m:t>2</m:t>
+              </m:r>
+              <m:r>
+                <m:t>​</m:t>
+              </m:r>
+              <m:d>
+                <m:dPr>
+                  <m:begChr m:val="("/>
+                  <m:sepChr m:val=""/>
+                  <m:endChr m:val=")"/>
+                  <m:grow/>
+                </m:dPr>
+                <m:e>
+                  <m:r>
+                    <m:t>μ</m:t>
+                  </m:r>
+                  <m:r>
+                    <m:rPr>
+                      <m:sty m:val="p"/>
+                    </m:rPr>
+                    <m:t>−</m:t>
+                  </m:r>
+                  <m:sSub>
+                    <m:e>
+                      <m:r>
+                        <m:rPr>
+                          <m:sty m:val="p"/>
+                        </m:rPr>
+                        <m:t>E</m:t>
+                      </m:r>
+                    </m:e>
+                    <m:sub>
+                      <m:sSub>
+                        <m:e>
+                          <m:r>
+                            <m:rPr>
+                              <m:scr m:val="script"/>
+                              <m:sty m:val="p"/>
+                            </m:rPr>
+                            <m:t>D</m:t>
+                          </m:r>
+                        </m:e>
+                        <m:sub>
+                          <m:r>
+                            <m:rPr>
+                              <m:nor/>
+                              <m:sty m:val="p"/>
+                            </m:rPr>
+                            <m:t>train</m:t>
+                          </m:r>
+                        </m:sub>
+                      </m:sSub>
+                    </m:sub>
+                  </m:sSub>
+                  <m:r>
+                    <m:t>​</m:t>
+                  </m:r>
+                  <m:d>
+                    <m:dPr>
+                      <m:begChr m:val="["/>
+                      <m:sepChr m:val=""/>
+                      <m:endChr m:val="]"/>
+                      <m:grow/>
+                    </m:dPr>
+                    <m:e>
+                      <m:acc>
+                        <m:accPr>
+                          <m:chr m:val="̂"/>
+                        </m:accPr>
+                        <m:e>
+                          <m:r>
+                            <m:t>y</m:t>
+                          </m:r>
+                        </m:e>
+                      </m:acc>
+                    </m:e>
+                  </m:d>
+                  <m:r>
+                    <m:t>​</m:t>
+                  </m:r>
+                </m:e>
+              </m:d>
+              <m:r>
+                <m:t>​</m:t>
+              </m:r>
+              <m:r>
+                <m:t>​</m:t>
+              </m:r>
+              <m:d>
+                <m:dPr>
+                  <m:begChr m:val="("/>
+                  <m:sepChr m:val=""/>
+                  <m:endChr m:val=")"/>
+                  <m:grow/>
+                </m:dPr>
+                <m:e>
+                  <m:r>
+                    <m:rPr>
+                      <m:sty m:val="p"/>
+                    </m:rPr>
+                    <m:t>E</m:t>
+                  </m:r>
+                  <m:r>
+                    <m:t>​</m:t>
+                  </m:r>
+                  <m:d>
+                    <m:dPr>
+                      <m:begChr m:val="["/>
+                      <m:sepChr m:val=""/>
+                      <m:endChr m:val="]"/>
+                      <m:grow/>
+                    </m:dPr>
+                    <m:e>
+                      <m:sSub>
+                        <m:e>
+                          <m:r>
+                            <m:rPr>
+                              <m:sty m:val="p"/>
+                            </m:rPr>
+                            <m:t>E</m:t>
+                          </m:r>
+                        </m:e>
+                        <m:sub>
+                          <m:sSub>
+                            <m:e>
+                              <m:r>
+                                <m:rPr>
+                                  <m:scr m:val="script"/>
+                                  <m:sty m:val="p"/>
+                                </m:rPr>
+                                <m:t>D</m:t>
+                              </m:r>
+                            </m:e>
+                            <m:sub>
+                              <m:r>
+                                <m:rPr>
+                                  <m:nor/>
+                                  <m:sty m:val="p"/>
+                                </m:rPr>
+                                <m:t>train</m:t>
+                              </m:r>
+                            </m:sub>
+                          </m:sSub>
+                        </m:sub>
+                      </m:sSub>
+                      <m:r>
+                        <m:t>​</m:t>
+                      </m:r>
+                      <m:d>
+                        <m:dPr>
+                          <m:begChr m:val="["/>
+                          <m:sepChr m:val=""/>
+                          <m:endChr m:val="]"/>
+                          <m:grow/>
+                        </m:dPr>
+                        <m:e>
+                          <m:acc>
+                            <m:accPr>
+                              <m:chr m:val="̂"/>
+                            </m:accPr>
+                            <m:e>
+                              <m:r>
+                                <m:t>y</m:t>
+                              </m:r>
+                            </m:e>
+                          </m:acc>
+                        </m:e>
+                      </m:d>
+                      <m:r>
+                        <m:t>​</m:t>
+                      </m:r>
+                    </m:e>
+                  </m:d>
+                  <m:r>
+                    <m:t>​</m:t>
+                  </m:r>
+                  <m:r>
+                    <m:rPr>
+                      <m:sty m:val="p"/>
+                    </m:rPr>
+                    <m:t>−</m:t>
+                  </m:r>
+                  <m:r>
+                    <m:rPr>
+                      <m:sty m:val="p"/>
+                    </m:rPr>
+                    <m:t>E</m:t>
+                  </m:r>
+                  <m:r>
+                    <m:t>​</m:t>
+                  </m:r>
+                  <m:d>
+                    <m:dPr>
+                      <m:begChr m:val="["/>
+                      <m:sepChr m:val=""/>
+                      <m:endChr m:val="]"/>
+                      <m:grow/>
+                    </m:dPr>
+                    <m:e>
+                      <m:acc>
+                        <m:accPr>
+                          <m:chr m:val="̂"/>
+                        </m:accPr>
+                        <m:e>
+                          <m:r>
+                            <m:t>y</m:t>
+                          </m:r>
+                        </m:e>
+                      </m:acc>
+                    </m:e>
+                  </m:d>
+                  <m:r>
+                    <m:t>​</m:t>
+                  </m:r>
+                </m:e>
+              </m:d>
+              <m:r>
+                <m:t>​</m:t>
+              </m:r>
+              <m:r>
+                <m:t>&amp;</m:t>
+              </m:r>
+              <m:r>
+                <m:t>&amp;</m:t>
+              </m:r>
+              <m:r>
+                <m:rPr>
+                  <m:nor/>
+                  <m:sty m:val="p"/>
+                </m:rPr>
+                <m:t>(linearity)</m:t>
+              </m:r>
+            </m:e>
+            <m:e>
+              <m:r>
+                <m:t>&amp;</m:t>
+              </m:r>
+              <m:r>
+                <m:rPr>
+                  <m:sty m:val="p"/>
+                </m:rPr>
+                <m:t>=</m:t>
+              </m:r>
+              <m:r>
+                <m:t>2</m:t>
+              </m:r>
+              <m:r>
+                <m:t>​</m:t>
+              </m:r>
+              <m:d>
+                <m:dPr>
+                  <m:begChr m:val="("/>
+                  <m:sepChr m:val=""/>
+                  <m:endChr m:val=")"/>
+                  <m:grow/>
+                </m:dPr>
+                <m:e>
+                  <m:r>
+                    <m:t>μ</m:t>
+                  </m:r>
+                  <m:r>
+                    <m:rPr>
+                      <m:sty m:val="p"/>
+                    </m:rPr>
+                    <m:t>−</m:t>
+                  </m:r>
+                  <m:sSub>
+                    <m:e>
+                      <m:r>
+                        <m:rPr>
+                          <m:sty m:val="p"/>
+                        </m:rPr>
+                        <m:t>E</m:t>
+                      </m:r>
+                    </m:e>
+                    <m:sub>
+                      <m:sSub>
+                        <m:e>
+                          <m:r>
+                            <m:rPr>
+                              <m:scr m:val="script"/>
+                              <m:sty m:val="p"/>
+                            </m:rPr>
+                            <m:t>D</m:t>
+                          </m:r>
+                        </m:e>
+                        <m:sub>
+                          <m:r>
+                            <m:rPr>
+                              <m:nor/>
+                              <m:sty m:val="p"/>
+                            </m:rPr>
+                            <m:t>train</m:t>
+                          </m:r>
+                        </m:sub>
+                      </m:sSub>
+                    </m:sub>
+                  </m:sSub>
+                  <m:r>
+                    <m:t>​</m:t>
+                  </m:r>
+                  <m:d>
+                    <m:dPr>
+                      <m:begChr m:val="["/>
+                      <m:sepChr m:val=""/>
+                      <m:endChr m:val="]"/>
+                      <m:grow/>
+                    </m:dPr>
+                    <m:e>
+                      <m:acc>
+                        <m:accPr>
+                          <m:chr m:val="̂"/>
+                        </m:accPr>
+                        <m:e>
+                          <m:r>
+                            <m:t>y</m:t>
+                          </m:r>
+                        </m:e>
+                      </m:acc>
+                    </m:e>
+                  </m:d>
+                  <m:r>
+                    <m:t>​</m:t>
+                  </m:r>
+                </m:e>
+              </m:d>
+              <m:r>
+                <m:t>​</m:t>
+              </m:r>
+              <m:r>
+                <m:t>​</m:t>
+              </m:r>
+              <m:d>
+                <m:dPr>
+                  <m:begChr m:val="("/>
+                  <m:sepChr m:val=""/>
+                  <m:endChr m:val=")"/>
+                  <m:grow/>
+                </m:dPr>
+                <m:e>
+                  <m:sSub>
+                    <m:e>
+                      <m:r>
+                        <m:rPr>
+                          <m:sty m:val="p"/>
+                        </m:rPr>
+                        <m:t>E</m:t>
+                      </m:r>
+                    </m:e>
+                    <m:sub>
+                      <m:sSub>
+                        <m:e>
+                          <m:r>
+                            <m:rPr>
+                              <m:scr m:val="script"/>
+                              <m:sty m:val="p"/>
+                            </m:rPr>
+                            <m:t>D</m:t>
+                          </m:r>
+                        </m:e>
+                        <m:sub>
+                          <m:r>
+                            <m:rPr>
+                              <m:nor/>
+                              <m:sty m:val="p"/>
+                            </m:rPr>
+                            <m:t>train</m:t>
+                          </m:r>
+                        </m:sub>
+                      </m:sSub>
+                    </m:sub>
+                  </m:sSub>
+                  <m:r>
+                    <m:t>​</m:t>
+                  </m:r>
+                  <m:d>
+                    <m:dPr>
+                      <m:begChr m:val="["/>
+                      <m:sepChr m:val=""/>
+                      <m:endChr m:val="]"/>
+                      <m:grow/>
+                    </m:dPr>
+                    <m:e>
+                      <m:acc>
+                        <m:accPr>
+                          <m:chr m:val="̂"/>
+                        </m:accPr>
+                        <m:e>
+                          <m:r>
+                            <m:t>y</m:t>
+                          </m:r>
+                        </m:e>
+                      </m:acc>
+                    </m:e>
+                  </m:d>
+                  <m:r>
+                    <m:t>​</m:t>
+                  </m:r>
+                  <m:r>
+                    <m:rPr>
+                      <m:sty m:val="p"/>
+                    </m:rPr>
+                    <m:t>−</m:t>
+                  </m:r>
+                  <m:r>
+                    <m:rPr>
+                      <m:sty m:val="p"/>
+                    </m:rPr>
+                    <m:t>E</m:t>
+                  </m:r>
+                  <m:r>
+                    <m:t>​</m:t>
+                  </m:r>
+                  <m:d>
+                    <m:dPr>
+                      <m:begChr m:val="["/>
+                      <m:sepChr m:val=""/>
+                      <m:endChr m:val="]"/>
+                      <m:grow/>
+                    </m:dPr>
+                    <m:e>
+                      <m:acc>
+                        <m:accPr>
+                          <m:chr m:val="̂"/>
+                        </m:accPr>
+                        <m:e>
+                          <m:r>
+                            <m:t>y</m:t>
+                          </m:r>
+                        </m:e>
+                      </m:acc>
+                    </m:e>
+                  </m:d>
+                  <m:r>
+                    <m:t>​</m:t>
+                  </m:r>
+                </m:e>
+              </m:d>
+              <m:r>
+                <m:t>​</m:t>
+              </m:r>
+              <m:r>
+                <m:t>&amp;</m:t>
+              </m:r>
+              <m:r>
+                <m:t>&amp;</m:t>
+              </m:r>
+              <m:r>
+                <m:rPr>
+                  <m:nor/>
+                  <m:sty m:val="p"/>
+                </m:rPr>
+                <m:t>(expectation of a constant)</m:t>
+              </m:r>
+            </m:e>
+            <m:e>
+              <m:r>
+                <m:t>&amp;</m:t>
+              </m:r>
+              <m:r>
+                <m:rPr>
+                  <m:sty m:val="p"/>
+                </m:rPr>
+                <m:t>=</m:t>
+              </m:r>
+              <m:r>
+                <m:t>2</m:t>
+              </m:r>
+              <m:r>
+                <m:t>​</m:t>
+              </m:r>
+              <m:d>
+                <m:dPr>
+                  <m:begChr m:val="("/>
+                  <m:sepChr m:val=""/>
+                  <m:endChr m:val=")"/>
+                  <m:grow/>
+                </m:dPr>
+                <m:e>
+                  <m:r>
+                    <m:t>μ</m:t>
+                  </m:r>
+                  <m:r>
+                    <m:rPr>
+                      <m:sty m:val="p"/>
+                    </m:rPr>
+                    <m:t>−</m:t>
+                  </m:r>
+                  <m:sSub>
+                    <m:e>
+                      <m:r>
+                        <m:rPr>
+                          <m:sty m:val="p"/>
+                        </m:rPr>
+                        <m:t>E</m:t>
+                      </m:r>
+                    </m:e>
+                    <m:sub>
+                      <m:sSub>
+                        <m:e>
+                          <m:r>
+                            <m:rPr>
+                              <m:scr m:val="script"/>
+                              <m:sty m:val="p"/>
+                            </m:rPr>
+                            <m:t>D</m:t>
+                          </m:r>
+                        </m:e>
+                        <m:sub>
+                          <m:r>
+                            <m:rPr>
+                              <m:nor/>
+                              <m:sty m:val="p"/>
+                            </m:rPr>
+                            <m:t>train</m:t>
+                          </m:r>
+                        </m:sub>
+                      </m:sSub>
+                    </m:sub>
+                  </m:sSub>
+                  <m:r>
+                    <m:t>​</m:t>
+                  </m:r>
+                  <m:d>
+                    <m:dPr>
+                      <m:begChr m:val="["/>
+                      <m:sepChr m:val=""/>
+                      <m:endChr m:val="]"/>
+                      <m:grow/>
+                    </m:dPr>
+                    <m:e>
+                      <m:acc>
+                        <m:accPr>
+                          <m:chr m:val="̂"/>
+                        </m:accPr>
+                        <m:e>
+                          <m:r>
+                            <m:t>y</m:t>
+                          </m:r>
+                        </m:e>
+                      </m:acc>
+                    </m:e>
+                  </m:d>
+                  <m:r>
+                    <m:t>​</m:t>
+                  </m:r>
+                </m:e>
+              </m:d>
+              <m:r>
+                <m:t>​</m:t>
+              </m:r>
+              <m:r>
+                <m:t>​</m:t>
+              </m:r>
+              <m:d>
+                <m:dPr>
+                  <m:begChr m:val="("/>
+                  <m:sepChr m:val=""/>
+                  <m:endChr m:val=")"/>
+                  <m:grow/>
+                </m:dPr>
+                <m:e>
+                  <m:sSub>
+                    <m:e>
+                      <m:r>
+                        <m:rPr>
+                          <m:sty m:val="p"/>
+                        </m:rPr>
+                        <m:t>E</m:t>
+                      </m:r>
+                    </m:e>
+                    <m:sub>
+                      <m:sSub>
+                        <m:e>
+                          <m:r>
+                            <m:rPr>
+                              <m:scr m:val="script"/>
+                              <m:sty m:val="p"/>
+                            </m:rPr>
+                            <m:t>D</m:t>
+                          </m:r>
+                        </m:e>
+                        <m:sub>
+                          <m:r>
+                            <m:rPr>
+                              <m:nor/>
+                              <m:sty m:val="p"/>
+                            </m:rPr>
+                            <m:t>train</m:t>
+                          </m:r>
+                        </m:sub>
+                      </m:sSub>
+                    </m:sub>
+                  </m:sSub>
+                  <m:r>
+                    <m:t>​</m:t>
+                  </m:r>
+                  <m:d>
+                    <m:dPr>
+                      <m:begChr m:val="["/>
+                      <m:sepChr m:val=""/>
+                      <m:endChr m:val="]"/>
+                      <m:grow/>
+                    </m:dPr>
+                    <m:e>
+                      <m:acc>
+                        <m:accPr>
+                          <m:chr m:val="̂"/>
+                        </m:accPr>
+                        <m:e>
+                          <m:r>
+                            <m:t>y</m:t>
+                          </m:r>
+                        </m:e>
+                      </m:acc>
+                    </m:e>
+                  </m:d>
+                  <m:r>
+                    <m:t>​</m:t>
+                  </m:r>
+                  <m:r>
+                    <m:rPr>
+                      <m:sty m:val="p"/>
+                    </m:rPr>
+                    <m:t>−</m:t>
+                  </m:r>
+                  <m:sSub>
+                    <m:e>
+                      <m:r>
+                        <m:rPr>
+                          <m:sty m:val="p"/>
+                        </m:rPr>
+                        <m:t>E</m:t>
+                      </m:r>
+                    </m:e>
+                    <m:sub>
+                      <m:sSub>
+                        <m:e>
+                          <m:r>
+                            <m:rPr>
+                              <m:scr m:val="script"/>
+                              <m:sty m:val="p"/>
+                            </m:rPr>
+                            <m:t>D</m:t>
+                          </m:r>
+                        </m:e>
+                        <m:sub>
+                          <m:r>
+                            <m:rPr>
+                              <m:nor/>
+                              <m:sty m:val="p"/>
+                            </m:rPr>
+                            <m:t>train</m:t>
+                          </m:r>
+                        </m:sub>
+                      </m:sSub>
+                    </m:sub>
+                  </m:sSub>
+                  <m:r>
+                    <m:t>​</m:t>
+                  </m:r>
+                  <m:d>
+                    <m:dPr>
+                      <m:begChr m:val="["/>
+                      <m:sepChr m:val=""/>
+                      <m:endChr m:val="]"/>
+                      <m:grow/>
+                    </m:dPr>
+                    <m:e>
+                      <m:acc>
+                        <m:accPr>
+                          <m:chr m:val="̂"/>
+                        </m:accPr>
+                        <m:e>
+                          <m:r>
+                            <m:t>y</m:t>
+                          </m:r>
+                        </m:e>
+                      </m:acc>
+                    </m:e>
+                  </m:d>
+                  <m:r>
+                    <m:t>​</m:t>
+                  </m:r>
+                </m:e>
+              </m:d>
+              <m:r>
+                <m:t>​</m:t>
+              </m:r>
+              <m:r>
+                <m:t>&amp;</m:t>
+              </m:r>
+              <m:r>
+                <m:t>&amp;</m:t>
+              </m:r>
+              <m:r>
+                <m:rPr>
+                  <m:nor/>
+                  <m:sty m:val="p"/>
+                </m:rPr>
+                <m:t>(definition of the expected prediction)</m:t>
+              </m:r>
+            </m:e>
+            <m:e>
+              <m:r>
+                <m:t>&amp;</m:t>
+              </m:r>
+              <m:r>
+                <m:rPr>
+                  <m:sty m:val="p"/>
+                </m:rPr>
+                <m:t>=</m:t>
+              </m:r>
+              <m:r>
+                <m:t>2</m:t>
+              </m:r>
+              <m:r>
+                <m:t>​</m:t>
+              </m:r>
+              <m:d>
+                <m:dPr>
+                  <m:begChr m:val="("/>
+                  <m:sepChr m:val=""/>
+                  <m:endChr m:val=")"/>
+                  <m:grow/>
+                </m:dPr>
+                <m:e>
+                  <m:r>
+                    <m:t>μ</m:t>
+                  </m:r>
+                  <m:r>
+                    <m:rPr>
+                      <m:sty m:val="p"/>
+                    </m:rPr>
+                    <m:t>−</m:t>
+                  </m:r>
+                  <m:sSub>
+                    <m:e>
+                      <m:r>
+                        <m:rPr>
+                          <m:sty m:val="p"/>
+                        </m:rPr>
+                        <m:t>E</m:t>
+                      </m:r>
+                    </m:e>
+                    <m:sub>
+                      <m:sSub>
+                        <m:e>
+                          <m:r>
+                            <m:rPr>
+                              <m:scr m:val="script"/>
+                              <m:sty m:val="p"/>
+                            </m:rPr>
+                            <m:t>D</m:t>
+                          </m:r>
+                        </m:e>
+                        <m:sub>
+                          <m:r>
+                            <m:rPr>
+                              <m:nor/>
+                              <m:sty m:val="p"/>
+                            </m:rPr>
+                            <m:t>train</m:t>
+                          </m:r>
+                        </m:sub>
+                      </m:sSub>
+                    </m:sub>
+                  </m:sSub>
+                  <m:r>
+                    <m:t>​</m:t>
+                  </m:r>
+                  <m:d>
+                    <m:dPr>
+                      <m:begChr m:val="["/>
+                      <m:sepChr m:val=""/>
+                      <m:endChr m:val="]"/>
+                      <m:grow/>
+                    </m:dPr>
+                    <m:e>
+                      <m:acc>
+                        <m:accPr>
+                          <m:chr m:val="̂"/>
+                        </m:accPr>
+                        <m:e>
+                          <m:r>
+                            <m:t>y</m:t>
+                          </m:r>
+                        </m:e>
+                      </m:acc>
+                    </m:e>
+                  </m:d>
+                  <m:r>
+                    <m:t>​</m:t>
+                  </m:r>
                 </m:e>
               </m:d>
               <m:r>
@@ -23617,15 +24847,61 @@
                           <m:sSub>
                             <m:e>
                               <m:r>
-                                <m:t>μ</m:t>
+                                <m:rPr>
+                                  <m:sty m:val="p"/>
+                                </m:rPr>
+                                <m:t>E</m:t>
                               </m:r>
                             </m:e>
                             <m:sub>
-                              <m:r>
-                                <m:t>h</m:t>
-                              </m:r>
+                              <m:sSub>
+                                <m:e>
+                                  <m:r>
+                                    <m:rPr>
+                                      <m:scr m:val="script"/>
+                                      <m:sty m:val="p"/>
+                                    </m:rPr>
+                                    <m:t>D</m:t>
+                                  </m:r>
+                                </m:e>
+                                <m:sub>
+                                  <m:r>
+                                    <m:rPr>
+                                      <m:nor/>
+                                      <m:sty m:val="p"/>
+                                    </m:rPr>
+                                    <m:t>train</m:t>
+                                  </m:r>
+                                </m:sub>
+                              </m:sSub>
                             </m:sub>
                           </m:sSub>
+                          <m:r>
+                            <m:t>​</m:t>
+                          </m:r>
+                          <m:d>
+                            <m:dPr>
+                              <m:begChr m:val="["/>
+                              <m:sepChr m:val=""/>
+                              <m:endChr m:val="]"/>
+                              <m:grow/>
+                            </m:dPr>
+                            <m:e>
+                              <m:acc>
+                                <m:accPr>
+                                  <m:chr m:val="̂"/>
+                                </m:accPr>
+                                <m:e>
+                                  <m:r>
+                                    <m:t>y</m:t>
+                                  </m:r>
+                                </m:e>
+                              </m:acc>
+                            </m:e>
+                          </m:d>
+                          <m:r>
+                            <m:t>​</m:t>
+                          </m:r>
                           <m:r>
                             <m:rPr>
                               <m:sty m:val="p"/>
@@ -23659,105 +24935,6 @@
               <m:r>
                 <m:t>​</m:t>
               </m:r>
-              <m:r>
-                <m:t>&amp;</m:t>
-              </m:r>
-              <m:r>
-                <m:rPr>
-                  <m:sty m:val="p"/>
-                </m:rPr>
-                <m:t>=</m:t>
-              </m:r>
-              <m:r>
-                <m:rPr>
-                  <m:sty m:val="p"/>
-                </m:rPr>
-                <m:t>E</m:t>
-              </m:r>
-              <m:r>
-                <m:t>​</m:t>
-              </m:r>
-              <m:d>
-                <m:dPr>
-                  <m:begChr m:val="["/>
-                  <m:sepChr m:val=""/>
-                  <m:endChr m:val="]"/>
-                  <m:grow/>
-                </m:dPr>
-                <m:e>
-                  <m:sSup>
-                    <m:e>
-                      <m:r>
-                        <m:t>​</m:t>
-                      </m:r>
-                      <m:d>
-                        <m:dPr>
-                          <m:begChr m:val="("/>
-                          <m:sepChr m:val=""/>
-                          <m:endChr m:val=")"/>
-                          <m:grow/>
-                        </m:dPr>
-                        <m:e>
-                          <m:acc>
-                            <m:accPr>
-                              <m:chr m:val="̂"/>
-                            </m:accPr>
-                            <m:e>
-                              <m:r>
-                                <m:t>y</m:t>
-                              </m:r>
-                            </m:e>
-                          </m:acc>
-                          <m:r>
-                            <m:rPr>
-                              <m:sty m:val="p"/>
-                            </m:rPr>
-                            <m:t>−</m:t>
-                          </m:r>
-                          <m:sSub>
-                            <m:e>
-                              <m:r>
-                                <m:t>μ</m:t>
-                              </m:r>
-                            </m:e>
-                            <m:sub>
-                              <m:r>
-                                <m:t>h</m:t>
-                              </m:r>
-                            </m:sub>
-                          </m:sSub>
-                        </m:e>
-                      </m:d>
-                      <m:r>
-                        <m:t>​</m:t>
-                      </m:r>
-                    </m:e>
-                    <m:sup>
-                      <m:r>
-                        <m:t>2</m:t>
-                      </m:r>
-                    </m:sup>
-                  </m:sSup>
-                </m:e>
-              </m:d>
-              <m:r>
-                <m:t>​</m:t>
-              </m:r>
-              <m:r>
-                <m:t>&amp;</m:t>
-              </m:r>
-              <m:r>
-                <m:t>&amp;</m:t>
-              </m:r>
-              <m:r>
-                <m:rPr>
-                  <m:nor/>
-                  <m:sty m:val="p"/>
-                </m:rPr>
-                <m:t>(a number and its negative have the same square)</m:t>
-              </m:r>
-            </m:e>
-            <m:e>
               <m:r>
                 <m:t>&amp;</m:t>
               </m:r>
@@ -23899,7 +25076,7 @@
                   <m:nor/>
                   <m:sty m:val="p"/>
                 </m:rPr>
-                <m:t>(definition of the expected prediction)</m:t>
+                <m:t>(a number and its negative have the same square)</m:t>
               </m:r>
             </m:e>
             <m:e>
@@ -61324,7 +62501,7 @@
         <w:rPr>
           <w:rStyle w:val="CommentTok"/>
         </w:rPr>
-        <w:t xml:space="preserve">#&gt;    7.10543e-15    2.00000e+00</w:t>
+        <w:t xml:space="preserve">#&gt;    8.88178e-15    2.00000e+00</w:t>
       </w:r>
     </w:p>
     <w:p>
@@ -61332,7 +62509,7 @@
         <w:pStyle w:val="FirstParagraph"/>
       </w:pPr>
       <w:r>
-        <w:t xml:space="preserve">The two columns differ by at most 7.1e-15,</w:t>
+        <w:t xml:space="preserve">The two columns differ by at most 8.9e-15,</w:t>
       </w:r>
       <w:r>
         <w:t xml:space="preserve"> </w:t>

</xml_diff>

<commit_message>
Deploying to gh-pages from @ Morrison-Lab/sds@5fdbf39a3ef0693c6438a7f7c7decc33544bac05 🚀
</commit_message>
<xml_diff>
--- a/model-validation-handout.docx
+++ b/model-validation-handout.docx
@@ -15,7 +15,7 @@
         <w:pStyle w:val="Date"/>
       </w:pPr>
       <w:r>
-        <w:t xml:space="preserve">Last modified: 2026-10-17 08:57:23 (PDT)</w:t>
+        <w:t xml:space="preserve">Last modified: 2026-10-17 10:19:16 (PDT)</w:t>
       </w:r>
     </w:p>
     <w:bookmarkStart w:id="17" w:name="sec-data-sets"/>
@@ -18000,6 +18000,25 @@
         <m:r>
           <m:t>μ</m:t>
         </m:r>
+        <m:r>
+          <m:t>​</m:t>
+        </m:r>
+        <m:d>
+          <m:dPr>
+            <m:begChr m:val="("/>
+            <m:sepChr m:val=""/>
+            <m:endChr m:val=")"/>
+            <m:grow/>
+          </m:dPr>
+          <m:e>
+            <m:r>
+              <m:t>x</m:t>
+            </m:r>
+          </m:e>
+        </m:d>
+        <m:r>
+          <m:t>​</m:t>
+        </m:r>
       </m:oMath>
       <w:r>
         <w:t xml:space="preserve">,</w:t>
@@ -18236,6 +18255,25 @@
           <m:t>μ</m:t>
         </m:r>
         <m:r>
+          <m:t>​</m:t>
+        </m:r>
+        <m:d>
+          <m:dPr>
+            <m:begChr m:val="("/>
+            <m:sepChr m:val=""/>
+            <m:endChr m:val=")"/>
+            <m:grow/>
+          </m:dPr>
+          <m:e>
+            <m:r>
+              <m:t>x</m:t>
+            </m:r>
+          </m:e>
+        </m:d>
+        <m:r>
+          <m:t>​</m:t>
+        </m:r>
+        <m:r>
           <m:rPr>
             <m:sty m:val="p"/>
           </m:rPr>
@@ -18502,6 +18540,25 @@
               <m:r>
                 <m:t>μ</m:t>
               </m:r>
+              <m:r>
+                <m:t>​</m:t>
+              </m:r>
+              <m:d>
+                <m:dPr>
+                  <m:begChr m:val="("/>
+                  <m:sepChr m:val=""/>
+                  <m:endChr m:val=")"/>
+                  <m:grow/>
+                </m:dPr>
+                <m:e>
+                  <m:r>
+                    <m:t>x</m:t>
+                  </m:r>
+                </m:e>
+              </m:d>
+              <m:r>
+                <m:t>​</m:t>
+              </m:r>
             </m:e>
             <m:e>
               <m:r>
@@ -18822,6 +18879,25 @@
         </m:r>
         <m:r>
           <m:t>μ</m:t>
+        </m:r>
+        <m:r>
+          <m:t>​</m:t>
+        </m:r>
+        <m:d>
+          <m:dPr>
+            <m:begChr m:val="("/>
+            <m:sepChr m:val=""/>
+            <m:endChr m:val=")"/>
+            <m:grow/>
+          </m:dPr>
+          <m:e>
+            <m:r>
+              <m:t>x</m:t>
+            </m:r>
+          </m:e>
+        </m:d>
+        <m:r>
+          <m:t>​</m:t>
         </m:r>
         <m:r>
           <m:rPr>
@@ -21864,6 +21940,25 @@
                         <m:t>μ</m:t>
                       </m:r>
                       <m:r>
+                        <m:t>​</m:t>
+                      </m:r>
+                      <m:d>
+                        <m:dPr>
+                          <m:begChr m:val="("/>
+                          <m:sepChr m:val=""/>
+                          <m:endChr m:val=")"/>
+                          <m:grow/>
+                        </m:dPr>
+                        <m:e>
+                          <m:r>
+                            <m:t>x</m:t>
+                          </m:r>
+                        </m:e>
+                      </m:d>
+                      <m:r>
+                        <m:t>​</m:t>
+                      </m:r>
+                      <m:r>
                         <m:rPr>
                           <m:sty m:val="p"/>
                         </m:rPr>
@@ -21919,6 +22014,25 @@
         <m:r>
           <m:t>μ</m:t>
         </m:r>
+        <m:r>
+          <m:t>​</m:t>
+        </m:r>
+        <m:d>
+          <m:dPr>
+            <m:begChr m:val="("/>
+            <m:sepChr m:val=""/>
+            <m:endChr m:val=")"/>
+            <m:grow/>
+          </m:dPr>
+          <m:e>
+            <m:r>
+              <m:t>x</m:t>
+            </m:r>
+          </m:e>
+        </m:d>
+        <m:r>
+          <m:t>​</m:t>
+        </m:r>
       </m:oMath>
       <w:r>
         <w:t xml:space="preserve"> </w:t>
@@ -22111,6 +22225,25 @@
                 <m:t>μ</m:t>
               </m:r>
               <m:r>
+                <m:t>​</m:t>
+              </m:r>
+              <m:d>
+                <m:dPr>
+                  <m:begChr m:val="("/>
+                  <m:sepChr m:val=""/>
+                  <m:endChr m:val=")"/>
+                  <m:grow/>
+                </m:dPr>
+                <m:e>
+                  <m:r>
+                    <m:t>x</m:t>
+                  </m:r>
+                </m:e>
+              </m:d>
+              <m:r>
+                <m:t>​</m:t>
+              </m:r>
+              <m:r>
                 <m:rPr>
                   <m:sty m:val="p"/>
                 </m:rPr>
@@ -22148,6 +22281,25 @@
                 <m:e>
                   <m:r>
                     <m:t>μ</m:t>
+                  </m:r>
+                  <m:r>
+                    <m:t>​</m:t>
+                  </m:r>
+                  <m:d>
+                    <m:dPr>
+                      <m:begChr m:val="("/>
+                      <m:sepChr m:val=""/>
+                      <m:endChr m:val=")"/>
+                      <m:grow/>
+                    </m:dPr>
+                    <m:e>
+                      <m:r>
+                        <m:t>x</m:t>
+                      </m:r>
+                    </m:e>
+                  </m:d>
+                  <m:r>
+                    <m:t>​</m:t>
                   </m:r>
                   <m:r>
                     <m:rPr>
@@ -22433,6 +22585,25 @@
                         <m:t>μ</m:t>
                       </m:r>
                       <m:r>
+                        <m:t>​</m:t>
+                      </m:r>
+                      <m:d>
+                        <m:dPr>
+                          <m:begChr m:val="("/>
+                          <m:sepChr m:val=""/>
+                          <m:endChr m:val=")"/>
+                          <m:grow/>
+                        </m:dPr>
+                        <m:e>
+                          <m:r>
+                            <m:t>x</m:t>
+                          </m:r>
+                        </m:e>
+                      </m:d>
+                      <m:r>
+                        <m:t>​</m:t>
+                      </m:r>
+                      <m:r>
                         <m:rPr>
                           <m:sty m:val="p"/>
                         </m:rPr>
@@ -22484,6 +22655,25 @@
                     <m:e>
                       <m:r>
                         <m:t>μ</m:t>
+                      </m:r>
+                      <m:r>
+                        <m:t>​</m:t>
+                      </m:r>
+                      <m:d>
+                        <m:dPr>
+                          <m:begChr m:val="("/>
+                          <m:sepChr m:val=""/>
+                          <m:endChr m:val=")"/>
+                          <m:grow/>
+                        </m:dPr>
+                        <m:e>
+                          <m:r>
+                            <m:t>x</m:t>
+                          </m:r>
+                        </m:e>
+                      </m:d>
+                      <m:r>
+                        <m:t>​</m:t>
                       </m:r>
                       <m:r>
                         <m:rPr>
@@ -22583,6 +22773,25 @@
                 <m:e>
                   <m:r>
                     <m:t>μ</m:t>
+                  </m:r>
+                  <m:r>
+                    <m:t>​</m:t>
+                  </m:r>
+                  <m:d>
+                    <m:dPr>
+                      <m:begChr m:val="("/>
+                      <m:sepChr m:val=""/>
+                      <m:endChr m:val=")"/>
+                      <m:grow/>
+                    </m:dPr>
+                    <m:e>
+                      <m:r>
+                        <m:t>x</m:t>
+                      </m:r>
+                    </m:e>
+                  </m:d>
+                  <m:r>
+                    <m:t>​</m:t>
                   </m:r>
                   <m:r>
                     <m:rPr>
@@ -22916,6 +23125,25 @@
         <m:r>
           <m:t>μ</m:t>
         </m:r>
+        <m:r>
+          <m:t>​</m:t>
+        </m:r>
+        <m:d>
+          <m:dPr>
+            <m:begChr m:val="("/>
+            <m:sepChr m:val=""/>
+            <m:endChr m:val=")"/>
+            <m:grow/>
+          </m:dPr>
+          <m:e>
+            <m:r>
+              <m:t>x</m:t>
+            </m:r>
+          </m:e>
+        </m:d>
+        <m:r>
+          <m:t>​</m:t>
+        </m:r>
       </m:oMath>
       <w:r>
         <w:t xml:space="preserve"> </w:t>
@@ -23048,6 +23276,25 @@
                         <m:e>
                           <m:r>
                             <m:t>μ</m:t>
+                          </m:r>
+                          <m:r>
+                            <m:t>​</m:t>
+                          </m:r>
+                          <m:d>
+                            <m:dPr>
+                              <m:begChr m:val="("/>
+                              <m:sepChr m:val=""/>
+                              <m:endChr m:val=")"/>
+                              <m:grow/>
+                            </m:dPr>
+                            <m:e>
+                              <m:r>
+                                <m:t>x</m:t>
+                              </m:r>
+                            </m:e>
+                          </m:d>
+                          <m:r>
+                            <m:t>​</m:t>
                           </m:r>
                           <m:r>
                             <m:rPr>
@@ -23154,6 +23401,25 @@
                     <m:e>
                       <m:r>
                         <m:t>μ</m:t>
+                      </m:r>
+                      <m:r>
+                        <m:t>​</m:t>
+                      </m:r>
+                      <m:d>
+                        <m:dPr>
+                          <m:begChr m:val="("/>
+                          <m:sepChr m:val=""/>
+                          <m:endChr m:val=")"/>
+                          <m:grow/>
+                        </m:dPr>
+                        <m:e>
+                          <m:r>
+                            <m:t>x</m:t>
+                          </m:r>
+                        </m:e>
+                      </m:d>
+                      <m:r>
+                        <m:t>​</m:t>
                       </m:r>
                       <m:r>
                         <m:rPr>
@@ -23335,6 +23601,25 @@
                       <m:r>
                         <m:t>μ</m:t>
                       </m:r>
+                      <m:r>
+                        <m:t>​</m:t>
+                      </m:r>
+                      <m:d>
+                        <m:dPr>
+                          <m:begChr m:val="("/>
+                          <m:sepChr m:val=""/>
+                          <m:endChr m:val=")"/>
+                          <m:grow/>
+                        </m:dPr>
+                        <m:e>
+                          <m:r>
+                            <m:t>x</m:t>
+                          </m:r>
+                        </m:e>
+                      </m:d>
+                      <m:r>
+                        <m:t>​</m:t>
+                      </m:r>
                     </m:e>
                   </m:d>
                   <m:r>
@@ -23510,6 +23795,25 @@
                     <m:e>
                       <m:r>
                         <m:t>μ</m:t>
+                      </m:r>
+                      <m:r>
+                        <m:t>​</m:t>
+                      </m:r>
+                      <m:d>
+                        <m:dPr>
+                          <m:begChr m:val="("/>
+                          <m:sepChr m:val=""/>
+                          <m:endChr m:val=")"/>
+                          <m:grow/>
+                        </m:dPr>
+                        <m:e>
+                          <m:r>
+                            <m:t>x</m:t>
+                          </m:r>
+                        </m:e>
+                      </m:d>
+                      <m:r>
+                        <m:t>​</m:t>
                       </m:r>
                       <m:r>
                         <m:rPr>
@@ -23702,6 +24006,25 @@
                     <m:t>μ</m:t>
                   </m:r>
                   <m:r>
+                    <m:t>​</m:t>
+                  </m:r>
+                  <m:d>
+                    <m:dPr>
+                      <m:begChr m:val="("/>
+                      <m:sepChr m:val=""/>
+                      <m:endChr m:val=")"/>
+                      <m:grow/>
+                    </m:dPr>
+                    <m:e>
+                      <m:r>
+                        <m:t>x</m:t>
+                      </m:r>
+                    </m:e>
+                  </m:d>
+                  <m:r>
+                    <m:t>​</m:t>
+                  </m:r>
+                  <m:r>
                     <m:rPr>
                       <m:sty m:val="p"/>
                     </m:rPr>
@@ -23906,6 +24229,25 @@
                 <m:e>
                   <m:r>
                     <m:t>μ</m:t>
+                  </m:r>
+                  <m:r>
+                    <m:t>​</m:t>
+                  </m:r>
+                  <m:d>
+                    <m:dPr>
+                      <m:begChr m:val="("/>
+                      <m:sepChr m:val=""/>
+                      <m:endChr m:val=")"/>
+                      <m:grow/>
+                    </m:dPr>
+                    <m:e>
+                      <m:r>
+                        <m:t>x</m:t>
+                      </m:r>
+                    </m:e>
+                  </m:d>
+                  <m:r>
+                    <m:t>​</m:t>
                   </m:r>
                   <m:r>
                     <m:rPr>
@@ -24152,6 +24494,25 @@
                     <m:t>μ</m:t>
                   </m:r>
                   <m:r>
+                    <m:t>​</m:t>
+                  </m:r>
+                  <m:d>
+                    <m:dPr>
+                      <m:begChr m:val="("/>
+                      <m:sepChr m:val=""/>
+                      <m:endChr m:val=")"/>
+                      <m:grow/>
+                    </m:dPr>
+                    <m:e>
+                      <m:r>
+                        <m:t>x</m:t>
+                      </m:r>
+                    </m:e>
+                  </m:d>
+                  <m:r>
+                    <m:t>​</m:t>
+                  </m:r>
+                  <m:r>
                     <m:rPr>
                       <m:sty m:val="p"/>
                     </m:rPr>
@@ -24372,6 +24733,25 @@
                 <m:e>
                   <m:r>
                     <m:t>μ</m:t>
+                  </m:r>
+                  <m:r>
+                    <m:t>​</m:t>
+                  </m:r>
+                  <m:d>
+                    <m:dPr>
+                      <m:begChr m:val="("/>
+                      <m:sepChr m:val=""/>
+                      <m:endChr m:val=")"/>
+                      <m:grow/>
+                    </m:dPr>
+                    <m:e>
+                      <m:r>
+                        <m:t>x</m:t>
+                      </m:r>
+                    </m:e>
+                  </m:d>
+                  <m:r>
+                    <m:t>​</m:t>
                   </m:r>
                   <m:r>
                     <m:rPr>
@@ -24622,6 +25002,25 @@
                     <m:t>μ</m:t>
                   </m:r>
                   <m:r>
+                    <m:t>​</m:t>
+                  </m:r>
+                  <m:d>
+                    <m:dPr>
+                      <m:begChr m:val="("/>
+                      <m:sepChr m:val=""/>
+                      <m:endChr m:val=")"/>
+                      <m:grow/>
+                    </m:dPr>
+                    <m:e>
+                      <m:r>
+                        <m:t>x</m:t>
+                      </m:r>
+                    </m:e>
+                  </m:d>
+                  <m:r>
+                    <m:t>​</m:t>
+                  </m:r>
+                  <m:r>
                     <m:rPr>
                       <m:sty m:val="p"/>
                     </m:rPr>
@@ -25191,6 +25590,25 @@
                         <m:t>μ</m:t>
                       </m:r>
                       <m:r>
+                        <m:t>​</m:t>
+                      </m:r>
+                      <m:d>
+                        <m:dPr>
+                          <m:begChr m:val="("/>
+                          <m:sepChr m:val=""/>
+                          <m:endChr m:val=")"/>
+                          <m:grow/>
+                        </m:dPr>
+                        <m:e>
+                          <m:r>
+                            <m:t>x</m:t>
+                          </m:r>
+                        </m:e>
+                      </m:d>
+                      <m:r>
+                        <m:t>​</m:t>
+                      </m:r>
+                      <m:r>
                         <m:rPr>
                           <m:sty m:val="p"/>
                         </m:rPr>
@@ -25509,6 +25927,25 @@
           <m:t>μ</m:t>
         </m:r>
         <m:r>
+          <m:t>​</m:t>
+        </m:r>
+        <m:d>
+          <m:dPr>
+            <m:begChr m:val="("/>
+            <m:sepChr m:val=""/>
+            <m:endChr m:val=")"/>
+            <m:grow/>
+          </m:dPr>
+          <m:e>
+            <m:r>
+              <m:t>x</m:t>
+            </m:r>
+          </m:e>
+        </m:d>
+        <m:r>
+          <m:t>​</m:t>
+        </m:r>
+        <m:r>
           <m:rPr>
             <m:sty m:val="p"/>
           </m:rPr>
@@ -25818,6 +26255,25 @@
       <m:oMath>
         <m:r>
           <m:t>μ</m:t>
+        </m:r>
+        <m:r>
+          <m:t>​</m:t>
+        </m:r>
+        <m:d>
+          <m:dPr>
+            <m:begChr m:val="("/>
+            <m:sepChr m:val=""/>
+            <m:endChr m:val=")"/>
+            <m:grow/>
+          </m:dPr>
+          <m:e>
+            <m:r>
+              <m:t>x</m:t>
+            </m:r>
+          </m:e>
+        </m:d>
+        <m:r>
+          <m:t>​</m:t>
         </m:r>
       </m:oMath>
       <w:r>
@@ -26160,6 +26616,25 @@
         <m:r>
           <m:t>μ</m:t>
         </m:r>
+        <m:r>
+          <m:t>​</m:t>
+        </m:r>
+        <m:d>
+          <m:dPr>
+            <m:begChr m:val="("/>
+            <m:sepChr m:val=""/>
+            <m:endChr m:val=")"/>
+            <m:grow/>
+          </m:dPr>
+          <m:e>
+            <m:r>
+              <m:t>x</m:t>
+            </m:r>
+          </m:e>
+        </m:d>
+        <m:r>
+          <m:t>​</m:t>
+        </m:r>
       </m:oMath>
       <w:r>
         <w:t xml:space="preserve">.</w:t>
@@ -26331,6 +26806,25 @@
                         <m:e>
                           <m:r>
                             <m:t>μ</m:t>
+                          </m:r>
+                          <m:r>
+                            <m:t>​</m:t>
+                          </m:r>
+                          <m:d>
+                            <m:dPr>
+                              <m:begChr m:val="("/>
+                              <m:sepChr m:val=""/>
+                              <m:endChr m:val=")"/>
+                              <m:grow/>
+                            </m:dPr>
+                            <m:e>
+                              <m:r>
+                                <m:t>x</m:t>
+                              </m:r>
+                            </m:e>
+                          </m:d>
+                          <m:r>
+                            <m:t>​</m:t>
                           </m:r>
                           <m:r>
                             <m:rPr>
@@ -28228,6 +28722,25 @@
       <m:oMath>
         <m:r>
           <m:t>μ</m:t>
+        </m:r>
+        <m:r>
+          <m:t>​</m:t>
+        </m:r>
+        <m:d>
+          <m:dPr>
+            <m:begChr m:val="("/>
+            <m:sepChr m:val=""/>
+            <m:endChr m:val=")"/>
+            <m:grow/>
+          </m:dPr>
+          <m:e>
+            <m:r>
+              <m:t>x</m:t>
+            </m:r>
+          </m:e>
+        </m:d>
+        <m:r>
+          <m:t>​</m:t>
         </m:r>
       </m:oMath>
       <w:r>
@@ -62501,7 +63014,7 @@
         <w:rPr>
           <w:rStyle w:val="CommentTok"/>
         </w:rPr>
-        <w:t xml:space="preserve">#&gt;    8.88178e-15    2.00000e+00</w:t>
+        <w:t xml:space="preserve">#&gt;    7.10543e-15    2.00000e+00</w:t>
       </w:r>
     </w:p>
     <w:p>
@@ -62509,7 +63022,7 @@
         <w:pStyle w:val="FirstParagraph"/>
       </w:pPr>
       <w:r>
-        <w:t xml:space="preserve">The two columns differ by at most 8.9e-15,</w:t>
+        <w:t xml:space="preserve">The two columns differ by at most 7.1e-15,</w:t>
       </w:r>
       <w:r>
         <w:t xml:space="preserve"> </w:t>

</xml_diff>

<commit_message>
Deploying to gh-pages from @ Morrison-Lab/sds@7712066d90c24d50a3a027c85306b03e16d0c987 🚀
</commit_message>
<xml_diff>
--- a/model-validation-handout.docx
+++ b/model-validation-handout.docx
@@ -15,7 +15,7 @@
         <w:pStyle w:val="Date"/>
       </w:pPr>
       <w:r>
-        <w:t xml:space="preserve">Last modified: 2026-10-17 18:16:37 (PDT)</w:t>
+        <w:t xml:space="preserve">Last modified: 2026-10-17 19:06:28 (PDT)</w:t>
       </w:r>
     </w:p>
     <w:bookmarkStart w:id="17" w:name="sec-data-sets"/>
@@ -5477,6 +5477,32 @@
               </m:r>
             </m:sub>
           </m:sSub>
+          <m:r>
+            <m:t>​</m:t>
+          </m:r>
+          <m:d>
+            <m:dPr>
+              <m:begChr m:val="("/>
+              <m:sepChr m:val=""/>
+              <m:endChr m:val=")"/>
+              <m:grow/>
+            </m:dPr>
+            <m:e>
+              <m:acc>
+                <m:accPr>
+                  <m:chr m:val="̂"/>
+                </m:accPr>
+                <m:e>
+                  <m:r>
+                    <m:t>y</m:t>
+                  </m:r>
+                </m:e>
+              </m:acc>
+            </m:e>
+          </m:d>
+          <m:r>
+            <m:t>​</m:t>
+          </m:r>
           <m:limUpp>
             <m:e>
               <m:r>
@@ -5604,6 +5630,18 @@
         <w:pStyle w:val="FirstParagraph"/>
       </w:pPr>
       <w:r>
+        <w:t xml:space="preserve">The subscript names the observation, a member of a family of losses,</w:t>
+      </w:r>
+      <w:r>
+        <w:t xml:space="preserve"> </w:t>
+      </w:r>
+      <w:r>
+        <w:t xml:space="preserve">and the parentheses hold the prediction rule the loss is evaluated at.</w:t>
+      </w:r>
+      <w:r>
+        <w:t xml:space="preserve"> </w:t>
+      </w:r>
+      <w:r>
         <w:t xml:space="preserve">The index</w:t>
       </w:r>
       <w:r>
@@ -5704,6 +5742,32 @@
             </m:r>
           </m:sub>
         </m:sSub>
+        <m:r>
+          <m:t>​</m:t>
+        </m:r>
+        <m:d>
+          <m:dPr>
+            <m:begChr m:val="("/>
+            <m:sepChr m:val=""/>
+            <m:endChr m:val=")"/>
+            <m:grow/>
+          </m:dPr>
+          <m:e>
+            <m:acc>
+              <m:accPr>
+                <m:chr m:val="̂"/>
+              </m:accPr>
+              <m:e>
+                <m:r>
+                  <m:t>y</m:t>
+                </m:r>
+              </m:e>
+            </m:acc>
+          </m:e>
+        </m:d>
+        <m:r>
+          <m:t>​</m:t>
+        </m:r>
         <m:r>
           <m:rPr>
             <m:sty m:val="p"/>
@@ -5786,6 +5850,81 @@
             <m:r>
               <m:t>​</m:t>
             </m:r>
+          </m:e>
+        </m:d>
+        <m:r>
+          <m:t>​</m:t>
+        </m:r>
+      </m:oMath>
+      <w:r>
+        <w:t xml:space="preserve">.</w:t>
+      </w:r>
+      <w:r>
+        <w:t xml:space="preserve"> </w:t>
+      </w:r>
+      <w:r>
+        <w:t xml:space="preserve">When the rule is clear from context, we write</w:t>
+      </w:r>
+      <w:r>
+        <w:t xml:space="preserve"> </w:t>
+      </w:r>
+      <m:oMath>
+        <m:sSub>
+          <m:e>
+            <m:r>
+              <m:t>ℓ</m:t>
+            </m:r>
+          </m:e>
+          <m:sub>
+            <m:r>
+              <m:t>i</m:t>
+            </m:r>
+          </m:sub>
+        </m:sSub>
+      </m:oMath>
+      <w:r>
+        <w:t xml:space="preserve"> </w:t>
+      </w:r>
+      <w:r>
+        <w:t xml:space="preserve">for</w:t>
+      </w:r>
+      <w:r>
+        <w:t xml:space="preserve"> </w:t>
+      </w:r>
+      <m:oMath>
+        <m:sSub>
+          <m:e>
+            <m:r>
+              <m:t>ℓ</m:t>
+            </m:r>
+          </m:e>
+          <m:sub>
+            <m:r>
+              <m:t>i</m:t>
+            </m:r>
+          </m:sub>
+        </m:sSub>
+        <m:r>
+          <m:t>​</m:t>
+        </m:r>
+        <m:d>
+          <m:dPr>
+            <m:begChr m:val="("/>
+            <m:sepChr m:val=""/>
+            <m:endChr m:val=")"/>
+            <m:grow/>
+          </m:dPr>
+          <m:e>
+            <m:acc>
+              <m:accPr>
+                <m:chr m:val="̂"/>
+              </m:accPr>
+              <m:e>
+                <m:r>
+                  <m:t>y</m:t>
+                </m:r>
+              </m:e>
+            </m:acc>
           </m:e>
         </m:d>
         <m:r>
@@ -14019,27 +14158,6 @@
             </m:r>
           </m:sub>
         </m:sSub>
-      </m:oMath>
-      <w:r>
-        <w:t xml:space="preserve"> </w:t>
-      </w:r>
-      <w:r>
-        <w:t xml:space="preserve">of its prediction</w:t>
-      </w:r>
-      <w:r>
-        <w:t xml:space="preserve"> </w:t>
-      </w:r>
-      <m:oMath>
-        <m:acc>
-          <m:accPr>
-            <m:chr m:val="̂"/>
-          </m:accPr>
-          <m:e>
-            <m:r>
-              <m:t>y</m:t>
-            </m:r>
-          </m:e>
-        </m:acc>
         <m:r>
           <m:t>​</m:t>
         </m:r>
@@ -14051,9 +14169,16 @@
             <m:grow/>
           </m:dPr>
           <m:e>
-            <m:r>
-              <m:t>x</m:t>
-            </m:r>
+            <m:acc>
+              <m:accPr>
+                <m:chr m:val="̂"/>
+              </m:accPr>
+              <m:e>
+                <m:r>
+                  <m:t>y</m:t>
+                </m:r>
+              </m:e>
+            </m:acc>
           </m:e>
         </m:d>
         <m:r>
@@ -14064,7 +14189,129 @@
         <w:t xml:space="preserve"> </w:t>
       </w:r>
       <w:r>
-        <w:t xml:space="preserve">for a new outcome</w:t>
+        <w:t xml:space="preserve">of the</w:t>
+      </w:r>
+      <w:r>
+        <w:t xml:space="preserve"> </w:t>
+      </w:r>
+      <w:hyperlink w:anchor="def-prediction-rule">
+        <w:r>
+          <w:rPr>
+            <w:rStyle w:val="Hyperlink"/>
+          </w:rPr>
+          <w:t xml:space="preserve">prediction rule</w:t>
+        </w:r>
+      </w:hyperlink>
+      <w:r>
+        <w:t xml:space="preserve"> </w:t>
+      </w:r>
+      <m:oMath>
+        <m:acc>
+          <m:accPr>
+            <m:chr m:val="̂"/>
+          </m:accPr>
+          <m:e>
+            <m:r>
+              <m:t>y</m:t>
+            </m:r>
+          </m:e>
+        </m:acc>
+        <m:r>
+          <m:rPr>
+            <m:sty m:val="p"/>
+          </m:rPr>
+          <m:t>=</m:t>
+        </m:r>
+        <m:sSub>
+          <m:e>
+            <m:acc>
+              <m:accPr>
+                <m:chr m:val="̂"/>
+              </m:accPr>
+              <m:e>
+                <m:r>
+                  <m:t>y</m:t>
+                </m:r>
+              </m:e>
+            </m:acc>
+          </m:e>
+          <m:sub>
+            <m:sSub>
+              <m:e>
+                <m:r>
+                  <m:rPr>
+                    <m:scr m:val="script"/>
+                    <m:sty m:val="p"/>
+                  </m:rPr>
+                  <m:t>D</m:t>
+                </m:r>
+              </m:e>
+              <m:sub>
+                <m:r>
+                  <m:rPr>
+                    <m:nor/>
+                    <m:sty m:val="p"/>
+                  </m:rPr>
+                  <m:t>train</m:t>
+                </m:r>
+              </m:sub>
+            </m:sSub>
+          </m:sub>
+        </m:sSub>
+      </m:oMath>
+      <w:r>
+        <w:t xml:space="preserve"> </w:t>
+      </w:r>
+      <w:r>
+        <w:t xml:space="preserve">that</w:t>
+      </w:r>
+      <w:r>
+        <w:t xml:space="preserve"> </w:t>
+      </w:r>
+      <m:oMath>
+        <m:r>
+          <m:t>g</m:t>
+        </m:r>
+      </m:oMath>
+      <w:r>
+        <w:t xml:space="preserve"> </w:t>
+      </w:r>
+      <w:r>
+        <w:t xml:space="preserve">produces from</w:t>
+      </w:r>
+      <w:r>
+        <w:t xml:space="preserve"> </w:t>
+      </w:r>
+      <m:oMath>
+        <m:sSub>
+          <m:e>
+            <m:r>
+              <m:rPr>
+                <m:scr m:val="script"/>
+                <m:sty m:val="p"/>
+              </m:rPr>
+              <m:t>D</m:t>
+            </m:r>
+          </m:e>
+          <m:sub>
+            <m:r>
+              <m:rPr>
+                <m:nor/>
+                <m:sty m:val="p"/>
+              </m:rPr>
+              <m:t>train</m:t>
+            </m:r>
+          </m:sub>
+        </m:sSub>
+      </m:oMath>
+      <w:r>
+        <w:t xml:space="preserve">,</w:t>
+      </w:r>
+      <w:r>
+        <w:t xml:space="preserve"> </w:t>
+      </w:r>
+      <w:r>
+        <w:t xml:space="preserve">on a new outcome</w:t>
       </w:r>
       <w:r>
         <w:t xml:space="preserve"> </w:t>
@@ -14275,7 +14522,91 @@
         </m:sSub>
       </m:oMath>
       <w:r>
-        <w:t xml:space="preserve">:</w:t>
+        <w:t xml:space="preserve">.</w:t>
+      </w:r>
+      <w:r>
+        <w:t xml:space="preserve"> </w:t>
+      </w:r>
+      <w:r>
+        <w:t xml:space="preserve">The rule</w:t>
+      </w:r>
+      <w:r>
+        <w:t xml:space="preserve"> </w:t>
+      </w:r>
+      <m:oMath>
+        <m:sSub>
+          <m:e>
+            <m:acc>
+              <m:accPr>
+                <m:chr m:val="̂"/>
+              </m:accPr>
+              <m:e>
+                <m:r>
+                  <m:t>y</m:t>
+                </m:r>
+              </m:e>
+            </m:acc>
+          </m:e>
+          <m:sub>
+            <m:sSub>
+              <m:e>
+                <m:r>
+                  <m:rPr>
+                    <m:scr m:val="script"/>
+                    <m:sty m:val="p"/>
+                  </m:rPr>
+                  <m:t>D</m:t>
+                </m:r>
+              </m:e>
+              <m:sub>
+                <m:r>
+                  <m:rPr>
+                    <m:nor/>
+                    <m:sty m:val="p"/>
+                  </m:rPr>
+                  <m:t>train</m:t>
+                </m:r>
+              </m:sub>
+            </m:sSub>
+          </m:sub>
+        </m:sSub>
+      </m:oMath>
+      <w:r>
+        <w:t xml:space="preserve"> </w:t>
+      </w:r>
+      <w:r>
+        <w:t xml:space="preserve">is random because</w:t>
+      </w:r>
+      <w:r>
+        <w:t xml:space="preserve"> </w:t>
+      </w:r>
+      <m:oMath>
+        <m:sSub>
+          <m:e>
+            <m:r>
+              <m:rPr>
+                <m:scr m:val="script"/>
+                <m:sty m:val="p"/>
+              </m:rPr>
+              <m:t>D</m:t>
+            </m:r>
+          </m:e>
+          <m:sub>
+            <m:r>
+              <m:rPr>
+                <m:nor/>
+                <m:sty m:val="p"/>
+              </m:rPr>
+              <m:t>train</m:t>
+            </m:r>
+          </m:sub>
+        </m:sSub>
+      </m:oMath>
+      <w:r>
+        <w:t xml:space="preserve"> </w:t>
+      </w:r>
+      <w:r>
+        <w:t xml:space="preserve">is:</w:t>
       </w:r>
     </w:p>
     <w:p>
@@ -14378,6 +14709,58 @@
                   </m:r>
                 </m:sub>
               </m:sSub>
+              <m:r>
+                <m:t>​</m:t>
+              </m:r>
+              <m:d>
+                <m:dPr>
+                  <m:begChr m:val="("/>
+                  <m:sepChr m:val=""/>
+                  <m:endChr m:val=")"/>
+                  <m:grow/>
+                </m:dPr>
+                <m:e>
+                  <m:sSub>
+                    <m:e>
+                      <m:acc>
+                        <m:accPr>
+                          <m:chr m:val="̂"/>
+                        </m:accPr>
+                        <m:e>
+                          <m:r>
+                            <m:t>y</m:t>
+                          </m:r>
+                        </m:e>
+                      </m:acc>
+                    </m:e>
+                    <m:sub>
+                      <m:sSub>
+                        <m:e>
+                          <m:r>
+                            <m:rPr>
+                              <m:scr m:val="script"/>
+                              <m:sty m:val="p"/>
+                            </m:rPr>
+                            <m:t>D</m:t>
+                          </m:r>
+                        </m:e>
+                        <m:sub>
+                          <m:r>
+                            <m:rPr>
+                              <m:nor/>
+                              <m:sty m:val="p"/>
+                            </m:rPr>
+                            <m:t>train</m:t>
+                          </m:r>
+                        </m:sub>
+                      </m:sSub>
+                    </m:sub>
+                  </m:sSub>
+                </m:e>
+              </m:d>
+              <m:r>
+                <m:t>​</m:t>
+              </m:r>
               <m:r>
                 <m:rPr>
                   <m:sty m:val="p"/>
@@ -14736,7 +15119,7 @@
         <w:t xml:space="preserve"> </w:t>
       </w:r>
       <w:r>
-        <w:t xml:space="preserve">the expected square of the</w:t>
+        <w:t xml:space="preserve">the expected value of the squared</w:t>
       </w:r>
       <w:r>
         <w:t xml:space="preserve"> </w:t>
@@ -14765,6 +15148,219 @@
                 <m:sty m:val="p"/>
               </m:rPr>
               <m:t>*</m:t>
+            </m:r>
+          </m:sub>
+        </m:sSub>
+        <m:r>
+          <m:t>​</m:t>
+        </m:r>
+        <m:d>
+          <m:dPr>
+            <m:begChr m:val="("/>
+            <m:sepChr m:val=""/>
+            <m:endChr m:val=")"/>
+            <m:grow/>
+          </m:dPr>
+          <m:e>
+            <m:acc>
+              <m:accPr>
+                <m:chr m:val="̂"/>
+              </m:accPr>
+              <m:e>
+                <m:r>
+                  <m:t>y</m:t>
+                </m:r>
+              </m:e>
+            </m:acc>
+          </m:e>
+        </m:d>
+        <m:r>
+          <m:t>​</m:t>
+        </m:r>
+        <m:r>
+          <m:rPr>
+            <m:sty m:val="p"/>
+          </m:rPr>
+          <m:t>=</m:t>
+        </m:r>
+        <m:acc>
+          <m:accPr>
+            <m:chr m:val="̂"/>
+          </m:accPr>
+          <m:e>
+            <m:r>
+              <m:t>y</m:t>
+            </m:r>
+          </m:e>
+        </m:acc>
+        <m:r>
+          <m:t>​</m:t>
+        </m:r>
+        <m:d>
+          <m:dPr>
+            <m:begChr m:val="("/>
+            <m:sepChr m:val=""/>
+            <m:endChr m:val=")"/>
+            <m:grow/>
+          </m:dPr>
+          <m:e>
+            <m:sSub>
+              <m:e>
+                <m:r>
+                  <m:t>X</m:t>
+                </m:r>
+              </m:e>
+              <m:sub>
+                <m:r>
+                  <m:rPr>
+                    <m:sty m:val="p"/>
+                  </m:rPr>
+                  <m:t>*</m:t>
+                </m:r>
+              </m:sub>
+            </m:sSub>
+          </m:e>
+        </m:d>
+        <m:r>
+          <m:t>​</m:t>
+        </m:r>
+        <m:r>
+          <m:rPr>
+            <m:sty m:val="p"/>
+          </m:rPr>
+          <m:t>−</m:t>
+        </m:r>
+        <m:sSub>
+          <m:e>
+            <m:r>
+              <m:t>Y</m:t>
+            </m:r>
+          </m:e>
+          <m:sub>
+            <m:r>
+              <m:rPr>
+                <m:sty m:val="p"/>
+              </m:rPr>
+              <m:t>*</m:t>
+            </m:r>
+          </m:sub>
+        </m:sSub>
+      </m:oMath>
+      <w:r>
+        <w:t xml:space="preserve"> </w:t>
+      </w:r>
+      <w:r>
+        <w:t xml:space="preserve">of the</w:t>
+      </w:r>
+      <w:r>
+        <w:t xml:space="preserve"> </w:t>
+      </w:r>
+      <w:hyperlink w:anchor="def-prediction-rule">
+        <w:r>
+          <w:rPr>
+            <w:rStyle w:val="Hyperlink"/>
+          </w:rPr>
+          <w:t xml:space="preserve">prediction rule</w:t>
+        </w:r>
+      </w:hyperlink>
+      <w:r>
+        <w:t xml:space="preserve"> </w:t>
+      </w:r>
+      <m:oMath>
+        <m:acc>
+          <m:accPr>
+            <m:chr m:val="̂"/>
+          </m:accPr>
+          <m:e>
+            <m:r>
+              <m:t>y</m:t>
+            </m:r>
+          </m:e>
+        </m:acc>
+        <m:r>
+          <m:rPr>
+            <m:sty m:val="p"/>
+          </m:rPr>
+          <m:t>=</m:t>
+        </m:r>
+        <m:sSub>
+          <m:e>
+            <m:acc>
+              <m:accPr>
+                <m:chr m:val="̂"/>
+              </m:accPr>
+              <m:e>
+                <m:r>
+                  <m:t>y</m:t>
+                </m:r>
+              </m:e>
+            </m:acc>
+          </m:e>
+          <m:sub>
+            <m:sSub>
+              <m:e>
+                <m:r>
+                  <m:rPr>
+                    <m:scr m:val="script"/>
+                    <m:sty m:val="p"/>
+                  </m:rPr>
+                  <m:t>D</m:t>
+                </m:r>
+              </m:e>
+              <m:sub>
+                <m:r>
+                  <m:rPr>
+                    <m:nor/>
+                    <m:sty m:val="p"/>
+                  </m:rPr>
+                  <m:t>train</m:t>
+                </m:r>
+              </m:sub>
+            </m:sSub>
+          </m:sub>
+        </m:sSub>
+      </m:oMath>
+      <w:r>
+        <w:t xml:space="preserve"> </w:t>
+      </w:r>
+      <w:r>
+        <w:t xml:space="preserve">that</w:t>
+      </w:r>
+      <w:r>
+        <w:t xml:space="preserve"> </w:t>
+      </w:r>
+      <m:oMath>
+        <m:r>
+          <m:t>g</m:t>
+        </m:r>
+      </m:oMath>
+      <w:r>
+        <w:t xml:space="preserve"> </w:t>
+      </w:r>
+      <w:r>
+        <w:t xml:space="preserve">produces from</w:t>
+      </w:r>
+      <w:r>
+        <w:t xml:space="preserve"> </w:t>
+      </w:r>
+      <m:oMath>
+        <m:sSub>
+          <m:e>
+            <m:r>
+              <m:rPr>
+                <m:scr m:val="script"/>
+                <m:sty m:val="p"/>
+              </m:rPr>
+              <m:t>D</m:t>
+            </m:r>
+          </m:e>
+          <m:sub>
+            <m:r>
+              <m:rPr>
+                <m:nor/>
+                <m:sty m:val="p"/>
+              </m:rPr>
+              <m:t>train</m:t>
             </m:r>
           </m:sub>
         </m:sSub>
@@ -14858,7 +15454,7 @@
               <m:grow/>
             </m:dPr>
             <m:e>
-              <m:sSubSup>
+              <m:sSub>
                 <m:e>
                   <m:r>
                     <m:t>ε</m:t>
@@ -14872,12 +15468,68 @@
                     <m:t>*</m:t>
                   </m:r>
                 </m:sub>
+              </m:sSub>
+              <m:r>
+                <m:t>​</m:t>
+              </m:r>
+              <m:d>
+                <m:dPr>
+                  <m:begChr m:val="("/>
+                  <m:sepChr m:val=""/>
+                  <m:endChr m:val=")"/>
+                  <m:grow/>
+                </m:dPr>
+                <m:e>
+                  <m:sSub>
+                    <m:e>
+                      <m:acc>
+                        <m:accPr>
+                          <m:chr m:val="̂"/>
+                        </m:accPr>
+                        <m:e>
+                          <m:r>
+                            <m:t>y</m:t>
+                          </m:r>
+                        </m:e>
+                      </m:acc>
+                    </m:e>
+                    <m:sub>
+                      <m:sSub>
+                        <m:e>
+                          <m:r>
+                            <m:rPr>
+                              <m:scr m:val="script"/>
+                              <m:sty m:val="p"/>
+                            </m:rPr>
+                            <m:t>D</m:t>
+                          </m:r>
+                        </m:e>
+                        <m:sub>
+                          <m:r>
+                            <m:rPr>
+                              <m:nor/>
+                              <m:sty m:val="p"/>
+                            </m:rPr>
+                            <m:t>train</m:t>
+                          </m:r>
+                        </m:sub>
+                      </m:sSub>
+                    </m:sub>
+                  </m:sSub>
+                </m:e>
+              </m:d>
+              <m:sSup>
+                <m:e>
+                  <m:r>
+                    <m:t>​</m:t>
+                  </m:r>
+                </m:e>
                 <m:sup>
                   <m:r>
                     <m:t>2</m:t>
                   </m:r>
                 </m:sup>
-              </m:sSubSup>
+              </m:sSup>
               <m:r>
                 <m:rPr>
                   <m:sty m:val="p"/>
@@ -14963,31 +15615,19 @@
       <w:r>
         <w:t xml:space="preserve"> </w:t>
       </w:r>
-      <w:hyperlink r:id="rId67">
+      <w:hyperlink r:id="rId111">
         <w:r>
           <w:rPr>
             <w:rStyle w:val="Hyperlink"/>
           </w:rPr>
-          <w:t xml:space="preserve">sMSE of predictions</w:t>
+          <w:t xml:space="preserve">pMSE</w:t>
         </w:r>
       </w:hyperlink>
       <w:r>
         <w:t xml:space="preserve"> </w:t>
       </w:r>
       <w:r>
-        <w:t xml:space="preserve">with the average over observations replaced by an expectation</w:t>
-      </w:r>
-      <w:r>
-        <w:t xml:space="preserve"> </w:t>
-      </w:r>
-      <w:r>
-        <w:t xml:space="preserve">over training sets and new outcomes:</w:t>
-      </w:r>
-      <w:r>
-        <w:t xml:space="preserve"> </w:t>
-      </w:r>
-      <w:r>
-        <w:t xml:space="preserve">the pMSE of the prediction</w:t>
+        <w:t xml:space="preserve">of the prediction</w:t>
       </w:r>
       <w:r>
         <w:t xml:space="preserve"> </w:t>
@@ -15156,19 +15796,52 @@
         <w:pStyle w:val="BodyText"/>
       </w:pPr>
       <w:r>
-        <w:t xml:space="preserve">It is not the</w:t>
-      </w:r>
-      <w:r>
-        <w:t xml:space="preserve"> </w:t>
-      </w:r>
-      <w:hyperlink r:id="rId111">
+        <w:t xml:space="preserve">It differs from the pMSE of the same prediction as an estimator of the</w:t>
+      </w:r>
+      <w:r>
+        <w:t xml:space="preserve"> </w:t>
+      </w:r>
+      <w:hyperlink w:anchor="def-mean-function">
         <w:r>
           <w:rPr>
             <w:rStyle w:val="Hyperlink"/>
           </w:rPr>
-          <w:t xml:space="preserve">pMSE of an estimator</w:t>
+          <w:t xml:space="preserve">mean function</w:t>
         </w:r>
       </w:hyperlink>
+      <w:r>
+        <w:t xml:space="preserve"> </w:t>
+      </w:r>
+      <w:r>
+        <w:t xml:space="preserve">value</w:t>
+      </w:r>
+      <w:r>
+        <w:t xml:space="preserve"> </w:t>
+      </w:r>
+      <m:oMath>
+        <m:r>
+          <m:t>μ</m:t>
+        </m:r>
+        <m:r>
+          <m:t>​</m:t>
+        </m:r>
+        <m:d>
+          <m:dPr>
+            <m:begChr m:val="("/>
+            <m:sepChr m:val=""/>
+            <m:endChr m:val=")"/>
+            <m:grow/>
+          </m:dPr>
+          <m:e>
+            <m:r>
+              <m:t>x</m:t>
+            </m:r>
+          </m:e>
+        </m:d>
+        <m:r>
+          <m:t>​</m:t>
+        </m:r>
+      </m:oMath>
       <w:r>
         <w:t xml:space="preserve">:</w:t>
       </w:r>
@@ -15187,63 +15860,7 @@
         <w:t xml:space="preserve"> </w:t>
       </w:r>
       <w:r>
-        <w:t xml:space="preserve">shows that it exceeds the pMSE</w:t>
-      </w:r>
-      <w:r>
-        <w:t xml:space="preserve"> </w:t>
-      </w:r>
-      <w:r>
-        <w:t xml:space="preserve">of the prediction as an estimator of the</w:t>
-      </w:r>
-      <w:r>
-        <w:t xml:space="preserve"> </w:t>
-      </w:r>
-      <w:hyperlink w:anchor="def-mean-function">
-        <w:r>
-          <w:rPr>
-            <w:rStyle w:val="Hyperlink"/>
-          </w:rPr>
-          <w:t xml:space="preserve">mean function</w:t>
-        </w:r>
-      </w:hyperlink>
-      <w:r>
-        <w:t xml:space="preserve"> </w:t>
-      </w:r>
-      <w:r>
-        <w:t xml:space="preserve">value</w:t>
-      </w:r>
-      <w:r>
-        <w:t xml:space="preserve"> </w:t>
-      </w:r>
-      <m:oMath>
-        <m:r>
-          <m:t>μ</m:t>
-        </m:r>
-        <m:r>
-          <m:t>​</m:t>
-        </m:r>
-        <m:d>
-          <m:dPr>
-            <m:begChr m:val="("/>
-            <m:sepChr m:val=""/>
-            <m:endChr m:val=")"/>
-            <m:grow/>
-          </m:dPr>
-          <m:e>
-            <m:r>
-              <m:t>x</m:t>
-            </m:r>
-          </m:e>
-        </m:d>
-        <m:r>
-          <m:t>​</m:t>
-        </m:r>
-      </m:oMath>
-      <w:r>
-        <w:t xml:space="preserve"> </w:t>
-      </w:r>
-      <w:r>
-        <w:t xml:space="preserve">by the noise variance.</w:t>
+        <w:t xml:space="preserve">shows that it exceeds that pMSE by the noise variance.</w:t>
       </w:r>
       <w:r>
         <w:t xml:space="preserve"> </w:t>
@@ -16312,7 +16929,56 @@
         <w:t xml:space="preserve"> </w:t>
       </w:r>
       <w:r>
-        <w:t xml:space="preserve">is the</w:t>
+        <w:t xml:space="preserve">abbreviates</w:t>
+      </w:r>
+      <w:r>
+        <w:t xml:space="preserve"> </w:t>
+      </w:r>
+      <m:oMath>
+        <m:sSub>
+          <m:e>
+            <m:r>
+              <m:t>ℓ</m:t>
+            </m:r>
+          </m:e>
+          <m:sub>
+            <m:r>
+              <m:rPr>
+                <m:sty m:val="p"/>
+              </m:rPr>
+              <m:t>*</m:t>
+            </m:r>
+          </m:sub>
+        </m:sSub>
+        <m:r>
+          <m:t>​</m:t>
+        </m:r>
+        <m:d>
+          <m:dPr>
+            <m:begChr m:val="("/>
+            <m:sepChr m:val=""/>
+            <m:endChr m:val=")"/>
+            <m:grow/>
+          </m:dPr>
+          <m:e>
+            <m:acc>
+              <m:accPr>
+                <m:chr m:val="̂"/>
+              </m:accPr>
+              <m:e>
+                <m:r>
+                  <m:t>y</m:t>
+                </m:r>
+              </m:e>
+            </m:acc>
+          </m:e>
+        </m:d>
+        <m:r>
+          <m:t>​</m:t>
+        </m:r>
+      </m:oMath>
+      <w:r>
+        <w:t xml:space="preserve">, the</w:t>
       </w:r>
       <w:r>
         <w:t xml:space="preserve"> </w:t>

</xml_diff>